<commit_message>
EPAS .Net Connector Guide 9.6.0.3 - RM 39823 In Section 3.4 added note for web.config; Corrected cross reference in Section 4.1.2
</commit_message>
<xml_diff>
--- a/edb_docs/EDB_Postgres_Advanced_Server_NET_Connector_Guide.docx
+++ b/edb_docs/EDB_Postgres_Advanced_Server_NET_Connector_Guide.docx
@@ -12,7 +12,7 @@
           <w:noProof/>
         </w:rPr>
         <w:drawing>
-          <wp:inline distT="0" distB="0" distL="0" distR="0" wp14:anchorId="5B3ECACA" wp14:editId="12F693E2">
+          <wp:inline distT="0" distB="0" distL="0" distR="0" wp14:anchorId="26F15A2A" wp14:editId="141CB36F">
             <wp:extent cx="2380711" cy="1371599"/>
             <wp:effectExtent l="0" t="0" r="635" b="635"/>
             <wp:docPr id="6" name="Picture 6"/>
@@ -225,7 +225,7 @@
         <w:pStyle w:val="EDBCoverProductDate"/>
       </w:pPr>
       <w:r>
-        <w:t>April 3</w:t>
+        <w:t>May 9</w:t>
       </w:r>
       <w:r>
         <w:t>, 2017</w:t>
@@ -526,7 +526,7 @@
       <w:r>
         <w:fldChar w:fldCharType="separate"/>
       </w:r>
-      <w:hyperlink w:anchor="_Toc478974066" w:history="1">
+      <w:hyperlink w:anchor="_Toc482089112" w:history="1">
         <w:r>
           <w:rPr>
             <w:rStyle w:val="Hyperlink"/>
@@ -566,7 +566,7 @@
           <w:rPr>
             <w:noProof/>
           </w:rPr>
-          <w:instrText xml:space="preserve"> PAGEREF _Toc478974066 \h </w:instrText>
+          <w:instrText xml:space="preserve"> PAGEREF _Toc482089112 \h </w:instrText>
         </w:r>
         <w:r>
           <w:rPr>
@@ -607,7 +607,7 @@
           <w:szCs w:val="22"/>
         </w:rPr>
       </w:pPr>
-      <w:hyperlink w:anchor="_Toc478974067" w:history="1">
+      <w:hyperlink w:anchor="_Toc482089113" w:history="1">
         <w:r>
           <w:rPr>
             <w:rStyle w:val="Hyperlink"/>
@@ -647,7 +647,7 @@
           <w:rPr>
             <w:noProof/>
           </w:rPr>
-          <w:instrText xml:space="preserve"> PAGEREF _Toc478974067 \h </w:instrText>
+          <w:instrText xml:space="preserve"> PAGEREF _Toc482089113 \h </w:instrText>
         </w:r>
         <w:r>
           <w:rPr>
@@ -688,7 +688,7 @@
           <w:szCs w:val="22"/>
         </w:rPr>
       </w:pPr>
-      <w:hyperlink w:anchor="_Toc478974068" w:history="1">
+      <w:hyperlink w:anchor="_Toc482089114" w:history="1">
         <w:r>
           <w:rPr>
             <w:rStyle w:val="Hyperlink"/>
@@ -728,7 +728,7 @@
           <w:rPr>
             <w:noProof/>
           </w:rPr>
-          <w:instrText xml:space="preserve"> PAGEREF _Toc478974068 \h </w:instrText>
+          <w:instrText xml:space="preserve"> PAGEREF _Toc482089114 \h </w:instrText>
         </w:r>
         <w:r>
           <w:rPr>
@@ -769,7 +769,7 @@
           <w:szCs w:val="22"/>
         </w:rPr>
       </w:pPr>
-      <w:hyperlink w:anchor="_Toc478974069" w:history="1">
+      <w:hyperlink w:anchor="_Toc482089115" w:history="1">
         <w:r>
           <w:rPr>
             <w:rStyle w:val="Hyperlink"/>
@@ -809,7 +809,7 @@
           <w:rPr>
             <w:noProof/>
           </w:rPr>
-          <w:instrText xml:space="preserve"> PAGEREF _Toc478974069 \h </w:instrText>
+          <w:instrText xml:space="preserve"> PAGEREF _Toc482089115 \h </w:instrText>
         </w:r>
         <w:r>
           <w:rPr>
@@ -850,7 +850,7 @@
           <w:szCs w:val="22"/>
         </w:rPr>
       </w:pPr>
-      <w:hyperlink w:anchor="_Toc478974070" w:history="1">
+      <w:hyperlink w:anchor="_Toc482089116" w:history="1">
         <w:r>
           <w:rPr>
             <w:rStyle w:val="Hyperlink"/>
@@ -890,7 +890,7 @@
           <w:rPr>
             <w:noProof/>
           </w:rPr>
-          <w:instrText xml:space="preserve"> PAGEREF _Toc478974070 \h </w:instrText>
+          <w:instrText xml:space="preserve"> PAGEREF _Toc482089116 \h </w:instrText>
         </w:r>
         <w:r>
           <w:rPr>
@@ -931,7 +931,7 @@
           <w:szCs w:val="22"/>
         </w:rPr>
       </w:pPr>
-      <w:hyperlink w:anchor="_Toc478974071" w:history="1">
+      <w:hyperlink w:anchor="_Toc482089117" w:history="1">
         <w:r>
           <w:rPr>
             <w:rStyle w:val="Hyperlink"/>
@@ -971,7 +971,7 @@
           <w:rPr>
             <w:noProof/>
           </w:rPr>
-          <w:instrText xml:space="preserve"> PAGEREF _Toc478974071 \h </w:instrText>
+          <w:instrText xml:space="preserve"> PAGEREF _Toc482089117 \h </w:instrText>
         </w:r>
         <w:r>
           <w:rPr>
@@ -1012,7 +1012,7 @@
           <w:szCs w:val="22"/>
         </w:rPr>
       </w:pPr>
-      <w:hyperlink w:anchor="_Toc478974072" w:history="1">
+      <w:hyperlink w:anchor="_Toc482089118" w:history="1">
         <w:r>
           <w:rPr>
             <w:rStyle w:val="Hyperlink"/>
@@ -1052,7 +1052,7 @@
           <w:rPr>
             <w:noProof/>
           </w:rPr>
-          <w:instrText xml:space="preserve"> PAGEREF _Toc478974072 \h </w:instrText>
+          <w:instrText xml:space="preserve"> PAGEREF _Toc482089118 \h </w:instrText>
         </w:r>
         <w:r>
           <w:rPr>
@@ -1093,7 +1093,7 @@
           <w:szCs w:val="22"/>
         </w:rPr>
       </w:pPr>
-      <w:hyperlink w:anchor="_Toc478974073" w:history="1">
+      <w:hyperlink w:anchor="_Toc482089119" w:history="1">
         <w:r>
           <w:rPr>
             <w:rStyle w:val="Hyperlink"/>
@@ -1133,7 +1133,7 @@
           <w:rPr>
             <w:noProof/>
           </w:rPr>
-          <w:instrText xml:space="preserve"> PAGEREF _Toc478974073 \h </w:instrText>
+          <w:instrText xml:space="preserve"> PAGEREF _Toc482089119 \h </w:instrText>
         </w:r>
         <w:r>
           <w:rPr>
@@ -1174,7 +1174,7 @@
           <w:szCs w:val="22"/>
         </w:rPr>
       </w:pPr>
-      <w:hyperlink w:anchor="_Toc478974074" w:history="1">
+      <w:hyperlink w:anchor="_Toc482089120" w:history="1">
         <w:r>
           <w:rPr>
             <w:rStyle w:val="Hyperlink"/>
@@ -1214,7 +1214,7 @@
           <w:rPr>
             <w:noProof/>
           </w:rPr>
-          <w:instrText xml:space="preserve"> PAGEREF _Toc478974074 \h </w:instrText>
+          <w:instrText xml:space="preserve"> PAGEREF _Toc482089120 \h </w:instrText>
         </w:r>
         <w:r>
           <w:rPr>
@@ -1255,7 +1255,7 @@
           <w:szCs w:val="22"/>
         </w:rPr>
       </w:pPr>
-      <w:hyperlink w:anchor="_Toc478974075" w:history="1">
+      <w:hyperlink w:anchor="_Toc482089121" w:history="1">
         <w:r>
           <w:rPr>
             <w:rStyle w:val="Hyperlink"/>
@@ -1295,7 +1295,7 @@
           <w:rPr>
             <w:noProof/>
           </w:rPr>
-          <w:instrText xml:space="preserve"> PAGEREF _Toc478974075 \h </w:instrText>
+          <w:instrText xml:space="preserve"> PAGEREF _Toc482089121 \h </w:instrText>
         </w:r>
         <w:r>
           <w:rPr>
@@ -1336,7 +1336,7 @@
           <w:szCs w:val="22"/>
         </w:rPr>
       </w:pPr>
-      <w:hyperlink w:anchor="_Toc478974076" w:history="1">
+      <w:hyperlink w:anchor="_Toc482089122" w:history="1">
         <w:r>
           <w:rPr>
             <w:rStyle w:val="Hyperlink"/>
@@ -1376,7 +1376,7 @@
           <w:rPr>
             <w:noProof/>
           </w:rPr>
-          <w:instrText xml:space="preserve"> PAGEREF _Toc478974076 \h </w:instrText>
+          <w:instrText xml:space="preserve"> PAGEREF _Toc482089122 \h </w:instrText>
         </w:r>
         <w:r>
           <w:rPr>
@@ -1417,7 +1417,7 @@
           <w:szCs w:val="22"/>
         </w:rPr>
       </w:pPr>
-      <w:hyperlink w:anchor="_Toc478974077" w:history="1">
+      <w:hyperlink w:anchor="_Toc482089123" w:history="1">
         <w:r>
           <w:rPr>
             <w:rStyle w:val="Hyperlink"/>
@@ -1457,7 +1457,7 @@
           <w:rPr>
             <w:noProof/>
           </w:rPr>
-          <w:instrText xml:space="preserve"> PAGEREF _Toc478974077 \h </w:instrText>
+          <w:instrText xml:space="preserve"> PAGEREF _Toc482089123 \h </w:instrText>
         </w:r>
         <w:r>
           <w:rPr>
@@ -1498,7 +1498,7 @@
           <w:szCs w:val="22"/>
         </w:rPr>
       </w:pPr>
-      <w:hyperlink w:anchor="_Toc478974078" w:history="1">
+      <w:hyperlink w:anchor="_Toc482089124" w:history="1">
         <w:r>
           <w:rPr>
             <w:rStyle w:val="Hyperlink"/>
@@ -1538,7 +1538,7 @@
           <w:rPr>
             <w:noProof/>
           </w:rPr>
-          <w:instrText xml:space="preserve"> PAGEREF _Toc478974078 \h </w:instrText>
+          <w:instrText xml:space="preserve"> PAGEREF _Toc482089124 \h </w:instrText>
         </w:r>
         <w:r>
           <w:rPr>
@@ -1579,7 +1579,7 @@
           <w:szCs w:val="22"/>
         </w:rPr>
       </w:pPr>
-      <w:hyperlink w:anchor="_Toc478974079" w:history="1">
+      <w:hyperlink w:anchor="_Toc482089125" w:history="1">
         <w:r>
           <w:rPr>
             <w:rStyle w:val="Hyperlink"/>
@@ -1619,7 +1619,7 @@
           <w:rPr>
             <w:noProof/>
           </w:rPr>
-          <w:instrText xml:space="preserve"> PAGEREF _Toc478974079 \h </w:instrText>
+          <w:instrText xml:space="preserve"> PAGEREF _Toc482089125 \h </w:instrText>
         </w:r>
         <w:r>
           <w:rPr>
@@ -1655,7 +1655,7 @@
           <w:szCs w:val="22"/>
         </w:rPr>
       </w:pPr>
-      <w:hyperlink w:anchor="_Toc478974080" w:history="1">
+      <w:hyperlink w:anchor="_Toc482089126" w:history="1">
         <w:r>
           <w:rPr>
             <w:rStyle w:val="Hyperlink"/>
@@ -1683,7 +1683,7 @@
           <w:fldChar w:fldCharType="begin"/>
         </w:r>
         <w:r>
-          <w:instrText xml:space="preserve"> PAGEREF _Toc478974080 \h </w:instrText>
+          <w:instrText xml:space="preserve"> PAGEREF _Toc482089126 \h </w:instrText>
         </w:r>
         <w:r>
           <w:fldChar w:fldCharType="separate"/>
@@ -1705,7 +1705,7 @@
           <w:szCs w:val="22"/>
         </w:rPr>
       </w:pPr>
-      <w:hyperlink w:anchor="_Toc478974081" w:history="1">
+      <w:hyperlink w:anchor="_Toc482089127" w:history="1">
         <w:r>
           <w:rPr>
             <w:rStyle w:val="Hyperlink"/>
@@ -1733,7 +1733,7 @@
           <w:fldChar w:fldCharType="begin"/>
         </w:r>
         <w:r>
-          <w:instrText xml:space="preserve"> PAGEREF _Toc478974081 \h </w:instrText>
+          <w:instrText xml:space="preserve"> PAGEREF _Toc482089127 \h </w:instrText>
         </w:r>
         <w:r>
           <w:fldChar w:fldCharType="separate"/>
@@ -1755,7 +1755,7 @@
           <w:szCs w:val="22"/>
         </w:rPr>
       </w:pPr>
-      <w:hyperlink w:anchor="_Toc478974082" w:history="1">
+      <w:hyperlink w:anchor="_Toc482089128" w:history="1">
         <w:r>
           <w:rPr>
             <w:rStyle w:val="Hyperlink"/>
@@ -1783,7 +1783,7 @@
           <w:fldChar w:fldCharType="begin"/>
         </w:r>
         <w:r>
-          <w:instrText xml:space="preserve"> PAGEREF _Toc478974082 \h </w:instrText>
+          <w:instrText xml:space="preserve"> PAGEREF _Toc482089128 \h </w:instrText>
         </w:r>
         <w:r>
           <w:fldChar w:fldCharType="separate"/>
@@ -1805,7 +1805,7 @@
           <w:szCs w:val="22"/>
         </w:rPr>
       </w:pPr>
-      <w:hyperlink w:anchor="_Toc478974083" w:history="1">
+      <w:hyperlink w:anchor="_Toc482089129" w:history="1">
         <w:r>
           <w:rPr>
             <w:rStyle w:val="Hyperlink"/>
@@ -1833,7 +1833,7 @@
           <w:fldChar w:fldCharType="begin"/>
         </w:r>
         <w:r>
-          <w:instrText xml:space="preserve"> PAGEREF _Toc478974083 \h </w:instrText>
+          <w:instrText xml:space="preserve"> PAGEREF _Toc482089129 \h </w:instrText>
         </w:r>
         <w:r>
           <w:fldChar w:fldCharType="separate"/>
@@ -1860,7 +1860,7 @@
           <w:szCs w:val="22"/>
         </w:rPr>
       </w:pPr>
-      <w:hyperlink w:anchor="_Toc478974084" w:history="1">
+      <w:hyperlink w:anchor="_Toc482089130" w:history="1">
         <w:r>
           <w:rPr>
             <w:rStyle w:val="Hyperlink"/>
@@ -1900,7 +1900,7 @@
           <w:rPr>
             <w:noProof/>
           </w:rPr>
-          <w:instrText xml:space="preserve"> PAGEREF _Toc478974084 \h </w:instrText>
+          <w:instrText xml:space="preserve"> PAGEREF _Toc482089130 \h </w:instrText>
         </w:r>
         <w:r>
           <w:rPr>
@@ -1936,7 +1936,7 @@
           <w:szCs w:val="22"/>
         </w:rPr>
       </w:pPr>
-      <w:hyperlink w:anchor="_Toc478974085" w:history="1">
+      <w:hyperlink w:anchor="_Toc482089131" w:history="1">
         <w:r>
           <w:rPr>
             <w:rStyle w:val="Hyperlink"/>
@@ -1964,7 +1964,7 @@
           <w:fldChar w:fldCharType="begin"/>
         </w:r>
         <w:r>
-          <w:instrText xml:space="preserve"> PAGEREF _Toc478974085 \h </w:instrText>
+          <w:instrText xml:space="preserve"> PAGEREF _Toc482089131 \h </w:instrText>
         </w:r>
         <w:r>
           <w:fldChar w:fldCharType="separate"/>
@@ -1991,7 +1991,7 @@
           <w:szCs w:val="22"/>
         </w:rPr>
       </w:pPr>
-      <w:hyperlink w:anchor="_Toc478974086" w:history="1">
+      <w:hyperlink w:anchor="_Toc482089132" w:history="1">
         <w:r>
           <w:rPr>
             <w:rStyle w:val="Hyperlink"/>
@@ -2031,7 +2031,7 @@
           <w:rPr>
             <w:noProof/>
           </w:rPr>
-          <w:instrText xml:space="preserve"> PAGEREF _Toc478974086 \h </w:instrText>
+          <w:instrText xml:space="preserve"> PAGEREF _Toc482089132 \h </w:instrText>
         </w:r>
         <w:r>
           <w:rPr>
@@ -2072,7 +2072,7 @@
           <w:szCs w:val="22"/>
         </w:rPr>
       </w:pPr>
-      <w:hyperlink w:anchor="_Toc478974087" w:history="1">
+      <w:hyperlink w:anchor="_Toc482089133" w:history="1">
         <w:r>
           <w:rPr>
             <w:rStyle w:val="Hyperlink"/>
@@ -2112,7 +2112,7 @@
           <w:rPr>
             <w:noProof/>
           </w:rPr>
-          <w:instrText xml:space="preserve"> PAGEREF _Toc478974087 \h </w:instrText>
+          <w:instrText xml:space="preserve"> PAGEREF _Toc482089133 \h </w:instrText>
         </w:r>
         <w:r>
           <w:rPr>
@@ -2153,7 +2153,7 @@
           <w:szCs w:val="22"/>
         </w:rPr>
       </w:pPr>
-      <w:hyperlink w:anchor="_Toc478974088" w:history="1">
+      <w:hyperlink w:anchor="_Toc482089134" w:history="1">
         <w:r>
           <w:rPr>
             <w:rStyle w:val="Hyperlink"/>
@@ -2193,7 +2193,7 @@
           <w:rPr>
             <w:noProof/>
           </w:rPr>
-          <w:instrText xml:space="preserve"> PAGEREF _Toc478974088 \h </w:instrText>
+          <w:instrText xml:space="preserve"> PAGEREF _Toc482089134 \h </w:instrText>
         </w:r>
         <w:r>
           <w:rPr>
@@ -2234,7 +2234,7 @@
           <w:szCs w:val="22"/>
         </w:rPr>
       </w:pPr>
-      <w:hyperlink w:anchor="_Toc478974089" w:history="1">
+      <w:hyperlink w:anchor="_Toc482089135" w:history="1">
         <w:r>
           <w:rPr>
             <w:rStyle w:val="Hyperlink"/>
@@ -2274,7 +2274,7 @@
           <w:rPr>
             <w:noProof/>
           </w:rPr>
-          <w:instrText xml:space="preserve"> PAGEREF _Toc478974089 \h </w:instrText>
+          <w:instrText xml:space="preserve"> PAGEREF _Toc482089135 \h </w:instrText>
         </w:r>
         <w:r>
           <w:rPr>
@@ -2310,7 +2310,7 @@
           <w:szCs w:val="22"/>
         </w:rPr>
       </w:pPr>
-      <w:hyperlink w:anchor="_Toc478974090" w:history="1">
+      <w:hyperlink w:anchor="_Toc482089136" w:history="1">
         <w:r>
           <w:rPr>
             <w:rStyle w:val="Hyperlink"/>
@@ -2338,7 +2338,7 @@
           <w:fldChar w:fldCharType="begin"/>
         </w:r>
         <w:r>
-          <w:instrText xml:space="preserve"> PAGEREF _Toc478974090 \h </w:instrText>
+          <w:instrText xml:space="preserve"> PAGEREF _Toc482089136 \h </w:instrText>
         </w:r>
         <w:r>
           <w:fldChar w:fldCharType="separate"/>
@@ -2360,7 +2360,7 @@
           <w:szCs w:val="22"/>
         </w:rPr>
       </w:pPr>
-      <w:hyperlink w:anchor="_Toc478974091" w:history="1">
+      <w:hyperlink w:anchor="_Toc482089137" w:history="1">
         <w:r>
           <w:rPr>
             <w:rStyle w:val="Hyperlink"/>
@@ -2388,7 +2388,7 @@
           <w:fldChar w:fldCharType="begin"/>
         </w:r>
         <w:r>
-          <w:instrText xml:space="preserve"> PAGEREF _Toc478974091 \h </w:instrText>
+          <w:instrText xml:space="preserve"> PAGEREF _Toc482089137 \h </w:instrText>
         </w:r>
         <w:r>
           <w:fldChar w:fldCharType="separate"/>
@@ -2410,7 +2410,7 @@
           <w:szCs w:val="22"/>
         </w:rPr>
       </w:pPr>
-      <w:hyperlink w:anchor="_Toc478974092" w:history="1">
+      <w:hyperlink w:anchor="_Toc482089138" w:history="1">
         <w:r>
           <w:rPr>
             <w:rStyle w:val="Hyperlink"/>
@@ -2438,7 +2438,7 @@
           <w:fldChar w:fldCharType="begin"/>
         </w:r>
         <w:r>
-          <w:instrText xml:space="preserve"> PAGEREF _Toc478974092 \h </w:instrText>
+          <w:instrText xml:space="preserve"> PAGEREF _Toc482089138 \h </w:instrText>
         </w:r>
         <w:r>
           <w:fldChar w:fldCharType="separate"/>
@@ -2465,7 +2465,7 @@
           <w:szCs w:val="22"/>
         </w:rPr>
       </w:pPr>
-      <w:hyperlink w:anchor="_Toc478974093" w:history="1">
+      <w:hyperlink w:anchor="_Toc482089139" w:history="1">
         <w:r>
           <w:rPr>
             <w:rStyle w:val="Hyperlink"/>
@@ -2505,7 +2505,7 @@
           <w:rPr>
             <w:noProof/>
           </w:rPr>
-          <w:instrText xml:space="preserve"> PAGEREF _Toc478974093 \h </w:instrText>
+          <w:instrText xml:space="preserve"> PAGEREF _Toc482089139 \h </w:instrText>
         </w:r>
         <w:r>
           <w:rPr>
@@ -2563,7 +2563,7 @@
       <w:pPr>
         <w:pStyle w:val="Heading1"/>
       </w:pPr>
-      <w:bookmarkStart w:id="1" w:name="_Toc478974066"/>
+      <w:bookmarkStart w:id="1" w:name="_Toc482089112"/>
       <w:r>
         <w:lastRenderedPageBreak/>
         <w:t>Introduction</w:t>
@@ -2687,7 +2687,7 @@
         </w:tabs>
       </w:pPr>
       <w:bookmarkStart w:id="2" w:name="_Toc453572801"/>
-      <w:bookmarkStart w:id="3" w:name="_Toc478974067"/>
+      <w:bookmarkStart w:id="3" w:name="_Toc482089113"/>
       <w:r>
         <w:t>What’s New</w:t>
       </w:r>
@@ -2977,7 +2977,7 @@
       <w:bookmarkStart w:id="5" w:name="_Ref103071794"/>
       <w:bookmarkStart w:id="6" w:name="_Ref103073047"/>
       <w:bookmarkStart w:id="7" w:name="_Ref103073090"/>
-      <w:bookmarkStart w:id="8" w:name="_Toc478974068"/>
+      <w:bookmarkStart w:id="8" w:name="_Toc482089114"/>
       <w:r>
         <w:lastRenderedPageBreak/>
         <w:t>Typographical Conventions Used in this Guide</w:t>
@@ -3370,7 +3370,7 @@
       <w:pPr>
         <w:pStyle w:val="Heading1"/>
       </w:pPr>
-      <w:bookmarkStart w:id="10" w:name="_Toc478974069"/>
+      <w:bookmarkStart w:id="10" w:name="_Toc482089115"/>
       <w:r>
         <w:lastRenderedPageBreak/>
         <w:t>The Advanced Server .NET Connector - Overview</w:t>
@@ -3436,7 +3436,7 @@
       <w:pPr>
         <w:pStyle w:val="Heading2"/>
       </w:pPr>
-      <w:bookmarkStart w:id="11" w:name="_Toc478974070"/>
+      <w:bookmarkStart w:id="11" w:name="_Toc482089116"/>
       <w:r>
         <w:t>The .NET Class Hierarchy</w:t>
       </w:r>
@@ -3594,14 +3594,12 @@
         </w:rPr>
         <w:t xml:space="preserve"> object, you must link it to an </w:t>
       </w:r>
-      <w:proofErr w:type="spellStart"/>
       <w:r>
         <w:rPr>
           <w:rStyle w:val="EDBTXTKeywordBlack"/>
         </w:rPr>
         <w:t>EDBConnection</w:t>
       </w:r>
-      <w:proofErr w:type="spellEnd"/>
       <w:r>
         <w:rPr>
           <w:color w:val="auto"/>
@@ -3703,14 +3701,12 @@
         </w:rPr>
         <w:t xml:space="preserve"> object links a result set to the Advanced Server database.  You can modify values and use the </w:t>
       </w:r>
-      <w:proofErr w:type="spellStart"/>
       <w:r>
         <w:rPr>
           <w:rStyle w:val="EDBTXTKeywordBlack"/>
         </w:rPr>
         <w:t>EDBDataAdapter</w:t>
       </w:r>
-      <w:proofErr w:type="spellEnd"/>
       <w:r>
         <w:rPr>
           <w:color w:val="auto"/>
@@ -3727,7 +3723,7 @@
       <w:pPr>
         <w:pStyle w:val="Heading2"/>
       </w:pPr>
-      <w:bookmarkStart w:id="12" w:name="_Toc478974071"/>
+      <w:bookmarkStart w:id="12" w:name="_Toc482089117"/>
       <w:r>
         <w:lastRenderedPageBreak/>
         <w:t>Installing the .NET Connector</w:t>
@@ -3791,7 +3787,7 @@
           <w:noProof/>
         </w:rPr>
         <w:drawing>
-          <wp:inline distT="0" distB="0" distL="0" distR="0" wp14:anchorId="3988D303" wp14:editId="5113E9BD">
+          <wp:inline distT="0" distB="0" distL="0" distR="0" wp14:anchorId="28BAB2A3" wp14:editId="1D63F15B">
             <wp:extent cx="4114800" cy="2728253"/>
             <wp:effectExtent l="0" t="0" r="0" b="0"/>
             <wp:docPr id="9" name="Picture 9"/>
@@ -3975,7 +3971,7 @@
         </w:rPr>
         <w:lastRenderedPageBreak/>
         <w:drawing>
-          <wp:inline distT="0" distB="0" distL="0" distR="0" wp14:anchorId="03FAD4BA" wp14:editId="48BF879C">
+          <wp:inline distT="0" distB="0" distL="0" distR="0" wp14:anchorId="1E2EF73E" wp14:editId="0ACFCE6F">
             <wp:extent cx="3886200" cy="3037805"/>
             <wp:effectExtent l="0" t="0" r="0" b="0"/>
             <wp:docPr id="2" name="Picture 2"/>
@@ -4077,7 +4073,7 @@
           <w:noProof/>
         </w:rPr>
         <w:drawing>
-          <wp:inline distT="0" distB="0" distL="0" distR="0" wp14:anchorId="76C253AB" wp14:editId="1810CBD2">
+          <wp:inline distT="0" distB="0" distL="0" distR="0" wp14:anchorId="612F21AF" wp14:editId="682C1A9A">
             <wp:extent cx="3886200" cy="3046927"/>
             <wp:effectExtent l="0" t="0" r="0" b="1270"/>
             <wp:docPr id="3" name="Picture 3"/>
@@ -4204,7 +4200,7 @@
         </w:rPr>
         <w:lastRenderedPageBreak/>
         <w:drawing>
-          <wp:inline distT="0" distB="0" distL="0" distR="0" wp14:anchorId="57680523" wp14:editId="4C9A055A">
+          <wp:inline distT="0" distB="0" distL="0" distR="0" wp14:anchorId="7F057296" wp14:editId="0F09F33C">
             <wp:extent cx="4114800" cy="3217552"/>
             <wp:effectExtent l="0" t="0" r="0" b="1905"/>
             <wp:docPr id="4" name="Picture 4"/>
@@ -4339,7 +4335,7 @@
           <w:noProof/>
         </w:rPr>
         <w:drawing>
-          <wp:inline distT="0" distB="0" distL="0" distR="0" wp14:anchorId="4BCC2E47" wp14:editId="731838CD">
+          <wp:inline distT="0" distB="0" distL="0" distR="0" wp14:anchorId="0BC4F953" wp14:editId="1E9DA54B">
             <wp:extent cx="4114800" cy="3194511"/>
             <wp:effectExtent l="0" t="0" r="0" b="6350"/>
             <wp:docPr id="5" name="Picture 5"/>
@@ -4501,7 +4497,7 @@
           <w:noProof/>
         </w:rPr>
         <w:drawing>
-          <wp:inline distT="0" distB="0" distL="0" distR="0" wp14:anchorId="0347F69B" wp14:editId="7ACC3B99">
+          <wp:inline distT="0" distB="0" distL="0" distR="0" wp14:anchorId="20DAF44E" wp14:editId="0ADB27CF">
             <wp:extent cx="3790950" cy="1619051"/>
             <wp:effectExtent l="0" t="0" r="0" b="635"/>
             <wp:docPr id="12" name="Picture 12" descr="C:\Users\susan\AppData\Local\Temp\vmware-susan\VMwareDnD\7412d23f\Screen Shot 2016-07-11 at 4.50.20 PM.png"/>
@@ -4649,7 +4645,7 @@
           <w:noProof/>
         </w:rPr>
         <w:drawing>
-          <wp:inline distT="0" distB="0" distL="0" distR="0" wp14:anchorId="08174BA2" wp14:editId="00BD3164">
+          <wp:inline distT="0" distB="0" distL="0" distR="0" wp14:anchorId="1492F104" wp14:editId="6434DE7F">
             <wp:extent cx="4114800" cy="3004331"/>
             <wp:effectExtent l="0" t="0" r="0" b="5715"/>
             <wp:docPr id="1" name="Picture 1"/>
@@ -4743,7 +4739,7 @@
         <w:pStyle w:val="Heading1"/>
       </w:pPr>
       <w:bookmarkStart w:id="13" w:name="_Ref456012125"/>
-      <w:bookmarkStart w:id="14" w:name="_Toc478974072"/>
+      <w:bookmarkStart w:id="14" w:name="_Toc482089118"/>
       <w:r>
         <w:lastRenderedPageBreak/>
         <w:t>Configuring the .NET Connector</w:t>
@@ -4915,7 +4911,7 @@
         <w:pStyle w:val="Heading2"/>
       </w:pPr>
       <w:bookmarkStart w:id="15" w:name="_Ref477525249"/>
-      <w:bookmarkStart w:id="16" w:name="_Toc478974073"/>
+      <w:bookmarkStart w:id="16" w:name="_Toc482089119"/>
       <w:r>
         <w:t>General Instructions</w:t>
       </w:r>
@@ -5181,7 +5177,7 @@
       <w:pPr>
         <w:pStyle w:val="Heading2"/>
       </w:pPr>
-      <w:bookmarkStart w:id="17" w:name="_Toc478974074"/>
+      <w:bookmarkStart w:id="17" w:name="_Toc482089120"/>
       <w:r>
         <w:t>.NET Framework 4.0</w:t>
       </w:r>
@@ -5375,7 +5371,7 @@
       <w:pPr>
         <w:pStyle w:val="Heading2"/>
       </w:pPr>
-      <w:bookmarkStart w:id="18" w:name="_Toc478974075"/>
+      <w:bookmarkStart w:id="18" w:name="_Toc482089121"/>
       <w:r>
         <w:t>.NET Framework 4.5</w:t>
       </w:r>
@@ -5576,7 +5572,7 @@
         <w:pStyle w:val="Heading2"/>
       </w:pPr>
       <w:bookmarkStart w:id="19" w:name="_Ref477527440"/>
-      <w:bookmarkStart w:id="20" w:name="_Toc478974076"/>
+      <w:bookmarkStart w:id="20" w:name="_Toc482089122"/>
       <w:r>
         <w:t>Entity Framework 6</w:t>
       </w:r>
@@ -5736,7 +5732,6 @@
       <w:r>
         <w:t xml:space="preserve"> entries for the ADO.NET driver of EDB Postgres in the </w:t>
       </w:r>
-      <w:proofErr w:type="spellStart"/>
       <w:r>
         <w:rPr>
           <w:rStyle w:val="EDBTXTKeywordBlack"/>
@@ -5749,7 +5744,6 @@
         </w:rPr>
         <w:t>.config</w:t>
       </w:r>
-      <w:proofErr w:type="spellEnd"/>
       <w:r>
         <w:t xml:space="preserve"> file. The following are the entries:</w:t>
       </w:r>
@@ -5783,31 +5777,7 @@
         <w:pStyle w:val="EDBSYNTXPreformattedBlackLeft033"/>
       </w:pPr>
       <w:r>
-        <w:t xml:space="preserve">  </w:t>
-      </w:r>
-      <w:proofErr w:type="gramStart"/>
-      <w:r>
-        <w:t>type</w:t>
-      </w:r>
-      <w:proofErr w:type="gramEnd"/>
-      <w:r>
-        <w:t>="</w:t>
-      </w:r>
-      <w:proofErr w:type="spellStart"/>
-      <w:r>
-        <w:t>EnterpriseDB.EDBClient.EDBFactory</w:t>
-      </w:r>
-      <w:proofErr w:type="spellEnd"/>
-      <w:r>
-        <w:t xml:space="preserve">, </w:t>
-      </w:r>
-      <w:proofErr w:type="spellStart"/>
-      <w:r>
-        <w:t>EnterpriseDB.EDBClient</w:t>
-      </w:r>
-      <w:proofErr w:type="spellEnd"/>
-      <w:r>
-        <w:t>, Version=3.</w:t>
+        <w:t xml:space="preserve">  type="EnterpriseDB.EDBClient.EDBFactory, EnterpriseDB.EDBClient, Version=3.</w:t>
       </w:r>
       <w:r>
         <w:t>1</w:t>
@@ -5825,15 +5795,7 @@
         <w:t>0</w:t>
       </w:r>
       <w:r>
-        <w:t xml:space="preserve">, Culture=neutral, </w:t>
-      </w:r>
-      <w:proofErr w:type="spellStart"/>
-      <w:r>
-        <w:t>PublicKeyToken</w:t>
-      </w:r>
-      <w:proofErr w:type="spellEnd"/>
-      <w:r>
-        <w:t>=5d8b90d52f46fda7"</w:t>
+        <w:t>, Culture=neutral, PublicKeyToken=5d8b90d52f46fda7"</w:t>
       </w:r>
     </w:p>
     <w:p>
@@ -5841,15 +5803,7 @@
         <w:pStyle w:val="EDBSYNTXPreformattedBlackLeft033"/>
       </w:pPr>
       <w:r>
-        <w:t xml:space="preserve">  </w:t>
-      </w:r>
-      <w:proofErr w:type="gramStart"/>
-      <w:r>
-        <w:t>support</w:t>
-      </w:r>
-      <w:proofErr w:type="gramEnd"/>
-      <w:r>
-        <w:t>="FF"/&gt;</w:t>
+        <w:t xml:space="preserve">  support="FF"/&gt;</w:t>
       </w:r>
     </w:p>
     <w:p>
@@ -6234,6 +6188,56 @@
         <w:pStyle w:val="EDBTXTNormalWebBlackCharChar0"/>
       </w:pPr>
       <w:r>
+        <w:rPr>
+          <w:rStyle w:val="EDBTXTEmphasisNormalWebBoldBlackCharChar"/>
+        </w:rPr>
+        <w:t>Note:</w:t>
+      </w:r>
+      <w:r>
+        <w:t xml:space="preserve"> The same entries for </w:t>
+      </w:r>
+      <w:r>
+        <w:rPr>
+          <w:rStyle w:val="EDBTXTKeywordBlack"/>
+        </w:rPr>
+        <w:t>&lt;providers&gt;</w:t>
+      </w:r>
+      <w:r>
+        <w:t xml:space="preserve"> and </w:t>
+      </w:r>
+      <w:r>
+        <w:rPr>
+          <w:rStyle w:val="EDBTXTKeywordBlack"/>
+        </w:rPr>
+        <w:t>&lt;DbProviderFactories&gt;</w:t>
+      </w:r>
+      <w:r>
+        <w:t xml:space="preserve"> are valid for the </w:t>
+      </w:r>
+      <w:r>
+        <w:rPr>
+          <w:rStyle w:val="EDBTXTKeywordBlack"/>
+        </w:rPr>
+        <w:t>web.config</w:t>
+      </w:r>
+      <w:r>
+        <w:t xml:space="preserve"> file as well as for </w:t>
+      </w:r>
+      <w:r>
+        <w:rPr>
+          <w:rStyle w:val="EDBTXTKeywordBlack"/>
+        </w:rPr>
+        <w:t>app.config</w:t>
+      </w:r>
+      <w:r>
+        <w:t>.</w:t>
+      </w:r>
+    </w:p>
+    <w:p>
+      <w:pPr>
+        <w:pStyle w:val="EDBTXTNormalWebBlackCharChar0"/>
+      </w:pPr>
+      <w:r>
         <w:t xml:space="preserve">Depending upon the type of application, import the namespace into the source code (see Section </w:t>
       </w:r>
       <w:r>
@@ -6300,7 +6304,7 @@
         <w:pStyle w:val="Heading2"/>
       </w:pPr>
       <w:bookmarkStart w:id="21" w:name="_Ref477528081"/>
-      <w:bookmarkStart w:id="22" w:name="_Toc478974077"/>
+      <w:bookmarkStart w:id="22" w:name="_Toc482089123"/>
       <w:r>
         <w:t>EDBDdexProvider for Visual Studio</w:t>
       </w:r>
@@ -6606,6 +6610,7 @@
         <w:rPr>
           <w:rStyle w:val="EDBTXTEmphasisNormalWebBoldBlackCharChar"/>
         </w:rPr>
+        <w:lastRenderedPageBreak/>
         <w:t>Step 5:</w:t>
       </w:r>
       <w:r>
@@ -6651,8 +6656,382 @@
         <w:pStyle w:val="EDBSYNTXPreformattedBlackLeft033"/>
       </w:pPr>
       <w:r>
+        <w:t xml:space="preserve">  description=".NET Data Provider for EnterpriseDB PostgreSQL”</w:t>
+      </w:r>
+    </w:p>
+    <w:p>
+      <w:pPr>
+        <w:pStyle w:val="EDBSYNTXPreformattedBlackLeft033"/>
+      </w:pPr>
+      <w:r>
+        <w:t xml:space="preserve">  type="EnterpriseDB.EDBClient.EDBFactory, EnterpriseDB.EDBClient, Version=3.</w:t>
+      </w:r>
+      <w:r>
+        <w:t>1</w:t>
+      </w:r>
+      <w:r>
+        <w:t>.</w:t>
+      </w:r>
+      <w:r>
+        <w:t>9</w:t>
+      </w:r>
+      <w:r>
+        <w:t>.</w:t>
+      </w:r>
+      <w:r>
+        <w:t>0</w:t>
+      </w:r>
+      <w:r>
+        <w:t>, Culture=neutral, PublicKeyToken=5d8b90d52f46fda7"</w:t>
+      </w:r>
+    </w:p>
+    <w:p>
+      <w:pPr>
+        <w:pStyle w:val="EDBSYNTXPreformattedBlackLeft033"/>
+      </w:pPr>
+      <w:r>
+        <w:t xml:space="preserve">  support="FF"/&gt;</w:t>
+      </w:r>
+    </w:p>
+    <w:p>
+      <w:pPr>
+        <w:pStyle w:val="EDBTXTNormalWebBlackCharChar0"/>
+      </w:pPr>
+      <w:r>
+        <w:rPr>
+          <w:rStyle w:val="EDBTXTEmphasisNormalWebBoldBlackCharChar"/>
+        </w:rPr>
+        <w:t>Note:</w:t>
+      </w:r>
+      <w:r>
+        <w:t xml:space="preserve"> For the attribute-value pairs, the double-quoted strings should not contain excess white space characters, but be configured on a single line. The examples shown in this section may be split on multiple lines for clarity, but should actually be configured within a single line such as the following:</w:t>
+      </w:r>
+    </w:p>
+    <w:p>
+      <w:pPr>
+        <w:pStyle w:val="EDBTXTNormalWebBlackCharChar0"/>
+        <w:rPr>
+          <w:rStyle w:val="EDBTXTKeywordBlack"/>
+        </w:rPr>
+      </w:pPr>
+      <w:r>
+        <w:rPr>
+          <w:rStyle w:val="EDBTXTKeywordBlack"/>
+        </w:rPr>
+        <w:t>description=".NET Data Provider for EnterpriseDB PostgreSQL”</w:t>
+      </w:r>
+    </w:p>
+    <w:p>
+      <w:pPr>
+        <w:pStyle w:val="EDBTXTNormalWebBlackCharChar0"/>
+      </w:pPr>
+      <w:r>
+        <w:t xml:space="preserve">For 64-bit Windows, the </w:t>
+      </w:r>
+      <w:r>
+        <w:rPr>
+          <w:rStyle w:val="EDBTXTKeywordBlack"/>
+        </w:rPr>
+        <w:t>machine.config</w:t>
+      </w:r>
+      <w:r>
+        <w:t xml:space="preserve"> file is in the following location:</w:t>
+      </w:r>
+    </w:p>
+    <w:p>
+      <w:pPr>
+        <w:pStyle w:val="EDBSYNTXPreformattedBlackLeft033"/>
+      </w:pPr>
+      <w:r>
+        <w:t>C:\Windows\Microsoft.NET\Framework64\v4.0.30319\</w:t>
+      </w:r>
+    </w:p>
+    <w:p>
+      <w:pPr>
+        <w:pStyle w:val="EDBSYNTXPreformattedBlackLeft033"/>
+      </w:pPr>
+      <w:r>
+        <w:t>Config</w:t>
+      </w:r>
+      <w:r>
+        <w:t>\machine.config</w:t>
+      </w:r>
+    </w:p>
+    <w:p>
+      <w:pPr>
+        <w:pStyle w:val="EDBTXTNormalWebBlackCharChar0"/>
+      </w:pPr>
+      <w:r>
+        <w:t xml:space="preserve">For 32-bit Windows, the </w:t>
+      </w:r>
+      <w:r>
+        <w:rPr>
+          <w:rStyle w:val="EDBTXTKeywordBlack"/>
+        </w:rPr>
+        <w:t>machine.config</w:t>
+      </w:r>
+      <w:r>
+        <w:t xml:space="preserve"> file is in the following location:</w:t>
+      </w:r>
+    </w:p>
+    <w:p>
+      <w:pPr>
+        <w:pStyle w:val="EDBSYNTXPreformattedBlackLeft033"/>
+      </w:pPr>
+      <w:r>
+        <w:t>C:\Windows\Microsoft.NET\Framework\v4.0.30319\</w:t>
+      </w:r>
+    </w:p>
+    <w:p>
+      <w:pPr>
+        <w:pStyle w:val="EDBSYNTXPreformattedBlackLeft033"/>
+      </w:pPr>
+      <w:r>
+        <w:t>Config</w:t>
+      </w:r>
+      <w:r>
+        <w:t>\machine.config</w:t>
+      </w:r>
+    </w:p>
+    <w:p>
+      <w:pPr>
+        <w:pStyle w:val="EDBTXTNormalWebBlackCharChar0"/>
+      </w:pPr>
+      <w:r>
+        <w:rPr>
+          <w:rStyle w:val="EDBTXTEmphasisNormalWebBoldBlackCharChar"/>
+        </w:rPr>
+        <w:t>Step 6:</w:t>
+      </w:r>
+      <w:r>
+        <w:t xml:space="preserve"> Place the DDL generation template </w:t>
+      </w:r>
+      <w:r>
+        <w:rPr>
+          <w:rStyle w:val="EDBTXTKeywordBlack"/>
+        </w:rPr>
+        <w:t>SSDLToPgSQL.tt</w:t>
+      </w:r>
+      <w:r>
+        <w:t xml:space="preserve"> in the </w:t>
+      </w:r>
+      <w:r>
+        <w:t xml:space="preserve">Visual Studio </w:t>
+      </w:r>
+      <w:r>
+        <w:rPr>
+          <w:rStyle w:val="EDBTXTKeywordBlack"/>
+        </w:rPr>
+        <w:t>EntityFramework Tools\DBGen\</w:t>
+      </w:r>
+      <w:r>
+        <w:t xml:space="preserve"> folder</w:t>
+      </w:r>
+      <w:r>
+        <w:t xml:space="preserve"> as in the following example</w:t>
+      </w:r>
+      <w:r>
+        <w:t>:</w:t>
+      </w:r>
+    </w:p>
+    <w:p>
+      <w:pPr>
+        <w:pStyle w:val="EDBSYNTXPreformattedBlackLeft033"/>
+      </w:pPr>
+      <w:r>
+        <w:t>C:\Program Files (x86)\Microsoft Visual Studio 14.0\</w:t>
+      </w:r>
+    </w:p>
+    <w:p>
+      <w:pPr>
+        <w:pStyle w:val="EDBSYNTXPreformattedBlackLeft033"/>
+      </w:pPr>
+      <w:r>
+        <w:t>Common7\IDE\Extensions\Microsoft\EntityFramework Tools\DBGen\</w:t>
+      </w:r>
+    </w:p>
+    <w:p>
+      <w:pPr>
+        <w:pStyle w:val="EDBTXTNormalWebBlackCharChar0"/>
+      </w:pPr>
+      <w:r>
+        <w:rPr>
+          <w:rStyle w:val="EDBTXTEmphasisNormalWebBoldBlackCharChar"/>
+        </w:rPr>
+        <w:t>Note:</w:t>
+      </w:r>
+      <w:r>
+        <w:t xml:space="preserve"> Select this template </w:t>
+      </w:r>
+      <w:r>
+        <w:rPr>
+          <w:rStyle w:val="EDBTXTKeywordBlack"/>
+        </w:rPr>
+        <w:t>SSDLToPgSQL.tt</w:t>
+      </w:r>
+      <w:r>
+        <w:t xml:space="preserve"> in your EDMX file properties.</w:t>
+      </w:r>
+    </w:p>
+    <w:p>
+      <w:pPr>
+        <w:pStyle w:val="EDBTXTNormalWebBlackCharChar0"/>
+      </w:pPr>
+      <w:r>
+        <w:rPr>
+          <w:rStyle w:val="EDBTXTEmphasisNormalWebBoldBlackCharChar"/>
+        </w:rPr>
+        <w:t>Step 7:</w:t>
+      </w:r>
+      <w:r>
+        <w:t xml:space="preserve"> Relaunch Visual Studio and verify from </w:t>
+      </w:r>
+      <w:r>
+        <w:rPr>
+          <w:rStyle w:val="EDBTXTKeywordBlack"/>
+        </w:rPr>
+        <w:t>Tools &gt; Extentions and Updates</w:t>
+      </w:r>
+      <w:r>
+        <w:t>… menu that the EDBDdexProvider extension is installed.</w:t>
+      </w:r>
+    </w:p>
+    <w:p>
+      <w:pPr>
+        <w:pStyle w:val="EDBTXTNormalWebBlackCharChar0"/>
+      </w:pPr>
+      <w:r>
+        <w:rPr>
+          <w:rStyle w:val="EDBTXTEmphasisNormalWebBoldBlackCharChar"/>
+        </w:rPr>
+        <w:t>Step 8:</w:t>
+      </w:r>
+      <w:r>
+        <w:t xml:space="preserve"> From Server Explorer, right-click on </w:t>
+      </w:r>
+      <w:r>
+        <w:rPr>
+          <w:rStyle w:val="EDBTXTKeywordBlack"/>
+        </w:rPr>
+        <w:t>Data Connections</w:t>
+      </w:r>
+      <w:r>
+        <w:t xml:space="preserve">, click </w:t>
+      </w:r>
+      <w:r>
+        <w:rPr>
+          <w:rStyle w:val="EDBTXTKeywordBlack"/>
+        </w:rPr>
+        <w:t>Add Connection</w:t>
+      </w:r>
+      <w:r>
+        <w:t xml:space="preserve">, and verify the </w:t>
+      </w:r>
+      <w:r>
+        <w:rPr>
+          <w:rStyle w:val="EDBTXTKeywordBlack"/>
+        </w:rPr>
+        <w:t>Enterprisedb Postgres Database</w:t>
+      </w:r>
+      <w:r>
+        <w:t xml:space="preserve"> data source is available.</w:t>
+      </w:r>
+    </w:p>
+    <w:p>
+      <w:pPr>
+        <w:pStyle w:val="EDBTXTNormalWebBlackCharChar0"/>
+      </w:pPr>
+      <w:r>
+        <w:rPr>
+          <w:rStyle w:val="EDBTXTEmphasisNormalWebBoldBlackCharChar"/>
+        </w:rPr>
+        <w:t>Step 9:</w:t>
+      </w:r>
+      <w:r>
+        <w:t xml:space="preserve"> Add files </w:t>
+      </w:r>
+      <w:r>
+        <w:rPr>
+          <w:rStyle w:val="EDBTXTKeywordBlack"/>
+        </w:rPr>
+        <w:t>EnterpriseDB.EDBClient.dll</w:t>
+      </w:r>
+      <w:r>
+        <w:t xml:space="preserve"> and </w:t>
+      </w:r>
+      <w:r>
+        <w:rPr>
+          <w:rStyle w:val="EDBTXTKeywordBlack"/>
+        </w:rPr>
+        <w:t>EntityFramework6.EnterpriseDB.EDBClient.dll</w:t>
+      </w:r>
+      <w:r>
+        <w:t xml:space="preserve"> in project references.</w:t>
+      </w:r>
+      <w:r>
+        <w:t xml:space="preserve"> See Section </w:t>
+      </w:r>
+      <w:r>
+        <w:rPr>
+          <w:u w:val="single"/>
+        </w:rPr>
+        <w:fldChar w:fldCharType="begin"/>
+      </w:r>
+      <w:r>
+        <w:rPr>
+          <w:u w:val="single"/>
+        </w:rPr>
+        <w:instrText xml:space="preserve"> REF _Ref477525249 \r \h </w:instrText>
+      </w:r>
+      <w:r>
+        <w:rPr>
+          <w:u w:val="single"/>
+        </w:rPr>
+      </w:r>
+      <w:r>
+        <w:rPr>
+          <w:u w:val="single"/>
+        </w:rPr>
+        <w:fldChar w:fldCharType="separate"/>
+      </w:r>
+      <w:r>
+        <w:rPr>
+          <w:u w:val="single"/>
+        </w:rPr>
+        <w:t>3.1</w:t>
+      </w:r>
+      <w:r>
+        <w:rPr>
+          <w:u w:val="single"/>
+        </w:rPr>
+        <w:fldChar w:fldCharType="end"/>
+      </w:r>
+      <w:r>
+        <w:t xml:space="preserve"> for information on referencing library files.</w:t>
+      </w:r>
+    </w:p>
+    <w:p>
+      <w:pPr>
+        <w:pStyle w:val="EDBTXTNormalWebBlackCharChar0"/>
+      </w:pPr>
+      <w:r>
+        <w:rPr>
+          <w:rStyle w:val="EDBTXTEmphasisNormalWebBoldBlackCharChar"/>
+        </w:rPr>
         <w:lastRenderedPageBreak/>
-        <w:t xml:space="preserve">  description=".NET Data Provider for EnterpriseDB PostgreSQL”</w:t>
+        <w:t>Step 10:</w:t>
+      </w:r>
+      <w:r>
+        <w:t xml:space="preserve"> In the project’s </w:t>
+      </w:r>
+      <w:r>
+        <w:rPr>
+          <w:rStyle w:val="EDBTXTKeywordBlack"/>
+        </w:rPr>
+        <w:t>app.config</w:t>
+      </w:r>
+      <w:r>
+        <w:t xml:space="preserve"> file add the following entry for provider services under the EntityFramework/providers tag.</w:t>
       </w:r>
     </w:p>
     <w:p>
@@ -6660,57 +7039,21 @@
         <w:pStyle w:val="EDBSYNTXPreformattedBlackLeft033"/>
       </w:pPr>
       <w:r>
+        <w:t>&lt;provider invaria</w:t>
+      </w:r>
+      <w:r>
+        <w:t>ntName="EnterpriseDB.EDBClient"</w:t>
+      </w:r>
+    </w:p>
+    <w:p>
+      <w:pPr>
+        <w:pStyle w:val="EDBSYNTXPreformattedBlackLeft033"/>
+      </w:pPr>
+      <w:r>
         <w:t xml:space="preserve">  </w:t>
       </w:r>
-      <w:proofErr w:type="gramStart"/>
-      <w:r>
-        <w:t>type</w:t>
-      </w:r>
-      <w:proofErr w:type="gramEnd"/>
-      <w:r>
-        <w:t>="</w:t>
-      </w:r>
-      <w:proofErr w:type="spellStart"/>
-      <w:r>
-        <w:t>EnterpriseDB.EDBClient.EDBFactory</w:t>
-      </w:r>
-      <w:proofErr w:type="spellEnd"/>
-      <w:r>
-        <w:t xml:space="preserve">, </w:t>
-      </w:r>
-      <w:proofErr w:type="spellStart"/>
-      <w:r>
-        <w:t>EnterpriseDB.EDBClient</w:t>
-      </w:r>
-      <w:proofErr w:type="spellEnd"/>
-      <w:r>
-        <w:t>, Version=3.</w:t>
-      </w:r>
-      <w:r>
-        <w:t>1</w:t>
-      </w:r>
-      <w:r>
-        <w:t>.</w:t>
-      </w:r>
-      <w:r>
-        <w:t>9</w:t>
-      </w:r>
-      <w:r>
-        <w:t>.</w:t>
-      </w:r>
-      <w:r>
-        <w:t>0</w:t>
-      </w:r>
-      <w:r>
-        <w:t xml:space="preserve">, Culture=neutral, </w:t>
-      </w:r>
-      <w:proofErr w:type="spellStart"/>
-      <w:r>
-        <w:t>PublicKeyToken</w:t>
-      </w:r>
-      <w:proofErr w:type="spellEnd"/>
-      <w:r>
-        <w:t>=5d8b90d52f46fda7"</w:t>
+      <w:r>
+        <w:t>type="EnterpriseDB.EDBClient.EDBServices, EntityFramework6.EnterpriseDB.EDBClient"&gt;</w:t>
       </w:r>
     </w:p>
     <w:p>
@@ -6718,338 +7061,15 @@
         <w:pStyle w:val="EDBSYNTXPreformattedBlackLeft033"/>
       </w:pPr>
       <w:r>
-        <w:t xml:space="preserve">  support="FF"/&gt;</w:t>
-      </w:r>
-    </w:p>
-    <w:p>
-      <w:pPr>
-        <w:pStyle w:val="EDBTXTNormalWebBlackCharChar0"/>
-      </w:pPr>
-      <w:r>
-        <w:rPr>
-          <w:rStyle w:val="EDBTXTEmphasisNormalWebBoldBlackCharChar"/>
-        </w:rPr>
-        <w:t>Note:</w:t>
-      </w:r>
-      <w:r>
-        <w:t xml:space="preserve"> For the attribute-value pairs, the double-quoted strings should not contain excess white space characters, but be configured on a single line. The examples shown in this section may be split on multiple lines for clarity, but should actually be configured within a single line such as the following:</w:t>
-      </w:r>
-    </w:p>
-    <w:p>
-      <w:pPr>
-        <w:pStyle w:val="EDBTXTNormalWebBlackCharChar0"/>
-        <w:rPr>
-          <w:rStyle w:val="EDBTXTKeywordBlack"/>
-        </w:rPr>
-      </w:pPr>
-      <w:r>
-        <w:rPr>
-          <w:rStyle w:val="EDBTXTKeywordBlack"/>
-        </w:rPr>
-        <w:t>description=".NET Data Provider for EnterpriseDB PostgreSQL”</w:t>
-      </w:r>
-    </w:p>
-    <w:p>
-      <w:pPr>
-        <w:pStyle w:val="EDBTXTNormalWebBlackCharChar0"/>
-      </w:pPr>
-      <w:r>
-        <w:t xml:space="preserve">For 64-bit Windows, the </w:t>
-      </w:r>
-      <w:r>
-        <w:rPr>
-          <w:rStyle w:val="EDBTXTKeywordBlack"/>
-        </w:rPr>
-        <w:t>machine.config</w:t>
-      </w:r>
-      <w:r>
-        <w:t xml:space="preserve"> file is in the following location:</w:t>
-      </w:r>
-    </w:p>
-    <w:p>
-      <w:pPr>
-        <w:pStyle w:val="EDBSYNTXPreformattedBlackLeft033"/>
-      </w:pPr>
-      <w:r>
-        <w:t>C:\Windows\Microsoft.NET\Framework64\v4.0.30319\</w:t>
-      </w:r>
-    </w:p>
-    <w:p>
-      <w:pPr>
-        <w:pStyle w:val="EDBSYNTXPreformattedBlackLeft033"/>
-      </w:pPr>
-      <w:r>
-        <w:t>Config</w:t>
-      </w:r>
-      <w:r>
-        <w:t>\machine.config</w:t>
-      </w:r>
-    </w:p>
-    <w:p>
-      <w:pPr>
-        <w:pStyle w:val="EDBTXTNormalWebBlackCharChar0"/>
-      </w:pPr>
-      <w:r>
-        <w:t xml:space="preserve">For 32-bit Windows, the </w:t>
-      </w:r>
-      <w:r>
-        <w:rPr>
-          <w:rStyle w:val="EDBTXTKeywordBlack"/>
-        </w:rPr>
-        <w:t>machine.config</w:t>
-      </w:r>
-      <w:r>
-        <w:t xml:space="preserve"> file is in the following location:</w:t>
-      </w:r>
-    </w:p>
-    <w:p>
-      <w:pPr>
-        <w:pStyle w:val="EDBSYNTXPreformattedBlackLeft033"/>
-      </w:pPr>
-      <w:r>
-        <w:t>C:\Windows\Microsoft.NET\Framework\v4.0.30319\</w:t>
-      </w:r>
-    </w:p>
-    <w:p>
-      <w:pPr>
-        <w:pStyle w:val="EDBSYNTXPreformattedBlackLeft033"/>
-      </w:pPr>
-      <w:r>
-        <w:t>Config</w:t>
-      </w:r>
-      <w:r>
-        <w:t>\machine.config</w:t>
-      </w:r>
-    </w:p>
-    <w:p>
-      <w:pPr>
-        <w:pStyle w:val="EDBTXTNormalWebBlackCharChar0"/>
-      </w:pPr>
-      <w:r>
-        <w:rPr>
-          <w:rStyle w:val="EDBTXTEmphasisNormalWebBoldBlackCharChar"/>
-        </w:rPr>
-        <w:t>Step 6:</w:t>
-      </w:r>
-      <w:r>
-        <w:t xml:space="preserve"> Place the DDL generation template </w:t>
-      </w:r>
-      <w:r>
-        <w:rPr>
-          <w:rStyle w:val="EDBTXTKeywordBlack"/>
-        </w:rPr>
-        <w:t>SSDLToPgSQL.tt</w:t>
-      </w:r>
-      <w:r>
-        <w:t xml:space="preserve"> in the </w:t>
-      </w:r>
-      <w:r>
-        <w:t xml:space="preserve">Visual Studio </w:t>
-      </w:r>
-      <w:r>
-        <w:rPr>
-          <w:rStyle w:val="EDBTXTKeywordBlack"/>
-        </w:rPr>
-        <w:t>EntityFramework Tools\DBGen\</w:t>
-      </w:r>
-      <w:r>
-        <w:t xml:space="preserve"> folder</w:t>
-      </w:r>
-      <w:r>
-        <w:t xml:space="preserve"> as in the following example</w:t>
-      </w:r>
-      <w:r>
-        <w:t>:</w:t>
-      </w:r>
-    </w:p>
-    <w:p>
-      <w:pPr>
-        <w:pStyle w:val="EDBSYNTXPreformattedBlackLeft033"/>
-      </w:pPr>
-      <w:r>
-        <w:t>C:\Program Files (x86)\Microsoft Visual Studio 14.0\</w:t>
-      </w:r>
-    </w:p>
-    <w:p>
-      <w:pPr>
-        <w:pStyle w:val="EDBSYNTXPreformattedBlackLeft033"/>
-      </w:pPr>
-      <w:r>
-        <w:t>Common7\IDE\Extensions\Microsoft\EntityFramework Tools\DBGen\</w:t>
-      </w:r>
-    </w:p>
-    <w:p>
-      <w:pPr>
-        <w:pStyle w:val="EDBTXTNormalWebBlackCharChar0"/>
-      </w:pPr>
-      <w:r>
-        <w:rPr>
-          <w:rStyle w:val="EDBTXTEmphasisNormalWebBoldBlackCharChar"/>
-        </w:rPr>
-        <w:t>Note:</w:t>
-      </w:r>
-      <w:r>
-        <w:t xml:space="preserve"> Select this template </w:t>
-      </w:r>
-      <w:r>
-        <w:rPr>
-          <w:rStyle w:val="EDBTXTKeywordBlack"/>
-        </w:rPr>
-        <w:t>SSDLToPgSQL.tt</w:t>
-      </w:r>
-      <w:r>
-        <w:t xml:space="preserve"> in your EDMX file properties.</w:t>
-      </w:r>
-    </w:p>
-    <w:p>
-      <w:pPr>
-        <w:pStyle w:val="EDBTXTNormalWebBlackCharChar0"/>
-      </w:pPr>
-      <w:r>
-        <w:rPr>
-          <w:rStyle w:val="EDBTXTEmphasisNormalWebBoldBlackCharChar"/>
-        </w:rPr>
-        <w:t>Step 7:</w:t>
-      </w:r>
-      <w:r>
-        <w:t xml:space="preserve"> Relaunch Visual Studio and verify from </w:t>
-      </w:r>
-      <w:r>
-        <w:rPr>
-          <w:rStyle w:val="EDBTXTKeywordBlack"/>
-        </w:rPr>
-        <w:t>Tools &gt; Extentions and Updates</w:t>
-      </w:r>
-      <w:r>
-        <w:t>… menu that the EDBDdexProvider extension is installed.</w:t>
-      </w:r>
-    </w:p>
-    <w:p>
-      <w:pPr>
-        <w:pStyle w:val="EDBTXTNormalWebBlackCharChar0"/>
-      </w:pPr>
-      <w:r>
-        <w:rPr>
-          <w:rStyle w:val="EDBTXTEmphasisNormalWebBoldBlackCharChar"/>
-        </w:rPr>
-        <w:t>Step 8:</w:t>
-      </w:r>
-      <w:r>
-        <w:t xml:space="preserve"> From Server Explorer, right-click on </w:t>
-      </w:r>
-      <w:r>
-        <w:rPr>
-          <w:rStyle w:val="EDBTXTKeywordBlack"/>
-        </w:rPr>
-        <w:t>Data Connections</w:t>
-      </w:r>
-      <w:r>
-        <w:t xml:space="preserve">, click </w:t>
-      </w:r>
-      <w:r>
-        <w:rPr>
-          <w:rStyle w:val="EDBTXTKeywordBlack"/>
-        </w:rPr>
-        <w:t>Add Connection</w:t>
-      </w:r>
-      <w:r>
-        <w:t xml:space="preserve">, and verify the </w:t>
-      </w:r>
-      <w:r>
-        <w:rPr>
-          <w:rStyle w:val="EDBTXTKeywordBlack"/>
-        </w:rPr>
-        <w:t>Enterprisedb Postgres Database</w:t>
-      </w:r>
-      <w:r>
-        <w:t xml:space="preserve"> data source is available.</w:t>
-      </w:r>
-    </w:p>
-    <w:p>
-      <w:pPr>
-        <w:pStyle w:val="EDBTXTNormalWebBlackCharChar0"/>
-      </w:pPr>
-      <w:r>
-        <w:rPr>
-          <w:rStyle w:val="EDBTXTEmphasisNormalWebBoldBlackCharChar"/>
-        </w:rPr>
-        <w:t>Step 9:</w:t>
-      </w:r>
-      <w:r>
-        <w:t xml:space="preserve"> Add files </w:t>
-      </w:r>
-      <w:r>
-        <w:rPr>
-          <w:rStyle w:val="EDBTXTKeywordBlack"/>
-        </w:rPr>
-        <w:t>EnterpriseDB.EDBClient.dll</w:t>
-      </w:r>
-      <w:r>
-        <w:t xml:space="preserve"> and </w:t>
-      </w:r>
-      <w:r>
-        <w:rPr>
-          <w:rStyle w:val="EDBTXTKeywordBlack"/>
-        </w:rPr>
-        <w:t>EntityFramework6.EnterpriseDB.EDBClient.dll</w:t>
-      </w:r>
-      <w:r>
-        <w:t xml:space="preserve"> in project references.</w:t>
-      </w:r>
-      <w:r>
-        <w:t xml:space="preserve"> See Section </w:t>
-      </w:r>
-      <w:r>
-        <w:rPr>
-          <w:u w:val="single"/>
-        </w:rPr>
-        <w:fldChar w:fldCharType="begin"/>
-      </w:r>
-      <w:r>
-        <w:rPr>
-          <w:u w:val="single"/>
-        </w:rPr>
-        <w:instrText xml:space="preserve"> REF _Ref477525249 \r \h </w:instrText>
-      </w:r>
-      <w:r>
-        <w:rPr>
-          <w:u w:val="single"/>
-        </w:rPr>
-      </w:r>
-      <w:r>
-        <w:rPr>
-          <w:u w:val="single"/>
-        </w:rPr>
-        <w:fldChar w:fldCharType="separate"/>
-      </w:r>
-      <w:r>
-        <w:rPr>
-          <w:u w:val="single"/>
-        </w:rPr>
-        <w:t>3.1</w:t>
-      </w:r>
-      <w:r>
-        <w:rPr>
-          <w:u w:val="single"/>
-        </w:rPr>
-        <w:fldChar w:fldCharType="end"/>
-      </w:r>
-      <w:r>
-        <w:t xml:space="preserve"> for information on referencing library files.</w:t>
-      </w:r>
-    </w:p>
-    <w:p>
-      <w:pPr>
-        <w:pStyle w:val="EDBTXTNormalWebBlackCharChar0"/>
-      </w:pPr>
-      <w:r>
-        <w:rPr>
-          <w:rStyle w:val="EDBTXTEmphasisNormalWebBoldBlackCharChar"/>
-        </w:rPr>
-        <w:t>Step 10:</w:t>
-      </w:r>
-      <w:r>
-        <w:t xml:space="preserve"> In the project’s </w:t>
+        <w:t>&lt;/provider&gt;</w:t>
+      </w:r>
+    </w:p>
+    <w:p>
+      <w:pPr>
+        <w:pStyle w:val="EDBTXTNormalWebBlackCharChar0"/>
+      </w:pPr>
+      <w:r>
+        <w:t xml:space="preserve">The following is an example of the </w:t>
       </w:r>
       <w:r>
         <w:rPr>
@@ -7058,54 +7078,6 @@
         <w:t>app.config</w:t>
       </w:r>
       <w:r>
-        <w:t xml:space="preserve"> file add the following entry for provider services under the EntityFramework/providers tag.</w:t>
-      </w:r>
-    </w:p>
-    <w:p>
-      <w:pPr>
-        <w:pStyle w:val="EDBSYNTXPreformattedBlackLeft033"/>
-      </w:pPr>
-      <w:r>
-        <w:t>&lt;provider invaria</w:t>
-      </w:r>
-      <w:r>
-        <w:t>ntName="EnterpriseDB.EDBClient"</w:t>
-      </w:r>
-    </w:p>
-    <w:p>
-      <w:pPr>
-        <w:pStyle w:val="EDBSYNTXPreformattedBlackLeft033"/>
-      </w:pPr>
-      <w:r>
-        <w:lastRenderedPageBreak/>
-        <w:t xml:space="preserve">  </w:t>
-      </w:r>
-      <w:r>
-        <w:t>type="EnterpriseDB.EDBClient.EDBServices, EntityFramework6.EnterpriseDB.EDBClient"&gt;</w:t>
-      </w:r>
-    </w:p>
-    <w:p>
-      <w:pPr>
-        <w:pStyle w:val="EDBSYNTXPreformattedBlackLeft033"/>
-      </w:pPr>
-      <w:r>
-        <w:t>&lt;/provider&gt;</w:t>
-      </w:r>
-    </w:p>
-    <w:p>
-      <w:pPr>
-        <w:pStyle w:val="EDBTXTNormalWebBlackCharChar0"/>
-      </w:pPr>
-      <w:r>
-        <w:t xml:space="preserve">The following is an example of the </w:t>
-      </w:r>
-      <w:r>
-        <w:rPr>
-          <w:rStyle w:val="EDBTXTKeywordBlack"/>
-        </w:rPr>
-        <w:t>app.config</w:t>
-      </w:r>
-      <w:r>
         <w:t xml:space="preserve"> file.</w:t>
       </w:r>
     </w:p>
@@ -7380,35 +7352,35 @@
         <w:rPr>
           <w:sz w:val="16"/>
         </w:rPr>
-        <w:t>" type="</w:t>
-      </w:r>
-      <w:proofErr w:type="spellStart"/>
-      <w:r>
+        <w:t>" type="EnterpriseDB.EDBClient.EDBFactory, EnterpriseDB.EDBClient"/&gt;</w:t>
+      </w:r>
+    </w:p>
+    <w:p>
+      <w:pPr>
+        <w:pStyle w:val="EDBEXCourierNew9ptCustomColorRGB4649146Left01"/>
         <w:rPr>
           <w:sz w:val="16"/>
         </w:rPr>
-        <w:t>EnterpriseDB.EDBClient.EDBFactory</w:t>
-      </w:r>
-      <w:proofErr w:type="spellEnd"/>
+      </w:pPr>
       <w:r>
         <w:rPr>
           <w:sz w:val="16"/>
         </w:rPr>
-        <w:t xml:space="preserve">, </w:t>
-      </w:r>
-      <w:proofErr w:type="spellStart"/>
-      <w:r>
+        <w:t xml:space="preserve">    &lt;/DbProviderFactories&gt;</w:t>
+      </w:r>
+    </w:p>
+    <w:p>
+      <w:pPr>
+        <w:pStyle w:val="EDBEXCourierNew9ptCustomColorRGB4649146Left01"/>
         <w:rPr>
           <w:sz w:val="16"/>
         </w:rPr>
-        <w:t>EnterpriseDB.EDBClient</w:t>
-      </w:r>
-      <w:proofErr w:type="spellEnd"/>
+      </w:pPr>
       <w:r>
         <w:rPr>
           <w:sz w:val="16"/>
         </w:rPr>
-        <w:t>"/&gt;</w:t>
+        <w:t xml:space="preserve">  &lt;/system.data&gt;</w:t>
       </w:r>
     </w:p>
     <w:p>
@@ -7418,46 +7390,18 @@
           <w:sz w:val="16"/>
         </w:rPr>
       </w:pPr>
-      <w:r>
+    </w:p>
+    <w:p>
+      <w:pPr>
+        <w:pStyle w:val="EDBEXCourierNew9ptCustomColorRGB4649146Left01"/>
         <w:rPr>
           <w:sz w:val="16"/>
         </w:rPr>
-        <w:t xml:space="preserve">    &lt;/DbProviderFactories&gt;</w:t>
-      </w:r>
-    </w:p>
-    <w:p>
-      <w:pPr>
-        <w:pStyle w:val="EDBEXCourierNew9ptCustomColorRGB4649146Left01"/>
+      </w:pPr>
+      <w:r>
         <w:rPr>
           <w:sz w:val="16"/>
         </w:rPr>
-      </w:pPr>
-      <w:r>
-        <w:rPr>
-          <w:sz w:val="16"/>
-        </w:rPr>
-        <w:t xml:space="preserve">  &lt;/system.data&gt;</w:t>
-      </w:r>
-    </w:p>
-    <w:p>
-      <w:pPr>
-        <w:pStyle w:val="EDBEXCourierNew9ptCustomColorRGB4649146Left01"/>
-        <w:rPr>
-          <w:sz w:val="16"/>
-        </w:rPr>
-      </w:pPr>
-    </w:p>
-    <w:p>
-      <w:pPr>
-        <w:pStyle w:val="EDBEXCourierNew9ptCustomColorRGB4649146Left01"/>
-        <w:rPr>
-          <w:sz w:val="16"/>
-        </w:rPr>
-      </w:pPr>
-      <w:r>
-        <w:rPr>
-          <w:sz w:val="16"/>
-        </w:rPr>
         <w:t>&lt;/configuration&gt;</w:t>
       </w:r>
     </w:p>
@@ -7470,12 +7414,14 @@
       <w:pPr>
         <w:pStyle w:val="Heading1"/>
       </w:pPr>
-      <w:bookmarkStart w:id="23" w:name="_Toc478974078"/>
+      <w:bookmarkStart w:id="23" w:name="_Ref482087625"/>
+      <w:bookmarkStart w:id="24" w:name="_Toc482089124"/>
       <w:r>
         <w:lastRenderedPageBreak/>
         <w:t>Using the .NET Connector</w:t>
       </w:r>
       <w:bookmarkEnd w:id="23"/>
+      <w:bookmarkEnd w:id="24"/>
     </w:p>
     <w:p>
       <w:pPr>
@@ -7723,11 +7669,11 @@
       <w:pPr>
         <w:pStyle w:val="Heading2"/>
       </w:pPr>
-      <w:bookmarkStart w:id="24" w:name="_Toc478974079"/>
+      <w:bookmarkStart w:id="25" w:name="_Toc482089125"/>
       <w:r>
         <w:t>Opening a Database Connection</w:t>
       </w:r>
-      <w:bookmarkEnd w:id="24"/>
+      <w:bookmarkEnd w:id="25"/>
     </w:p>
     <w:p>
       <w:pPr>
@@ -7940,11 +7886,13 @@
       <w:pPr>
         <w:pStyle w:val="Heading3"/>
       </w:pPr>
-      <w:bookmarkStart w:id="25" w:name="_Toc478974080"/>
+      <w:bookmarkStart w:id="26" w:name="_Ref482087661"/>
+      <w:bookmarkStart w:id="27" w:name="_Toc482089126"/>
       <w:r>
         <w:t>Connection String Parameters</w:t>
       </w:r>
-      <w:bookmarkEnd w:id="25"/>
+      <w:bookmarkEnd w:id="26"/>
+      <w:bookmarkEnd w:id="27"/>
       <w:r>
         <w:t xml:space="preserve"> </w:t>
       </w:r>
@@ -9003,14 +8951,14 @@
       <w:pPr>
         <w:pStyle w:val="Heading3"/>
       </w:pPr>
-      <w:bookmarkStart w:id="26" w:name="_Toc478974081"/>
+      <w:bookmarkStart w:id="28" w:name="_Toc482089127"/>
       <w:r>
         <w:t xml:space="preserve">Example - </w:t>
       </w:r>
       <w:r>
         <w:t>Opening a Database Connection using ASP.NET</w:t>
       </w:r>
-      <w:bookmarkEnd w:id="26"/>
+      <w:bookmarkEnd w:id="28"/>
       <w:r>
         <w:t xml:space="preserve"> </w:t>
       </w:r>
@@ -9044,22 +8992,86 @@
         <w:t>DB_CONN_STRING</w:t>
       </w:r>
       <w:r>
-        <w:t xml:space="preserve"> configuration parameter (see Section 2.3, </w:t>
-      </w:r>
-      <w:r>
-        <w:rPr>
-          <w:i/>
-        </w:rPr>
-        <w:t>The web.config File</w:t>
-      </w:r>
-      <w:r>
-        <w:t>)</w:t>
-      </w:r>
-      <w:r>
-        <w:t>.</w:t>
-      </w:r>
-      <w:r>
-        <w:t xml:space="preserve"> </w:t>
+        <w:t xml:space="preserve"> configuration parameter (see </w:t>
+      </w:r>
+      <w:r>
+        <w:t xml:space="preserve">the beginning of Chapter </w:t>
+      </w:r>
+      <w:r>
+        <w:rPr>
+          <w:u w:val="single"/>
+        </w:rPr>
+        <w:fldChar w:fldCharType="begin"/>
+      </w:r>
+      <w:r>
+        <w:rPr>
+          <w:u w:val="single"/>
+        </w:rPr>
+        <w:instrText xml:space="preserve"> REF _Ref482087625 \r \h </w:instrText>
+      </w:r>
+      <w:r>
+        <w:rPr>
+          <w:u w:val="single"/>
+        </w:rPr>
+      </w:r>
+      <w:r>
+        <w:rPr>
+          <w:u w:val="single"/>
+        </w:rPr>
+        <w:fldChar w:fldCharType="separate"/>
+      </w:r>
+      <w:r>
+        <w:rPr>
+          <w:u w:val="single"/>
+        </w:rPr>
+        <w:t>4</w:t>
+      </w:r>
+      <w:r>
+        <w:rPr>
+          <w:u w:val="single"/>
+        </w:rPr>
+        <w:fldChar w:fldCharType="end"/>
+      </w:r>
+      <w:r>
+        <w:t xml:space="preserve"> for an introduction to connection information and Section </w:t>
+      </w:r>
+      <w:r>
+        <w:rPr>
+          <w:u w:val="single"/>
+        </w:rPr>
+        <w:fldChar w:fldCharType="begin"/>
+      </w:r>
+      <w:r>
+        <w:rPr>
+          <w:u w:val="single"/>
+        </w:rPr>
+        <w:instrText xml:space="preserve"> REF _Ref482087661 \r \h </w:instrText>
+      </w:r>
+      <w:r>
+        <w:rPr>
+          <w:u w:val="single"/>
+        </w:rPr>
+      </w:r>
+      <w:r>
+        <w:rPr>
+          <w:u w:val="single"/>
+        </w:rPr>
+        <w:fldChar w:fldCharType="separate"/>
+      </w:r>
+      <w:r>
+        <w:rPr>
+          <w:u w:val="single"/>
+        </w:rPr>
+        <w:t>4.1.1</w:t>
+      </w:r>
+      <w:r>
+        <w:rPr>
+          <w:u w:val="single"/>
+        </w:rPr>
+        <w:fldChar w:fldCharType="end"/>
+      </w:r>
+      <w:r>
+        <w:t xml:space="preserve"> for connection parameters).</w:t>
       </w:r>
     </w:p>
     <w:p>
@@ -9359,7 +9371,7 @@
           <w:noProof/>
         </w:rPr>
         <w:drawing>
-          <wp:inline distT="0" distB="0" distL="0" distR="0" wp14:anchorId="3E6AD63B" wp14:editId="23A964A3">
+          <wp:inline distT="0" distB="0" distL="0" distR="0" wp14:anchorId="78DFCFE0" wp14:editId="3D36B2E5">
             <wp:extent cx="5480050" cy="1663700"/>
             <wp:effectExtent l="0" t="0" r="6350" b="0"/>
             <wp:docPr id="7" name="Picture 7" descr="Screen Shot 2014-06-26 at 8"/>
@@ -9410,15 +9422,6 @@
     </w:p>
     <w:p>
       <w:pPr>
-        <w:widowControl w:val="0"/>
-        <w:autoSpaceDE w:val="0"/>
-        <w:autoSpaceDN w:val="0"/>
-        <w:adjustRightInd w:val="0"/>
-        <w:spacing w:after="320"/>
-      </w:pPr>
-    </w:p>
-    <w:p>
-      <w:pPr>
         <w:pStyle w:val="EDBHTMLPageBreak"/>
       </w:pPr>
     </w:p>
@@ -9426,14 +9429,14 @@
       <w:pPr>
         <w:pStyle w:val="Heading3"/>
       </w:pPr>
-      <w:bookmarkStart w:id="27" w:name="_Toc478974082"/>
+      <w:bookmarkStart w:id="29" w:name="_Toc482089128"/>
       <w:r>
         <w:t xml:space="preserve">Example - </w:t>
       </w:r>
       <w:r>
         <w:t>Opening a Database Connection from a Console Application</w:t>
       </w:r>
-      <w:bookmarkEnd w:id="27"/>
+      <w:bookmarkEnd w:id="29"/>
     </w:p>
     <w:p>
       <w:pPr>
@@ -10039,14 +10042,14 @@
       <w:pPr>
         <w:pStyle w:val="Heading3"/>
       </w:pPr>
-      <w:bookmarkStart w:id="28" w:name="_Toc478974083"/>
+      <w:bookmarkStart w:id="30" w:name="_Toc482089129"/>
       <w:r>
         <w:t xml:space="preserve">Example - </w:t>
       </w:r>
       <w:r>
         <w:t>Opening a Database Connection from a Windows Form Application</w:t>
       </w:r>
-      <w:bookmarkEnd w:id="28"/>
+      <w:bookmarkEnd w:id="30"/>
     </w:p>
     <w:p>
       <w:pPr>
@@ -10836,7 +10839,7 @@
           <w:noProof/>
         </w:rPr>
         <w:drawing>
-          <wp:inline distT="0" distB="0" distL="0" distR="0" wp14:anchorId="34867478" wp14:editId="252EDC5D">
+          <wp:inline distT="0" distB="0" distL="0" distR="0" wp14:anchorId="62889672" wp14:editId="2D00798B">
             <wp:extent cx="2120900" cy="2120900"/>
             <wp:effectExtent l="0" t="0" r="0" b="0"/>
             <wp:docPr id="8" name="Picture 8" descr="dialog"/>
@@ -10948,12 +10951,12 @@
       <w:pPr>
         <w:pStyle w:val="Heading2"/>
       </w:pPr>
-      <w:bookmarkStart w:id="29" w:name="_Toc478974084"/>
+      <w:bookmarkStart w:id="31" w:name="_Toc482089130"/>
       <w:r>
         <w:lastRenderedPageBreak/>
         <w:t>Retrieving Database Records</w:t>
       </w:r>
-      <w:bookmarkEnd w:id="29"/>
+      <w:bookmarkEnd w:id="31"/>
     </w:p>
     <w:p>
       <w:pPr>
@@ -12032,14 +12035,14 @@
       <w:pPr>
         <w:pStyle w:val="Heading3"/>
       </w:pPr>
-      <w:bookmarkStart w:id="30" w:name="_Toc478974085"/>
+      <w:bookmarkStart w:id="32" w:name="_Toc482089131"/>
       <w:r>
         <w:t>Retr</w:t>
       </w:r>
       <w:r>
         <w:t>ieving a Single Database Record</w:t>
       </w:r>
-      <w:bookmarkEnd w:id="30"/>
+      <w:bookmarkEnd w:id="32"/>
     </w:p>
     <w:p>
       <w:pPr>
@@ -12566,12 +12569,12 @@
       <w:pPr>
         <w:pStyle w:val="Heading2"/>
       </w:pPr>
-      <w:bookmarkStart w:id="31" w:name="_Toc478974086"/>
+      <w:bookmarkStart w:id="33" w:name="_Toc482089132"/>
       <w:r>
         <w:lastRenderedPageBreak/>
         <w:t>Parameterized Queries</w:t>
       </w:r>
-      <w:bookmarkEnd w:id="31"/>
+      <w:bookmarkEnd w:id="33"/>
     </w:p>
     <w:p>
       <w:pPr>
@@ -13247,12 +13250,12 @@
       <w:pPr>
         <w:pStyle w:val="Heading2"/>
       </w:pPr>
-      <w:bookmarkStart w:id="32" w:name="_Toc478974087"/>
+      <w:bookmarkStart w:id="34" w:name="_Toc482089133"/>
       <w:r>
         <w:lastRenderedPageBreak/>
         <w:t>Inserting Records in a Database</w:t>
       </w:r>
-      <w:bookmarkEnd w:id="32"/>
+      <w:bookmarkEnd w:id="34"/>
     </w:p>
     <w:p>
       <w:pPr>
@@ -14093,12 +14096,12 @@
       <w:pPr>
         <w:pStyle w:val="Heading2"/>
       </w:pPr>
-      <w:bookmarkStart w:id="33" w:name="_Toc478974088"/>
+      <w:bookmarkStart w:id="35" w:name="_Toc482089134"/>
       <w:r>
         <w:lastRenderedPageBreak/>
         <w:t>Deleting Records in a Database</w:t>
       </w:r>
-      <w:bookmarkEnd w:id="33"/>
+      <w:bookmarkEnd w:id="35"/>
     </w:p>
     <w:p>
       <w:pPr>
@@ -14935,12 +14938,12 @@
       <w:pPr>
         <w:pStyle w:val="Heading2"/>
       </w:pPr>
-      <w:bookmarkStart w:id="34" w:name="_Toc478974089"/>
+      <w:bookmarkStart w:id="36" w:name="_Toc482089135"/>
       <w:r>
         <w:lastRenderedPageBreak/>
         <w:t>Using SPL Stored Procedures in your .NET Application</w:t>
       </w:r>
-      <w:bookmarkEnd w:id="34"/>
+      <w:bookmarkEnd w:id="36"/>
     </w:p>
     <w:p>
       <w:pPr>
@@ -15211,7 +15214,7 @@
       <w:pPr>
         <w:pStyle w:val="Heading3"/>
       </w:pPr>
-      <w:bookmarkStart w:id="35" w:name="_Toc478974090"/>
+      <w:bookmarkStart w:id="37" w:name="_Toc482089136"/>
       <w:r>
         <w:t>Example - Executing</w:t>
       </w:r>
@@ -15221,7 +15224,7 @@
       <w:r>
         <w:t xml:space="preserve"> without Parameters</w:t>
       </w:r>
-      <w:bookmarkEnd w:id="35"/>
+      <w:bookmarkEnd w:id="37"/>
     </w:p>
     <w:p>
       <w:pPr>
@@ -16140,14 +16143,14 @@
       <w:pPr>
         <w:pStyle w:val="Heading3"/>
       </w:pPr>
-      <w:bookmarkStart w:id="36" w:name="_Toc478974091"/>
+      <w:bookmarkStart w:id="38" w:name="_Toc482089137"/>
       <w:r>
         <w:t xml:space="preserve">Example - </w:t>
       </w:r>
       <w:r>
         <w:t>Executing a Stored Procedure with IN Parameters</w:t>
       </w:r>
-      <w:bookmarkEnd w:id="36"/>
+      <w:bookmarkEnd w:id="38"/>
     </w:p>
     <w:p>
       <w:pPr>
@@ -17936,7 +17939,7 @@
       <w:pPr>
         <w:pStyle w:val="Heading3"/>
       </w:pPr>
-      <w:bookmarkStart w:id="37" w:name="_Toc478974092"/>
+      <w:bookmarkStart w:id="39" w:name="_Toc482089138"/>
       <w:r>
         <w:t xml:space="preserve">Example - </w:t>
       </w:r>
@@ -17955,7 +17958,7 @@
       <w:r>
         <w:t xml:space="preserve"> Parameters</w:t>
       </w:r>
-      <w:bookmarkEnd w:id="37"/>
+      <w:bookmarkEnd w:id="39"/>
     </w:p>
     <w:p>
       <w:pPr>
@@ -20170,7 +20173,7 @@
       <w:pPr>
         <w:pStyle w:val="Heading2"/>
       </w:pPr>
-      <w:bookmarkStart w:id="38" w:name="_Toc478974093"/>
+      <w:bookmarkStart w:id="40" w:name="_Toc482089139"/>
       <w:r>
         <w:lastRenderedPageBreak/>
         <w:t xml:space="preserve">Using </w:t>
@@ -20181,7 +20184,7 @@
       <w:r>
         <w:t xml:space="preserve"> in a .NET Application</w:t>
       </w:r>
-      <w:bookmarkEnd w:id="38"/>
+      <w:bookmarkEnd w:id="40"/>
     </w:p>
     <w:p>
       <w:pPr>
@@ -21548,7 +21551,7 @@
         <w:rStyle w:val="PageNumber"/>
         <w:noProof/>
       </w:rPr>
-      <w:t>15</w:t>
+      <w:t>21</w:t>
     </w:r>
     <w:r>
       <w:rPr>
@@ -21823,29 +21826,29 @@
         <v:path o:extrusionok="f" gradientshapeok="t" o:connecttype="rect"/>
         <o:lock v:ext="edit" aspectratio="t"/>
       </v:shapetype>
-      <v:shape id="_x0000_i1041" type="#_x0000_t75" style="width:8pt;height:8pt" o:bullet="t">
+      <v:shape id="_x0000_i1062" type="#_x0000_t75" style="width:8pt;height:8pt" o:bullet="t">
         <v:imagedata r:id="rId1" o:title="bullet"/>
       </v:shape>
     </w:pict>
   </w:numPicBullet>
   <w:numPicBullet w:numPicBulletId="1">
     <w:pict>
-      <v:shape id="_x0000_i1042" type="#_x0000_t75" style="width:3in;height:3in" o:bullet="t"/>
+      <v:shape id="_x0000_i1063" type="#_x0000_t75" style="width:3in;height:3in" o:bullet="t"/>
     </w:pict>
   </w:numPicBullet>
   <w:numPicBullet w:numPicBulletId="2">
     <w:pict>
-      <v:shape id="_x0000_i1043" type="#_x0000_t75" style="width:3in;height:3in" o:bullet="t"/>
+      <v:shape id="_x0000_i1064" type="#_x0000_t75" style="width:3in;height:3in" o:bullet="t"/>
     </w:pict>
   </w:numPicBullet>
   <w:numPicBullet w:numPicBulletId="3">
     <w:pict>
-      <v:shape id="_x0000_i1044" type="#_x0000_t75" style="width:3in;height:3in" o:bullet="t"/>
+      <v:shape id="_x0000_i1065" type="#_x0000_t75" style="width:3in;height:3in" o:bullet="t"/>
     </w:pict>
   </w:numPicBullet>
   <w:numPicBullet w:numPicBulletId="4">
     <w:pict>
-      <v:shape id="_x0000_i1045" type="#_x0000_t75" style="width:3in;height:3in" o:bullet="t"/>
+      <v:shape id="_x0000_i1066" type="#_x0000_t75" style="width:3in;height:3in" o:bullet="t"/>
     </w:pict>
   </w:numPicBullet>
   <w:abstractNum w:abstractNumId="0">
@@ -31443,7 +31446,7 @@
 </file>
 
 <file path=customXml/itemProps1.xml><?xml version="1.0" encoding="utf-8"?>
-<ds:datastoreItem xmlns:ds="http://schemas.openxmlformats.org/officeDocument/2006/customXml" ds:itemID="{E1178766-07C7-4E17-8E39-9D32401AC61F}">
+<ds:datastoreItem xmlns:ds="http://schemas.openxmlformats.org/officeDocument/2006/customXml" ds:itemID="{F76577C0-ECAF-4D3B-83EF-3C0DD9DB3C52}">
   <ds:schemaRefs>
     <ds:schemaRef ds:uri="http://schemas.openxmlformats.org/officeDocument/2006/bibliography"/>
   </ds:schemaRefs>

</xml_diff>

<commit_message>
EPAS .Net Connector Guide 9.6.0.3 - RM 40748 Version updated from 3.1.9.0 to 3.1.9.3
</commit_message>
<xml_diff>
--- a/edb_docs/EDB_Postgres_Advanced_Server_NET_Connector_Guide.docx
+++ b/edb_docs/EDB_Postgres_Advanced_Server_NET_Connector_Guide.docx
@@ -7,12 +7,14 @@
       <w:pPr>
         <w:pStyle w:val="EDBCoverLogo"/>
       </w:pPr>
+      <w:bookmarkStart w:id="0" w:name="_GoBack"/>
+      <w:bookmarkEnd w:id="0"/>
       <w:r>
         <w:rPr>
           <w:noProof/>
         </w:rPr>
         <w:drawing>
-          <wp:inline distT="0" distB="0" distL="0" distR="0" wp14:anchorId="26F15A2A" wp14:editId="141CB36F">
+          <wp:inline distT="0" distB="0" distL="0" distR="0" wp14:anchorId="52F942E0" wp14:editId="3F876FBE">
             <wp:extent cx="2380711" cy="1371599"/>
             <wp:effectExtent l="0" t="0" r="635" b="635"/>
             <wp:docPr id="6" name="Picture 6"/>
@@ -69,8 +71,6 @@
       <w:pPr>
         <w:pStyle w:val="EDBTXTNormalWebBlackCharChar0"/>
       </w:pPr>
-      <w:bookmarkStart w:id="0" w:name="_GoBack"/>
-      <w:bookmarkEnd w:id="0"/>
     </w:p>
     <w:p>
       <w:pPr>
@@ -217,7 +217,7 @@
         <w:t>.</w:t>
       </w:r>
       <w:r>
-        <w:t>0</w:t>
+        <w:t>3</w:t>
       </w:r>
     </w:p>
     <w:p>
@@ -225,7 +225,10 @@
         <w:pStyle w:val="EDBCoverProductDate"/>
       </w:pPr>
       <w:r>
-        <w:t>May 9</w:t>
+        <w:t xml:space="preserve">May </w:t>
+      </w:r>
+      <w:r>
+        <w:t>16</w:t>
       </w:r>
       <w:r>
         <w:t>, 2017</w:t>
@@ -526,7 +529,7 @@
       <w:r>
         <w:fldChar w:fldCharType="separate"/>
       </w:r>
-      <w:hyperlink w:anchor="_Toc482089112" w:history="1">
+      <w:hyperlink w:anchor="_Toc482710210" w:history="1">
         <w:r>
           <w:rPr>
             <w:rStyle w:val="Hyperlink"/>
@@ -566,7 +569,7 @@
           <w:rPr>
             <w:noProof/>
           </w:rPr>
-          <w:instrText xml:space="preserve"> PAGEREF _Toc482089112 \h </w:instrText>
+          <w:instrText xml:space="preserve"> PAGEREF _Toc482710210 \h </w:instrText>
         </w:r>
         <w:r>
           <w:rPr>
@@ -607,7 +610,7 @@
           <w:szCs w:val="22"/>
         </w:rPr>
       </w:pPr>
-      <w:hyperlink w:anchor="_Toc482089113" w:history="1">
+      <w:hyperlink w:anchor="_Toc482710211" w:history="1">
         <w:r>
           <w:rPr>
             <w:rStyle w:val="Hyperlink"/>
@@ -647,7 +650,7 @@
           <w:rPr>
             <w:noProof/>
           </w:rPr>
-          <w:instrText xml:space="preserve"> PAGEREF _Toc482089113 \h </w:instrText>
+          <w:instrText xml:space="preserve"> PAGEREF _Toc482710211 \h </w:instrText>
         </w:r>
         <w:r>
           <w:rPr>
@@ -688,7 +691,7 @@
           <w:szCs w:val="22"/>
         </w:rPr>
       </w:pPr>
-      <w:hyperlink w:anchor="_Toc482089114" w:history="1">
+      <w:hyperlink w:anchor="_Toc482710212" w:history="1">
         <w:r>
           <w:rPr>
             <w:rStyle w:val="Hyperlink"/>
@@ -728,7 +731,7 @@
           <w:rPr>
             <w:noProof/>
           </w:rPr>
-          <w:instrText xml:space="preserve"> PAGEREF _Toc482089114 \h </w:instrText>
+          <w:instrText xml:space="preserve"> PAGEREF _Toc482710212 \h </w:instrText>
         </w:r>
         <w:r>
           <w:rPr>
@@ -769,7 +772,7 @@
           <w:szCs w:val="22"/>
         </w:rPr>
       </w:pPr>
-      <w:hyperlink w:anchor="_Toc482089115" w:history="1">
+      <w:hyperlink w:anchor="_Toc482710213" w:history="1">
         <w:r>
           <w:rPr>
             <w:rStyle w:val="Hyperlink"/>
@@ -809,7 +812,7 @@
           <w:rPr>
             <w:noProof/>
           </w:rPr>
-          <w:instrText xml:space="preserve"> PAGEREF _Toc482089115 \h </w:instrText>
+          <w:instrText xml:space="preserve"> PAGEREF _Toc482710213 \h </w:instrText>
         </w:r>
         <w:r>
           <w:rPr>
@@ -850,7 +853,7 @@
           <w:szCs w:val="22"/>
         </w:rPr>
       </w:pPr>
-      <w:hyperlink w:anchor="_Toc482089116" w:history="1">
+      <w:hyperlink w:anchor="_Toc482710214" w:history="1">
         <w:r>
           <w:rPr>
             <w:rStyle w:val="Hyperlink"/>
@@ -890,7 +893,7 @@
           <w:rPr>
             <w:noProof/>
           </w:rPr>
-          <w:instrText xml:space="preserve"> PAGEREF _Toc482089116 \h </w:instrText>
+          <w:instrText xml:space="preserve"> PAGEREF _Toc482710214 \h </w:instrText>
         </w:r>
         <w:r>
           <w:rPr>
@@ -931,7 +934,7 @@
           <w:szCs w:val="22"/>
         </w:rPr>
       </w:pPr>
-      <w:hyperlink w:anchor="_Toc482089117" w:history="1">
+      <w:hyperlink w:anchor="_Toc482710215" w:history="1">
         <w:r>
           <w:rPr>
             <w:rStyle w:val="Hyperlink"/>
@@ -971,7 +974,7 @@
           <w:rPr>
             <w:noProof/>
           </w:rPr>
-          <w:instrText xml:space="preserve"> PAGEREF _Toc482089117 \h </w:instrText>
+          <w:instrText xml:space="preserve"> PAGEREF _Toc482710215 \h </w:instrText>
         </w:r>
         <w:r>
           <w:rPr>
@@ -1012,7 +1015,7 @@
           <w:szCs w:val="22"/>
         </w:rPr>
       </w:pPr>
-      <w:hyperlink w:anchor="_Toc482089118" w:history="1">
+      <w:hyperlink w:anchor="_Toc482710216" w:history="1">
         <w:r>
           <w:rPr>
             <w:rStyle w:val="Hyperlink"/>
@@ -1052,7 +1055,7 @@
           <w:rPr>
             <w:noProof/>
           </w:rPr>
-          <w:instrText xml:space="preserve"> PAGEREF _Toc482089118 \h </w:instrText>
+          <w:instrText xml:space="preserve"> PAGEREF _Toc482710216 \h </w:instrText>
         </w:r>
         <w:r>
           <w:rPr>
@@ -1093,7 +1096,7 @@
           <w:szCs w:val="22"/>
         </w:rPr>
       </w:pPr>
-      <w:hyperlink w:anchor="_Toc482089119" w:history="1">
+      <w:hyperlink w:anchor="_Toc482710217" w:history="1">
         <w:r>
           <w:rPr>
             <w:rStyle w:val="Hyperlink"/>
@@ -1133,7 +1136,7 @@
           <w:rPr>
             <w:noProof/>
           </w:rPr>
-          <w:instrText xml:space="preserve"> PAGEREF _Toc482089119 \h </w:instrText>
+          <w:instrText xml:space="preserve"> PAGEREF _Toc482710217 \h </w:instrText>
         </w:r>
         <w:r>
           <w:rPr>
@@ -1174,7 +1177,7 @@
           <w:szCs w:val="22"/>
         </w:rPr>
       </w:pPr>
-      <w:hyperlink w:anchor="_Toc482089120" w:history="1">
+      <w:hyperlink w:anchor="_Toc482710218" w:history="1">
         <w:r>
           <w:rPr>
             <w:rStyle w:val="Hyperlink"/>
@@ -1214,7 +1217,7 @@
           <w:rPr>
             <w:noProof/>
           </w:rPr>
-          <w:instrText xml:space="preserve"> PAGEREF _Toc482089120 \h </w:instrText>
+          <w:instrText xml:space="preserve"> PAGEREF _Toc482710218 \h </w:instrText>
         </w:r>
         <w:r>
           <w:rPr>
@@ -1255,7 +1258,7 @@
           <w:szCs w:val="22"/>
         </w:rPr>
       </w:pPr>
-      <w:hyperlink w:anchor="_Toc482089121" w:history="1">
+      <w:hyperlink w:anchor="_Toc482710219" w:history="1">
         <w:r>
           <w:rPr>
             <w:rStyle w:val="Hyperlink"/>
@@ -1295,7 +1298,7 @@
           <w:rPr>
             <w:noProof/>
           </w:rPr>
-          <w:instrText xml:space="preserve"> PAGEREF _Toc482089121 \h </w:instrText>
+          <w:instrText xml:space="preserve"> PAGEREF _Toc482710219 \h </w:instrText>
         </w:r>
         <w:r>
           <w:rPr>
@@ -1336,7 +1339,7 @@
           <w:szCs w:val="22"/>
         </w:rPr>
       </w:pPr>
-      <w:hyperlink w:anchor="_Toc482089122" w:history="1">
+      <w:hyperlink w:anchor="_Toc482710220" w:history="1">
         <w:r>
           <w:rPr>
             <w:rStyle w:val="Hyperlink"/>
@@ -1376,7 +1379,7 @@
           <w:rPr>
             <w:noProof/>
           </w:rPr>
-          <w:instrText xml:space="preserve"> PAGEREF _Toc482089122 \h </w:instrText>
+          <w:instrText xml:space="preserve"> PAGEREF _Toc482710220 \h </w:instrText>
         </w:r>
         <w:r>
           <w:rPr>
@@ -1417,7 +1420,7 @@
           <w:szCs w:val="22"/>
         </w:rPr>
       </w:pPr>
-      <w:hyperlink w:anchor="_Toc482089123" w:history="1">
+      <w:hyperlink w:anchor="_Toc482710221" w:history="1">
         <w:r>
           <w:rPr>
             <w:rStyle w:val="Hyperlink"/>
@@ -1457,7 +1460,7 @@
           <w:rPr>
             <w:noProof/>
           </w:rPr>
-          <w:instrText xml:space="preserve"> PAGEREF _Toc482089123 \h </w:instrText>
+          <w:instrText xml:space="preserve"> PAGEREF _Toc482710221 \h </w:instrText>
         </w:r>
         <w:r>
           <w:rPr>
@@ -1498,7 +1501,7 @@
           <w:szCs w:val="22"/>
         </w:rPr>
       </w:pPr>
-      <w:hyperlink w:anchor="_Toc482089124" w:history="1">
+      <w:hyperlink w:anchor="_Toc482710222" w:history="1">
         <w:r>
           <w:rPr>
             <w:rStyle w:val="Hyperlink"/>
@@ -1538,7 +1541,7 @@
           <w:rPr>
             <w:noProof/>
           </w:rPr>
-          <w:instrText xml:space="preserve"> PAGEREF _Toc482089124 \h </w:instrText>
+          <w:instrText xml:space="preserve"> PAGEREF _Toc482710222 \h </w:instrText>
         </w:r>
         <w:r>
           <w:rPr>
@@ -1579,7 +1582,7 @@
           <w:szCs w:val="22"/>
         </w:rPr>
       </w:pPr>
-      <w:hyperlink w:anchor="_Toc482089125" w:history="1">
+      <w:hyperlink w:anchor="_Toc482710223" w:history="1">
         <w:r>
           <w:rPr>
             <w:rStyle w:val="Hyperlink"/>
@@ -1619,7 +1622,7 @@
           <w:rPr>
             <w:noProof/>
           </w:rPr>
-          <w:instrText xml:space="preserve"> PAGEREF _Toc482089125 \h </w:instrText>
+          <w:instrText xml:space="preserve"> PAGEREF _Toc482710223 \h </w:instrText>
         </w:r>
         <w:r>
           <w:rPr>
@@ -1655,7 +1658,7 @@
           <w:szCs w:val="22"/>
         </w:rPr>
       </w:pPr>
-      <w:hyperlink w:anchor="_Toc482089126" w:history="1">
+      <w:hyperlink w:anchor="_Toc482710224" w:history="1">
         <w:r>
           <w:rPr>
             <w:rStyle w:val="Hyperlink"/>
@@ -1683,7 +1686,7 @@
           <w:fldChar w:fldCharType="begin"/>
         </w:r>
         <w:r>
-          <w:instrText xml:space="preserve"> PAGEREF _Toc482089126 \h </w:instrText>
+          <w:instrText xml:space="preserve"> PAGEREF _Toc482710224 \h </w:instrText>
         </w:r>
         <w:r>
           <w:fldChar w:fldCharType="separate"/>
@@ -1705,7 +1708,7 @@
           <w:szCs w:val="22"/>
         </w:rPr>
       </w:pPr>
-      <w:hyperlink w:anchor="_Toc482089127" w:history="1">
+      <w:hyperlink w:anchor="_Toc482710225" w:history="1">
         <w:r>
           <w:rPr>
             <w:rStyle w:val="Hyperlink"/>
@@ -1733,7 +1736,7 @@
           <w:fldChar w:fldCharType="begin"/>
         </w:r>
         <w:r>
-          <w:instrText xml:space="preserve"> PAGEREF _Toc482089127 \h </w:instrText>
+          <w:instrText xml:space="preserve"> PAGEREF _Toc482710225 \h </w:instrText>
         </w:r>
         <w:r>
           <w:fldChar w:fldCharType="separate"/>
@@ -1755,7 +1758,7 @@
           <w:szCs w:val="22"/>
         </w:rPr>
       </w:pPr>
-      <w:hyperlink w:anchor="_Toc482089128" w:history="1">
+      <w:hyperlink w:anchor="_Toc482710226" w:history="1">
         <w:r>
           <w:rPr>
             <w:rStyle w:val="Hyperlink"/>
@@ -1783,7 +1786,7 @@
           <w:fldChar w:fldCharType="begin"/>
         </w:r>
         <w:r>
-          <w:instrText xml:space="preserve"> PAGEREF _Toc482089128 \h </w:instrText>
+          <w:instrText xml:space="preserve"> PAGEREF _Toc482710226 \h </w:instrText>
         </w:r>
         <w:r>
           <w:fldChar w:fldCharType="separate"/>
@@ -1805,7 +1808,7 @@
           <w:szCs w:val="22"/>
         </w:rPr>
       </w:pPr>
-      <w:hyperlink w:anchor="_Toc482089129" w:history="1">
+      <w:hyperlink w:anchor="_Toc482710227" w:history="1">
         <w:r>
           <w:rPr>
             <w:rStyle w:val="Hyperlink"/>
@@ -1833,7 +1836,7 @@
           <w:fldChar w:fldCharType="begin"/>
         </w:r>
         <w:r>
-          <w:instrText xml:space="preserve"> PAGEREF _Toc482089129 \h </w:instrText>
+          <w:instrText xml:space="preserve"> PAGEREF _Toc482710227 \h </w:instrText>
         </w:r>
         <w:r>
           <w:fldChar w:fldCharType="separate"/>
@@ -1860,7 +1863,7 @@
           <w:szCs w:val="22"/>
         </w:rPr>
       </w:pPr>
-      <w:hyperlink w:anchor="_Toc482089130" w:history="1">
+      <w:hyperlink w:anchor="_Toc482710228" w:history="1">
         <w:r>
           <w:rPr>
             <w:rStyle w:val="Hyperlink"/>
@@ -1900,7 +1903,7 @@
           <w:rPr>
             <w:noProof/>
           </w:rPr>
-          <w:instrText xml:space="preserve"> PAGEREF _Toc482089130 \h </w:instrText>
+          <w:instrText xml:space="preserve"> PAGEREF _Toc482710228 \h </w:instrText>
         </w:r>
         <w:r>
           <w:rPr>
@@ -1936,7 +1939,7 @@
           <w:szCs w:val="22"/>
         </w:rPr>
       </w:pPr>
-      <w:hyperlink w:anchor="_Toc482089131" w:history="1">
+      <w:hyperlink w:anchor="_Toc482710229" w:history="1">
         <w:r>
           <w:rPr>
             <w:rStyle w:val="Hyperlink"/>
@@ -1964,7 +1967,7 @@
           <w:fldChar w:fldCharType="begin"/>
         </w:r>
         <w:r>
-          <w:instrText xml:space="preserve"> PAGEREF _Toc482089131 \h </w:instrText>
+          <w:instrText xml:space="preserve"> PAGEREF _Toc482710229 \h </w:instrText>
         </w:r>
         <w:r>
           <w:fldChar w:fldCharType="separate"/>
@@ -1991,7 +1994,7 @@
           <w:szCs w:val="22"/>
         </w:rPr>
       </w:pPr>
-      <w:hyperlink w:anchor="_Toc482089132" w:history="1">
+      <w:hyperlink w:anchor="_Toc482710230" w:history="1">
         <w:r>
           <w:rPr>
             <w:rStyle w:val="Hyperlink"/>
@@ -2031,7 +2034,7 @@
           <w:rPr>
             <w:noProof/>
           </w:rPr>
-          <w:instrText xml:space="preserve"> PAGEREF _Toc482089132 \h </w:instrText>
+          <w:instrText xml:space="preserve"> PAGEREF _Toc482710230 \h </w:instrText>
         </w:r>
         <w:r>
           <w:rPr>
@@ -2072,7 +2075,7 @@
           <w:szCs w:val="22"/>
         </w:rPr>
       </w:pPr>
-      <w:hyperlink w:anchor="_Toc482089133" w:history="1">
+      <w:hyperlink w:anchor="_Toc482710231" w:history="1">
         <w:r>
           <w:rPr>
             <w:rStyle w:val="Hyperlink"/>
@@ -2112,7 +2115,7 @@
           <w:rPr>
             <w:noProof/>
           </w:rPr>
-          <w:instrText xml:space="preserve"> PAGEREF _Toc482089133 \h </w:instrText>
+          <w:instrText xml:space="preserve"> PAGEREF _Toc482710231 \h </w:instrText>
         </w:r>
         <w:r>
           <w:rPr>
@@ -2153,7 +2156,7 @@
           <w:szCs w:val="22"/>
         </w:rPr>
       </w:pPr>
-      <w:hyperlink w:anchor="_Toc482089134" w:history="1">
+      <w:hyperlink w:anchor="_Toc482710232" w:history="1">
         <w:r>
           <w:rPr>
             <w:rStyle w:val="Hyperlink"/>
@@ -2193,7 +2196,7 @@
           <w:rPr>
             <w:noProof/>
           </w:rPr>
-          <w:instrText xml:space="preserve"> PAGEREF _Toc482089134 \h </w:instrText>
+          <w:instrText xml:space="preserve"> PAGEREF _Toc482710232 \h </w:instrText>
         </w:r>
         <w:r>
           <w:rPr>
@@ -2234,7 +2237,7 @@
           <w:szCs w:val="22"/>
         </w:rPr>
       </w:pPr>
-      <w:hyperlink w:anchor="_Toc482089135" w:history="1">
+      <w:hyperlink w:anchor="_Toc482710233" w:history="1">
         <w:r>
           <w:rPr>
             <w:rStyle w:val="Hyperlink"/>
@@ -2274,7 +2277,7 @@
           <w:rPr>
             <w:noProof/>
           </w:rPr>
-          <w:instrText xml:space="preserve"> PAGEREF _Toc482089135 \h </w:instrText>
+          <w:instrText xml:space="preserve"> PAGEREF _Toc482710233 \h </w:instrText>
         </w:r>
         <w:r>
           <w:rPr>
@@ -2310,7 +2313,7 @@
           <w:szCs w:val="22"/>
         </w:rPr>
       </w:pPr>
-      <w:hyperlink w:anchor="_Toc482089136" w:history="1">
+      <w:hyperlink w:anchor="_Toc482710234" w:history="1">
         <w:r>
           <w:rPr>
             <w:rStyle w:val="Hyperlink"/>
@@ -2338,7 +2341,7 @@
           <w:fldChar w:fldCharType="begin"/>
         </w:r>
         <w:r>
-          <w:instrText xml:space="preserve"> PAGEREF _Toc482089136 \h </w:instrText>
+          <w:instrText xml:space="preserve"> PAGEREF _Toc482710234 \h </w:instrText>
         </w:r>
         <w:r>
           <w:fldChar w:fldCharType="separate"/>
@@ -2360,7 +2363,7 @@
           <w:szCs w:val="22"/>
         </w:rPr>
       </w:pPr>
-      <w:hyperlink w:anchor="_Toc482089137" w:history="1">
+      <w:hyperlink w:anchor="_Toc482710235" w:history="1">
         <w:r>
           <w:rPr>
             <w:rStyle w:val="Hyperlink"/>
@@ -2388,7 +2391,7 @@
           <w:fldChar w:fldCharType="begin"/>
         </w:r>
         <w:r>
-          <w:instrText xml:space="preserve"> PAGEREF _Toc482089137 \h </w:instrText>
+          <w:instrText xml:space="preserve"> PAGEREF _Toc482710235 \h </w:instrText>
         </w:r>
         <w:r>
           <w:fldChar w:fldCharType="separate"/>
@@ -2410,7 +2413,7 @@
           <w:szCs w:val="22"/>
         </w:rPr>
       </w:pPr>
-      <w:hyperlink w:anchor="_Toc482089138" w:history="1">
+      <w:hyperlink w:anchor="_Toc482710236" w:history="1">
         <w:r>
           <w:rPr>
             <w:rStyle w:val="Hyperlink"/>
@@ -2438,7 +2441,7 @@
           <w:fldChar w:fldCharType="begin"/>
         </w:r>
         <w:r>
-          <w:instrText xml:space="preserve"> PAGEREF _Toc482089138 \h </w:instrText>
+          <w:instrText xml:space="preserve"> PAGEREF _Toc482710236 \h </w:instrText>
         </w:r>
         <w:r>
           <w:fldChar w:fldCharType="separate"/>
@@ -2465,7 +2468,7 @@
           <w:szCs w:val="22"/>
         </w:rPr>
       </w:pPr>
-      <w:hyperlink w:anchor="_Toc482089139" w:history="1">
+      <w:hyperlink w:anchor="_Toc482710237" w:history="1">
         <w:r>
           <w:rPr>
             <w:rStyle w:val="Hyperlink"/>
@@ -2505,7 +2508,7 @@
           <w:rPr>
             <w:noProof/>
           </w:rPr>
-          <w:instrText xml:space="preserve"> PAGEREF _Toc482089139 \h </w:instrText>
+          <w:instrText xml:space="preserve"> PAGEREF _Toc482710237 \h </w:instrText>
         </w:r>
         <w:r>
           <w:rPr>
@@ -2563,7 +2566,7 @@
       <w:pPr>
         <w:pStyle w:val="Heading1"/>
       </w:pPr>
-      <w:bookmarkStart w:id="1" w:name="_Toc482089112"/>
+      <w:bookmarkStart w:id="1" w:name="_Toc482710210"/>
       <w:r>
         <w:lastRenderedPageBreak/>
         <w:t>Introduction</w:t>
@@ -2687,7 +2690,7 @@
         </w:tabs>
       </w:pPr>
       <w:bookmarkStart w:id="2" w:name="_Toc453572801"/>
-      <w:bookmarkStart w:id="3" w:name="_Toc482089113"/>
+      <w:bookmarkStart w:id="3" w:name="_Toc482710211"/>
       <w:r>
         <w:t>What’s New</w:t>
       </w:r>
@@ -2977,7 +2980,7 @@
       <w:bookmarkStart w:id="5" w:name="_Ref103071794"/>
       <w:bookmarkStart w:id="6" w:name="_Ref103073047"/>
       <w:bookmarkStart w:id="7" w:name="_Ref103073090"/>
-      <w:bookmarkStart w:id="8" w:name="_Toc482089114"/>
+      <w:bookmarkStart w:id="8" w:name="_Toc482710212"/>
       <w:r>
         <w:lastRenderedPageBreak/>
         <w:t>Typographical Conventions Used in this Guide</w:t>
@@ -3370,7 +3373,7 @@
       <w:pPr>
         <w:pStyle w:val="Heading1"/>
       </w:pPr>
-      <w:bookmarkStart w:id="10" w:name="_Toc482089115"/>
+      <w:bookmarkStart w:id="10" w:name="_Toc482710213"/>
       <w:r>
         <w:lastRenderedPageBreak/>
         <w:t>The Advanced Server .NET Connector - Overview</w:t>
@@ -3436,7 +3439,7 @@
       <w:pPr>
         <w:pStyle w:val="Heading2"/>
       </w:pPr>
-      <w:bookmarkStart w:id="11" w:name="_Toc482089116"/>
+      <w:bookmarkStart w:id="11" w:name="_Toc482710214"/>
       <w:r>
         <w:t>The .NET Class Hierarchy</w:t>
       </w:r>
@@ -3723,7 +3726,7 @@
       <w:pPr>
         <w:pStyle w:val="Heading2"/>
       </w:pPr>
-      <w:bookmarkStart w:id="12" w:name="_Toc482089117"/>
+      <w:bookmarkStart w:id="12" w:name="_Toc482710215"/>
       <w:r>
         <w:lastRenderedPageBreak/>
         <w:t>Installing the .NET Connector</w:t>
@@ -3787,7 +3790,7 @@
           <w:noProof/>
         </w:rPr>
         <w:drawing>
-          <wp:inline distT="0" distB="0" distL="0" distR="0" wp14:anchorId="28BAB2A3" wp14:editId="1D63F15B">
+          <wp:inline distT="0" distB="0" distL="0" distR="0" wp14:anchorId="257A1743" wp14:editId="57DB2C42">
             <wp:extent cx="4114800" cy="2728253"/>
             <wp:effectExtent l="0" t="0" r="0" b="0"/>
             <wp:docPr id="9" name="Picture 9"/>
@@ -3971,7 +3974,7 @@
         </w:rPr>
         <w:lastRenderedPageBreak/>
         <w:drawing>
-          <wp:inline distT="0" distB="0" distL="0" distR="0" wp14:anchorId="1E2EF73E" wp14:editId="0ACFCE6F">
+          <wp:inline distT="0" distB="0" distL="0" distR="0" wp14:anchorId="0E3DCA0A" wp14:editId="737CAC8F">
             <wp:extent cx="3886200" cy="3037805"/>
             <wp:effectExtent l="0" t="0" r="0" b="0"/>
             <wp:docPr id="2" name="Picture 2"/>
@@ -4073,7 +4076,7 @@
           <w:noProof/>
         </w:rPr>
         <w:drawing>
-          <wp:inline distT="0" distB="0" distL="0" distR="0" wp14:anchorId="612F21AF" wp14:editId="682C1A9A">
+          <wp:inline distT="0" distB="0" distL="0" distR="0" wp14:anchorId="10F4DC5E" wp14:editId="1CB6C3B7">
             <wp:extent cx="3886200" cy="3046927"/>
             <wp:effectExtent l="0" t="0" r="0" b="1270"/>
             <wp:docPr id="3" name="Picture 3"/>
@@ -4200,7 +4203,7 @@
         </w:rPr>
         <w:lastRenderedPageBreak/>
         <w:drawing>
-          <wp:inline distT="0" distB="0" distL="0" distR="0" wp14:anchorId="7F057296" wp14:editId="0F09F33C">
+          <wp:inline distT="0" distB="0" distL="0" distR="0" wp14:anchorId="2A7EF47C" wp14:editId="63760AF1">
             <wp:extent cx="4114800" cy="3217552"/>
             <wp:effectExtent l="0" t="0" r="0" b="1905"/>
             <wp:docPr id="4" name="Picture 4"/>
@@ -4335,7 +4338,7 @@
           <w:noProof/>
         </w:rPr>
         <w:drawing>
-          <wp:inline distT="0" distB="0" distL="0" distR="0" wp14:anchorId="0BC4F953" wp14:editId="1E9DA54B">
+          <wp:inline distT="0" distB="0" distL="0" distR="0" wp14:anchorId="428EADD8" wp14:editId="76B01FB1">
             <wp:extent cx="4114800" cy="3194511"/>
             <wp:effectExtent l="0" t="0" r="0" b="6350"/>
             <wp:docPr id="5" name="Picture 5"/>
@@ -4497,7 +4500,7 @@
           <w:noProof/>
         </w:rPr>
         <w:drawing>
-          <wp:inline distT="0" distB="0" distL="0" distR="0" wp14:anchorId="20DAF44E" wp14:editId="0ADB27CF">
+          <wp:inline distT="0" distB="0" distL="0" distR="0" wp14:anchorId="5DBCBC8A" wp14:editId="2C99E20F">
             <wp:extent cx="3790950" cy="1619051"/>
             <wp:effectExtent l="0" t="0" r="0" b="635"/>
             <wp:docPr id="12" name="Picture 12" descr="C:\Users\susan\AppData\Local\Temp\vmware-susan\VMwareDnD\7412d23f\Screen Shot 2016-07-11 at 4.50.20 PM.png"/>
@@ -4645,7 +4648,7 @@
           <w:noProof/>
         </w:rPr>
         <w:drawing>
-          <wp:inline distT="0" distB="0" distL="0" distR="0" wp14:anchorId="1492F104" wp14:editId="6434DE7F">
+          <wp:inline distT="0" distB="0" distL="0" distR="0" wp14:anchorId="268230D1" wp14:editId="6B9793D2">
             <wp:extent cx="4114800" cy="3004331"/>
             <wp:effectExtent l="0" t="0" r="0" b="5715"/>
             <wp:docPr id="1" name="Picture 1"/>
@@ -4739,7 +4742,7 @@
         <w:pStyle w:val="Heading1"/>
       </w:pPr>
       <w:bookmarkStart w:id="13" w:name="_Ref456012125"/>
-      <w:bookmarkStart w:id="14" w:name="_Toc482089118"/>
+      <w:bookmarkStart w:id="14" w:name="_Toc482710216"/>
       <w:r>
         <w:lastRenderedPageBreak/>
         <w:t>Configuring the .NET Connector</w:t>
@@ -4911,7 +4914,7 @@
         <w:pStyle w:val="Heading2"/>
       </w:pPr>
       <w:bookmarkStart w:id="15" w:name="_Ref477525249"/>
-      <w:bookmarkStart w:id="16" w:name="_Toc482089119"/>
+      <w:bookmarkStart w:id="16" w:name="_Toc482710217"/>
       <w:r>
         <w:t>General Instructions</w:t>
       </w:r>
@@ -5177,7 +5180,7 @@
       <w:pPr>
         <w:pStyle w:val="Heading2"/>
       </w:pPr>
-      <w:bookmarkStart w:id="17" w:name="_Toc482089120"/>
+      <w:bookmarkStart w:id="17" w:name="_Toc482710218"/>
       <w:r>
         <w:t>.NET Framework 4.0</w:t>
       </w:r>
@@ -5371,7 +5374,7 @@
       <w:pPr>
         <w:pStyle w:val="Heading2"/>
       </w:pPr>
-      <w:bookmarkStart w:id="18" w:name="_Toc482089121"/>
+      <w:bookmarkStart w:id="18" w:name="_Toc482710219"/>
       <w:r>
         <w:t>.NET Framework 4.5</w:t>
       </w:r>
@@ -5572,7 +5575,7 @@
         <w:pStyle w:val="Heading2"/>
       </w:pPr>
       <w:bookmarkStart w:id="19" w:name="_Ref477527440"/>
-      <w:bookmarkStart w:id="20" w:name="_Toc482089122"/>
+      <w:bookmarkStart w:id="20" w:name="_Toc482710220"/>
       <w:r>
         <w:t>Entity Framework 6</w:t>
       </w:r>
@@ -5777,7 +5780,31 @@
         <w:pStyle w:val="EDBSYNTXPreformattedBlackLeft033"/>
       </w:pPr>
       <w:r>
-        <w:t xml:space="preserve">  type="EnterpriseDB.EDBClient.EDBFactory, EnterpriseDB.EDBClient, Version=3.</w:t>
+        <w:t xml:space="preserve">  </w:t>
+      </w:r>
+      <w:proofErr w:type="gramStart"/>
+      <w:r>
+        <w:t>type</w:t>
+      </w:r>
+      <w:proofErr w:type="gramEnd"/>
+      <w:r>
+        <w:t>="</w:t>
+      </w:r>
+      <w:proofErr w:type="spellStart"/>
+      <w:r>
+        <w:t>EnterpriseDB.EDBClient.EDBFactory</w:t>
+      </w:r>
+      <w:proofErr w:type="spellEnd"/>
+      <w:r>
+        <w:t xml:space="preserve">, </w:t>
+      </w:r>
+      <w:proofErr w:type="spellStart"/>
+      <w:r>
+        <w:t>EnterpriseDB.EDBClient</w:t>
+      </w:r>
+      <w:proofErr w:type="spellEnd"/>
+      <w:r>
+        <w:t>, Version=3.</w:t>
       </w:r>
       <w:r>
         <w:t>1</w:t>
@@ -5792,10 +5819,18 @@
         <w:t>.</w:t>
       </w:r>
       <w:r>
-        <w:t>0</w:t>
-      </w:r>
-      <w:r>
-        <w:t>, Culture=neutral, PublicKeyToken=5d8b90d52f46fda7"</w:t>
+        <w:t>3</w:t>
+      </w:r>
+      <w:r>
+        <w:t xml:space="preserve">, Culture=neutral, </w:t>
+      </w:r>
+      <w:proofErr w:type="spellStart"/>
+      <w:r>
+        <w:t>PublicKeyToken</w:t>
+      </w:r>
+      <w:proofErr w:type="spellEnd"/>
+      <w:r>
+        <w:t>=5d8b90d52f46fda7"</w:t>
       </w:r>
     </w:p>
     <w:p>
@@ -6304,7 +6339,7 @@
         <w:pStyle w:val="Heading2"/>
       </w:pPr>
       <w:bookmarkStart w:id="21" w:name="_Ref477528081"/>
-      <w:bookmarkStart w:id="22" w:name="_Toc482089123"/>
+      <w:bookmarkStart w:id="22" w:name="_Toc482710221"/>
       <w:r>
         <w:t>EDBDdexProvider for Visual Studio</w:t>
       </w:r>
@@ -6664,7 +6699,31 @@
         <w:pStyle w:val="EDBSYNTXPreformattedBlackLeft033"/>
       </w:pPr>
       <w:r>
-        <w:t xml:space="preserve">  type="EnterpriseDB.EDBClient.EDBFactory, EnterpriseDB.EDBClient, Version=3.</w:t>
+        <w:t xml:space="preserve">  </w:t>
+      </w:r>
+      <w:proofErr w:type="gramStart"/>
+      <w:r>
+        <w:t>type</w:t>
+      </w:r>
+      <w:proofErr w:type="gramEnd"/>
+      <w:r>
+        <w:t>="</w:t>
+      </w:r>
+      <w:proofErr w:type="spellStart"/>
+      <w:r>
+        <w:t>EnterpriseDB.EDBClient.EDBFactory</w:t>
+      </w:r>
+      <w:proofErr w:type="spellEnd"/>
+      <w:r>
+        <w:t xml:space="preserve">, </w:t>
+      </w:r>
+      <w:proofErr w:type="spellStart"/>
+      <w:r>
+        <w:t>EnterpriseDB.EDBClient</w:t>
+      </w:r>
+      <w:proofErr w:type="spellEnd"/>
+      <w:r>
+        <w:t>, Version=3.</w:t>
       </w:r>
       <w:r>
         <w:t>1</w:t>
@@ -6679,10 +6738,18 @@
         <w:t>.</w:t>
       </w:r>
       <w:r>
-        <w:t>0</w:t>
-      </w:r>
-      <w:r>
-        <w:t>, Culture=neutral, PublicKeyToken=5d8b90d52f46fda7"</w:t>
+        <w:t>3</w:t>
+      </w:r>
+      <w:r>
+        <w:t xml:space="preserve">, Culture=neutral, </w:t>
+      </w:r>
+      <w:proofErr w:type="spellStart"/>
+      <w:r>
+        <w:t>PublicKeyToken</w:t>
+      </w:r>
+      <w:proofErr w:type="spellEnd"/>
+      <w:r>
+        <w:t>=5d8b90d52f46fda7"</w:t>
       </w:r>
     </w:p>
     <w:p>
@@ -7415,7 +7482,7 @@
         <w:pStyle w:val="Heading1"/>
       </w:pPr>
       <w:bookmarkStart w:id="23" w:name="_Ref482087625"/>
-      <w:bookmarkStart w:id="24" w:name="_Toc482089124"/>
+      <w:bookmarkStart w:id="24" w:name="_Toc482710222"/>
       <w:r>
         <w:lastRenderedPageBreak/>
         <w:t>Using the .NET Connector</w:t>
@@ -7669,7 +7736,7 @@
       <w:pPr>
         <w:pStyle w:val="Heading2"/>
       </w:pPr>
-      <w:bookmarkStart w:id="25" w:name="_Toc482089125"/>
+      <w:bookmarkStart w:id="25" w:name="_Toc482710223"/>
       <w:r>
         <w:t>Opening a Database Connection</w:t>
       </w:r>
@@ -7887,7 +7954,7 @@
         <w:pStyle w:val="Heading3"/>
       </w:pPr>
       <w:bookmarkStart w:id="26" w:name="_Ref482087661"/>
-      <w:bookmarkStart w:id="27" w:name="_Toc482089126"/>
+      <w:bookmarkStart w:id="27" w:name="_Toc482710224"/>
       <w:r>
         <w:t>Connection String Parameters</w:t>
       </w:r>
@@ -8951,7 +9018,7 @@
       <w:pPr>
         <w:pStyle w:val="Heading3"/>
       </w:pPr>
-      <w:bookmarkStart w:id="28" w:name="_Toc482089127"/>
+      <w:bookmarkStart w:id="28" w:name="_Toc482710225"/>
       <w:r>
         <w:t xml:space="preserve">Example - </w:t>
       </w:r>
@@ -9371,7 +9438,7 @@
           <w:noProof/>
         </w:rPr>
         <w:drawing>
-          <wp:inline distT="0" distB="0" distL="0" distR="0" wp14:anchorId="78DFCFE0" wp14:editId="3D36B2E5">
+          <wp:inline distT="0" distB="0" distL="0" distR="0" wp14:anchorId="7C5B28D6" wp14:editId="503A84D0">
             <wp:extent cx="5480050" cy="1663700"/>
             <wp:effectExtent l="0" t="0" r="6350" b="0"/>
             <wp:docPr id="7" name="Picture 7" descr="Screen Shot 2014-06-26 at 8"/>
@@ -9429,7 +9496,7 @@
       <w:pPr>
         <w:pStyle w:val="Heading3"/>
       </w:pPr>
-      <w:bookmarkStart w:id="29" w:name="_Toc482089128"/>
+      <w:bookmarkStart w:id="29" w:name="_Toc482710226"/>
       <w:r>
         <w:t xml:space="preserve">Example - </w:t>
       </w:r>
@@ -10042,7 +10109,7 @@
       <w:pPr>
         <w:pStyle w:val="Heading3"/>
       </w:pPr>
-      <w:bookmarkStart w:id="30" w:name="_Toc482089129"/>
+      <w:bookmarkStart w:id="30" w:name="_Toc482710227"/>
       <w:r>
         <w:t xml:space="preserve">Example - </w:t>
       </w:r>
@@ -10839,7 +10906,7 @@
           <w:noProof/>
         </w:rPr>
         <w:drawing>
-          <wp:inline distT="0" distB="0" distL="0" distR="0" wp14:anchorId="62889672" wp14:editId="2D00798B">
+          <wp:inline distT="0" distB="0" distL="0" distR="0" wp14:anchorId="70060F21" wp14:editId="337F5096">
             <wp:extent cx="2120900" cy="2120900"/>
             <wp:effectExtent l="0" t="0" r="0" b="0"/>
             <wp:docPr id="8" name="Picture 8" descr="dialog"/>
@@ -10951,7 +11018,7 @@
       <w:pPr>
         <w:pStyle w:val="Heading2"/>
       </w:pPr>
-      <w:bookmarkStart w:id="31" w:name="_Toc482089130"/>
+      <w:bookmarkStart w:id="31" w:name="_Toc482710228"/>
       <w:r>
         <w:lastRenderedPageBreak/>
         <w:t>Retrieving Database Records</w:t>
@@ -12035,7 +12102,7 @@
       <w:pPr>
         <w:pStyle w:val="Heading3"/>
       </w:pPr>
-      <w:bookmarkStart w:id="32" w:name="_Toc482089131"/>
+      <w:bookmarkStart w:id="32" w:name="_Toc482710229"/>
       <w:r>
         <w:t>Retr</w:t>
       </w:r>
@@ -12569,7 +12636,7 @@
       <w:pPr>
         <w:pStyle w:val="Heading2"/>
       </w:pPr>
-      <w:bookmarkStart w:id="33" w:name="_Toc482089132"/>
+      <w:bookmarkStart w:id="33" w:name="_Toc482710230"/>
       <w:r>
         <w:lastRenderedPageBreak/>
         <w:t>Parameterized Queries</w:t>
@@ -13250,7 +13317,7 @@
       <w:pPr>
         <w:pStyle w:val="Heading2"/>
       </w:pPr>
-      <w:bookmarkStart w:id="34" w:name="_Toc482089133"/>
+      <w:bookmarkStart w:id="34" w:name="_Toc482710231"/>
       <w:r>
         <w:lastRenderedPageBreak/>
         <w:t>Inserting Records in a Database</w:t>
@@ -14096,7 +14163,7 @@
       <w:pPr>
         <w:pStyle w:val="Heading2"/>
       </w:pPr>
-      <w:bookmarkStart w:id="35" w:name="_Toc482089134"/>
+      <w:bookmarkStart w:id="35" w:name="_Toc482710232"/>
       <w:r>
         <w:lastRenderedPageBreak/>
         <w:t>Deleting Records in a Database</w:t>
@@ -14938,7 +15005,7 @@
       <w:pPr>
         <w:pStyle w:val="Heading2"/>
       </w:pPr>
-      <w:bookmarkStart w:id="36" w:name="_Toc482089135"/>
+      <w:bookmarkStart w:id="36" w:name="_Toc482710233"/>
       <w:r>
         <w:lastRenderedPageBreak/>
         <w:t>Using SPL Stored Procedures in your .NET Application</w:t>
@@ -15214,7 +15281,7 @@
       <w:pPr>
         <w:pStyle w:val="Heading3"/>
       </w:pPr>
-      <w:bookmarkStart w:id="37" w:name="_Toc482089136"/>
+      <w:bookmarkStart w:id="37" w:name="_Toc482710234"/>
       <w:r>
         <w:t>Example - Executing</w:t>
       </w:r>
@@ -16143,7 +16210,7 @@
       <w:pPr>
         <w:pStyle w:val="Heading3"/>
       </w:pPr>
-      <w:bookmarkStart w:id="38" w:name="_Toc482089137"/>
+      <w:bookmarkStart w:id="38" w:name="_Toc482710235"/>
       <w:r>
         <w:t xml:space="preserve">Example - </w:t>
       </w:r>
@@ -17939,7 +18006,7 @@
       <w:pPr>
         <w:pStyle w:val="Heading3"/>
       </w:pPr>
-      <w:bookmarkStart w:id="39" w:name="_Toc482089138"/>
+      <w:bookmarkStart w:id="39" w:name="_Toc482710236"/>
       <w:r>
         <w:t xml:space="preserve">Example - </w:t>
       </w:r>
@@ -20173,7 +20240,7 @@
       <w:pPr>
         <w:pStyle w:val="Heading2"/>
       </w:pPr>
-      <w:bookmarkStart w:id="40" w:name="_Toc482089139"/>
+      <w:bookmarkStart w:id="40" w:name="_Toc482710237"/>
       <w:r>
         <w:lastRenderedPageBreak/>
         <w:t xml:space="preserve">Using </w:t>
@@ -21826,29 +21893,29 @@
         <v:path o:extrusionok="f" gradientshapeok="t" o:connecttype="rect"/>
         <o:lock v:ext="edit" aspectratio="t"/>
       </v:shapetype>
-      <v:shape id="_x0000_i1062" type="#_x0000_t75" style="width:8pt;height:8pt" o:bullet="t">
+      <v:shape id="_x0000_i1041" type="#_x0000_t75" style="width:8pt;height:8pt" o:bullet="t">
         <v:imagedata r:id="rId1" o:title="bullet"/>
       </v:shape>
     </w:pict>
   </w:numPicBullet>
   <w:numPicBullet w:numPicBulletId="1">
     <w:pict>
-      <v:shape id="_x0000_i1063" type="#_x0000_t75" style="width:3in;height:3in" o:bullet="t"/>
+      <v:shape id="_x0000_i1042" type="#_x0000_t75" style="width:3in;height:3in" o:bullet="t"/>
     </w:pict>
   </w:numPicBullet>
   <w:numPicBullet w:numPicBulletId="2">
     <w:pict>
-      <v:shape id="_x0000_i1064" type="#_x0000_t75" style="width:3in;height:3in" o:bullet="t"/>
+      <v:shape id="_x0000_i1043" type="#_x0000_t75" style="width:3in;height:3in" o:bullet="t"/>
     </w:pict>
   </w:numPicBullet>
   <w:numPicBullet w:numPicBulletId="3">
     <w:pict>
-      <v:shape id="_x0000_i1065" type="#_x0000_t75" style="width:3in;height:3in" o:bullet="t"/>
+      <v:shape id="_x0000_i1044" type="#_x0000_t75" style="width:3in;height:3in" o:bullet="t"/>
     </w:pict>
   </w:numPicBullet>
   <w:numPicBullet w:numPicBulletId="4">
     <w:pict>
-      <v:shape id="_x0000_i1066" type="#_x0000_t75" style="width:3in;height:3in" o:bullet="t"/>
+      <v:shape id="_x0000_i1045" type="#_x0000_t75" style="width:3in;height:3in" o:bullet="t"/>
     </w:pict>
   </w:numPicBullet>
   <w:abstractNum w:abstractNumId="0">
@@ -31446,7 +31513,7 @@
 </file>
 
 <file path=customXml/itemProps1.xml><?xml version="1.0" encoding="utf-8"?>
-<ds:datastoreItem xmlns:ds="http://schemas.openxmlformats.org/officeDocument/2006/customXml" ds:itemID="{F76577C0-ECAF-4D3B-83EF-3C0DD9DB3C52}">
+<ds:datastoreItem xmlns:ds="http://schemas.openxmlformats.org/officeDocument/2006/customXml" ds:itemID="{47EBA4D4-1001-48FF-9A7F-41257594EC53}">
   <ds:schemaRefs>
     <ds:schemaRef ds:uri="http://schemas.openxmlformats.org/officeDocument/2006/bibliography"/>
   </ds:schemaRefs>

</xml_diff>

<commit_message>
EPAS .Net Connector Guide 9.6.0.3 - RM 41454 Whats New updated with community Npgsql driver version 3.1.9 and authentication failure for MS Office on Win32
</commit_message>
<xml_diff>
--- a/edb_docs/EDB_Postgres_Advanced_Server_NET_Connector_Guide.docx
+++ b/edb_docs/EDB_Postgres_Advanced_Server_NET_Connector_Guide.docx
@@ -7,14 +7,12 @@
       <w:pPr>
         <w:pStyle w:val="EDBCoverLogo"/>
       </w:pPr>
-      <w:bookmarkStart w:id="0" w:name="_GoBack"/>
-      <w:bookmarkEnd w:id="0"/>
       <w:r>
         <w:rPr>
           <w:noProof/>
         </w:rPr>
         <w:drawing>
-          <wp:inline distT="0" distB="0" distL="0" distR="0" wp14:anchorId="52F942E0" wp14:editId="3F876FBE">
+          <wp:inline distT="0" distB="0" distL="0" distR="0" wp14:anchorId="0771BCDE" wp14:editId="3167337E">
             <wp:extent cx="2380711" cy="1371599"/>
             <wp:effectExtent l="0" t="0" r="635" b="635"/>
             <wp:docPr id="6" name="Picture 6"/>
@@ -79,6 +77,8 @@
           <w:color w:val="auto"/>
         </w:rPr>
       </w:pPr>
+      <w:bookmarkStart w:id="0" w:name="_GoBack"/>
+      <w:bookmarkEnd w:id="0"/>
     </w:p>
     <w:p>
       <w:pPr>
@@ -225,10 +225,10 @@
         <w:pStyle w:val="EDBCoverProductDate"/>
       </w:pPr>
       <w:r>
-        <w:t xml:space="preserve">May </w:t>
-      </w:r>
-      <w:r>
-        <w:t>16</w:t>
+        <w:t xml:space="preserve">June </w:t>
+      </w:r>
+      <w:r>
+        <w:t>6</w:t>
       </w:r>
       <w:r>
         <w:t>, 2017</w:t>
@@ -529,7 +529,7 @@
       <w:r>
         <w:fldChar w:fldCharType="separate"/>
       </w:r>
-      <w:hyperlink w:anchor="_Toc482710210" w:history="1">
+      <w:hyperlink w:anchor="_Toc484441961" w:history="1">
         <w:r>
           <w:rPr>
             <w:rStyle w:val="Hyperlink"/>
@@ -569,7 +569,7 @@
           <w:rPr>
             <w:noProof/>
           </w:rPr>
-          <w:instrText xml:space="preserve"> PAGEREF _Toc482710210 \h </w:instrText>
+          <w:instrText xml:space="preserve"> PAGEREF _Toc484441961 \h </w:instrText>
         </w:r>
         <w:r>
           <w:rPr>
@@ -610,7 +610,7 @@
           <w:szCs w:val="22"/>
         </w:rPr>
       </w:pPr>
-      <w:hyperlink w:anchor="_Toc482710211" w:history="1">
+      <w:hyperlink w:anchor="_Toc484441962" w:history="1">
         <w:r>
           <w:rPr>
             <w:rStyle w:val="Hyperlink"/>
@@ -650,7 +650,7 @@
           <w:rPr>
             <w:noProof/>
           </w:rPr>
-          <w:instrText xml:space="preserve"> PAGEREF _Toc482710211 \h </w:instrText>
+          <w:instrText xml:space="preserve"> PAGEREF _Toc484441962 \h </w:instrText>
         </w:r>
         <w:r>
           <w:rPr>
@@ -667,7 +667,7 @@
           <w:rPr>
             <w:noProof/>
           </w:rPr>
-          <w:t>4</w:t>
+          <w:t>5</w:t>
         </w:r>
         <w:r>
           <w:rPr>
@@ -691,7 +691,7 @@
           <w:szCs w:val="22"/>
         </w:rPr>
       </w:pPr>
-      <w:hyperlink w:anchor="_Toc482710212" w:history="1">
+      <w:hyperlink w:anchor="_Toc484441963" w:history="1">
         <w:r>
           <w:rPr>
             <w:rStyle w:val="Hyperlink"/>
@@ -731,7 +731,7 @@
           <w:rPr>
             <w:noProof/>
           </w:rPr>
-          <w:instrText xml:space="preserve"> PAGEREF _Toc482710212 \h </w:instrText>
+          <w:instrText xml:space="preserve"> PAGEREF _Toc484441963 \h </w:instrText>
         </w:r>
         <w:r>
           <w:rPr>
@@ -772,7 +772,7 @@
           <w:szCs w:val="22"/>
         </w:rPr>
       </w:pPr>
-      <w:hyperlink w:anchor="_Toc482710213" w:history="1">
+      <w:hyperlink w:anchor="_Toc484441964" w:history="1">
         <w:r>
           <w:rPr>
             <w:rStyle w:val="Hyperlink"/>
@@ -812,7 +812,7 @@
           <w:rPr>
             <w:noProof/>
           </w:rPr>
-          <w:instrText xml:space="preserve"> PAGEREF _Toc482710213 \h </w:instrText>
+          <w:instrText xml:space="preserve"> PAGEREF _Toc484441964 \h </w:instrText>
         </w:r>
         <w:r>
           <w:rPr>
@@ -853,7 +853,7 @@
           <w:szCs w:val="22"/>
         </w:rPr>
       </w:pPr>
-      <w:hyperlink w:anchor="_Toc482710214" w:history="1">
+      <w:hyperlink w:anchor="_Toc484441965" w:history="1">
         <w:r>
           <w:rPr>
             <w:rStyle w:val="Hyperlink"/>
@@ -893,7 +893,7 @@
           <w:rPr>
             <w:noProof/>
           </w:rPr>
-          <w:instrText xml:space="preserve"> PAGEREF _Toc482710214 \h </w:instrText>
+          <w:instrText xml:space="preserve"> PAGEREF _Toc484441965 \h </w:instrText>
         </w:r>
         <w:r>
           <w:rPr>
@@ -934,7 +934,7 @@
           <w:szCs w:val="22"/>
         </w:rPr>
       </w:pPr>
-      <w:hyperlink w:anchor="_Toc482710215" w:history="1">
+      <w:hyperlink w:anchor="_Toc484441966" w:history="1">
         <w:r>
           <w:rPr>
             <w:rStyle w:val="Hyperlink"/>
@@ -974,7 +974,7 @@
           <w:rPr>
             <w:noProof/>
           </w:rPr>
-          <w:instrText xml:space="preserve"> PAGEREF _Toc482710215 \h </w:instrText>
+          <w:instrText xml:space="preserve"> PAGEREF _Toc484441966 \h </w:instrText>
         </w:r>
         <w:r>
           <w:rPr>
@@ -1015,7 +1015,7 @@
           <w:szCs w:val="22"/>
         </w:rPr>
       </w:pPr>
-      <w:hyperlink w:anchor="_Toc482710216" w:history="1">
+      <w:hyperlink w:anchor="_Toc484441967" w:history="1">
         <w:r>
           <w:rPr>
             <w:rStyle w:val="Hyperlink"/>
@@ -1055,7 +1055,7 @@
           <w:rPr>
             <w:noProof/>
           </w:rPr>
-          <w:instrText xml:space="preserve"> PAGEREF _Toc482710216 \h </w:instrText>
+          <w:instrText xml:space="preserve"> PAGEREF _Toc484441967 \h </w:instrText>
         </w:r>
         <w:r>
           <w:rPr>
@@ -1096,7 +1096,7 @@
           <w:szCs w:val="22"/>
         </w:rPr>
       </w:pPr>
-      <w:hyperlink w:anchor="_Toc482710217" w:history="1">
+      <w:hyperlink w:anchor="_Toc484441968" w:history="1">
         <w:r>
           <w:rPr>
             <w:rStyle w:val="Hyperlink"/>
@@ -1136,7 +1136,7 @@
           <w:rPr>
             <w:noProof/>
           </w:rPr>
-          <w:instrText xml:space="preserve"> PAGEREF _Toc482710217 \h </w:instrText>
+          <w:instrText xml:space="preserve"> PAGEREF _Toc484441968 \h </w:instrText>
         </w:r>
         <w:r>
           <w:rPr>
@@ -1177,7 +1177,7 @@
           <w:szCs w:val="22"/>
         </w:rPr>
       </w:pPr>
-      <w:hyperlink w:anchor="_Toc482710218" w:history="1">
+      <w:hyperlink w:anchor="_Toc484441969" w:history="1">
         <w:r>
           <w:rPr>
             <w:rStyle w:val="Hyperlink"/>
@@ -1217,7 +1217,7 @@
           <w:rPr>
             <w:noProof/>
           </w:rPr>
-          <w:instrText xml:space="preserve"> PAGEREF _Toc482710218 \h </w:instrText>
+          <w:instrText xml:space="preserve"> PAGEREF _Toc484441969 \h </w:instrText>
         </w:r>
         <w:r>
           <w:rPr>
@@ -1258,7 +1258,7 @@
           <w:szCs w:val="22"/>
         </w:rPr>
       </w:pPr>
-      <w:hyperlink w:anchor="_Toc482710219" w:history="1">
+      <w:hyperlink w:anchor="_Toc484441970" w:history="1">
         <w:r>
           <w:rPr>
             <w:rStyle w:val="Hyperlink"/>
@@ -1298,7 +1298,7 @@
           <w:rPr>
             <w:noProof/>
           </w:rPr>
-          <w:instrText xml:space="preserve"> PAGEREF _Toc482710219 \h </w:instrText>
+          <w:instrText xml:space="preserve"> PAGEREF _Toc484441970 \h </w:instrText>
         </w:r>
         <w:r>
           <w:rPr>
@@ -1339,7 +1339,7 @@
           <w:szCs w:val="22"/>
         </w:rPr>
       </w:pPr>
-      <w:hyperlink w:anchor="_Toc482710220" w:history="1">
+      <w:hyperlink w:anchor="_Toc484441971" w:history="1">
         <w:r>
           <w:rPr>
             <w:rStyle w:val="Hyperlink"/>
@@ -1379,7 +1379,7 @@
           <w:rPr>
             <w:noProof/>
           </w:rPr>
-          <w:instrText xml:space="preserve"> PAGEREF _Toc482710220 \h </w:instrText>
+          <w:instrText xml:space="preserve"> PAGEREF _Toc484441971 \h </w:instrText>
         </w:r>
         <w:r>
           <w:rPr>
@@ -1420,7 +1420,7 @@
           <w:szCs w:val="22"/>
         </w:rPr>
       </w:pPr>
-      <w:hyperlink w:anchor="_Toc482710221" w:history="1">
+      <w:hyperlink w:anchor="_Toc484441972" w:history="1">
         <w:r>
           <w:rPr>
             <w:rStyle w:val="Hyperlink"/>
@@ -1460,7 +1460,7 @@
           <w:rPr>
             <w:noProof/>
           </w:rPr>
-          <w:instrText xml:space="preserve"> PAGEREF _Toc482710221 \h </w:instrText>
+          <w:instrText xml:space="preserve"> PAGEREF _Toc484441972 \h </w:instrText>
         </w:r>
         <w:r>
           <w:rPr>
@@ -1501,7 +1501,7 @@
           <w:szCs w:val="22"/>
         </w:rPr>
       </w:pPr>
-      <w:hyperlink w:anchor="_Toc482710222" w:history="1">
+      <w:hyperlink w:anchor="_Toc484441973" w:history="1">
         <w:r>
           <w:rPr>
             <w:rStyle w:val="Hyperlink"/>
@@ -1541,7 +1541,7 @@
           <w:rPr>
             <w:noProof/>
           </w:rPr>
-          <w:instrText xml:space="preserve"> PAGEREF _Toc482710222 \h </w:instrText>
+          <w:instrText xml:space="preserve"> PAGEREF _Toc484441973 \h </w:instrText>
         </w:r>
         <w:r>
           <w:rPr>
@@ -1582,7 +1582,7 @@
           <w:szCs w:val="22"/>
         </w:rPr>
       </w:pPr>
-      <w:hyperlink w:anchor="_Toc482710223" w:history="1">
+      <w:hyperlink w:anchor="_Toc484441974" w:history="1">
         <w:r>
           <w:rPr>
             <w:rStyle w:val="Hyperlink"/>
@@ -1622,7 +1622,7 @@
           <w:rPr>
             <w:noProof/>
           </w:rPr>
-          <w:instrText xml:space="preserve"> PAGEREF _Toc482710223 \h </w:instrText>
+          <w:instrText xml:space="preserve"> PAGEREF _Toc484441974 \h </w:instrText>
         </w:r>
         <w:r>
           <w:rPr>
@@ -1658,7 +1658,7 @@
           <w:szCs w:val="22"/>
         </w:rPr>
       </w:pPr>
-      <w:hyperlink w:anchor="_Toc482710224" w:history="1">
+      <w:hyperlink w:anchor="_Toc484441975" w:history="1">
         <w:r>
           <w:rPr>
             <w:rStyle w:val="Hyperlink"/>
@@ -1686,7 +1686,7 @@
           <w:fldChar w:fldCharType="begin"/>
         </w:r>
         <w:r>
-          <w:instrText xml:space="preserve"> PAGEREF _Toc482710224 \h </w:instrText>
+          <w:instrText xml:space="preserve"> PAGEREF _Toc484441975 \h </w:instrText>
         </w:r>
         <w:r>
           <w:fldChar w:fldCharType="separate"/>
@@ -1708,7 +1708,7 @@
           <w:szCs w:val="22"/>
         </w:rPr>
       </w:pPr>
-      <w:hyperlink w:anchor="_Toc482710225" w:history="1">
+      <w:hyperlink w:anchor="_Toc484441976" w:history="1">
         <w:r>
           <w:rPr>
             <w:rStyle w:val="Hyperlink"/>
@@ -1736,7 +1736,7 @@
           <w:fldChar w:fldCharType="begin"/>
         </w:r>
         <w:r>
-          <w:instrText xml:space="preserve"> PAGEREF _Toc482710225 \h </w:instrText>
+          <w:instrText xml:space="preserve"> PAGEREF _Toc484441976 \h </w:instrText>
         </w:r>
         <w:r>
           <w:fldChar w:fldCharType="separate"/>
@@ -1758,7 +1758,7 @@
           <w:szCs w:val="22"/>
         </w:rPr>
       </w:pPr>
-      <w:hyperlink w:anchor="_Toc482710226" w:history="1">
+      <w:hyperlink w:anchor="_Toc484441977" w:history="1">
         <w:r>
           <w:rPr>
             <w:rStyle w:val="Hyperlink"/>
@@ -1786,7 +1786,7 @@
           <w:fldChar w:fldCharType="begin"/>
         </w:r>
         <w:r>
-          <w:instrText xml:space="preserve"> PAGEREF _Toc482710226 \h </w:instrText>
+          <w:instrText xml:space="preserve"> PAGEREF _Toc484441977 \h </w:instrText>
         </w:r>
         <w:r>
           <w:fldChar w:fldCharType="separate"/>
@@ -1808,7 +1808,7 @@
           <w:szCs w:val="22"/>
         </w:rPr>
       </w:pPr>
-      <w:hyperlink w:anchor="_Toc482710227" w:history="1">
+      <w:hyperlink w:anchor="_Toc484441978" w:history="1">
         <w:r>
           <w:rPr>
             <w:rStyle w:val="Hyperlink"/>
@@ -1836,7 +1836,7 @@
           <w:fldChar w:fldCharType="begin"/>
         </w:r>
         <w:r>
-          <w:instrText xml:space="preserve"> PAGEREF _Toc482710227 \h </w:instrText>
+          <w:instrText xml:space="preserve"> PAGEREF _Toc484441978 \h </w:instrText>
         </w:r>
         <w:r>
           <w:fldChar w:fldCharType="separate"/>
@@ -1863,7 +1863,7 @@
           <w:szCs w:val="22"/>
         </w:rPr>
       </w:pPr>
-      <w:hyperlink w:anchor="_Toc482710228" w:history="1">
+      <w:hyperlink w:anchor="_Toc484441979" w:history="1">
         <w:r>
           <w:rPr>
             <w:rStyle w:val="Hyperlink"/>
@@ -1903,7 +1903,7 @@
           <w:rPr>
             <w:noProof/>
           </w:rPr>
-          <w:instrText xml:space="preserve"> PAGEREF _Toc482710228 \h </w:instrText>
+          <w:instrText xml:space="preserve"> PAGEREF _Toc484441979 \h </w:instrText>
         </w:r>
         <w:r>
           <w:rPr>
@@ -1939,7 +1939,7 @@
           <w:szCs w:val="22"/>
         </w:rPr>
       </w:pPr>
-      <w:hyperlink w:anchor="_Toc482710229" w:history="1">
+      <w:hyperlink w:anchor="_Toc484441980" w:history="1">
         <w:r>
           <w:rPr>
             <w:rStyle w:val="Hyperlink"/>
@@ -1967,7 +1967,7 @@
           <w:fldChar w:fldCharType="begin"/>
         </w:r>
         <w:r>
-          <w:instrText xml:space="preserve"> PAGEREF _Toc482710229 \h </w:instrText>
+          <w:instrText xml:space="preserve"> PAGEREF _Toc484441980 \h </w:instrText>
         </w:r>
         <w:r>
           <w:fldChar w:fldCharType="separate"/>
@@ -1994,7 +1994,7 @@
           <w:szCs w:val="22"/>
         </w:rPr>
       </w:pPr>
-      <w:hyperlink w:anchor="_Toc482710230" w:history="1">
+      <w:hyperlink w:anchor="_Toc484441981" w:history="1">
         <w:r>
           <w:rPr>
             <w:rStyle w:val="Hyperlink"/>
@@ -2034,7 +2034,7 @@
           <w:rPr>
             <w:noProof/>
           </w:rPr>
-          <w:instrText xml:space="preserve"> PAGEREF _Toc482710230 \h </w:instrText>
+          <w:instrText xml:space="preserve"> PAGEREF _Toc484441981 \h </w:instrText>
         </w:r>
         <w:r>
           <w:rPr>
@@ -2075,7 +2075,7 @@
           <w:szCs w:val="22"/>
         </w:rPr>
       </w:pPr>
-      <w:hyperlink w:anchor="_Toc482710231" w:history="1">
+      <w:hyperlink w:anchor="_Toc484441982" w:history="1">
         <w:r>
           <w:rPr>
             <w:rStyle w:val="Hyperlink"/>
@@ -2115,7 +2115,7 @@
           <w:rPr>
             <w:noProof/>
           </w:rPr>
-          <w:instrText xml:space="preserve"> PAGEREF _Toc482710231 \h </w:instrText>
+          <w:instrText xml:space="preserve"> PAGEREF _Toc484441982 \h </w:instrText>
         </w:r>
         <w:r>
           <w:rPr>
@@ -2156,7 +2156,7 @@
           <w:szCs w:val="22"/>
         </w:rPr>
       </w:pPr>
-      <w:hyperlink w:anchor="_Toc482710232" w:history="1">
+      <w:hyperlink w:anchor="_Toc484441983" w:history="1">
         <w:r>
           <w:rPr>
             <w:rStyle w:val="Hyperlink"/>
@@ -2196,7 +2196,7 @@
           <w:rPr>
             <w:noProof/>
           </w:rPr>
-          <w:instrText xml:space="preserve"> PAGEREF _Toc482710232 \h </w:instrText>
+          <w:instrText xml:space="preserve"> PAGEREF _Toc484441983 \h </w:instrText>
         </w:r>
         <w:r>
           <w:rPr>
@@ -2237,7 +2237,7 @@
           <w:szCs w:val="22"/>
         </w:rPr>
       </w:pPr>
-      <w:hyperlink w:anchor="_Toc482710233" w:history="1">
+      <w:hyperlink w:anchor="_Toc484441984" w:history="1">
         <w:r>
           <w:rPr>
             <w:rStyle w:val="Hyperlink"/>
@@ -2277,7 +2277,7 @@
           <w:rPr>
             <w:noProof/>
           </w:rPr>
-          <w:instrText xml:space="preserve"> PAGEREF _Toc482710233 \h </w:instrText>
+          <w:instrText xml:space="preserve"> PAGEREF _Toc484441984 \h </w:instrText>
         </w:r>
         <w:r>
           <w:rPr>
@@ -2313,7 +2313,7 @@
           <w:szCs w:val="22"/>
         </w:rPr>
       </w:pPr>
-      <w:hyperlink w:anchor="_Toc482710234" w:history="1">
+      <w:hyperlink w:anchor="_Toc484441985" w:history="1">
         <w:r>
           <w:rPr>
             <w:rStyle w:val="Hyperlink"/>
@@ -2341,7 +2341,7 @@
           <w:fldChar w:fldCharType="begin"/>
         </w:r>
         <w:r>
-          <w:instrText xml:space="preserve"> PAGEREF _Toc482710234 \h </w:instrText>
+          <w:instrText xml:space="preserve"> PAGEREF _Toc484441985 \h </w:instrText>
         </w:r>
         <w:r>
           <w:fldChar w:fldCharType="separate"/>
@@ -2363,7 +2363,7 @@
           <w:szCs w:val="22"/>
         </w:rPr>
       </w:pPr>
-      <w:hyperlink w:anchor="_Toc482710235" w:history="1">
+      <w:hyperlink w:anchor="_Toc484441986" w:history="1">
         <w:r>
           <w:rPr>
             <w:rStyle w:val="Hyperlink"/>
@@ -2391,7 +2391,7 @@
           <w:fldChar w:fldCharType="begin"/>
         </w:r>
         <w:r>
-          <w:instrText xml:space="preserve"> PAGEREF _Toc482710235 \h </w:instrText>
+          <w:instrText xml:space="preserve"> PAGEREF _Toc484441986 \h </w:instrText>
         </w:r>
         <w:r>
           <w:fldChar w:fldCharType="separate"/>
@@ -2413,7 +2413,7 @@
           <w:szCs w:val="22"/>
         </w:rPr>
       </w:pPr>
-      <w:hyperlink w:anchor="_Toc482710236" w:history="1">
+      <w:hyperlink w:anchor="_Toc484441987" w:history="1">
         <w:r>
           <w:rPr>
             <w:rStyle w:val="Hyperlink"/>
@@ -2441,7 +2441,7 @@
           <w:fldChar w:fldCharType="begin"/>
         </w:r>
         <w:r>
-          <w:instrText xml:space="preserve"> PAGEREF _Toc482710236 \h </w:instrText>
+          <w:instrText xml:space="preserve"> PAGEREF _Toc484441987 \h </w:instrText>
         </w:r>
         <w:r>
           <w:fldChar w:fldCharType="separate"/>
@@ -2468,7 +2468,7 @@
           <w:szCs w:val="22"/>
         </w:rPr>
       </w:pPr>
-      <w:hyperlink w:anchor="_Toc482710237" w:history="1">
+      <w:hyperlink w:anchor="_Toc484441988" w:history="1">
         <w:r>
           <w:rPr>
             <w:rStyle w:val="Hyperlink"/>
@@ -2508,7 +2508,7 @@
           <w:rPr>
             <w:noProof/>
           </w:rPr>
-          <w:instrText xml:space="preserve"> PAGEREF _Toc482710237 \h </w:instrText>
+          <w:instrText xml:space="preserve"> PAGEREF _Toc484441988 \h </w:instrText>
         </w:r>
         <w:r>
           <w:rPr>
@@ -2566,7 +2566,7 @@
       <w:pPr>
         <w:pStyle w:val="Heading1"/>
       </w:pPr>
-      <w:bookmarkStart w:id="1" w:name="_Toc482710210"/>
+      <w:bookmarkStart w:id="1" w:name="_Toc484441961"/>
       <w:r>
         <w:lastRenderedPageBreak/>
         <w:t>Introduction</w:t>
@@ -2684,14 +2684,70 @@
     </w:p>
     <w:p>
       <w:pPr>
+        <w:pStyle w:val="EDBTXTNormalWebBlack"/>
+      </w:pPr>
+    </w:p>
+    <w:p>
+      <w:pPr>
+        <w:pStyle w:val="EDBTXTNormalWebBlack"/>
+      </w:pPr>
+    </w:p>
+    <w:p>
+      <w:pPr>
+        <w:pStyle w:val="EDBTXTNormalWebBlack"/>
+      </w:pPr>
+    </w:p>
+    <w:p>
+      <w:pPr>
+        <w:pStyle w:val="EDBTXTNormalWebBlack"/>
+      </w:pPr>
+    </w:p>
+    <w:p>
+      <w:pPr>
+        <w:pStyle w:val="EDBTXTNormalWebBlack"/>
+      </w:pPr>
+    </w:p>
+    <w:p>
+      <w:pPr>
+        <w:pStyle w:val="EDBTXTNormalWebBlack"/>
+      </w:pPr>
+    </w:p>
+    <w:p>
+      <w:pPr>
+        <w:pStyle w:val="EDBTXTNormalWebBlack"/>
+      </w:pPr>
+    </w:p>
+    <w:p>
+      <w:pPr>
+        <w:pStyle w:val="EDBTXTNormalWebBlack"/>
+      </w:pPr>
+    </w:p>
+    <w:p>
+      <w:pPr>
+        <w:pStyle w:val="EDBTXTNormalWebBlack"/>
+      </w:pPr>
+    </w:p>
+    <w:p>
+      <w:pPr>
+        <w:pStyle w:val="EDBTXTNormalWebBlack"/>
+      </w:pPr>
+    </w:p>
+    <w:p>
+      <w:pPr>
+        <w:pStyle w:val="EDBTXTNormalWebBlack"/>
+      </w:pPr>
+    </w:p>
+    <w:p>
+      <w:pPr>
         <w:pStyle w:val="Heading2"/>
         <w:tabs>
           <w:tab w:val="left" w:pos="576"/>
         </w:tabs>
       </w:pPr>
       <w:bookmarkStart w:id="2" w:name="_Toc453572801"/>
-      <w:bookmarkStart w:id="3" w:name="_Toc482710211"/>
-      <w:r>
+      <w:bookmarkStart w:id="3" w:name="_Toc484441962"/>
+      <w:r>
+        <w:lastRenderedPageBreak/>
         <w:t>What’s New</w:t>
       </w:r>
       <w:bookmarkEnd w:id="2"/>
@@ -2734,11 +2790,15 @@
     </w:p>
     <w:p>
       <w:pPr>
-        <w:pStyle w:val="EDBTXTNormalWebBlack"/>
+        <w:pStyle w:val="EDBTXTNormalWebBlackCharChar1"/>
         <w:numPr>
           <w:ilvl w:val="0"/>
-          <w:numId w:val="17"/>
+          <w:numId w:val="2"/>
         </w:numPr>
+        <w:tabs>
+          <w:tab w:val="left" w:pos="720"/>
+        </w:tabs>
+        <w:spacing w:before="0" w:after="0"/>
         <w:rPr>
           <w:lang w:eastAsia="ar-SA"/>
         </w:rPr>
@@ -2747,73 +2807,63 @@
         <w:rPr>
           <w:lang w:eastAsia="ar-SA"/>
         </w:rPr>
-        <w:t xml:space="preserve">The .NET </w:t>
-      </w:r>
-      <w:r>
+        <w:t>Merged with the community Npgsql driver version 3.1.9</w:t>
+      </w:r>
+    </w:p>
+    <w:p>
+      <w:pPr>
+        <w:pStyle w:val="EDBTXTNormalWebBlackCharChar1"/>
+        <w:numPr>
+          <w:ilvl w:val="0"/>
+          <w:numId w:val="2"/>
+        </w:numPr>
+        <w:tabs>
+          <w:tab w:val="left" w:pos="720"/>
+        </w:tabs>
+        <w:spacing w:before="0" w:after="0"/>
         <w:rPr>
           <w:lang w:eastAsia="ar-SA"/>
         </w:rPr>
-        <w:t xml:space="preserve">Connector </w:t>
-      </w:r>
+      </w:pPr>
       <w:r>
         <w:rPr>
           <w:lang w:eastAsia="ar-SA"/>
         </w:rPr>
-        <w:t xml:space="preserve">now provides </w:t>
-      </w:r>
-      <w:r>
+        <w:t>Authentication for MS Office fails on Win32.</w:t>
+      </w:r>
+    </w:p>
+    <w:p>
+      <w:pPr>
+        <w:pStyle w:val="EDBTXTNormalWebBlackCharChar1"/>
+        <w:numPr>
+          <w:ilvl w:val="0"/>
+          <w:numId w:val="2"/>
+        </w:numPr>
+        <w:tabs>
+          <w:tab w:val="left" w:pos="720"/>
+        </w:tabs>
+        <w:spacing w:before="0" w:after="0"/>
         <w:rPr>
           <w:lang w:eastAsia="ar-SA"/>
         </w:rPr>
-        <w:t xml:space="preserve">access to </w:t>
-      </w:r>
+      </w:pPr>
       <w:r>
         <w:rPr>
           <w:lang w:eastAsia="ar-SA"/>
         </w:rPr>
-        <w:t>Advanced Server</w:t>
+        <w:t xml:space="preserve">The .NET Connector now provides access to Advanced Server databases from Microsoft Visual Studio with the </w:t>
       </w:r>
       <w:r>
         <w:rPr>
           <w:lang w:eastAsia="ar-SA"/>
         </w:rPr>
-        <w:t xml:space="preserve"> databases from Microsoft Visual Studio with the </w:t>
+        <w:t>EDBDdexProvider</w:t>
       </w:r>
       <w:r>
         <w:rPr>
           <w:lang w:eastAsia="ar-SA"/>
         </w:rPr>
-        <w:t>EDBDdexProvider</w:t>
-      </w:r>
-      <w:r>
-        <w:rPr>
-          <w:lang w:eastAsia="ar-SA"/>
-        </w:rPr>
-        <w:t xml:space="preserve"> component. Thus, the features of Visual Studio can now be used </w:t>
-      </w:r>
-      <w:r>
-        <w:rPr>
-          <w:lang w:eastAsia="ar-SA"/>
-        </w:rPr>
-        <w:t xml:space="preserve">with </w:t>
-      </w:r>
-      <w:r>
-        <w:rPr>
-          <w:lang w:eastAsia="ar-SA"/>
-        </w:rPr>
-        <w:t>Advanced Server</w:t>
-      </w:r>
-      <w:r>
-        <w:rPr>
-          <w:lang w:eastAsia="ar-SA"/>
-        </w:rPr>
-        <w:t xml:space="preserve"> as the external data source. For more information, see </w:t>
-      </w:r>
-      <w:r>
-        <w:rPr>
-          <w:lang w:eastAsia="ar-SA"/>
-        </w:rPr>
-        <w:t xml:space="preserve">Section </w:t>
+        <w:t xml:space="preserve"> component. Thus, the features of Visual Studio can now be used with Advanced Server as the external data source. For more information, see Section </w:t>
       </w:r>
       <w:r>
         <w:rPr>
@@ -2865,11 +2915,15 @@
     </w:p>
     <w:p>
       <w:pPr>
-        <w:pStyle w:val="EDBTXTNormalWebBlack"/>
+        <w:pStyle w:val="EDBTXTNormalWebBlackCharChar1"/>
         <w:numPr>
           <w:ilvl w:val="0"/>
-          <w:numId w:val="17"/>
+          <w:numId w:val="2"/>
         </w:numPr>
+        <w:tabs>
+          <w:tab w:val="left" w:pos="720"/>
+        </w:tabs>
+        <w:spacing w:before="0" w:after="0"/>
         <w:rPr>
           <w:lang w:eastAsia="ar-SA"/>
         </w:rPr>
@@ -2878,94 +2932,8 @@
         <w:rPr>
           <w:lang w:eastAsia="ar-SA"/>
         </w:rPr>
-        <w:t>The .NET C</w:t>
-      </w:r>
-      <w:r>
-        <w:rPr>
-          <w:lang w:eastAsia="ar-SA"/>
-        </w:rPr>
-        <w:t>onne</w:t>
-      </w:r>
-      <w:r>
-        <w:rPr>
-          <w:lang w:eastAsia="ar-SA"/>
-        </w:rPr>
-        <w:t>ctor</w:t>
-      </w:r>
-      <w:r>
-        <w:rPr>
-          <w:lang w:eastAsia="ar-SA"/>
-        </w:rPr>
-        <w:t xml:space="preserve"> is no</w:t>
-      </w:r>
-      <w:r>
-        <w:rPr>
-          <w:lang w:eastAsia="ar-SA"/>
-        </w:rPr>
-        <w:t>w</w:t>
-      </w:r>
-      <w:r>
-        <w:rPr>
-          <w:lang w:eastAsia="ar-SA"/>
-        </w:rPr>
-        <w:t xml:space="preserve"> based on </w:t>
-      </w:r>
-      <w:r>
-        <w:rPr>
-          <w:lang w:eastAsia="ar-SA"/>
-        </w:rPr>
-        <w:t xml:space="preserve">.NET </w:t>
-      </w:r>
-      <w:r>
-        <w:rPr>
-          <w:lang w:eastAsia="ar-SA"/>
-        </w:rPr>
-        <w:t xml:space="preserve">Framework version </w:t>
-      </w:r>
-      <w:r>
-        <w:rPr>
-          <w:lang w:eastAsia="ar-SA"/>
-        </w:rPr>
-        <w:t xml:space="preserve">4.5.1. If there are existing applications based on .NET </w:t>
-      </w:r>
-      <w:r>
-        <w:rPr>
-          <w:lang w:eastAsia="ar-SA"/>
-        </w:rPr>
-        <w:t xml:space="preserve">Framework </w:t>
-      </w:r>
-      <w:r>
-        <w:rPr>
-          <w:lang w:eastAsia="ar-SA"/>
-        </w:rPr>
-        <w:t xml:space="preserve">4.5, </w:t>
-      </w:r>
-      <w:r>
-        <w:rPr>
-          <w:lang w:eastAsia="ar-SA"/>
-        </w:rPr>
-        <w:t>they need to be upgraded to 4.5.1.</w:t>
-      </w:r>
-    </w:p>
-    <w:p>
-      <w:pPr>
-        <w:pStyle w:val="EDBTXTNormalWebBlackCharChar0"/>
-      </w:pPr>
-    </w:p>
-    <w:p>
-      <w:pPr>
-        <w:pStyle w:val="EDBTXTNormalWebBlackCharChar0"/>
-      </w:pPr>
-    </w:p>
-    <w:p>
-      <w:pPr>
-        <w:pStyle w:val="EDBTXTNormalWebBlackCharChar0"/>
-      </w:pPr>
-    </w:p>
-    <w:p>
-      <w:pPr>
-        <w:pStyle w:val="EDBTXTNormalWebBlackCharChar0"/>
-      </w:pPr>
+        <w:t>The .NET Connector is now based on .NET Framework version 4.5.1. If there are existing applications based on .NET Framework 4.5, they need to be upgraded to 4.5.1.</w:t>
+      </w:r>
     </w:p>
     <w:p>
       <w:pPr>
@@ -2980,9 +2948,8 @@
       <w:bookmarkStart w:id="5" w:name="_Ref103071794"/>
       <w:bookmarkStart w:id="6" w:name="_Ref103073047"/>
       <w:bookmarkStart w:id="7" w:name="_Ref103073090"/>
-      <w:bookmarkStart w:id="8" w:name="_Toc482710212"/>
-      <w:r>
-        <w:lastRenderedPageBreak/>
+      <w:bookmarkStart w:id="8" w:name="_Toc484441963"/>
+      <w:r>
         <w:t>Typographical Conventions Used in this Guide</w:t>
       </w:r>
       <w:bookmarkEnd w:id="4"/>
@@ -3373,7 +3340,7 @@
       <w:pPr>
         <w:pStyle w:val="Heading1"/>
       </w:pPr>
-      <w:bookmarkStart w:id="10" w:name="_Toc482710213"/>
+      <w:bookmarkStart w:id="10" w:name="_Toc484441964"/>
       <w:r>
         <w:lastRenderedPageBreak/>
         <w:t>The Advanced Server .NET Connector - Overview</w:t>
@@ -3439,7 +3406,7 @@
       <w:pPr>
         <w:pStyle w:val="Heading2"/>
       </w:pPr>
-      <w:bookmarkStart w:id="11" w:name="_Toc482710214"/>
+      <w:bookmarkStart w:id="11" w:name="_Toc484441965"/>
       <w:r>
         <w:t>The .NET Class Hierarchy</w:t>
       </w:r>
@@ -3726,7 +3693,7 @@
       <w:pPr>
         <w:pStyle w:val="Heading2"/>
       </w:pPr>
-      <w:bookmarkStart w:id="12" w:name="_Toc482710215"/>
+      <w:bookmarkStart w:id="12" w:name="_Toc484441966"/>
       <w:r>
         <w:lastRenderedPageBreak/>
         <w:t>Installing the .NET Connector</w:t>
@@ -3790,7 +3757,7 @@
           <w:noProof/>
         </w:rPr>
         <w:drawing>
-          <wp:inline distT="0" distB="0" distL="0" distR="0" wp14:anchorId="257A1743" wp14:editId="57DB2C42">
+          <wp:inline distT="0" distB="0" distL="0" distR="0" wp14:anchorId="288FA727" wp14:editId="2A0C3F90">
             <wp:extent cx="4114800" cy="2728253"/>
             <wp:effectExtent l="0" t="0" r="0" b="0"/>
             <wp:docPr id="9" name="Picture 9"/>
@@ -3974,7 +3941,7 @@
         </w:rPr>
         <w:lastRenderedPageBreak/>
         <w:drawing>
-          <wp:inline distT="0" distB="0" distL="0" distR="0" wp14:anchorId="0E3DCA0A" wp14:editId="737CAC8F">
+          <wp:inline distT="0" distB="0" distL="0" distR="0" wp14:anchorId="32EF3A39" wp14:editId="1E997E6A">
             <wp:extent cx="3886200" cy="3037805"/>
             <wp:effectExtent l="0" t="0" r="0" b="0"/>
             <wp:docPr id="2" name="Picture 2"/>
@@ -4076,7 +4043,7 @@
           <w:noProof/>
         </w:rPr>
         <w:drawing>
-          <wp:inline distT="0" distB="0" distL="0" distR="0" wp14:anchorId="10F4DC5E" wp14:editId="1CB6C3B7">
+          <wp:inline distT="0" distB="0" distL="0" distR="0" wp14:anchorId="01937CF5" wp14:editId="122D6B52">
             <wp:extent cx="3886200" cy="3046927"/>
             <wp:effectExtent l="0" t="0" r="0" b="1270"/>
             <wp:docPr id="3" name="Picture 3"/>
@@ -4203,7 +4170,7 @@
         </w:rPr>
         <w:lastRenderedPageBreak/>
         <w:drawing>
-          <wp:inline distT="0" distB="0" distL="0" distR="0" wp14:anchorId="2A7EF47C" wp14:editId="63760AF1">
+          <wp:inline distT="0" distB="0" distL="0" distR="0" wp14:anchorId="737AD1A0" wp14:editId="49C8CC3E">
             <wp:extent cx="4114800" cy="3217552"/>
             <wp:effectExtent l="0" t="0" r="0" b="1905"/>
             <wp:docPr id="4" name="Picture 4"/>
@@ -4338,7 +4305,7 @@
           <w:noProof/>
         </w:rPr>
         <w:drawing>
-          <wp:inline distT="0" distB="0" distL="0" distR="0" wp14:anchorId="428EADD8" wp14:editId="76B01FB1">
+          <wp:inline distT="0" distB="0" distL="0" distR="0" wp14:anchorId="375031FA" wp14:editId="1A9A1A4A">
             <wp:extent cx="4114800" cy="3194511"/>
             <wp:effectExtent l="0" t="0" r="0" b="6350"/>
             <wp:docPr id="5" name="Picture 5"/>
@@ -4500,7 +4467,7 @@
           <w:noProof/>
         </w:rPr>
         <w:drawing>
-          <wp:inline distT="0" distB="0" distL="0" distR="0" wp14:anchorId="5DBCBC8A" wp14:editId="2C99E20F">
+          <wp:inline distT="0" distB="0" distL="0" distR="0" wp14:anchorId="24EF53E3" wp14:editId="0C71FE7D">
             <wp:extent cx="3790950" cy="1619051"/>
             <wp:effectExtent l="0" t="0" r="0" b="635"/>
             <wp:docPr id="12" name="Picture 12" descr="C:\Users\susan\AppData\Local\Temp\vmware-susan\VMwareDnD\7412d23f\Screen Shot 2016-07-11 at 4.50.20 PM.png"/>
@@ -4648,7 +4615,7 @@
           <w:noProof/>
         </w:rPr>
         <w:drawing>
-          <wp:inline distT="0" distB="0" distL="0" distR="0" wp14:anchorId="268230D1" wp14:editId="6B9793D2">
+          <wp:inline distT="0" distB="0" distL="0" distR="0" wp14:anchorId="0C3CBEC8" wp14:editId="116FA912">
             <wp:extent cx="4114800" cy="3004331"/>
             <wp:effectExtent l="0" t="0" r="0" b="5715"/>
             <wp:docPr id="1" name="Picture 1"/>
@@ -4742,7 +4709,7 @@
         <w:pStyle w:val="Heading1"/>
       </w:pPr>
       <w:bookmarkStart w:id="13" w:name="_Ref456012125"/>
-      <w:bookmarkStart w:id="14" w:name="_Toc482710216"/>
+      <w:bookmarkStart w:id="14" w:name="_Toc484441967"/>
       <w:r>
         <w:lastRenderedPageBreak/>
         <w:t>Configuring the .NET Connector</w:t>
@@ -4914,7 +4881,7 @@
         <w:pStyle w:val="Heading2"/>
       </w:pPr>
       <w:bookmarkStart w:id="15" w:name="_Ref477525249"/>
-      <w:bookmarkStart w:id="16" w:name="_Toc482710217"/>
+      <w:bookmarkStart w:id="16" w:name="_Toc484441968"/>
       <w:r>
         <w:t>General Instructions</w:t>
       </w:r>
@@ -5180,7 +5147,7 @@
       <w:pPr>
         <w:pStyle w:val="Heading2"/>
       </w:pPr>
-      <w:bookmarkStart w:id="17" w:name="_Toc482710218"/>
+      <w:bookmarkStart w:id="17" w:name="_Toc484441969"/>
       <w:r>
         <w:t>.NET Framework 4.0</w:t>
       </w:r>
@@ -5374,7 +5341,7 @@
       <w:pPr>
         <w:pStyle w:val="Heading2"/>
       </w:pPr>
-      <w:bookmarkStart w:id="18" w:name="_Toc482710219"/>
+      <w:bookmarkStart w:id="18" w:name="_Toc484441970"/>
       <w:r>
         <w:t>.NET Framework 4.5</w:t>
       </w:r>
@@ -5575,7 +5542,7 @@
         <w:pStyle w:val="Heading2"/>
       </w:pPr>
       <w:bookmarkStart w:id="19" w:name="_Ref477527440"/>
-      <w:bookmarkStart w:id="20" w:name="_Toc482710220"/>
+      <w:bookmarkStart w:id="20" w:name="_Toc484441971"/>
       <w:r>
         <w:t>Entity Framework 6</w:t>
       </w:r>
@@ -6339,7 +6306,7 @@
         <w:pStyle w:val="Heading2"/>
       </w:pPr>
       <w:bookmarkStart w:id="21" w:name="_Ref477528081"/>
-      <w:bookmarkStart w:id="22" w:name="_Toc482710221"/>
+      <w:bookmarkStart w:id="22" w:name="_Toc484441972"/>
       <w:r>
         <w:t>EDBDdexProvider for Visual Studio</w:t>
       </w:r>
@@ -7482,7 +7449,7 @@
         <w:pStyle w:val="Heading1"/>
       </w:pPr>
       <w:bookmarkStart w:id="23" w:name="_Ref482087625"/>
-      <w:bookmarkStart w:id="24" w:name="_Toc482710222"/>
+      <w:bookmarkStart w:id="24" w:name="_Toc484441973"/>
       <w:r>
         <w:lastRenderedPageBreak/>
         <w:t>Using the .NET Connector</w:t>
@@ -7736,7 +7703,7 @@
       <w:pPr>
         <w:pStyle w:val="Heading2"/>
       </w:pPr>
-      <w:bookmarkStart w:id="25" w:name="_Toc482710223"/>
+      <w:bookmarkStart w:id="25" w:name="_Toc484441974"/>
       <w:r>
         <w:t>Opening a Database Connection</w:t>
       </w:r>
@@ -7954,7 +7921,7 @@
         <w:pStyle w:val="Heading3"/>
       </w:pPr>
       <w:bookmarkStart w:id="26" w:name="_Ref482087661"/>
-      <w:bookmarkStart w:id="27" w:name="_Toc482710224"/>
+      <w:bookmarkStart w:id="27" w:name="_Toc484441975"/>
       <w:r>
         <w:t>Connection String Parameters</w:t>
       </w:r>
@@ -9018,7 +8985,7 @@
       <w:pPr>
         <w:pStyle w:val="Heading3"/>
       </w:pPr>
-      <w:bookmarkStart w:id="28" w:name="_Toc482710225"/>
+      <w:bookmarkStart w:id="28" w:name="_Toc484441976"/>
       <w:r>
         <w:t xml:space="preserve">Example - </w:t>
       </w:r>
@@ -9438,7 +9405,7 @@
           <w:noProof/>
         </w:rPr>
         <w:drawing>
-          <wp:inline distT="0" distB="0" distL="0" distR="0" wp14:anchorId="7C5B28D6" wp14:editId="503A84D0">
+          <wp:inline distT="0" distB="0" distL="0" distR="0" wp14:anchorId="03B5C3AD" wp14:editId="6F2076CC">
             <wp:extent cx="5480050" cy="1663700"/>
             <wp:effectExtent l="0" t="0" r="6350" b="0"/>
             <wp:docPr id="7" name="Picture 7" descr="Screen Shot 2014-06-26 at 8"/>
@@ -9496,7 +9463,7 @@
       <w:pPr>
         <w:pStyle w:val="Heading3"/>
       </w:pPr>
-      <w:bookmarkStart w:id="29" w:name="_Toc482710226"/>
+      <w:bookmarkStart w:id="29" w:name="_Toc484441977"/>
       <w:r>
         <w:t xml:space="preserve">Example - </w:t>
       </w:r>
@@ -10109,7 +10076,7 @@
       <w:pPr>
         <w:pStyle w:val="Heading3"/>
       </w:pPr>
-      <w:bookmarkStart w:id="30" w:name="_Toc482710227"/>
+      <w:bookmarkStart w:id="30" w:name="_Toc484441978"/>
       <w:r>
         <w:t xml:space="preserve">Example - </w:t>
       </w:r>
@@ -10906,7 +10873,7 @@
           <w:noProof/>
         </w:rPr>
         <w:drawing>
-          <wp:inline distT="0" distB="0" distL="0" distR="0" wp14:anchorId="70060F21" wp14:editId="337F5096">
+          <wp:inline distT="0" distB="0" distL="0" distR="0" wp14:anchorId="4B7A5DBB" wp14:editId="306A9EE2">
             <wp:extent cx="2120900" cy="2120900"/>
             <wp:effectExtent l="0" t="0" r="0" b="0"/>
             <wp:docPr id="8" name="Picture 8" descr="dialog"/>
@@ -11018,7 +10985,7 @@
       <w:pPr>
         <w:pStyle w:val="Heading2"/>
       </w:pPr>
-      <w:bookmarkStart w:id="31" w:name="_Toc482710228"/>
+      <w:bookmarkStart w:id="31" w:name="_Toc484441979"/>
       <w:r>
         <w:lastRenderedPageBreak/>
         <w:t>Retrieving Database Records</w:t>
@@ -12102,7 +12069,7 @@
       <w:pPr>
         <w:pStyle w:val="Heading3"/>
       </w:pPr>
-      <w:bookmarkStart w:id="32" w:name="_Toc482710229"/>
+      <w:bookmarkStart w:id="32" w:name="_Toc484441980"/>
       <w:r>
         <w:t>Retr</w:t>
       </w:r>
@@ -12636,7 +12603,7 @@
       <w:pPr>
         <w:pStyle w:val="Heading2"/>
       </w:pPr>
-      <w:bookmarkStart w:id="33" w:name="_Toc482710230"/>
+      <w:bookmarkStart w:id="33" w:name="_Toc484441981"/>
       <w:r>
         <w:lastRenderedPageBreak/>
         <w:t>Parameterized Queries</w:t>
@@ -13317,7 +13284,7 @@
       <w:pPr>
         <w:pStyle w:val="Heading2"/>
       </w:pPr>
-      <w:bookmarkStart w:id="34" w:name="_Toc482710231"/>
+      <w:bookmarkStart w:id="34" w:name="_Toc484441982"/>
       <w:r>
         <w:lastRenderedPageBreak/>
         <w:t>Inserting Records in a Database</w:t>
@@ -14163,7 +14130,7 @@
       <w:pPr>
         <w:pStyle w:val="Heading2"/>
       </w:pPr>
-      <w:bookmarkStart w:id="35" w:name="_Toc482710232"/>
+      <w:bookmarkStart w:id="35" w:name="_Toc484441983"/>
       <w:r>
         <w:lastRenderedPageBreak/>
         <w:t>Deleting Records in a Database</w:t>
@@ -15005,7 +14972,7 @@
       <w:pPr>
         <w:pStyle w:val="Heading2"/>
       </w:pPr>
-      <w:bookmarkStart w:id="36" w:name="_Toc482710233"/>
+      <w:bookmarkStart w:id="36" w:name="_Toc484441984"/>
       <w:r>
         <w:lastRenderedPageBreak/>
         <w:t>Using SPL Stored Procedures in your .NET Application</w:t>
@@ -15281,7 +15248,7 @@
       <w:pPr>
         <w:pStyle w:val="Heading3"/>
       </w:pPr>
-      <w:bookmarkStart w:id="37" w:name="_Toc482710234"/>
+      <w:bookmarkStart w:id="37" w:name="_Toc484441985"/>
       <w:r>
         <w:t>Example - Executing</w:t>
       </w:r>
@@ -16210,7 +16177,7 @@
       <w:pPr>
         <w:pStyle w:val="Heading3"/>
       </w:pPr>
-      <w:bookmarkStart w:id="38" w:name="_Toc482710235"/>
+      <w:bookmarkStart w:id="38" w:name="_Toc484441986"/>
       <w:r>
         <w:t xml:space="preserve">Example - </w:t>
       </w:r>
@@ -18006,7 +17973,7 @@
       <w:pPr>
         <w:pStyle w:val="Heading3"/>
       </w:pPr>
-      <w:bookmarkStart w:id="39" w:name="_Toc482710236"/>
+      <w:bookmarkStart w:id="39" w:name="_Toc484441987"/>
       <w:r>
         <w:t xml:space="preserve">Example - </w:t>
       </w:r>
@@ -20240,7 +20207,7 @@
       <w:pPr>
         <w:pStyle w:val="Heading2"/>
       </w:pPr>
-      <w:bookmarkStart w:id="40" w:name="_Toc482710237"/>
+      <w:bookmarkStart w:id="40" w:name="_Toc484441988"/>
       <w:r>
         <w:lastRenderedPageBreak/>
         <w:t xml:space="preserve">Using </w:t>
@@ -31513,7 +31480,7 @@
 </file>
 
 <file path=customXml/itemProps1.xml><?xml version="1.0" encoding="utf-8"?>
-<ds:datastoreItem xmlns:ds="http://schemas.openxmlformats.org/officeDocument/2006/customXml" ds:itemID="{47EBA4D4-1001-48FF-9A7F-41257594EC53}">
+<ds:datastoreItem xmlns:ds="http://schemas.openxmlformats.org/officeDocument/2006/customXml" ds:itemID="{0D22978E-ADBA-45C8-B8F3-A37696986646}">
   <ds:schemaRefs>
     <ds:schemaRef ds:uri="http://schemas.openxmlformats.org/officeDocument/2006/bibliography"/>
   </ds:schemaRefs>

</xml_diff>

<commit_message>
EPAS .Net Connector Guide 9.6.0.3 - RM 41454 In Whats New section removed bullet point Authentication failure for MS Office on Win32
</commit_message>
<xml_diff>
--- a/edb_docs/EDB_Postgres_Advanced_Server_NET_Connector_Guide.docx
+++ b/edb_docs/EDB_Postgres_Advanced_Server_NET_Connector_Guide.docx
@@ -12,7 +12,7 @@
           <w:noProof/>
         </w:rPr>
         <w:drawing>
-          <wp:inline distT="0" distB="0" distL="0" distR="0" wp14:anchorId="0771BCDE" wp14:editId="3167337E">
+          <wp:inline distT="0" distB="0" distL="0" distR="0" wp14:anchorId="77D5FFC1" wp14:editId="67C17FA7">
             <wp:extent cx="2380711" cy="1371599"/>
             <wp:effectExtent l="0" t="0" r="635" b="635"/>
             <wp:docPr id="6" name="Picture 6"/>
@@ -77,18 +77,18 @@
           <w:color w:val="auto"/>
         </w:rPr>
       </w:pPr>
+    </w:p>
+    <w:p>
+      <w:pPr>
+        <w:pStyle w:val="EDBTXTNormalWebBlackCharChar0"/>
+      </w:pPr>
+    </w:p>
+    <w:p>
+      <w:pPr>
+        <w:pStyle w:val="EDBTXTNormalWebBlackCharChar0"/>
+      </w:pPr>
       <w:bookmarkStart w:id="0" w:name="_GoBack"/>
       <w:bookmarkEnd w:id="0"/>
-    </w:p>
-    <w:p>
-      <w:pPr>
-        <w:pStyle w:val="EDBTXTNormalWebBlackCharChar0"/>
-      </w:pPr>
-    </w:p>
-    <w:p>
-      <w:pPr>
-        <w:pStyle w:val="EDBTXTNormalWebBlackCharChar0"/>
-      </w:pPr>
     </w:p>
     <w:p>
       <w:pPr>
@@ -228,7 +228,7 @@
         <w:t xml:space="preserve">June </w:t>
       </w:r>
       <w:r>
-        <w:t>6</w:t>
+        <w:t>14</w:t>
       </w:r>
       <w:r>
         <w:t>, 2017</w:t>
@@ -529,7 +529,7 @@
       <w:r>
         <w:fldChar w:fldCharType="separate"/>
       </w:r>
-      <w:hyperlink w:anchor="_Toc484441961" w:history="1">
+      <w:hyperlink w:anchor="_Toc485205013" w:history="1">
         <w:r>
           <w:rPr>
             <w:rStyle w:val="Hyperlink"/>
@@ -569,7 +569,7 @@
           <w:rPr>
             <w:noProof/>
           </w:rPr>
-          <w:instrText xml:space="preserve"> PAGEREF _Toc484441961 \h </w:instrText>
+          <w:instrText xml:space="preserve"> PAGEREF _Toc485205013 \h </w:instrText>
         </w:r>
         <w:r>
           <w:rPr>
@@ -610,7 +610,7 @@
           <w:szCs w:val="22"/>
         </w:rPr>
       </w:pPr>
-      <w:hyperlink w:anchor="_Toc484441962" w:history="1">
+      <w:hyperlink w:anchor="_Toc485205014" w:history="1">
         <w:r>
           <w:rPr>
             <w:rStyle w:val="Hyperlink"/>
@@ -650,7 +650,7 @@
           <w:rPr>
             <w:noProof/>
           </w:rPr>
-          <w:instrText xml:space="preserve"> PAGEREF _Toc484441962 \h </w:instrText>
+          <w:instrText xml:space="preserve"> PAGEREF _Toc485205014 \h </w:instrText>
         </w:r>
         <w:r>
           <w:rPr>
@@ -691,7 +691,7 @@
           <w:szCs w:val="22"/>
         </w:rPr>
       </w:pPr>
-      <w:hyperlink w:anchor="_Toc484441963" w:history="1">
+      <w:hyperlink w:anchor="_Toc485205015" w:history="1">
         <w:r>
           <w:rPr>
             <w:rStyle w:val="Hyperlink"/>
@@ -731,7 +731,7 @@
           <w:rPr>
             <w:noProof/>
           </w:rPr>
-          <w:instrText xml:space="preserve"> PAGEREF _Toc484441963 \h </w:instrText>
+          <w:instrText xml:space="preserve"> PAGEREF _Toc485205015 \h </w:instrText>
         </w:r>
         <w:r>
           <w:rPr>
@@ -772,7 +772,7 @@
           <w:szCs w:val="22"/>
         </w:rPr>
       </w:pPr>
-      <w:hyperlink w:anchor="_Toc484441964" w:history="1">
+      <w:hyperlink w:anchor="_Toc485205016" w:history="1">
         <w:r>
           <w:rPr>
             <w:rStyle w:val="Hyperlink"/>
@@ -812,7 +812,7 @@
           <w:rPr>
             <w:noProof/>
           </w:rPr>
-          <w:instrText xml:space="preserve"> PAGEREF _Toc484441964 \h </w:instrText>
+          <w:instrText xml:space="preserve"> PAGEREF _Toc485205016 \h </w:instrText>
         </w:r>
         <w:r>
           <w:rPr>
@@ -853,7 +853,7 @@
           <w:szCs w:val="22"/>
         </w:rPr>
       </w:pPr>
-      <w:hyperlink w:anchor="_Toc484441965" w:history="1">
+      <w:hyperlink w:anchor="_Toc485205017" w:history="1">
         <w:r>
           <w:rPr>
             <w:rStyle w:val="Hyperlink"/>
@@ -893,7 +893,7 @@
           <w:rPr>
             <w:noProof/>
           </w:rPr>
-          <w:instrText xml:space="preserve"> PAGEREF _Toc484441965 \h </w:instrText>
+          <w:instrText xml:space="preserve"> PAGEREF _Toc485205017 \h </w:instrText>
         </w:r>
         <w:r>
           <w:rPr>
@@ -934,7 +934,7 @@
           <w:szCs w:val="22"/>
         </w:rPr>
       </w:pPr>
-      <w:hyperlink w:anchor="_Toc484441966" w:history="1">
+      <w:hyperlink w:anchor="_Toc485205018" w:history="1">
         <w:r>
           <w:rPr>
             <w:rStyle w:val="Hyperlink"/>
@@ -974,7 +974,7 @@
           <w:rPr>
             <w:noProof/>
           </w:rPr>
-          <w:instrText xml:space="preserve"> PAGEREF _Toc484441966 \h </w:instrText>
+          <w:instrText xml:space="preserve"> PAGEREF _Toc485205018 \h </w:instrText>
         </w:r>
         <w:r>
           <w:rPr>
@@ -1015,7 +1015,7 @@
           <w:szCs w:val="22"/>
         </w:rPr>
       </w:pPr>
-      <w:hyperlink w:anchor="_Toc484441967" w:history="1">
+      <w:hyperlink w:anchor="_Toc485205019" w:history="1">
         <w:r>
           <w:rPr>
             <w:rStyle w:val="Hyperlink"/>
@@ -1055,7 +1055,7 @@
           <w:rPr>
             <w:noProof/>
           </w:rPr>
-          <w:instrText xml:space="preserve"> PAGEREF _Toc484441967 \h </w:instrText>
+          <w:instrText xml:space="preserve"> PAGEREF _Toc485205019 \h </w:instrText>
         </w:r>
         <w:r>
           <w:rPr>
@@ -1096,7 +1096,7 @@
           <w:szCs w:val="22"/>
         </w:rPr>
       </w:pPr>
-      <w:hyperlink w:anchor="_Toc484441968" w:history="1">
+      <w:hyperlink w:anchor="_Toc485205020" w:history="1">
         <w:r>
           <w:rPr>
             <w:rStyle w:val="Hyperlink"/>
@@ -1136,7 +1136,7 @@
           <w:rPr>
             <w:noProof/>
           </w:rPr>
-          <w:instrText xml:space="preserve"> PAGEREF _Toc484441968 \h </w:instrText>
+          <w:instrText xml:space="preserve"> PAGEREF _Toc485205020 \h </w:instrText>
         </w:r>
         <w:r>
           <w:rPr>
@@ -1177,7 +1177,7 @@
           <w:szCs w:val="22"/>
         </w:rPr>
       </w:pPr>
-      <w:hyperlink w:anchor="_Toc484441969" w:history="1">
+      <w:hyperlink w:anchor="_Toc485205021" w:history="1">
         <w:r>
           <w:rPr>
             <w:rStyle w:val="Hyperlink"/>
@@ -1217,7 +1217,7 @@
           <w:rPr>
             <w:noProof/>
           </w:rPr>
-          <w:instrText xml:space="preserve"> PAGEREF _Toc484441969 \h </w:instrText>
+          <w:instrText xml:space="preserve"> PAGEREF _Toc485205021 \h </w:instrText>
         </w:r>
         <w:r>
           <w:rPr>
@@ -1258,7 +1258,7 @@
           <w:szCs w:val="22"/>
         </w:rPr>
       </w:pPr>
-      <w:hyperlink w:anchor="_Toc484441970" w:history="1">
+      <w:hyperlink w:anchor="_Toc485205022" w:history="1">
         <w:r>
           <w:rPr>
             <w:rStyle w:val="Hyperlink"/>
@@ -1298,7 +1298,7 @@
           <w:rPr>
             <w:noProof/>
           </w:rPr>
-          <w:instrText xml:space="preserve"> PAGEREF _Toc484441970 \h </w:instrText>
+          <w:instrText xml:space="preserve"> PAGEREF _Toc485205022 \h </w:instrText>
         </w:r>
         <w:r>
           <w:rPr>
@@ -1339,7 +1339,7 @@
           <w:szCs w:val="22"/>
         </w:rPr>
       </w:pPr>
-      <w:hyperlink w:anchor="_Toc484441971" w:history="1">
+      <w:hyperlink w:anchor="_Toc485205023" w:history="1">
         <w:r>
           <w:rPr>
             <w:rStyle w:val="Hyperlink"/>
@@ -1379,7 +1379,7 @@
           <w:rPr>
             <w:noProof/>
           </w:rPr>
-          <w:instrText xml:space="preserve"> PAGEREF _Toc484441971 \h </w:instrText>
+          <w:instrText xml:space="preserve"> PAGEREF _Toc485205023 \h </w:instrText>
         </w:r>
         <w:r>
           <w:rPr>
@@ -1420,7 +1420,7 @@
           <w:szCs w:val="22"/>
         </w:rPr>
       </w:pPr>
-      <w:hyperlink w:anchor="_Toc484441972" w:history="1">
+      <w:hyperlink w:anchor="_Toc485205024" w:history="1">
         <w:r>
           <w:rPr>
             <w:rStyle w:val="Hyperlink"/>
@@ -1460,7 +1460,7 @@
           <w:rPr>
             <w:noProof/>
           </w:rPr>
-          <w:instrText xml:space="preserve"> PAGEREF _Toc484441972 \h </w:instrText>
+          <w:instrText xml:space="preserve"> PAGEREF _Toc485205024 \h </w:instrText>
         </w:r>
         <w:r>
           <w:rPr>
@@ -1501,7 +1501,7 @@
           <w:szCs w:val="22"/>
         </w:rPr>
       </w:pPr>
-      <w:hyperlink w:anchor="_Toc484441973" w:history="1">
+      <w:hyperlink w:anchor="_Toc485205025" w:history="1">
         <w:r>
           <w:rPr>
             <w:rStyle w:val="Hyperlink"/>
@@ -1541,7 +1541,7 @@
           <w:rPr>
             <w:noProof/>
           </w:rPr>
-          <w:instrText xml:space="preserve"> PAGEREF _Toc484441973 \h </w:instrText>
+          <w:instrText xml:space="preserve"> PAGEREF _Toc485205025 \h </w:instrText>
         </w:r>
         <w:r>
           <w:rPr>
@@ -1582,7 +1582,7 @@
           <w:szCs w:val="22"/>
         </w:rPr>
       </w:pPr>
-      <w:hyperlink w:anchor="_Toc484441974" w:history="1">
+      <w:hyperlink w:anchor="_Toc485205026" w:history="1">
         <w:r>
           <w:rPr>
             <w:rStyle w:val="Hyperlink"/>
@@ -1622,7 +1622,7 @@
           <w:rPr>
             <w:noProof/>
           </w:rPr>
-          <w:instrText xml:space="preserve"> PAGEREF _Toc484441974 \h </w:instrText>
+          <w:instrText xml:space="preserve"> PAGEREF _Toc485205026 \h </w:instrText>
         </w:r>
         <w:r>
           <w:rPr>
@@ -1658,7 +1658,7 @@
           <w:szCs w:val="22"/>
         </w:rPr>
       </w:pPr>
-      <w:hyperlink w:anchor="_Toc484441975" w:history="1">
+      <w:hyperlink w:anchor="_Toc485205027" w:history="1">
         <w:r>
           <w:rPr>
             <w:rStyle w:val="Hyperlink"/>
@@ -1686,7 +1686,7 @@
           <w:fldChar w:fldCharType="begin"/>
         </w:r>
         <w:r>
-          <w:instrText xml:space="preserve"> PAGEREF _Toc484441975 \h </w:instrText>
+          <w:instrText xml:space="preserve"> PAGEREF _Toc485205027 \h </w:instrText>
         </w:r>
         <w:r>
           <w:fldChar w:fldCharType="separate"/>
@@ -1708,7 +1708,7 @@
           <w:szCs w:val="22"/>
         </w:rPr>
       </w:pPr>
-      <w:hyperlink w:anchor="_Toc484441976" w:history="1">
+      <w:hyperlink w:anchor="_Toc485205028" w:history="1">
         <w:r>
           <w:rPr>
             <w:rStyle w:val="Hyperlink"/>
@@ -1736,7 +1736,7 @@
           <w:fldChar w:fldCharType="begin"/>
         </w:r>
         <w:r>
-          <w:instrText xml:space="preserve"> PAGEREF _Toc484441976 \h </w:instrText>
+          <w:instrText xml:space="preserve"> PAGEREF _Toc485205028 \h </w:instrText>
         </w:r>
         <w:r>
           <w:fldChar w:fldCharType="separate"/>
@@ -1758,7 +1758,7 @@
           <w:szCs w:val="22"/>
         </w:rPr>
       </w:pPr>
-      <w:hyperlink w:anchor="_Toc484441977" w:history="1">
+      <w:hyperlink w:anchor="_Toc485205029" w:history="1">
         <w:r>
           <w:rPr>
             <w:rStyle w:val="Hyperlink"/>
@@ -1786,7 +1786,7 @@
           <w:fldChar w:fldCharType="begin"/>
         </w:r>
         <w:r>
-          <w:instrText xml:space="preserve"> PAGEREF _Toc484441977 \h </w:instrText>
+          <w:instrText xml:space="preserve"> PAGEREF _Toc485205029 \h </w:instrText>
         </w:r>
         <w:r>
           <w:fldChar w:fldCharType="separate"/>
@@ -1808,7 +1808,7 @@
           <w:szCs w:val="22"/>
         </w:rPr>
       </w:pPr>
-      <w:hyperlink w:anchor="_Toc484441978" w:history="1">
+      <w:hyperlink w:anchor="_Toc485205030" w:history="1">
         <w:r>
           <w:rPr>
             <w:rStyle w:val="Hyperlink"/>
@@ -1836,7 +1836,7 @@
           <w:fldChar w:fldCharType="begin"/>
         </w:r>
         <w:r>
-          <w:instrText xml:space="preserve"> PAGEREF _Toc484441978 \h </w:instrText>
+          <w:instrText xml:space="preserve"> PAGEREF _Toc485205030 \h </w:instrText>
         </w:r>
         <w:r>
           <w:fldChar w:fldCharType="separate"/>
@@ -1863,7 +1863,7 @@
           <w:szCs w:val="22"/>
         </w:rPr>
       </w:pPr>
-      <w:hyperlink w:anchor="_Toc484441979" w:history="1">
+      <w:hyperlink w:anchor="_Toc485205031" w:history="1">
         <w:r>
           <w:rPr>
             <w:rStyle w:val="Hyperlink"/>
@@ -1903,7 +1903,7 @@
           <w:rPr>
             <w:noProof/>
           </w:rPr>
-          <w:instrText xml:space="preserve"> PAGEREF _Toc484441979 \h </w:instrText>
+          <w:instrText xml:space="preserve"> PAGEREF _Toc485205031 \h </w:instrText>
         </w:r>
         <w:r>
           <w:rPr>
@@ -1939,7 +1939,7 @@
           <w:szCs w:val="22"/>
         </w:rPr>
       </w:pPr>
-      <w:hyperlink w:anchor="_Toc484441980" w:history="1">
+      <w:hyperlink w:anchor="_Toc485205032" w:history="1">
         <w:r>
           <w:rPr>
             <w:rStyle w:val="Hyperlink"/>
@@ -1967,7 +1967,7 @@
           <w:fldChar w:fldCharType="begin"/>
         </w:r>
         <w:r>
-          <w:instrText xml:space="preserve"> PAGEREF _Toc484441980 \h </w:instrText>
+          <w:instrText xml:space="preserve"> PAGEREF _Toc485205032 \h </w:instrText>
         </w:r>
         <w:r>
           <w:fldChar w:fldCharType="separate"/>
@@ -1994,7 +1994,7 @@
           <w:szCs w:val="22"/>
         </w:rPr>
       </w:pPr>
-      <w:hyperlink w:anchor="_Toc484441981" w:history="1">
+      <w:hyperlink w:anchor="_Toc485205033" w:history="1">
         <w:r>
           <w:rPr>
             <w:rStyle w:val="Hyperlink"/>
@@ -2034,7 +2034,7 @@
           <w:rPr>
             <w:noProof/>
           </w:rPr>
-          <w:instrText xml:space="preserve"> PAGEREF _Toc484441981 \h </w:instrText>
+          <w:instrText xml:space="preserve"> PAGEREF _Toc485205033 \h </w:instrText>
         </w:r>
         <w:r>
           <w:rPr>
@@ -2075,7 +2075,7 @@
           <w:szCs w:val="22"/>
         </w:rPr>
       </w:pPr>
-      <w:hyperlink w:anchor="_Toc484441982" w:history="1">
+      <w:hyperlink w:anchor="_Toc485205034" w:history="1">
         <w:r>
           <w:rPr>
             <w:rStyle w:val="Hyperlink"/>
@@ -2115,7 +2115,7 @@
           <w:rPr>
             <w:noProof/>
           </w:rPr>
-          <w:instrText xml:space="preserve"> PAGEREF _Toc484441982 \h </w:instrText>
+          <w:instrText xml:space="preserve"> PAGEREF _Toc485205034 \h </w:instrText>
         </w:r>
         <w:r>
           <w:rPr>
@@ -2156,7 +2156,7 @@
           <w:szCs w:val="22"/>
         </w:rPr>
       </w:pPr>
-      <w:hyperlink w:anchor="_Toc484441983" w:history="1">
+      <w:hyperlink w:anchor="_Toc485205035" w:history="1">
         <w:r>
           <w:rPr>
             <w:rStyle w:val="Hyperlink"/>
@@ -2196,7 +2196,7 @@
           <w:rPr>
             <w:noProof/>
           </w:rPr>
-          <w:instrText xml:space="preserve"> PAGEREF _Toc484441983 \h </w:instrText>
+          <w:instrText xml:space="preserve"> PAGEREF _Toc485205035 \h </w:instrText>
         </w:r>
         <w:r>
           <w:rPr>
@@ -2237,7 +2237,7 @@
           <w:szCs w:val="22"/>
         </w:rPr>
       </w:pPr>
-      <w:hyperlink w:anchor="_Toc484441984" w:history="1">
+      <w:hyperlink w:anchor="_Toc485205036" w:history="1">
         <w:r>
           <w:rPr>
             <w:rStyle w:val="Hyperlink"/>
@@ -2277,7 +2277,7 @@
           <w:rPr>
             <w:noProof/>
           </w:rPr>
-          <w:instrText xml:space="preserve"> PAGEREF _Toc484441984 \h </w:instrText>
+          <w:instrText xml:space="preserve"> PAGEREF _Toc485205036 \h </w:instrText>
         </w:r>
         <w:r>
           <w:rPr>
@@ -2313,7 +2313,7 @@
           <w:szCs w:val="22"/>
         </w:rPr>
       </w:pPr>
-      <w:hyperlink w:anchor="_Toc484441985" w:history="1">
+      <w:hyperlink w:anchor="_Toc485205037" w:history="1">
         <w:r>
           <w:rPr>
             <w:rStyle w:val="Hyperlink"/>
@@ -2341,7 +2341,7 @@
           <w:fldChar w:fldCharType="begin"/>
         </w:r>
         <w:r>
-          <w:instrText xml:space="preserve"> PAGEREF _Toc484441985 \h </w:instrText>
+          <w:instrText xml:space="preserve"> PAGEREF _Toc485205037 \h </w:instrText>
         </w:r>
         <w:r>
           <w:fldChar w:fldCharType="separate"/>
@@ -2363,7 +2363,7 @@
           <w:szCs w:val="22"/>
         </w:rPr>
       </w:pPr>
-      <w:hyperlink w:anchor="_Toc484441986" w:history="1">
+      <w:hyperlink w:anchor="_Toc485205038" w:history="1">
         <w:r>
           <w:rPr>
             <w:rStyle w:val="Hyperlink"/>
@@ -2391,7 +2391,7 @@
           <w:fldChar w:fldCharType="begin"/>
         </w:r>
         <w:r>
-          <w:instrText xml:space="preserve"> PAGEREF _Toc484441986 \h </w:instrText>
+          <w:instrText xml:space="preserve"> PAGEREF _Toc485205038 \h </w:instrText>
         </w:r>
         <w:r>
           <w:fldChar w:fldCharType="separate"/>
@@ -2413,7 +2413,7 @@
           <w:szCs w:val="22"/>
         </w:rPr>
       </w:pPr>
-      <w:hyperlink w:anchor="_Toc484441987" w:history="1">
+      <w:hyperlink w:anchor="_Toc485205039" w:history="1">
         <w:r>
           <w:rPr>
             <w:rStyle w:val="Hyperlink"/>
@@ -2441,7 +2441,7 @@
           <w:fldChar w:fldCharType="begin"/>
         </w:r>
         <w:r>
-          <w:instrText xml:space="preserve"> PAGEREF _Toc484441987 \h </w:instrText>
+          <w:instrText xml:space="preserve"> PAGEREF _Toc485205039 \h </w:instrText>
         </w:r>
         <w:r>
           <w:fldChar w:fldCharType="separate"/>
@@ -2468,7 +2468,7 @@
           <w:szCs w:val="22"/>
         </w:rPr>
       </w:pPr>
-      <w:hyperlink w:anchor="_Toc484441988" w:history="1">
+      <w:hyperlink w:anchor="_Toc485205040" w:history="1">
         <w:r>
           <w:rPr>
             <w:rStyle w:val="Hyperlink"/>
@@ -2508,7 +2508,7 @@
           <w:rPr>
             <w:noProof/>
           </w:rPr>
-          <w:instrText xml:space="preserve"> PAGEREF _Toc484441988 \h </w:instrText>
+          <w:instrText xml:space="preserve"> PAGEREF _Toc485205040 \h </w:instrText>
         </w:r>
         <w:r>
           <w:rPr>
@@ -2566,7 +2566,7 @@
       <w:pPr>
         <w:pStyle w:val="Heading1"/>
       </w:pPr>
-      <w:bookmarkStart w:id="1" w:name="_Toc484441961"/>
+      <w:bookmarkStart w:id="1" w:name="_Toc485205013"/>
       <w:r>
         <w:lastRenderedPageBreak/>
         <w:t>Introduction</w:t>
@@ -2745,7 +2745,7 @@
         </w:tabs>
       </w:pPr>
       <w:bookmarkStart w:id="2" w:name="_Toc453572801"/>
-      <w:bookmarkStart w:id="3" w:name="_Toc484441962"/>
+      <w:bookmarkStart w:id="3" w:name="_Toc485205014"/>
       <w:r>
         <w:lastRenderedPageBreak/>
         <w:t>What’s New</w:t>
@@ -2807,7 +2807,21 @@
         <w:rPr>
           <w:lang w:eastAsia="ar-SA"/>
         </w:rPr>
-        <w:t>Merged with the community Npgsql driver version 3.1.9</w:t>
+        <w:t xml:space="preserve">Merged with the community </w:t>
+      </w:r>
+      <w:proofErr w:type="spellStart"/>
+      <w:r>
+        <w:rPr>
+          <w:lang w:eastAsia="ar-SA"/>
+        </w:rPr>
+        <w:t>Npgsql</w:t>
+      </w:r>
+      <w:proofErr w:type="spellEnd"/>
+      <w:r>
+        <w:rPr>
+          <w:lang w:eastAsia="ar-SA"/>
+        </w:rPr>
+        <w:t xml:space="preserve"> driver version 3.1.9</w:t>
       </w:r>
     </w:p>
     <w:p>
@@ -2829,7 +2843,66 @@
         <w:rPr>
           <w:lang w:eastAsia="ar-SA"/>
         </w:rPr>
-        <w:t>Authentication for MS Office fails on Win32.</w:t>
+        <w:t xml:space="preserve">The .NET Connector now provides access to Advanced Server databases from Microsoft Visual Studio with the </w:t>
+      </w:r>
+      <w:r>
+        <w:rPr>
+          <w:lang w:eastAsia="ar-SA"/>
+        </w:rPr>
+        <w:t>EDBDdexProvider</w:t>
+      </w:r>
+      <w:r>
+        <w:rPr>
+          <w:lang w:eastAsia="ar-SA"/>
+        </w:rPr>
+        <w:t xml:space="preserve"> component. Thus, the features of Visual Studio can now be used with Advanced Server as the external data source. For more information, see Section </w:t>
+      </w:r>
+      <w:r>
+        <w:rPr>
+          <w:u w:val="single"/>
+          <w:lang w:eastAsia="ar-SA"/>
+        </w:rPr>
+        <w:fldChar w:fldCharType="begin"/>
+      </w:r>
+      <w:r>
+        <w:rPr>
+          <w:u w:val="single"/>
+          <w:lang w:eastAsia="ar-SA"/>
+        </w:rPr>
+        <w:instrText xml:space="preserve"> REF _Ref477528081 \r \h </w:instrText>
+      </w:r>
+      <w:r>
+        <w:rPr>
+          <w:u w:val="single"/>
+          <w:lang w:eastAsia="ar-SA"/>
+        </w:rPr>
+      </w:r>
+      <w:r>
+        <w:rPr>
+          <w:u w:val="single"/>
+          <w:lang w:eastAsia="ar-SA"/>
+        </w:rPr>
+        <w:fldChar w:fldCharType="separate"/>
+      </w:r>
+      <w:r>
+        <w:rPr>
+          <w:u w:val="single"/>
+          <w:lang w:eastAsia="ar-SA"/>
+        </w:rPr>
+        <w:t>3.5</w:t>
+      </w:r>
+      <w:r>
+        <w:rPr>
+          <w:u w:val="single"/>
+          <w:lang w:eastAsia="ar-SA"/>
+        </w:rPr>
+        <w:fldChar w:fldCharType="end"/>
+      </w:r>
+      <w:r>
+        <w:rPr>
+          <w:lang w:eastAsia="ar-SA"/>
+        </w:rPr>
+        <w:t>.</w:t>
       </w:r>
     </w:p>
     <w:p>
@@ -2851,87 +2924,6 @@
         <w:rPr>
           <w:lang w:eastAsia="ar-SA"/>
         </w:rPr>
-        <w:t xml:space="preserve">The .NET Connector now provides access to Advanced Server databases from Microsoft Visual Studio with the </w:t>
-      </w:r>
-      <w:r>
-        <w:rPr>
-          <w:lang w:eastAsia="ar-SA"/>
-        </w:rPr>
-        <w:t>EDBDdexProvider</w:t>
-      </w:r>
-      <w:r>
-        <w:rPr>
-          <w:lang w:eastAsia="ar-SA"/>
-        </w:rPr>
-        <w:t xml:space="preserve"> component. Thus, the features of Visual Studio can now be used with Advanced Server as the external data source. For more information, see Section </w:t>
-      </w:r>
-      <w:r>
-        <w:rPr>
-          <w:u w:val="single"/>
-          <w:lang w:eastAsia="ar-SA"/>
-        </w:rPr>
-        <w:fldChar w:fldCharType="begin"/>
-      </w:r>
-      <w:r>
-        <w:rPr>
-          <w:u w:val="single"/>
-          <w:lang w:eastAsia="ar-SA"/>
-        </w:rPr>
-        <w:instrText xml:space="preserve"> REF _Ref477528081 \r \h </w:instrText>
-      </w:r>
-      <w:r>
-        <w:rPr>
-          <w:u w:val="single"/>
-          <w:lang w:eastAsia="ar-SA"/>
-        </w:rPr>
-      </w:r>
-      <w:r>
-        <w:rPr>
-          <w:u w:val="single"/>
-          <w:lang w:eastAsia="ar-SA"/>
-        </w:rPr>
-        <w:fldChar w:fldCharType="separate"/>
-      </w:r>
-      <w:r>
-        <w:rPr>
-          <w:u w:val="single"/>
-          <w:lang w:eastAsia="ar-SA"/>
-        </w:rPr>
-        <w:t>3.5</w:t>
-      </w:r>
-      <w:r>
-        <w:rPr>
-          <w:u w:val="single"/>
-          <w:lang w:eastAsia="ar-SA"/>
-        </w:rPr>
-        <w:fldChar w:fldCharType="end"/>
-      </w:r>
-      <w:r>
-        <w:rPr>
-          <w:lang w:eastAsia="ar-SA"/>
-        </w:rPr>
-        <w:t>.</w:t>
-      </w:r>
-    </w:p>
-    <w:p>
-      <w:pPr>
-        <w:pStyle w:val="EDBTXTNormalWebBlackCharChar1"/>
-        <w:numPr>
-          <w:ilvl w:val="0"/>
-          <w:numId w:val="2"/>
-        </w:numPr>
-        <w:tabs>
-          <w:tab w:val="left" w:pos="720"/>
-        </w:tabs>
-        <w:spacing w:before="0" w:after="0"/>
-        <w:rPr>
-          <w:lang w:eastAsia="ar-SA"/>
-        </w:rPr>
-      </w:pPr>
-      <w:r>
-        <w:rPr>
-          <w:lang w:eastAsia="ar-SA"/>
-        </w:rPr>
         <w:t>The .NET Connector is now based on .NET Framework version 4.5.1. If there are existing applications based on .NET Framework 4.5, they need to be upgraded to 4.5.1.</w:t>
       </w:r>
     </w:p>
@@ -2948,7 +2940,7 @@
       <w:bookmarkStart w:id="5" w:name="_Ref103071794"/>
       <w:bookmarkStart w:id="6" w:name="_Ref103073047"/>
       <w:bookmarkStart w:id="7" w:name="_Ref103073090"/>
-      <w:bookmarkStart w:id="8" w:name="_Toc484441963"/>
+      <w:bookmarkStart w:id="8" w:name="_Toc485205015"/>
       <w:r>
         <w:t>Typographical Conventions Used in this Guide</w:t>
       </w:r>
@@ -3340,7 +3332,7 @@
       <w:pPr>
         <w:pStyle w:val="Heading1"/>
       </w:pPr>
-      <w:bookmarkStart w:id="10" w:name="_Toc484441964"/>
+      <w:bookmarkStart w:id="10" w:name="_Toc485205016"/>
       <w:r>
         <w:lastRenderedPageBreak/>
         <w:t>The Advanced Server .NET Connector - Overview</w:t>
@@ -3406,7 +3398,7 @@
       <w:pPr>
         <w:pStyle w:val="Heading2"/>
       </w:pPr>
-      <w:bookmarkStart w:id="11" w:name="_Toc484441965"/>
+      <w:bookmarkStart w:id="11" w:name="_Toc485205017"/>
       <w:r>
         <w:t>The .NET Class Hierarchy</w:t>
       </w:r>
@@ -3693,7 +3685,7 @@
       <w:pPr>
         <w:pStyle w:val="Heading2"/>
       </w:pPr>
-      <w:bookmarkStart w:id="12" w:name="_Toc484441966"/>
+      <w:bookmarkStart w:id="12" w:name="_Toc485205018"/>
       <w:r>
         <w:lastRenderedPageBreak/>
         <w:t>Installing the .NET Connector</w:t>
@@ -3757,7 +3749,7 @@
           <w:noProof/>
         </w:rPr>
         <w:drawing>
-          <wp:inline distT="0" distB="0" distL="0" distR="0" wp14:anchorId="288FA727" wp14:editId="2A0C3F90">
+          <wp:inline distT="0" distB="0" distL="0" distR="0" wp14:anchorId="52FC05D1" wp14:editId="2977F8F2">
             <wp:extent cx="4114800" cy="2728253"/>
             <wp:effectExtent l="0" t="0" r="0" b="0"/>
             <wp:docPr id="9" name="Picture 9"/>
@@ -3941,7 +3933,7 @@
         </w:rPr>
         <w:lastRenderedPageBreak/>
         <w:drawing>
-          <wp:inline distT="0" distB="0" distL="0" distR="0" wp14:anchorId="32EF3A39" wp14:editId="1E997E6A">
+          <wp:inline distT="0" distB="0" distL="0" distR="0" wp14:anchorId="7A962378" wp14:editId="6CDB9E57">
             <wp:extent cx="3886200" cy="3037805"/>
             <wp:effectExtent l="0" t="0" r="0" b="0"/>
             <wp:docPr id="2" name="Picture 2"/>
@@ -4043,7 +4035,7 @@
           <w:noProof/>
         </w:rPr>
         <w:drawing>
-          <wp:inline distT="0" distB="0" distL="0" distR="0" wp14:anchorId="01937CF5" wp14:editId="122D6B52">
+          <wp:inline distT="0" distB="0" distL="0" distR="0" wp14:anchorId="4056513D" wp14:editId="4A775EB6">
             <wp:extent cx="3886200" cy="3046927"/>
             <wp:effectExtent l="0" t="0" r="0" b="1270"/>
             <wp:docPr id="3" name="Picture 3"/>
@@ -4170,7 +4162,7 @@
         </w:rPr>
         <w:lastRenderedPageBreak/>
         <w:drawing>
-          <wp:inline distT="0" distB="0" distL="0" distR="0" wp14:anchorId="737AD1A0" wp14:editId="49C8CC3E">
+          <wp:inline distT="0" distB="0" distL="0" distR="0" wp14:anchorId="607945E1" wp14:editId="277AB9CF">
             <wp:extent cx="4114800" cy="3217552"/>
             <wp:effectExtent l="0" t="0" r="0" b="1905"/>
             <wp:docPr id="4" name="Picture 4"/>
@@ -4305,7 +4297,7 @@
           <w:noProof/>
         </w:rPr>
         <w:drawing>
-          <wp:inline distT="0" distB="0" distL="0" distR="0" wp14:anchorId="375031FA" wp14:editId="1A9A1A4A">
+          <wp:inline distT="0" distB="0" distL="0" distR="0" wp14:anchorId="2A36F159" wp14:editId="18D5B12F">
             <wp:extent cx="4114800" cy="3194511"/>
             <wp:effectExtent l="0" t="0" r="0" b="6350"/>
             <wp:docPr id="5" name="Picture 5"/>
@@ -4467,7 +4459,7 @@
           <w:noProof/>
         </w:rPr>
         <w:drawing>
-          <wp:inline distT="0" distB="0" distL="0" distR="0" wp14:anchorId="24EF53E3" wp14:editId="0C71FE7D">
+          <wp:inline distT="0" distB="0" distL="0" distR="0" wp14:anchorId="58FB2759" wp14:editId="362161EA">
             <wp:extent cx="3790950" cy="1619051"/>
             <wp:effectExtent l="0" t="0" r="0" b="635"/>
             <wp:docPr id="12" name="Picture 12" descr="C:\Users\susan\AppData\Local\Temp\vmware-susan\VMwareDnD\7412d23f\Screen Shot 2016-07-11 at 4.50.20 PM.png"/>
@@ -4615,7 +4607,7 @@
           <w:noProof/>
         </w:rPr>
         <w:drawing>
-          <wp:inline distT="0" distB="0" distL="0" distR="0" wp14:anchorId="0C3CBEC8" wp14:editId="116FA912">
+          <wp:inline distT="0" distB="0" distL="0" distR="0" wp14:anchorId="39B62D05" wp14:editId="1CE9D895">
             <wp:extent cx="4114800" cy="3004331"/>
             <wp:effectExtent l="0" t="0" r="0" b="5715"/>
             <wp:docPr id="1" name="Picture 1"/>
@@ -4709,7 +4701,7 @@
         <w:pStyle w:val="Heading1"/>
       </w:pPr>
       <w:bookmarkStart w:id="13" w:name="_Ref456012125"/>
-      <w:bookmarkStart w:id="14" w:name="_Toc484441967"/>
+      <w:bookmarkStart w:id="14" w:name="_Toc485205019"/>
       <w:r>
         <w:lastRenderedPageBreak/>
         <w:t>Configuring the .NET Connector</w:t>
@@ -4881,7 +4873,7 @@
         <w:pStyle w:val="Heading2"/>
       </w:pPr>
       <w:bookmarkStart w:id="15" w:name="_Ref477525249"/>
-      <w:bookmarkStart w:id="16" w:name="_Toc484441968"/>
+      <w:bookmarkStart w:id="16" w:name="_Toc485205020"/>
       <w:r>
         <w:t>General Instructions</w:t>
       </w:r>
@@ -5147,7 +5139,7 @@
       <w:pPr>
         <w:pStyle w:val="Heading2"/>
       </w:pPr>
-      <w:bookmarkStart w:id="17" w:name="_Toc484441969"/>
+      <w:bookmarkStart w:id="17" w:name="_Toc485205021"/>
       <w:r>
         <w:t>.NET Framework 4.0</w:t>
       </w:r>
@@ -5341,7 +5333,7 @@
       <w:pPr>
         <w:pStyle w:val="Heading2"/>
       </w:pPr>
-      <w:bookmarkStart w:id="18" w:name="_Toc484441970"/>
+      <w:bookmarkStart w:id="18" w:name="_Toc485205022"/>
       <w:r>
         <w:t>.NET Framework 4.5</w:t>
       </w:r>
@@ -5542,7 +5534,7 @@
         <w:pStyle w:val="Heading2"/>
       </w:pPr>
       <w:bookmarkStart w:id="19" w:name="_Ref477527440"/>
-      <w:bookmarkStart w:id="20" w:name="_Toc484441971"/>
+      <w:bookmarkStart w:id="20" w:name="_Toc485205023"/>
       <w:r>
         <w:t>Entity Framework 6</w:t>
       </w:r>
@@ -6306,7 +6298,7 @@
         <w:pStyle w:val="Heading2"/>
       </w:pPr>
       <w:bookmarkStart w:id="21" w:name="_Ref477528081"/>
-      <w:bookmarkStart w:id="22" w:name="_Toc484441972"/>
+      <w:bookmarkStart w:id="22" w:name="_Toc485205024"/>
       <w:r>
         <w:t>EDBDdexProvider for Visual Studio</w:t>
       </w:r>
@@ -7449,7 +7441,7 @@
         <w:pStyle w:val="Heading1"/>
       </w:pPr>
       <w:bookmarkStart w:id="23" w:name="_Ref482087625"/>
-      <w:bookmarkStart w:id="24" w:name="_Toc484441973"/>
+      <w:bookmarkStart w:id="24" w:name="_Toc485205025"/>
       <w:r>
         <w:lastRenderedPageBreak/>
         <w:t>Using the .NET Connector</w:t>
@@ -7703,7 +7695,7 @@
       <w:pPr>
         <w:pStyle w:val="Heading2"/>
       </w:pPr>
-      <w:bookmarkStart w:id="25" w:name="_Toc484441974"/>
+      <w:bookmarkStart w:id="25" w:name="_Toc485205026"/>
       <w:r>
         <w:t>Opening a Database Connection</w:t>
       </w:r>
@@ -7921,7 +7913,7 @@
         <w:pStyle w:val="Heading3"/>
       </w:pPr>
       <w:bookmarkStart w:id="26" w:name="_Ref482087661"/>
-      <w:bookmarkStart w:id="27" w:name="_Toc484441975"/>
+      <w:bookmarkStart w:id="27" w:name="_Toc485205027"/>
       <w:r>
         <w:t>Connection String Parameters</w:t>
       </w:r>
@@ -8985,7 +8977,7 @@
       <w:pPr>
         <w:pStyle w:val="Heading3"/>
       </w:pPr>
-      <w:bookmarkStart w:id="28" w:name="_Toc484441976"/>
+      <w:bookmarkStart w:id="28" w:name="_Toc485205028"/>
       <w:r>
         <w:t xml:space="preserve">Example - </w:t>
       </w:r>
@@ -9405,7 +9397,7 @@
           <w:noProof/>
         </w:rPr>
         <w:drawing>
-          <wp:inline distT="0" distB="0" distL="0" distR="0" wp14:anchorId="03B5C3AD" wp14:editId="6F2076CC">
+          <wp:inline distT="0" distB="0" distL="0" distR="0" wp14:anchorId="522695B5" wp14:editId="2D4A28D5">
             <wp:extent cx="5480050" cy="1663700"/>
             <wp:effectExtent l="0" t="0" r="6350" b="0"/>
             <wp:docPr id="7" name="Picture 7" descr="Screen Shot 2014-06-26 at 8"/>
@@ -9463,7 +9455,7 @@
       <w:pPr>
         <w:pStyle w:val="Heading3"/>
       </w:pPr>
-      <w:bookmarkStart w:id="29" w:name="_Toc484441977"/>
+      <w:bookmarkStart w:id="29" w:name="_Toc485205029"/>
       <w:r>
         <w:t xml:space="preserve">Example - </w:t>
       </w:r>
@@ -10076,7 +10068,7 @@
       <w:pPr>
         <w:pStyle w:val="Heading3"/>
       </w:pPr>
-      <w:bookmarkStart w:id="30" w:name="_Toc484441978"/>
+      <w:bookmarkStart w:id="30" w:name="_Toc485205030"/>
       <w:r>
         <w:t xml:space="preserve">Example - </w:t>
       </w:r>
@@ -10873,7 +10865,7 @@
           <w:noProof/>
         </w:rPr>
         <w:drawing>
-          <wp:inline distT="0" distB="0" distL="0" distR="0" wp14:anchorId="4B7A5DBB" wp14:editId="306A9EE2">
+          <wp:inline distT="0" distB="0" distL="0" distR="0" wp14:anchorId="110D3252" wp14:editId="42503D72">
             <wp:extent cx="2120900" cy="2120900"/>
             <wp:effectExtent l="0" t="0" r="0" b="0"/>
             <wp:docPr id="8" name="Picture 8" descr="dialog"/>
@@ -10985,7 +10977,7 @@
       <w:pPr>
         <w:pStyle w:val="Heading2"/>
       </w:pPr>
-      <w:bookmarkStart w:id="31" w:name="_Toc484441979"/>
+      <w:bookmarkStart w:id="31" w:name="_Toc485205031"/>
       <w:r>
         <w:lastRenderedPageBreak/>
         <w:t>Retrieving Database Records</w:t>
@@ -12069,7 +12061,7 @@
       <w:pPr>
         <w:pStyle w:val="Heading3"/>
       </w:pPr>
-      <w:bookmarkStart w:id="32" w:name="_Toc484441980"/>
+      <w:bookmarkStart w:id="32" w:name="_Toc485205032"/>
       <w:r>
         <w:t>Retr</w:t>
       </w:r>
@@ -12603,7 +12595,7 @@
       <w:pPr>
         <w:pStyle w:val="Heading2"/>
       </w:pPr>
-      <w:bookmarkStart w:id="33" w:name="_Toc484441981"/>
+      <w:bookmarkStart w:id="33" w:name="_Toc485205033"/>
       <w:r>
         <w:lastRenderedPageBreak/>
         <w:t>Parameterized Queries</w:t>
@@ -13284,7 +13276,7 @@
       <w:pPr>
         <w:pStyle w:val="Heading2"/>
       </w:pPr>
-      <w:bookmarkStart w:id="34" w:name="_Toc484441982"/>
+      <w:bookmarkStart w:id="34" w:name="_Toc485205034"/>
       <w:r>
         <w:lastRenderedPageBreak/>
         <w:t>Inserting Records in a Database</w:t>
@@ -14130,7 +14122,7 @@
       <w:pPr>
         <w:pStyle w:val="Heading2"/>
       </w:pPr>
-      <w:bookmarkStart w:id="35" w:name="_Toc484441983"/>
+      <w:bookmarkStart w:id="35" w:name="_Toc485205035"/>
       <w:r>
         <w:lastRenderedPageBreak/>
         <w:t>Deleting Records in a Database</w:t>
@@ -14972,7 +14964,7 @@
       <w:pPr>
         <w:pStyle w:val="Heading2"/>
       </w:pPr>
-      <w:bookmarkStart w:id="36" w:name="_Toc484441984"/>
+      <w:bookmarkStart w:id="36" w:name="_Toc485205036"/>
       <w:r>
         <w:lastRenderedPageBreak/>
         <w:t>Using SPL Stored Procedures in your .NET Application</w:t>
@@ -15248,7 +15240,7 @@
       <w:pPr>
         <w:pStyle w:val="Heading3"/>
       </w:pPr>
-      <w:bookmarkStart w:id="37" w:name="_Toc484441985"/>
+      <w:bookmarkStart w:id="37" w:name="_Toc485205037"/>
       <w:r>
         <w:t>Example - Executing</w:t>
       </w:r>
@@ -16177,7 +16169,7 @@
       <w:pPr>
         <w:pStyle w:val="Heading3"/>
       </w:pPr>
-      <w:bookmarkStart w:id="38" w:name="_Toc484441986"/>
+      <w:bookmarkStart w:id="38" w:name="_Toc485205038"/>
       <w:r>
         <w:t xml:space="preserve">Example - </w:t>
       </w:r>
@@ -17973,7 +17965,7 @@
       <w:pPr>
         <w:pStyle w:val="Heading3"/>
       </w:pPr>
-      <w:bookmarkStart w:id="39" w:name="_Toc484441987"/>
+      <w:bookmarkStart w:id="39" w:name="_Toc485205039"/>
       <w:r>
         <w:t xml:space="preserve">Example - </w:t>
       </w:r>
@@ -20207,7 +20199,7 @@
       <w:pPr>
         <w:pStyle w:val="Heading2"/>
       </w:pPr>
-      <w:bookmarkStart w:id="40" w:name="_Toc484441988"/>
+      <w:bookmarkStart w:id="40" w:name="_Toc485205040"/>
       <w:r>
         <w:lastRenderedPageBreak/>
         <w:t xml:space="preserve">Using </w:t>
@@ -31480,7 +31472,7 @@
 </file>
 
 <file path=customXml/itemProps1.xml><?xml version="1.0" encoding="utf-8"?>
-<ds:datastoreItem xmlns:ds="http://schemas.openxmlformats.org/officeDocument/2006/customXml" ds:itemID="{0D22978E-ADBA-45C8-B8F3-A37696986646}">
+<ds:datastoreItem xmlns:ds="http://schemas.openxmlformats.org/officeDocument/2006/customXml" ds:itemID="{2765F8CE-1AD9-4A03-8FA6-F5F5BAAEB6D9}">
   <ds:schemaRefs>
     <ds:schemaRef ds:uri="http://schemas.openxmlformats.org/officeDocument/2006/bibliography"/>
   </ds:schemaRefs>

</xml_diff>

<commit_message>
EPAS .Net Connector Guide 10.0.0 - RM 42187 Updated cover Connector Release to 10.0.0 and .NET 4.5 connector version number to 3.1.9.4
</commit_message>
<xml_diff>
--- a/edb_docs/EDB_Postgres_Advanced_Server_NET_Connector_Guide.docx
+++ b/edb_docs/EDB_Postgres_Advanced_Server_NET_Connector_Guide.docx
@@ -12,7 +12,7 @@
           <w:noProof/>
         </w:rPr>
         <w:drawing>
-          <wp:inline distT="0" distB="0" distL="0" distR="0" wp14:anchorId="77D5FFC1" wp14:editId="67C17FA7">
+          <wp:inline distT="0" distB="0" distL="0" distR="0" wp14:anchorId="1A36058A" wp14:editId="257F3515">
             <wp:extent cx="2380711" cy="1371599"/>
             <wp:effectExtent l="0" t="0" r="635" b="635"/>
             <wp:docPr id="6" name="Picture 6"/>
@@ -82,13 +82,13 @@
       <w:pPr>
         <w:pStyle w:val="EDBTXTNormalWebBlackCharChar0"/>
       </w:pPr>
-    </w:p>
-    <w:p>
-      <w:pPr>
-        <w:pStyle w:val="EDBTXTNormalWebBlackCharChar0"/>
-      </w:pPr>
       <w:bookmarkStart w:id="0" w:name="_GoBack"/>
       <w:bookmarkEnd w:id="0"/>
+    </w:p>
+    <w:p>
+      <w:pPr>
+        <w:pStyle w:val="EDBTXTNormalWebBlackCharChar0"/>
+      </w:pPr>
     </w:p>
     <w:p>
       <w:pPr>
@@ -179,10 +179,10 @@
         </w:rPr>
       </w:pPr>
       <w:r>
-        <w:t>Connectors Release 9.6.0.</w:t>
-      </w:r>
-      <w:r>
-        <w:t>3</w:t>
+        <w:t xml:space="preserve">Connectors Release </w:t>
+      </w:r>
+      <w:r>
+        <w:t>10.0.0</w:t>
       </w:r>
       <w:r>
         <w:br/>
@@ -217,7 +217,7 @@
         <w:t>.</w:t>
       </w:r>
       <w:r>
-        <w:t>3</w:t>
+        <w:t>4</w:t>
       </w:r>
     </w:p>
     <w:p>
@@ -225,10 +225,7 @@
         <w:pStyle w:val="EDBCoverProductDate"/>
       </w:pPr>
       <w:r>
-        <w:t xml:space="preserve">June </w:t>
-      </w:r>
-      <w:r>
-        <w:t>14</w:t>
+        <w:t>August 18</w:t>
       </w:r>
       <w:r>
         <w:t>, 2017</w:t>
@@ -529,7 +526,7 @@
       <w:r>
         <w:fldChar w:fldCharType="separate"/>
       </w:r>
-      <w:hyperlink w:anchor="_Toc485205013" w:history="1">
+      <w:hyperlink w:anchor="_Toc490824094" w:history="1">
         <w:r>
           <w:rPr>
             <w:rStyle w:val="Hyperlink"/>
@@ -569,7 +566,7 @@
           <w:rPr>
             <w:noProof/>
           </w:rPr>
-          <w:instrText xml:space="preserve"> PAGEREF _Toc485205013 \h </w:instrText>
+          <w:instrText xml:space="preserve"> PAGEREF _Toc490824094 \h </w:instrText>
         </w:r>
         <w:r>
           <w:rPr>
@@ -610,7 +607,7 @@
           <w:szCs w:val="22"/>
         </w:rPr>
       </w:pPr>
-      <w:hyperlink w:anchor="_Toc485205014" w:history="1">
+      <w:hyperlink w:anchor="_Toc490824095" w:history="1">
         <w:r>
           <w:rPr>
             <w:rStyle w:val="Hyperlink"/>
@@ -650,7 +647,7 @@
           <w:rPr>
             <w:noProof/>
           </w:rPr>
-          <w:instrText xml:space="preserve"> PAGEREF _Toc485205014 \h </w:instrText>
+          <w:instrText xml:space="preserve"> PAGEREF _Toc490824095 \h </w:instrText>
         </w:r>
         <w:r>
           <w:rPr>
@@ -691,7 +688,7 @@
           <w:szCs w:val="22"/>
         </w:rPr>
       </w:pPr>
-      <w:hyperlink w:anchor="_Toc485205015" w:history="1">
+      <w:hyperlink w:anchor="_Toc490824096" w:history="1">
         <w:r>
           <w:rPr>
             <w:rStyle w:val="Hyperlink"/>
@@ -731,7 +728,7 @@
           <w:rPr>
             <w:noProof/>
           </w:rPr>
-          <w:instrText xml:space="preserve"> PAGEREF _Toc485205015 \h </w:instrText>
+          <w:instrText xml:space="preserve"> PAGEREF _Toc490824096 \h </w:instrText>
         </w:r>
         <w:r>
           <w:rPr>
@@ -772,7 +769,7 @@
           <w:szCs w:val="22"/>
         </w:rPr>
       </w:pPr>
-      <w:hyperlink w:anchor="_Toc485205016" w:history="1">
+      <w:hyperlink w:anchor="_Toc490824097" w:history="1">
         <w:r>
           <w:rPr>
             <w:rStyle w:val="Hyperlink"/>
@@ -812,7 +809,7 @@
           <w:rPr>
             <w:noProof/>
           </w:rPr>
-          <w:instrText xml:space="preserve"> PAGEREF _Toc485205016 \h </w:instrText>
+          <w:instrText xml:space="preserve"> PAGEREF _Toc490824097 \h </w:instrText>
         </w:r>
         <w:r>
           <w:rPr>
@@ -853,7 +850,7 @@
           <w:szCs w:val="22"/>
         </w:rPr>
       </w:pPr>
-      <w:hyperlink w:anchor="_Toc485205017" w:history="1">
+      <w:hyperlink w:anchor="_Toc490824098" w:history="1">
         <w:r>
           <w:rPr>
             <w:rStyle w:val="Hyperlink"/>
@@ -893,7 +890,7 @@
           <w:rPr>
             <w:noProof/>
           </w:rPr>
-          <w:instrText xml:space="preserve"> PAGEREF _Toc485205017 \h </w:instrText>
+          <w:instrText xml:space="preserve"> PAGEREF _Toc490824098 \h </w:instrText>
         </w:r>
         <w:r>
           <w:rPr>
@@ -934,7 +931,7 @@
           <w:szCs w:val="22"/>
         </w:rPr>
       </w:pPr>
-      <w:hyperlink w:anchor="_Toc485205018" w:history="1">
+      <w:hyperlink w:anchor="_Toc490824099" w:history="1">
         <w:r>
           <w:rPr>
             <w:rStyle w:val="Hyperlink"/>
@@ -974,7 +971,7 @@
           <w:rPr>
             <w:noProof/>
           </w:rPr>
-          <w:instrText xml:space="preserve"> PAGEREF _Toc485205018 \h </w:instrText>
+          <w:instrText xml:space="preserve"> PAGEREF _Toc490824099 \h </w:instrText>
         </w:r>
         <w:r>
           <w:rPr>
@@ -1015,7 +1012,7 @@
           <w:szCs w:val="22"/>
         </w:rPr>
       </w:pPr>
-      <w:hyperlink w:anchor="_Toc485205019" w:history="1">
+      <w:hyperlink w:anchor="_Toc490824100" w:history="1">
         <w:r>
           <w:rPr>
             <w:rStyle w:val="Hyperlink"/>
@@ -1055,7 +1052,7 @@
           <w:rPr>
             <w:noProof/>
           </w:rPr>
-          <w:instrText xml:space="preserve"> PAGEREF _Toc485205019 \h </w:instrText>
+          <w:instrText xml:space="preserve"> PAGEREF _Toc490824100 \h </w:instrText>
         </w:r>
         <w:r>
           <w:rPr>
@@ -1096,7 +1093,7 @@
           <w:szCs w:val="22"/>
         </w:rPr>
       </w:pPr>
-      <w:hyperlink w:anchor="_Toc485205020" w:history="1">
+      <w:hyperlink w:anchor="_Toc490824101" w:history="1">
         <w:r>
           <w:rPr>
             <w:rStyle w:val="Hyperlink"/>
@@ -1136,7 +1133,7 @@
           <w:rPr>
             <w:noProof/>
           </w:rPr>
-          <w:instrText xml:space="preserve"> PAGEREF _Toc485205020 \h </w:instrText>
+          <w:instrText xml:space="preserve"> PAGEREF _Toc490824101 \h </w:instrText>
         </w:r>
         <w:r>
           <w:rPr>
@@ -1177,7 +1174,7 @@
           <w:szCs w:val="22"/>
         </w:rPr>
       </w:pPr>
-      <w:hyperlink w:anchor="_Toc485205021" w:history="1">
+      <w:hyperlink w:anchor="_Toc490824102" w:history="1">
         <w:r>
           <w:rPr>
             <w:rStyle w:val="Hyperlink"/>
@@ -1217,7 +1214,7 @@
           <w:rPr>
             <w:noProof/>
           </w:rPr>
-          <w:instrText xml:space="preserve"> PAGEREF _Toc485205021 \h </w:instrText>
+          <w:instrText xml:space="preserve"> PAGEREF _Toc490824102 \h </w:instrText>
         </w:r>
         <w:r>
           <w:rPr>
@@ -1258,7 +1255,7 @@
           <w:szCs w:val="22"/>
         </w:rPr>
       </w:pPr>
-      <w:hyperlink w:anchor="_Toc485205022" w:history="1">
+      <w:hyperlink w:anchor="_Toc490824103" w:history="1">
         <w:r>
           <w:rPr>
             <w:rStyle w:val="Hyperlink"/>
@@ -1298,7 +1295,7 @@
           <w:rPr>
             <w:noProof/>
           </w:rPr>
-          <w:instrText xml:space="preserve"> PAGEREF _Toc485205022 \h </w:instrText>
+          <w:instrText xml:space="preserve"> PAGEREF _Toc490824103 \h </w:instrText>
         </w:r>
         <w:r>
           <w:rPr>
@@ -1339,7 +1336,7 @@
           <w:szCs w:val="22"/>
         </w:rPr>
       </w:pPr>
-      <w:hyperlink w:anchor="_Toc485205023" w:history="1">
+      <w:hyperlink w:anchor="_Toc490824104" w:history="1">
         <w:r>
           <w:rPr>
             <w:rStyle w:val="Hyperlink"/>
@@ -1379,7 +1376,7 @@
           <w:rPr>
             <w:noProof/>
           </w:rPr>
-          <w:instrText xml:space="preserve"> PAGEREF _Toc485205023 \h </w:instrText>
+          <w:instrText xml:space="preserve"> PAGEREF _Toc490824104 \h </w:instrText>
         </w:r>
         <w:r>
           <w:rPr>
@@ -1420,7 +1417,7 @@
           <w:szCs w:val="22"/>
         </w:rPr>
       </w:pPr>
-      <w:hyperlink w:anchor="_Toc485205024" w:history="1">
+      <w:hyperlink w:anchor="_Toc490824105" w:history="1">
         <w:r>
           <w:rPr>
             <w:rStyle w:val="Hyperlink"/>
@@ -1460,7 +1457,7 @@
           <w:rPr>
             <w:noProof/>
           </w:rPr>
-          <w:instrText xml:space="preserve"> PAGEREF _Toc485205024 \h </w:instrText>
+          <w:instrText xml:space="preserve"> PAGEREF _Toc490824105 \h </w:instrText>
         </w:r>
         <w:r>
           <w:rPr>
@@ -1501,7 +1498,7 @@
           <w:szCs w:val="22"/>
         </w:rPr>
       </w:pPr>
-      <w:hyperlink w:anchor="_Toc485205025" w:history="1">
+      <w:hyperlink w:anchor="_Toc490824106" w:history="1">
         <w:r>
           <w:rPr>
             <w:rStyle w:val="Hyperlink"/>
@@ -1541,7 +1538,7 @@
           <w:rPr>
             <w:noProof/>
           </w:rPr>
-          <w:instrText xml:space="preserve"> PAGEREF _Toc485205025 \h </w:instrText>
+          <w:instrText xml:space="preserve"> PAGEREF _Toc490824106 \h </w:instrText>
         </w:r>
         <w:r>
           <w:rPr>
@@ -1582,7 +1579,7 @@
           <w:szCs w:val="22"/>
         </w:rPr>
       </w:pPr>
-      <w:hyperlink w:anchor="_Toc485205026" w:history="1">
+      <w:hyperlink w:anchor="_Toc490824107" w:history="1">
         <w:r>
           <w:rPr>
             <w:rStyle w:val="Hyperlink"/>
@@ -1622,7 +1619,7 @@
           <w:rPr>
             <w:noProof/>
           </w:rPr>
-          <w:instrText xml:space="preserve"> PAGEREF _Toc485205026 \h </w:instrText>
+          <w:instrText xml:space="preserve"> PAGEREF _Toc490824107 \h </w:instrText>
         </w:r>
         <w:r>
           <w:rPr>
@@ -1658,7 +1655,7 @@
           <w:szCs w:val="22"/>
         </w:rPr>
       </w:pPr>
-      <w:hyperlink w:anchor="_Toc485205027" w:history="1">
+      <w:hyperlink w:anchor="_Toc490824108" w:history="1">
         <w:r>
           <w:rPr>
             <w:rStyle w:val="Hyperlink"/>
@@ -1686,7 +1683,7 @@
           <w:fldChar w:fldCharType="begin"/>
         </w:r>
         <w:r>
-          <w:instrText xml:space="preserve"> PAGEREF _Toc485205027 \h </w:instrText>
+          <w:instrText xml:space="preserve"> PAGEREF _Toc490824108 \h </w:instrText>
         </w:r>
         <w:r>
           <w:fldChar w:fldCharType="separate"/>
@@ -1708,7 +1705,7 @@
           <w:szCs w:val="22"/>
         </w:rPr>
       </w:pPr>
-      <w:hyperlink w:anchor="_Toc485205028" w:history="1">
+      <w:hyperlink w:anchor="_Toc490824109" w:history="1">
         <w:r>
           <w:rPr>
             <w:rStyle w:val="Hyperlink"/>
@@ -1736,7 +1733,7 @@
           <w:fldChar w:fldCharType="begin"/>
         </w:r>
         <w:r>
-          <w:instrText xml:space="preserve"> PAGEREF _Toc485205028 \h </w:instrText>
+          <w:instrText xml:space="preserve"> PAGEREF _Toc490824109 \h </w:instrText>
         </w:r>
         <w:r>
           <w:fldChar w:fldCharType="separate"/>
@@ -1758,7 +1755,7 @@
           <w:szCs w:val="22"/>
         </w:rPr>
       </w:pPr>
-      <w:hyperlink w:anchor="_Toc485205029" w:history="1">
+      <w:hyperlink w:anchor="_Toc490824110" w:history="1">
         <w:r>
           <w:rPr>
             <w:rStyle w:val="Hyperlink"/>
@@ -1786,7 +1783,7 @@
           <w:fldChar w:fldCharType="begin"/>
         </w:r>
         <w:r>
-          <w:instrText xml:space="preserve"> PAGEREF _Toc485205029 \h </w:instrText>
+          <w:instrText xml:space="preserve"> PAGEREF _Toc490824110 \h </w:instrText>
         </w:r>
         <w:r>
           <w:fldChar w:fldCharType="separate"/>
@@ -1808,7 +1805,7 @@
           <w:szCs w:val="22"/>
         </w:rPr>
       </w:pPr>
-      <w:hyperlink w:anchor="_Toc485205030" w:history="1">
+      <w:hyperlink w:anchor="_Toc490824111" w:history="1">
         <w:r>
           <w:rPr>
             <w:rStyle w:val="Hyperlink"/>
@@ -1836,7 +1833,7 @@
           <w:fldChar w:fldCharType="begin"/>
         </w:r>
         <w:r>
-          <w:instrText xml:space="preserve"> PAGEREF _Toc485205030 \h </w:instrText>
+          <w:instrText xml:space="preserve"> PAGEREF _Toc490824111 \h </w:instrText>
         </w:r>
         <w:r>
           <w:fldChar w:fldCharType="separate"/>
@@ -1863,7 +1860,7 @@
           <w:szCs w:val="22"/>
         </w:rPr>
       </w:pPr>
-      <w:hyperlink w:anchor="_Toc485205031" w:history="1">
+      <w:hyperlink w:anchor="_Toc490824112" w:history="1">
         <w:r>
           <w:rPr>
             <w:rStyle w:val="Hyperlink"/>
@@ -1903,7 +1900,7 @@
           <w:rPr>
             <w:noProof/>
           </w:rPr>
-          <w:instrText xml:space="preserve"> PAGEREF _Toc485205031 \h </w:instrText>
+          <w:instrText xml:space="preserve"> PAGEREF _Toc490824112 \h </w:instrText>
         </w:r>
         <w:r>
           <w:rPr>
@@ -1939,7 +1936,7 @@
           <w:szCs w:val="22"/>
         </w:rPr>
       </w:pPr>
-      <w:hyperlink w:anchor="_Toc485205032" w:history="1">
+      <w:hyperlink w:anchor="_Toc490824113" w:history="1">
         <w:r>
           <w:rPr>
             <w:rStyle w:val="Hyperlink"/>
@@ -1967,7 +1964,7 @@
           <w:fldChar w:fldCharType="begin"/>
         </w:r>
         <w:r>
-          <w:instrText xml:space="preserve"> PAGEREF _Toc485205032 \h </w:instrText>
+          <w:instrText xml:space="preserve"> PAGEREF _Toc490824113 \h </w:instrText>
         </w:r>
         <w:r>
           <w:fldChar w:fldCharType="separate"/>
@@ -1994,7 +1991,7 @@
           <w:szCs w:val="22"/>
         </w:rPr>
       </w:pPr>
-      <w:hyperlink w:anchor="_Toc485205033" w:history="1">
+      <w:hyperlink w:anchor="_Toc490824114" w:history="1">
         <w:r>
           <w:rPr>
             <w:rStyle w:val="Hyperlink"/>
@@ -2034,7 +2031,7 @@
           <w:rPr>
             <w:noProof/>
           </w:rPr>
-          <w:instrText xml:space="preserve"> PAGEREF _Toc485205033 \h </w:instrText>
+          <w:instrText xml:space="preserve"> PAGEREF _Toc490824114 \h </w:instrText>
         </w:r>
         <w:r>
           <w:rPr>
@@ -2075,7 +2072,7 @@
           <w:szCs w:val="22"/>
         </w:rPr>
       </w:pPr>
-      <w:hyperlink w:anchor="_Toc485205034" w:history="1">
+      <w:hyperlink w:anchor="_Toc490824115" w:history="1">
         <w:r>
           <w:rPr>
             <w:rStyle w:val="Hyperlink"/>
@@ -2115,7 +2112,7 @@
           <w:rPr>
             <w:noProof/>
           </w:rPr>
-          <w:instrText xml:space="preserve"> PAGEREF _Toc485205034 \h </w:instrText>
+          <w:instrText xml:space="preserve"> PAGEREF _Toc490824115 \h </w:instrText>
         </w:r>
         <w:r>
           <w:rPr>
@@ -2156,7 +2153,7 @@
           <w:szCs w:val="22"/>
         </w:rPr>
       </w:pPr>
-      <w:hyperlink w:anchor="_Toc485205035" w:history="1">
+      <w:hyperlink w:anchor="_Toc490824116" w:history="1">
         <w:r>
           <w:rPr>
             <w:rStyle w:val="Hyperlink"/>
@@ -2196,7 +2193,7 @@
           <w:rPr>
             <w:noProof/>
           </w:rPr>
-          <w:instrText xml:space="preserve"> PAGEREF _Toc485205035 \h </w:instrText>
+          <w:instrText xml:space="preserve"> PAGEREF _Toc490824116 \h </w:instrText>
         </w:r>
         <w:r>
           <w:rPr>
@@ -2237,7 +2234,7 @@
           <w:szCs w:val="22"/>
         </w:rPr>
       </w:pPr>
-      <w:hyperlink w:anchor="_Toc485205036" w:history="1">
+      <w:hyperlink w:anchor="_Toc490824117" w:history="1">
         <w:r>
           <w:rPr>
             <w:rStyle w:val="Hyperlink"/>
@@ -2277,7 +2274,7 @@
           <w:rPr>
             <w:noProof/>
           </w:rPr>
-          <w:instrText xml:space="preserve"> PAGEREF _Toc485205036 \h </w:instrText>
+          <w:instrText xml:space="preserve"> PAGEREF _Toc490824117 \h </w:instrText>
         </w:r>
         <w:r>
           <w:rPr>
@@ -2313,7 +2310,7 @@
           <w:szCs w:val="22"/>
         </w:rPr>
       </w:pPr>
-      <w:hyperlink w:anchor="_Toc485205037" w:history="1">
+      <w:hyperlink w:anchor="_Toc490824118" w:history="1">
         <w:r>
           <w:rPr>
             <w:rStyle w:val="Hyperlink"/>
@@ -2341,7 +2338,7 @@
           <w:fldChar w:fldCharType="begin"/>
         </w:r>
         <w:r>
-          <w:instrText xml:space="preserve"> PAGEREF _Toc485205037 \h </w:instrText>
+          <w:instrText xml:space="preserve"> PAGEREF _Toc490824118 \h </w:instrText>
         </w:r>
         <w:r>
           <w:fldChar w:fldCharType="separate"/>
@@ -2363,7 +2360,7 @@
           <w:szCs w:val="22"/>
         </w:rPr>
       </w:pPr>
-      <w:hyperlink w:anchor="_Toc485205038" w:history="1">
+      <w:hyperlink w:anchor="_Toc490824119" w:history="1">
         <w:r>
           <w:rPr>
             <w:rStyle w:val="Hyperlink"/>
@@ -2391,7 +2388,7 @@
           <w:fldChar w:fldCharType="begin"/>
         </w:r>
         <w:r>
-          <w:instrText xml:space="preserve"> PAGEREF _Toc485205038 \h </w:instrText>
+          <w:instrText xml:space="preserve"> PAGEREF _Toc490824119 \h </w:instrText>
         </w:r>
         <w:r>
           <w:fldChar w:fldCharType="separate"/>
@@ -2413,7 +2410,7 @@
           <w:szCs w:val="22"/>
         </w:rPr>
       </w:pPr>
-      <w:hyperlink w:anchor="_Toc485205039" w:history="1">
+      <w:hyperlink w:anchor="_Toc490824120" w:history="1">
         <w:r>
           <w:rPr>
             <w:rStyle w:val="Hyperlink"/>
@@ -2441,7 +2438,7 @@
           <w:fldChar w:fldCharType="begin"/>
         </w:r>
         <w:r>
-          <w:instrText xml:space="preserve"> PAGEREF _Toc485205039 \h </w:instrText>
+          <w:instrText xml:space="preserve"> PAGEREF _Toc490824120 \h </w:instrText>
         </w:r>
         <w:r>
           <w:fldChar w:fldCharType="separate"/>
@@ -2468,7 +2465,7 @@
           <w:szCs w:val="22"/>
         </w:rPr>
       </w:pPr>
-      <w:hyperlink w:anchor="_Toc485205040" w:history="1">
+      <w:hyperlink w:anchor="_Toc490824121" w:history="1">
         <w:r>
           <w:rPr>
             <w:rStyle w:val="Hyperlink"/>
@@ -2508,7 +2505,7 @@
           <w:rPr>
             <w:noProof/>
           </w:rPr>
-          <w:instrText xml:space="preserve"> PAGEREF _Toc485205040 \h </w:instrText>
+          <w:instrText xml:space="preserve"> PAGEREF _Toc490824121 \h </w:instrText>
         </w:r>
         <w:r>
           <w:rPr>
@@ -2566,7 +2563,7 @@
       <w:pPr>
         <w:pStyle w:val="Heading1"/>
       </w:pPr>
-      <w:bookmarkStart w:id="1" w:name="_Toc485205013"/>
+      <w:bookmarkStart w:id="1" w:name="_Toc490824094"/>
       <w:r>
         <w:lastRenderedPageBreak/>
         <w:t>Introduction</w:t>
@@ -2745,7 +2742,7 @@
         </w:tabs>
       </w:pPr>
       <w:bookmarkStart w:id="2" w:name="_Toc453572801"/>
-      <w:bookmarkStart w:id="3" w:name="_Toc485205014"/>
+      <w:bookmarkStart w:id="3" w:name="_Toc490824095"/>
       <w:r>
         <w:lastRenderedPageBreak/>
         <w:t>What’s New</w:t>
@@ -2940,7 +2937,7 @@
       <w:bookmarkStart w:id="5" w:name="_Ref103071794"/>
       <w:bookmarkStart w:id="6" w:name="_Ref103073047"/>
       <w:bookmarkStart w:id="7" w:name="_Ref103073090"/>
-      <w:bookmarkStart w:id="8" w:name="_Toc485205015"/>
+      <w:bookmarkStart w:id="8" w:name="_Toc490824096"/>
       <w:r>
         <w:t>Typographical Conventions Used in this Guide</w:t>
       </w:r>
@@ -3332,7 +3329,7 @@
       <w:pPr>
         <w:pStyle w:val="Heading1"/>
       </w:pPr>
-      <w:bookmarkStart w:id="10" w:name="_Toc485205016"/>
+      <w:bookmarkStart w:id="10" w:name="_Toc490824097"/>
       <w:r>
         <w:lastRenderedPageBreak/>
         <w:t>The Advanced Server .NET Connector - Overview</w:t>
@@ -3398,7 +3395,7 @@
       <w:pPr>
         <w:pStyle w:val="Heading2"/>
       </w:pPr>
-      <w:bookmarkStart w:id="11" w:name="_Toc485205017"/>
+      <w:bookmarkStart w:id="11" w:name="_Toc490824098"/>
       <w:r>
         <w:t>The .NET Class Hierarchy</w:t>
       </w:r>
@@ -3685,7 +3682,7 @@
       <w:pPr>
         <w:pStyle w:val="Heading2"/>
       </w:pPr>
-      <w:bookmarkStart w:id="12" w:name="_Toc485205018"/>
+      <w:bookmarkStart w:id="12" w:name="_Toc490824099"/>
       <w:r>
         <w:lastRenderedPageBreak/>
         <w:t>Installing the .NET Connector</w:t>
@@ -3749,7 +3746,7 @@
           <w:noProof/>
         </w:rPr>
         <w:drawing>
-          <wp:inline distT="0" distB="0" distL="0" distR="0" wp14:anchorId="52FC05D1" wp14:editId="2977F8F2">
+          <wp:inline distT="0" distB="0" distL="0" distR="0" wp14:anchorId="1579A7E1" wp14:editId="772A0F78">
             <wp:extent cx="4114800" cy="2728253"/>
             <wp:effectExtent l="0" t="0" r="0" b="0"/>
             <wp:docPr id="9" name="Picture 9"/>
@@ -3933,7 +3930,7 @@
         </w:rPr>
         <w:lastRenderedPageBreak/>
         <w:drawing>
-          <wp:inline distT="0" distB="0" distL="0" distR="0" wp14:anchorId="7A962378" wp14:editId="6CDB9E57">
+          <wp:inline distT="0" distB="0" distL="0" distR="0" wp14:anchorId="23A0594B" wp14:editId="598E5EE6">
             <wp:extent cx="3886200" cy="3037805"/>
             <wp:effectExtent l="0" t="0" r="0" b="0"/>
             <wp:docPr id="2" name="Picture 2"/>
@@ -4035,7 +4032,7 @@
           <w:noProof/>
         </w:rPr>
         <w:drawing>
-          <wp:inline distT="0" distB="0" distL="0" distR="0" wp14:anchorId="4056513D" wp14:editId="4A775EB6">
+          <wp:inline distT="0" distB="0" distL="0" distR="0" wp14:anchorId="45DB706D" wp14:editId="0E74DB65">
             <wp:extent cx="3886200" cy="3046927"/>
             <wp:effectExtent l="0" t="0" r="0" b="1270"/>
             <wp:docPr id="3" name="Picture 3"/>
@@ -4162,7 +4159,7 @@
         </w:rPr>
         <w:lastRenderedPageBreak/>
         <w:drawing>
-          <wp:inline distT="0" distB="0" distL="0" distR="0" wp14:anchorId="607945E1" wp14:editId="277AB9CF">
+          <wp:inline distT="0" distB="0" distL="0" distR="0" wp14:anchorId="34116458" wp14:editId="1A4355B8">
             <wp:extent cx="4114800" cy="3217552"/>
             <wp:effectExtent l="0" t="0" r="0" b="1905"/>
             <wp:docPr id="4" name="Picture 4"/>
@@ -4297,7 +4294,7 @@
           <w:noProof/>
         </w:rPr>
         <w:drawing>
-          <wp:inline distT="0" distB="0" distL="0" distR="0" wp14:anchorId="2A36F159" wp14:editId="18D5B12F">
+          <wp:inline distT="0" distB="0" distL="0" distR="0" wp14:anchorId="243C2DD7" wp14:editId="33B75B36">
             <wp:extent cx="4114800" cy="3194511"/>
             <wp:effectExtent l="0" t="0" r="0" b="6350"/>
             <wp:docPr id="5" name="Picture 5"/>
@@ -4459,7 +4456,7 @@
           <w:noProof/>
         </w:rPr>
         <w:drawing>
-          <wp:inline distT="0" distB="0" distL="0" distR="0" wp14:anchorId="58FB2759" wp14:editId="362161EA">
+          <wp:inline distT="0" distB="0" distL="0" distR="0" wp14:anchorId="1C32F2BF" wp14:editId="699751D7">
             <wp:extent cx="3790950" cy="1619051"/>
             <wp:effectExtent l="0" t="0" r="0" b="635"/>
             <wp:docPr id="12" name="Picture 12" descr="C:\Users\susan\AppData\Local\Temp\vmware-susan\VMwareDnD\7412d23f\Screen Shot 2016-07-11 at 4.50.20 PM.png"/>
@@ -4607,7 +4604,7 @@
           <w:noProof/>
         </w:rPr>
         <w:drawing>
-          <wp:inline distT="0" distB="0" distL="0" distR="0" wp14:anchorId="39B62D05" wp14:editId="1CE9D895">
+          <wp:inline distT="0" distB="0" distL="0" distR="0" wp14:anchorId="6D2B97BE" wp14:editId="3C6950C8">
             <wp:extent cx="4114800" cy="3004331"/>
             <wp:effectExtent l="0" t="0" r="0" b="5715"/>
             <wp:docPr id="1" name="Picture 1"/>
@@ -4701,7 +4698,7 @@
         <w:pStyle w:val="Heading1"/>
       </w:pPr>
       <w:bookmarkStart w:id="13" w:name="_Ref456012125"/>
-      <w:bookmarkStart w:id="14" w:name="_Toc485205019"/>
+      <w:bookmarkStart w:id="14" w:name="_Toc490824100"/>
       <w:r>
         <w:lastRenderedPageBreak/>
         <w:t>Configuring the .NET Connector</w:t>
@@ -4873,7 +4870,7 @@
         <w:pStyle w:val="Heading2"/>
       </w:pPr>
       <w:bookmarkStart w:id="15" w:name="_Ref477525249"/>
-      <w:bookmarkStart w:id="16" w:name="_Toc485205020"/>
+      <w:bookmarkStart w:id="16" w:name="_Toc490824101"/>
       <w:r>
         <w:t>General Instructions</w:t>
       </w:r>
@@ -5139,7 +5136,7 @@
       <w:pPr>
         <w:pStyle w:val="Heading2"/>
       </w:pPr>
-      <w:bookmarkStart w:id="17" w:name="_Toc485205021"/>
+      <w:bookmarkStart w:id="17" w:name="_Toc490824102"/>
       <w:r>
         <w:t>.NET Framework 4.0</w:t>
       </w:r>
@@ -5333,7 +5330,7 @@
       <w:pPr>
         <w:pStyle w:val="Heading2"/>
       </w:pPr>
-      <w:bookmarkStart w:id="18" w:name="_Toc485205022"/>
+      <w:bookmarkStart w:id="18" w:name="_Toc490824103"/>
       <w:r>
         <w:t>.NET Framework 4.5</w:t>
       </w:r>
@@ -5534,7 +5531,7 @@
         <w:pStyle w:val="Heading2"/>
       </w:pPr>
       <w:bookmarkStart w:id="19" w:name="_Ref477527440"/>
-      <w:bookmarkStart w:id="20" w:name="_Toc485205023"/>
+      <w:bookmarkStart w:id="20" w:name="_Toc490824104"/>
       <w:r>
         <w:t>Entity Framework 6</w:t>
       </w:r>
@@ -5778,7 +5775,7 @@
         <w:t>.</w:t>
       </w:r>
       <w:r>
-        <w:t>3</w:t>
+        <w:t>4</w:t>
       </w:r>
       <w:r>
         <w:t xml:space="preserve">, Culture=neutral, </w:t>
@@ -6298,7 +6295,7 @@
         <w:pStyle w:val="Heading2"/>
       </w:pPr>
       <w:bookmarkStart w:id="21" w:name="_Ref477528081"/>
-      <w:bookmarkStart w:id="22" w:name="_Toc485205024"/>
+      <w:bookmarkStart w:id="22" w:name="_Toc490824105"/>
       <w:r>
         <w:t>EDBDdexProvider for Visual Studio</w:t>
       </w:r>
@@ -6697,7 +6694,7 @@
         <w:t>.</w:t>
       </w:r>
       <w:r>
-        <w:t>3</w:t>
+        <w:t>4</w:t>
       </w:r>
       <w:r>
         <w:t xml:space="preserve">, Culture=neutral, </w:t>
@@ -7441,7 +7438,7 @@
         <w:pStyle w:val="Heading1"/>
       </w:pPr>
       <w:bookmarkStart w:id="23" w:name="_Ref482087625"/>
-      <w:bookmarkStart w:id="24" w:name="_Toc485205025"/>
+      <w:bookmarkStart w:id="24" w:name="_Toc490824106"/>
       <w:r>
         <w:lastRenderedPageBreak/>
         <w:t>Using the .NET Connector</w:t>
@@ -7695,7 +7692,7 @@
       <w:pPr>
         <w:pStyle w:val="Heading2"/>
       </w:pPr>
-      <w:bookmarkStart w:id="25" w:name="_Toc485205026"/>
+      <w:bookmarkStart w:id="25" w:name="_Toc490824107"/>
       <w:r>
         <w:t>Opening a Database Connection</w:t>
       </w:r>
@@ -7913,7 +7910,7 @@
         <w:pStyle w:val="Heading3"/>
       </w:pPr>
       <w:bookmarkStart w:id="26" w:name="_Ref482087661"/>
-      <w:bookmarkStart w:id="27" w:name="_Toc485205027"/>
+      <w:bookmarkStart w:id="27" w:name="_Toc490824108"/>
       <w:r>
         <w:t>Connection String Parameters</w:t>
       </w:r>
@@ -8977,7 +8974,7 @@
       <w:pPr>
         <w:pStyle w:val="Heading3"/>
       </w:pPr>
-      <w:bookmarkStart w:id="28" w:name="_Toc485205028"/>
+      <w:bookmarkStart w:id="28" w:name="_Toc490824109"/>
       <w:r>
         <w:t xml:space="preserve">Example - </w:t>
       </w:r>
@@ -9397,7 +9394,7 @@
           <w:noProof/>
         </w:rPr>
         <w:drawing>
-          <wp:inline distT="0" distB="0" distL="0" distR="0" wp14:anchorId="522695B5" wp14:editId="2D4A28D5">
+          <wp:inline distT="0" distB="0" distL="0" distR="0" wp14:anchorId="34E18356" wp14:editId="4A78392F">
             <wp:extent cx="5480050" cy="1663700"/>
             <wp:effectExtent l="0" t="0" r="6350" b="0"/>
             <wp:docPr id="7" name="Picture 7" descr="Screen Shot 2014-06-26 at 8"/>
@@ -9455,7 +9452,7 @@
       <w:pPr>
         <w:pStyle w:val="Heading3"/>
       </w:pPr>
-      <w:bookmarkStart w:id="29" w:name="_Toc485205029"/>
+      <w:bookmarkStart w:id="29" w:name="_Toc490824110"/>
       <w:r>
         <w:t xml:space="preserve">Example - </w:t>
       </w:r>
@@ -10068,7 +10065,7 @@
       <w:pPr>
         <w:pStyle w:val="Heading3"/>
       </w:pPr>
-      <w:bookmarkStart w:id="30" w:name="_Toc485205030"/>
+      <w:bookmarkStart w:id="30" w:name="_Toc490824111"/>
       <w:r>
         <w:t xml:space="preserve">Example - </w:t>
       </w:r>
@@ -10865,7 +10862,7 @@
           <w:noProof/>
         </w:rPr>
         <w:drawing>
-          <wp:inline distT="0" distB="0" distL="0" distR="0" wp14:anchorId="110D3252" wp14:editId="42503D72">
+          <wp:inline distT="0" distB="0" distL="0" distR="0" wp14:anchorId="013689BC" wp14:editId="244E939E">
             <wp:extent cx="2120900" cy="2120900"/>
             <wp:effectExtent l="0" t="0" r="0" b="0"/>
             <wp:docPr id="8" name="Picture 8" descr="dialog"/>
@@ -10977,7 +10974,7 @@
       <w:pPr>
         <w:pStyle w:val="Heading2"/>
       </w:pPr>
-      <w:bookmarkStart w:id="31" w:name="_Toc485205031"/>
+      <w:bookmarkStart w:id="31" w:name="_Toc490824112"/>
       <w:r>
         <w:lastRenderedPageBreak/>
         <w:t>Retrieving Database Records</w:t>
@@ -12061,7 +12058,7 @@
       <w:pPr>
         <w:pStyle w:val="Heading3"/>
       </w:pPr>
-      <w:bookmarkStart w:id="32" w:name="_Toc485205032"/>
+      <w:bookmarkStart w:id="32" w:name="_Toc490824113"/>
       <w:r>
         <w:t>Retr</w:t>
       </w:r>
@@ -12595,7 +12592,7 @@
       <w:pPr>
         <w:pStyle w:val="Heading2"/>
       </w:pPr>
-      <w:bookmarkStart w:id="33" w:name="_Toc485205033"/>
+      <w:bookmarkStart w:id="33" w:name="_Toc490824114"/>
       <w:r>
         <w:lastRenderedPageBreak/>
         <w:t>Parameterized Queries</w:t>
@@ -13276,7 +13273,7 @@
       <w:pPr>
         <w:pStyle w:val="Heading2"/>
       </w:pPr>
-      <w:bookmarkStart w:id="34" w:name="_Toc485205034"/>
+      <w:bookmarkStart w:id="34" w:name="_Toc490824115"/>
       <w:r>
         <w:lastRenderedPageBreak/>
         <w:t>Inserting Records in a Database</w:t>
@@ -14122,7 +14119,7 @@
       <w:pPr>
         <w:pStyle w:val="Heading2"/>
       </w:pPr>
-      <w:bookmarkStart w:id="35" w:name="_Toc485205035"/>
+      <w:bookmarkStart w:id="35" w:name="_Toc490824116"/>
       <w:r>
         <w:lastRenderedPageBreak/>
         <w:t>Deleting Records in a Database</w:t>
@@ -14964,7 +14961,7 @@
       <w:pPr>
         <w:pStyle w:val="Heading2"/>
       </w:pPr>
-      <w:bookmarkStart w:id="36" w:name="_Toc485205036"/>
+      <w:bookmarkStart w:id="36" w:name="_Toc490824117"/>
       <w:r>
         <w:lastRenderedPageBreak/>
         <w:t>Using SPL Stored Procedures in your .NET Application</w:t>
@@ -15240,7 +15237,7 @@
       <w:pPr>
         <w:pStyle w:val="Heading3"/>
       </w:pPr>
-      <w:bookmarkStart w:id="37" w:name="_Toc485205037"/>
+      <w:bookmarkStart w:id="37" w:name="_Toc490824118"/>
       <w:r>
         <w:t>Example - Executing</w:t>
       </w:r>
@@ -16169,7 +16166,7 @@
       <w:pPr>
         <w:pStyle w:val="Heading3"/>
       </w:pPr>
-      <w:bookmarkStart w:id="38" w:name="_Toc485205038"/>
+      <w:bookmarkStart w:id="38" w:name="_Toc490824119"/>
       <w:r>
         <w:t xml:space="preserve">Example - </w:t>
       </w:r>
@@ -17965,7 +17962,7 @@
       <w:pPr>
         <w:pStyle w:val="Heading3"/>
       </w:pPr>
-      <w:bookmarkStart w:id="39" w:name="_Toc485205039"/>
+      <w:bookmarkStart w:id="39" w:name="_Toc490824120"/>
       <w:r>
         <w:t xml:space="preserve">Example - </w:t>
       </w:r>
@@ -20199,7 +20196,7 @@
       <w:pPr>
         <w:pStyle w:val="Heading2"/>
       </w:pPr>
-      <w:bookmarkStart w:id="40" w:name="_Toc485205040"/>
+      <w:bookmarkStart w:id="40" w:name="_Toc490824121"/>
       <w:r>
         <w:lastRenderedPageBreak/>
         <w:t xml:space="preserve">Using </w:t>
@@ -31472,7 +31469,7 @@
 </file>
 
 <file path=customXml/itemProps1.xml><?xml version="1.0" encoding="utf-8"?>
-<ds:datastoreItem xmlns:ds="http://schemas.openxmlformats.org/officeDocument/2006/customXml" ds:itemID="{2765F8CE-1AD9-4A03-8FA6-F5F5BAAEB6D9}">
+<ds:datastoreItem xmlns:ds="http://schemas.openxmlformats.org/officeDocument/2006/customXml" ds:itemID="{9C08E24A-58FB-4A37-BA58-D77EC0C94777}">
   <ds:schemaRefs>
     <ds:schemaRef ds:uri="http://schemas.openxmlformats.org/officeDocument/2006/bibliography"/>
   </ds:schemaRefs>

</xml_diff>

<commit_message>
EPAS .Net Connector Guide 10.0.0 - Removed What's New section
</commit_message>
<xml_diff>
--- a/edb_docs/EDB_Postgres_Advanced_Server_NET_Connector_Guide.docx
+++ b/edb_docs/EDB_Postgres_Advanced_Server_NET_Connector_Guide.docx
@@ -12,7 +12,7 @@
           <w:noProof/>
         </w:rPr>
         <w:drawing>
-          <wp:inline distT="0" distB="0" distL="0" distR="0" wp14:anchorId="1A36058A" wp14:editId="257F3515">
+          <wp:inline distT="0" distB="0" distL="0" distR="0" wp14:anchorId="6DC60BB5" wp14:editId="61BC1F8E">
             <wp:extent cx="2380711" cy="1371599"/>
             <wp:effectExtent l="0" t="0" r="635" b="635"/>
             <wp:docPr id="6" name="Picture 6"/>
@@ -77,13 +77,13 @@
           <w:color w:val="auto"/>
         </w:rPr>
       </w:pPr>
-    </w:p>
-    <w:p>
-      <w:pPr>
-        <w:pStyle w:val="EDBTXTNormalWebBlackCharChar0"/>
-      </w:pPr>
       <w:bookmarkStart w:id="0" w:name="_GoBack"/>
       <w:bookmarkEnd w:id="0"/>
+    </w:p>
+    <w:p>
+      <w:pPr>
+        <w:pStyle w:val="EDBTXTNormalWebBlackCharChar0"/>
+      </w:pPr>
     </w:p>
     <w:p>
       <w:pPr>
@@ -526,7 +526,7 @@
       <w:r>
         <w:fldChar w:fldCharType="separate"/>
       </w:r>
-      <w:hyperlink w:anchor="_Toc490824094" w:history="1">
+      <w:hyperlink w:anchor="_Toc490831597" w:history="1">
         <w:r>
           <w:rPr>
             <w:rStyle w:val="Hyperlink"/>
@@ -566,7 +566,7 @@
           <w:rPr>
             <w:noProof/>
           </w:rPr>
-          <w:instrText xml:space="preserve"> PAGEREF _Toc490824094 \h </w:instrText>
+          <w:instrText xml:space="preserve"> PAGEREF _Toc490831597 \h </w:instrText>
         </w:r>
         <w:r>
           <w:rPr>
@@ -607,94 +607,13 @@
           <w:szCs w:val="22"/>
         </w:rPr>
       </w:pPr>
-      <w:hyperlink w:anchor="_Toc490824095" w:history="1">
+      <w:hyperlink w:anchor="_Toc490831604" w:history="1">
         <w:r>
           <w:rPr>
             <w:rStyle w:val="Hyperlink"/>
             <w:noProof/>
           </w:rPr>
           <w:t>1.1</w:t>
-        </w:r>
-        <w:r>
-          <w:rPr>
-            <w:rFonts w:asciiTheme="minorHAnsi" w:eastAsiaTheme="minorEastAsia" w:hAnsiTheme="minorHAnsi" w:cstheme="minorBidi"/>
-            <w:noProof/>
-            <w:sz w:val="22"/>
-            <w:szCs w:val="22"/>
-          </w:rPr>
-          <w:tab/>
-        </w:r>
-        <w:r>
-          <w:rPr>
-            <w:rStyle w:val="Hyperlink"/>
-            <w:noProof/>
-          </w:rPr>
-          <w:t>What’s New</w:t>
-        </w:r>
-        <w:r>
-          <w:rPr>
-            <w:noProof/>
-          </w:rPr>
-          <w:tab/>
-        </w:r>
-        <w:r>
-          <w:rPr>
-            <w:noProof/>
-          </w:rPr>
-          <w:fldChar w:fldCharType="begin"/>
-        </w:r>
-        <w:r>
-          <w:rPr>
-            <w:noProof/>
-          </w:rPr>
-          <w:instrText xml:space="preserve"> PAGEREF _Toc490824095 \h </w:instrText>
-        </w:r>
-        <w:r>
-          <w:rPr>
-            <w:noProof/>
-          </w:rPr>
-        </w:r>
-        <w:r>
-          <w:rPr>
-            <w:noProof/>
-          </w:rPr>
-          <w:fldChar w:fldCharType="separate"/>
-        </w:r>
-        <w:r>
-          <w:rPr>
-            <w:noProof/>
-          </w:rPr>
-          <w:t>5</w:t>
-        </w:r>
-        <w:r>
-          <w:rPr>
-            <w:noProof/>
-          </w:rPr>
-          <w:fldChar w:fldCharType="end"/>
-        </w:r>
-      </w:hyperlink>
-    </w:p>
-    <w:p>
-      <w:pPr>
-        <w:pStyle w:val="TOC2"/>
-        <w:tabs>
-          <w:tab w:val="left" w:pos="960"/>
-          <w:tab w:val="right" w:leader="dot" w:pos="8630"/>
-        </w:tabs>
-        <w:rPr>
-          <w:rFonts w:asciiTheme="minorHAnsi" w:eastAsiaTheme="minorEastAsia" w:hAnsiTheme="minorHAnsi" w:cstheme="minorBidi"/>
-          <w:noProof/>
-          <w:sz w:val="22"/>
-          <w:szCs w:val="22"/>
-        </w:rPr>
-      </w:pPr>
-      <w:hyperlink w:anchor="_Toc490824096" w:history="1">
-        <w:r>
-          <w:rPr>
-            <w:rStyle w:val="Hyperlink"/>
-            <w:noProof/>
-          </w:rPr>
-          <w:t>1.2</w:t>
         </w:r>
         <w:r>
           <w:rPr>
@@ -728,7 +647,7 @@
           <w:rPr>
             <w:noProof/>
           </w:rPr>
-          <w:instrText xml:space="preserve"> PAGEREF _Toc490824096 \h </w:instrText>
+          <w:instrText xml:space="preserve"> PAGEREF _Toc490831604 \h </w:instrText>
         </w:r>
         <w:r>
           <w:rPr>
@@ -769,7 +688,7 @@
           <w:szCs w:val="22"/>
         </w:rPr>
       </w:pPr>
-      <w:hyperlink w:anchor="_Toc490824097" w:history="1">
+      <w:hyperlink w:anchor="_Toc490831605" w:history="1">
         <w:r>
           <w:rPr>
             <w:rStyle w:val="Hyperlink"/>
@@ -809,7 +728,7 @@
           <w:rPr>
             <w:noProof/>
           </w:rPr>
-          <w:instrText xml:space="preserve"> PAGEREF _Toc490824097 \h </w:instrText>
+          <w:instrText xml:space="preserve"> PAGEREF _Toc490831605 \h </w:instrText>
         </w:r>
         <w:r>
           <w:rPr>
@@ -850,7 +769,7 @@
           <w:szCs w:val="22"/>
         </w:rPr>
       </w:pPr>
-      <w:hyperlink w:anchor="_Toc490824098" w:history="1">
+      <w:hyperlink w:anchor="_Toc490831606" w:history="1">
         <w:r>
           <w:rPr>
             <w:rStyle w:val="Hyperlink"/>
@@ -890,7 +809,7 @@
           <w:rPr>
             <w:noProof/>
           </w:rPr>
-          <w:instrText xml:space="preserve"> PAGEREF _Toc490824098 \h </w:instrText>
+          <w:instrText xml:space="preserve"> PAGEREF _Toc490831606 \h </w:instrText>
         </w:r>
         <w:r>
           <w:rPr>
@@ -931,7 +850,7 @@
           <w:szCs w:val="22"/>
         </w:rPr>
       </w:pPr>
-      <w:hyperlink w:anchor="_Toc490824099" w:history="1">
+      <w:hyperlink w:anchor="_Toc490831607" w:history="1">
         <w:r>
           <w:rPr>
             <w:rStyle w:val="Hyperlink"/>
@@ -971,7 +890,7 @@
           <w:rPr>
             <w:noProof/>
           </w:rPr>
-          <w:instrText xml:space="preserve"> PAGEREF _Toc490824099 \h </w:instrText>
+          <w:instrText xml:space="preserve"> PAGEREF _Toc490831607 \h </w:instrText>
         </w:r>
         <w:r>
           <w:rPr>
@@ -1012,7 +931,7 @@
           <w:szCs w:val="22"/>
         </w:rPr>
       </w:pPr>
-      <w:hyperlink w:anchor="_Toc490824100" w:history="1">
+      <w:hyperlink w:anchor="_Toc490831608" w:history="1">
         <w:r>
           <w:rPr>
             <w:rStyle w:val="Hyperlink"/>
@@ -1052,7 +971,7 @@
           <w:rPr>
             <w:noProof/>
           </w:rPr>
-          <w:instrText xml:space="preserve"> PAGEREF _Toc490824100 \h </w:instrText>
+          <w:instrText xml:space="preserve"> PAGEREF _Toc490831608 \h </w:instrText>
         </w:r>
         <w:r>
           <w:rPr>
@@ -1093,7 +1012,7 @@
           <w:szCs w:val="22"/>
         </w:rPr>
       </w:pPr>
-      <w:hyperlink w:anchor="_Toc490824101" w:history="1">
+      <w:hyperlink w:anchor="_Toc490831609" w:history="1">
         <w:r>
           <w:rPr>
             <w:rStyle w:val="Hyperlink"/>
@@ -1133,7 +1052,7 @@
           <w:rPr>
             <w:noProof/>
           </w:rPr>
-          <w:instrText xml:space="preserve"> PAGEREF _Toc490824101 \h </w:instrText>
+          <w:instrText xml:space="preserve"> PAGEREF _Toc490831609 \h </w:instrText>
         </w:r>
         <w:r>
           <w:rPr>
@@ -1174,7 +1093,7 @@
           <w:szCs w:val="22"/>
         </w:rPr>
       </w:pPr>
-      <w:hyperlink w:anchor="_Toc490824102" w:history="1">
+      <w:hyperlink w:anchor="_Toc490831610" w:history="1">
         <w:r>
           <w:rPr>
             <w:rStyle w:val="Hyperlink"/>
@@ -1214,7 +1133,7 @@
           <w:rPr>
             <w:noProof/>
           </w:rPr>
-          <w:instrText xml:space="preserve"> PAGEREF _Toc490824102 \h </w:instrText>
+          <w:instrText xml:space="preserve"> PAGEREF _Toc490831610 \h </w:instrText>
         </w:r>
         <w:r>
           <w:rPr>
@@ -1255,7 +1174,7 @@
           <w:szCs w:val="22"/>
         </w:rPr>
       </w:pPr>
-      <w:hyperlink w:anchor="_Toc490824103" w:history="1">
+      <w:hyperlink w:anchor="_Toc490831611" w:history="1">
         <w:r>
           <w:rPr>
             <w:rStyle w:val="Hyperlink"/>
@@ -1295,7 +1214,7 @@
           <w:rPr>
             <w:noProof/>
           </w:rPr>
-          <w:instrText xml:space="preserve"> PAGEREF _Toc490824103 \h </w:instrText>
+          <w:instrText xml:space="preserve"> PAGEREF _Toc490831611 \h </w:instrText>
         </w:r>
         <w:r>
           <w:rPr>
@@ -1336,7 +1255,7 @@
           <w:szCs w:val="22"/>
         </w:rPr>
       </w:pPr>
-      <w:hyperlink w:anchor="_Toc490824104" w:history="1">
+      <w:hyperlink w:anchor="_Toc490831612" w:history="1">
         <w:r>
           <w:rPr>
             <w:rStyle w:val="Hyperlink"/>
@@ -1376,7 +1295,7 @@
           <w:rPr>
             <w:noProof/>
           </w:rPr>
-          <w:instrText xml:space="preserve"> PAGEREF _Toc490824104 \h </w:instrText>
+          <w:instrText xml:space="preserve"> PAGEREF _Toc490831612 \h </w:instrText>
         </w:r>
         <w:r>
           <w:rPr>
@@ -1417,7 +1336,7 @@
           <w:szCs w:val="22"/>
         </w:rPr>
       </w:pPr>
-      <w:hyperlink w:anchor="_Toc490824105" w:history="1">
+      <w:hyperlink w:anchor="_Toc490831613" w:history="1">
         <w:r>
           <w:rPr>
             <w:rStyle w:val="Hyperlink"/>
@@ -1457,7 +1376,7 @@
           <w:rPr>
             <w:noProof/>
           </w:rPr>
-          <w:instrText xml:space="preserve"> PAGEREF _Toc490824105 \h </w:instrText>
+          <w:instrText xml:space="preserve"> PAGEREF _Toc490831613 \h </w:instrText>
         </w:r>
         <w:r>
           <w:rPr>
@@ -1498,7 +1417,7 @@
           <w:szCs w:val="22"/>
         </w:rPr>
       </w:pPr>
-      <w:hyperlink w:anchor="_Toc490824106" w:history="1">
+      <w:hyperlink w:anchor="_Toc490831614" w:history="1">
         <w:r>
           <w:rPr>
             <w:rStyle w:val="Hyperlink"/>
@@ -1538,7 +1457,7 @@
           <w:rPr>
             <w:noProof/>
           </w:rPr>
-          <w:instrText xml:space="preserve"> PAGEREF _Toc490824106 \h </w:instrText>
+          <w:instrText xml:space="preserve"> PAGEREF _Toc490831614 \h </w:instrText>
         </w:r>
         <w:r>
           <w:rPr>
@@ -1579,7 +1498,7 @@
           <w:szCs w:val="22"/>
         </w:rPr>
       </w:pPr>
-      <w:hyperlink w:anchor="_Toc490824107" w:history="1">
+      <w:hyperlink w:anchor="_Toc490831615" w:history="1">
         <w:r>
           <w:rPr>
             <w:rStyle w:val="Hyperlink"/>
@@ -1619,7 +1538,7 @@
           <w:rPr>
             <w:noProof/>
           </w:rPr>
-          <w:instrText xml:space="preserve"> PAGEREF _Toc490824107 \h </w:instrText>
+          <w:instrText xml:space="preserve"> PAGEREF _Toc490831615 \h </w:instrText>
         </w:r>
         <w:r>
           <w:rPr>
@@ -1655,7 +1574,7 @@
           <w:szCs w:val="22"/>
         </w:rPr>
       </w:pPr>
-      <w:hyperlink w:anchor="_Toc490824108" w:history="1">
+      <w:hyperlink w:anchor="_Toc490831616" w:history="1">
         <w:r>
           <w:rPr>
             <w:rStyle w:val="Hyperlink"/>
@@ -1683,7 +1602,7 @@
           <w:fldChar w:fldCharType="begin"/>
         </w:r>
         <w:r>
-          <w:instrText xml:space="preserve"> PAGEREF _Toc490824108 \h </w:instrText>
+          <w:instrText xml:space="preserve"> PAGEREF _Toc490831616 \h </w:instrText>
         </w:r>
         <w:r>
           <w:fldChar w:fldCharType="separate"/>
@@ -1705,7 +1624,7 @@
           <w:szCs w:val="22"/>
         </w:rPr>
       </w:pPr>
-      <w:hyperlink w:anchor="_Toc490824109" w:history="1">
+      <w:hyperlink w:anchor="_Toc490831617" w:history="1">
         <w:r>
           <w:rPr>
             <w:rStyle w:val="Hyperlink"/>
@@ -1733,7 +1652,7 @@
           <w:fldChar w:fldCharType="begin"/>
         </w:r>
         <w:r>
-          <w:instrText xml:space="preserve"> PAGEREF _Toc490824109 \h </w:instrText>
+          <w:instrText xml:space="preserve"> PAGEREF _Toc490831617 \h </w:instrText>
         </w:r>
         <w:r>
           <w:fldChar w:fldCharType="separate"/>
@@ -1755,7 +1674,7 @@
           <w:szCs w:val="22"/>
         </w:rPr>
       </w:pPr>
-      <w:hyperlink w:anchor="_Toc490824110" w:history="1">
+      <w:hyperlink w:anchor="_Toc490831618" w:history="1">
         <w:r>
           <w:rPr>
             <w:rStyle w:val="Hyperlink"/>
@@ -1783,7 +1702,7 @@
           <w:fldChar w:fldCharType="begin"/>
         </w:r>
         <w:r>
-          <w:instrText xml:space="preserve"> PAGEREF _Toc490824110 \h </w:instrText>
+          <w:instrText xml:space="preserve"> PAGEREF _Toc490831618 \h </w:instrText>
         </w:r>
         <w:r>
           <w:fldChar w:fldCharType="separate"/>
@@ -1805,7 +1724,7 @@
           <w:szCs w:val="22"/>
         </w:rPr>
       </w:pPr>
-      <w:hyperlink w:anchor="_Toc490824111" w:history="1">
+      <w:hyperlink w:anchor="_Toc490831619" w:history="1">
         <w:r>
           <w:rPr>
             <w:rStyle w:val="Hyperlink"/>
@@ -1833,7 +1752,7 @@
           <w:fldChar w:fldCharType="begin"/>
         </w:r>
         <w:r>
-          <w:instrText xml:space="preserve"> PAGEREF _Toc490824111 \h </w:instrText>
+          <w:instrText xml:space="preserve"> PAGEREF _Toc490831619 \h </w:instrText>
         </w:r>
         <w:r>
           <w:fldChar w:fldCharType="separate"/>
@@ -1860,7 +1779,7 @@
           <w:szCs w:val="22"/>
         </w:rPr>
       </w:pPr>
-      <w:hyperlink w:anchor="_Toc490824112" w:history="1">
+      <w:hyperlink w:anchor="_Toc490831620" w:history="1">
         <w:r>
           <w:rPr>
             <w:rStyle w:val="Hyperlink"/>
@@ -1900,7 +1819,7 @@
           <w:rPr>
             <w:noProof/>
           </w:rPr>
-          <w:instrText xml:space="preserve"> PAGEREF _Toc490824112 \h </w:instrText>
+          <w:instrText xml:space="preserve"> PAGEREF _Toc490831620 \h </w:instrText>
         </w:r>
         <w:r>
           <w:rPr>
@@ -1936,7 +1855,7 @@
           <w:szCs w:val="22"/>
         </w:rPr>
       </w:pPr>
-      <w:hyperlink w:anchor="_Toc490824113" w:history="1">
+      <w:hyperlink w:anchor="_Toc490831621" w:history="1">
         <w:r>
           <w:rPr>
             <w:rStyle w:val="Hyperlink"/>
@@ -1964,7 +1883,7 @@
           <w:fldChar w:fldCharType="begin"/>
         </w:r>
         <w:r>
-          <w:instrText xml:space="preserve"> PAGEREF _Toc490824113 \h </w:instrText>
+          <w:instrText xml:space="preserve"> PAGEREF _Toc490831621 \h </w:instrText>
         </w:r>
         <w:r>
           <w:fldChar w:fldCharType="separate"/>
@@ -1991,7 +1910,7 @@
           <w:szCs w:val="22"/>
         </w:rPr>
       </w:pPr>
-      <w:hyperlink w:anchor="_Toc490824114" w:history="1">
+      <w:hyperlink w:anchor="_Toc490831622" w:history="1">
         <w:r>
           <w:rPr>
             <w:rStyle w:val="Hyperlink"/>
@@ -2031,7 +1950,7 @@
           <w:rPr>
             <w:noProof/>
           </w:rPr>
-          <w:instrText xml:space="preserve"> PAGEREF _Toc490824114 \h </w:instrText>
+          <w:instrText xml:space="preserve"> PAGEREF _Toc490831622 \h </w:instrText>
         </w:r>
         <w:r>
           <w:rPr>
@@ -2072,7 +1991,7 @@
           <w:szCs w:val="22"/>
         </w:rPr>
       </w:pPr>
-      <w:hyperlink w:anchor="_Toc490824115" w:history="1">
+      <w:hyperlink w:anchor="_Toc490831623" w:history="1">
         <w:r>
           <w:rPr>
             <w:rStyle w:val="Hyperlink"/>
@@ -2112,7 +2031,7 @@
           <w:rPr>
             <w:noProof/>
           </w:rPr>
-          <w:instrText xml:space="preserve"> PAGEREF _Toc490824115 \h </w:instrText>
+          <w:instrText xml:space="preserve"> PAGEREF _Toc490831623 \h </w:instrText>
         </w:r>
         <w:r>
           <w:rPr>
@@ -2153,7 +2072,7 @@
           <w:szCs w:val="22"/>
         </w:rPr>
       </w:pPr>
-      <w:hyperlink w:anchor="_Toc490824116" w:history="1">
+      <w:hyperlink w:anchor="_Toc490831624" w:history="1">
         <w:r>
           <w:rPr>
             <w:rStyle w:val="Hyperlink"/>
@@ -2193,7 +2112,7 @@
           <w:rPr>
             <w:noProof/>
           </w:rPr>
-          <w:instrText xml:space="preserve"> PAGEREF _Toc490824116 \h </w:instrText>
+          <w:instrText xml:space="preserve"> PAGEREF _Toc490831624 \h </w:instrText>
         </w:r>
         <w:r>
           <w:rPr>
@@ -2234,7 +2153,7 @@
           <w:szCs w:val="22"/>
         </w:rPr>
       </w:pPr>
-      <w:hyperlink w:anchor="_Toc490824117" w:history="1">
+      <w:hyperlink w:anchor="_Toc490831625" w:history="1">
         <w:r>
           <w:rPr>
             <w:rStyle w:val="Hyperlink"/>
@@ -2274,7 +2193,7 @@
           <w:rPr>
             <w:noProof/>
           </w:rPr>
-          <w:instrText xml:space="preserve"> PAGEREF _Toc490824117 \h </w:instrText>
+          <w:instrText xml:space="preserve"> PAGEREF _Toc490831625 \h </w:instrText>
         </w:r>
         <w:r>
           <w:rPr>
@@ -2310,7 +2229,7 @@
           <w:szCs w:val="22"/>
         </w:rPr>
       </w:pPr>
-      <w:hyperlink w:anchor="_Toc490824118" w:history="1">
+      <w:hyperlink w:anchor="_Toc490831626" w:history="1">
         <w:r>
           <w:rPr>
             <w:rStyle w:val="Hyperlink"/>
@@ -2338,7 +2257,7 @@
           <w:fldChar w:fldCharType="begin"/>
         </w:r>
         <w:r>
-          <w:instrText xml:space="preserve"> PAGEREF _Toc490824118 \h </w:instrText>
+          <w:instrText xml:space="preserve"> PAGEREF _Toc490831626 \h </w:instrText>
         </w:r>
         <w:r>
           <w:fldChar w:fldCharType="separate"/>
@@ -2360,7 +2279,7 @@
           <w:szCs w:val="22"/>
         </w:rPr>
       </w:pPr>
-      <w:hyperlink w:anchor="_Toc490824119" w:history="1">
+      <w:hyperlink w:anchor="_Toc490831627" w:history="1">
         <w:r>
           <w:rPr>
             <w:rStyle w:val="Hyperlink"/>
@@ -2388,7 +2307,7 @@
           <w:fldChar w:fldCharType="begin"/>
         </w:r>
         <w:r>
-          <w:instrText xml:space="preserve"> PAGEREF _Toc490824119 \h </w:instrText>
+          <w:instrText xml:space="preserve"> PAGEREF _Toc490831627 \h </w:instrText>
         </w:r>
         <w:r>
           <w:fldChar w:fldCharType="separate"/>
@@ -2410,7 +2329,7 @@
           <w:szCs w:val="22"/>
         </w:rPr>
       </w:pPr>
-      <w:hyperlink w:anchor="_Toc490824120" w:history="1">
+      <w:hyperlink w:anchor="_Toc490831628" w:history="1">
         <w:r>
           <w:rPr>
             <w:rStyle w:val="Hyperlink"/>
@@ -2438,7 +2357,7 @@
           <w:fldChar w:fldCharType="begin"/>
         </w:r>
         <w:r>
-          <w:instrText xml:space="preserve"> PAGEREF _Toc490824120 \h </w:instrText>
+          <w:instrText xml:space="preserve"> PAGEREF _Toc490831628 \h </w:instrText>
         </w:r>
         <w:r>
           <w:fldChar w:fldCharType="separate"/>
@@ -2465,7 +2384,7 @@
           <w:szCs w:val="22"/>
         </w:rPr>
       </w:pPr>
-      <w:hyperlink w:anchor="_Toc490824121" w:history="1">
+      <w:hyperlink w:anchor="_Toc490831629" w:history="1">
         <w:r>
           <w:rPr>
             <w:rStyle w:val="Hyperlink"/>
@@ -2505,7 +2424,7 @@
           <w:rPr>
             <w:noProof/>
           </w:rPr>
-          <w:instrText xml:space="preserve"> PAGEREF _Toc490824121 \h </w:instrText>
+          <w:instrText xml:space="preserve"> PAGEREF _Toc490831629 \h </w:instrText>
         </w:r>
         <w:r>
           <w:rPr>
@@ -2563,7 +2482,7 @@
       <w:pPr>
         <w:pStyle w:val="Heading1"/>
       </w:pPr>
-      <w:bookmarkStart w:id="1" w:name="_Toc490824094"/>
+      <w:bookmarkStart w:id="1" w:name="_Toc490831597"/>
       <w:r>
         <w:lastRenderedPageBreak/>
         <w:t>Introduction</w:t>
@@ -2737,215 +2656,33 @@
     <w:p>
       <w:pPr>
         <w:pStyle w:val="Heading2"/>
-        <w:tabs>
-          <w:tab w:val="left" w:pos="576"/>
-        </w:tabs>
-      </w:pPr>
-      <w:bookmarkStart w:id="2" w:name="_Toc453572801"/>
-      <w:bookmarkStart w:id="3" w:name="_Toc490824095"/>
-      <w:r>
-        <w:lastRenderedPageBreak/>
-        <w:t>What’s New</w:t>
-      </w:r>
+      </w:pPr>
+      <w:bookmarkStart w:id="2" w:name="_Toc490831598"/>
+      <w:bookmarkStart w:id="3" w:name="_Toc490831599"/>
+      <w:bookmarkStart w:id="4" w:name="_Toc490831600"/>
+      <w:bookmarkStart w:id="5" w:name="_Toc490831601"/>
+      <w:bookmarkStart w:id="6" w:name="_Toc490831602"/>
+      <w:bookmarkStart w:id="7" w:name="_Toc490831603"/>
+      <w:bookmarkStart w:id="8" w:name="_Ref103071763"/>
+      <w:bookmarkStart w:id="9" w:name="_Ref103071794"/>
+      <w:bookmarkStart w:id="10" w:name="_Ref103073047"/>
+      <w:bookmarkStart w:id="11" w:name="_Ref103073090"/>
+      <w:bookmarkStart w:id="12" w:name="_Toc490831604"/>
       <w:bookmarkEnd w:id="2"/>
       <w:bookmarkEnd w:id="3"/>
-    </w:p>
-    <w:p>
-      <w:pPr>
-        <w:pStyle w:val="EDBTXTNormalWebBlackCharChar1"/>
-        <w:rPr>
-          <w:color w:val="auto"/>
-        </w:rPr>
-      </w:pPr>
-      <w:r>
-        <w:t xml:space="preserve">The following </w:t>
-      </w:r>
-      <w:r>
-        <w:t xml:space="preserve">features have </w:t>
-      </w:r>
-      <w:r>
-        <w:t xml:space="preserve">been added to the Advanced Server .NET </w:t>
-      </w:r>
-      <w:r>
-        <w:t xml:space="preserve">Connector </w:t>
-      </w:r>
-      <w:r>
-        <w:t>9.6.0.2 t</w:t>
-      </w:r>
-      <w:r>
-        <w:t>o produce Advanced Server .NET C</w:t>
-      </w:r>
-      <w:r>
-        <w:t>onnector 9.6.0.3</w:t>
-      </w:r>
-      <w:r>
-        <w:rPr>
-          <w:color w:val="auto"/>
-        </w:rPr>
-        <w:t>:</w:t>
-      </w:r>
-    </w:p>
-    <w:p>
-      <w:pPr>
-        <w:pStyle w:val="EDBTXTNormalWebBlackCharChar1"/>
-        <w:numPr>
-          <w:ilvl w:val="0"/>
-          <w:numId w:val="2"/>
-        </w:numPr>
-        <w:tabs>
-          <w:tab w:val="left" w:pos="720"/>
-        </w:tabs>
-        <w:spacing w:before="0" w:after="0"/>
-        <w:rPr>
-          <w:lang w:eastAsia="ar-SA"/>
-        </w:rPr>
-      </w:pPr>
-      <w:r>
-        <w:rPr>
-          <w:lang w:eastAsia="ar-SA"/>
-        </w:rPr>
-        <w:t xml:space="preserve">Merged with the community </w:t>
-      </w:r>
-      <w:proofErr w:type="spellStart"/>
-      <w:r>
-        <w:rPr>
-          <w:lang w:eastAsia="ar-SA"/>
-        </w:rPr>
-        <w:t>Npgsql</w:t>
-      </w:r>
-      <w:proofErr w:type="spellEnd"/>
-      <w:r>
-        <w:rPr>
-          <w:lang w:eastAsia="ar-SA"/>
-        </w:rPr>
-        <w:t xml:space="preserve"> driver version 3.1.9</w:t>
-      </w:r>
-    </w:p>
-    <w:p>
-      <w:pPr>
-        <w:pStyle w:val="EDBTXTNormalWebBlackCharChar1"/>
-        <w:numPr>
-          <w:ilvl w:val="0"/>
-          <w:numId w:val="2"/>
-        </w:numPr>
-        <w:tabs>
-          <w:tab w:val="left" w:pos="720"/>
-        </w:tabs>
-        <w:spacing w:before="0" w:after="0"/>
-        <w:rPr>
-          <w:lang w:eastAsia="ar-SA"/>
-        </w:rPr>
-      </w:pPr>
-      <w:r>
-        <w:rPr>
-          <w:lang w:eastAsia="ar-SA"/>
-        </w:rPr>
-        <w:t xml:space="preserve">The .NET Connector now provides access to Advanced Server databases from Microsoft Visual Studio with the </w:t>
-      </w:r>
-      <w:r>
-        <w:rPr>
-          <w:lang w:eastAsia="ar-SA"/>
-        </w:rPr>
-        <w:t>EDBDdexProvider</w:t>
-      </w:r>
-      <w:r>
-        <w:rPr>
-          <w:lang w:eastAsia="ar-SA"/>
-        </w:rPr>
-        <w:t xml:space="preserve"> component. Thus, the features of Visual Studio can now be used with Advanced Server as the external data source. For more information, see Section </w:t>
-      </w:r>
-      <w:r>
-        <w:rPr>
-          <w:u w:val="single"/>
-          <w:lang w:eastAsia="ar-SA"/>
-        </w:rPr>
-        <w:fldChar w:fldCharType="begin"/>
-      </w:r>
-      <w:r>
-        <w:rPr>
-          <w:u w:val="single"/>
-          <w:lang w:eastAsia="ar-SA"/>
-        </w:rPr>
-        <w:instrText xml:space="preserve"> REF _Ref477528081 \r \h </w:instrText>
-      </w:r>
-      <w:r>
-        <w:rPr>
-          <w:u w:val="single"/>
-          <w:lang w:eastAsia="ar-SA"/>
-        </w:rPr>
-      </w:r>
-      <w:r>
-        <w:rPr>
-          <w:u w:val="single"/>
-          <w:lang w:eastAsia="ar-SA"/>
-        </w:rPr>
-        <w:fldChar w:fldCharType="separate"/>
-      </w:r>
-      <w:r>
-        <w:rPr>
-          <w:u w:val="single"/>
-          <w:lang w:eastAsia="ar-SA"/>
-        </w:rPr>
-        <w:t>3.5</w:t>
-      </w:r>
-      <w:r>
-        <w:rPr>
-          <w:u w:val="single"/>
-          <w:lang w:eastAsia="ar-SA"/>
-        </w:rPr>
-        <w:fldChar w:fldCharType="end"/>
-      </w:r>
-      <w:r>
-        <w:rPr>
-          <w:lang w:eastAsia="ar-SA"/>
-        </w:rPr>
-        <w:t>.</w:t>
-      </w:r>
-    </w:p>
-    <w:p>
-      <w:pPr>
-        <w:pStyle w:val="EDBTXTNormalWebBlackCharChar1"/>
-        <w:numPr>
-          <w:ilvl w:val="0"/>
-          <w:numId w:val="2"/>
-        </w:numPr>
-        <w:tabs>
-          <w:tab w:val="left" w:pos="720"/>
-        </w:tabs>
-        <w:spacing w:before="0" w:after="0"/>
-        <w:rPr>
-          <w:lang w:eastAsia="ar-SA"/>
-        </w:rPr>
-      </w:pPr>
-      <w:r>
-        <w:rPr>
-          <w:lang w:eastAsia="ar-SA"/>
-        </w:rPr>
-        <w:t>The .NET Connector is now based on .NET Framework version 4.5.1. If there are existing applications based on .NET Framework 4.5, they need to be upgraded to 4.5.1.</w:t>
-      </w:r>
-    </w:p>
-    <w:p>
-      <w:pPr>
-        <w:pStyle w:val="EDBTXTNormalWebBlackCharChar0"/>
-      </w:pPr>
-    </w:p>
-    <w:p>
-      <w:pPr>
-        <w:pStyle w:val="Heading2"/>
-      </w:pPr>
-      <w:bookmarkStart w:id="4" w:name="_Ref103071763"/>
-      <w:bookmarkStart w:id="5" w:name="_Ref103071794"/>
-      <w:bookmarkStart w:id="6" w:name="_Ref103073047"/>
-      <w:bookmarkStart w:id="7" w:name="_Ref103073090"/>
-      <w:bookmarkStart w:id="8" w:name="_Toc490824096"/>
-      <w:r>
-        <w:t>Typographical Conventions Used in this Guide</w:t>
-      </w:r>
       <w:bookmarkEnd w:id="4"/>
       <w:bookmarkEnd w:id="5"/>
       <w:bookmarkEnd w:id="6"/>
       <w:bookmarkEnd w:id="7"/>
+      <w:r>
+        <w:lastRenderedPageBreak/>
+        <w:t>Typographical Conventions Used in this Guide</w:t>
+      </w:r>
       <w:bookmarkEnd w:id="8"/>
+      <w:bookmarkEnd w:id="9"/>
+      <w:bookmarkEnd w:id="10"/>
+      <w:bookmarkEnd w:id="11"/>
+      <w:bookmarkEnd w:id="12"/>
     </w:p>
     <w:p>
       <w:pPr>
@@ -3322,19 +3059,19 @@
         </w:rPr>
         <w:t>”.</w:t>
       </w:r>
-      <w:bookmarkStart w:id="9" w:name="_First_level_Heading"/>
-      <w:bookmarkEnd w:id="9"/>
+      <w:bookmarkStart w:id="13" w:name="_First_level_Heading"/>
+      <w:bookmarkEnd w:id="13"/>
     </w:p>
     <w:p>
       <w:pPr>
         <w:pStyle w:val="Heading1"/>
       </w:pPr>
-      <w:bookmarkStart w:id="10" w:name="_Toc490824097"/>
+      <w:bookmarkStart w:id="14" w:name="_Toc490831605"/>
       <w:r>
         <w:lastRenderedPageBreak/>
         <w:t>The Advanced Server .NET Connector - Overview</w:t>
       </w:r>
-      <w:bookmarkEnd w:id="10"/>
+      <w:bookmarkEnd w:id="14"/>
     </w:p>
     <w:p>
       <w:pPr>
@@ -3395,11 +3132,11 @@
       <w:pPr>
         <w:pStyle w:val="Heading2"/>
       </w:pPr>
-      <w:bookmarkStart w:id="11" w:name="_Toc490824098"/>
+      <w:bookmarkStart w:id="15" w:name="_Toc490831606"/>
       <w:r>
         <w:t>The .NET Class Hierarchy</w:t>
       </w:r>
-      <w:bookmarkEnd w:id="11"/>
+      <w:bookmarkEnd w:id="15"/>
     </w:p>
     <w:p>
       <w:pPr>
@@ -3682,12 +3419,12 @@
       <w:pPr>
         <w:pStyle w:val="Heading2"/>
       </w:pPr>
-      <w:bookmarkStart w:id="12" w:name="_Toc490824099"/>
+      <w:bookmarkStart w:id="16" w:name="_Toc490831607"/>
       <w:r>
         <w:lastRenderedPageBreak/>
         <w:t>Installing the .NET Connector</w:t>
       </w:r>
-      <w:bookmarkEnd w:id="12"/>
+      <w:bookmarkEnd w:id="16"/>
     </w:p>
     <w:p>
       <w:pPr>
@@ -3746,7 +3483,7 @@
           <w:noProof/>
         </w:rPr>
         <w:drawing>
-          <wp:inline distT="0" distB="0" distL="0" distR="0" wp14:anchorId="1579A7E1" wp14:editId="772A0F78">
+          <wp:inline distT="0" distB="0" distL="0" distR="0" wp14:anchorId="09136DB8" wp14:editId="4964EB3C">
             <wp:extent cx="4114800" cy="2728253"/>
             <wp:effectExtent l="0" t="0" r="0" b="0"/>
             <wp:docPr id="9" name="Picture 9"/>
@@ -3930,7 +3667,7 @@
         </w:rPr>
         <w:lastRenderedPageBreak/>
         <w:drawing>
-          <wp:inline distT="0" distB="0" distL="0" distR="0" wp14:anchorId="23A0594B" wp14:editId="598E5EE6">
+          <wp:inline distT="0" distB="0" distL="0" distR="0" wp14:anchorId="3FA129E6" wp14:editId="24D132E0">
             <wp:extent cx="3886200" cy="3037805"/>
             <wp:effectExtent l="0" t="0" r="0" b="0"/>
             <wp:docPr id="2" name="Picture 2"/>
@@ -4032,7 +3769,7 @@
           <w:noProof/>
         </w:rPr>
         <w:drawing>
-          <wp:inline distT="0" distB="0" distL="0" distR="0" wp14:anchorId="45DB706D" wp14:editId="0E74DB65">
+          <wp:inline distT="0" distB="0" distL="0" distR="0" wp14:anchorId="08997872" wp14:editId="02AE6251">
             <wp:extent cx="3886200" cy="3046927"/>
             <wp:effectExtent l="0" t="0" r="0" b="1270"/>
             <wp:docPr id="3" name="Picture 3"/>
@@ -4159,7 +3896,7 @@
         </w:rPr>
         <w:lastRenderedPageBreak/>
         <w:drawing>
-          <wp:inline distT="0" distB="0" distL="0" distR="0" wp14:anchorId="34116458" wp14:editId="1A4355B8">
+          <wp:inline distT="0" distB="0" distL="0" distR="0" wp14:anchorId="76FE7A0A" wp14:editId="1B9CCFD1">
             <wp:extent cx="4114800" cy="3217552"/>
             <wp:effectExtent l="0" t="0" r="0" b="1905"/>
             <wp:docPr id="4" name="Picture 4"/>
@@ -4294,7 +4031,7 @@
           <w:noProof/>
         </w:rPr>
         <w:drawing>
-          <wp:inline distT="0" distB="0" distL="0" distR="0" wp14:anchorId="243C2DD7" wp14:editId="33B75B36">
+          <wp:inline distT="0" distB="0" distL="0" distR="0" wp14:anchorId="69DD4AFB" wp14:editId="69927904">
             <wp:extent cx="4114800" cy="3194511"/>
             <wp:effectExtent l="0" t="0" r="0" b="6350"/>
             <wp:docPr id="5" name="Picture 5"/>
@@ -4456,7 +4193,7 @@
           <w:noProof/>
         </w:rPr>
         <w:drawing>
-          <wp:inline distT="0" distB="0" distL="0" distR="0" wp14:anchorId="1C32F2BF" wp14:editId="699751D7">
+          <wp:inline distT="0" distB="0" distL="0" distR="0" wp14:anchorId="333975A1" wp14:editId="3E627FE6">
             <wp:extent cx="3790950" cy="1619051"/>
             <wp:effectExtent l="0" t="0" r="0" b="635"/>
             <wp:docPr id="12" name="Picture 12" descr="C:\Users\susan\AppData\Local\Temp\vmware-susan\VMwareDnD\7412d23f\Screen Shot 2016-07-11 at 4.50.20 PM.png"/>
@@ -4604,7 +4341,7 @@
           <w:noProof/>
         </w:rPr>
         <w:drawing>
-          <wp:inline distT="0" distB="0" distL="0" distR="0" wp14:anchorId="6D2B97BE" wp14:editId="3C6950C8">
+          <wp:inline distT="0" distB="0" distL="0" distR="0" wp14:anchorId="63D16F4C" wp14:editId="74A7A128">
             <wp:extent cx="4114800" cy="3004331"/>
             <wp:effectExtent l="0" t="0" r="0" b="5715"/>
             <wp:docPr id="1" name="Picture 1"/>
@@ -4697,14 +4434,14 @@
       <w:pPr>
         <w:pStyle w:val="Heading1"/>
       </w:pPr>
-      <w:bookmarkStart w:id="13" w:name="_Ref456012125"/>
-      <w:bookmarkStart w:id="14" w:name="_Toc490824100"/>
+      <w:bookmarkStart w:id="17" w:name="_Ref456012125"/>
+      <w:bookmarkStart w:id="18" w:name="_Toc490831608"/>
       <w:r>
         <w:lastRenderedPageBreak/>
         <w:t>Configuring the .NET Connector</w:t>
       </w:r>
-      <w:bookmarkEnd w:id="13"/>
-      <w:bookmarkEnd w:id="14"/>
+      <w:bookmarkEnd w:id="17"/>
+      <w:bookmarkEnd w:id="18"/>
     </w:p>
     <w:p>
       <w:pPr>
@@ -4869,13 +4606,13 @@
       <w:pPr>
         <w:pStyle w:val="Heading2"/>
       </w:pPr>
-      <w:bookmarkStart w:id="15" w:name="_Ref477525249"/>
-      <w:bookmarkStart w:id="16" w:name="_Toc490824101"/>
+      <w:bookmarkStart w:id="19" w:name="_Ref477525249"/>
+      <w:bookmarkStart w:id="20" w:name="_Toc490831609"/>
       <w:r>
         <w:t>General Instructions</w:t>
       </w:r>
-      <w:bookmarkEnd w:id="15"/>
-      <w:bookmarkEnd w:id="16"/>
+      <w:bookmarkEnd w:id="19"/>
+      <w:bookmarkEnd w:id="20"/>
     </w:p>
     <w:p>
       <w:pPr>
@@ -5136,11 +4873,11 @@
       <w:pPr>
         <w:pStyle w:val="Heading2"/>
       </w:pPr>
-      <w:bookmarkStart w:id="17" w:name="_Toc490824102"/>
+      <w:bookmarkStart w:id="21" w:name="_Toc490831610"/>
       <w:r>
         <w:t>.NET Framework 4.0</w:t>
       </w:r>
-      <w:bookmarkEnd w:id="17"/>
+      <w:bookmarkEnd w:id="21"/>
     </w:p>
     <w:p>
       <w:pPr>
@@ -5330,14 +5067,14 @@
       <w:pPr>
         <w:pStyle w:val="Heading2"/>
       </w:pPr>
-      <w:bookmarkStart w:id="18" w:name="_Toc490824103"/>
+      <w:bookmarkStart w:id="22" w:name="_Toc490831611"/>
       <w:r>
         <w:t>.NET Framework 4.5</w:t>
       </w:r>
       <w:r>
         <w:t>.1</w:t>
       </w:r>
-      <w:bookmarkEnd w:id="18"/>
+      <w:bookmarkEnd w:id="22"/>
     </w:p>
     <w:p>
       <w:pPr>
@@ -5530,13 +5267,13 @@
       <w:pPr>
         <w:pStyle w:val="Heading2"/>
       </w:pPr>
-      <w:bookmarkStart w:id="19" w:name="_Ref477527440"/>
-      <w:bookmarkStart w:id="20" w:name="_Toc490824104"/>
+      <w:bookmarkStart w:id="23" w:name="_Ref477527440"/>
+      <w:bookmarkStart w:id="24" w:name="_Toc490831612"/>
       <w:r>
         <w:t>Entity Framework 6</w:t>
       </w:r>
-      <w:bookmarkEnd w:id="19"/>
-      <w:bookmarkEnd w:id="20"/>
+      <w:bookmarkEnd w:id="23"/>
+      <w:bookmarkEnd w:id="24"/>
     </w:p>
     <w:p>
       <w:pPr>
@@ -6294,13 +6031,13 @@
       <w:pPr>
         <w:pStyle w:val="Heading2"/>
       </w:pPr>
-      <w:bookmarkStart w:id="21" w:name="_Ref477528081"/>
-      <w:bookmarkStart w:id="22" w:name="_Toc490824105"/>
+      <w:bookmarkStart w:id="25" w:name="_Ref477528081"/>
+      <w:bookmarkStart w:id="26" w:name="_Toc490831613"/>
       <w:r>
         <w:t>EDBDdexProvider for Visual Studio</w:t>
       </w:r>
-      <w:bookmarkEnd w:id="21"/>
-      <w:bookmarkEnd w:id="22"/>
+      <w:bookmarkEnd w:id="25"/>
+      <w:bookmarkEnd w:id="26"/>
     </w:p>
     <w:p>
       <w:pPr>
@@ -7437,14 +7174,14 @@
       <w:pPr>
         <w:pStyle w:val="Heading1"/>
       </w:pPr>
-      <w:bookmarkStart w:id="23" w:name="_Ref482087625"/>
-      <w:bookmarkStart w:id="24" w:name="_Toc490824106"/>
+      <w:bookmarkStart w:id="27" w:name="_Ref482087625"/>
+      <w:bookmarkStart w:id="28" w:name="_Toc490831614"/>
       <w:r>
         <w:lastRenderedPageBreak/>
         <w:t>Using the .NET Connector</w:t>
       </w:r>
-      <w:bookmarkEnd w:id="23"/>
-      <w:bookmarkEnd w:id="24"/>
+      <w:bookmarkEnd w:id="27"/>
+      <w:bookmarkEnd w:id="28"/>
     </w:p>
     <w:p>
       <w:pPr>
@@ -7692,11 +7429,11 @@
       <w:pPr>
         <w:pStyle w:val="Heading2"/>
       </w:pPr>
-      <w:bookmarkStart w:id="25" w:name="_Toc490824107"/>
+      <w:bookmarkStart w:id="29" w:name="_Toc490831615"/>
       <w:r>
         <w:t>Opening a Database Connection</w:t>
       </w:r>
-      <w:bookmarkEnd w:id="25"/>
+      <w:bookmarkEnd w:id="29"/>
     </w:p>
     <w:p>
       <w:pPr>
@@ -7909,13 +7646,13 @@
       <w:pPr>
         <w:pStyle w:val="Heading3"/>
       </w:pPr>
-      <w:bookmarkStart w:id="26" w:name="_Ref482087661"/>
-      <w:bookmarkStart w:id="27" w:name="_Toc490824108"/>
+      <w:bookmarkStart w:id="30" w:name="_Ref482087661"/>
+      <w:bookmarkStart w:id="31" w:name="_Toc490831616"/>
       <w:r>
         <w:t>Connection String Parameters</w:t>
       </w:r>
-      <w:bookmarkEnd w:id="26"/>
-      <w:bookmarkEnd w:id="27"/>
+      <w:bookmarkEnd w:id="30"/>
+      <w:bookmarkEnd w:id="31"/>
       <w:r>
         <w:t xml:space="preserve"> </w:t>
       </w:r>
@@ -8974,14 +8711,14 @@
       <w:pPr>
         <w:pStyle w:val="Heading3"/>
       </w:pPr>
-      <w:bookmarkStart w:id="28" w:name="_Toc490824109"/>
+      <w:bookmarkStart w:id="32" w:name="_Toc490831617"/>
       <w:r>
         <w:t xml:space="preserve">Example - </w:t>
       </w:r>
       <w:r>
         <w:t>Opening a Database Connection using ASP.NET</w:t>
       </w:r>
-      <w:bookmarkEnd w:id="28"/>
+      <w:bookmarkEnd w:id="32"/>
       <w:r>
         <w:t xml:space="preserve"> </w:t>
       </w:r>
@@ -9394,7 +9131,7 @@
           <w:noProof/>
         </w:rPr>
         <w:drawing>
-          <wp:inline distT="0" distB="0" distL="0" distR="0" wp14:anchorId="34E18356" wp14:editId="4A78392F">
+          <wp:inline distT="0" distB="0" distL="0" distR="0" wp14:anchorId="5DDE609C" wp14:editId="372D1BDC">
             <wp:extent cx="5480050" cy="1663700"/>
             <wp:effectExtent l="0" t="0" r="6350" b="0"/>
             <wp:docPr id="7" name="Picture 7" descr="Screen Shot 2014-06-26 at 8"/>
@@ -9452,14 +9189,14 @@
       <w:pPr>
         <w:pStyle w:val="Heading3"/>
       </w:pPr>
-      <w:bookmarkStart w:id="29" w:name="_Toc490824110"/>
+      <w:bookmarkStart w:id="33" w:name="_Toc490831618"/>
       <w:r>
         <w:t xml:space="preserve">Example - </w:t>
       </w:r>
       <w:r>
         <w:t>Opening a Database Connection from a Console Application</w:t>
       </w:r>
-      <w:bookmarkEnd w:id="29"/>
+      <w:bookmarkEnd w:id="33"/>
     </w:p>
     <w:p>
       <w:pPr>
@@ -10065,14 +9802,14 @@
       <w:pPr>
         <w:pStyle w:val="Heading3"/>
       </w:pPr>
-      <w:bookmarkStart w:id="30" w:name="_Toc490824111"/>
+      <w:bookmarkStart w:id="34" w:name="_Toc490831619"/>
       <w:r>
         <w:t xml:space="preserve">Example - </w:t>
       </w:r>
       <w:r>
         <w:t>Opening a Database Connection from a Windows Form Application</w:t>
       </w:r>
-      <w:bookmarkEnd w:id="30"/>
+      <w:bookmarkEnd w:id="34"/>
     </w:p>
     <w:p>
       <w:pPr>
@@ -10862,7 +10599,7 @@
           <w:noProof/>
         </w:rPr>
         <w:drawing>
-          <wp:inline distT="0" distB="0" distL="0" distR="0" wp14:anchorId="013689BC" wp14:editId="244E939E">
+          <wp:inline distT="0" distB="0" distL="0" distR="0" wp14:anchorId="5892A2EF" wp14:editId="0C8186C4">
             <wp:extent cx="2120900" cy="2120900"/>
             <wp:effectExtent l="0" t="0" r="0" b="0"/>
             <wp:docPr id="8" name="Picture 8" descr="dialog"/>
@@ -10974,12 +10711,12 @@
       <w:pPr>
         <w:pStyle w:val="Heading2"/>
       </w:pPr>
-      <w:bookmarkStart w:id="31" w:name="_Toc490824112"/>
+      <w:bookmarkStart w:id="35" w:name="_Toc490831620"/>
       <w:r>
         <w:lastRenderedPageBreak/>
         <w:t>Retrieving Database Records</w:t>
       </w:r>
-      <w:bookmarkEnd w:id="31"/>
+      <w:bookmarkEnd w:id="35"/>
     </w:p>
     <w:p>
       <w:pPr>
@@ -12058,14 +11795,14 @@
       <w:pPr>
         <w:pStyle w:val="Heading3"/>
       </w:pPr>
-      <w:bookmarkStart w:id="32" w:name="_Toc490824113"/>
+      <w:bookmarkStart w:id="36" w:name="_Toc490831621"/>
       <w:r>
         <w:t>Retr</w:t>
       </w:r>
       <w:r>
         <w:t>ieving a Single Database Record</w:t>
       </w:r>
-      <w:bookmarkEnd w:id="32"/>
+      <w:bookmarkEnd w:id="36"/>
     </w:p>
     <w:p>
       <w:pPr>
@@ -12592,12 +12329,12 @@
       <w:pPr>
         <w:pStyle w:val="Heading2"/>
       </w:pPr>
-      <w:bookmarkStart w:id="33" w:name="_Toc490824114"/>
+      <w:bookmarkStart w:id="37" w:name="_Toc490831622"/>
       <w:r>
         <w:lastRenderedPageBreak/>
         <w:t>Parameterized Queries</w:t>
       </w:r>
-      <w:bookmarkEnd w:id="33"/>
+      <w:bookmarkEnd w:id="37"/>
     </w:p>
     <w:p>
       <w:pPr>
@@ -13273,12 +13010,12 @@
       <w:pPr>
         <w:pStyle w:val="Heading2"/>
       </w:pPr>
-      <w:bookmarkStart w:id="34" w:name="_Toc490824115"/>
+      <w:bookmarkStart w:id="38" w:name="_Toc490831623"/>
       <w:r>
         <w:lastRenderedPageBreak/>
         <w:t>Inserting Records in a Database</w:t>
       </w:r>
-      <w:bookmarkEnd w:id="34"/>
+      <w:bookmarkEnd w:id="38"/>
     </w:p>
     <w:p>
       <w:pPr>
@@ -14119,12 +13856,12 @@
       <w:pPr>
         <w:pStyle w:val="Heading2"/>
       </w:pPr>
-      <w:bookmarkStart w:id="35" w:name="_Toc490824116"/>
+      <w:bookmarkStart w:id="39" w:name="_Toc490831624"/>
       <w:r>
         <w:lastRenderedPageBreak/>
         <w:t>Deleting Records in a Database</w:t>
       </w:r>
-      <w:bookmarkEnd w:id="35"/>
+      <w:bookmarkEnd w:id="39"/>
     </w:p>
     <w:p>
       <w:pPr>
@@ -14961,12 +14698,12 @@
       <w:pPr>
         <w:pStyle w:val="Heading2"/>
       </w:pPr>
-      <w:bookmarkStart w:id="36" w:name="_Toc490824117"/>
+      <w:bookmarkStart w:id="40" w:name="_Toc490831625"/>
       <w:r>
         <w:lastRenderedPageBreak/>
         <w:t>Using SPL Stored Procedures in your .NET Application</w:t>
       </w:r>
-      <w:bookmarkEnd w:id="36"/>
+      <w:bookmarkEnd w:id="40"/>
     </w:p>
     <w:p>
       <w:pPr>
@@ -15237,7 +14974,7 @@
       <w:pPr>
         <w:pStyle w:val="Heading3"/>
       </w:pPr>
-      <w:bookmarkStart w:id="37" w:name="_Toc490824118"/>
+      <w:bookmarkStart w:id="41" w:name="_Toc490831626"/>
       <w:r>
         <w:t>Example - Executing</w:t>
       </w:r>
@@ -15247,7 +14984,7 @@
       <w:r>
         <w:t xml:space="preserve"> without Parameters</w:t>
       </w:r>
-      <w:bookmarkEnd w:id="37"/>
+      <w:bookmarkEnd w:id="41"/>
     </w:p>
     <w:p>
       <w:pPr>
@@ -16166,14 +15903,14 @@
       <w:pPr>
         <w:pStyle w:val="Heading3"/>
       </w:pPr>
-      <w:bookmarkStart w:id="38" w:name="_Toc490824119"/>
+      <w:bookmarkStart w:id="42" w:name="_Toc490831627"/>
       <w:r>
         <w:t xml:space="preserve">Example - </w:t>
       </w:r>
       <w:r>
         <w:t>Executing a Stored Procedure with IN Parameters</w:t>
       </w:r>
-      <w:bookmarkEnd w:id="38"/>
+      <w:bookmarkEnd w:id="42"/>
     </w:p>
     <w:p>
       <w:pPr>
@@ -17962,7 +17699,7 @@
       <w:pPr>
         <w:pStyle w:val="Heading3"/>
       </w:pPr>
-      <w:bookmarkStart w:id="39" w:name="_Toc490824120"/>
+      <w:bookmarkStart w:id="43" w:name="_Toc490831628"/>
       <w:r>
         <w:t xml:space="preserve">Example - </w:t>
       </w:r>
@@ -17981,7 +17718,7 @@
       <w:r>
         <w:t xml:space="preserve"> Parameters</w:t>
       </w:r>
-      <w:bookmarkEnd w:id="39"/>
+      <w:bookmarkEnd w:id="43"/>
     </w:p>
     <w:p>
       <w:pPr>
@@ -20196,7 +19933,7 @@
       <w:pPr>
         <w:pStyle w:val="Heading2"/>
       </w:pPr>
-      <w:bookmarkStart w:id="40" w:name="_Toc490824121"/>
+      <w:bookmarkStart w:id="44" w:name="_Toc490831629"/>
       <w:r>
         <w:lastRenderedPageBreak/>
         <w:t xml:space="preserve">Using </w:t>
@@ -20207,7 +19944,7 @@
       <w:r>
         <w:t xml:space="preserve"> in a .NET Application</w:t>
       </w:r>
-      <w:bookmarkEnd w:id="40"/>
+      <w:bookmarkEnd w:id="44"/>
     </w:p>
     <w:p>
       <w:pPr>
@@ -31469,7 +31206,7 @@
 </file>
 
 <file path=customXml/itemProps1.xml><?xml version="1.0" encoding="utf-8"?>
-<ds:datastoreItem xmlns:ds="http://schemas.openxmlformats.org/officeDocument/2006/customXml" ds:itemID="{9C08E24A-58FB-4A37-BA58-D77EC0C94777}">
+<ds:datastoreItem xmlns:ds="http://schemas.openxmlformats.org/officeDocument/2006/customXml" ds:itemID="{58F966F0-A332-49AA-AF12-F9FCD411E67E}">
   <ds:schemaRefs>
     <ds:schemaRef ds:uri="http://schemas.openxmlformats.org/officeDocument/2006/bibliography"/>
   </ds:schemaRefs>

</xml_diff>

<commit_message>
EPAS .Net Connector Guide 10.0.1 - RM 42691 VSIX directory location added
</commit_message>
<xml_diff>
--- a/edb_docs/EDB_Postgres_Advanced_Server_NET_Connector_Guide.docx
+++ b/edb_docs/EDB_Postgres_Advanced_Server_NET_Connector_Guide.docx
@@ -12,7 +12,7 @@
           <w:noProof/>
         </w:rPr>
         <w:drawing>
-          <wp:inline distT="0" distB="0" distL="0" distR="0" wp14:anchorId="6DC60BB5" wp14:editId="61BC1F8E">
+          <wp:inline distT="0" distB="0" distL="0" distR="0" wp14:anchorId="3EA398AC" wp14:editId="2524D64D">
             <wp:extent cx="2380711" cy="1371599"/>
             <wp:effectExtent l="0" t="0" r="635" b="635"/>
             <wp:docPr id="6" name="Picture 6"/>
@@ -69,16 +69,16 @@
       <w:pPr>
         <w:pStyle w:val="EDBTXTNormalWebBlackCharChar0"/>
       </w:pPr>
-    </w:p>
-    <w:p>
-      <w:pPr>
-        <w:pStyle w:val="EDBTXTNormalWebBlackCharChar0"/>
-        <w:rPr>
-          <w:color w:val="auto"/>
-        </w:rPr>
-      </w:pPr>
       <w:bookmarkStart w:id="0" w:name="_GoBack"/>
       <w:bookmarkEnd w:id="0"/>
+    </w:p>
+    <w:p>
+      <w:pPr>
+        <w:pStyle w:val="EDBTXTNormalWebBlackCharChar0"/>
+        <w:rPr>
+          <w:color w:val="auto"/>
+        </w:rPr>
+      </w:pPr>
     </w:p>
     <w:p>
       <w:pPr>
@@ -182,7 +182,10 @@
         <w:t xml:space="preserve">Connectors Release </w:t>
       </w:r>
       <w:r>
-        <w:t>10.0.0</w:t>
+        <w:t>10.0.</w:t>
+      </w:r>
+      <w:r>
+        <w:t>1</w:t>
       </w:r>
       <w:r>
         <w:br/>
@@ -225,7 +228,7 @@
         <w:pStyle w:val="EDBCoverProductDate"/>
       </w:pPr>
       <w:r>
-        <w:t>August 18</w:t>
+        <w:t>November 6</w:t>
       </w:r>
       <w:r>
         <w:t>, 2017</w:t>
@@ -526,7 +529,7 @@
       <w:r>
         <w:fldChar w:fldCharType="separate"/>
       </w:r>
-      <w:hyperlink w:anchor="_Toc490831597" w:history="1">
+      <w:hyperlink w:anchor="_Toc497743210" w:history="1">
         <w:r>
           <w:rPr>
             <w:rStyle w:val="Hyperlink"/>
@@ -566,7 +569,7 @@
           <w:rPr>
             <w:noProof/>
           </w:rPr>
-          <w:instrText xml:space="preserve"> PAGEREF _Toc490831597 \h </w:instrText>
+          <w:instrText xml:space="preserve"> PAGEREF _Toc497743210 \h </w:instrText>
         </w:r>
         <w:r>
           <w:rPr>
@@ -607,7 +610,7 @@
           <w:szCs w:val="22"/>
         </w:rPr>
       </w:pPr>
-      <w:hyperlink w:anchor="_Toc490831604" w:history="1">
+      <w:hyperlink w:anchor="_Toc497743211" w:history="1">
         <w:r>
           <w:rPr>
             <w:rStyle w:val="Hyperlink"/>
@@ -647,7 +650,7 @@
           <w:rPr>
             <w:noProof/>
           </w:rPr>
-          <w:instrText xml:space="preserve"> PAGEREF _Toc490831604 \h </w:instrText>
+          <w:instrText xml:space="preserve"> PAGEREF _Toc497743211 \h </w:instrText>
         </w:r>
         <w:r>
           <w:rPr>
@@ -688,7 +691,7 @@
           <w:szCs w:val="22"/>
         </w:rPr>
       </w:pPr>
-      <w:hyperlink w:anchor="_Toc490831605" w:history="1">
+      <w:hyperlink w:anchor="_Toc497743212" w:history="1">
         <w:r>
           <w:rPr>
             <w:rStyle w:val="Hyperlink"/>
@@ -728,7 +731,7 @@
           <w:rPr>
             <w:noProof/>
           </w:rPr>
-          <w:instrText xml:space="preserve"> PAGEREF _Toc490831605 \h </w:instrText>
+          <w:instrText xml:space="preserve"> PAGEREF _Toc497743212 \h </w:instrText>
         </w:r>
         <w:r>
           <w:rPr>
@@ -769,7 +772,7 @@
           <w:szCs w:val="22"/>
         </w:rPr>
       </w:pPr>
-      <w:hyperlink w:anchor="_Toc490831606" w:history="1">
+      <w:hyperlink w:anchor="_Toc497743213" w:history="1">
         <w:r>
           <w:rPr>
             <w:rStyle w:val="Hyperlink"/>
@@ -809,7 +812,7 @@
           <w:rPr>
             <w:noProof/>
           </w:rPr>
-          <w:instrText xml:space="preserve"> PAGEREF _Toc490831606 \h </w:instrText>
+          <w:instrText xml:space="preserve"> PAGEREF _Toc497743213 \h </w:instrText>
         </w:r>
         <w:r>
           <w:rPr>
@@ -850,7 +853,7 @@
           <w:szCs w:val="22"/>
         </w:rPr>
       </w:pPr>
-      <w:hyperlink w:anchor="_Toc490831607" w:history="1">
+      <w:hyperlink w:anchor="_Toc497743214" w:history="1">
         <w:r>
           <w:rPr>
             <w:rStyle w:val="Hyperlink"/>
@@ -890,7 +893,7 @@
           <w:rPr>
             <w:noProof/>
           </w:rPr>
-          <w:instrText xml:space="preserve"> PAGEREF _Toc490831607 \h </w:instrText>
+          <w:instrText xml:space="preserve"> PAGEREF _Toc497743214 \h </w:instrText>
         </w:r>
         <w:r>
           <w:rPr>
@@ -931,7 +934,7 @@
           <w:szCs w:val="22"/>
         </w:rPr>
       </w:pPr>
-      <w:hyperlink w:anchor="_Toc490831608" w:history="1">
+      <w:hyperlink w:anchor="_Toc497743215" w:history="1">
         <w:r>
           <w:rPr>
             <w:rStyle w:val="Hyperlink"/>
@@ -971,7 +974,7 @@
           <w:rPr>
             <w:noProof/>
           </w:rPr>
-          <w:instrText xml:space="preserve"> PAGEREF _Toc490831608 \h </w:instrText>
+          <w:instrText xml:space="preserve"> PAGEREF _Toc497743215 \h </w:instrText>
         </w:r>
         <w:r>
           <w:rPr>
@@ -1012,7 +1015,7 @@
           <w:szCs w:val="22"/>
         </w:rPr>
       </w:pPr>
-      <w:hyperlink w:anchor="_Toc490831609" w:history="1">
+      <w:hyperlink w:anchor="_Toc497743216" w:history="1">
         <w:r>
           <w:rPr>
             <w:rStyle w:val="Hyperlink"/>
@@ -1052,7 +1055,7 @@
           <w:rPr>
             <w:noProof/>
           </w:rPr>
-          <w:instrText xml:space="preserve"> PAGEREF _Toc490831609 \h </w:instrText>
+          <w:instrText xml:space="preserve"> PAGEREF _Toc497743216 \h </w:instrText>
         </w:r>
         <w:r>
           <w:rPr>
@@ -1093,7 +1096,7 @@
           <w:szCs w:val="22"/>
         </w:rPr>
       </w:pPr>
-      <w:hyperlink w:anchor="_Toc490831610" w:history="1">
+      <w:hyperlink w:anchor="_Toc497743217" w:history="1">
         <w:r>
           <w:rPr>
             <w:rStyle w:val="Hyperlink"/>
@@ -1133,7 +1136,7 @@
           <w:rPr>
             <w:noProof/>
           </w:rPr>
-          <w:instrText xml:space="preserve"> PAGEREF _Toc490831610 \h </w:instrText>
+          <w:instrText xml:space="preserve"> PAGEREF _Toc497743217 \h </w:instrText>
         </w:r>
         <w:r>
           <w:rPr>
@@ -1174,7 +1177,7 @@
           <w:szCs w:val="22"/>
         </w:rPr>
       </w:pPr>
-      <w:hyperlink w:anchor="_Toc490831611" w:history="1">
+      <w:hyperlink w:anchor="_Toc497743218" w:history="1">
         <w:r>
           <w:rPr>
             <w:rStyle w:val="Hyperlink"/>
@@ -1214,7 +1217,7 @@
           <w:rPr>
             <w:noProof/>
           </w:rPr>
-          <w:instrText xml:space="preserve"> PAGEREF _Toc490831611 \h </w:instrText>
+          <w:instrText xml:space="preserve"> PAGEREF _Toc497743218 \h </w:instrText>
         </w:r>
         <w:r>
           <w:rPr>
@@ -1255,7 +1258,7 @@
           <w:szCs w:val="22"/>
         </w:rPr>
       </w:pPr>
-      <w:hyperlink w:anchor="_Toc490831612" w:history="1">
+      <w:hyperlink w:anchor="_Toc497743219" w:history="1">
         <w:r>
           <w:rPr>
             <w:rStyle w:val="Hyperlink"/>
@@ -1295,7 +1298,7 @@
           <w:rPr>
             <w:noProof/>
           </w:rPr>
-          <w:instrText xml:space="preserve"> PAGEREF _Toc490831612 \h </w:instrText>
+          <w:instrText xml:space="preserve"> PAGEREF _Toc497743219 \h </w:instrText>
         </w:r>
         <w:r>
           <w:rPr>
@@ -1336,7 +1339,7 @@
           <w:szCs w:val="22"/>
         </w:rPr>
       </w:pPr>
-      <w:hyperlink w:anchor="_Toc490831613" w:history="1">
+      <w:hyperlink w:anchor="_Toc497743220" w:history="1">
         <w:r>
           <w:rPr>
             <w:rStyle w:val="Hyperlink"/>
@@ -1376,7 +1379,7 @@
           <w:rPr>
             <w:noProof/>
           </w:rPr>
-          <w:instrText xml:space="preserve"> PAGEREF _Toc490831613 \h </w:instrText>
+          <w:instrText xml:space="preserve"> PAGEREF _Toc497743220 \h </w:instrText>
         </w:r>
         <w:r>
           <w:rPr>
@@ -1417,7 +1420,7 @@
           <w:szCs w:val="22"/>
         </w:rPr>
       </w:pPr>
-      <w:hyperlink w:anchor="_Toc490831614" w:history="1">
+      <w:hyperlink w:anchor="_Toc497743221" w:history="1">
         <w:r>
           <w:rPr>
             <w:rStyle w:val="Hyperlink"/>
@@ -1457,7 +1460,7 @@
           <w:rPr>
             <w:noProof/>
           </w:rPr>
-          <w:instrText xml:space="preserve"> PAGEREF _Toc490831614 \h </w:instrText>
+          <w:instrText xml:space="preserve"> PAGEREF _Toc497743221 \h </w:instrText>
         </w:r>
         <w:r>
           <w:rPr>
@@ -1498,7 +1501,7 @@
           <w:szCs w:val="22"/>
         </w:rPr>
       </w:pPr>
-      <w:hyperlink w:anchor="_Toc490831615" w:history="1">
+      <w:hyperlink w:anchor="_Toc497743222" w:history="1">
         <w:r>
           <w:rPr>
             <w:rStyle w:val="Hyperlink"/>
@@ -1538,7 +1541,7 @@
           <w:rPr>
             <w:noProof/>
           </w:rPr>
-          <w:instrText xml:space="preserve"> PAGEREF _Toc490831615 \h </w:instrText>
+          <w:instrText xml:space="preserve"> PAGEREF _Toc497743222 \h </w:instrText>
         </w:r>
         <w:r>
           <w:rPr>
@@ -1574,7 +1577,7 @@
           <w:szCs w:val="22"/>
         </w:rPr>
       </w:pPr>
-      <w:hyperlink w:anchor="_Toc490831616" w:history="1">
+      <w:hyperlink w:anchor="_Toc497743223" w:history="1">
         <w:r>
           <w:rPr>
             <w:rStyle w:val="Hyperlink"/>
@@ -1602,7 +1605,7 @@
           <w:fldChar w:fldCharType="begin"/>
         </w:r>
         <w:r>
-          <w:instrText xml:space="preserve"> PAGEREF _Toc490831616 \h </w:instrText>
+          <w:instrText xml:space="preserve"> PAGEREF _Toc497743223 \h </w:instrText>
         </w:r>
         <w:r>
           <w:fldChar w:fldCharType="separate"/>
@@ -1624,7 +1627,7 @@
           <w:szCs w:val="22"/>
         </w:rPr>
       </w:pPr>
-      <w:hyperlink w:anchor="_Toc490831617" w:history="1">
+      <w:hyperlink w:anchor="_Toc497743224" w:history="1">
         <w:r>
           <w:rPr>
             <w:rStyle w:val="Hyperlink"/>
@@ -1652,7 +1655,7 @@
           <w:fldChar w:fldCharType="begin"/>
         </w:r>
         <w:r>
-          <w:instrText xml:space="preserve"> PAGEREF _Toc490831617 \h </w:instrText>
+          <w:instrText xml:space="preserve"> PAGEREF _Toc497743224 \h </w:instrText>
         </w:r>
         <w:r>
           <w:fldChar w:fldCharType="separate"/>
@@ -1674,7 +1677,7 @@
           <w:szCs w:val="22"/>
         </w:rPr>
       </w:pPr>
-      <w:hyperlink w:anchor="_Toc490831618" w:history="1">
+      <w:hyperlink w:anchor="_Toc497743225" w:history="1">
         <w:r>
           <w:rPr>
             <w:rStyle w:val="Hyperlink"/>
@@ -1702,7 +1705,7 @@
           <w:fldChar w:fldCharType="begin"/>
         </w:r>
         <w:r>
-          <w:instrText xml:space="preserve"> PAGEREF _Toc490831618 \h </w:instrText>
+          <w:instrText xml:space="preserve"> PAGEREF _Toc497743225 \h </w:instrText>
         </w:r>
         <w:r>
           <w:fldChar w:fldCharType="separate"/>
@@ -1724,7 +1727,7 @@
           <w:szCs w:val="22"/>
         </w:rPr>
       </w:pPr>
-      <w:hyperlink w:anchor="_Toc490831619" w:history="1">
+      <w:hyperlink w:anchor="_Toc497743226" w:history="1">
         <w:r>
           <w:rPr>
             <w:rStyle w:val="Hyperlink"/>
@@ -1752,7 +1755,7 @@
           <w:fldChar w:fldCharType="begin"/>
         </w:r>
         <w:r>
-          <w:instrText xml:space="preserve"> PAGEREF _Toc490831619 \h </w:instrText>
+          <w:instrText xml:space="preserve"> PAGEREF _Toc497743226 \h </w:instrText>
         </w:r>
         <w:r>
           <w:fldChar w:fldCharType="separate"/>
@@ -1779,7 +1782,7 @@
           <w:szCs w:val="22"/>
         </w:rPr>
       </w:pPr>
-      <w:hyperlink w:anchor="_Toc490831620" w:history="1">
+      <w:hyperlink w:anchor="_Toc497743227" w:history="1">
         <w:r>
           <w:rPr>
             <w:rStyle w:val="Hyperlink"/>
@@ -1819,7 +1822,7 @@
           <w:rPr>
             <w:noProof/>
           </w:rPr>
-          <w:instrText xml:space="preserve"> PAGEREF _Toc490831620 \h </w:instrText>
+          <w:instrText xml:space="preserve"> PAGEREF _Toc497743227 \h </w:instrText>
         </w:r>
         <w:r>
           <w:rPr>
@@ -1855,7 +1858,7 @@
           <w:szCs w:val="22"/>
         </w:rPr>
       </w:pPr>
-      <w:hyperlink w:anchor="_Toc490831621" w:history="1">
+      <w:hyperlink w:anchor="_Toc497743228" w:history="1">
         <w:r>
           <w:rPr>
             <w:rStyle w:val="Hyperlink"/>
@@ -1883,7 +1886,7 @@
           <w:fldChar w:fldCharType="begin"/>
         </w:r>
         <w:r>
-          <w:instrText xml:space="preserve"> PAGEREF _Toc490831621 \h </w:instrText>
+          <w:instrText xml:space="preserve"> PAGEREF _Toc497743228 \h </w:instrText>
         </w:r>
         <w:r>
           <w:fldChar w:fldCharType="separate"/>
@@ -1910,7 +1913,7 @@
           <w:szCs w:val="22"/>
         </w:rPr>
       </w:pPr>
-      <w:hyperlink w:anchor="_Toc490831622" w:history="1">
+      <w:hyperlink w:anchor="_Toc497743229" w:history="1">
         <w:r>
           <w:rPr>
             <w:rStyle w:val="Hyperlink"/>
@@ -1950,7 +1953,7 @@
           <w:rPr>
             <w:noProof/>
           </w:rPr>
-          <w:instrText xml:space="preserve"> PAGEREF _Toc490831622 \h </w:instrText>
+          <w:instrText xml:space="preserve"> PAGEREF _Toc497743229 \h </w:instrText>
         </w:r>
         <w:r>
           <w:rPr>
@@ -1991,7 +1994,7 @@
           <w:szCs w:val="22"/>
         </w:rPr>
       </w:pPr>
-      <w:hyperlink w:anchor="_Toc490831623" w:history="1">
+      <w:hyperlink w:anchor="_Toc497743230" w:history="1">
         <w:r>
           <w:rPr>
             <w:rStyle w:val="Hyperlink"/>
@@ -2031,7 +2034,7 @@
           <w:rPr>
             <w:noProof/>
           </w:rPr>
-          <w:instrText xml:space="preserve"> PAGEREF _Toc490831623 \h </w:instrText>
+          <w:instrText xml:space="preserve"> PAGEREF _Toc497743230 \h </w:instrText>
         </w:r>
         <w:r>
           <w:rPr>
@@ -2072,7 +2075,7 @@
           <w:szCs w:val="22"/>
         </w:rPr>
       </w:pPr>
-      <w:hyperlink w:anchor="_Toc490831624" w:history="1">
+      <w:hyperlink w:anchor="_Toc497743231" w:history="1">
         <w:r>
           <w:rPr>
             <w:rStyle w:val="Hyperlink"/>
@@ -2112,7 +2115,7 @@
           <w:rPr>
             <w:noProof/>
           </w:rPr>
-          <w:instrText xml:space="preserve"> PAGEREF _Toc490831624 \h </w:instrText>
+          <w:instrText xml:space="preserve"> PAGEREF _Toc497743231 \h </w:instrText>
         </w:r>
         <w:r>
           <w:rPr>
@@ -2153,7 +2156,7 @@
           <w:szCs w:val="22"/>
         </w:rPr>
       </w:pPr>
-      <w:hyperlink w:anchor="_Toc490831625" w:history="1">
+      <w:hyperlink w:anchor="_Toc497743232" w:history="1">
         <w:r>
           <w:rPr>
             <w:rStyle w:val="Hyperlink"/>
@@ -2193,7 +2196,7 @@
           <w:rPr>
             <w:noProof/>
           </w:rPr>
-          <w:instrText xml:space="preserve"> PAGEREF _Toc490831625 \h </w:instrText>
+          <w:instrText xml:space="preserve"> PAGEREF _Toc497743232 \h </w:instrText>
         </w:r>
         <w:r>
           <w:rPr>
@@ -2229,7 +2232,7 @@
           <w:szCs w:val="22"/>
         </w:rPr>
       </w:pPr>
-      <w:hyperlink w:anchor="_Toc490831626" w:history="1">
+      <w:hyperlink w:anchor="_Toc497743233" w:history="1">
         <w:r>
           <w:rPr>
             <w:rStyle w:val="Hyperlink"/>
@@ -2257,7 +2260,7 @@
           <w:fldChar w:fldCharType="begin"/>
         </w:r>
         <w:r>
-          <w:instrText xml:space="preserve"> PAGEREF _Toc490831626 \h </w:instrText>
+          <w:instrText xml:space="preserve"> PAGEREF _Toc497743233 \h </w:instrText>
         </w:r>
         <w:r>
           <w:fldChar w:fldCharType="separate"/>
@@ -2279,7 +2282,7 @@
           <w:szCs w:val="22"/>
         </w:rPr>
       </w:pPr>
-      <w:hyperlink w:anchor="_Toc490831627" w:history="1">
+      <w:hyperlink w:anchor="_Toc497743234" w:history="1">
         <w:r>
           <w:rPr>
             <w:rStyle w:val="Hyperlink"/>
@@ -2307,7 +2310,7 @@
           <w:fldChar w:fldCharType="begin"/>
         </w:r>
         <w:r>
-          <w:instrText xml:space="preserve"> PAGEREF _Toc490831627 \h </w:instrText>
+          <w:instrText xml:space="preserve"> PAGEREF _Toc497743234 \h </w:instrText>
         </w:r>
         <w:r>
           <w:fldChar w:fldCharType="separate"/>
@@ -2329,7 +2332,7 @@
           <w:szCs w:val="22"/>
         </w:rPr>
       </w:pPr>
-      <w:hyperlink w:anchor="_Toc490831628" w:history="1">
+      <w:hyperlink w:anchor="_Toc497743235" w:history="1">
         <w:r>
           <w:rPr>
             <w:rStyle w:val="Hyperlink"/>
@@ -2357,7 +2360,7 @@
           <w:fldChar w:fldCharType="begin"/>
         </w:r>
         <w:r>
-          <w:instrText xml:space="preserve"> PAGEREF _Toc490831628 \h </w:instrText>
+          <w:instrText xml:space="preserve"> PAGEREF _Toc497743235 \h </w:instrText>
         </w:r>
         <w:r>
           <w:fldChar w:fldCharType="separate"/>
@@ -2384,7 +2387,7 @@
           <w:szCs w:val="22"/>
         </w:rPr>
       </w:pPr>
-      <w:hyperlink w:anchor="_Toc490831629" w:history="1">
+      <w:hyperlink w:anchor="_Toc497743236" w:history="1">
         <w:r>
           <w:rPr>
             <w:rStyle w:val="Hyperlink"/>
@@ -2424,7 +2427,7 @@
           <w:rPr>
             <w:noProof/>
           </w:rPr>
-          <w:instrText xml:space="preserve"> PAGEREF _Toc490831629 \h </w:instrText>
+          <w:instrText xml:space="preserve"> PAGEREF _Toc497743236 \h </w:instrText>
         </w:r>
         <w:r>
           <w:rPr>
@@ -2482,7 +2485,7 @@
       <w:pPr>
         <w:pStyle w:val="Heading1"/>
       </w:pPr>
-      <w:bookmarkStart w:id="1" w:name="_Toc490831597"/>
+      <w:bookmarkStart w:id="1" w:name="_Toc497743210"/>
       <w:r>
         <w:lastRenderedPageBreak/>
         <w:t>Introduction</w:t>
@@ -2667,7 +2670,7 @@
       <w:bookmarkStart w:id="9" w:name="_Ref103071794"/>
       <w:bookmarkStart w:id="10" w:name="_Ref103073047"/>
       <w:bookmarkStart w:id="11" w:name="_Ref103073090"/>
-      <w:bookmarkStart w:id="12" w:name="_Toc490831604"/>
+      <w:bookmarkStart w:id="12" w:name="_Toc497743211"/>
       <w:bookmarkEnd w:id="2"/>
       <w:bookmarkEnd w:id="3"/>
       <w:bookmarkEnd w:id="4"/>
@@ -3066,7 +3069,7 @@
       <w:pPr>
         <w:pStyle w:val="Heading1"/>
       </w:pPr>
-      <w:bookmarkStart w:id="14" w:name="_Toc490831605"/>
+      <w:bookmarkStart w:id="14" w:name="_Toc497743212"/>
       <w:r>
         <w:lastRenderedPageBreak/>
         <w:t>The Advanced Server .NET Connector - Overview</w:t>
@@ -3132,7 +3135,7 @@
       <w:pPr>
         <w:pStyle w:val="Heading2"/>
       </w:pPr>
-      <w:bookmarkStart w:id="15" w:name="_Toc490831606"/>
+      <w:bookmarkStart w:id="15" w:name="_Toc497743213"/>
       <w:r>
         <w:t>The .NET Class Hierarchy</w:t>
       </w:r>
@@ -3419,7 +3422,7 @@
       <w:pPr>
         <w:pStyle w:val="Heading2"/>
       </w:pPr>
-      <w:bookmarkStart w:id="16" w:name="_Toc490831607"/>
+      <w:bookmarkStart w:id="16" w:name="_Toc497743214"/>
       <w:r>
         <w:lastRenderedPageBreak/>
         <w:t>Installing the .NET Connector</w:t>
@@ -3483,7 +3486,7 @@
           <w:noProof/>
         </w:rPr>
         <w:drawing>
-          <wp:inline distT="0" distB="0" distL="0" distR="0" wp14:anchorId="09136DB8" wp14:editId="4964EB3C">
+          <wp:inline distT="0" distB="0" distL="0" distR="0" wp14:anchorId="781C3BDE" wp14:editId="6E31B5F2">
             <wp:extent cx="4114800" cy="2728253"/>
             <wp:effectExtent l="0" t="0" r="0" b="0"/>
             <wp:docPr id="9" name="Picture 9"/>
@@ -3667,7 +3670,7 @@
         </w:rPr>
         <w:lastRenderedPageBreak/>
         <w:drawing>
-          <wp:inline distT="0" distB="0" distL="0" distR="0" wp14:anchorId="3FA129E6" wp14:editId="24D132E0">
+          <wp:inline distT="0" distB="0" distL="0" distR="0" wp14:anchorId="041E0053" wp14:editId="0DFF29ED">
             <wp:extent cx="3886200" cy="3037805"/>
             <wp:effectExtent l="0" t="0" r="0" b="0"/>
             <wp:docPr id="2" name="Picture 2"/>
@@ -3769,7 +3772,7 @@
           <w:noProof/>
         </w:rPr>
         <w:drawing>
-          <wp:inline distT="0" distB="0" distL="0" distR="0" wp14:anchorId="08997872" wp14:editId="02AE6251">
+          <wp:inline distT="0" distB="0" distL="0" distR="0" wp14:anchorId="10F81E4D" wp14:editId="19AF221A">
             <wp:extent cx="3886200" cy="3046927"/>
             <wp:effectExtent l="0" t="0" r="0" b="1270"/>
             <wp:docPr id="3" name="Picture 3"/>
@@ -3896,7 +3899,7 @@
         </w:rPr>
         <w:lastRenderedPageBreak/>
         <w:drawing>
-          <wp:inline distT="0" distB="0" distL="0" distR="0" wp14:anchorId="76FE7A0A" wp14:editId="1B9CCFD1">
+          <wp:inline distT="0" distB="0" distL="0" distR="0" wp14:anchorId="6EBC06C6" wp14:editId="3E5CD723">
             <wp:extent cx="4114800" cy="3217552"/>
             <wp:effectExtent l="0" t="0" r="0" b="1905"/>
             <wp:docPr id="4" name="Picture 4"/>
@@ -4031,7 +4034,7 @@
           <w:noProof/>
         </w:rPr>
         <w:drawing>
-          <wp:inline distT="0" distB="0" distL="0" distR="0" wp14:anchorId="69DD4AFB" wp14:editId="69927904">
+          <wp:inline distT="0" distB="0" distL="0" distR="0" wp14:anchorId="0AB62146" wp14:editId="08273FD1">
             <wp:extent cx="4114800" cy="3194511"/>
             <wp:effectExtent l="0" t="0" r="0" b="6350"/>
             <wp:docPr id="5" name="Picture 5"/>
@@ -4193,7 +4196,7 @@
           <w:noProof/>
         </w:rPr>
         <w:drawing>
-          <wp:inline distT="0" distB="0" distL="0" distR="0" wp14:anchorId="333975A1" wp14:editId="3E627FE6">
+          <wp:inline distT="0" distB="0" distL="0" distR="0" wp14:anchorId="64C7F00B" wp14:editId="6550BBE6">
             <wp:extent cx="3790950" cy="1619051"/>
             <wp:effectExtent l="0" t="0" r="0" b="635"/>
             <wp:docPr id="12" name="Picture 12" descr="C:\Users\susan\AppData\Local\Temp\vmware-susan\VMwareDnD\7412d23f\Screen Shot 2016-07-11 at 4.50.20 PM.png"/>
@@ -4341,7 +4344,7 @@
           <w:noProof/>
         </w:rPr>
         <w:drawing>
-          <wp:inline distT="0" distB="0" distL="0" distR="0" wp14:anchorId="63D16F4C" wp14:editId="74A7A128">
+          <wp:inline distT="0" distB="0" distL="0" distR="0" wp14:anchorId="65454197" wp14:editId="2CF2324C">
             <wp:extent cx="4114800" cy="3004331"/>
             <wp:effectExtent l="0" t="0" r="0" b="5715"/>
             <wp:docPr id="1" name="Picture 1"/>
@@ -4435,7 +4438,7 @@
         <w:pStyle w:val="Heading1"/>
       </w:pPr>
       <w:bookmarkStart w:id="17" w:name="_Ref456012125"/>
-      <w:bookmarkStart w:id="18" w:name="_Toc490831608"/>
+      <w:bookmarkStart w:id="18" w:name="_Toc497743215"/>
       <w:r>
         <w:lastRenderedPageBreak/>
         <w:t>Configuring the .NET Connector</w:t>
@@ -4607,7 +4610,7 @@
         <w:pStyle w:val="Heading2"/>
       </w:pPr>
       <w:bookmarkStart w:id="19" w:name="_Ref477525249"/>
-      <w:bookmarkStart w:id="20" w:name="_Toc490831609"/>
+      <w:bookmarkStart w:id="20" w:name="_Toc497743216"/>
       <w:r>
         <w:t>General Instructions</w:t>
       </w:r>
@@ -4873,7 +4876,7 @@
       <w:pPr>
         <w:pStyle w:val="Heading2"/>
       </w:pPr>
-      <w:bookmarkStart w:id="21" w:name="_Toc490831610"/>
+      <w:bookmarkStart w:id="21" w:name="_Toc497743217"/>
       <w:r>
         <w:t>.NET Framework 4.0</w:t>
       </w:r>
@@ -5067,7 +5070,7 @@
       <w:pPr>
         <w:pStyle w:val="Heading2"/>
       </w:pPr>
-      <w:bookmarkStart w:id="22" w:name="_Toc490831611"/>
+      <w:bookmarkStart w:id="22" w:name="_Toc497743218"/>
       <w:r>
         <w:t>.NET Framework 4.5</w:t>
       </w:r>
@@ -5268,7 +5271,7 @@
         <w:pStyle w:val="Heading2"/>
       </w:pPr>
       <w:bookmarkStart w:id="23" w:name="_Ref477527440"/>
-      <w:bookmarkStart w:id="24" w:name="_Toc490831612"/>
+      <w:bookmarkStart w:id="24" w:name="_Toc497743219"/>
       <w:r>
         <w:t>Entity Framework 6</w:t>
       </w:r>
@@ -5473,15 +5476,7 @@
         <w:pStyle w:val="EDBSYNTXPreformattedBlackLeft033"/>
       </w:pPr>
       <w:r>
-        <w:t xml:space="preserve">  </w:t>
-      </w:r>
-      <w:proofErr w:type="gramStart"/>
-      <w:r>
-        <w:t>type</w:t>
-      </w:r>
-      <w:proofErr w:type="gramEnd"/>
-      <w:r>
-        <w:t>="</w:t>
+        <w:t xml:space="preserve">  type="</w:t>
       </w:r>
       <w:proofErr w:type="spellStart"/>
       <w:r>
@@ -6032,7 +6027,7 @@
         <w:pStyle w:val="Heading2"/>
       </w:pPr>
       <w:bookmarkStart w:id="25" w:name="_Ref477528081"/>
-      <w:bookmarkStart w:id="26" w:name="_Toc490831613"/>
+      <w:bookmarkStart w:id="26" w:name="_Toc497743220"/>
       <w:r>
         <w:t>EDBDdexProvider for Visual Studio</w:t>
       </w:r>
@@ -6113,19 +6108,22 @@
         <w:t>Step 1:</w:t>
       </w:r>
       <w:r>
-        <w:t xml:space="preserve"> Install EDBDdexProvider with the </w:t>
-      </w:r>
-      <w:r>
-        <w:rPr>
-          <w:rStyle w:val="EDBTXTKeywordBlack"/>
-        </w:rPr>
-        <w:t>EDBDdexProvider-</w:t>
-      </w:r>
-      <w:r>
-        <w:rPr>
-          <w:rStyle w:val="EDBTXTVariable11ptBlack"/>
-        </w:rPr>
-        <w:t>x</w:t>
+        <w:t xml:space="preserve"> Install </w:t>
+      </w:r>
+      <w:proofErr w:type="spellStart"/>
+      <w:r>
+        <w:t>EDBDdexProvider</w:t>
+      </w:r>
+      <w:proofErr w:type="spellEnd"/>
+      <w:r>
+        <w:t xml:space="preserve"> with the </w:t>
+      </w:r>
+      <w:proofErr w:type="spellStart"/>
+      <w:r>
+        <w:rPr>
+          <w:rStyle w:val="EDBTXTKeywordBlack"/>
+        </w:rPr>
+        <w:t>EDBDdexProvider</w:t>
       </w:r>
       <w:r>
         <w:rPr>
@@ -6135,31 +6133,41 @@
       </w:r>
       <w:r>
         <w:rPr>
-          <w:rStyle w:val="EDBTXTVariable11ptBlack"/>
-        </w:rPr>
-        <w:t>x</w:t>
-      </w:r>
-      <w:r>
-        <w:rPr>
-          <w:rStyle w:val="EDBTXTKeywordBlack"/>
-        </w:rPr>
-        <w:t>.</w:t>
-      </w:r>
-      <w:r>
-        <w:rPr>
-          <w:rStyle w:val="EDBTXTVariable11ptBlack"/>
-        </w:rPr>
-        <w:t>x</w:t>
-      </w:r>
-      <w:r>
-        <w:rPr>
-          <w:rStyle w:val="EDBTXTKeywordBlack"/>
-        </w:rPr>
-        <w:t>.vsix</w:t>
-      </w:r>
-      <w:r>
-        <w:t xml:space="preserve"> installer.</w:t>
-      </w:r>
+          <w:rStyle w:val="EDBTXTKeywordBlack"/>
+        </w:rPr>
+        <w:t>vsix</w:t>
+      </w:r>
+      <w:proofErr w:type="spellEnd"/>
+      <w:r>
+        <w:t xml:space="preserve"> installer</w:t>
+      </w:r>
+      <w:r>
+        <w:t xml:space="preserve"> at the following location:</w:t>
+      </w:r>
+    </w:p>
+    <w:p>
+      <w:pPr>
+        <w:pStyle w:val="EDBSYNTXPreformattedBlackLeft033"/>
+      </w:pPr>
+      <w:r>
+        <w:t xml:space="preserve">C:\Program </w:t>
+      </w:r>
+      <w:r>
+        <w:t>Files\edb\connectors\dotnet\4.5</w:t>
+      </w:r>
+      <w:r>
+        <w:t>\</w:t>
+      </w:r>
+    </w:p>
+    <w:p>
+      <w:pPr>
+        <w:pStyle w:val="EDBSYNTXPreformattedBlackLeft033"/>
+      </w:pPr>
+      <w:proofErr w:type="spellStart"/>
+      <w:r>
+        <w:t>EDBDdexProvider.vsix</w:t>
+      </w:r>
+      <w:proofErr w:type="spellEnd"/>
     </w:p>
     <w:p>
       <w:pPr>
@@ -6327,6 +6335,7 @@
         <w:pStyle w:val="EDBEXCourierNew9ptCustomColorRGB4649146Left01"/>
       </w:pPr>
       <w:r>
+        <w:lastRenderedPageBreak/>
         <w:t>&gt; gacutil.exe /i EnterpriseDB.EDBClient.dll</w:t>
       </w:r>
     </w:p>
@@ -6338,29 +6347,451 @@
         <w:rPr>
           <w:rStyle w:val="EDBTXTEmphasisNormalWebBoldBlackCharChar"/>
         </w:rPr>
+        <w:t>Step 5:</w:t>
+      </w:r>
+      <w:r>
+        <w:t xml:space="preserve"> Add the </w:t>
+      </w:r>
+      <w:r>
+        <w:rPr>
+          <w:rStyle w:val="EDBTXTKeywordBlack"/>
+        </w:rPr>
+        <w:t>&lt;DbProviderFactories&gt;</w:t>
+      </w:r>
+      <w:r>
+        <w:t xml:space="preserve"> entries for the ADO.NET driver of EDB Postgres in the </w:t>
+      </w:r>
+      <w:r>
+        <w:rPr>
+          <w:rStyle w:val="EDBTXTKeywordBlack"/>
+        </w:rPr>
+        <w:t>machine.config</w:t>
+      </w:r>
+      <w:r>
+        <w:t xml:space="preserve"> file. The following are the entries:</w:t>
+      </w:r>
+    </w:p>
+    <w:p>
+      <w:pPr>
+        <w:pStyle w:val="EDBSYNTXPreformattedBlackLeft033"/>
+      </w:pPr>
+      <w:r>
+        <w:t>&lt;add name="EnterpriseDB.EDBClient"</w:t>
+      </w:r>
+    </w:p>
+    <w:p>
+      <w:pPr>
+        <w:pStyle w:val="EDBSYNTXPreformattedBlackLeft033"/>
+      </w:pPr>
+      <w:r>
+        <w:t xml:space="preserve">  invariant="EnterpriseDB.EDBClient"</w:t>
+      </w:r>
+    </w:p>
+    <w:p>
+      <w:pPr>
+        <w:pStyle w:val="EDBSYNTXPreformattedBlackLeft033"/>
+      </w:pPr>
+      <w:r>
+        <w:t xml:space="preserve">  description=".NET Data Provider for EnterpriseDB PostgreSQL”</w:t>
+      </w:r>
+    </w:p>
+    <w:p>
+      <w:pPr>
+        <w:pStyle w:val="EDBSYNTXPreformattedBlackLeft033"/>
+      </w:pPr>
+      <w:r>
+        <w:t xml:space="preserve">  type="</w:t>
+      </w:r>
+      <w:proofErr w:type="spellStart"/>
+      <w:r>
+        <w:t>EnterpriseDB.EDBClient.EDBFactory</w:t>
+      </w:r>
+      <w:proofErr w:type="spellEnd"/>
+      <w:r>
+        <w:t xml:space="preserve">, </w:t>
+      </w:r>
+      <w:proofErr w:type="spellStart"/>
+      <w:r>
+        <w:t>EnterpriseDB.EDBClient</w:t>
+      </w:r>
+      <w:proofErr w:type="spellEnd"/>
+      <w:r>
+        <w:t>, Version=3.</w:t>
+      </w:r>
+      <w:r>
+        <w:t>1</w:t>
+      </w:r>
+      <w:r>
+        <w:t>.</w:t>
+      </w:r>
+      <w:r>
+        <w:t>9</w:t>
+      </w:r>
+      <w:r>
+        <w:t>.</w:t>
+      </w:r>
+      <w:r>
+        <w:t>4</w:t>
+      </w:r>
+      <w:r>
+        <w:t xml:space="preserve">, Culture=neutral, </w:t>
+      </w:r>
+      <w:proofErr w:type="spellStart"/>
+      <w:r>
+        <w:t>PublicKeyToken</w:t>
+      </w:r>
+      <w:proofErr w:type="spellEnd"/>
+      <w:r>
+        <w:t>=5d8b90d52f46fda7"</w:t>
+      </w:r>
+    </w:p>
+    <w:p>
+      <w:pPr>
+        <w:pStyle w:val="EDBSYNTXPreformattedBlackLeft033"/>
+      </w:pPr>
+      <w:r>
+        <w:t xml:space="preserve">  support="FF"/&gt;</w:t>
+      </w:r>
+    </w:p>
+    <w:p>
+      <w:pPr>
+        <w:pStyle w:val="EDBTXTNormalWebBlackCharChar0"/>
+      </w:pPr>
+      <w:r>
+        <w:rPr>
+          <w:rStyle w:val="EDBTXTEmphasisNormalWebBoldBlackCharChar"/>
+        </w:rPr>
+        <w:t>Note:</w:t>
+      </w:r>
+      <w:r>
+        <w:t xml:space="preserve"> For the attribute-value pairs, the double-quoted strings should not contain excess white space characters, but be configured on a single line. The examples shown in this section may be split on multiple lines for clarity, but should actually be configured within a single line such as the following:</w:t>
+      </w:r>
+    </w:p>
+    <w:p>
+      <w:pPr>
+        <w:pStyle w:val="EDBTXTNormalWebBlackCharChar0"/>
+        <w:rPr>
+          <w:rStyle w:val="EDBTXTKeywordBlack"/>
+        </w:rPr>
+      </w:pPr>
+      <w:r>
+        <w:rPr>
+          <w:rStyle w:val="EDBTXTKeywordBlack"/>
+        </w:rPr>
+        <w:t>description=".NET Data Provider for EnterpriseDB PostgreSQL”</w:t>
+      </w:r>
+    </w:p>
+    <w:p>
+      <w:pPr>
+        <w:pStyle w:val="EDBTXTNormalWebBlackCharChar0"/>
+      </w:pPr>
+      <w:r>
+        <w:t xml:space="preserve">For 64-bit Windows, the </w:t>
+      </w:r>
+      <w:r>
+        <w:rPr>
+          <w:rStyle w:val="EDBTXTKeywordBlack"/>
+        </w:rPr>
+        <w:t>machine.config</w:t>
+      </w:r>
+      <w:r>
+        <w:t xml:space="preserve"> file is in the following location:</w:t>
+      </w:r>
+    </w:p>
+    <w:p>
+      <w:pPr>
+        <w:pStyle w:val="EDBSYNTXPreformattedBlackLeft033"/>
+      </w:pPr>
+      <w:r>
+        <w:t>C:\Windows\Microsoft.NET\Framework64\v4.0.30319\</w:t>
+      </w:r>
+    </w:p>
+    <w:p>
+      <w:pPr>
+        <w:pStyle w:val="EDBSYNTXPreformattedBlackLeft033"/>
+      </w:pPr>
+      <w:r>
+        <w:t>Config</w:t>
+      </w:r>
+      <w:r>
+        <w:t>\machine.config</w:t>
+      </w:r>
+    </w:p>
+    <w:p>
+      <w:pPr>
+        <w:pStyle w:val="EDBTXTNormalWebBlackCharChar0"/>
+      </w:pPr>
+      <w:r>
+        <w:t xml:space="preserve">For 32-bit Windows, the </w:t>
+      </w:r>
+      <w:r>
+        <w:rPr>
+          <w:rStyle w:val="EDBTXTKeywordBlack"/>
+        </w:rPr>
+        <w:t>machine.config</w:t>
+      </w:r>
+      <w:r>
+        <w:t xml:space="preserve"> file is in the following location:</w:t>
+      </w:r>
+    </w:p>
+    <w:p>
+      <w:pPr>
+        <w:pStyle w:val="EDBSYNTXPreformattedBlackLeft033"/>
+      </w:pPr>
+      <w:r>
+        <w:t>C:\Windows\Microsoft.NET\Framework\v4.0.30319\</w:t>
+      </w:r>
+    </w:p>
+    <w:p>
+      <w:pPr>
+        <w:pStyle w:val="EDBSYNTXPreformattedBlackLeft033"/>
+      </w:pPr>
+      <w:r>
+        <w:t>Config</w:t>
+      </w:r>
+      <w:r>
+        <w:t>\machine.config</w:t>
+      </w:r>
+    </w:p>
+    <w:p>
+      <w:pPr>
+        <w:pStyle w:val="EDBTXTNormalWebBlackCharChar0"/>
+      </w:pPr>
+      <w:r>
+        <w:rPr>
+          <w:rStyle w:val="EDBTXTEmphasisNormalWebBoldBlackCharChar"/>
+        </w:rPr>
+        <w:t>Step 6:</w:t>
+      </w:r>
+      <w:r>
+        <w:t xml:space="preserve"> Place the DDL generation template </w:t>
+      </w:r>
+      <w:r>
+        <w:rPr>
+          <w:rStyle w:val="EDBTXTKeywordBlack"/>
+        </w:rPr>
+        <w:t>SSDLToPgSQL.tt</w:t>
+      </w:r>
+      <w:r>
+        <w:t xml:space="preserve"> in the </w:t>
+      </w:r>
+      <w:r>
+        <w:t xml:space="preserve">Visual Studio </w:t>
+      </w:r>
+      <w:r>
+        <w:rPr>
+          <w:rStyle w:val="EDBTXTKeywordBlack"/>
+        </w:rPr>
+        <w:t>EntityFramework Tools\DBGen\</w:t>
+      </w:r>
+      <w:r>
+        <w:t xml:space="preserve"> folder</w:t>
+      </w:r>
+      <w:r>
+        <w:t xml:space="preserve"> as in the following example</w:t>
+      </w:r>
+      <w:r>
+        <w:t>:</w:t>
+      </w:r>
+    </w:p>
+    <w:p>
+      <w:pPr>
+        <w:pStyle w:val="EDBSYNTXPreformattedBlackLeft033"/>
+      </w:pPr>
+      <w:r>
+        <w:t>C:\Program Files (x86)\Microsoft Visual Studio 14.0\</w:t>
+      </w:r>
+    </w:p>
+    <w:p>
+      <w:pPr>
+        <w:pStyle w:val="EDBSYNTXPreformattedBlackLeft033"/>
+      </w:pPr>
+      <w:r>
+        <w:t>Common7\IDE\Extensions\Microsoft\EntityFramework Tools\DBGen\</w:t>
+      </w:r>
+    </w:p>
+    <w:p>
+      <w:pPr>
+        <w:pStyle w:val="EDBTXTNormalWebBlackCharChar0"/>
+      </w:pPr>
+      <w:r>
+        <w:rPr>
+          <w:rStyle w:val="EDBTXTEmphasisNormalWebBoldBlackCharChar"/>
+        </w:rPr>
+        <w:t>Note:</w:t>
+      </w:r>
+      <w:r>
+        <w:t xml:space="preserve"> Select this template </w:t>
+      </w:r>
+      <w:r>
+        <w:rPr>
+          <w:rStyle w:val="EDBTXTKeywordBlack"/>
+        </w:rPr>
+        <w:t>SSDLToPgSQL.tt</w:t>
+      </w:r>
+      <w:r>
+        <w:t xml:space="preserve"> in your EDMX file properties.</w:t>
+      </w:r>
+    </w:p>
+    <w:p>
+      <w:pPr>
+        <w:pStyle w:val="EDBTXTNormalWebBlackCharChar0"/>
+      </w:pPr>
+      <w:r>
+        <w:rPr>
+          <w:rStyle w:val="EDBTXTEmphasisNormalWebBoldBlackCharChar"/>
+        </w:rPr>
+        <w:t>Step 7:</w:t>
+      </w:r>
+      <w:r>
+        <w:t xml:space="preserve"> Relaunch Visual Studio and verify from </w:t>
+      </w:r>
+      <w:r>
+        <w:rPr>
+          <w:rStyle w:val="EDBTXTKeywordBlack"/>
+        </w:rPr>
+        <w:t>Tools &gt; Extentions and Updates</w:t>
+      </w:r>
+      <w:r>
+        <w:t>… menu that the EDBDdexProvider extension is installed.</w:t>
+      </w:r>
+    </w:p>
+    <w:p>
+      <w:pPr>
+        <w:pStyle w:val="EDBTXTNormalWebBlackCharChar0"/>
+      </w:pPr>
+      <w:r>
+        <w:rPr>
+          <w:rStyle w:val="EDBTXTEmphasisNormalWebBoldBlackCharChar"/>
+        </w:rPr>
+        <w:t>Step 8:</w:t>
+      </w:r>
+      <w:r>
+        <w:t xml:space="preserve"> From Server Explorer, right-click on </w:t>
+      </w:r>
+      <w:r>
+        <w:rPr>
+          <w:rStyle w:val="EDBTXTKeywordBlack"/>
+        </w:rPr>
+        <w:t>Data Connections</w:t>
+      </w:r>
+      <w:r>
+        <w:t xml:space="preserve">, click </w:t>
+      </w:r>
+      <w:r>
+        <w:rPr>
+          <w:rStyle w:val="EDBTXTKeywordBlack"/>
+        </w:rPr>
+        <w:t>Add Connection</w:t>
+      </w:r>
+      <w:r>
+        <w:t xml:space="preserve">, and verify the </w:t>
+      </w:r>
+      <w:r>
+        <w:rPr>
+          <w:rStyle w:val="EDBTXTKeywordBlack"/>
+        </w:rPr>
+        <w:t>Enterprisedb Postgres Database</w:t>
+      </w:r>
+      <w:r>
+        <w:t xml:space="preserve"> data source is available.</w:t>
+      </w:r>
+    </w:p>
+    <w:p>
+      <w:pPr>
+        <w:pStyle w:val="EDBTXTNormalWebBlackCharChar0"/>
+      </w:pPr>
+      <w:r>
+        <w:rPr>
+          <w:rStyle w:val="EDBTXTEmphasisNormalWebBoldBlackCharChar"/>
+        </w:rPr>
         <w:lastRenderedPageBreak/>
-        <w:t>Step 5:</w:t>
-      </w:r>
-      <w:r>
-        <w:t xml:space="preserve"> Add the </w:t>
-      </w:r>
-      <w:r>
-        <w:rPr>
-          <w:rStyle w:val="EDBTXTKeywordBlack"/>
-        </w:rPr>
-        <w:t>&lt;DbProviderFactories&gt;</w:t>
-      </w:r>
-      <w:r>
-        <w:t xml:space="preserve"> entries for the ADO.NET driver of EDB Postgres in the </w:t>
-      </w:r>
-      <w:r>
-        <w:rPr>
-          <w:rStyle w:val="EDBTXTKeywordBlack"/>
-        </w:rPr>
-        <w:t>machine.config</w:t>
-      </w:r>
-      <w:r>
-        <w:t xml:space="preserve"> file. The following are the entries:</w:t>
+        <w:t>Step 9:</w:t>
+      </w:r>
+      <w:r>
+        <w:t xml:space="preserve"> Add files </w:t>
+      </w:r>
+      <w:r>
+        <w:rPr>
+          <w:rStyle w:val="EDBTXTKeywordBlack"/>
+        </w:rPr>
+        <w:t>EnterpriseDB.EDBClient.dll</w:t>
+      </w:r>
+      <w:r>
+        <w:t xml:space="preserve"> and </w:t>
+      </w:r>
+      <w:r>
+        <w:rPr>
+          <w:rStyle w:val="EDBTXTKeywordBlack"/>
+        </w:rPr>
+        <w:t>EntityFramework6.EnterpriseDB.EDBClient.dll</w:t>
+      </w:r>
+      <w:r>
+        <w:t xml:space="preserve"> in project references.</w:t>
+      </w:r>
+      <w:r>
+        <w:t xml:space="preserve"> See Section </w:t>
+      </w:r>
+      <w:r>
+        <w:rPr>
+          <w:u w:val="single"/>
+        </w:rPr>
+        <w:fldChar w:fldCharType="begin"/>
+      </w:r>
+      <w:r>
+        <w:rPr>
+          <w:u w:val="single"/>
+        </w:rPr>
+        <w:instrText xml:space="preserve"> REF _Ref477525249 \r \h </w:instrText>
+      </w:r>
+      <w:r>
+        <w:rPr>
+          <w:u w:val="single"/>
+        </w:rPr>
+      </w:r>
+      <w:r>
+        <w:rPr>
+          <w:u w:val="single"/>
+        </w:rPr>
+        <w:fldChar w:fldCharType="separate"/>
+      </w:r>
+      <w:r>
+        <w:rPr>
+          <w:u w:val="single"/>
+        </w:rPr>
+        <w:t>3.1</w:t>
+      </w:r>
+      <w:r>
+        <w:rPr>
+          <w:u w:val="single"/>
+        </w:rPr>
+        <w:fldChar w:fldCharType="end"/>
+      </w:r>
+      <w:r>
+        <w:t xml:space="preserve"> for information on referencing library files.</w:t>
+      </w:r>
+    </w:p>
+    <w:p>
+      <w:pPr>
+        <w:pStyle w:val="EDBTXTNormalWebBlackCharChar0"/>
+      </w:pPr>
+      <w:r>
+        <w:rPr>
+          <w:rStyle w:val="EDBTXTEmphasisNormalWebBoldBlackCharChar"/>
+        </w:rPr>
+        <w:t>Step 10:</w:t>
+      </w:r>
+      <w:r>
+        <w:t xml:space="preserve"> In the project’s </w:t>
+      </w:r>
+      <w:r>
+        <w:rPr>
+          <w:rStyle w:val="EDBTXTKeywordBlack"/>
+        </w:rPr>
+        <w:t>app.config</w:t>
+      </w:r>
+      <w:r>
+        <w:t xml:space="preserve"> file add the following entry for provider services under the EntityFramework/providers tag.</w:t>
       </w:r>
     </w:p>
     <w:p>
@@ -6368,7 +6799,10 @@
         <w:pStyle w:val="EDBSYNTXPreformattedBlackLeft033"/>
       </w:pPr>
       <w:r>
-        <w:t>&lt;add name="EnterpriseDB.EDBClient"</w:t>
+        <w:t>&lt;provider invaria</w:t>
+      </w:r>
+      <w:r>
+        <w:t>ntName="EnterpriseDB.EDBClient"</w:t>
       </w:r>
     </w:p>
     <w:p>
@@ -6376,7 +6810,10 @@
         <w:pStyle w:val="EDBSYNTXPreformattedBlackLeft033"/>
       </w:pPr>
       <w:r>
-        <w:t xml:space="preserve">  invariant="EnterpriseDB.EDBClient"</w:t>
+        <w:t xml:space="preserve">  </w:t>
+      </w:r>
+      <w:r>
+        <w:t>type="EnterpriseDB.EDBClient.EDBServices, EntityFramework6.EnterpriseDB.EDBClient"&gt;</w:t>
       </w:r>
     </w:p>
     <w:p>
@@ -6384,405 +6821,15 @@
         <w:pStyle w:val="EDBSYNTXPreformattedBlackLeft033"/>
       </w:pPr>
       <w:r>
-        <w:t xml:space="preserve">  description=".NET Data Provider for EnterpriseDB PostgreSQL”</w:t>
-      </w:r>
-    </w:p>
-    <w:p>
-      <w:pPr>
-        <w:pStyle w:val="EDBSYNTXPreformattedBlackLeft033"/>
-      </w:pPr>
-      <w:r>
-        <w:t xml:space="preserve">  </w:t>
-      </w:r>
-      <w:proofErr w:type="gramStart"/>
-      <w:r>
-        <w:t>type</w:t>
-      </w:r>
-      <w:proofErr w:type="gramEnd"/>
-      <w:r>
-        <w:t>="</w:t>
-      </w:r>
-      <w:proofErr w:type="spellStart"/>
-      <w:r>
-        <w:t>EnterpriseDB.EDBClient.EDBFactory</w:t>
-      </w:r>
-      <w:proofErr w:type="spellEnd"/>
-      <w:r>
-        <w:t xml:space="preserve">, </w:t>
-      </w:r>
-      <w:proofErr w:type="spellStart"/>
-      <w:r>
-        <w:t>EnterpriseDB.EDBClient</w:t>
-      </w:r>
-      <w:proofErr w:type="spellEnd"/>
-      <w:r>
-        <w:t>, Version=3.</w:t>
-      </w:r>
-      <w:r>
-        <w:t>1</w:t>
-      </w:r>
-      <w:r>
-        <w:t>.</w:t>
-      </w:r>
-      <w:r>
-        <w:t>9</w:t>
-      </w:r>
-      <w:r>
-        <w:t>.</w:t>
-      </w:r>
-      <w:r>
-        <w:t>4</w:t>
-      </w:r>
-      <w:r>
-        <w:t xml:space="preserve">, Culture=neutral, </w:t>
-      </w:r>
-      <w:proofErr w:type="spellStart"/>
-      <w:r>
-        <w:t>PublicKeyToken</w:t>
-      </w:r>
-      <w:proofErr w:type="spellEnd"/>
-      <w:r>
-        <w:t>=5d8b90d52f46fda7"</w:t>
-      </w:r>
-    </w:p>
-    <w:p>
-      <w:pPr>
-        <w:pStyle w:val="EDBSYNTXPreformattedBlackLeft033"/>
-      </w:pPr>
-      <w:r>
-        <w:t xml:space="preserve">  support="FF"/&gt;</w:t>
-      </w:r>
-    </w:p>
-    <w:p>
-      <w:pPr>
-        <w:pStyle w:val="EDBTXTNormalWebBlackCharChar0"/>
-      </w:pPr>
-      <w:r>
-        <w:rPr>
-          <w:rStyle w:val="EDBTXTEmphasisNormalWebBoldBlackCharChar"/>
-        </w:rPr>
-        <w:t>Note:</w:t>
-      </w:r>
-      <w:r>
-        <w:t xml:space="preserve"> For the attribute-value pairs, the double-quoted strings should not contain excess white space characters, but be configured on a single line. The examples shown in this section may be split on multiple lines for clarity, but should actually be configured within a single line such as the following:</w:t>
-      </w:r>
-    </w:p>
-    <w:p>
-      <w:pPr>
-        <w:pStyle w:val="EDBTXTNormalWebBlackCharChar0"/>
-        <w:rPr>
-          <w:rStyle w:val="EDBTXTKeywordBlack"/>
-        </w:rPr>
-      </w:pPr>
-      <w:r>
-        <w:rPr>
-          <w:rStyle w:val="EDBTXTKeywordBlack"/>
-        </w:rPr>
-        <w:t>description=".NET Data Provider for EnterpriseDB PostgreSQL”</w:t>
-      </w:r>
-    </w:p>
-    <w:p>
-      <w:pPr>
-        <w:pStyle w:val="EDBTXTNormalWebBlackCharChar0"/>
-      </w:pPr>
-      <w:r>
-        <w:t xml:space="preserve">For 64-bit Windows, the </w:t>
-      </w:r>
-      <w:r>
-        <w:rPr>
-          <w:rStyle w:val="EDBTXTKeywordBlack"/>
-        </w:rPr>
-        <w:t>machine.config</w:t>
-      </w:r>
-      <w:r>
-        <w:t xml:space="preserve"> file is in the following location:</w:t>
-      </w:r>
-    </w:p>
-    <w:p>
-      <w:pPr>
-        <w:pStyle w:val="EDBSYNTXPreformattedBlackLeft033"/>
-      </w:pPr>
-      <w:r>
-        <w:t>C:\Windows\Microsoft.NET\Framework64\v4.0.30319\</w:t>
-      </w:r>
-    </w:p>
-    <w:p>
-      <w:pPr>
-        <w:pStyle w:val="EDBSYNTXPreformattedBlackLeft033"/>
-      </w:pPr>
-      <w:r>
-        <w:t>Config</w:t>
-      </w:r>
-      <w:r>
-        <w:t>\machine.config</w:t>
-      </w:r>
-    </w:p>
-    <w:p>
-      <w:pPr>
-        <w:pStyle w:val="EDBTXTNormalWebBlackCharChar0"/>
-      </w:pPr>
-      <w:r>
-        <w:t xml:space="preserve">For 32-bit Windows, the </w:t>
-      </w:r>
-      <w:r>
-        <w:rPr>
-          <w:rStyle w:val="EDBTXTKeywordBlack"/>
-        </w:rPr>
-        <w:t>machine.config</w:t>
-      </w:r>
-      <w:r>
-        <w:t xml:space="preserve"> file is in the following location:</w:t>
-      </w:r>
-    </w:p>
-    <w:p>
-      <w:pPr>
-        <w:pStyle w:val="EDBSYNTXPreformattedBlackLeft033"/>
-      </w:pPr>
-      <w:r>
-        <w:t>C:\Windows\Microsoft.NET\Framework\v4.0.30319\</w:t>
-      </w:r>
-    </w:p>
-    <w:p>
-      <w:pPr>
-        <w:pStyle w:val="EDBSYNTXPreformattedBlackLeft033"/>
-      </w:pPr>
-      <w:r>
-        <w:t>Config</w:t>
-      </w:r>
-      <w:r>
-        <w:t>\machine.config</w:t>
-      </w:r>
-    </w:p>
-    <w:p>
-      <w:pPr>
-        <w:pStyle w:val="EDBTXTNormalWebBlackCharChar0"/>
-      </w:pPr>
-      <w:r>
-        <w:rPr>
-          <w:rStyle w:val="EDBTXTEmphasisNormalWebBoldBlackCharChar"/>
-        </w:rPr>
-        <w:t>Step 6:</w:t>
-      </w:r>
-      <w:r>
-        <w:t xml:space="preserve"> Place the DDL generation template </w:t>
-      </w:r>
-      <w:r>
-        <w:rPr>
-          <w:rStyle w:val="EDBTXTKeywordBlack"/>
-        </w:rPr>
-        <w:t>SSDLToPgSQL.tt</w:t>
-      </w:r>
-      <w:r>
-        <w:t xml:space="preserve"> in the </w:t>
-      </w:r>
-      <w:r>
-        <w:t xml:space="preserve">Visual Studio </w:t>
-      </w:r>
-      <w:r>
-        <w:rPr>
-          <w:rStyle w:val="EDBTXTKeywordBlack"/>
-        </w:rPr>
-        <w:t>EntityFramework Tools\DBGen\</w:t>
-      </w:r>
-      <w:r>
-        <w:t xml:space="preserve"> folder</w:t>
-      </w:r>
-      <w:r>
-        <w:t xml:space="preserve"> as in the following example</w:t>
-      </w:r>
-      <w:r>
-        <w:t>:</w:t>
-      </w:r>
-    </w:p>
-    <w:p>
-      <w:pPr>
-        <w:pStyle w:val="EDBSYNTXPreformattedBlackLeft033"/>
-      </w:pPr>
-      <w:r>
-        <w:t>C:\Program Files (x86)\Microsoft Visual Studio 14.0\</w:t>
-      </w:r>
-    </w:p>
-    <w:p>
-      <w:pPr>
-        <w:pStyle w:val="EDBSYNTXPreformattedBlackLeft033"/>
-      </w:pPr>
-      <w:r>
-        <w:t>Common7\IDE\Extensions\Microsoft\EntityFramework Tools\DBGen\</w:t>
-      </w:r>
-    </w:p>
-    <w:p>
-      <w:pPr>
-        <w:pStyle w:val="EDBTXTNormalWebBlackCharChar0"/>
-      </w:pPr>
-      <w:r>
-        <w:rPr>
-          <w:rStyle w:val="EDBTXTEmphasisNormalWebBoldBlackCharChar"/>
-        </w:rPr>
-        <w:t>Note:</w:t>
-      </w:r>
-      <w:r>
-        <w:t xml:space="preserve"> Select this template </w:t>
-      </w:r>
-      <w:r>
-        <w:rPr>
-          <w:rStyle w:val="EDBTXTKeywordBlack"/>
-        </w:rPr>
-        <w:t>SSDLToPgSQL.tt</w:t>
-      </w:r>
-      <w:r>
-        <w:t xml:space="preserve"> in your EDMX file properties.</w:t>
-      </w:r>
-    </w:p>
-    <w:p>
-      <w:pPr>
-        <w:pStyle w:val="EDBTXTNormalWebBlackCharChar0"/>
-      </w:pPr>
-      <w:r>
-        <w:rPr>
-          <w:rStyle w:val="EDBTXTEmphasisNormalWebBoldBlackCharChar"/>
-        </w:rPr>
-        <w:t>Step 7:</w:t>
-      </w:r>
-      <w:r>
-        <w:t xml:space="preserve"> Relaunch Visual Studio and verify from </w:t>
-      </w:r>
-      <w:r>
-        <w:rPr>
-          <w:rStyle w:val="EDBTXTKeywordBlack"/>
-        </w:rPr>
-        <w:t>Tools &gt; Extentions and Updates</w:t>
-      </w:r>
-      <w:r>
-        <w:t>… menu that the EDBDdexProvider extension is installed.</w:t>
-      </w:r>
-    </w:p>
-    <w:p>
-      <w:pPr>
-        <w:pStyle w:val="EDBTXTNormalWebBlackCharChar0"/>
-      </w:pPr>
-      <w:r>
-        <w:rPr>
-          <w:rStyle w:val="EDBTXTEmphasisNormalWebBoldBlackCharChar"/>
-        </w:rPr>
-        <w:t>Step 8:</w:t>
-      </w:r>
-      <w:r>
-        <w:t xml:space="preserve"> From Server Explorer, right-click on </w:t>
-      </w:r>
-      <w:r>
-        <w:rPr>
-          <w:rStyle w:val="EDBTXTKeywordBlack"/>
-        </w:rPr>
-        <w:t>Data Connections</w:t>
-      </w:r>
-      <w:r>
-        <w:t xml:space="preserve">, click </w:t>
-      </w:r>
-      <w:r>
-        <w:rPr>
-          <w:rStyle w:val="EDBTXTKeywordBlack"/>
-        </w:rPr>
-        <w:t>Add Connection</w:t>
-      </w:r>
-      <w:r>
-        <w:t xml:space="preserve">, and verify the </w:t>
-      </w:r>
-      <w:r>
-        <w:rPr>
-          <w:rStyle w:val="EDBTXTKeywordBlack"/>
-        </w:rPr>
-        <w:t>Enterprisedb Postgres Database</w:t>
-      </w:r>
-      <w:r>
-        <w:t xml:space="preserve"> data source is available.</w:t>
-      </w:r>
-    </w:p>
-    <w:p>
-      <w:pPr>
-        <w:pStyle w:val="EDBTXTNormalWebBlackCharChar0"/>
-      </w:pPr>
-      <w:r>
-        <w:rPr>
-          <w:rStyle w:val="EDBTXTEmphasisNormalWebBoldBlackCharChar"/>
-        </w:rPr>
-        <w:t>Step 9:</w:t>
-      </w:r>
-      <w:r>
-        <w:t xml:space="preserve"> Add files </w:t>
-      </w:r>
-      <w:r>
-        <w:rPr>
-          <w:rStyle w:val="EDBTXTKeywordBlack"/>
-        </w:rPr>
-        <w:t>EnterpriseDB.EDBClient.dll</w:t>
-      </w:r>
-      <w:r>
-        <w:t xml:space="preserve"> and </w:t>
-      </w:r>
-      <w:r>
-        <w:rPr>
-          <w:rStyle w:val="EDBTXTKeywordBlack"/>
-        </w:rPr>
-        <w:t>EntityFramework6.EnterpriseDB.EDBClient.dll</w:t>
-      </w:r>
-      <w:r>
-        <w:t xml:space="preserve"> in project references.</w:t>
-      </w:r>
-      <w:r>
-        <w:t xml:space="preserve"> See Section </w:t>
-      </w:r>
-      <w:r>
-        <w:rPr>
-          <w:u w:val="single"/>
-        </w:rPr>
-        <w:fldChar w:fldCharType="begin"/>
-      </w:r>
-      <w:r>
-        <w:rPr>
-          <w:u w:val="single"/>
-        </w:rPr>
-        <w:instrText xml:space="preserve"> REF _Ref477525249 \r \h </w:instrText>
-      </w:r>
-      <w:r>
-        <w:rPr>
-          <w:u w:val="single"/>
-        </w:rPr>
-      </w:r>
-      <w:r>
-        <w:rPr>
-          <w:u w:val="single"/>
-        </w:rPr>
-        <w:fldChar w:fldCharType="separate"/>
-      </w:r>
-      <w:r>
-        <w:rPr>
-          <w:u w:val="single"/>
-        </w:rPr>
-        <w:t>3.1</w:t>
-      </w:r>
-      <w:r>
-        <w:rPr>
-          <w:u w:val="single"/>
-        </w:rPr>
-        <w:fldChar w:fldCharType="end"/>
-      </w:r>
-      <w:r>
-        <w:t xml:space="preserve"> for information on referencing library files.</w:t>
-      </w:r>
-    </w:p>
-    <w:p>
-      <w:pPr>
-        <w:pStyle w:val="EDBTXTNormalWebBlackCharChar0"/>
-      </w:pPr>
-      <w:r>
-        <w:rPr>
-          <w:rStyle w:val="EDBTXTEmphasisNormalWebBoldBlackCharChar"/>
-        </w:rPr>
-        <w:lastRenderedPageBreak/>
-        <w:t>Step 10:</w:t>
-      </w:r>
-      <w:r>
-        <w:t xml:space="preserve"> In the project’s </w:t>
+        <w:t>&lt;/provider&gt;</w:t>
+      </w:r>
+    </w:p>
+    <w:p>
+      <w:pPr>
+        <w:pStyle w:val="EDBTXTNormalWebBlackCharChar0"/>
+      </w:pPr>
+      <w:r>
+        <w:t xml:space="preserve">The following is an example of the </w:t>
       </w:r>
       <w:r>
         <w:rPr>
@@ -6791,53 +6838,6 @@
         <w:t>app.config</w:t>
       </w:r>
       <w:r>
-        <w:t xml:space="preserve"> file add the following entry for provider services under the EntityFramework/providers tag.</w:t>
-      </w:r>
-    </w:p>
-    <w:p>
-      <w:pPr>
-        <w:pStyle w:val="EDBSYNTXPreformattedBlackLeft033"/>
-      </w:pPr>
-      <w:r>
-        <w:t>&lt;provider invaria</w:t>
-      </w:r>
-      <w:r>
-        <w:t>ntName="EnterpriseDB.EDBClient"</w:t>
-      </w:r>
-    </w:p>
-    <w:p>
-      <w:pPr>
-        <w:pStyle w:val="EDBSYNTXPreformattedBlackLeft033"/>
-      </w:pPr>
-      <w:r>
-        <w:t xml:space="preserve">  </w:t>
-      </w:r>
-      <w:r>
-        <w:t>type="EnterpriseDB.EDBClient.EDBServices, EntityFramework6.EnterpriseDB.EDBClient"&gt;</w:t>
-      </w:r>
-    </w:p>
-    <w:p>
-      <w:pPr>
-        <w:pStyle w:val="EDBSYNTXPreformattedBlackLeft033"/>
-      </w:pPr>
-      <w:r>
-        <w:t>&lt;/provider&gt;</w:t>
-      </w:r>
-    </w:p>
-    <w:p>
-      <w:pPr>
-        <w:pStyle w:val="EDBTXTNormalWebBlackCharChar0"/>
-      </w:pPr>
-      <w:r>
-        <w:t xml:space="preserve">The following is an example of the </w:t>
-      </w:r>
-      <w:r>
-        <w:rPr>
-          <w:rStyle w:val="EDBTXTKeywordBlack"/>
-        </w:rPr>
-        <w:t>app.config</w:t>
-      </w:r>
-      <w:r>
         <w:t xml:space="preserve"> file.</w:t>
       </w:r>
     </w:p>
@@ -7175,7 +7175,7 @@
         <w:pStyle w:val="Heading1"/>
       </w:pPr>
       <w:bookmarkStart w:id="27" w:name="_Ref482087625"/>
-      <w:bookmarkStart w:id="28" w:name="_Toc490831614"/>
+      <w:bookmarkStart w:id="28" w:name="_Toc497743221"/>
       <w:r>
         <w:lastRenderedPageBreak/>
         <w:t>Using the .NET Connector</w:t>
@@ -7429,7 +7429,7 @@
       <w:pPr>
         <w:pStyle w:val="Heading2"/>
       </w:pPr>
-      <w:bookmarkStart w:id="29" w:name="_Toc490831615"/>
+      <w:bookmarkStart w:id="29" w:name="_Toc497743222"/>
       <w:r>
         <w:t>Opening a Database Connection</w:t>
       </w:r>
@@ -7647,7 +7647,7 @@
         <w:pStyle w:val="Heading3"/>
       </w:pPr>
       <w:bookmarkStart w:id="30" w:name="_Ref482087661"/>
-      <w:bookmarkStart w:id="31" w:name="_Toc490831616"/>
+      <w:bookmarkStart w:id="31" w:name="_Toc497743223"/>
       <w:r>
         <w:t>Connection String Parameters</w:t>
       </w:r>
@@ -8711,7 +8711,7 @@
       <w:pPr>
         <w:pStyle w:val="Heading3"/>
       </w:pPr>
-      <w:bookmarkStart w:id="32" w:name="_Toc490831617"/>
+      <w:bookmarkStart w:id="32" w:name="_Toc497743224"/>
       <w:r>
         <w:t xml:space="preserve">Example - </w:t>
       </w:r>
@@ -9131,7 +9131,7 @@
           <w:noProof/>
         </w:rPr>
         <w:drawing>
-          <wp:inline distT="0" distB="0" distL="0" distR="0" wp14:anchorId="5DDE609C" wp14:editId="372D1BDC">
+          <wp:inline distT="0" distB="0" distL="0" distR="0" wp14:anchorId="49B39E7C" wp14:editId="0AD3CC7F">
             <wp:extent cx="5480050" cy="1663700"/>
             <wp:effectExtent l="0" t="0" r="6350" b="0"/>
             <wp:docPr id="7" name="Picture 7" descr="Screen Shot 2014-06-26 at 8"/>
@@ -9189,7 +9189,7 @@
       <w:pPr>
         <w:pStyle w:val="Heading3"/>
       </w:pPr>
-      <w:bookmarkStart w:id="33" w:name="_Toc490831618"/>
+      <w:bookmarkStart w:id="33" w:name="_Toc497743225"/>
       <w:r>
         <w:t xml:space="preserve">Example - </w:t>
       </w:r>
@@ -9802,7 +9802,7 @@
       <w:pPr>
         <w:pStyle w:val="Heading3"/>
       </w:pPr>
-      <w:bookmarkStart w:id="34" w:name="_Toc490831619"/>
+      <w:bookmarkStart w:id="34" w:name="_Toc497743226"/>
       <w:r>
         <w:t xml:space="preserve">Example - </w:t>
       </w:r>
@@ -10599,7 +10599,7 @@
           <w:noProof/>
         </w:rPr>
         <w:drawing>
-          <wp:inline distT="0" distB="0" distL="0" distR="0" wp14:anchorId="5892A2EF" wp14:editId="0C8186C4">
+          <wp:inline distT="0" distB="0" distL="0" distR="0" wp14:anchorId="7A58E89E" wp14:editId="3FE0F65A">
             <wp:extent cx="2120900" cy="2120900"/>
             <wp:effectExtent l="0" t="0" r="0" b="0"/>
             <wp:docPr id="8" name="Picture 8" descr="dialog"/>
@@ -10711,7 +10711,7 @@
       <w:pPr>
         <w:pStyle w:val="Heading2"/>
       </w:pPr>
-      <w:bookmarkStart w:id="35" w:name="_Toc490831620"/>
+      <w:bookmarkStart w:id="35" w:name="_Toc497743227"/>
       <w:r>
         <w:lastRenderedPageBreak/>
         <w:t>Retrieving Database Records</w:t>
@@ -11795,7 +11795,7 @@
       <w:pPr>
         <w:pStyle w:val="Heading3"/>
       </w:pPr>
-      <w:bookmarkStart w:id="36" w:name="_Toc490831621"/>
+      <w:bookmarkStart w:id="36" w:name="_Toc497743228"/>
       <w:r>
         <w:t>Retr</w:t>
       </w:r>
@@ -12329,7 +12329,7 @@
       <w:pPr>
         <w:pStyle w:val="Heading2"/>
       </w:pPr>
-      <w:bookmarkStart w:id="37" w:name="_Toc490831622"/>
+      <w:bookmarkStart w:id="37" w:name="_Toc497743229"/>
       <w:r>
         <w:lastRenderedPageBreak/>
         <w:t>Parameterized Queries</w:t>
@@ -13010,7 +13010,7 @@
       <w:pPr>
         <w:pStyle w:val="Heading2"/>
       </w:pPr>
-      <w:bookmarkStart w:id="38" w:name="_Toc490831623"/>
+      <w:bookmarkStart w:id="38" w:name="_Toc497743230"/>
       <w:r>
         <w:lastRenderedPageBreak/>
         <w:t>Inserting Records in a Database</w:t>
@@ -13856,7 +13856,7 @@
       <w:pPr>
         <w:pStyle w:val="Heading2"/>
       </w:pPr>
-      <w:bookmarkStart w:id="39" w:name="_Toc490831624"/>
+      <w:bookmarkStart w:id="39" w:name="_Toc497743231"/>
       <w:r>
         <w:lastRenderedPageBreak/>
         <w:t>Deleting Records in a Database</w:t>
@@ -14698,7 +14698,7 @@
       <w:pPr>
         <w:pStyle w:val="Heading2"/>
       </w:pPr>
-      <w:bookmarkStart w:id="40" w:name="_Toc490831625"/>
+      <w:bookmarkStart w:id="40" w:name="_Toc497743232"/>
       <w:r>
         <w:lastRenderedPageBreak/>
         <w:t>Using SPL Stored Procedures in your .NET Application</w:t>
@@ -14974,7 +14974,7 @@
       <w:pPr>
         <w:pStyle w:val="Heading3"/>
       </w:pPr>
-      <w:bookmarkStart w:id="41" w:name="_Toc490831626"/>
+      <w:bookmarkStart w:id="41" w:name="_Toc497743233"/>
       <w:r>
         <w:t>Example - Executing</w:t>
       </w:r>
@@ -15903,7 +15903,7 @@
       <w:pPr>
         <w:pStyle w:val="Heading3"/>
       </w:pPr>
-      <w:bookmarkStart w:id="42" w:name="_Toc490831627"/>
+      <w:bookmarkStart w:id="42" w:name="_Toc497743234"/>
       <w:r>
         <w:t xml:space="preserve">Example - </w:t>
       </w:r>
@@ -17699,7 +17699,7 @@
       <w:pPr>
         <w:pStyle w:val="Heading3"/>
       </w:pPr>
-      <w:bookmarkStart w:id="43" w:name="_Toc490831628"/>
+      <w:bookmarkStart w:id="43" w:name="_Toc497743235"/>
       <w:r>
         <w:t xml:space="preserve">Example - </w:t>
       </w:r>
@@ -19933,7 +19933,7 @@
       <w:pPr>
         <w:pStyle w:val="Heading2"/>
       </w:pPr>
-      <w:bookmarkStart w:id="44" w:name="_Toc490831629"/>
+      <w:bookmarkStart w:id="44" w:name="_Toc497743236"/>
       <w:r>
         <w:lastRenderedPageBreak/>
         <w:t xml:space="preserve">Using </w:t>
@@ -31206,7 +31206,7 @@
 </file>
 
 <file path=customXml/itemProps1.xml><?xml version="1.0" encoding="utf-8"?>
-<ds:datastoreItem xmlns:ds="http://schemas.openxmlformats.org/officeDocument/2006/customXml" ds:itemID="{58F966F0-A332-49AA-AF12-F9FCD411E67E}">
+<ds:datastoreItem xmlns:ds="http://schemas.openxmlformats.org/officeDocument/2006/customXml" ds:itemID="{1D5EE646-686F-4F66-A111-0222CDA7B502}">
   <ds:schemaRefs>
     <ds:schemaRef ds:uri="http://schemas.openxmlformats.org/officeDocument/2006/bibliography"/>
   </ds:schemaRefs>

</xml_diff>

<commit_message>
EPAS .Net Connector Guide 10.0.1 - Removed Select Components dialog box from older metainstaller
</commit_message>
<xml_diff>
--- a/edb_docs/EDB_Postgres_Advanced_Server_NET_Connector_Guide.docx
+++ b/edb_docs/EDB_Postgres_Advanced_Server_NET_Connector_Guide.docx
@@ -7,12 +7,14 @@
       <w:pPr>
         <w:pStyle w:val="EDBCoverLogo"/>
       </w:pPr>
+      <w:bookmarkStart w:id="0" w:name="_GoBack"/>
+      <w:bookmarkEnd w:id="0"/>
       <w:r>
         <w:rPr>
           <w:noProof/>
         </w:rPr>
         <w:drawing>
-          <wp:inline distT="0" distB="0" distL="0" distR="0" wp14:anchorId="3EA398AC" wp14:editId="2524D64D">
+          <wp:inline distT="0" distB="0" distL="0" distR="0" wp14:anchorId="70B7D69D" wp14:editId="57B14589">
             <wp:extent cx="2380711" cy="1371599"/>
             <wp:effectExtent l="0" t="0" r="635" b="635"/>
             <wp:docPr id="6" name="Picture 6"/>
@@ -69,8 +71,6 @@
       <w:pPr>
         <w:pStyle w:val="EDBTXTNormalWebBlackCharChar0"/>
       </w:pPr>
-      <w:bookmarkStart w:id="0" w:name="_GoBack"/>
-      <w:bookmarkEnd w:id="0"/>
     </w:p>
     <w:p>
       <w:pPr>
@@ -228,7 +228,10 @@
         <w:pStyle w:val="EDBCoverProductDate"/>
       </w:pPr>
       <w:r>
-        <w:t>November 6</w:t>
+        <w:t xml:space="preserve">November </w:t>
+      </w:r>
+      <w:r>
+        <w:t>21</w:t>
       </w:r>
       <w:r>
         <w:t>, 2017</w:t>
@@ -529,7 +532,7 @@
       <w:r>
         <w:fldChar w:fldCharType="separate"/>
       </w:r>
-      <w:hyperlink w:anchor="_Toc497743210" w:history="1">
+      <w:hyperlink w:anchor="_Toc499035427" w:history="1">
         <w:r>
           <w:rPr>
             <w:rStyle w:val="Hyperlink"/>
@@ -569,7 +572,7 @@
           <w:rPr>
             <w:noProof/>
           </w:rPr>
-          <w:instrText xml:space="preserve"> PAGEREF _Toc497743210 \h </w:instrText>
+          <w:instrText xml:space="preserve"> PAGEREF _Toc499035427 \h </w:instrText>
         </w:r>
         <w:r>
           <w:rPr>
@@ -610,7 +613,7 @@
           <w:szCs w:val="22"/>
         </w:rPr>
       </w:pPr>
-      <w:hyperlink w:anchor="_Toc497743211" w:history="1">
+      <w:hyperlink w:anchor="_Toc499035428" w:history="1">
         <w:r>
           <w:rPr>
             <w:rStyle w:val="Hyperlink"/>
@@ -650,7 +653,7 @@
           <w:rPr>
             <w:noProof/>
           </w:rPr>
-          <w:instrText xml:space="preserve"> PAGEREF _Toc497743211 \h </w:instrText>
+          <w:instrText xml:space="preserve"> PAGEREF _Toc499035428 \h </w:instrText>
         </w:r>
         <w:r>
           <w:rPr>
@@ -691,7 +694,7 @@
           <w:szCs w:val="22"/>
         </w:rPr>
       </w:pPr>
-      <w:hyperlink w:anchor="_Toc497743212" w:history="1">
+      <w:hyperlink w:anchor="_Toc499035429" w:history="1">
         <w:r>
           <w:rPr>
             <w:rStyle w:val="Hyperlink"/>
@@ -731,7 +734,7 @@
           <w:rPr>
             <w:noProof/>
           </w:rPr>
-          <w:instrText xml:space="preserve"> PAGEREF _Toc497743212 \h </w:instrText>
+          <w:instrText xml:space="preserve"> PAGEREF _Toc499035429 \h </w:instrText>
         </w:r>
         <w:r>
           <w:rPr>
@@ -772,7 +775,7 @@
           <w:szCs w:val="22"/>
         </w:rPr>
       </w:pPr>
-      <w:hyperlink w:anchor="_Toc497743213" w:history="1">
+      <w:hyperlink w:anchor="_Toc499035430" w:history="1">
         <w:r>
           <w:rPr>
             <w:rStyle w:val="Hyperlink"/>
@@ -812,7 +815,7 @@
           <w:rPr>
             <w:noProof/>
           </w:rPr>
-          <w:instrText xml:space="preserve"> PAGEREF _Toc497743213 \h </w:instrText>
+          <w:instrText xml:space="preserve"> PAGEREF _Toc499035430 \h </w:instrText>
         </w:r>
         <w:r>
           <w:rPr>
@@ -853,7 +856,7 @@
           <w:szCs w:val="22"/>
         </w:rPr>
       </w:pPr>
-      <w:hyperlink w:anchor="_Toc497743214" w:history="1">
+      <w:hyperlink w:anchor="_Toc499035431" w:history="1">
         <w:r>
           <w:rPr>
             <w:rStyle w:val="Hyperlink"/>
@@ -893,7 +896,7 @@
           <w:rPr>
             <w:noProof/>
           </w:rPr>
-          <w:instrText xml:space="preserve"> PAGEREF _Toc497743214 \h </w:instrText>
+          <w:instrText xml:space="preserve"> PAGEREF _Toc499035431 \h </w:instrText>
         </w:r>
         <w:r>
           <w:rPr>
@@ -934,7 +937,7 @@
           <w:szCs w:val="22"/>
         </w:rPr>
       </w:pPr>
-      <w:hyperlink w:anchor="_Toc497743215" w:history="1">
+      <w:hyperlink w:anchor="_Toc499035432" w:history="1">
         <w:r>
           <w:rPr>
             <w:rStyle w:val="Hyperlink"/>
@@ -974,7 +977,7 @@
           <w:rPr>
             <w:noProof/>
           </w:rPr>
-          <w:instrText xml:space="preserve"> PAGEREF _Toc497743215 \h </w:instrText>
+          <w:instrText xml:space="preserve"> PAGEREF _Toc499035432 \h </w:instrText>
         </w:r>
         <w:r>
           <w:rPr>
@@ -1015,7 +1018,7 @@
           <w:szCs w:val="22"/>
         </w:rPr>
       </w:pPr>
-      <w:hyperlink w:anchor="_Toc497743216" w:history="1">
+      <w:hyperlink w:anchor="_Toc499035433" w:history="1">
         <w:r>
           <w:rPr>
             <w:rStyle w:val="Hyperlink"/>
@@ -1055,7 +1058,7 @@
           <w:rPr>
             <w:noProof/>
           </w:rPr>
-          <w:instrText xml:space="preserve"> PAGEREF _Toc497743216 \h </w:instrText>
+          <w:instrText xml:space="preserve"> PAGEREF _Toc499035433 \h </w:instrText>
         </w:r>
         <w:r>
           <w:rPr>
@@ -1096,7 +1099,7 @@
           <w:szCs w:val="22"/>
         </w:rPr>
       </w:pPr>
-      <w:hyperlink w:anchor="_Toc497743217" w:history="1">
+      <w:hyperlink w:anchor="_Toc499035434" w:history="1">
         <w:r>
           <w:rPr>
             <w:rStyle w:val="Hyperlink"/>
@@ -1136,7 +1139,7 @@
           <w:rPr>
             <w:noProof/>
           </w:rPr>
-          <w:instrText xml:space="preserve"> PAGEREF _Toc497743217 \h </w:instrText>
+          <w:instrText xml:space="preserve"> PAGEREF _Toc499035434 \h </w:instrText>
         </w:r>
         <w:r>
           <w:rPr>
@@ -1177,7 +1180,7 @@
           <w:szCs w:val="22"/>
         </w:rPr>
       </w:pPr>
-      <w:hyperlink w:anchor="_Toc497743218" w:history="1">
+      <w:hyperlink w:anchor="_Toc499035435" w:history="1">
         <w:r>
           <w:rPr>
             <w:rStyle w:val="Hyperlink"/>
@@ -1217,7 +1220,7 @@
           <w:rPr>
             <w:noProof/>
           </w:rPr>
-          <w:instrText xml:space="preserve"> PAGEREF _Toc497743218 \h </w:instrText>
+          <w:instrText xml:space="preserve"> PAGEREF _Toc499035435 \h </w:instrText>
         </w:r>
         <w:r>
           <w:rPr>
@@ -1258,7 +1261,7 @@
           <w:szCs w:val="22"/>
         </w:rPr>
       </w:pPr>
-      <w:hyperlink w:anchor="_Toc497743219" w:history="1">
+      <w:hyperlink w:anchor="_Toc499035436" w:history="1">
         <w:r>
           <w:rPr>
             <w:rStyle w:val="Hyperlink"/>
@@ -1298,7 +1301,7 @@
           <w:rPr>
             <w:noProof/>
           </w:rPr>
-          <w:instrText xml:space="preserve"> PAGEREF _Toc497743219 \h </w:instrText>
+          <w:instrText xml:space="preserve"> PAGEREF _Toc499035436 \h </w:instrText>
         </w:r>
         <w:r>
           <w:rPr>
@@ -1339,7 +1342,7 @@
           <w:szCs w:val="22"/>
         </w:rPr>
       </w:pPr>
-      <w:hyperlink w:anchor="_Toc497743220" w:history="1">
+      <w:hyperlink w:anchor="_Toc499035437" w:history="1">
         <w:r>
           <w:rPr>
             <w:rStyle w:val="Hyperlink"/>
@@ -1379,7 +1382,7 @@
           <w:rPr>
             <w:noProof/>
           </w:rPr>
-          <w:instrText xml:space="preserve"> PAGEREF _Toc497743220 \h </w:instrText>
+          <w:instrText xml:space="preserve"> PAGEREF _Toc499035437 \h </w:instrText>
         </w:r>
         <w:r>
           <w:rPr>
@@ -1420,7 +1423,7 @@
           <w:szCs w:val="22"/>
         </w:rPr>
       </w:pPr>
-      <w:hyperlink w:anchor="_Toc497743221" w:history="1">
+      <w:hyperlink w:anchor="_Toc499035438" w:history="1">
         <w:r>
           <w:rPr>
             <w:rStyle w:val="Hyperlink"/>
@@ -1460,7 +1463,7 @@
           <w:rPr>
             <w:noProof/>
           </w:rPr>
-          <w:instrText xml:space="preserve"> PAGEREF _Toc497743221 \h </w:instrText>
+          <w:instrText xml:space="preserve"> PAGEREF _Toc499035438 \h </w:instrText>
         </w:r>
         <w:r>
           <w:rPr>
@@ -1501,7 +1504,7 @@
           <w:szCs w:val="22"/>
         </w:rPr>
       </w:pPr>
-      <w:hyperlink w:anchor="_Toc497743222" w:history="1">
+      <w:hyperlink w:anchor="_Toc499035439" w:history="1">
         <w:r>
           <w:rPr>
             <w:rStyle w:val="Hyperlink"/>
@@ -1541,7 +1544,7 @@
           <w:rPr>
             <w:noProof/>
           </w:rPr>
-          <w:instrText xml:space="preserve"> PAGEREF _Toc497743222 \h </w:instrText>
+          <w:instrText xml:space="preserve"> PAGEREF _Toc499035439 \h </w:instrText>
         </w:r>
         <w:r>
           <w:rPr>
@@ -1577,7 +1580,7 @@
           <w:szCs w:val="22"/>
         </w:rPr>
       </w:pPr>
-      <w:hyperlink w:anchor="_Toc497743223" w:history="1">
+      <w:hyperlink w:anchor="_Toc499035440" w:history="1">
         <w:r>
           <w:rPr>
             <w:rStyle w:val="Hyperlink"/>
@@ -1605,7 +1608,7 @@
           <w:fldChar w:fldCharType="begin"/>
         </w:r>
         <w:r>
-          <w:instrText xml:space="preserve"> PAGEREF _Toc497743223 \h </w:instrText>
+          <w:instrText xml:space="preserve"> PAGEREF _Toc499035440 \h </w:instrText>
         </w:r>
         <w:r>
           <w:fldChar w:fldCharType="separate"/>
@@ -1627,7 +1630,7 @@
           <w:szCs w:val="22"/>
         </w:rPr>
       </w:pPr>
-      <w:hyperlink w:anchor="_Toc497743224" w:history="1">
+      <w:hyperlink w:anchor="_Toc499035441" w:history="1">
         <w:r>
           <w:rPr>
             <w:rStyle w:val="Hyperlink"/>
@@ -1655,7 +1658,7 @@
           <w:fldChar w:fldCharType="begin"/>
         </w:r>
         <w:r>
-          <w:instrText xml:space="preserve"> PAGEREF _Toc497743224 \h </w:instrText>
+          <w:instrText xml:space="preserve"> PAGEREF _Toc499035441 \h </w:instrText>
         </w:r>
         <w:r>
           <w:fldChar w:fldCharType="separate"/>
@@ -1677,7 +1680,7 @@
           <w:szCs w:val="22"/>
         </w:rPr>
       </w:pPr>
-      <w:hyperlink w:anchor="_Toc497743225" w:history="1">
+      <w:hyperlink w:anchor="_Toc499035442" w:history="1">
         <w:r>
           <w:rPr>
             <w:rStyle w:val="Hyperlink"/>
@@ -1705,7 +1708,7 @@
           <w:fldChar w:fldCharType="begin"/>
         </w:r>
         <w:r>
-          <w:instrText xml:space="preserve"> PAGEREF _Toc497743225 \h </w:instrText>
+          <w:instrText xml:space="preserve"> PAGEREF _Toc499035442 \h </w:instrText>
         </w:r>
         <w:r>
           <w:fldChar w:fldCharType="separate"/>
@@ -1727,7 +1730,7 @@
           <w:szCs w:val="22"/>
         </w:rPr>
       </w:pPr>
-      <w:hyperlink w:anchor="_Toc497743226" w:history="1">
+      <w:hyperlink w:anchor="_Toc499035443" w:history="1">
         <w:r>
           <w:rPr>
             <w:rStyle w:val="Hyperlink"/>
@@ -1755,7 +1758,7 @@
           <w:fldChar w:fldCharType="begin"/>
         </w:r>
         <w:r>
-          <w:instrText xml:space="preserve"> PAGEREF _Toc497743226 \h </w:instrText>
+          <w:instrText xml:space="preserve"> PAGEREF _Toc499035443 \h </w:instrText>
         </w:r>
         <w:r>
           <w:fldChar w:fldCharType="separate"/>
@@ -1782,7 +1785,7 @@
           <w:szCs w:val="22"/>
         </w:rPr>
       </w:pPr>
-      <w:hyperlink w:anchor="_Toc497743227" w:history="1">
+      <w:hyperlink w:anchor="_Toc499035444" w:history="1">
         <w:r>
           <w:rPr>
             <w:rStyle w:val="Hyperlink"/>
@@ -1822,7 +1825,7 @@
           <w:rPr>
             <w:noProof/>
           </w:rPr>
-          <w:instrText xml:space="preserve"> PAGEREF _Toc497743227 \h </w:instrText>
+          <w:instrText xml:space="preserve"> PAGEREF _Toc499035444 \h </w:instrText>
         </w:r>
         <w:r>
           <w:rPr>
@@ -1858,7 +1861,7 @@
           <w:szCs w:val="22"/>
         </w:rPr>
       </w:pPr>
-      <w:hyperlink w:anchor="_Toc497743228" w:history="1">
+      <w:hyperlink w:anchor="_Toc499035445" w:history="1">
         <w:r>
           <w:rPr>
             <w:rStyle w:val="Hyperlink"/>
@@ -1886,7 +1889,7 @@
           <w:fldChar w:fldCharType="begin"/>
         </w:r>
         <w:r>
-          <w:instrText xml:space="preserve"> PAGEREF _Toc497743228 \h </w:instrText>
+          <w:instrText xml:space="preserve"> PAGEREF _Toc499035445 \h </w:instrText>
         </w:r>
         <w:r>
           <w:fldChar w:fldCharType="separate"/>
@@ -1913,7 +1916,7 @@
           <w:szCs w:val="22"/>
         </w:rPr>
       </w:pPr>
-      <w:hyperlink w:anchor="_Toc497743229" w:history="1">
+      <w:hyperlink w:anchor="_Toc499035446" w:history="1">
         <w:r>
           <w:rPr>
             <w:rStyle w:val="Hyperlink"/>
@@ -1953,7 +1956,7 @@
           <w:rPr>
             <w:noProof/>
           </w:rPr>
-          <w:instrText xml:space="preserve"> PAGEREF _Toc497743229 \h </w:instrText>
+          <w:instrText xml:space="preserve"> PAGEREF _Toc499035446 \h </w:instrText>
         </w:r>
         <w:r>
           <w:rPr>
@@ -1994,7 +1997,7 @@
           <w:szCs w:val="22"/>
         </w:rPr>
       </w:pPr>
-      <w:hyperlink w:anchor="_Toc497743230" w:history="1">
+      <w:hyperlink w:anchor="_Toc499035447" w:history="1">
         <w:r>
           <w:rPr>
             <w:rStyle w:val="Hyperlink"/>
@@ -2034,7 +2037,7 @@
           <w:rPr>
             <w:noProof/>
           </w:rPr>
-          <w:instrText xml:space="preserve"> PAGEREF _Toc497743230 \h </w:instrText>
+          <w:instrText xml:space="preserve"> PAGEREF _Toc499035447 \h </w:instrText>
         </w:r>
         <w:r>
           <w:rPr>
@@ -2075,7 +2078,7 @@
           <w:szCs w:val="22"/>
         </w:rPr>
       </w:pPr>
-      <w:hyperlink w:anchor="_Toc497743231" w:history="1">
+      <w:hyperlink w:anchor="_Toc499035448" w:history="1">
         <w:r>
           <w:rPr>
             <w:rStyle w:val="Hyperlink"/>
@@ -2115,7 +2118,7 @@
           <w:rPr>
             <w:noProof/>
           </w:rPr>
-          <w:instrText xml:space="preserve"> PAGEREF _Toc497743231 \h </w:instrText>
+          <w:instrText xml:space="preserve"> PAGEREF _Toc499035448 \h </w:instrText>
         </w:r>
         <w:r>
           <w:rPr>
@@ -2156,7 +2159,7 @@
           <w:szCs w:val="22"/>
         </w:rPr>
       </w:pPr>
-      <w:hyperlink w:anchor="_Toc497743232" w:history="1">
+      <w:hyperlink w:anchor="_Toc499035449" w:history="1">
         <w:r>
           <w:rPr>
             <w:rStyle w:val="Hyperlink"/>
@@ -2196,7 +2199,7 @@
           <w:rPr>
             <w:noProof/>
           </w:rPr>
-          <w:instrText xml:space="preserve"> PAGEREF _Toc497743232 \h </w:instrText>
+          <w:instrText xml:space="preserve"> PAGEREF _Toc499035449 \h </w:instrText>
         </w:r>
         <w:r>
           <w:rPr>
@@ -2232,7 +2235,7 @@
           <w:szCs w:val="22"/>
         </w:rPr>
       </w:pPr>
-      <w:hyperlink w:anchor="_Toc497743233" w:history="1">
+      <w:hyperlink w:anchor="_Toc499035450" w:history="1">
         <w:r>
           <w:rPr>
             <w:rStyle w:val="Hyperlink"/>
@@ -2260,7 +2263,7 @@
           <w:fldChar w:fldCharType="begin"/>
         </w:r>
         <w:r>
-          <w:instrText xml:space="preserve"> PAGEREF _Toc497743233 \h </w:instrText>
+          <w:instrText xml:space="preserve"> PAGEREF _Toc499035450 \h </w:instrText>
         </w:r>
         <w:r>
           <w:fldChar w:fldCharType="separate"/>
@@ -2282,7 +2285,7 @@
           <w:szCs w:val="22"/>
         </w:rPr>
       </w:pPr>
-      <w:hyperlink w:anchor="_Toc497743234" w:history="1">
+      <w:hyperlink w:anchor="_Toc499035451" w:history="1">
         <w:r>
           <w:rPr>
             <w:rStyle w:val="Hyperlink"/>
@@ -2310,7 +2313,7 @@
           <w:fldChar w:fldCharType="begin"/>
         </w:r>
         <w:r>
-          <w:instrText xml:space="preserve"> PAGEREF _Toc497743234 \h </w:instrText>
+          <w:instrText xml:space="preserve"> PAGEREF _Toc499035451 \h </w:instrText>
         </w:r>
         <w:r>
           <w:fldChar w:fldCharType="separate"/>
@@ -2332,7 +2335,7 @@
           <w:szCs w:val="22"/>
         </w:rPr>
       </w:pPr>
-      <w:hyperlink w:anchor="_Toc497743235" w:history="1">
+      <w:hyperlink w:anchor="_Toc499035452" w:history="1">
         <w:r>
           <w:rPr>
             <w:rStyle w:val="Hyperlink"/>
@@ -2360,7 +2363,7 @@
           <w:fldChar w:fldCharType="begin"/>
         </w:r>
         <w:r>
-          <w:instrText xml:space="preserve"> PAGEREF _Toc497743235 \h </w:instrText>
+          <w:instrText xml:space="preserve"> PAGEREF _Toc499035452 \h </w:instrText>
         </w:r>
         <w:r>
           <w:fldChar w:fldCharType="separate"/>
@@ -2387,7 +2390,7 @@
           <w:szCs w:val="22"/>
         </w:rPr>
       </w:pPr>
-      <w:hyperlink w:anchor="_Toc497743236" w:history="1">
+      <w:hyperlink w:anchor="_Toc499035453" w:history="1">
         <w:r>
           <w:rPr>
             <w:rStyle w:val="Hyperlink"/>
@@ -2427,7 +2430,7 @@
           <w:rPr>
             <w:noProof/>
           </w:rPr>
-          <w:instrText xml:space="preserve"> PAGEREF _Toc497743236 \h </w:instrText>
+          <w:instrText xml:space="preserve"> PAGEREF _Toc499035453 \h </w:instrText>
         </w:r>
         <w:r>
           <w:rPr>
@@ -2485,7 +2488,7 @@
       <w:pPr>
         <w:pStyle w:val="Heading1"/>
       </w:pPr>
-      <w:bookmarkStart w:id="1" w:name="_Toc497743210"/>
+      <w:bookmarkStart w:id="1" w:name="_Toc499035427"/>
       <w:r>
         <w:lastRenderedPageBreak/>
         <w:t>Introduction</w:t>
@@ -2670,7 +2673,7 @@
       <w:bookmarkStart w:id="9" w:name="_Ref103071794"/>
       <w:bookmarkStart w:id="10" w:name="_Ref103073047"/>
       <w:bookmarkStart w:id="11" w:name="_Ref103073090"/>
-      <w:bookmarkStart w:id="12" w:name="_Toc497743211"/>
+      <w:bookmarkStart w:id="12" w:name="_Toc499035428"/>
       <w:bookmarkEnd w:id="2"/>
       <w:bookmarkEnd w:id="3"/>
       <w:bookmarkEnd w:id="4"/>
@@ -3069,7 +3072,7 @@
       <w:pPr>
         <w:pStyle w:val="Heading1"/>
       </w:pPr>
-      <w:bookmarkStart w:id="14" w:name="_Toc497743212"/>
+      <w:bookmarkStart w:id="14" w:name="_Toc499035429"/>
       <w:r>
         <w:lastRenderedPageBreak/>
         <w:t>The Advanced Server .NET Connector - Overview</w:t>
@@ -3135,7 +3138,7 @@
       <w:pPr>
         <w:pStyle w:val="Heading2"/>
       </w:pPr>
-      <w:bookmarkStart w:id="15" w:name="_Toc497743213"/>
+      <w:bookmarkStart w:id="15" w:name="_Toc499035430"/>
       <w:r>
         <w:t>The .NET Class Hierarchy</w:t>
       </w:r>
@@ -3422,7 +3425,7 @@
       <w:pPr>
         <w:pStyle w:val="Heading2"/>
       </w:pPr>
-      <w:bookmarkStart w:id="16" w:name="_Toc497743214"/>
+      <w:bookmarkStart w:id="16" w:name="_Toc499035431"/>
       <w:r>
         <w:lastRenderedPageBreak/>
         <w:t>Installing the .NET Connector</w:t>
@@ -3434,34 +3437,73 @@
         <w:pStyle w:val="EDBTXTNormalWebBlackCharChar0"/>
       </w:pPr>
       <w:r>
-        <w:t xml:space="preserve">By default, the Advanced Server graphical installer for Windows installs the .NET </w:t>
+        <w:t xml:space="preserve">You can use the </w:t>
+      </w:r>
+      <w:proofErr w:type="spellStart"/>
+      <w:r>
+        <w:t>EnterpriseDB</w:t>
+      </w:r>
+      <w:proofErr w:type="spellEnd"/>
+      <w:r>
+        <w:t xml:space="preserve"> </w:t>
+      </w:r>
+      <w:r>
+        <w:t>Connectors Ins</w:t>
+      </w:r>
+      <w:r>
+        <w:t>tallation wizard to add the .NET</w:t>
+      </w:r>
+      <w:r>
+        <w:t xml:space="preserve"> </w:t>
       </w:r>
       <w:r>
         <w:t xml:space="preserve">Connector </w:t>
       </w:r>
       <w:r>
-        <w:t xml:space="preserve">when you install Advanced Server.  To ensure that the .NET </w:t>
-      </w:r>
-      <w:r>
-        <w:t xml:space="preserve">Connector </w:t>
-      </w:r>
-      <w:r>
-        <w:t xml:space="preserve">is installed during an Advanced Server installation, confirm that the check box next to </w:t>
-      </w:r>
-      <w:r>
-        <w:rPr>
-          <w:rStyle w:val="EDBTXTKeywordBlack"/>
-        </w:rPr>
-        <w:t>Connectors</w:t>
-      </w:r>
-      <w:r>
-        <w:t xml:space="preserve"> is checked on the </w:t>
-      </w:r>
-      <w:r>
-        <w:rPr>
-          <w:rStyle w:val="EDBTXTKeywordBlack"/>
-        </w:rPr>
-        <w:t>Select</w:t>
+        <w:t xml:space="preserve">to your system; the </w:t>
+      </w:r>
+      <w:r>
+        <w:t>installer</w:t>
+      </w:r>
+      <w:r>
+        <w:t xml:space="preserve"> is available at:</w:t>
+      </w:r>
+    </w:p>
+    <w:p>
+      <w:pPr>
+        <w:pStyle w:val="EDBTXTNormalWebBlackCharChar0"/>
+        <w:jc w:val="center"/>
+      </w:pPr>
+      <w:hyperlink r:id="rId18" w:history="1">
+        <w:r>
+          <w:rPr>
+            <w:rStyle w:val="Hyperlink"/>
+          </w:rPr>
+          <w:t>www.enterprisedb.com</w:t>
+        </w:r>
+      </w:hyperlink>
+    </w:p>
+    <w:p>
+      <w:pPr>
+        <w:pStyle w:val="EDBTXTNormalWebBlackCharChar0"/>
+      </w:pPr>
+      <w:r>
+        <w:t>After d</w:t>
+      </w:r>
+      <w:r>
+        <w:t>ownload</w:t>
+      </w:r>
+      <w:r>
+        <w:t>ing</w:t>
+      </w:r>
+      <w:r>
+        <w:t xml:space="preserve"> the installer, right-click on the installer icon, and select </w:t>
+      </w:r>
+      <w:r>
+        <w:rPr>
+          <w:rStyle w:val="EDBTXTKeywordBlack"/>
+        </w:rPr>
+        <w:t>Run</w:t>
       </w:r>
       <w:r>
         <w:t xml:space="preserve"> </w:t>
@@ -3470,10 +3512,37 @@
         <w:rPr>
           <w:rStyle w:val="EDBTXTKeywordBlack"/>
         </w:rPr>
-        <w:t>Components</w:t>
-      </w:r>
-      <w:r>
-        <w:t xml:space="preserve"> window of the installation wizard (see Figure 2.1).</w:t>
+        <w:t>As</w:t>
+      </w:r>
+      <w:r>
+        <w:t xml:space="preserve"> </w:t>
+      </w:r>
+      <w:r>
+        <w:rPr>
+          <w:rStyle w:val="EDBTXTKeywordBlack"/>
+        </w:rPr>
+        <w:t>Administrator</w:t>
+      </w:r>
+      <w:r>
+        <w:t xml:space="preserve"> from the context menu. </w:t>
+      </w:r>
+      <w:r>
+        <w:t xml:space="preserve"> </w:t>
+      </w:r>
+      <w:r>
+        <w:t>The installation</w:t>
+      </w:r>
+      <w:r>
+        <w:t xml:space="preserve"> wiz</w:t>
+      </w:r>
+      <w:r>
+        <w:t>ard opens as shown in Figure 2.</w:t>
+      </w:r>
+      <w:r>
+        <w:t>1</w:t>
+      </w:r>
+      <w:r>
+        <w:t>.</w:t>
       </w:r>
     </w:p>
     <w:p>
@@ -3486,10 +3555,10 @@
           <w:noProof/>
         </w:rPr>
         <w:drawing>
-          <wp:inline distT="0" distB="0" distL="0" distR="0" wp14:anchorId="781C3BDE" wp14:editId="6E31B5F2">
-            <wp:extent cx="4114800" cy="2728253"/>
+          <wp:inline distT="0" distB="0" distL="0" distR="0" wp14:anchorId="5D686578" wp14:editId="09099DAB">
+            <wp:extent cx="3886200" cy="3037805"/>
             <wp:effectExtent l="0" t="0" r="0" b="0"/>
-            <wp:docPr id="9" name="Picture 9"/>
+            <wp:docPr id="2" name="Picture 2"/>
             <wp:cNvGraphicFramePr>
               <a:graphicFrameLocks xmlns:a="http://schemas.openxmlformats.org/drawingml/2006/main" noChangeAspect="1"/>
             </wp:cNvGraphicFramePr>
@@ -3501,7 +3570,7 @@
                     <pic:cNvPicPr/>
                   </pic:nvPicPr>
                   <pic:blipFill>
-                    <a:blip r:embed="rId18"/>
+                    <a:blip r:embed="rId19"/>
                     <a:stretch>
                       <a:fillRect/>
                     </a:stretch>
@@ -3509,7 +3578,7 @@
                   <pic:spPr>
                     <a:xfrm>
                       <a:off x="0" y="0"/>
-                      <a:ext cx="4114800" cy="2728253"/>
+                      <a:ext cx="3886200" cy="3037805"/>
                     </a:xfrm>
                     <a:prstGeom prst="rect">
                       <a:avLst/>
@@ -3534,129 +3603,54 @@
         <w:rPr>
           <w:i/>
         </w:rPr>
-        <w:t>Figure 2.1</w:t>
+        <w:t xml:space="preserve">Figure </w:t>
       </w:r>
       <w:r>
         <w:rPr>
           <w:i/>
         </w:rPr>
-        <w:t xml:space="preserve"> - The Select Components dialog.</w:t>
-      </w:r>
-    </w:p>
-    <w:p>
-      <w:pPr>
-        <w:pStyle w:val="EDBTXTNormalWebBlackCharChar0"/>
-      </w:pPr>
-    </w:p>
-    <w:p>
-      <w:pPr>
-        <w:pStyle w:val="EDBTXTNormalWebBlackCharChar0"/>
-      </w:pPr>
-      <w:r>
-        <w:t xml:space="preserve">You can </w:t>
-      </w:r>
-      <w:r>
-        <w:t xml:space="preserve">also </w:t>
-      </w:r>
-      <w:r>
-        <w:t xml:space="preserve">use the </w:t>
-      </w:r>
-      <w:r>
-        <w:t xml:space="preserve">EnterpriseDB </w:t>
-      </w:r>
-      <w:r>
-        <w:t>Connectors Ins</w:t>
-      </w:r>
-      <w:r>
-        <w:t>tallation wizard to add the .NET</w:t>
-      </w:r>
-      <w:r>
-        <w:t xml:space="preserve"> </w:t>
-      </w:r>
-      <w:r>
-        <w:t xml:space="preserve">Connector </w:t>
-      </w:r>
-      <w:r>
-        <w:t xml:space="preserve">to your system; the </w:t>
-      </w:r>
-      <w:r>
-        <w:t>installer</w:t>
-      </w:r>
-      <w:r>
-        <w:t xml:space="preserve"> is available at:</w:t>
-      </w:r>
-    </w:p>
-    <w:p>
-      <w:pPr>
-        <w:pStyle w:val="EDBTXTNormalWebBlackCharChar0"/>
-        <w:jc w:val="center"/>
-      </w:pPr>
-      <w:hyperlink r:id="rId19" w:history="1">
-        <w:r>
-          <w:rPr>
-            <w:rStyle w:val="Hyperlink"/>
-          </w:rPr>
-          <w:t>www.enterprisedb.com</w:t>
-        </w:r>
-      </w:hyperlink>
-    </w:p>
-    <w:p>
-      <w:pPr>
-        <w:pStyle w:val="EDBTXTNormalWebBlackCharChar0"/>
-      </w:pPr>
-      <w:r>
-        <w:t>After d</w:t>
-      </w:r>
-      <w:r>
-        <w:t>ownload</w:t>
-      </w:r>
-      <w:r>
-        <w:t>ing</w:t>
-      </w:r>
-      <w:r>
-        <w:t xml:space="preserve"> the installer, right-click on the installer icon, and select </w:t>
-      </w:r>
-      <w:r>
-        <w:rPr>
-          <w:rStyle w:val="EDBTXTKeywordBlack"/>
-        </w:rPr>
-        <w:t>Run</w:t>
-      </w:r>
-      <w:r>
-        <w:t xml:space="preserve"> </w:t>
-      </w:r>
-      <w:r>
-        <w:rPr>
-          <w:rStyle w:val="EDBTXTKeywordBlack"/>
-        </w:rPr>
-        <w:t>As</w:t>
-      </w:r>
-      <w:r>
-        <w:t xml:space="preserve"> </w:t>
-      </w:r>
-      <w:r>
-        <w:rPr>
-          <w:rStyle w:val="EDBTXTKeywordBlack"/>
-        </w:rPr>
-        <w:t>Administrator</w:t>
-      </w:r>
-      <w:r>
-        <w:t xml:space="preserve"> from the context menu. </w:t>
-      </w:r>
-      <w:r>
-        <w:t xml:space="preserve"> </w:t>
-      </w:r>
-      <w:r>
-        <w:t>The installation</w:t>
-      </w:r>
-      <w:r>
-        <w:t xml:space="preserve"> wiz</w:t>
-      </w:r>
-      <w:r>
-        <w:t>ard opens as shown in Figure 2.2</w:t>
-      </w:r>
-      <w:r>
+        <w:t>2.</w:t>
+      </w:r>
+      <w:r>
+        <w:rPr>
+          <w:i/>
+        </w:rPr>
+        <w:t>1</w:t>
+      </w:r>
+      <w:r>
+        <w:rPr>
+          <w:i/>
+        </w:rPr>
+        <w:t xml:space="preserve"> - The </w:t>
+      </w:r>
+      <w:r>
+        <w:rPr>
+          <w:i/>
+        </w:rPr>
+        <w:t>Connectors Installation wizard</w:t>
+      </w:r>
+      <w:r>
+        <w:rPr>
+          <w:i/>
+        </w:rPr>
         <w:t>.</w:t>
+      </w:r>
+    </w:p>
+    <w:p>
+      <w:pPr>
+        <w:pStyle w:val="EDBTXTNormalWebBlackCharChar0"/>
+      </w:pPr>
+      <w:r>
+        <w:t xml:space="preserve">Click </w:t>
+      </w:r>
+      <w:r>
+        <w:rPr>
+          <w:rStyle w:val="EDBTXTKeywordBlack"/>
+        </w:rPr>
+        <w:t>Next</w:t>
+      </w:r>
+      <w:r>
+        <w:t xml:space="preserve"> to continue.</w:t>
       </w:r>
     </w:p>
     <w:p>
@@ -3670,10 +3664,10 @@
         </w:rPr>
         <w:lastRenderedPageBreak/>
         <w:drawing>
-          <wp:inline distT="0" distB="0" distL="0" distR="0" wp14:anchorId="041E0053" wp14:editId="0DFF29ED">
-            <wp:extent cx="3886200" cy="3037805"/>
-            <wp:effectExtent l="0" t="0" r="0" b="0"/>
-            <wp:docPr id="2" name="Picture 2"/>
+          <wp:inline distT="0" distB="0" distL="0" distR="0" wp14:anchorId="62AFAF22" wp14:editId="08DE9B4C">
+            <wp:extent cx="3886200" cy="3046927"/>
+            <wp:effectExtent l="0" t="0" r="0" b="1270"/>
+            <wp:docPr id="3" name="Picture 3"/>
             <wp:cNvGraphicFramePr>
               <a:graphicFrameLocks xmlns:a="http://schemas.openxmlformats.org/drawingml/2006/main" noChangeAspect="1"/>
             </wp:cNvGraphicFramePr>
@@ -3693,7 +3687,7 @@
                   <pic:spPr>
                     <a:xfrm>
                       <a:off x="0" y="0"/>
-                      <a:ext cx="3886200" cy="3037805"/>
+                      <a:ext cx="3886200" cy="3046927"/>
                     </a:xfrm>
                     <a:prstGeom prst="rect">
                       <a:avLst/>
@@ -3718,39 +3712,72 @@
         <w:rPr>
           <w:i/>
         </w:rPr>
-        <w:t xml:space="preserve">Figure </w:t>
+        <w:t>Figure</w:t>
       </w:r>
       <w:r>
         <w:rPr>
           <w:i/>
         </w:rPr>
-        <w:t>2.2</w:t>
+        <w:t xml:space="preserve"> 2.</w:t>
       </w:r>
       <w:r>
         <w:rPr>
           <w:i/>
         </w:rPr>
-        <w:t xml:space="preserve"> - The </w:t>
+        <w:t>2</w:t>
       </w:r>
       <w:r>
         <w:rPr>
           <w:i/>
         </w:rPr>
-        <w:t>Connectors Installation wizard</w:t>
+        <w:t xml:space="preserve">- The </w:t>
       </w:r>
       <w:r>
         <w:rPr>
           <w:i/>
         </w:rPr>
-        <w:t>.</w:t>
-      </w:r>
-    </w:p>
-    <w:p>
-      <w:pPr>
-        <w:pStyle w:val="EDBTXTNormalWebBlackCharChar0"/>
-      </w:pPr>
-      <w:r>
-        <w:t xml:space="preserve">Click </w:t>
+        <w:t>Installation</w:t>
+      </w:r>
+      <w:r>
+        <w:rPr>
+          <w:i/>
+        </w:rPr>
+        <w:t xml:space="preserve"> dialog.</w:t>
+      </w:r>
+    </w:p>
+    <w:p>
+      <w:pPr>
+        <w:pStyle w:val="EDBTXTNormalWebBlackCharChar0"/>
+      </w:pPr>
+      <w:r>
+        <w:t xml:space="preserve">Use the </w:t>
+      </w:r>
+      <w:r>
+        <w:rPr>
+          <w:rStyle w:val="EDBTXTKeywordBlack"/>
+        </w:rPr>
+        <w:t>Installation</w:t>
+      </w:r>
+      <w:r>
+        <w:t xml:space="preserve"> </w:t>
+      </w:r>
+      <w:r>
+        <w:rPr>
+          <w:rStyle w:val="EDBTXTKeywordBlack"/>
+        </w:rPr>
+        <w:t>Directory</w:t>
+      </w:r>
+      <w:r>
+        <w:t xml:space="preserve"> dialog</w:t>
+      </w:r>
+      <w:r>
+        <w:t xml:space="preserve"> (see Figure 2.</w:t>
+      </w:r>
+      <w:r>
+        <w:t>2</w:t>
+      </w:r>
+      <w:r>
+        <w:t xml:space="preserve">) to specify the directory in which the connector will be installed, and click </w:t>
       </w:r>
       <w:r>
         <w:rPr>
@@ -3772,10 +3799,10 @@
           <w:noProof/>
         </w:rPr>
         <w:drawing>
-          <wp:inline distT="0" distB="0" distL="0" distR="0" wp14:anchorId="10F81E4D" wp14:editId="19AF221A">
-            <wp:extent cx="3886200" cy="3046927"/>
-            <wp:effectExtent l="0" t="0" r="0" b="1270"/>
-            <wp:docPr id="3" name="Picture 3"/>
+          <wp:inline distT="0" distB="0" distL="0" distR="0" wp14:anchorId="191485F9" wp14:editId="436458C1">
+            <wp:extent cx="4114800" cy="3217552"/>
+            <wp:effectExtent l="0" t="0" r="0" b="1905"/>
+            <wp:docPr id="4" name="Picture 4"/>
             <wp:cNvGraphicFramePr>
               <a:graphicFrameLocks xmlns:a="http://schemas.openxmlformats.org/drawingml/2006/main" noChangeAspect="1"/>
             </wp:cNvGraphicFramePr>
@@ -3795,7 +3822,7 @@
                   <pic:spPr>
                     <a:xfrm>
                       <a:off x="0" y="0"/>
-                      <a:ext cx="3886200" cy="3046927"/>
+                      <a:ext cx="4114800" cy="3217552"/>
                     </a:xfrm>
                     <a:prstGeom prst="rect">
                       <a:avLst/>
@@ -3826,24 +3853,38 @@
         <w:rPr>
           <w:i/>
         </w:rPr>
-        <w:t xml:space="preserve"> 2.3</w:t>
+        <w:t xml:space="preserve"> 2.</w:t>
       </w:r>
       <w:r>
         <w:rPr>
           <w:i/>
         </w:rPr>
+        <w:t>3</w:t>
+      </w:r>
+      <w:r>
+        <w:rPr>
+          <w:i/>
+        </w:rPr>
         <w:t xml:space="preserve">- The </w:t>
       </w:r>
       <w:r>
         <w:rPr>
           <w:i/>
         </w:rPr>
-        <w:t>Installation</w:t>
-      </w:r>
+        <w:t xml:space="preserve">Ready to </w:t>
+      </w:r>
+      <w:proofErr w:type="gramStart"/>
       <w:r>
         <w:rPr>
           <w:i/>
         </w:rPr>
+        <w:t>Install</w:t>
+      </w:r>
+      <w:proofErr w:type="gramEnd"/>
+      <w:r>
+        <w:rPr>
+          <w:i/>
+        </w:rPr>
         <w:t xml:space="preserve"> dialog.</w:t>
       </w:r>
     </w:p>
@@ -3852,13 +3893,25 @@
         <w:pStyle w:val="EDBTXTNormalWebBlackCharChar0"/>
       </w:pPr>
       <w:r>
-        <w:t xml:space="preserve">Use the </w:t>
-      </w:r>
-      <w:r>
-        <w:rPr>
-          <w:rStyle w:val="EDBTXTKeywordBlack"/>
-        </w:rPr>
-        <w:t>Installation</w:t>
+        <w:lastRenderedPageBreak/>
+        <w:t xml:space="preserve">Click </w:t>
+      </w:r>
+      <w:proofErr w:type="gramStart"/>
+      <w:r>
+        <w:rPr>
+          <w:rStyle w:val="EDBTXTKeywordBlack"/>
+        </w:rPr>
+        <w:t>Next</w:t>
+      </w:r>
+      <w:proofErr w:type="gramEnd"/>
+      <w:r>
+        <w:t xml:space="preserve"> on the </w:t>
+      </w:r>
+      <w:r>
+        <w:rPr>
+          <w:rStyle w:val="EDBTXTKeywordBlack"/>
+        </w:rPr>
+        <w:t>Ready</w:t>
       </w:r>
       <w:r>
         <w:t xml:space="preserve"> </w:t>
@@ -3867,25 +3920,28 @@
         <w:rPr>
           <w:rStyle w:val="EDBTXTKeywordBlack"/>
         </w:rPr>
-        <w:t>Directory</w:t>
-      </w:r>
-      <w:r>
-        <w:t xml:space="preserve"> dialog</w:t>
-      </w:r>
-      <w:r>
-        <w:t xml:space="preserve"> (see Figure 2.3</w:t>
-      </w:r>
-      <w:r>
-        <w:t xml:space="preserve">) to specify the directory in which the connector will be installed, and click </w:t>
-      </w:r>
-      <w:r>
-        <w:rPr>
-          <w:rStyle w:val="EDBTXTKeywordBlack"/>
-        </w:rPr>
-        <w:t>Next</w:t>
-      </w:r>
-      <w:r>
-        <w:t xml:space="preserve"> to continue.</w:t>
+        <w:t>to</w:t>
+      </w:r>
+      <w:r>
+        <w:t xml:space="preserve"> </w:t>
+      </w:r>
+      <w:r>
+        <w:rPr>
+          <w:rStyle w:val="EDBTXTKeywordBlack"/>
+        </w:rPr>
+        <w:t>Install</w:t>
+      </w:r>
+      <w:r>
+        <w:t xml:space="preserve"> dialog (see Figure </w:t>
+      </w:r>
+      <w:r>
+        <w:t>2.</w:t>
+      </w:r>
+      <w:r>
+        <w:t>3</w:t>
+      </w:r>
+      <w:r>
+        <w:t xml:space="preserve">) to start the installation; popup dialogs confirm the progress of the installation wizard.  </w:t>
       </w:r>
     </w:p>
     <w:p>
@@ -3897,12 +3953,11 @@
         <w:rPr>
           <w:noProof/>
         </w:rPr>
-        <w:lastRenderedPageBreak/>
         <w:drawing>
-          <wp:inline distT="0" distB="0" distL="0" distR="0" wp14:anchorId="6EBC06C6" wp14:editId="3E5CD723">
-            <wp:extent cx="4114800" cy="3217552"/>
-            <wp:effectExtent l="0" t="0" r="0" b="1905"/>
-            <wp:docPr id="4" name="Picture 4"/>
+          <wp:inline distT="0" distB="0" distL="0" distR="0" wp14:anchorId="4A669E6C" wp14:editId="5DD8719F">
+            <wp:extent cx="4114800" cy="3194511"/>
+            <wp:effectExtent l="0" t="0" r="0" b="6350"/>
+            <wp:docPr id="5" name="Picture 5"/>
             <wp:cNvGraphicFramePr>
               <a:graphicFrameLocks xmlns:a="http://schemas.openxmlformats.org/drawingml/2006/main" noChangeAspect="1"/>
             </wp:cNvGraphicFramePr>
@@ -3922,141 +3977,6 @@
                   <pic:spPr>
                     <a:xfrm>
                       <a:off x="0" y="0"/>
-                      <a:ext cx="4114800" cy="3217552"/>
-                    </a:xfrm>
-                    <a:prstGeom prst="rect">
-                      <a:avLst/>
-                    </a:prstGeom>
-                  </pic:spPr>
-                </pic:pic>
-              </a:graphicData>
-            </a:graphic>
-          </wp:inline>
-        </w:drawing>
-      </w:r>
-    </w:p>
-    <w:p>
-      <w:pPr>
-        <w:pStyle w:val="EDBTXTNormalWebBlackCharChar0"/>
-        <w:jc w:val="center"/>
-        <w:rPr>
-          <w:i/>
-        </w:rPr>
-      </w:pPr>
-      <w:r>
-        <w:rPr>
-          <w:i/>
-        </w:rPr>
-        <w:t>Figure</w:t>
-      </w:r>
-      <w:r>
-        <w:rPr>
-          <w:i/>
-        </w:rPr>
-        <w:t xml:space="preserve"> 2.4</w:t>
-      </w:r>
-      <w:r>
-        <w:rPr>
-          <w:i/>
-        </w:rPr>
-        <w:t xml:space="preserve">- The </w:t>
-      </w:r>
-      <w:r>
-        <w:rPr>
-          <w:i/>
-        </w:rPr>
-        <w:t>Ready to Install</w:t>
-      </w:r>
-      <w:r>
-        <w:rPr>
-          <w:i/>
-        </w:rPr>
-        <w:t xml:space="preserve"> dialog.</w:t>
-      </w:r>
-    </w:p>
-    <w:p>
-      <w:pPr>
-        <w:pStyle w:val="EDBTXTNormalWebBlackCharChar0"/>
-      </w:pPr>
-      <w:r>
-        <w:t xml:space="preserve">Click </w:t>
-      </w:r>
-      <w:r>
-        <w:rPr>
-          <w:rStyle w:val="EDBTXTKeywordBlack"/>
-        </w:rPr>
-        <w:t>Next</w:t>
-      </w:r>
-      <w:r>
-        <w:t xml:space="preserve"> on the </w:t>
-      </w:r>
-      <w:r>
-        <w:rPr>
-          <w:rStyle w:val="EDBTXTKeywordBlack"/>
-        </w:rPr>
-        <w:t>Ready</w:t>
-      </w:r>
-      <w:r>
-        <w:t xml:space="preserve"> </w:t>
-      </w:r>
-      <w:r>
-        <w:rPr>
-          <w:rStyle w:val="EDBTXTKeywordBlack"/>
-        </w:rPr>
-        <w:t>to</w:t>
-      </w:r>
-      <w:r>
-        <w:t xml:space="preserve"> </w:t>
-      </w:r>
-      <w:r>
-        <w:rPr>
-          <w:rStyle w:val="EDBTXTKeywordBlack"/>
-        </w:rPr>
-        <w:t>Install</w:t>
-      </w:r>
-      <w:r>
-        <w:t xml:space="preserve"> dialog (see Figure </w:t>
-      </w:r>
-      <w:r>
-        <w:t>2.4</w:t>
-      </w:r>
-      <w:r>
-        <w:t xml:space="preserve">) to start the installation; popup dialogs confirm the progress of the installation wizard.  </w:t>
-      </w:r>
-    </w:p>
-    <w:p>
-      <w:pPr>
-        <w:pStyle w:val="EDBTXTNormalWebBlackCharChar0"/>
-        <w:jc w:val="center"/>
-      </w:pPr>
-      <w:r>
-        <w:rPr>
-          <w:noProof/>
-        </w:rPr>
-        <w:drawing>
-          <wp:inline distT="0" distB="0" distL="0" distR="0" wp14:anchorId="0AB62146" wp14:editId="08273FD1">
-            <wp:extent cx="4114800" cy="3194511"/>
-            <wp:effectExtent l="0" t="0" r="0" b="6350"/>
-            <wp:docPr id="5" name="Picture 5"/>
-            <wp:cNvGraphicFramePr>
-              <a:graphicFrameLocks xmlns:a="http://schemas.openxmlformats.org/drawingml/2006/main" noChangeAspect="1"/>
-            </wp:cNvGraphicFramePr>
-            <a:graphic xmlns:a="http://schemas.openxmlformats.org/drawingml/2006/main">
-              <a:graphicData uri="http://schemas.openxmlformats.org/drawingml/2006/picture">
-                <pic:pic xmlns:pic="http://schemas.openxmlformats.org/drawingml/2006/picture">
-                  <pic:nvPicPr>
-                    <pic:cNvPr id="0" name=""/>
-                    <pic:cNvPicPr/>
-                  </pic:nvPicPr>
-                  <pic:blipFill>
-                    <a:blip r:embed="rId23"/>
-                    <a:stretch>
-                      <a:fillRect/>
-                    </a:stretch>
-                  </pic:blipFill>
-                  <pic:spPr>
-                    <a:xfrm>
-                      <a:off x="0" y="0"/>
                       <a:ext cx="4114800" cy="3194511"/>
                     </a:xfrm>
                     <a:prstGeom prst="rect">
@@ -4088,12 +4008,18 @@
         <w:rPr>
           <w:i/>
         </w:rPr>
-        <w:t xml:space="preserve"> 2.5</w:t>
+        <w:t xml:space="preserve"> 2.</w:t>
       </w:r>
       <w:r>
         <w:rPr>
           <w:i/>
         </w:rPr>
+        <w:t>4</w:t>
+      </w:r>
+      <w:r>
+        <w:rPr>
+          <w:i/>
+        </w:rPr>
         <w:t xml:space="preserve"> </w:t>
       </w:r>
       <w:r>
@@ -4120,7 +4046,6 @@
         <w:pStyle w:val="EDBTXTNormalWebBlackCharChar0"/>
       </w:pPr>
       <w:r>
-        <w:lastRenderedPageBreak/>
         <w:t xml:space="preserve">When the wizard informs you that it has completed the setup, click the </w:t>
       </w:r>
       <w:r>
@@ -4133,7 +4058,10 @@
         <w:t xml:space="preserve"> button to exit the dialog (see Figure </w:t>
       </w:r>
       <w:r>
-        <w:t>2.5</w:t>
+        <w:t>2.</w:t>
+      </w:r>
+      <w:r>
+        <w:t>4</w:t>
       </w:r>
       <w:r>
         <w:t xml:space="preserve">).  </w:t>
@@ -4180,7 +4108,10 @@
         <w:t xml:space="preserve"> menu (see Figure </w:t>
       </w:r>
       <w:r>
-        <w:t>2.6</w:t>
+        <w:t>2.</w:t>
+      </w:r>
+      <w:r>
+        <w:t>5</w:t>
       </w:r>
       <w:r>
         <w:t>).</w:t>
@@ -4196,7 +4127,7 @@
           <w:noProof/>
         </w:rPr>
         <w:drawing>
-          <wp:inline distT="0" distB="0" distL="0" distR="0" wp14:anchorId="64C7F00B" wp14:editId="6550BBE6">
+          <wp:inline distT="0" distB="0" distL="0" distR="0" wp14:anchorId="3BB366E2" wp14:editId="6C7ED094">
             <wp:extent cx="3790950" cy="1619051"/>
             <wp:effectExtent l="0" t="0" r="0" b="635"/>
             <wp:docPr id="12" name="Picture 12" descr="C:\Users\susan\AppData\Local\Temp\vmware-susan\VMwareDnD\7412d23f\Screen Shot 2016-07-11 at 4.50.20 PM.png"/>
@@ -4213,7 +4144,7 @@
                     </pic:cNvPicPr>
                   </pic:nvPicPr>
                   <pic:blipFill>
-                    <a:blip r:embed="rId24" cstate="print">
+                    <a:blip r:embed="rId23" cstate="print">
                       <a:extLst>
                         <a:ext uri="{28A0092B-C50C-407E-A947-70E740481C1C}">
                           <a14:useLocalDpi xmlns:a14="http://schemas.microsoft.com/office/drawing/2010/main" val="0"/>
@@ -4257,24 +4188,50 @@
         <w:rPr>
           <w:i/>
         </w:rPr>
-        <w:t xml:space="preserve">Figure 2.6 </w:t>
+        <w:t>Figure 2.</w:t>
       </w:r>
       <w:r>
         <w:rPr>
           <w:i/>
         </w:rPr>
+        <w:t>5</w:t>
+      </w:r>
+      <w:r>
+        <w:rPr>
+          <w:i/>
+        </w:rPr>
+        <w:t xml:space="preserve"> </w:t>
+      </w:r>
+      <w:r>
+        <w:rPr>
+          <w:i/>
+        </w:rPr>
         <w:t>-</w:t>
       </w:r>
       <w:r>
         <w:rPr>
           <w:i/>
         </w:rPr>
-        <w:t xml:space="preserve"> Starting StackBuilder Plus</w:t>
-      </w:r>
+        <w:t xml:space="preserve"> Starting </w:t>
+      </w:r>
+      <w:proofErr w:type="spellStart"/>
       <w:r>
         <w:rPr>
           <w:i/>
         </w:rPr>
+        <w:t>StackBuilder</w:t>
+      </w:r>
+      <w:proofErr w:type="spellEnd"/>
+      <w:r>
+        <w:rPr>
+          <w:i/>
+        </w:rPr>
+        <w:t xml:space="preserve"> Plus</w:t>
+      </w:r>
+      <w:r>
+        <w:rPr>
+          <w:i/>
+        </w:rPr>
         <w:t>.</w:t>
       </w:r>
     </w:p>
@@ -4331,7 +4288,13 @@
         <w:t>Drivers</w:t>
       </w:r>
       <w:r>
-        <w:t xml:space="preserve"> node of the tree control (see Figure 2.7).</w:t>
+        <w:t xml:space="preserve"> node of the tree control (see Figure 2.</w:t>
+      </w:r>
+      <w:r>
+        <w:t>6</w:t>
+      </w:r>
+      <w:r>
+        <w:t>).</w:t>
       </w:r>
     </w:p>
     <w:p>
@@ -4343,11 +4306,12 @@
         <w:rPr>
           <w:noProof/>
         </w:rPr>
+        <w:lastRenderedPageBreak/>
         <w:drawing>
-          <wp:inline distT="0" distB="0" distL="0" distR="0" wp14:anchorId="65454197" wp14:editId="2CF2324C">
-            <wp:extent cx="4114800" cy="3004331"/>
-            <wp:effectExtent l="0" t="0" r="0" b="5715"/>
-            <wp:docPr id="1" name="Picture 1"/>
+          <wp:inline distT="0" distB="0" distL="0" distR="0" wp14:anchorId="1BA67057" wp14:editId="5B307DB7">
+            <wp:extent cx="4116527" cy="2992582"/>
+            <wp:effectExtent l="0" t="0" r="0" b="0"/>
+            <wp:docPr id="10" name="Picture 10"/>
             <wp:cNvGraphicFramePr>
               <a:graphicFrameLocks xmlns:a="http://schemas.openxmlformats.org/drawingml/2006/main" noChangeAspect="1"/>
             </wp:cNvGraphicFramePr>
@@ -4355,11 +4319,17 @@
               <a:graphicData uri="http://schemas.openxmlformats.org/drawingml/2006/picture">
                 <pic:pic xmlns:pic="http://schemas.openxmlformats.org/drawingml/2006/picture">
                   <pic:nvPicPr>
-                    <pic:cNvPr id="0" name=""/>
+                    <pic:cNvPr id="0" name="installer_sbp_1.jpg"/>
                     <pic:cNvPicPr/>
                   </pic:nvPicPr>
                   <pic:blipFill>
-                    <a:blip r:embed="rId25"/>
+                    <a:blip r:embed="rId24">
+                      <a:extLst>
+                        <a:ext uri="{28A0092B-C50C-407E-A947-70E740481C1C}">
+                          <a14:useLocalDpi xmlns:a14="http://schemas.microsoft.com/office/drawing/2010/main" val="0"/>
+                        </a:ext>
+                      </a:extLst>
+                    </a:blip>
                     <a:stretch>
                       <a:fillRect/>
                     </a:stretch>
@@ -4367,7 +4337,7 @@
                   <pic:spPr>
                     <a:xfrm>
                       <a:off x="0" y="0"/>
-                      <a:ext cx="4114800" cy="3004331"/>
+                      <a:ext cx="4122528" cy="2996944"/>
                     </a:xfrm>
                     <a:prstGeom prst="rect">
                       <a:avLst/>
@@ -4398,12 +4368,18 @@
         <w:rPr>
           <w:i/>
         </w:rPr>
-        <w:t>2.7</w:t>
+        <w:t>2.</w:t>
       </w:r>
       <w:r>
         <w:rPr>
           <w:i/>
         </w:rPr>
+        <w:t>6</w:t>
+      </w:r>
+      <w:r>
+        <w:rPr>
+          <w:i/>
+        </w:rPr>
         <w:t xml:space="preserve"> </w:t>
       </w:r>
       <w:r>
@@ -4438,7 +4414,7 @@
         <w:pStyle w:val="Heading1"/>
       </w:pPr>
       <w:bookmarkStart w:id="17" w:name="_Ref456012125"/>
-      <w:bookmarkStart w:id="18" w:name="_Toc497743215"/>
+      <w:bookmarkStart w:id="18" w:name="_Toc499035432"/>
       <w:r>
         <w:lastRenderedPageBreak/>
         <w:t>Configuring the .NET Connector</w:t>
@@ -4610,7 +4586,7 @@
         <w:pStyle w:val="Heading2"/>
       </w:pPr>
       <w:bookmarkStart w:id="19" w:name="_Ref477525249"/>
-      <w:bookmarkStart w:id="20" w:name="_Toc497743216"/>
+      <w:bookmarkStart w:id="20" w:name="_Toc499035433"/>
       <w:r>
         <w:t>General Instructions</w:t>
       </w:r>
@@ -4876,7 +4852,7 @@
       <w:pPr>
         <w:pStyle w:val="Heading2"/>
       </w:pPr>
-      <w:bookmarkStart w:id="21" w:name="_Toc497743217"/>
+      <w:bookmarkStart w:id="21" w:name="_Toc499035434"/>
       <w:r>
         <w:t>.NET Framework 4.0</w:t>
       </w:r>
@@ -5070,7 +5046,7 @@
       <w:pPr>
         <w:pStyle w:val="Heading2"/>
       </w:pPr>
-      <w:bookmarkStart w:id="22" w:name="_Toc497743218"/>
+      <w:bookmarkStart w:id="22" w:name="_Toc499035435"/>
       <w:r>
         <w:t>.NET Framework 4.5</w:t>
       </w:r>
@@ -5271,7 +5247,7 @@
         <w:pStyle w:val="Heading2"/>
       </w:pPr>
       <w:bookmarkStart w:id="23" w:name="_Ref477527440"/>
-      <w:bookmarkStart w:id="24" w:name="_Toc497743219"/>
+      <w:bookmarkStart w:id="24" w:name="_Toc499035436"/>
       <w:r>
         <w:t>Entity Framework 6</w:t>
       </w:r>
@@ -6027,7 +6003,7 @@
         <w:pStyle w:val="Heading2"/>
       </w:pPr>
       <w:bookmarkStart w:id="25" w:name="_Ref477528081"/>
-      <w:bookmarkStart w:id="26" w:name="_Toc497743220"/>
+      <w:bookmarkStart w:id="26" w:name="_Toc499035437"/>
       <w:r>
         <w:t>EDBDdexProvider for Visual Studio</w:t>
       </w:r>
@@ -7175,7 +7151,7 @@
         <w:pStyle w:val="Heading1"/>
       </w:pPr>
       <w:bookmarkStart w:id="27" w:name="_Ref482087625"/>
-      <w:bookmarkStart w:id="28" w:name="_Toc497743221"/>
+      <w:bookmarkStart w:id="28" w:name="_Toc499035438"/>
       <w:r>
         <w:lastRenderedPageBreak/>
         <w:t>Using the .NET Connector</w:t>
@@ -7429,7 +7405,7 @@
       <w:pPr>
         <w:pStyle w:val="Heading2"/>
       </w:pPr>
-      <w:bookmarkStart w:id="29" w:name="_Toc497743222"/>
+      <w:bookmarkStart w:id="29" w:name="_Toc499035439"/>
       <w:r>
         <w:t>Opening a Database Connection</w:t>
       </w:r>
@@ -7647,7 +7623,7 @@
         <w:pStyle w:val="Heading3"/>
       </w:pPr>
       <w:bookmarkStart w:id="30" w:name="_Ref482087661"/>
-      <w:bookmarkStart w:id="31" w:name="_Toc497743223"/>
+      <w:bookmarkStart w:id="31" w:name="_Toc499035440"/>
       <w:r>
         <w:t>Connection String Parameters</w:t>
       </w:r>
@@ -8711,7 +8687,7 @@
       <w:pPr>
         <w:pStyle w:val="Heading3"/>
       </w:pPr>
-      <w:bookmarkStart w:id="32" w:name="_Toc497743224"/>
+      <w:bookmarkStart w:id="32" w:name="_Toc499035441"/>
       <w:r>
         <w:t xml:space="preserve">Example - </w:t>
       </w:r>
@@ -9131,7 +9107,7 @@
           <w:noProof/>
         </w:rPr>
         <w:drawing>
-          <wp:inline distT="0" distB="0" distL="0" distR="0" wp14:anchorId="49B39E7C" wp14:editId="0AD3CC7F">
+          <wp:inline distT="0" distB="0" distL="0" distR="0" wp14:anchorId="28245088" wp14:editId="1432325F">
             <wp:extent cx="5480050" cy="1663700"/>
             <wp:effectExtent l="0" t="0" r="6350" b="0"/>
             <wp:docPr id="7" name="Picture 7" descr="Screen Shot 2014-06-26 at 8"/>
@@ -9148,7 +9124,7 @@
                     </pic:cNvPicPr>
                   </pic:nvPicPr>
                   <pic:blipFill>
-                    <a:blip r:embed="rId26">
+                    <a:blip r:embed="rId25">
                       <a:extLst>
                         <a:ext uri="{28A0092B-C50C-407E-A947-70E740481C1C}">
                           <a14:useLocalDpi xmlns:a14="http://schemas.microsoft.com/office/drawing/2010/main" val="0"/>
@@ -9189,7 +9165,7 @@
       <w:pPr>
         <w:pStyle w:val="Heading3"/>
       </w:pPr>
-      <w:bookmarkStart w:id="33" w:name="_Toc497743225"/>
+      <w:bookmarkStart w:id="33" w:name="_Toc499035442"/>
       <w:r>
         <w:t xml:space="preserve">Example - </w:t>
       </w:r>
@@ -9802,7 +9778,7 @@
       <w:pPr>
         <w:pStyle w:val="Heading3"/>
       </w:pPr>
-      <w:bookmarkStart w:id="34" w:name="_Toc497743226"/>
+      <w:bookmarkStart w:id="34" w:name="_Toc499035443"/>
       <w:r>
         <w:t xml:space="preserve">Example - </w:t>
       </w:r>
@@ -10599,7 +10575,7 @@
           <w:noProof/>
         </w:rPr>
         <w:drawing>
-          <wp:inline distT="0" distB="0" distL="0" distR="0" wp14:anchorId="7A58E89E" wp14:editId="3FE0F65A">
+          <wp:inline distT="0" distB="0" distL="0" distR="0" wp14:anchorId="64C32C7E" wp14:editId="2E8ED0A4">
             <wp:extent cx="2120900" cy="2120900"/>
             <wp:effectExtent l="0" t="0" r="0" b="0"/>
             <wp:docPr id="8" name="Picture 8" descr="dialog"/>
@@ -10616,7 +10592,7 @@
                     </pic:cNvPicPr>
                   </pic:nvPicPr>
                   <pic:blipFill>
-                    <a:blip r:embed="rId27">
+                    <a:blip r:embed="rId26">
                       <a:extLst>
                         <a:ext uri="{28A0092B-C50C-407E-A947-70E740481C1C}">
                           <a14:useLocalDpi xmlns:a14="http://schemas.microsoft.com/office/drawing/2010/main" val="0"/>
@@ -10711,7 +10687,7 @@
       <w:pPr>
         <w:pStyle w:val="Heading2"/>
       </w:pPr>
-      <w:bookmarkStart w:id="35" w:name="_Toc497743227"/>
+      <w:bookmarkStart w:id="35" w:name="_Toc499035444"/>
       <w:r>
         <w:lastRenderedPageBreak/>
         <w:t>Retrieving Database Records</w:t>
@@ -11795,7 +11771,7 @@
       <w:pPr>
         <w:pStyle w:val="Heading3"/>
       </w:pPr>
-      <w:bookmarkStart w:id="36" w:name="_Toc497743228"/>
+      <w:bookmarkStart w:id="36" w:name="_Toc499035445"/>
       <w:r>
         <w:t>Retr</w:t>
       </w:r>
@@ -12329,7 +12305,7 @@
       <w:pPr>
         <w:pStyle w:val="Heading2"/>
       </w:pPr>
-      <w:bookmarkStart w:id="37" w:name="_Toc497743229"/>
+      <w:bookmarkStart w:id="37" w:name="_Toc499035446"/>
       <w:r>
         <w:lastRenderedPageBreak/>
         <w:t>Parameterized Queries</w:t>
@@ -13010,7 +12986,7 @@
       <w:pPr>
         <w:pStyle w:val="Heading2"/>
       </w:pPr>
-      <w:bookmarkStart w:id="38" w:name="_Toc497743230"/>
+      <w:bookmarkStart w:id="38" w:name="_Toc499035447"/>
       <w:r>
         <w:lastRenderedPageBreak/>
         <w:t>Inserting Records in a Database</w:t>
@@ -13856,7 +13832,7 @@
       <w:pPr>
         <w:pStyle w:val="Heading2"/>
       </w:pPr>
-      <w:bookmarkStart w:id="39" w:name="_Toc497743231"/>
+      <w:bookmarkStart w:id="39" w:name="_Toc499035448"/>
       <w:r>
         <w:lastRenderedPageBreak/>
         <w:t>Deleting Records in a Database</w:t>
@@ -14698,7 +14674,7 @@
       <w:pPr>
         <w:pStyle w:val="Heading2"/>
       </w:pPr>
-      <w:bookmarkStart w:id="40" w:name="_Toc497743232"/>
+      <w:bookmarkStart w:id="40" w:name="_Toc499035449"/>
       <w:r>
         <w:lastRenderedPageBreak/>
         <w:t>Using SPL Stored Procedures in your .NET Application</w:t>
@@ -14974,7 +14950,7 @@
       <w:pPr>
         <w:pStyle w:val="Heading3"/>
       </w:pPr>
-      <w:bookmarkStart w:id="41" w:name="_Toc497743233"/>
+      <w:bookmarkStart w:id="41" w:name="_Toc499035450"/>
       <w:r>
         <w:t>Example - Executing</w:t>
       </w:r>
@@ -15903,7 +15879,7 @@
       <w:pPr>
         <w:pStyle w:val="Heading3"/>
       </w:pPr>
-      <w:bookmarkStart w:id="42" w:name="_Toc497743234"/>
+      <w:bookmarkStart w:id="42" w:name="_Toc499035451"/>
       <w:r>
         <w:t xml:space="preserve">Example - </w:t>
       </w:r>
@@ -17699,7 +17675,7 @@
       <w:pPr>
         <w:pStyle w:val="Heading3"/>
       </w:pPr>
-      <w:bookmarkStart w:id="43" w:name="_Toc497743235"/>
+      <w:bookmarkStart w:id="43" w:name="_Toc499035452"/>
       <w:r>
         <w:t xml:space="preserve">Example - </w:t>
       </w:r>
@@ -19933,7 +19909,7 @@
       <w:pPr>
         <w:pStyle w:val="Heading2"/>
       </w:pPr>
-      <w:bookmarkStart w:id="44" w:name="_Toc497743236"/>
+      <w:bookmarkStart w:id="44" w:name="_Toc499035453"/>
       <w:r>
         <w:lastRenderedPageBreak/>
         <w:t xml:space="preserve">Using </w:t>
@@ -21206,9 +21182,9 @@
       </w:r>
     </w:p>
     <w:sectPr>
-      <w:headerReference w:type="even" r:id="rId28"/>
-      <w:headerReference w:type="default" r:id="rId29"/>
-      <w:headerReference w:type="first" r:id="rId30"/>
+      <w:headerReference w:type="even" r:id="rId27"/>
+      <w:headerReference w:type="default" r:id="rId28"/>
+      <w:headerReference w:type="first" r:id="rId29"/>
       <w:footnotePr>
         <w:pos w:val="beneathText"/>
       </w:footnotePr>
@@ -31206,7 +31182,7 @@
 </file>
 
 <file path=customXml/itemProps1.xml><?xml version="1.0" encoding="utf-8"?>
-<ds:datastoreItem xmlns:ds="http://schemas.openxmlformats.org/officeDocument/2006/customXml" ds:itemID="{1D5EE646-686F-4F66-A111-0222CDA7B502}">
+<ds:datastoreItem xmlns:ds="http://schemas.openxmlformats.org/officeDocument/2006/customXml" ds:itemID="{159AC91F-513C-4532-8EA3-D2CFE93C21AE}">
   <ds:schemaRefs>
     <ds:schemaRef ds:uri="http://schemas.openxmlformats.org/officeDocument/2006/bibliography"/>
   </ds:schemaRefs>

</xml_diff>

<commit_message>
EPAS .Net Connector Guide 10.0.2 - JIRA EC-175 .NET 3.2.6 upstream merge documentation changes
</commit_message>
<xml_diff>
--- a/edb_docs/EDB_Postgres_Advanced_Server_NET_Connector_Guide.docx
+++ b/edb_docs/EDB_Postgres_Advanced_Server_NET_Connector_Guide.docx
@@ -12,7 +12,7 @@
           <w:noProof/>
         </w:rPr>
         <w:drawing>
-          <wp:inline distT="0" distB="0" distL="0" distR="0" wp14:anchorId="74DA54DE" wp14:editId="76F6B85D">
+          <wp:inline distT="0" distB="0" distL="0" distR="0" wp14:anchorId="613CBD99" wp14:editId="72427C55">
             <wp:extent cx="2380711" cy="1371599"/>
             <wp:effectExtent l="0" t="0" r="635" b="635"/>
             <wp:docPr id="6" name="Picture 6"/>
@@ -64,21 +64,21 @@
       <w:pPr>
         <w:pStyle w:val="EDBTXTNormalWebBlackCharChar0"/>
       </w:pPr>
+    </w:p>
+    <w:p>
+      <w:pPr>
+        <w:pStyle w:val="EDBTXTNormalWebBlackCharChar0"/>
+      </w:pPr>
+    </w:p>
+    <w:p>
+      <w:pPr>
+        <w:pStyle w:val="EDBTXTNormalWebBlackCharChar0"/>
+        <w:rPr>
+          <w:color w:val="auto"/>
+        </w:rPr>
+      </w:pPr>
       <w:bookmarkStart w:id="0" w:name="_GoBack"/>
       <w:bookmarkEnd w:id="0"/>
-    </w:p>
-    <w:p>
-      <w:pPr>
-        <w:pStyle w:val="EDBTXTNormalWebBlackCharChar0"/>
-      </w:pPr>
-    </w:p>
-    <w:p>
-      <w:pPr>
-        <w:pStyle w:val="EDBTXTNormalWebBlackCharChar0"/>
-        <w:rPr>
-          <w:color w:val="auto"/>
-        </w:rPr>
-      </w:pPr>
     </w:p>
     <w:p>
       <w:pPr>
@@ -176,7 +176,7 @@
         <w:t>10.0.</w:t>
       </w:r>
       <w:r>
-        <w:t>1</w:t>
+        <w:t>2</w:t>
       </w:r>
       <w:r>
         <w:br/>
@@ -211,7 +211,7 @@
         <w:t>.</w:t>
       </w:r>
       <w:r>
-        <w:t>2</w:t>
+        <w:t>6</w:t>
       </w:r>
       <w:r>
         <w:t>.</w:t>
@@ -221,7 +221,22 @@
       </w:r>
       <w:r>
         <w:br/>
-        <w:t>.NET Standard 1.3 Connector Version 3.2.2.1</w:t>
+        <w:t>.NET Standard 1.3</w:t>
+      </w:r>
+      <w:r>
+        <w:t>/2.0</w:t>
+      </w:r>
+      <w:r>
+        <w:t xml:space="preserve"> Connector Version 3.2.</w:t>
+      </w:r>
+      <w:r>
+        <w:t>6</w:t>
+      </w:r>
+      <w:r>
+        <w:t>.1</w:t>
+      </w:r>
+      <w:r>
+        <w:br/>
       </w:r>
     </w:p>
     <w:p>
@@ -229,13 +244,7 @@
         <w:pStyle w:val="EDBCoverProductDate"/>
       </w:pPr>
       <w:r>
-        <w:t xml:space="preserve">January </w:t>
-      </w:r>
-      <w:r>
-        <w:t>1</w:t>
-      </w:r>
-      <w:r>
-        <w:t>5</w:t>
+        <w:t>March 20</w:t>
       </w:r>
       <w:r>
         <w:t xml:space="preserve">, </w:t>
@@ -439,7 +448,13 @@
         <w:pStyle w:val="EDBCoverAddress"/>
       </w:pPr>
       <w:r>
-        <w:t>EnterpriseDB Corporation, 34 Crosby Drive Suite 100, Bedford, MA 01730, USA</w:t>
+        <w:t xml:space="preserve">EnterpriseDB Corporation, 34 Crosby </w:t>
+      </w:r>
+      <w:r>
+        <w:t>Drive Suite 201</w:t>
+      </w:r>
+      <w:r>
+        <w:t>, Bedford, MA 01730, USA</w:t>
       </w:r>
       <w:r>
         <w:br/>
@@ -548,7 +563,7 @@
       <w:r>
         <w:fldChar w:fldCharType="separate"/>
       </w:r>
-      <w:hyperlink w:anchor="_Toc503771148" w:history="1">
+      <w:hyperlink w:anchor="_Toc509323265" w:history="1">
         <w:r>
           <w:rPr>
             <w:rStyle w:val="Hyperlink"/>
@@ -588,7 +603,7 @@
           <w:rPr>
             <w:noProof/>
           </w:rPr>
-          <w:instrText xml:space="preserve"> PAGEREF _Toc503771148 \h </w:instrText>
+          <w:instrText xml:space="preserve"> PAGEREF _Toc509323265 \h </w:instrText>
         </w:r>
         <w:r>
           <w:rPr>
@@ -629,7 +644,7 @@
           <w:szCs w:val="22"/>
         </w:rPr>
       </w:pPr>
-      <w:hyperlink w:anchor="_Toc503771149" w:history="1">
+      <w:hyperlink w:anchor="_Toc509323266" w:history="1">
         <w:r>
           <w:rPr>
             <w:rStyle w:val="Hyperlink"/>
@@ -669,7 +684,7 @@
           <w:rPr>
             <w:noProof/>
           </w:rPr>
-          <w:instrText xml:space="preserve"> PAGEREF _Toc503771149 \h </w:instrText>
+          <w:instrText xml:space="preserve"> PAGEREF _Toc509323266 \h </w:instrText>
         </w:r>
         <w:r>
           <w:rPr>
@@ -710,7 +725,7 @@
           <w:szCs w:val="22"/>
         </w:rPr>
       </w:pPr>
-      <w:hyperlink w:anchor="_Toc503771150" w:history="1">
+      <w:hyperlink w:anchor="_Toc509323267" w:history="1">
         <w:r>
           <w:rPr>
             <w:rStyle w:val="Hyperlink"/>
@@ -750,7 +765,7 @@
           <w:rPr>
             <w:noProof/>
           </w:rPr>
-          <w:instrText xml:space="preserve"> PAGEREF _Toc503771150 \h </w:instrText>
+          <w:instrText xml:space="preserve"> PAGEREF _Toc509323267 \h </w:instrText>
         </w:r>
         <w:r>
           <w:rPr>
@@ -791,7 +806,7 @@
           <w:szCs w:val="22"/>
         </w:rPr>
       </w:pPr>
-      <w:hyperlink w:anchor="_Toc503771151" w:history="1">
+      <w:hyperlink w:anchor="_Toc509323268" w:history="1">
         <w:r>
           <w:rPr>
             <w:rStyle w:val="Hyperlink"/>
@@ -831,7 +846,7 @@
           <w:rPr>
             <w:noProof/>
           </w:rPr>
-          <w:instrText xml:space="preserve"> PAGEREF _Toc503771151 \h </w:instrText>
+          <w:instrText xml:space="preserve"> PAGEREF _Toc509323268 \h </w:instrText>
         </w:r>
         <w:r>
           <w:rPr>
@@ -872,7 +887,7 @@
           <w:szCs w:val="22"/>
         </w:rPr>
       </w:pPr>
-      <w:hyperlink w:anchor="_Toc503771152" w:history="1">
+      <w:hyperlink w:anchor="_Toc509323269" w:history="1">
         <w:r>
           <w:rPr>
             <w:rStyle w:val="Hyperlink"/>
@@ -912,7 +927,7 @@
           <w:rPr>
             <w:noProof/>
           </w:rPr>
-          <w:instrText xml:space="preserve"> PAGEREF _Toc503771152 \h </w:instrText>
+          <w:instrText xml:space="preserve"> PAGEREF _Toc509323269 \h </w:instrText>
         </w:r>
         <w:r>
           <w:rPr>
@@ -953,7 +968,7 @@
           <w:szCs w:val="22"/>
         </w:rPr>
       </w:pPr>
-      <w:hyperlink w:anchor="_Toc503771153" w:history="1">
+      <w:hyperlink w:anchor="_Toc509323270" w:history="1">
         <w:r>
           <w:rPr>
             <w:rStyle w:val="Hyperlink"/>
@@ -993,7 +1008,7 @@
           <w:rPr>
             <w:noProof/>
           </w:rPr>
-          <w:instrText xml:space="preserve"> PAGEREF _Toc503771153 \h </w:instrText>
+          <w:instrText xml:space="preserve"> PAGEREF _Toc509323270 \h </w:instrText>
         </w:r>
         <w:r>
           <w:rPr>
@@ -1034,7 +1049,7 @@
           <w:szCs w:val="22"/>
         </w:rPr>
       </w:pPr>
-      <w:hyperlink w:anchor="_Toc503771154" w:history="1">
+      <w:hyperlink w:anchor="_Toc509323271" w:history="1">
         <w:r>
           <w:rPr>
             <w:rStyle w:val="Hyperlink"/>
@@ -1074,7 +1089,7 @@
           <w:rPr>
             <w:noProof/>
           </w:rPr>
-          <w:instrText xml:space="preserve"> PAGEREF _Toc503771154 \h </w:instrText>
+          <w:instrText xml:space="preserve"> PAGEREF _Toc509323271 \h </w:instrText>
         </w:r>
         <w:r>
           <w:rPr>
@@ -1115,7 +1130,7 @@
           <w:szCs w:val="22"/>
         </w:rPr>
       </w:pPr>
-      <w:hyperlink w:anchor="_Toc503771155" w:history="1">
+      <w:hyperlink w:anchor="_Toc509323272" w:history="1">
         <w:r>
           <w:rPr>
             <w:rStyle w:val="Hyperlink"/>
@@ -1155,7 +1170,7 @@
           <w:rPr>
             <w:noProof/>
           </w:rPr>
-          <w:instrText xml:space="preserve"> PAGEREF _Toc503771155 \h </w:instrText>
+          <w:instrText xml:space="preserve"> PAGEREF _Toc509323272 \h </w:instrText>
         </w:r>
         <w:r>
           <w:rPr>
@@ -1196,7 +1211,7 @@
           <w:szCs w:val="22"/>
         </w:rPr>
       </w:pPr>
-      <w:hyperlink w:anchor="_Toc503771156" w:history="1">
+      <w:hyperlink w:anchor="_Toc509323273" w:history="1">
         <w:r>
           <w:rPr>
             <w:rStyle w:val="Hyperlink"/>
@@ -1236,7 +1251,7 @@
           <w:rPr>
             <w:noProof/>
           </w:rPr>
-          <w:instrText xml:space="preserve"> PAGEREF _Toc503771156 \h </w:instrText>
+          <w:instrText xml:space="preserve"> PAGEREF _Toc509323273 \h </w:instrText>
         </w:r>
         <w:r>
           <w:rPr>
@@ -1272,7 +1287,7 @@
           <w:szCs w:val="22"/>
         </w:rPr>
       </w:pPr>
-      <w:hyperlink w:anchor="_Toc503771157" w:history="1">
+      <w:hyperlink w:anchor="_Toc509323274" w:history="1">
         <w:r>
           <w:rPr>
             <w:rStyle w:val="Hyperlink"/>
@@ -1300,7 +1315,7 @@
           <w:fldChar w:fldCharType="begin"/>
         </w:r>
         <w:r>
-          <w:instrText xml:space="preserve"> PAGEREF _Toc503771157 \h </w:instrText>
+          <w:instrText xml:space="preserve"> PAGEREF _Toc509323274 \h </w:instrText>
         </w:r>
         <w:r>
           <w:fldChar w:fldCharType="separate"/>
@@ -1322,7 +1337,7 @@
           <w:szCs w:val="22"/>
         </w:rPr>
       </w:pPr>
-      <w:hyperlink w:anchor="_Toc503771158" w:history="1">
+      <w:hyperlink w:anchor="_Toc509323275" w:history="1">
         <w:r>
           <w:rPr>
             <w:rStyle w:val="Hyperlink"/>
@@ -1350,7 +1365,7 @@
           <w:fldChar w:fldCharType="begin"/>
         </w:r>
         <w:r>
-          <w:instrText xml:space="preserve"> PAGEREF _Toc503771158 \h </w:instrText>
+          <w:instrText xml:space="preserve"> PAGEREF _Toc509323275 \h </w:instrText>
         </w:r>
         <w:r>
           <w:fldChar w:fldCharType="separate"/>
@@ -1372,7 +1387,7 @@
           <w:szCs w:val="22"/>
         </w:rPr>
       </w:pPr>
-      <w:hyperlink w:anchor="_Toc503771159" w:history="1">
+      <w:hyperlink w:anchor="_Toc509323276" w:history="1">
         <w:r>
           <w:rPr>
             <w:rStyle w:val="Hyperlink"/>
@@ -1400,7 +1415,7 @@
           <w:fldChar w:fldCharType="begin"/>
         </w:r>
         <w:r>
-          <w:instrText xml:space="preserve"> PAGEREF _Toc503771159 \h </w:instrText>
+          <w:instrText xml:space="preserve"> PAGEREF _Toc509323276 \h </w:instrText>
         </w:r>
         <w:r>
           <w:fldChar w:fldCharType="separate"/>
@@ -1422,7 +1437,7 @@
           <w:szCs w:val="22"/>
         </w:rPr>
       </w:pPr>
-      <w:hyperlink w:anchor="_Toc503771160" w:history="1">
+      <w:hyperlink w:anchor="_Toc509323277" w:history="1">
         <w:r>
           <w:rPr>
             <w:rStyle w:val="Hyperlink"/>
@@ -1450,7 +1465,7 @@
           <w:fldChar w:fldCharType="begin"/>
         </w:r>
         <w:r>
-          <w:instrText xml:space="preserve"> PAGEREF _Toc503771160 \h </w:instrText>
+          <w:instrText xml:space="preserve"> PAGEREF _Toc509323277 \h </w:instrText>
         </w:r>
         <w:r>
           <w:fldChar w:fldCharType="separate"/>
@@ -1465,6 +1480,56 @@
     </w:p>
     <w:p>
       <w:pPr>
+        <w:pStyle w:val="TOC3"/>
+        <w:rPr>
+          <w:rFonts w:asciiTheme="minorHAnsi" w:eastAsiaTheme="minorEastAsia" w:hAnsiTheme="minorHAnsi" w:cstheme="minorBidi"/>
+          <w:sz w:val="22"/>
+          <w:szCs w:val="22"/>
+        </w:rPr>
+      </w:pPr>
+      <w:hyperlink w:anchor="_Toc509323278" w:history="1">
+        <w:r>
+          <w:rPr>
+            <w:rStyle w:val="Hyperlink"/>
+          </w:rPr>
+          <w:t>3.2.5</w:t>
+        </w:r>
+        <w:r>
+          <w:rPr>
+            <w:rFonts w:asciiTheme="minorHAnsi" w:eastAsiaTheme="minorEastAsia" w:hAnsiTheme="minorHAnsi" w:cstheme="minorBidi"/>
+            <w:sz w:val="22"/>
+            <w:szCs w:val="22"/>
+          </w:rPr>
+          <w:tab/>
+        </w:r>
+        <w:r>
+          <w:rPr>
+            <w:rStyle w:val="Hyperlink"/>
+          </w:rPr>
+          <w:t>.NET Standard 2.0</w:t>
+        </w:r>
+        <w:r>
+          <w:tab/>
+        </w:r>
+        <w:r>
+          <w:fldChar w:fldCharType="begin"/>
+        </w:r>
+        <w:r>
+          <w:instrText xml:space="preserve"> PAGEREF _Toc509323278 \h </w:instrText>
+        </w:r>
+        <w:r>
+          <w:fldChar w:fldCharType="separate"/>
+        </w:r>
+        <w:r>
+          <w:t>15</w:t>
+        </w:r>
+        <w:r>
+          <w:fldChar w:fldCharType="end"/>
+        </w:r>
+      </w:hyperlink>
+    </w:p>
+    <w:p>
+      <w:pPr>
         <w:pStyle w:val="TOC2"/>
         <w:tabs>
           <w:tab w:val="left" w:pos="960"/>
@@ -1477,7 +1542,7 @@
           <w:szCs w:val="22"/>
         </w:rPr>
       </w:pPr>
-      <w:hyperlink w:anchor="_Toc503771161" w:history="1">
+      <w:hyperlink w:anchor="_Toc509323279" w:history="1">
         <w:r>
           <w:rPr>
             <w:rStyle w:val="Hyperlink"/>
@@ -1517,7 +1582,7 @@
           <w:rPr>
             <w:noProof/>
           </w:rPr>
-          <w:instrText xml:space="preserve"> PAGEREF _Toc503771161 \h </w:instrText>
+          <w:instrText xml:space="preserve"> PAGEREF _Toc509323279 \h </w:instrText>
         </w:r>
         <w:r>
           <w:rPr>
@@ -1558,7 +1623,7 @@
           <w:szCs w:val="22"/>
         </w:rPr>
       </w:pPr>
-      <w:hyperlink w:anchor="_Toc503771162" w:history="1">
+      <w:hyperlink w:anchor="_Toc509323280" w:history="1">
         <w:r>
           <w:rPr>
             <w:rStyle w:val="Hyperlink"/>
@@ -1598,7 +1663,7 @@
           <w:rPr>
             <w:noProof/>
           </w:rPr>
-          <w:instrText xml:space="preserve"> PAGEREF _Toc503771162 \h </w:instrText>
+          <w:instrText xml:space="preserve"> PAGEREF _Toc509323280 \h </w:instrText>
         </w:r>
         <w:r>
           <w:rPr>
@@ -1634,7 +1699,7 @@
           <w:szCs w:val="22"/>
         </w:rPr>
       </w:pPr>
-      <w:hyperlink w:anchor="_Toc503771163" w:history="1">
+      <w:hyperlink w:anchor="_Toc509323281" w:history="1">
         <w:r>
           <w:rPr>
             <w:rStyle w:val="Hyperlink"/>
@@ -1662,13 +1727,13 @@
           <w:fldChar w:fldCharType="begin"/>
         </w:r>
         <w:r>
-          <w:instrText xml:space="preserve"> PAGEREF _Toc503771163 \h </w:instrText>
+          <w:instrText xml:space="preserve"> PAGEREF _Toc509323281 \h </w:instrText>
         </w:r>
         <w:r>
           <w:fldChar w:fldCharType="separate"/>
         </w:r>
         <w:r>
-          <w:t>16</w:t>
+          <w:t>17</w:t>
         </w:r>
         <w:r>
           <w:fldChar w:fldCharType="end"/>
@@ -1684,7 +1749,7 @@
           <w:szCs w:val="22"/>
         </w:rPr>
       </w:pPr>
-      <w:hyperlink w:anchor="_Toc503771164" w:history="1">
+      <w:hyperlink w:anchor="_Toc509323282" w:history="1">
         <w:r>
           <w:rPr>
             <w:rStyle w:val="Hyperlink"/>
@@ -1712,7 +1777,7 @@
           <w:fldChar w:fldCharType="begin"/>
         </w:r>
         <w:r>
-          <w:instrText xml:space="preserve"> PAGEREF _Toc503771164 \h </w:instrText>
+          <w:instrText xml:space="preserve"> PAGEREF _Toc509323282 \h </w:instrText>
         </w:r>
         <w:r>
           <w:fldChar w:fldCharType="separate"/>
@@ -1739,7 +1804,7 @@
           <w:szCs w:val="22"/>
         </w:rPr>
       </w:pPr>
-      <w:hyperlink w:anchor="_Toc503771165" w:history="1">
+      <w:hyperlink w:anchor="_Toc509323283" w:history="1">
         <w:r>
           <w:rPr>
             <w:rStyle w:val="Hyperlink"/>
@@ -1779,7 +1844,7 @@
           <w:rPr>
             <w:noProof/>
           </w:rPr>
-          <w:instrText xml:space="preserve"> PAGEREF _Toc503771165 \h </w:instrText>
+          <w:instrText xml:space="preserve"> PAGEREF _Toc509323283 \h </w:instrText>
         </w:r>
         <w:r>
           <w:rPr>
@@ -1820,7 +1885,7 @@
           <w:szCs w:val="22"/>
         </w:rPr>
       </w:pPr>
-      <w:hyperlink w:anchor="_Toc503771166" w:history="1">
+      <w:hyperlink w:anchor="_Toc509323284" w:history="1">
         <w:r>
           <w:rPr>
             <w:rStyle w:val="Hyperlink"/>
@@ -1860,7 +1925,7 @@
           <w:rPr>
             <w:noProof/>
           </w:rPr>
-          <w:instrText xml:space="preserve"> PAGEREF _Toc503771166 \h </w:instrText>
+          <w:instrText xml:space="preserve"> PAGEREF _Toc509323284 \h </w:instrText>
         </w:r>
         <w:r>
           <w:rPr>
@@ -1896,7 +1961,7 @@
           <w:szCs w:val="22"/>
         </w:rPr>
       </w:pPr>
-      <w:hyperlink w:anchor="_Toc503771167" w:history="1">
+      <w:hyperlink w:anchor="_Toc509323285" w:history="1">
         <w:r>
           <w:rPr>
             <w:rStyle w:val="Hyperlink"/>
@@ -1924,7 +1989,7 @@
           <w:fldChar w:fldCharType="begin"/>
         </w:r>
         <w:r>
-          <w:instrText xml:space="preserve"> PAGEREF _Toc503771167 \h </w:instrText>
+          <w:instrText xml:space="preserve"> PAGEREF _Toc509323285 \h </w:instrText>
         </w:r>
         <w:r>
           <w:fldChar w:fldCharType="separate"/>
@@ -1946,7 +2011,7 @@
           <w:szCs w:val="22"/>
         </w:rPr>
       </w:pPr>
-      <w:hyperlink w:anchor="_Toc503771168" w:history="1">
+      <w:hyperlink w:anchor="_Toc509323286" w:history="1">
         <w:r>
           <w:rPr>
             <w:rStyle w:val="Hyperlink"/>
@@ -1974,7 +2039,7 @@
           <w:fldChar w:fldCharType="begin"/>
         </w:r>
         <w:r>
-          <w:instrText xml:space="preserve"> PAGEREF _Toc503771168 \h </w:instrText>
+          <w:instrText xml:space="preserve"> PAGEREF _Toc509323286 \h </w:instrText>
         </w:r>
         <w:r>
           <w:fldChar w:fldCharType="separate"/>
@@ -1996,7 +2061,7 @@
           <w:szCs w:val="22"/>
         </w:rPr>
       </w:pPr>
-      <w:hyperlink w:anchor="_Toc503771169" w:history="1">
+      <w:hyperlink w:anchor="_Toc509323287" w:history="1">
         <w:r>
           <w:rPr>
             <w:rStyle w:val="Hyperlink"/>
@@ -2024,7 +2089,7 @@
           <w:fldChar w:fldCharType="begin"/>
         </w:r>
         <w:r>
-          <w:instrText xml:space="preserve"> PAGEREF _Toc503771169 \h </w:instrText>
+          <w:instrText xml:space="preserve"> PAGEREF _Toc509323287 \h </w:instrText>
         </w:r>
         <w:r>
           <w:fldChar w:fldCharType="separate"/>
@@ -2046,7 +2111,7 @@
           <w:szCs w:val="22"/>
         </w:rPr>
       </w:pPr>
-      <w:hyperlink w:anchor="_Toc503771170" w:history="1">
+      <w:hyperlink w:anchor="_Toc509323288" w:history="1">
         <w:r>
           <w:rPr>
             <w:rStyle w:val="Hyperlink"/>
@@ -2074,7 +2139,7 @@
           <w:fldChar w:fldCharType="begin"/>
         </w:r>
         <w:r>
-          <w:instrText xml:space="preserve"> PAGEREF _Toc503771170 \h </w:instrText>
+          <w:instrText xml:space="preserve"> PAGEREF _Toc509323288 \h </w:instrText>
         </w:r>
         <w:r>
           <w:fldChar w:fldCharType="separate"/>
@@ -2101,7 +2166,7 @@
           <w:szCs w:val="22"/>
         </w:rPr>
       </w:pPr>
-      <w:hyperlink w:anchor="_Toc503771171" w:history="1">
+      <w:hyperlink w:anchor="_Toc509323289" w:history="1">
         <w:r>
           <w:rPr>
             <w:rStyle w:val="Hyperlink"/>
@@ -2141,7 +2206,7 @@
           <w:rPr>
             <w:noProof/>
           </w:rPr>
-          <w:instrText xml:space="preserve"> PAGEREF _Toc503771171 \h </w:instrText>
+          <w:instrText xml:space="preserve"> PAGEREF _Toc509323289 \h </w:instrText>
         </w:r>
         <w:r>
           <w:rPr>
@@ -2177,7 +2242,7 @@
           <w:szCs w:val="22"/>
         </w:rPr>
       </w:pPr>
-      <w:hyperlink w:anchor="_Toc503771172" w:history="1">
+      <w:hyperlink w:anchor="_Toc509323290" w:history="1">
         <w:r>
           <w:rPr>
             <w:rStyle w:val="Hyperlink"/>
@@ -2205,7 +2270,7 @@
           <w:fldChar w:fldCharType="begin"/>
         </w:r>
         <w:r>
-          <w:instrText xml:space="preserve"> PAGEREF _Toc503771172 \h </w:instrText>
+          <w:instrText xml:space="preserve"> PAGEREF _Toc509323290 \h </w:instrText>
         </w:r>
         <w:r>
           <w:fldChar w:fldCharType="separate"/>
@@ -2232,7 +2297,7 @@
           <w:szCs w:val="22"/>
         </w:rPr>
       </w:pPr>
-      <w:hyperlink w:anchor="_Toc503771173" w:history="1">
+      <w:hyperlink w:anchor="_Toc509323291" w:history="1">
         <w:r>
           <w:rPr>
             <w:rStyle w:val="Hyperlink"/>
@@ -2272,7 +2337,7 @@
           <w:rPr>
             <w:noProof/>
           </w:rPr>
-          <w:instrText xml:space="preserve"> PAGEREF _Toc503771173 \h </w:instrText>
+          <w:instrText xml:space="preserve"> PAGEREF _Toc509323291 \h </w:instrText>
         </w:r>
         <w:r>
           <w:rPr>
@@ -2313,7 +2378,7 @@
           <w:szCs w:val="22"/>
         </w:rPr>
       </w:pPr>
-      <w:hyperlink w:anchor="_Toc503771174" w:history="1">
+      <w:hyperlink w:anchor="_Toc509323292" w:history="1">
         <w:r>
           <w:rPr>
             <w:rStyle w:val="Hyperlink"/>
@@ -2353,7 +2418,7 @@
           <w:rPr>
             <w:noProof/>
           </w:rPr>
-          <w:instrText xml:space="preserve"> PAGEREF _Toc503771174 \h </w:instrText>
+          <w:instrText xml:space="preserve"> PAGEREF _Toc509323292 \h </w:instrText>
         </w:r>
         <w:r>
           <w:rPr>
@@ -2394,7 +2459,7 @@
           <w:szCs w:val="22"/>
         </w:rPr>
       </w:pPr>
-      <w:hyperlink w:anchor="_Toc503771175" w:history="1">
+      <w:hyperlink w:anchor="_Toc509323293" w:history="1">
         <w:r>
           <w:rPr>
             <w:rStyle w:val="Hyperlink"/>
@@ -2434,7 +2499,7 @@
           <w:rPr>
             <w:noProof/>
           </w:rPr>
-          <w:instrText xml:space="preserve"> PAGEREF _Toc503771175 \h </w:instrText>
+          <w:instrText xml:space="preserve"> PAGEREF _Toc509323293 \h </w:instrText>
         </w:r>
         <w:r>
           <w:rPr>
@@ -2475,7 +2540,7 @@
           <w:szCs w:val="22"/>
         </w:rPr>
       </w:pPr>
-      <w:hyperlink w:anchor="_Toc503771176" w:history="1">
+      <w:hyperlink w:anchor="_Toc509323294" w:history="1">
         <w:r>
           <w:rPr>
             <w:rStyle w:val="Hyperlink"/>
@@ -2515,7 +2580,7 @@
           <w:rPr>
             <w:noProof/>
           </w:rPr>
-          <w:instrText xml:space="preserve"> PAGEREF _Toc503771176 \h </w:instrText>
+          <w:instrText xml:space="preserve"> PAGEREF _Toc509323294 \h </w:instrText>
         </w:r>
         <w:r>
           <w:rPr>
@@ -2551,7 +2616,7 @@
           <w:szCs w:val="22"/>
         </w:rPr>
       </w:pPr>
-      <w:hyperlink w:anchor="_Toc503771177" w:history="1">
+      <w:hyperlink w:anchor="_Toc509323295" w:history="1">
         <w:r>
           <w:rPr>
             <w:rStyle w:val="Hyperlink"/>
@@ -2579,7 +2644,7 @@
           <w:fldChar w:fldCharType="begin"/>
         </w:r>
         <w:r>
-          <w:instrText xml:space="preserve"> PAGEREF _Toc503771177 \h </w:instrText>
+          <w:instrText xml:space="preserve"> PAGEREF _Toc509323295 \h </w:instrText>
         </w:r>
         <w:r>
           <w:fldChar w:fldCharType="separate"/>
@@ -2601,7 +2666,7 @@
           <w:szCs w:val="22"/>
         </w:rPr>
       </w:pPr>
-      <w:hyperlink w:anchor="_Toc503771178" w:history="1">
+      <w:hyperlink w:anchor="_Toc509323296" w:history="1">
         <w:r>
           <w:rPr>
             <w:rStyle w:val="Hyperlink"/>
@@ -2629,7 +2694,7 @@
           <w:fldChar w:fldCharType="begin"/>
         </w:r>
         <w:r>
-          <w:instrText xml:space="preserve"> PAGEREF _Toc503771178 \h </w:instrText>
+          <w:instrText xml:space="preserve"> PAGEREF _Toc509323296 \h </w:instrText>
         </w:r>
         <w:r>
           <w:fldChar w:fldCharType="separate"/>
@@ -2651,7 +2716,7 @@
           <w:szCs w:val="22"/>
         </w:rPr>
       </w:pPr>
-      <w:hyperlink w:anchor="_Toc503771179" w:history="1">
+      <w:hyperlink w:anchor="_Toc509323297" w:history="1">
         <w:r>
           <w:rPr>
             <w:rStyle w:val="Hyperlink"/>
@@ -2679,7 +2744,7 @@
           <w:fldChar w:fldCharType="begin"/>
         </w:r>
         <w:r>
-          <w:instrText xml:space="preserve"> PAGEREF _Toc503771179 \h </w:instrText>
+          <w:instrText xml:space="preserve"> PAGEREF _Toc509323297 \h </w:instrText>
         </w:r>
         <w:r>
           <w:fldChar w:fldCharType="separate"/>
@@ -2706,7 +2771,7 @@
           <w:szCs w:val="22"/>
         </w:rPr>
       </w:pPr>
-      <w:hyperlink w:anchor="_Toc503771180" w:history="1">
+      <w:hyperlink w:anchor="_Toc509323298" w:history="1">
         <w:r>
           <w:rPr>
             <w:rStyle w:val="Hyperlink"/>
@@ -2746,7 +2811,7 @@
           <w:rPr>
             <w:noProof/>
           </w:rPr>
-          <w:instrText xml:space="preserve"> PAGEREF _Toc503771180 \h </w:instrText>
+          <w:instrText xml:space="preserve"> PAGEREF _Toc509323298 \h </w:instrText>
         </w:r>
         <w:r>
           <w:rPr>
@@ -2804,7 +2869,7 @@
       <w:pPr>
         <w:pStyle w:val="Heading1"/>
       </w:pPr>
-      <w:bookmarkStart w:id="1" w:name="_Toc503771148"/>
+      <w:bookmarkStart w:id="1" w:name="_Toc509323265"/>
       <w:r>
         <w:lastRenderedPageBreak/>
         <w:t>Introduction</w:t>
@@ -2979,7 +3044,7 @@
       <w:pPr>
         <w:pStyle w:val="Heading2"/>
       </w:pPr>
-      <w:bookmarkStart w:id="2" w:name="_Toc503771149"/>
+      <w:bookmarkStart w:id="2" w:name="_Toc509323266"/>
       <w:r>
         <w:lastRenderedPageBreak/>
         <w:t>What’s New</w:t>
@@ -3009,7 +3074,16 @@
         <w:t>ve</w:t>
       </w:r>
       <w:r>
-        <w:t xml:space="preserve"> been added to the Advanced Server .NET Connector 10.0.0 to produce Advanced Server .NET Connector 10.0.1</w:t>
+        <w:t xml:space="preserve"> been added to the Advanced Server .NET Connector 10.0.</w:t>
+      </w:r>
+      <w:r>
+        <w:t>1</w:t>
+      </w:r>
+      <w:r>
+        <w:t xml:space="preserve"> to produce Advanced Server .NET Connector 10.0.</w:t>
+      </w:r>
+      <w:r>
+        <w:t>2</w:t>
       </w:r>
       <w:r>
         <w:rPr>
@@ -3043,7 +3117,13 @@
         <w:rPr>
           <w:lang w:eastAsia="ar-SA"/>
         </w:rPr>
-        <w:t>munity Npgsql driver version 3.2.2</w:t>
+        <w:t>munity Npgsql driver version 3.2.</w:t>
+      </w:r>
+      <w:r>
+        <w:rPr>
+          <w:lang w:eastAsia="ar-SA"/>
+        </w:rPr>
+        <w:t>6</w:t>
       </w:r>
     </w:p>
     <w:p>
@@ -3065,13 +3145,37 @@
         <w:rPr>
           <w:lang w:eastAsia="ar-SA"/>
         </w:rPr>
-        <w:t>The .NET Connector now provides support for both .NET 4.5 and .NET 4.5.1. Previously, .NET 4.5 users had to upgrade to 4.5.1</w:t>
+        <w:t xml:space="preserve">The .NET Connector now provides support for .NET Standard </w:t>
       </w:r>
       <w:r>
         <w:rPr>
           <w:lang w:eastAsia="ar-SA"/>
         </w:rPr>
-        <w:t xml:space="preserve">. For more information, see sections </w:t>
+        <w:t>2</w:t>
+      </w:r>
+      <w:r>
+        <w:rPr>
+          <w:lang w:eastAsia="ar-SA"/>
+        </w:rPr>
+        <w:t>.</w:t>
+      </w:r>
+      <w:r>
+        <w:rPr>
+          <w:lang w:eastAsia="ar-SA"/>
+        </w:rPr>
+        <w:t>0</w:t>
+      </w:r>
+      <w:r>
+        <w:rPr>
+          <w:lang w:eastAsia="ar-SA"/>
+        </w:rPr>
+        <w:t>. For more information, see Section</w:t>
+      </w:r>
+      <w:r>
+        <w:rPr>
+          <w:lang w:eastAsia="ar-SA"/>
+        </w:rPr>
+        <w:t xml:space="preserve"> </w:t>
       </w:r>
       <w:r>
         <w:rPr>
@@ -3085,7 +3189,7 @@
           <w:u w:val="single"/>
           <w:lang w:eastAsia="ar-SA"/>
         </w:rPr>
-        <w:instrText xml:space="preserve"> REF _Ref503430964 \r \h </w:instrText>
+        <w:instrText xml:space="preserve"> REF _Ref509321802 \r \h </w:instrText>
       </w:r>
       <w:r>
         <w:rPr>
@@ -3105,129 +3209,7 @@
           <w:u w:val="single"/>
           <w:lang w:eastAsia="ar-SA"/>
         </w:rPr>
-        <w:t>3.2.2</w:t>
-      </w:r>
-      <w:r>
-        <w:rPr>
-          <w:u w:val="single"/>
-          <w:lang w:eastAsia="ar-SA"/>
-        </w:rPr>
-        <w:fldChar w:fldCharType="end"/>
-      </w:r>
-      <w:r>
-        <w:rPr>
-          <w:lang w:eastAsia="ar-SA"/>
-        </w:rPr>
-        <w:t xml:space="preserve"> and </w:t>
-      </w:r>
-      <w:r>
-        <w:rPr>
-          <w:u w:val="single"/>
-          <w:lang w:eastAsia="ar-SA"/>
-        </w:rPr>
-        <w:fldChar w:fldCharType="begin"/>
-      </w:r>
-      <w:r>
-        <w:rPr>
-          <w:u w:val="single"/>
-          <w:lang w:eastAsia="ar-SA"/>
-        </w:rPr>
-        <w:instrText xml:space="preserve"> REF _Ref503431008 \r \h </w:instrText>
-      </w:r>
-      <w:r>
-        <w:rPr>
-          <w:u w:val="single"/>
-          <w:lang w:eastAsia="ar-SA"/>
-        </w:rPr>
-      </w:r>
-      <w:r>
-        <w:rPr>
-          <w:u w:val="single"/>
-          <w:lang w:eastAsia="ar-SA"/>
-        </w:rPr>
-        <w:fldChar w:fldCharType="separate"/>
-      </w:r>
-      <w:r>
-        <w:rPr>
-          <w:u w:val="single"/>
-          <w:lang w:eastAsia="ar-SA"/>
-        </w:rPr>
-        <w:t>3.2.3</w:t>
-      </w:r>
-      <w:r>
-        <w:rPr>
-          <w:u w:val="single"/>
-          <w:lang w:eastAsia="ar-SA"/>
-        </w:rPr>
-        <w:fldChar w:fldCharType="end"/>
-      </w:r>
-      <w:r>
-        <w:rPr>
-          <w:lang w:eastAsia="ar-SA"/>
-        </w:rPr>
-        <w:t>.</w:t>
-      </w:r>
-    </w:p>
-    <w:p>
-      <w:pPr>
-        <w:pStyle w:val="EDBTXTNormalWebBlackCharChar1"/>
-        <w:numPr>
-          <w:ilvl w:val="0"/>
-          <w:numId w:val="2"/>
-        </w:numPr>
-        <w:tabs>
-          <w:tab w:val="left" w:pos="720"/>
-        </w:tabs>
-        <w:spacing w:before="0" w:after="0"/>
-        <w:rPr>
-          <w:lang w:eastAsia="ar-SA"/>
-        </w:rPr>
-      </w:pPr>
-      <w:r>
-        <w:rPr>
-          <w:lang w:eastAsia="ar-SA"/>
-        </w:rPr>
-        <w:t>The .NET Connector now provides support for .NET Standard 1.3</w:t>
-      </w:r>
-      <w:r>
-        <w:rPr>
-          <w:lang w:eastAsia="ar-SA"/>
-        </w:rPr>
-        <w:t xml:space="preserve">. For more information, see Section </w:t>
-      </w:r>
-      <w:r>
-        <w:rPr>
-          <w:u w:val="single"/>
-          <w:lang w:eastAsia="ar-SA"/>
-        </w:rPr>
-        <w:fldChar w:fldCharType="begin"/>
-      </w:r>
-      <w:r>
-        <w:rPr>
-          <w:u w:val="single"/>
-          <w:lang w:eastAsia="ar-SA"/>
-        </w:rPr>
-        <w:instrText xml:space="preserve"> REF _Ref503431048 \r \h </w:instrText>
-      </w:r>
-      <w:r>
-        <w:rPr>
-          <w:u w:val="single"/>
-          <w:lang w:eastAsia="ar-SA"/>
-        </w:rPr>
-      </w:r>
-      <w:r>
-        <w:rPr>
-          <w:u w:val="single"/>
-          <w:lang w:eastAsia="ar-SA"/>
-        </w:rPr>
-        <w:fldChar w:fldCharType="separate"/>
-      </w:r>
-      <w:r>
-        <w:rPr>
-          <w:u w:val="single"/>
-          <w:lang w:eastAsia="ar-SA"/>
-        </w:rPr>
-        <w:t>3.2.4</w:t>
+        <w:t>3.2.5</w:t>
       </w:r>
       <w:r>
         <w:rPr>
@@ -3262,7 +3244,7 @@
       <w:bookmarkStart w:id="10" w:name="_Ref103071794"/>
       <w:bookmarkStart w:id="11" w:name="_Ref103073047"/>
       <w:bookmarkStart w:id="12" w:name="_Ref103073090"/>
-      <w:bookmarkStart w:id="13" w:name="_Toc503771150"/>
+      <w:bookmarkStart w:id="13" w:name="_Toc509323267"/>
       <w:bookmarkEnd w:id="3"/>
       <w:bookmarkEnd w:id="4"/>
       <w:bookmarkEnd w:id="5"/>
@@ -3693,7 +3675,7 @@
       <w:pPr>
         <w:pStyle w:val="Heading1"/>
       </w:pPr>
-      <w:bookmarkStart w:id="15" w:name="_Toc503771151"/>
+      <w:bookmarkStart w:id="15" w:name="_Toc509323268"/>
       <w:r>
         <w:lastRenderedPageBreak/>
         <w:t>The Advanced Server .NET Connector - Overview</w:t>
@@ -3759,7 +3741,7 @@
       <w:pPr>
         <w:pStyle w:val="Heading2"/>
       </w:pPr>
-      <w:bookmarkStart w:id="16" w:name="_Toc503771152"/>
+      <w:bookmarkStart w:id="16" w:name="_Toc509323269"/>
       <w:r>
         <w:t>The .NET Class Hierarchy</w:t>
       </w:r>
@@ -4046,7 +4028,7 @@
       <w:pPr>
         <w:pStyle w:val="Heading2"/>
       </w:pPr>
-      <w:bookmarkStart w:id="17" w:name="_Toc503771153"/>
+      <w:bookmarkStart w:id="17" w:name="_Toc509323270"/>
       <w:r>
         <w:lastRenderedPageBreak/>
         <w:t>Installing the .NET Connector</w:t>
@@ -4173,7 +4155,7 @@
           <w:noProof/>
         </w:rPr>
         <w:drawing>
-          <wp:inline distT="0" distB="0" distL="0" distR="0" wp14:anchorId="0EFA0FCB" wp14:editId="2A3CA3C2">
+          <wp:inline distT="0" distB="0" distL="0" distR="0" wp14:anchorId="59E5C706" wp14:editId="5F111761">
             <wp:extent cx="3886200" cy="3037805"/>
             <wp:effectExtent l="0" t="0" r="0" b="0"/>
             <wp:docPr id="2" name="Picture 2"/>
@@ -4282,7 +4264,7 @@
         </w:rPr>
         <w:lastRenderedPageBreak/>
         <w:drawing>
-          <wp:inline distT="0" distB="0" distL="0" distR="0" wp14:anchorId="7363081D" wp14:editId="393B3B0B">
+          <wp:inline distT="0" distB="0" distL="0" distR="0" wp14:anchorId="2DBADB27" wp14:editId="747624C2">
             <wp:extent cx="3886200" cy="3046927"/>
             <wp:effectExtent l="0" t="0" r="0" b="1270"/>
             <wp:docPr id="3" name="Picture 3"/>
@@ -4417,7 +4399,7 @@
           <w:noProof/>
         </w:rPr>
         <w:drawing>
-          <wp:inline distT="0" distB="0" distL="0" distR="0" wp14:anchorId="3054EE3D" wp14:editId="45445A73">
+          <wp:inline distT="0" distB="0" distL="0" distR="0" wp14:anchorId="736D0C27" wp14:editId="397820BD">
             <wp:extent cx="4114800" cy="3217552"/>
             <wp:effectExtent l="0" t="0" r="0" b="1905"/>
             <wp:docPr id="4" name="Picture 4"/>
@@ -4572,7 +4554,7 @@
           <w:noProof/>
         </w:rPr>
         <w:drawing>
-          <wp:inline distT="0" distB="0" distL="0" distR="0" wp14:anchorId="6A4EC1C5" wp14:editId="6A6C9428">
+          <wp:inline distT="0" distB="0" distL="0" distR="0" wp14:anchorId="508CD424" wp14:editId="45B34EFB">
             <wp:extent cx="4114800" cy="3194511"/>
             <wp:effectExtent l="0" t="0" r="0" b="6350"/>
             <wp:docPr id="5" name="Picture 5"/>
@@ -4745,7 +4727,7 @@
           <w:noProof/>
         </w:rPr>
         <w:drawing>
-          <wp:inline distT="0" distB="0" distL="0" distR="0" wp14:anchorId="627CAA74" wp14:editId="63A421DE">
+          <wp:inline distT="0" distB="0" distL="0" distR="0" wp14:anchorId="0AE9CE3A" wp14:editId="46992EC8">
             <wp:extent cx="3790950" cy="1619051"/>
             <wp:effectExtent l="0" t="0" r="0" b="635"/>
             <wp:docPr id="12" name="Picture 12" descr="C:\Users\susan\AppData\Local\Temp\vmware-susan\VMwareDnD\7412d23f\Screen Shot 2016-07-11 at 4.50.20 PM.png"/>
@@ -4912,7 +4894,7 @@
         </w:rPr>
         <w:lastRenderedPageBreak/>
         <w:drawing>
-          <wp:inline distT="0" distB="0" distL="0" distR="0" wp14:anchorId="2AB439E9" wp14:editId="5F1E6793">
+          <wp:inline distT="0" distB="0" distL="0" distR="0" wp14:anchorId="7DA492D5" wp14:editId="2DA1EFF7">
             <wp:extent cx="4116527" cy="2992582"/>
             <wp:effectExtent l="0" t="0" r="0" b="0"/>
             <wp:docPr id="10" name="Picture 10"/>
@@ -5018,7 +5000,7 @@
         <w:pStyle w:val="Heading1"/>
       </w:pPr>
       <w:bookmarkStart w:id="18" w:name="_Ref456012125"/>
-      <w:bookmarkStart w:id="19" w:name="_Toc503771154"/>
+      <w:bookmarkStart w:id="19" w:name="_Toc509323271"/>
       <w:r>
         <w:lastRenderedPageBreak/>
         <w:t>Configuring the .NET Connector</w:t>
@@ -5196,28 +5178,16 @@
         <w:rPr>
           <w:rStyle w:val="EDBTXTEmphasisNormalWebBoldBlackCharChar"/>
         </w:rPr>
-        <w:t xml:space="preserve">Entity Framework </w:t>
+        <w:t>.NET Standard 2.0</w:t>
       </w:r>
       <w:r>
         <w:rPr>
           <w:rStyle w:val="EDBTXTEmphasisNormalWebBoldBlackCharChar"/>
         </w:rPr>
-        <w:t>5/</w:t>
-      </w:r>
-      <w:r>
-        <w:rPr>
-          <w:rStyle w:val="EDBTXTEmphasisNormalWebBoldBlackCharChar"/>
-        </w:rPr>
-        <w:t>6</w:t>
-      </w:r>
-      <w:r>
-        <w:rPr>
-          <w:rStyle w:val="EDBTXTEmphasisNormalWebBoldBlackCharChar"/>
-        </w:rPr>
         <w:t>.</w:t>
       </w:r>
       <w:r>
-        <w:t xml:space="preserve"> Instructions for configuring for usage with Entity Framework</w:t>
+        <w:t xml:space="preserve"> Instructions for configuring for usage with .NET Standard 2.0</w:t>
       </w:r>
     </w:p>
     <w:p>
@@ -5236,6 +5206,46 @@
         <w:rPr>
           <w:rStyle w:val="EDBTXTEmphasisNormalWebBoldBlackCharChar"/>
         </w:rPr>
+        <w:t xml:space="preserve">Entity Framework </w:t>
+      </w:r>
+      <w:r>
+        <w:rPr>
+          <w:rStyle w:val="EDBTXTEmphasisNormalWebBoldBlackCharChar"/>
+        </w:rPr>
+        <w:t>5/</w:t>
+      </w:r>
+      <w:r>
+        <w:rPr>
+          <w:rStyle w:val="EDBTXTEmphasisNormalWebBoldBlackCharChar"/>
+        </w:rPr>
+        <w:t>6</w:t>
+      </w:r>
+      <w:r>
+        <w:rPr>
+          <w:rStyle w:val="EDBTXTEmphasisNormalWebBoldBlackCharChar"/>
+        </w:rPr>
+        <w:t>.</w:t>
+      </w:r>
+      <w:r>
+        <w:t xml:space="preserve"> Instructions for configuring for usage with Entity Framework</w:t>
+      </w:r>
+    </w:p>
+    <w:p>
+      <w:pPr>
+        <w:pStyle w:val="EDBTXTNormalWebBlackCharChar1"/>
+        <w:numPr>
+          <w:ilvl w:val="0"/>
+          <w:numId w:val="2"/>
+        </w:numPr>
+        <w:spacing w:before="0" w:after="0"/>
+        <w:rPr>
+          <w:lang w:eastAsia="ar-SA"/>
+        </w:rPr>
+      </w:pPr>
+      <w:r>
+        <w:rPr>
+          <w:rStyle w:val="EDBTXTEmphasisNormalWebBoldBlackCharChar"/>
+        </w:rPr>
         <w:t>EDBDdexProvider</w:t>
       </w:r>
       <w:r>
@@ -5258,7 +5268,7 @@
         <w:pStyle w:val="Heading2"/>
       </w:pPr>
       <w:bookmarkStart w:id="20" w:name="_Ref477525249"/>
-      <w:bookmarkStart w:id="21" w:name="_Toc503771155"/>
+      <w:bookmarkStart w:id="21" w:name="_Toc509323272"/>
       <w:r>
         <w:t>General Instructions</w:t>
       </w:r>
@@ -5532,7 +5542,7 @@
       <w:pPr>
         <w:pStyle w:val="Heading2"/>
       </w:pPr>
-      <w:bookmarkStart w:id="22" w:name="_Toc503771156"/>
+      <w:bookmarkStart w:id="22" w:name="_Toc509323273"/>
       <w:r>
         <w:t xml:space="preserve">.NET Framework </w:t>
       </w:r>
@@ -5559,7 +5569,7 @@
       <w:pPr>
         <w:pStyle w:val="Heading3"/>
       </w:pPr>
-      <w:bookmarkStart w:id="23" w:name="_Toc503771157"/>
+      <w:bookmarkStart w:id="23" w:name="_Toc509323274"/>
       <w:r>
         <w:t>.NET Framework 4.0</w:t>
       </w:r>
@@ -5767,7 +5777,7 @@
       </w:pPr>
       <w:bookmarkStart w:id="24" w:name="_Ref503423964"/>
       <w:bookmarkStart w:id="25" w:name="_Ref503430964"/>
-      <w:bookmarkStart w:id="26" w:name="_Toc503771158"/>
+      <w:bookmarkStart w:id="26" w:name="_Toc509323275"/>
       <w:r>
         <w:t>.NET Framework 4.5</w:t>
       </w:r>
@@ -6066,7 +6076,7 @@
       </w:pPr>
       <w:bookmarkStart w:id="27" w:name="_Ref503423994"/>
       <w:bookmarkStart w:id="28" w:name="_Ref503431008"/>
-      <w:bookmarkStart w:id="29" w:name="_Toc503771159"/>
+      <w:bookmarkStart w:id="29" w:name="_Toc509323276"/>
       <w:r>
         <w:t>.NET Framework 4.5.1</w:t>
       </w:r>
@@ -6387,7 +6397,7 @@
         <w:pStyle w:val="Heading3"/>
       </w:pPr>
       <w:bookmarkStart w:id="30" w:name="_Ref503431048"/>
-      <w:bookmarkStart w:id="31" w:name="_Toc503771160"/>
+      <w:bookmarkStart w:id="31" w:name="_Toc509323277"/>
       <w:r>
         <w:t>.NET Standard 1.3</w:t>
       </w:r>
@@ -6542,24 +6552,13 @@
     </w:p>
     <w:p>
       <w:pPr>
-        <w:pStyle w:val="EDBTXTNormalWebBlackCharChar0"/>
-      </w:pPr>
-    </w:p>
-    <w:p>
-      <w:pPr>
-        <w:pStyle w:val="Heading2"/>
-      </w:pPr>
-      <w:bookmarkStart w:id="32" w:name="_Ref477527440"/>
-      <w:bookmarkStart w:id="33" w:name="_Toc503771161"/>
+        <w:pStyle w:val="Heading3"/>
+      </w:pPr>
+      <w:bookmarkStart w:id="32" w:name="_Ref509321802"/>
+      <w:bookmarkStart w:id="33" w:name="_Toc509323278"/>
       <w:r>
         <w:lastRenderedPageBreak/>
-        <w:t xml:space="preserve">Entity Framework </w:t>
-      </w:r>
-      <w:r>
-        <w:t>5/</w:t>
-      </w:r>
-      <w:r>
-        <w:t>6</w:t>
+        <w:t>.NET Standard 2.0</w:t>
       </w:r>
       <w:bookmarkEnd w:id="32"/>
       <w:bookmarkEnd w:id="33"/>
@@ -6569,6 +6568,182 @@
         <w:pStyle w:val="EDBTXTNormalWebBlackCharChar0"/>
       </w:pPr>
       <w:r>
+        <w:t>For .NET Standard Framework 2.0</w:t>
+      </w:r>
+      <w:r>
+        <w:t xml:space="preserve">, the data provider installation path is </w:t>
+      </w:r>
+      <w:r>
+        <w:t xml:space="preserve">the </w:t>
+      </w:r>
+      <w:r>
+        <w:t>following:</w:t>
+      </w:r>
+    </w:p>
+    <w:p>
+      <w:pPr>
+        <w:pStyle w:val="EDBTXTNormalWebBlackCharChar0"/>
+        <w:ind w:left="720"/>
+        <w:rPr>
+          <w:rStyle w:val="EDBTXTKeywordBlack"/>
+        </w:rPr>
+      </w:pPr>
+      <w:r>
+        <w:rPr>
+          <w:rStyle w:val="EDBTXTKeywordBlack"/>
+        </w:rPr>
+        <w:t>C:\Program Files\edb\connectors\d</w:t>
+      </w:r>
+      <w:r>
+        <w:rPr>
+          <w:rStyle w:val="EDBTXTKeywordBlack"/>
+        </w:rPr>
+        <w:t>otnet\netstandard2.0</w:t>
+      </w:r>
+      <w:r>
+        <w:rPr>
+          <w:rStyle w:val="EDBTXTKeywordBlack"/>
+        </w:rPr>
+        <w:t>\</w:t>
+      </w:r>
+    </w:p>
+    <w:p>
+      <w:pPr>
+        <w:pStyle w:val="EDBTXTNormalWebBlackCharChar0"/>
+      </w:pPr>
+      <w:r>
+        <w:t>The shared library file is the following:</w:t>
+      </w:r>
+    </w:p>
+    <w:p>
+      <w:pPr>
+        <w:ind w:left="720"/>
+        <w:rPr>
+          <w:rStyle w:val="EDBTXTKeywordBlack"/>
+        </w:rPr>
+      </w:pPr>
+      <w:r>
+        <w:rPr>
+          <w:rStyle w:val="EDBTXTKeywordBlack"/>
+        </w:rPr>
+        <w:t>EnterpriseDB.EDBClient.dll</w:t>
+      </w:r>
+    </w:p>
+    <w:p>
+      <w:pPr>
+        <w:pStyle w:val="EDBTXTNormalWebBlackCharChar0"/>
+      </w:pPr>
+      <w:r>
+        <w:t xml:space="preserve">See Section </w:t>
+      </w:r>
+      <w:r>
+        <w:rPr>
+          <w:u w:val="single"/>
+        </w:rPr>
+        <w:fldChar w:fldCharType="begin"/>
+      </w:r>
+      <w:r>
+        <w:rPr>
+          <w:u w:val="single"/>
+        </w:rPr>
+        <w:instrText xml:space="preserve"> REF _Ref477525249 \r \h </w:instrText>
+      </w:r>
+      <w:r>
+        <w:rPr>
+          <w:u w:val="single"/>
+        </w:rPr>
+      </w:r>
+      <w:r>
+        <w:rPr>
+          <w:u w:val="single"/>
+        </w:rPr>
+        <w:fldChar w:fldCharType="separate"/>
+      </w:r>
+      <w:r>
+        <w:rPr>
+          <w:u w:val="single"/>
+        </w:rPr>
+        <w:t>3.1</w:t>
+      </w:r>
+      <w:r>
+        <w:rPr>
+          <w:u w:val="single"/>
+        </w:rPr>
+        <w:fldChar w:fldCharType="end"/>
+      </w:r>
+      <w:r>
+        <w:t xml:space="preserve"> for information on referencing library files.</w:t>
+      </w:r>
+    </w:p>
+    <w:p>
+      <w:pPr>
+        <w:pStyle w:val="EDBTXTNormalWebBlackCharChar0"/>
+      </w:pPr>
+      <w:r>
+        <w:t xml:space="preserve">Depending upon the type of application, import the namespace into the source code (see Section </w:t>
+      </w:r>
+      <w:r>
+        <w:rPr>
+          <w:u w:val="single"/>
+        </w:rPr>
+        <w:fldChar w:fldCharType="begin"/>
+      </w:r>
+      <w:r>
+        <w:rPr>
+          <w:u w:val="single"/>
+        </w:rPr>
+        <w:instrText xml:space="preserve"> REF _Ref477525249 \r \h </w:instrText>
+      </w:r>
+      <w:r>
+        <w:rPr>
+          <w:u w:val="single"/>
+        </w:rPr>
+      </w:r>
+      <w:r>
+        <w:rPr>
+          <w:u w:val="single"/>
+        </w:rPr>
+        <w:fldChar w:fldCharType="separate"/>
+      </w:r>
+      <w:r>
+        <w:rPr>
+          <w:u w:val="single"/>
+        </w:rPr>
+        <w:t>3.1</w:t>
+      </w:r>
+      <w:r>
+        <w:rPr>
+          <w:u w:val="single"/>
+        </w:rPr>
+        <w:fldChar w:fldCharType="end"/>
+      </w:r>
+      <w:r>
+        <w:t>).</w:t>
+      </w:r>
+    </w:p>
+    <w:p>
+      <w:pPr>
+        <w:pStyle w:val="Heading2"/>
+      </w:pPr>
+      <w:bookmarkStart w:id="34" w:name="_Ref477527440"/>
+      <w:bookmarkStart w:id="35" w:name="_Toc509323279"/>
+      <w:r>
+        <w:t xml:space="preserve">Entity Framework </w:t>
+      </w:r>
+      <w:r>
+        <w:t>5/</w:t>
+      </w:r>
+      <w:r>
+        <w:t>6</w:t>
+      </w:r>
+      <w:bookmarkEnd w:id="34"/>
+      <w:bookmarkEnd w:id="35"/>
+    </w:p>
+    <w:p>
+      <w:pPr>
+        <w:pStyle w:val="EDBTXTNormalWebBlackCharChar0"/>
+      </w:pPr>
+      <w:r>
         <w:t>To set up .NET Connector for usage with Entity Framework, reference the shared library files located in the following directory:</w:t>
       </w:r>
     </w:p>
@@ -6944,7 +7119,7 @@
         <w:t>.</w:t>
       </w:r>
       <w:r>
-        <w:t>2</w:t>
+        <w:t>6</w:t>
       </w:r>
       <w:r>
         <w:t>.</w:t>
@@ -6994,6 +7169,7 @@
         <w:pStyle w:val="EDBSYNTXPreformattedBlackLeft033"/>
       </w:pPr>
       <w:r>
+        <w:lastRenderedPageBreak/>
         <w:t>&lt;provider invaria</w:t>
       </w:r>
       <w:r>
@@ -7244,399 +7420,399 @@
         <w:rPr>
           <w:sz w:val="16"/>
         </w:rPr>
+        <w:t xml:space="preserve">  &lt;</w:t>
+      </w:r>
+      <w:proofErr w:type="gramStart"/>
+      <w:r>
+        <w:rPr>
+          <w:sz w:val="16"/>
+        </w:rPr>
+        <w:t>entityFramework</w:t>
+      </w:r>
+      <w:proofErr w:type="gramEnd"/>
+      <w:r>
+        <w:rPr>
+          <w:sz w:val="16"/>
+        </w:rPr>
+        <w:t>&gt;</w:t>
+      </w:r>
+    </w:p>
+    <w:p>
+      <w:pPr>
+        <w:pStyle w:val="EDBEXCourierNew9ptCustomColorRGB4649146Left01"/>
+        <w:rPr>
+          <w:sz w:val="16"/>
+        </w:rPr>
+      </w:pPr>
+      <w:r>
+        <w:rPr>
+          <w:sz w:val="16"/>
+        </w:rPr>
+        <w:t xml:space="preserve">    &lt;</w:t>
+      </w:r>
+      <w:proofErr w:type="gramStart"/>
+      <w:r>
+        <w:rPr>
+          <w:sz w:val="16"/>
+        </w:rPr>
+        <w:t>providers</w:t>
+      </w:r>
+      <w:proofErr w:type="gramEnd"/>
+      <w:r>
+        <w:rPr>
+          <w:sz w:val="16"/>
+        </w:rPr>
+        <w:t>&gt;</w:t>
+      </w:r>
+    </w:p>
+    <w:p>
+      <w:pPr>
+        <w:pStyle w:val="EDBEXCourierNew9ptCustomColorRGB4649146Left01"/>
+        <w:rPr>
+          <w:sz w:val="16"/>
+        </w:rPr>
+      </w:pPr>
+      <w:r>
+        <w:rPr>
+          <w:sz w:val="16"/>
+        </w:rPr>
+        <w:t xml:space="preserve">      &lt;provider invariantName="EnterpriseDB.EDBClient" type="EnterpriseDB.EDBClient.EDBServices, EntityFramework6.EnterpriseDB.EDBClient"&gt;&lt;/provider&gt;</w:t>
+      </w:r>
+    </w:p>
+    <w:p>
+      <w:pPr>
+        <w:pStyle w:val="EDBEXCourierNew9ptCustomColorRGB4649146Left01"/>
+        <w:rPr>
+          <w:sz w:val="16"/>
+        </w:rPr>
+      </w:pPr>
+      <w:r>
+        <w:rPr>
+          <w:sz w:val="16"/>
+        </w:rPr>
+        <w:t xml:space="preserve">    &lt;/providers&gt;</w:t>
+      </w:r>
+    </w:p>
+    <w:p>
+      <w:pPr>
+        <w:pStyle w:val="EDBEXCourierNew9ptCustomColorRGB4649146Left01"/>
+        <w:rPr>
+          <w:sz w:val="16"/>
+        </w:rPr>
+      </w:pPr>
+      <w:r>
+        <w:rPr>
+          <w:sz w:val="16"/>
+        </w:rPr>
+        <w:t xml:space="preserve">  &lt;/entityFramework&gt;</w:t>
+      </w:r>
+    </w:p>
+    <w:p>
+      <w:pPr>
+        <w:pStyle w:val="EDBEXCourierNew9ptCustomColorRGB4649146Left01"/>
+        <w:rPr>
+          <w:sz w:val="16"/>
+        </w:rPr>
+      </w:pPr>
+    </w:p>
+    <w:p>
+      <w:pPr>
+        <w:pStyle w:val="EDBEXCourierNew9ptCustomColorRGB4649146Left01"/>
+        <w:rPr>
+          <w:sz w:val="16"/>
+        </w:rPr>
+      </w:pPr>
+      <w:r>
+        <w:rPr>
+          <w:sz w:val="16"/>
+        </w:rPr>
+        <w:t xml:space="preserve">  &lt;system.data&gt;</w:t>
+      </w:r>
+    </w:p>
+    <w:p>
+      <w:pPr>
+        <w:pStyle w:val="EDBEXCourierNew9ptCustomColorRGB4649146Left01"/>
+        <w:rPr>
+          <w:sz w:val="16"/>
+        </w:rPr>
+      </w:pPr>
+      <w:r>
+        <w:rPr>
+          <w:sz w:val="16"/>
+        </w:rPr>
+        <w:t xml:space="preserve">    &lt;DbProviderFactories&gt;</w:t>
+      </w:r>
+    </w:p>
+    <w:p>
+      <w:pPr>
+        <w:pStyle w:val="EDBEXCourierNew9ptCustomColorRGB4649146Left01"/>
+        <w:rPr>
+          <w:sz w:val="16"/>
+        </w:rPr>
+      </w:pPr>
+      <w:r>
+        <w:rPr>
+          <w:sz w:val="16"/>
+        </w:rPr>
+        <w:t xml:space="preserve">      &lt;remove invariant="EnterpriseDB.EDBClient"/&gt;</w:t>
+      </w:r>
+    </w:p>
+    <w:p>
+      <w:pPr>
+        <w:pStyle w:val="EDBEXCourierNew9ptCustomColorRGB4649146Left01"/>
+        <w:rPr>
+          <w:sz w:val="16"/>
+        </w:rPr>
+      </w:pPr>
+      <w:r>
+        <w:rPr>
+          <w:sz w:val="16"/>
+        </w:rPr>
+        <w:t xml:space="preserve">      &lt;add name="EnterpriseDB Data Provider" invariant="EnterpriseDB.EDBClient" support="FF" description=".Net Framework Data Provider for Postgresql" type="EnterpriseDB.EDBClient.EDBFactory, EnterpriseDB.EDBClient"/&gt;</w:t>
+      </w:r>
+    </w:p>
+    <w:p>
+      <w:pPr>
+        <w:pStyle w:val="EDBEXCourierNew9ptCustomColorRGB4649146Left01"/>
+        <w:rPr>
+          <w:sz w:val="16"/>
+        </w:rPr>
+      </w:pPr>
+      <w:r>
+        <w:rPr>
+          <w:sz w:val="16"/>
+        </w:rPr>
+        <w:t xml:space="preserve">    &lt;/DbProviderFactories&gt;</w:t>
+      </w:r>
+    </w:p>
+    <w:p>
+      <w:pPr>
+        <w:pStyle w:val="EDBEXCourierNew9ptCustomColorRGB4649146Left01"/>
+        <w:rPr>
+          <w:sz w:val="16"/>
+        </w:rPr>
+      </w:pPr>
+      <w:r>
+        <w:rPr>
+          <w:sz w:val="16"/>
+        </w:rPr>
+        <w:t xml:space="preserve">  &lt;/system.data&gt;</w:t>
+      </w:r>
+    </w:p>
+    <w:p>
+      <w:pPr>
+        <w:pStyle w:val="EDBEXCourierNew9ptCustomColorRGB4649146Left01"/>
+        <w:rPr>
+          <w:sz w:val="16"/>
+        </w:rPr>
+      </w:pPr>
+    </w:p>
+    <w:p>
+      <w:pPr>
+        <w:pStyle w:val="EDBEXCourierNew9ptCustomColorRGB4649146Left01"/>
+        <w:rPr>
+          <w:sz w:val="16"/>
+        </w:rPr>
+      </w:pPr>
+      <w:r>
+        <w:rPr>
+          <w:sz w:val="16"/>
+        </w:rPr>
+        <w:t>&lt;/configuration&gt;</w:t>
+      </w:r>
+    </w:p>
+    <w:p>
+      <w:pPr>
+        <w:pStyle w:val="EDBTXTNormalWebBlackCharChar0"/>
+      </w:pPr>
+      <w:r>
+        <w:rPr>
+          <w:rStyle w:val="EDBTXTEmphasisNormalWebBoldBlackCharChar"/>
+        </w:rPr>
+        <w:t>Note:</w:t>
+      </w:r>
+      <w:r>
+        <w:t xml:space="preserve"> The same entries for </w:t>
+      </w:r>
+      <w:r>
+        <w:rPr>
+          <w:rStyle w:val="EDBTXTKeywordBlack"/>
+        </w:rPr>
+        <w:t>&lt;providers&gt;</w:t>
+      </w:r>
+      <w:r>
+        <w:t xml:space="preserve"> and </w:t>
+      </w:r>
+      <w:r>
+        <w:rPr>
+          <w:rStyle w:val="EDBTXTKeywordBlack"/>
+        </w:rPr>
+        <w:t>&lt;DbProviderFactories&gt;</w:t>
+      </w:r>
+      <w:r>
+        <w:t xml:space="preserve"> are valid for the </w:t>
+      </w:r>
+      <w:r>
+        <w:rPr>
+          <w:rStyle w:val="EDBTXTKeywordBlack"/>
+        </w:rPr>
+        <w:t>web.config</w:t>
+      </w:r>
+      <w:r>
+        <w:t xml:space="preserve"> file as well as for </w:t>
+      </w:r>
+      <w:r>
+        <w:rPr>
+          <w:rStyle w:val="EDBTXTKeywordBlack"/>
+        </w:rPr>
+        <w:t>app.config</w:t>
+      </w:r>
+      <w:r>
+        <w:t>.</w:t>
+      </w:r>
+    </w:p>
+    <w:p>
+      <w:pPr>
+        <w:pStyle w:val="EDBTXTNormalWebBlackCharChar0"/>
+      </w:pPr>
+      <w:r>
+        <w:t xml:space="preserve">Depending upon the type of application, import the namespace into the source code (see Section </w:t>
+      </w:r>
+      <w:r>
+        <w:rPr>
+          <w:u w:val="single"/>
+        </w:rPr>
+        <w:fldChar w:fldCharType="begin"/>
+      </w:r>
+      <w:r>
+        <w:rPr>
+          <w:u w:val="single"/>
+        </w:rPr>
+        <w:instrText xml:space="preserve"> REF _Ref477525249 \r \h </w:instrText>
+      </w:r>
+      <w:r>
+        <w:rPr>
+          <w:u w:val="single"/>
+        </w:rPr>
+      </w:r>
+      <w:r>
+        <w:rPr>
+          <w:u w:val="single"/>
+        </w:rPr>
+        <w:fldChar w:fldCharType="separate"/>
+      </w:r>
+      <w:r>
+        <w:rPr>
+          <w:u w:val="single"/>
+        </w:rPr>
+        <w:t>3.1</w:t>
+      </w:r>
+      <w:r>
+        <w:rPr>
+          <w:u w:val="single"/>
+        </w:rPr>
+        <w:fldChar w:fldCharType="end"/>
+      </w:r>
+      <w:r>
+        <w:t>).</w:t>
+      </w:r>
+    </w:p>
+    <w:p>
+      <w:pPr>
+        <w:pStyle w:val="EDBTXTNormalWebBlackCharChar0"/>
+      </w:pPr>
+      <w:r>
+        <w:t xml:space="preserve">For usage of </w:t>
+      </w:r>
+      <w:r>
+        <w:t xml:space="preserve">the features of </w:t>
+      </w:r>
+      <w:r>
+        <w:t>Entity Framework, refer to the Micr</w:t>
+      </w:r>
+      <w:r>
+        <w:t>o</w:t>
+      </w:r>
+      <w:r>
+        <w:t>soft documentation.</w:t>
+      </w:r>
+    </w:p>
+    <w:p>
+      <w:pPr>
+        <w:pStyle w:val="Heading2"/>
+      </w:pPr>
+      <w:bookmarkStart w:id="36" w:name="_Ref477528081"/>
+      <w:bookmarkStart w:id="37" w:name="_Toc509323280"/>
+      <w:r>
+        <w:t>EDBDdexProvider for Visual Studio</w:t>
+      </w:r>
+      <w:bookmarkEnd w:id="36"/>
+      <w:r>
+        <w:t xml:space="preserve"> 2015</w:t>
+      </w:r>
+      <w:bookmarkEnd w:id="37"/>
+    </w:p>
+    <w:p>
+      <w:pPr>
+        <w:pStyle w:val="EDBTXTNormalWebBlackCharChar0"/>
+      </w:pPr>
+      <w:r>
+        <w:rPr>
+          <w:rStyle w:val="EDBTXTTermNormalWebBlackItalicCharCharChar"/>
+        </w:rPr>
+        <w:t>EDB Data Designer Extensibility Provider</w:t>
+      </w:r>
+      <w:r>
+        <w:t xml:space="preserve"> (</w:t>
+      </w:r>
+      <w:r>
+        <w:rPr>
+          <w:rStyle w:val="EDBTXTTermNormalWebBlackItalicCharCharChar"/>
+        </w:rPr>
+        <w:t>EDBDdexProvider</w:t>
+      </w:r>
+      <w:r>
+        <w:t>)</w:t>
+      </w:r>
+      <w:r>
+        <w:t xml:space="preserve"> is a component, which integrates </w:t>
+      </w:r>
+      <w:r>
+        <w:t>Advanced Server</w:t>
+      </w:r>
+      <w:r>
+        <w:t xml:space="preserve"> database access into Visual Studio, thus providing Vis</w:t>
+      </w:r>
+      <w:r>
+        <w:t>ual Studio integrated features.</w:t>
+      </w:r>
+    </w:p>
+    <w:p>
+      <w:pPr>
+        <w:pStyle w:val="EDBTXTNormalWebBlackCharChar0"/>
+      </w:pPr>
+      <w:r>
+        <w:t xml:space="preserve">It allows connecting to </w:t>
+      </w:r>
+      <w:r>
+        <w:t>Advanced Server</w:t>
+      </w:r>
+      <w:r>
+        <w:t xml:space="preserve"> from within Visual Studio's Server Explorer, creating a model from an existing database, etc. Therefore, if Visual Studio features are desired, then EDBDdexPr</w:t>
+      </w:r>
+      <w:r>
+        <w:t>ovider must be utilized</w:t>
+      </w:r>
+      <w:r>
+        <w:t>.</w:t>
+      </w:r>
+    </w:p>
+    <w:p>
+      <w:pPr>
+        <w:pStyle w:val="EDBTXTNormalWebBlackCharChar0"/>
+      </w:pPr>
+      <w:r>
         <w:lastRenderedPageBreak/>
-        <w:t xml:space="preserve">  &lt;</w:t>
-      </w:r>
-      <w:proofErr w:type="gramStart"/>
-      <w:r>
-        <w:rPr>
-          <w:sz w:val="16"/>
-        </w:rPr>
-        <w:t>entityFramework</w:t>
-      </w:r>
-      <w:proofErr w:type="gramEnd"/>
-      <w:r>
-        <w:rPr>
-          <w:sz w:val="16"/>
-        </w:rPr>
-        <w:t>&gt;</w:t>
-      </w:r>
-    </w:p>
-    <w:p>
-      <w:pPr>
-        <w:pStyle w:val="EDBEXCourierNew9ptCustomColorRGB4649146Left01"/>
-        <w:rPr>
-          <w:sz w:val="16"/>
-        </w:rPr>
-      </w:pPr>
-      <w:r>
-        <w:rPr>
-          <w:sz w:val="16"/>
-        </w:rPr>
-        <w:t xml:space="preserve">    &lt;</w:t>
-      </w:r>
-      <w:proofErr w:type="gramStart"/>
-      <w:r>
-        <w:rPr>
-          <w:sz w:val="16"/>
-        </w:rPr>
-        <w:t>providers</w:t>
-      </w:r>
-      <w:proofErr w:type="gramEnd"/>
-      <w:r>
-        <w:rPr>
-          <w:sz w:val="16"/>
-        </w:rPr>
-        <w:t>&gt;</w:t>
-      </w:r>
-    </w:p>
-    <w:p>
-      <w:pPr>
-        <w:pStyle w:val="EDBEXCourierNew9ptCustomColorRGB4649146Left01"/>
-        <w:rPr>
-          <w:sz w:val="16"/>
-        </w:rPr>
-      </w:pPr>
-      <w:r>
-        <w:rPr>
-          <w:sz w:val="16"/>
-        </w:rPr>
-        <w:t xml:space="preserve">      &lt;provider invariantName="EnterpriseDB.EDBClient" type="EnterpriseDB.EDBClient.EDBServices, EntityFramework6.EnterpriseDB.EDBClient"&gt;&lt;/provider&gt;</w:t>
-      </w:r>
-    </w:p>
-    <w:p>
-      <w:pPr>
-        <w:pStyle w:val="EDBEXCourierNew9ptCustomColorRGB4649146Left01"/>
-        <w:rPr>
-          <w:sz w:val="16"/>
-        </w:rPr>
-      </w:pPr>
-      <w:r>
-        <w:rPr>
-          <w:sz w:val="16"/>
-        </w:rPr>
-        <w:t xml:space="preserve">    &lt;/providers&gt;</w:t>
-      </w:r>
-    </w:p>
-    <w:p>
-      <w:pPr>
-        <w:pStyle w:val="EDBEXCourierNew9ptCustomColorRGB4649146Left01"/>
-        <w:rPr>
-          <w:sz w:val="16"/>
-        </w:rPr>
-      </w:pPr>
-      <w:r>
-        <w:rPr>
-          <w:sz w:val="16"/>
-        </w:rPr>
-        <w:t xml:space="preserve">  &lt;/entityFramework&gt;</w:t>
-      </w:r>
-    </w:p>
-    <w:p>
-      <w:pPr>
-        <w:pStyle w:val="EDBEXCourierNew9ptCustomColorRGB4649146Left01"/>
-        <w:rPr>
-          <w:sz w:val="16"/>
-        </w:rPr>
-      </w:pPr>
-    </w:p>
-    <w:p>
-      <w:pPr>
-        <w:pStyle w:val="EDBEXCourierNew9ptCustomColorRGB4649146Left01"/>
-        <w:rPr>
-          <w:sz w:val="16"/>
-        </w:rPr>
-      </w:pPr>
-      <w:r>
-        <w:rPr>
-          <w:sz w:val="16"/>
-        </w:rPr>
-        <w:t xml:space="preserve">  &lt;system.data&gt;</w:t>
-      </w:r>
-    </w:p>
-    <w:p>
-      <w:pPr>
-        <w:pStyle w:val="EDBEXCourierNew9ptCustomColorRGB4649146Left01"/>
-        <w:rPr>
-          <w:sz w:val="16"/>
-        </w:rPr>
-      </w:pPr>
-      <w:r>
-        <w:rPr>
-          <w:sz w:val="16"/>
-        </w:rPr>
-        <w:t xml:space="preserve">    &lt;DbProviderFactories&gt;</w:t>
-      </w:r>
-    </w:p>
-    <w:p>
-      <w:pPr>
-        <w:pStyle w:val="EDBEXCourierNew9ptCustomColorRGB4649146Left01"/>
-        <w:rPr>
-          <w:sz w:val="16"/>
-        </w:rPr>
-      </w:pPr>
-      <w:r>
-        <w:rPr>
-          <w:sz w:val="16"/>
-        </w:rPr>
-        <w:t xml:space="preserve">      &lt;remove invariant="EnterpriseDB.EDBClient"/&gt;</w:t>
-      </w:r>
-    </w:p>
-    <w:p>
-      <w:pPr>
-        <w:pStyle w:val="EDBEXCourierNew9ptCustomColorRGB4649146Left01"/>
-        <w:rPr>
-          <w:sz w:val="16"/>
-        </w:rPr>
-      </w:pPr>
-      <w:r>
-        <w:rPr>
-          <w:sz w:val="16"/>
-        </w:rPr>
-        <w:t xml:space="preserve">      &lt;add name="EnterpriseDB Data Provider" invariant="EnterpriseDB.EDBClient" support="FF" description=".Net Framework Data Provider for Postgresql" type="EnterpriseDB.EDBClient.EDBFactory, EnterpriseDB.EDBClient"/&gt;</w:t>
-      </w:r>
-    </w:p>
-    <w:p>
-      <w:pPr>
-        <w:pStyle w:val="EDBEXCourierNew9ptCustomColorRGB4649146Left01"/>
-        <w:rPr>
-          <w:sz w:val="16"/>
-        </w:rPr>
-      </w:pPr>
-      <w:r>
-        <w:rPr>
-          <w:sz w:val="16"/>
-        </w:rPr>
-        <w:t xml:space="preserve">    &lt;/DbProviderFactories&gt;</w:t>
-      </w:r>
-    </w:p>
-    <w:p>
-      <w:pPr>
-        <w:pStyle w:val="EDBEXCourierNew9ptCustomColorRGB4649146Left01"/>
-        <w:rPr>
-          <w:sz w:val="16"/>
-        </w:rPr>
-      </w:pPr>
-      <w:r>
-        <w:rPr>
-          <w:sz w:val="16"/>
-        </w:rPr>
-        <w:t xml:space="preserve">  &lt;/system.data&gt;</w:t>
-      </w:r>
-    </w:p>
-    <w:p>
-      <w:pPr>
-        <w:pStyle w:val="EDBEXCourierNew9ptCustomColorRGB4649146Left01"/>
-        <w:rPr>
-          <w:sz w:val="16"/>
-        </w:rPr>
-      </w:pPr>
-    </w:p>
-    <w:p>
-      <w:pPr>
-        <w:pStyle w:val="EDBEXCourierNew9ptCustomColorRGB4649146Left01"/>
-        <w:rPr>
-          <w:sz w:val="16"/>
-        </w:rPr>
-      </w:pPr>
-      <w:r>
-        <w:rPr>
-          <w:sz w:val="16"/>
-        </w:rPr>
-        <w:t>&lt;/configuration&gt;</w:t>
-      </w:r>
-    </w:p>
-    <w:p>
-      <w:pPr>
-        <w:pStyle w:val="EDBTXTNormalWebBlackCharChar0"/>
-      </w:pPr>
-      <w:r>
-        <w:rPr>
-          <w:rStyle w:val="EDBTXTEmphasisNormalWebBoldBlackCharChar"/>
-        </w:rPr>
-        <w:t>Note:</w:t>
-      </w:r>
-      <w:r>
-        <w:t xml:space="preserve"> The same entries for </w:t>
-      </w:r>
-      <w:r>
-        <w:rPr>
-          <w:rStyle w:val="EDBTXTKeywordBlack"/>
-        </w:rPr>
-        <w:t>&lt;providers&gt;</w:t>
-      </w:r>
-      <w:r>
-        <w:t xml:space="preserve"> and </w:t>
-      </w:r>
-      <w:r>
-        <w:rPr>
-          <w:rStyle w:val="EDBTXTKeywordBlack"/>
-        </w:rPr>
-        <w:t>&lt;DbProviderFactories&gt;</w:t>
-      </w:r>
-      <w:r>
-        <w:t xml:space="preserve"> are valid for the </w:t>
-      </w:r>
-      <w:r>
-        <w:rPr>
-          <w:rStyle w:val="EDBTXTKeywordBlack"/>
-        </w:rPr>
-        <w:t>web.config</w:t>
-      </w:r>
-      <w:r>
-        <w:t xml:space="preserve"> file as well as for </w:t>
-      </w:r>
-      <w:r>
-        <w:rPr>
-          <w:rStyle w:val="EDBTXTKeywordBlack"/>
-        </w:rPr>
-        <w:t>app.config</w:t>
-      </w:r>
-      <w:r>
-        <w:t>.</w:t>
-      </w:r>
-    </w:p>
-    <w:p>
-      <w:pPr>
-        <w:pStyle w:val="EDBTXTNormalWebBlackCharChar0"/>
-      </w:pPr>
-      <w:r>
-        <w:t xml:space="preserve">Depending upon the type of application, import the namespace into the source code (see Section </w:t>
-      </w:r>
-      <w:r>
-        <w:rPr>
-          <w:u w:val="single"/>
-        </w:rPr>
-        <w:fldChar w:fldCharType="begin"/>
-      </w:r>
-      <w:r>
-        <w:rPr>
-          <w:u w:val="single"/>
-        </w:rPr>
-        <w:instrText xml:space="preserve"> REF _Ref477525249 \r \h </w:instrText>
-      </w:r>
-      <w:r>
-        <w:rPr>
-          <w:u w:val="single"/>
-        </w:rPr>
-      </w:r>
-      <w:r>
-        <w:rPr>
-          <w:u w:val="single"/>
-        </w:rPr>
-        <w:fldChar w:fldCharType="separate"/>
-      </w:r>
-      <w:r>
-        <w:rPr>
-          <w:u w:val="single"/>
-        </w:rPr>
-        <w:t>3.1</w:t>
-      </w:r>
-      <w:r>
-        <w:rPr>
-          <w:u w:val="single"/>
-        </w:rPr>
-        <w:fldChar w:fldCharType="end"/>
-      </w:r>
-      <w:r>
-        <w:t>).</w:t>
-      </w:r>
-    </w:p>
-    <w:p>
-      <w:pPr>
-        <w:pStyle w:val="EDBTXTNormalWebBlackCharChar0"/>
-      </w:pPr>
-      <w:r>
-        <w:t xml:space="preserve">For usage of </w:t>
-      </w:r>
-      <w:r>
-        <w:t xml:space="preserve">the features of </w:t>
-      </w:r>
-      <w:r>
-        <w:t>Entity Framework, refer to the Micr</w:t>
-      </w:r>
-      <w:r>
-        <w:t>o</w:t>
-      </w:r>
-      <w:r>
-        <w:t>soft documentation.</w:t>
-      </w:r>
-    </w:p>
-    <w:p>
-      <w:pPr>
-        <w:pStyle w:val="Heading2"/>
-      </w:pPr>
-      <w:bookmarkStart w:id="34" w:name="_Ref477528081"/>
-      <w:bookmarkStart w:id="35" w:name="_Toc503771162"/>
-      <w:r>
-        <w:t>EDBDdexProvider for Visual Studio</w:t>
-      </w:r>
-      <w:bookmarkEnd w:id="34"/>
-      <w:r>
-        <w:t xml:space="preserve"> 2015</w:t>
-      </w:r>
-      <w:bookmarkEnd w:id="35"/>
-    </w:p>
-    <w:p>
-      <w:pPr>
-        <w:pStyle w:val="EDBTXTNormalWebBlackCharChar0"/>
-      </w:pPr>
-      <w:r>
-        <w:rPr>
-          <w:rStyle w:val="EDBTXTTermNormalWebBlackItalicCharCharChar"/>
-        </w:rPr>
-        <w:t>EDB Data Designer Extensibility Provider</w:t>
-      </w:r>
-      <w:r>
-        <w:t xml:space="preserve"> (</w:t>
-      </w:r>
-      <w:r>
-        <w:rPr>
-          <w:rStyle w:val="EDBTXTTermNormalWebBlackItalicCharCharChar"/>
-        </w:rPr>
-        <w:t>EDBDdexProvider</w:t>
-      </w:r>
-      <w:r>
-        <w:t>)</w:t>
-      </w:r>
-      <w:r>
-        <w:t xml:space="preserve"> is a component, which integrates </w:t>
-      </w:r>
-      <w:r>
-        <w:t>Advanced Server</w:t>
-      </w:r>
-      <w:r>
-        <w:t xml:space="preserve"> database access into Visual Studio, thus providing Vis</w:t>
-      </w:r>
-      <w:r>
-        <w:t>ual Studio integrated features.</w:t>
-      </w:r>
-    </w:p>
-    <w:p>
-      <w:pPr>
-        <w:pStyle w:val="EDBTXTNormalWebBlackCharChar0"/>
-      </w:pPr>
-      <w:r>
-        <w:t xml:space="preserve">It allows connecting to </w:t>
-      </w:r>
-      <w:r>
-        <w:t>Advanced Server</w:t>
-      </w:r>
-      <w:r>
-        <w:t xml:space="preserve"> from within Visual Studio's Server Explorer, creating a model from an existing database, etc. Therefore, if Visual Studio features are desired, then EDBDdexPr</w:t>
-      </w:r>
-      <w:r>
-        <w:t>ovider must be utilized</w:t>
-      </w:r>
-      <w:r>
-        <w:t>.</w:t>
-      </w:r>
-    </w:p>
-    <w:p>
-      <w:pPr>
-        <w:pStyle w:val="EDBTXTNormalWebBlackCharChar0"/>
-      </w:pPr>
-      <w:r>
         <w:t>EDBDdexProvider is located in the following directory:</w:t>
       </w:r>
     </w:p>
@@ -7717,11 +7893,11 @@
       <w:pPr>
         <w:pStyle w:val="Heading3"/>
       </w:pPr>
-      <w:bookmarkStart w:id="36" w:name="_Toc503771163"/>
+      <w:bookmarkStart w:id="38" w:name="_Toc509323281"/>
       <w:r>
         <w:t>Installation and Configuration for Visual Studio 2015</w:t>
       </w:r>
-      <w:bookmarkEnd w:id="36"/>
+      <w:bookmarkEnd w:id="38"/>
     </w:p>
     <w:p>
       <w:pPr>
@@ -7739,7 +7915,6 @@
         <w:rPr>
           <w:rStyle w:val="EDBTXTEmphasisNormalWebBoldBlackCharChar"/>
         </w:rPr>
-        <w:lastRenderedPageBreak/>
         <w:t>Step 1:</w:t>
       </w:r>
       <w:r>
@@ -8040,16 +8215,442 @@
         <w:t>.</w:t>
       </w:r>
       <w:r>
+        <w:t>6</w:t>
+      </w:r>
+      <w:r>
+        <w:t>.</w:t>
+      </w:r>
+      <w:r>
+        <w:t>1</w:t>
+      </w:r>
+      <w:r>
+        <w:t>, Culture=neutral, PublicKeyToken=5d8b90d52f46fda7"</w:t>
+      </w:r>
+    </w:p>
+    <w:p>
+      <w:pPr>
+        <w:pStyle w:val="EDBSYNTXPreformattedBlackLeft033"/>
+      </w:pPr>
+      <w:r>
+        <w:t xml:space="preserve">  </w:t>
+      </w:r>
+      <w:proofErr w:type="gramStart"/>
+      <w:r>
+        <w:t>support</w:t>
+      </w:r>
+      <w:proofErr w:type="gramEnd"/>
+      <w:r>
+        <w:t>="FF"/&gt;</w:t>
+      </w:r>
+    </w:p>
+    <w:p>
+      <w:pPr>
+        <w:pStyle w:val="EDBTXTNormalWebBlackCharChar0"/>
+      </w:pPr>
+      <w:r>
+        <w:rPr>
+          <w:rStyle w:val="EDBTXTEmphasisNormalWebBoldBlackCharChar"/>
+        </w:rPr>
+        <w:lastRenderedPageBreak/>
+        <w:t>Note:</w:t>
+      </w:r>
+      <w:r>
+        <w:t xml:space="preserve"> For the attribute-value pairs, the double-quoted strings should not contain excess white space characters, but be configured on a single line. The examples shown in this section may be split on multiple lines for clarity, but should actually be configured within a single line such as the following:</w:t>
+      </w:r>
+    </w:p>
+    <w:p>
+      <w:pPr>
+        <w:pStyle w:val="EDBTXTNormalWebBlackCharChar0"/>
+        <w:rPr>
+          <w:rStyle w:val="EDBTXTKeywordBlack"/>
+        </w:rPr>
+      </w:pPr>
+      <w:proofErr w:type="gramStart"/>
+      <w:r>
+        <w:rPr>
+          <w:rStyle w:val="EDBTXTKeywordBlack"/>
+        </w:rPr>
+        <w:t>description</w:t>
+      </w:r>
+      <w:proofErr w:type="gramEnd"/>
+      <w:r>
+        <w:rPr>
+          <w:rStyle w:val="EDBTXTKeywordBlack"/>
+        </w:rPr>
+        <w:t>=".NET Data Provider for EnterpriseDB PostgreSQL”</w:t>
+      </w:r>
+    </w:p>
+    <w:p>
+      <w:pPr>
+        <w:pStyle w:val="EDBTXTNormalWebBlackCharChar0"/>
+      </w:pPr>
+      <w:r>
+        <w:t xml:space="preserve">For 64-bit Windows, the </w:t>
+      </w:r>
+      <w:r>
+        <w:rPr>
+          <w:rStyle w:val="EDBTXTKeywordBlack"/>
+        </w:rPr>
+        <w:t>machine.config</w:t>
+      </w:r>
+      <w:r>
+        <w:t xml:space="preserve"> file is in the following location:</w:t>
+      </w:r>
+    </w:p>
+    <w:p>
+      <w:pPr>
+        <w:pStyle w:val="EDBSYNTXPreformattedBlackLeft033"/>
+      </w:pPr>
+      <w:r>
+        <w:t>C:\Windows\Microsoft.NET\Framework64\v4.0.30319\</w:t>
+      </w:r>
+    </w:p>
+    <w:p>
+      <w:pPr>
+        <w:pStyle w:val="EDBSYNTXPreformattedBlackLeft033"/>
+      </w:pPr>
+      <w:r>
+        <w:t>Config</w:t>
+      </w:r>
+      <w:r>
+        <w:t>\machine.config</w:t>
+      </w:r>
+    </w:p>
+    <w:p>
+      <w:pPr>
+        <w:pStyle w:val="EDBTXTNormalWebBlackCharChar0"/>
+      </w:pPr>
+      <w:r>
+        <w:t xml:space="preserve">For 32-bit Windows, the </w:t>
+      </w:r>
+      <w:r>
+        <w:rPr>
+          <w:rStyle w:val="EDBTXTKeywordBlack"/>
+        </w:rPr>
+        <w:t>machine.config</w:t>
+      </w:r>
+      <w:r>
+        <w:t xml:space="preserve"> file is in the following location:</w:t>
+      </w:r>
+    </w:p>
+    <w:p>
+      <w:pPr>
+        <w:pStyle w:val="EDBSYNTXPreformattedBlackLeft033"/>
+      </w:pPr>
+      <w:r>
+        <w:t>C:\Windows\Microsoft.NET\Framework\v4.0.30319\</w:t>
+      </w:r>
+    </w:p>
+    <w:p>
+      <w:pPr>
+        <w:pStyle w:val="EDBSYNTXPreformattedBlackLeft033"/>
+      </w:pPr>
+      <w:r>
+        <w:t>Config</w:t>
+      </w:r>
+      <w:r>
+        <w:t>\machine.config</w:t>
+      </w:r>
+    </w:p>
+    <w:p>
+      <w:pPr>
+        <w:pStyle w:val="EDBTXTNormalWebBlackCharChar0"/>
+      </w:pPr>
+      <w:r>
+        <w:rPr>
+          <w:rStyle w:val="EDBTXTEmphasisNormalWebBoldBlackCharChar"/>
+        </w:rPr>
+        <w:t xml:space="preserve">Step </w:t>
+      </w:r>
+      <w:r>
+        <w:rPr>
+          <w:rStyle w:val="EDBTXTEmphasisNormalWebBoldBlackCharChar"/>
+        </w:rPr>
+        <w:t>4</w:t>
+      </w:r>
+      <w:r>
+        <w:rPr>
+          <w:rStyle w:val="EDBTXTEmphasisNormalWebBoldBlackCharChar"/>
+        </w:rPr>
+        <w:t>:</w:t>
+      </w:r>
+      <w:r>
+        <w:t xml:space="preserve"> Relaunch Visual Studio and verify from </w:t>
+      </w:r>
+      <w:r>
+        <w:rPr>
+          <w:rStyle w:val="EDBTXTKeywordBlack"/>
+        </w:rPr>
+        <w:t>Tools &gt; Extentions and Updates</w:t>
+      </w:r>
+      <w:r>
+        <w:t>… menu that the EDBDdexProvider extension is installed.</w:t>
+      </w:r>
+    </w:p>
+    <w:p>
+      <w:pPr>
+        <w:pStyle w:val="EDBTXTNormalWebBlackCharChar0"/>
+      </w:pPr>
+      <w:r>
+        <w:rPr>
+          <w:rStyle w:val="EDBTXTEmphasisNormalWebBoldBlackCharChar"/>
+        </w:rPr>
+        <w:t xml:space="preserve">Step </w:t>
+      </w:r>
+      <w:r>
+        <w:rPr>
+          <w:rStyle w:val="EDBTXTEmphasisNormalWebBoldBlackCharChar"/>
+        </w:rPr>
+        <w:t>5</w:t>
+      </w:r>
+      <w:r>
+        <w:rPr>
+          <w:rStyle w:val="EDBTXTEmphasisNormalWebBoldBlackCharChar"/>
+        </w:rPr>
+        <w:t>:</w:t>
+      </w:r>
+      <w:r>
+        <w:t xml:space="preserve"> From Server Explorer, right-click on </w:t>
+      </w:r>
+      <w:r>
+        <w:rPr>
+          <w:rStyle w:val="EDBTXTKeywordBlack"/>
+        </w:rPr>
+        <w:t>Data Connections</w:t>
+      </w:r>
+      <w:r>
+        <w:t xml:space="preserve">, click </w:t>
+      </w:r>
+      <w:r>
+        <w:rPr>
+          <w:rStyle w:val="EDBTXTKeywordBlack"/>
+        </w:rPr>
+        <w:t>Add Connection</w:t>
+      </w:r>
+      <w:r>
+        <w:t xml:space="preserve">, and verify the </w:t>
+      </w:r>
+      <w:r>
+        <w:rPr>
+          <w:rStyle w:val="EDBTXTKeywordBlack"/>
+        </w:rPr>
+        <w:t>Enterprisedb Postgres Database</w:t>
+      </w:r>
+      <w:r>
+        <w:t xml:space="preserve"> data source is available.</w:t>
+      </w:r>
+    </w:p>
+    <w:p>
+      <w:pPr>
+        <w:pStyle w:val="Heading3"/>
+      </w:pPr>
+      <w:bookmarkStart w:id="39" w:name="_Toc509323282"/>
+      <w:r>
+        <w:t>Model First and Data First Usage</w:t>
+      </w:r>
+      <w:bookmarkEnd w:id="39"/>
+    </w:p>
+    <w:p>
+      <w:pPr>
+        <w:pStyle w:val="EDBTXTNormalWebBlackCharChar0"/>
+      </w:pPr>
+      <w:r>
+        <w:rPr>
+          <w:rStyle w:val="EDBTXTEmphasisNormalWebBoldBlackCharChar"/>
+        </w:rPr>
+        <w:t>Step 1</w:t>
+      </w:r>
+      <w:r>
+        <w:rPr>
+          <w:rStyle w:val="EDBTXTEmphasisNormalWebBoldBlackCharChar"/>
+        </w:rPr>
+        <w:t>:</w:t>
+      </w:r>
+      <w:r>
+        <w:t xml:space="preserve"> Place the DDL generation template </w:t>
+      </w:r>
+      <w:r>
+        <w:rPr>
+          <w:rStyle w:val="EDBTXTKeywordBlack"/>
+        </w:rPr>
+        <w:t>SSDLToPgSQL.tt</w:t>
+      </w:r>
+      <w:r>
+        <w:t xml:space="preserve"> in the </w:t>
+      </w:r>
+      <w:r>
+        <w:t xml:space="preserve">Visual Studio </w:t>
+      </w:r>
+      <w:r>
+        <w:rPr>
+          <w:rStyle w:val="EDBTXTKeywordBlack"/>
+        </w:rPr>
+        <w:t>EntityFramework Tools\DBGen\</w:t>
+      </w:r>
+      <w:r>
+        <w:t xml:space="preserve"> folder</w:t>
+      </w:r>
+      <w:r>
+        <w:t xml:space="preserve"> as in the following example:</w:t>
+      </w:r>
+    </w:p>
+    <w:p>
+      <w:pPr>
+        <w:pStyle w:val="EDBSYNTXPreformattedBlackLeft033"/>
+      </w:pPr>
+      <w:r>
+        <w:t>C:\Program Files (x86)\Microsoft Visual Studio 14.0\</w:t>
+      </w:r>
+    </w:p>
+    <w:p>
+      <w:pPr>
+        <w:pStyle w:val="EDBSYNTXPreformattedBlackLeft033"/>
+      </w:pPr>
+      <w:r>
+        <w:t>Common7\IDE\Extensions\Microsoft\EntityFramework Tools\DBGen\</w:t>
+      </w:r>
+    </w:p>
+    <w:p>
+      <w:pPr>
+        <w:pStyle w:val="EDBTXTNormalWebBlackCharChar0"/>
+      </w:pPr>
+      <w:r>
+        <w:rPr>
+          <w:rStyle w:val="EDBTXTEmphasisNormalWebBoldBlackCharChar"/>
+        </w:rPr>
+        <w:t>Note:</w:t>
+      </w:r>
+      <w:r>
+        <w:t xml:space="preserve"> Select this template </w:t>
+      </w:r>
+      <w:r>
+        <w:rPr>
+          <w:rStyle w:val="EDBTXTKeywordBlack"/>
+        </w:rPr>
+        <w:t>SSDLToPgSQL.tt</w:t>
+      </w:r>
+      <w:r>
+        <w:t xml:space="preserve"> in your EDMX file properties.</w:t>
+      </w:r>
+    </w:p>
+    <w:p>
+      <w:pPr>
+        <w:pStyle w:val="EDBTXTNormalWebBlackCharChar0"/>
+      </w:pPr>
+      <w:r>
+        <w:rPr>
+          <w:rStyle w:val="EDBTXTEmphasisNormalWebBoldBlackCharChar"/>
+        </w:rPr>
+        <w:t xml:space="preserve">Step </w:t>
+      </w:r>
+      <w:r>
+        <w:rPr>
+          <w:rStyle w:val="EDBTXTEmphasisNormalWebBoldBlackCharChar"/>
+        </w:rPr>
         <w:t>2</w:t>
       </w:r>
       <w:r>
-        <w:t>.</w:t>
-      </w:r>
-      <w:r>
-        <w:t>1</w:t>
-      </w:r>
-      <w:r>
-        <w:t>, Culture=neutral, PublicKeyToken=5d8b90d52f46fda7"</w:t>
+        <w:rPr>
+          <w:rStyle w:val="EDBTXTEmphasisNormalWebBoldBlackCharChar"/>
+        </w:rPr>
+        <w:t>:</w:t>
+      </w:r>
+      <w:r>
+        <w:t xml:space="preserve"> Add files </w:t>
+      </w:r>
+      <w:r>
+        <w:rPr>
+          <w:rStyle w:val="EDBTXTKeywordBlack"/>
+        </w:rPr>
+        <w:t>EnterpriseDB.EDBClient.dll</w:t>
+      </w:r>
+      <w:r>
+        <w:t xml:space="preserve"> and </w:t>
+      </w:r>
+      <w:r>
+        <w:rPr>
+          <w:rStyle w:val="EDBTXTKeywordBlack"/>
+        </w:rPr>
+        <w:t>EntityFramework6.EnterpriseDB.EDBClient.dll</w:t>
+      </w:r>
+      <w:r>
+        <w:t xml:space="preserve"> in project references.</w:t>
+      </w:r>
+      <w:r>
+        <w:t xml:space="preserve"> See Section </w:t>
+      </w:r>
+      <w:r>
+        <w:rPr>
+          <w:u w:val="single"/>
+        </w:rPr>
+        <w:fldChar w:fldCharType="begin"/>
+      </w:r>
+      <w:r>
+        <w:rPr>
+          <w:u w:val="single"/>
+        </w:rPr>
+        <w:instrText xml:space="preserve"> REF _Ref477525249 \r \h </w:instrText>
+      </w:r>
+      <w:r>
+        <w:rPr>
+          <w:u w:val="single"/>
+        </w:rPr>
+      </w:r>
+      <w:r>
+        <w:rPr>
+          <w:u w:val="single"/>
+        </w:rPr>
+        <w:fldChar w:fldCharType="separate"/>
+      </w:r>
+      <w:r>
+        <w:rPr>
+          <w:u w:val="single"/>
+        </w:rPr>
+        <w:t>3.1</w:t>
+      </w:r>
+      <w:r>
+        <w:rPr>
+          <w:u w:val="single"/>
+        </w:rPr>
+        <w:fldChar w:fldCharType="end"/>
+      </w:r>
+      <w:r>
+        <w:t xml:space="preserve"> for information on referencing library files.</w:t>
+      </w:r>
+    </w:p>
+    <w:p>
+      <w:pPr>
+        <w:pStyle w:val="EDBTXTNormalWebBlackCharChar0"/>
+      </w:pPr>
+      <w:r>
+        <w:rPr>
+          <w:rStyle w:val="EDBTXTEmphasisNormalWebBoldBlackCharChar"/>
+        </w:rPr>
+        <w:t xml:space="preserve">Step </w:t>
+      </w:r>
+      <w:r>
+        <w:rPr>
+          <w:rStyle w:val="EDBTXTEmphasisNormalWebBoldBlackCharChar"/>
+        </w:rPr>
+        <w:t>3</w:t>
+      </w:r>
+      <w:r>
+        <w:rPr>
+          <w:rStyle w:val="EDBTXTEmphasisNormalWebBoldBlackCharChar"/>
+        </w:rPr>
+        <w:t>:</w:t>
+      </w:r>
+      <w:r>
+        <w:t xml:space="preserve"> In the project’s </w:t>
+      </w:r>
+      <w:r>
+        <w:rPr>
+          <w:rStyle w:val="EDBTXTKeywordBlack"/>
+        </w:rPr>
+        <w:t>app.config</w:t>
+      </w:r>
+      <w:r>
+        <w:t xml:space="preserve"> file add the following entry for provider services under the EntityFramework/providers tag.</w:t>
       </w:r>
     </w:p>
     <w:p>
@@ -8057,499 +8658,130 @@
         <w:pStyle w:val="EDBSYNTXPreformattedBlackLeft033"/>
       </w:pPr>
       <w:r>
+        <w:t>&lt;provider invaria</w:t>
+      </w:r>
+      <w:r>
+        <w:t>ntName="EnterpriseDB.EDBClient"</w:t>
+      </w:r>
+    </w:p>
+    <w:p>
+      <w:pPr>
+        <w:pStyle w:val="EDBSYNTXPreformattedBlackLeft033"/>
+      </w:pPr>
+      <w:r>
         <w:t xml:space="preserve">  </w:t>
       </w:r>
       <w:proofErr w:type="gramStart"/>
       <w:r>
-        <w:t>support</w:t>
+        <w:t>type</w:t>
       </w:r>
       <w:proofErr w:type="gramEnd"/>
       <w:r>
-        <w:t>="FF"/&gt;</w:t>
-      </w:r>
-    </w:p>
-    <w:p>
-      <w:pPr>
-        <w:pStyle w:val="EDBTXTNormalWebBlackCharChar0"/>
-      </w:pPr>
-      <w:r>
-        <w:rPr>
-          <w:rStyle w:val="EDBTXTEmphasisNormalWebBoldBlackCharChar"/>
-        </w:rPr>
-        <w:t>Note:</w:t>
-      </w:r>
-      <w:r>
-        <w:t xml:space="preserve"> For the attribute-value pairs, the double-quoted strings should not contain excess white space characters, but be configured on a single line. The examples shown in this section may be split on multiple lines for clarity, but should actually be configured within a single line such as the following:</w:t>
-      </w:r>
-    </w:p>
-    <w:p>
-      <w:pPr>
-        <w:pStyle w:val="EDBTXTNormalWebBlackCharChar0"/>
-        <w:rPr>
-          <w:rStyle w:val="EDBTXTKeywordBlack"/>
+        <w:t>="EnterpriseDB.EDBClient.EDBServices, EntityFramework6.EnterpriseDB.EDBClient"&gt;</w:t>
+      </w:r>
+    </w:p>
+    <w:p>
+      <w:pPr>
+        <w:pStyle w:val="EDBSYNTXPreformattedBlackLeft033"/>
+      </w:pPr>
+      <w:r>
+        <w:t>&lt;/provider&gt;</w:t>
+      </w:r>
+    </w:p>
+    <w:p>
+      <w:pPr>
+        <w:pStyle w:val="EDBTXTNormalWebBlackCharChar0"/>
+      </w:pPr>
+      <w:r>
+        <w:t xml:space="preserve">The following is an example of the </w:t>
+      </w:r>
+      <w:r>
+        <w:rPr>
+          <w:rStyle w:val="EDBTXTKeywordBlack"/>
+        </w:rPr>
+        <w:t>app.config</w:t>
+      </w:r>
+      <w:r>
+        <w:t xml:space="preserve"> file.</w:t>
+      </w:r>
+    </w:p>
+    <w:p>
+      <w:pPr>
+        <w:pStyle w:val="EDBEXCourierNew9ptCustomColorRGB4649146Left01"/>
+        <w:rPr>
+          <w:sz w:val="16"/>
         </w:rPr>
       </w:pPr>
       <w:proofErr w:type="gramStart"/>
       <w:r>
         <w:rPr>
-          <w:rStyle w:val="EDBTXTKeywordBlack"/>
-        </w:rPr>
-        <w:t>description</w:t>
+          <w:sz w:val="16"/>
+        </w:rPr>
+        <w:lastRenderedPageBreak/>
+        <w:t>&lt;?xml</w:t>
       </w:r>
       <w:proofErr w:type="gramEnd"/>
       <w:r>
         <w:rPr>
-          <w:rStyle w:val="EDBTXTKeywordBlack"/>
-        </w:rPr>
-        <w:t>=".NET Data Provider for EnterpriseDB PostgreSQL”</w:t>
-      </w:r>
-    </w:p>
-    <w:p>
-      <w:pPr>
-        <w:pStyle w:val="EDBTXTNormalWebBlackCharChar0"/>
-      </w:pPr>
-      <w:r>
-        <w:t xml:space="preserve">For 64-bit Windows, the </w:t>
-      </w:r>
-      <w:r>
-        <w:rPr>
-          <w:rStyle w:val="EDBTXTKeywordBlack"/>
-        </w:rPr>
-        <w:t>machine.config</w:t>
-      </w:r>
-      <w:r>
-        <w:t xml:space="preserve"> file is in the following location:</w:t>
-      </w:r>
-    </w:p>
-    <w:p>
-      <w:pPr>
-        <w:pStyle w:val="EDBSYNTXPreformattedBlackLeft033"/>
-      </w:pPr>
-      <w:r>
-        <w:t>C:\Windows\Microsoft.NET\Framework64\v4.0.30319\</w:t>
-      </w:r>
-    </w:p>
-    <w:p>
-      <w:pPr>
-        <w:pStyle w:val="EDBSYNTXPreformattedBlackLeft033"/>
-      </w:pPr>
-      <w:r>
-        <w:t>Config</w:t>
-      </w:r>
-      <w:r>
-        <w:t>\machine.config</w:t>
-      </w:r>
-    </w:p>
-    <w:p>
-      <w:pPr>
-        <w:pStyle w:val="EDBTXTNormalWebBlackCharChar0"/>
-      </w:pPr>
-      <w:r>
-        <w:t xml:space="preserve">For 32-bit Windows, the </w:t>
-      </w:r>
-      <w:r>
-        <w:rPr>
-          <w:rStyle w:val="EDBTXTKeywordBlack"/>
-        </w:rPr>
-        <w:t>machine.config</w:t>
-      </w:r>
-      <w:r>
-        <w:t xml:space="preserve"> file is in the following location:</w:t>
-      </w:r>
-    </w:p>
-    <w:p>
-      <w:pPr>
-        <w:pStyle w:val="EDBSYNTXPreformattedBlackLeft033"/>
-      </w:pPr>
-      <w:r>
-        <w:t>C:\Windows\Microsoft.NET\Framework\v4.0.30319\</w:t>
-      </w:r>
-    </w:p>
-    <w:p>
-      <w:pPr>
-        <w:pStyle w:val="EDBSYNTXPreformattedBlackLeft033"/>
-      </w:pPr>
-      <w:r>
-        <w:t>Config</w:t>
-      </w:r>
-      <w:r>
-        <w:t>\machine.config</w:t>
-      </w:r>
-    </w:p>
-    <w:p>
-      <w:pPr>
-        <w:pStyle w:val="EDBTXTNormalWebBlackCharChar0"/>
-      </w:pPr>
-      <w:r>
-        <w:rPr>
-          <w:rStyle w:val="EDBTXTEmphasisNormalWebBoldBlackCharChar"/>
-        </w:rPr>
-        <w:lastRenderedPageBreak/>
-        <w:t xml:space="preserve">Step </w:t>
-      </w:r>
-      <w:r>
-        <w:rPr>
-          <w:rStyle w:val="EDBTXTEmphasisNormalWebBoldBlackCharChar"/>
-        </w:rPr>
-        <w:t>4</w:t>
-      </w:r>
-      <w:r>
-        <w:rPr>
-          <w:rStyle w:val="EDBTXTEmphasisNormalWebBoldBlackCharChar"/>
-        </w:rPr>
-        <w:t>:</w:t>
-      </w:r>
-      <w:r>
-        <w:t xml:space="preserve"> Relaunch Visual Studio and verify from </w:t>
-      </w:r>
-      <w:r>
-        <w:rPr>
-          <w:rStyle w:val="EDBTXTKeywordBlack"/>
-        </w:rPr>
-        <w:t>Tools &gt; Extentions and Updates</w:t>
-      </w:r>
-      <w:r>
-        <w:t>… menu that the EDBDdexProvider extension is installed.</w:t>
-      </w:r>
-    </w:p>
-    <w:p>
-      <w:pPr>
-        <w:pStyle w:val="EDBTXTNormalWebBlackCharChar0"/>
-      </w:pPr>
-      <w:r>
-        <w:rPr>
-          <w:rStyle w:val="EDBTXTEmphasisNormalWebBoldBlackCharChar"/>
-        </w:rPr>
-        <w:t xml:space="preserve">Step </w:t>
-      </w:r>
-      <w:r>
-        <w:rPr>
-          <w:rStyle w:val="EDBTXTEmphasisNormalWebBoldBlackCharChar"/>
-        </w:rPr>
-        <w:t>5</w:t>
-      </w:r>
-      <w:r>
-        <w:rPr>
-          <w:rStyle w:val="EDBTXTEmphasisNormalWebBoldBlackCharChar"/>
-        </w:rPr>
-        <w:t>:</w:t>
-      </w:r>
-      <w:r>
-        <w:t xml:space="preserve"> From Server Explorer, right-click on </w:t>
-      </w:r>
-      <w:r>
-        <w:rPr>
-          <w:rStyle w:val="EDBTXTKeywordBlack"/>
-        </w:rPr>
-        <w:t>Data Connections</w:t>
-      </w:r>
-      <w:r>
-        <w:t xml:space="preserve">, click </w:t>
-      </w:r>
-      <w:r>
-        <w:rPr>
-          <w:rStyle w:val="EDBTXTKeywordBlack"/>
-        </w:rPr>
-        <w:t>Add Connection</w:t>
-      </w:r>
-      <w:r>
-        <w:t xml:space="preserve">, and verify the </w:t>
-      </w:r>
-      <w:r>
-        <w:rPr>
-          <w:rStyle w:val="EDBTXTKeywordBlack"/>
-        </w:rPr>
-        <w:t>Enterprisedb Postgres Database</w:t>
-      </w:r>
-      <w:r>
-        <w:t xml:space="preserve"> data source is available.</w:t>
-      </w:r>
-    </w:p>
-    <w:p>
-      <w:pPr>
-        <w:pStyle w:val="Heading3"/>
-      </w:pPr>
-      <w:bookmarkStart w:id="37" w:name="_Toc503771164"/>
-      <w:r>
-        <w:t>Model First and Data First Usage</w:t>
-      </w:r>
-      <w:bookmarkEnd w:id="37"/>
-    </w:p>
-    <w:p>
-      <w:pPr>
-        <w:pStyle w:val="EDBTXTNormalWebBlackCharChar0"/>
-      </w:pPr>
-      <w:r>
-        <w:rPr>
-          <w:rStyle w:val="EDBTXTEmphasisNormalWebBoldBlackCharChar"/>
-        </w:rPr>
-        <w:t>Step 1</w:t>
-      </w:r>
-      <w:r>
-        <w:rPr>
-          <w:rStyle w:val="EDBTXTEmphasisNormalWebBoldBlackCharChar"/>
-        </w:rPr>
-        <w:t>:</w:t>
-      </w:r>
-      <w:r>
-        <w:t xml:space="preserve"> Place the DDL generation template </w:t>
-      </w:r>
-      <w:r>
-        <w:rPr>
-          <w:rStyle w:val="EDBTXTKeywordBlack"/>
-        </w:rPr>
-        <w:t>SSDLToPgSQL.tt</w:t>
-      </w:r>
-      <w:r>
-        <w:t xml:space="preserve"> in the </w:t>
-      </w:r>
-      <w:r>
-        <w:t xml:space="preserve">Visual Studio </w:t>
-      </w:r>
-      <w:r>
-        <w:rPr>
-          <w:rStyle w:val="EDBTXTKeywordBlack"/>
-        </w:rPr>
-        <w:t>EntityFramework Tools\DBGen\</w:t>
-      </w:r>
-      <w:r>
-        <w:t xml:space="preserve"> folder</w:t>
-      </w:r>
-      <w:r>
-        <w:t xml:space="preserve"> as in the following example:</w:t>
-      </w:r>
-    </w:p>
-    <w:p>
-      <w:pPr>
-        <w:pStyle w:val="EDBSYNTXPreformattedBlackLeft033"/>
-      </w:pPr>
-      <w:r>
-        <w:t>C:\Program Files (x86)\Microsoft Visual Studio 14.0\</w:t>
-      </w:r>
-    </w:p>
-    <w:p>
-      <w:pPr>
-        <w:pStyle w:val="EDBSYNTXPreformattedBlackLeft033"/>
-      </w:pPr>
-      <w:r>
-        <w:t>Common7\IDE\Extensions\Microsoft\EntityFramework Tools\DBGen\</w:t>
-      </w:r>
-    </w:p>
-    <w:p>
-      <w:pPr>
-        <w:pStyle w:val="EDBTXTNormalWebBlackCharChar0"/>
-      </w:pPr>
-      <w:r>
-        <w:rPr>
-          <w:rStyle w:val="EDBTXTEmphasisNormalWebBoldBlackCharChar"/>
-        </w:rPr>
-        <w:t>Note:</w:t>
-      </w:r>
-      <w:r>
-        <w:t xml:space="preserve"> Select this template </w:t>
-      </w:r>
-      <w:r>
-        <w:rPr>
-          <w:rStyle w:val="EDBTXTKeywordBlack"/>
-        </w:rPr>
-        <w:t>SSDLToPgSQL.tt</w:t>
-      </w:r>
-      <w:r>
-        <w:t xml:space="preserve"> in your EDMX file properties.</w:t>
-      </w:r>
-    </w:p>
-    <w:p>
-      <w:pPr>
-        <w:pStyle w:val="EDBTXTNormalWebBlackCharChar0"/>
-      </w:pPr>
-      <w:r>
-        <w:rPr>
-          <w:rStyle w:val="EDBTXTEmphasisNormalWebBoldBlackCharChar"/>
-        </w:rPr>
-        <w:t xml:space="preserve">Step </w:t>
-      </w:r>
-      <w:r>
-        <w:rPr>
-          <w:rStyle w:val="EDBTXTEmphasisNormalWebBoldBlackCharChar"/>
-        </w:rPr>
-        <w:t>2</w:t>
-      </w:r>
-      <w:r>
-        <w:rPr>
-          <w:rStyle w:val="EDBTXTEmphasisNormalWebBoldBlackCharChar"/>
-        </w:rPr>
-        <w:t>:</w:t>
-      </w:r>
-      <w:r>
-        <w:t xml:space="preserve"> Add files </w:t>
-      </w:r>
-      <w:r>
-        <w:rPr>
-          <w:rStyle w:val="EDBTXTKeywordBlack"/>
-        </w:rPr>
-        <w:t>EnterpriseDB.EDBClient.dll</w:t>
-      </w:r>
-      <w:r>
-        <w:t xml:space="preserve"> and </w:t>
-      </w:r>
-      <w:r>
-        <w:rPr>
-          <w:rStyle w:val="EDBTXTKeywordBlack"/>
-        </w:rPr>
-        <w:t>EntityFramework6.EnterpriseDB.EDBClient.dll</w:t>
-      </w:r>
-      <w:r>
-        <w:t xml:space="preserve"> in project references.</w:t>
-      </w:r>
-      <w:r>
-        <w:t xml:space="preserve"> See Section </w:t>
-      </w:r>
-      <w:r>
-        <w:rPr>
-          <w:u w:val="single"/>
-        </w:rPr>
-        <w:fldChar w:fldCharType="begin"/>
-      </w:r>
-      <w:r>
-        <w:rPr>
-          <w:u w:val="single"/>
-        </w:rPr>
-        <w:instrText xml:space="preserve"> REF _Ref477525249 \r \h </w:instrText>
-      </w:r>
-      <w:r>
-        <w:rPr>
-          <w:u w:val="single"/>
-        </w:rPr>
-      </w:r>
-      <w:r>
-        <w:rPr>
-          <w:u w:val="single"/>
-        </w:rPr>
-        <w:fldChar w:fldCharType="separate"/>
-      </w:r>
-      <w:r>
-        <w:rPr>
-          <w:u w:val="single"/>
-        </w:rPr>
-        <w:t>3.1</w:t>
-      </w:r>
-      <w:r>
-        <w:rPr>
-          <w:u w:val="single"/>
-        </w:rPr>
-        <w:fldChar w:fldCharType="end"/>
-      </w:r>
-      <w:r>
-        <w:t xml:space="preserve"> for information on referencing library files.</w:t>
-      </w:r>
-    </w:p>
-    <w:p>
-      <w:pPr>
-        <w:pStyle w:val="EDBTXTNormalWebBlackCharChar0"/>
-      </w:pPr>
-      <w:r>
-        <w:rPr>
-          <w:rStyle w:val="EDBTXTEmphasisNormalWebBoldBlackCharChar"/>
-        </w:rPr>
-        <w:t xml:space="preserve">Step </w:t>
-      </w:r>
-      <w:r>
-        <w:rPr>
-          <w:rStyle w:val="EDBTXTEmphasisNormalWebBoldBlackCharChar"/>
-        </w:rPr>
-        <w:t>3</w:t>
-      </w:r>
-      <w:r>
-        <w:rPr>
-          <w:rStyle w:val="EDBTXTEmphasisNormalWebBoldBlackCharChar"/>
-        </w:rPr>
-        <w:t>:</w:t>
-      </w:r>
-      <w:r>
-        <w:t xml:space="preserve"> In the project’s </w:t>
-      </w:r>
-      <w:r>
-        <w:rPr>
-          <w:rStyle w:val="EDBTXTKeywordBlack"/>
-        </w:rPr>
-        <w:t>app.config</w:t>
-      </w:r>
-      <w:r>
-        <w:t xml:space="preserve"> file add the following entry for provider services under the EntityFramework/providers tag.</w:t>
-      </w:r>
-    </w:p>
-    <w:p>
-      <w:pPr>
-        <w:pStyle w:val="EDBSYNTXPreformattedBlackLeft033"/>
-      </w:pPr>
-      <w:r>
-        <w:t>&lt;provider invaria</w:t>
-      </w:r>
-      <w:r>
-        <w:t>ntName="EnterpriseDB.EDBClient"</w:t>
-      </w:r>
-    </w:p>
-    <w:p>
-      <w:pPr>
-        <w:pStyle w:val="EDBSYNTXPreformattedBlackLeft033"/>
-      </w:pPr>
-      <w:r>
-        <w:t xml:space="preserve">  </w:t>
+          <w:sz w:val="16"/>
+        </w:rPr>
+        <w:t xml:space="preserve"> version="1.0" encoding="utf-8" ?&gt;</w:t>
+      </w:r>
+    </w:p>
+    <w:p>
+      <w:pPr>
+        <w:pStyle w:val="EDBEXCourierNew9ptCustomColorRGB4649146Left01"/>
+        <w:rPr>
+          <w:sz w:val="16"/>
+        </w:rPr>
+      </w:pPr>
+      <w:r>
+        <w:rPr>
+          <w:sz w:val="16"/>
+        </w:rPr>
+        <w:t>&lt;</w:t>
       </w:r>
       <w:proofErr w:type="gramStart"/>
       <w:r>
-        <w:t>type</w:t>
+        <w:rPr>
+          <w:sz w:val="16"/>
+        </w:rPr>
+        <w:t>configuration</w:t>
       </w:r>
       <w:proofErr w:type="gramEnd"/>
       <w:r>
-        <w:t>="EnterpriseDB.EDBClient.EDBServices, EntityFramework6.EnterpriseDB.EDBClient"&gt;</w:t>
-      </w:r>
-    </w:p>
-    <w:p>
-      <w:pPr>
-        <w:pStyle w:val="EDBSYNTXPreformattedBlackLeft033"/>
-      </w:pPr>
-      <w:r>
-        <w:t>&lt;/provider&gt;</w:t>
-      </w:r>
-    </w:p>
-    <w:p>
-      <w:pPr>
-        <w:pStyle w:val="EDBTXTNormalWebBlackCharChar0"/>
-      </w:pPr>
-      <w:r>
-        <w:t xml:space="preserve">The following is an example of the </w:t>
-      </w:r>
-      <w:r>
-        <w:rPr>
-          <w:rStyle w:val="EDBTXTKeywordBlack"/>
-        </w:rPr>
-        <w:t>app.config</w:t>
-      </w:r>
-      <w:r>
-        <w:t xml:space="preserve"> file.</w:t>
-      </w:r>
-    </w:p>
-    <w:p>
-      <w:pPr>
-        <w:pStyle w:val="EDBEXCourierNew9ptCustomColorRGB4649146Left01"/>
         <w:rPr>
           <w:sz w:val="16"/>
         </w:rPr>
-      </w:pPr>
+        <w:t>&gt;</w:t>
+      </w:r>
+    </w:p>
+    <w:p>
+      <w:pPr>
+        <w:pStyle w:val="EDBEXCourierNew9ptCustomColorRGB4649146Left01"/>
+        <w:rPr>
+          <w:sz w:val="16"/>
+        </w:rPr>
+      </w:pPr>
+      <w:r>
+        <w:rPr>
+          <w:sz w:val="16"/>
+        </w:rPr>
+        <w:t xml:space="preserve">  &lt;</w:t>
+      </w:r>
       <w:proofErr w:type="gramStart"/>
       <w:r>
         <w:rPr>
           <w:sz w:val="16"/>
         </w:rPr>
-        <w:t>&lt;?xml</w:t>
+        <w:t>configSections</w:t>
       </w:r>
       <w:proofErr w:type="gramEnd"/>
       <w:r>
         <w:rPr>
           <w:sz w:val="16"/>
         </w:rPr>
-        <w:t xml:space="preserve"> version="1.0" encoding="utf-8" ?&gt;</w:t>
+        <w:t>&gt;</w:t>
       </w:r>
     </w:p>
     <w:p>
@@ -8563,14 +8795,50 @@
         <w:rPr>
           <w:sz w:val="16"/>
         </w:rPr>
-        <w:t>&lt;</w:t>
+        <w:t xml:space="preserve">    &lt;section name="entityFramework" type="System.Data.Entity.Internal.ConfigFile.EntityFrameworkSection, EntityFramework, Version=6.0.0.0, Culture=neutral, PublicKeyToken=b77a5c561934e089" requirePermission="false"/&gt;</w:t>
+      </w:r>
+    </w:p>
+    <w:p>
+      <w:pPr>
+        <w:pStyle w:val="EDBEXCourierNew9ptCustomColorRGB4649146Left01"/>
+        <w:rPr>
+          <w:sz w:val="16"/>
+        </w:rPr>
+      </w:pPr>
+      <w:r>
+        <w:rPr>
+          <w:sz w:val="16"/>
+        </w:rPr>
+        <w:t xml:space="preserve">  &lt;/configSections&gt;</w:t>
+      </w:r>
+    </w:p>
+    <w:p>
+      <w:pPr>
+        <w:pStyle w:val="EDBEXCourierNew9ptCustomColorRGB4649146Left01"/>
+        <w:rPr>
+          <w:sz w:val="16"/>
+        </w:rPr>
+      </w:pPr>
+    </w:p>
+    <w:p>
+      <w:pPr>
+        <w:pStyle w:val="EDBEXCourierNew9ptCustomColorRGB4649146Left01"/>
+        <w:rPr>
+          <w:sz w:val="16"/>
+        </w:rPr>
+      </w:pPr>
+      <w:r>
+        <w:rPr>
+          <w:sz w:val="16"/>
+        </w:rPr>
+        <w:t xml:space="preserve">    &lt;</w:t>
       </w:r>
       <w:proofErr w:type="gramStart"/>
       <w:r>
         <w:rPr>
           <w:sz w:val="16"/>
         </w:rPr>
-        <w:t>configuration</w:t>
+        <w:t>startup</w:t>
       </w:r>
       <w:proofErr w:type="gramEnd"/>
       <w:r>
@@ -8591,6 +8859,56 @@
         <w:rPr>
           <w:sz w:val="16"/>
         </w:rPr>
+        <w:t xml:space="preserve">        &lt;supportedRuntime version="v4.0" sku=".NETFramework</w:t>
+      </w:r>
+      <w:proofErr w:type="gramStart"/>
+      <w:r>
+        <w:rPr>
+          <w:sz w:val="16"/>
+        </w:rPr>
+        <w:t>,Version</w:t>
+      </w:r>
+      <w:proofErr w:type="gramEnd"/>
+      <w:r>
+        <w:rPr>
+          <w:sz w:val="16"/>
+        </w:rPr>
+        <w:t>=v4.5" /&gt;</w:t>
+      </w:r>
+    </w:p>
+    <w:p>
+      <w:pPr>
+        <w:pStyle w:val="EDBEXCourierNew9ptCustomColorRGB4649146Left01"/>
+        <w:rPr>
+          <w:sz w:val="16"/>
+        </w:rPr>
+      </w:pPr>
+      <w:r>
+        <w:rPr>
+          <w:sz w:val="16"/>
+        </w:rPr>
+        <w:t xml:space="preserve">    &lt;/startup&gt;</w:t>
+      </w:r>
+    </w:p>
+    <w:p>
+      <w:pPr>
+        <w:pStyle w:val="EDBEXCourierNew9ptCustomColorRGB4649146Left01"/>
+        <w:rPr>
+          <w:sz w:val="16"/>
+        </w:rPr>
+      </w:pPr>
+    </w:p>
+    <w:p>
+      <w:pPr>
+        <w:pStyle w:val="EDBEXCourierNew9ptCustomColorRGB4649146Left01"/>
+        <w:rPr>
+          <w:sz w:val="16"/>
+        </w:rPr>
+      </w:pPr>
+      <w:r>
+        <w:rPr>
+          <w:sz w:val="16"/>
+        </w:rPr>
         <w:t xml:space="preserve">  &lt;</w:t>
       </w:r>
       <w:proofErr w:type="gramStart"/>
@@ -8598,7 +8916,7 @@
         <w:rPr>
           <w:sz w:val="16"/>
         </w:rPr>
-        <w:t>configSections</w:t>
+        <w:t>entityFramework</w:t>
       </w:r>
       <w:proofErr w:type="gramEnd"/>
       <w:r>
@@ -8619,21 +8937,21 @@
         <w:rPr>
           <w:sz w:val="16"/>
         </w:rPr>
-        <w:t xml:space="preserve">    &lt;section name="entityFramework" type="System.Data.Entity.Internal.ConfigFile.EntityFrameworkSection, EntityFramework, Version=6.0.0.0, Culture=neutral, PublicKeyToken=b77a5c561934e089" requirePermission="false"/&gt;</w:t>
-      </w:r>
-    </w:p>
-    <w:p>
-      <w:pPr>
-        <w:pStyle w:val="EDBEXCourierNew9ptCustomColorRGB4649146Left01"/>
+        <w:t xml:space="preserve">    &lt;</w:t>
+      </w:r>
+      <w:proofErr w:type="gramStart"/>
+      <w:r>
         <w:rPr>
           <w:sz w:val="16"/>
         </w:rPr>
-      </w:pPr>
+        <w:t>providers</w:t>
+      </w:r>
+      <w:proofErr w:type="gramEnd"/>
       <w:r>
         <w:rPr>
           <w:sz w:val="16"/>
         </w:rPr>
-        <w:t xml:space="preserve">  &lt;/configSections&gt;</w:t>
+        <w:t>&gt;</w:t>
       </w:r>
     </w:p>
     <w:p>
@@ -8643,61 +8961,61 @@
           <w:sz w:val="16"/>
         </w:rPr>
       </w:pPr>
-    </w:p>
-    <w:p>
-      <w:pPr>
-        <w:pStyle w:val="EDBEXCourierNew9ptCustomColorRGB4649146Left01"/>
+      <w:r>
         <w:rPr>
           <w:sz w:val="16"/>
         </w:rPr>
-      </w:pPr>
-      <w:r>
+        <w:t xml:space="preserve">      &lt;provider invariantName="EnterpriseDB.EDBClient" type="EnterpriseDB.EDBClient.EDBServices, EntityFramework6.EnterpriseDB.EDBClient"&gt;&lt;/provider&gt;</w:t>
+      </w:r>
+    </w:p>
+    <w:p>
+      <w:pPr>
+        <w:pStyle w:val="EDBEXCourierNew9ptCustomColorRGB4649146Left01"/>
         <w:rPr>
           <w:sz w:val="16"/>
         </w:rPr>
-        <w:t xml:space="preserve">    &lt;</w:t>
-      </w:r>
-      <w:proofErr w:type="gramStart"/>
+      </w:pPr>
       <w:r>
         <w:rPr>
           <w:sz w:val="16"/>
         </w:rPr>
-        <w:t>startup</w:t>
-      </w:r>
-      <w:proofErr w:type="gramEnd"/>
-      <w:r>
+        <w:t xml:space="preserve">    &lt;/providers&gt;</w:t>
+      </w:r>
+    </w:p>
+    <w:p>
+      <w:pPr>
+        <w:pStyle w:val="EDBEXCourierNew9ptCustomColorRGB4649146Left01"/>
         <w:rPr>
           <w:sz w:val="16"/>
         </w:rPr>
-        <w:t>&gt;</w:t>
-      </w:r>
-    </w:p>
-    <w:p>
-      <w:pPr>
-        <w:pStyle w:val="EDBEXCourierNew9ptCustomColorRGB4649146Left01"/>
+      </w:pPr>
+      <w:r>
         <w:rPr>
           <w:sz w:val="16"/>
         </w:rPr>
-      </w:pPr>
-      <w:r>
+        <w:t xml:space="preserve">  &lt;/entityFramework&gt;</w:t>
+      </w:r>
+    </w:p>
+    <w:p>
+      <w:pPr>
+        <w:pStyle w:val="EDBEXCourierNew9ptCustomColorRGB4649146Left01"/>
         <w:rPr>
           <w:sz w:val="16"/>
         </w:rPr>
-        <w:t xml:space="preserve">        &lt;supportedRuntime version="v4.0" sku=".NETFramework</w:t>
-      </w:r>
-      <w:proofErr w:type="gramStart"/>
-      <w:r>
+      </w:pPr>
+    </w:p>
+    <w:p>
+      <w:pPr>
+        <w:pStyle w:val="EDBEXCourierNew9ptCustomColorRGB4649146Left01"/>
         <w:rPr>
           <w:sz w:val="16"/>
         </w:rPr>
-        <w:t>,Version</w:t>
-      </w:r>
-      <w:proofErr w:type="gramEnd"/>
+      </w:pPr>
       <w:r>
         <w:rPr>
           <w:sz w:val="16"/>
         </w:rPr>
-        <w:t>=v4.5" /&gt;</w:t>
+        <w:t xml:space="preserve">  &lt;system.data&gt;</w:t>
       </w:r>
     </w:p>
     <w:p>
@@ -8711,7 +9029,7 @@
         <w:rPr>
           <w:sz w:val="16"/>
         </w:rPr>
-        <w:t xml:space="preserve">    &lt;/startup&gt;</w:t>
+        <w:t xml:space="preserve">    &lt;DbProviderFactories&gt;</w:t>
       </w:r>
     </w:p>
     <w:p>
@@ -8721,76 +9039,74 @@
           <w:sz w:val="16"/>
         </w:rPr>
       </w:pPr>
-    </w:p>
-    <w:p>
-      <w:pPr>
-        <w:pStyle w:val="EDBEXCourierNew9ptCustomColorRGB4649146Left01"/>
+      <w:r>
         <w:rPr>
           <w:sz w:val="16"/>
         </w:rPr>
-      </w:pPr>
-      <w:r>
+        <w:t xml:space="preserve">      &lt;remove invariant="EnterpriseDB.EDBClient"/&gt;</w:t>
+      </w:r>
+    </w:p>
+    <w:p>
+      <w:pPr>
+        <w:pStyle w:val="EDBEXCourierNew9ptCustomColorRGB4649146Left01"/>
         <w:rPr>
           <w:sz w:val="16"/>
         </w:rPr>
-        <w:t xml:space="preserve">  &lt;</w:t>
-      </w:r>
-      <w:proofErr w:type="gramStart"/>
+      </w:pPr>
       <w:r>
         <w:rPr>
           <w:sz w:val="16"/>
         </w:rPr>
-        <w:t>entityFramework</w:t>
-      </w:r>
-      <w:proofErr w:type="gramEnd"/>
+        <w:t xml:space="preserve">      &lt;add name="EnterpriseDB Data Provider" invariant="EnterpriseDB.EDBClient" support="FF" description=".Net Framework Data Provider for </w:t>
+      </w:r>
       <w:r>
         <w:rPr>
           <w:sz w:val="16"/>
         </w:rPr>
-        <w:t>&gt;</w:t>
-      </w:r>
-    </w:p>
-    <w:p>
-      <w:pPr>
-        <w:pStyle w:val="EDBEXCourierNew9ptCustomColorRGB4649146Left01"/>
+        <w:t>EDB Postgres</w:t>
+      </w:r>
+      <w:r>
         <w:rPr>
           <w:sz w:val="16"/>
         </w:rPr>
-      </w:pPr>
-      <w:r>
+        <w:t>" type="EnterpriseDB.EDBClient.EDBFactory, EnterpriseDB.EDBClient"/&gt;</w:t>
+      </w:r>
+    </w:p>
+    <w:p>
+      <w:pPr>
+        <w:pStyle w:val="EDBEXCourierNew9ptCustomColorRGB4649146Left01"/>
         <w:rPr>
           <w:sz w:val="16"/>
         </w:rPr>
-        <w:t xml:space="preserve">    &lt;</w:t>
-      </w:r>
-      <w:proofErr w:type="gramStart"/>
+      </w:pPr>
       <w:r>
         <w:rPr>
           <w:sz w:val="16"/>
         </w:rPr>
-        <w:t>providers</w:t>
-      </w:r>
-      <w:proofErr w:type="gramEnd"/>
-      <w:r>
+        <w:t xml:space="preserve">    &lt;/DbProviderFactories&gt;</w:t>
+      </w:r>
+    </w:p>
+    <w:p>
+      <w:pPr>
+        <w:pStyle w:val="EDBEXCourierNew9ptCustomColorRGB4649146Left01"/>
         <w:rPr>
           <w:sz w:val="16"/>
         </w:rPr>
-        <w:t>&gt;</w:t>
-      </w:r>
-    </w:p>
-    <w:p>
-      <w:pPr>
-        <w:pStyle w:val="EDBEXCourierNew9ptCustomColorRGB4649146Left01"/>
+      </w:pPr>
+      <w:r>
         <w:rPr>
           <w:sz w:val="16"/>
         </w:rPr>
-      </w:pPr>
-      <w:r>
+        <w:t xml:space="preserve">  &lt;/system.data&gt;</w:t>
+      </w:r>
+    </w:p>
+    <w:p>
+      <w:pPr>
+        <w:pStyle w:val="EDBEXCourierNew9ptCustomColorRGB4649146Left01"/>
         <w:rPr>
           <w:sz w:val="16"/>
         </w:rPr>
-        <w:t xml:space="preserve">      &lt;provider invariantName="EnterpriseDB.EDBClient" type="EnterpriseDB.EDBClient.EDBServices, EntityFramework6.EnterpriseDB.EDBClient"&gt;&lt;/provider&gt;</w:t>
-      </w:r>
+      </w:pPr>
     </w:p>
     <w:p>
       <w:pPr>
@@ -8803,147 +9119,6 @@
         <w:rPr>
           <w:sz w:val="16"/>
         </w:rPr>
-        <w:t xml:space="preserve">    &lt;/providers&gt;</w:t>
-      </w:r>
-    </w:p>
-    <w:p>
-      <w:pPr>
-        <w:pStyle w:val="EDBEXCourierNew9ptCustomColorRGB4649146Left01"/>
-        <w:rPr>
-          <w:sz w:val="16"/>
-        </w:rPr>
-      </w:pPr>
-      <w:r>
-        <w:rPr>
-          <w:sz w:val="16"/>
-        </w:rPr>
-        <w:t xml:space="preserve">  &lt;/entityFramework&gt;</w:t>
-      </w:r>
-    </w:p>
-    <w:p>
-      <w:pPr>
-        <w:pStyle w:val="EDBEXCourierNew9ptCustomColorRGB4649146Left01"/>
-        <w:rPr>
-          <w:sz w:val="16"/>
-        </w:rPr>
-      </w:pPr>
-    </w:p>
-    <w:p>
-      <w:pPr>
-        <w:pStyle w:val="EDBEXCourierNew9ptCustomColorRGB4649146Left01"/>
-        <w:rPr>
-          <w:sz w:val="16"/>
-        </w:rPr>
-      </w:pPr>
-      <w:r>
-        <w:rPr>
-          <w:sz w:val="16"/>
-        </w:rPr>
-        <w:t xml:space="preserve">  &lt;system.data&gt;</w:t>
-      </w:r>
-    </w:p>
-    <w:p>
-      <w:pPr>
-        <w:pStyle w:val="EDBEXCourierNew9ptCustomColorRGB4649146Left01"/>
-        <w:rPr>
-          <w:sz w:val="16"/>
-        </w:rPr>
-      </w:pPr>
-      <w:r>
-        <w:rPr>
-          <w:sz w:val="16"/>
-        </w:rPr>
-        <w:t xml:space="preserve">    &lt;DbProviderFactories&gt;</w:t>
-      </w:r>
-    </w:p>
-    <w:p>
-      <w:pPr>
-        <w:pStyle w:val="EDBEXCourierNew9ptCustomColorRGB4649146Left01"/>
-        <w:rPr>
-          <w:sz w:val="16"/>
-        </w:rPr>
-      </w:pPr>
-      <w:r>
-        <w:rPr>
-          <w:sz w:val="16"/>
-        </w:rPr>
-        <w:lastRenderedPageBreak/>
-        <w:t xml:space="preserve">      &lt;remove invariant="EnterpriseDB.EDBClient"/&gt;</w:t>
-      </w:r>
-    </w:p>
-    <w:p>
-      <w:pPr>
-        <w:pStyle w:val="EDBEXCourierNew9ptCustomColorRGB4649146Left01"/>
-        <w:rPr>
-          <w:sz w:val="16"/>
-        </w:rPr>
-      </w:pPr>
-      <w:r>
-        <w:rPr>
-          <w:sz w:val="16"/>
-        </w:rPr>
-        <w:t xml:space="preserve">      &lt;add name="EnterpriseDB Data Provider" invariant="EnterpriseDB.EDBClient" support="FF" description=".Net Framework Data Provider for </w:t>
-      </w:r>
-      <w:r>
-        <w:rPr>
-          <w:sz w:val="16"/>
-        </w:rPr>
-        <w:t>EDB Postgres</w:t>
-      </w:r>
-      <w:r>
-        <w:rPr>
-          <w:sz w:val="16"/>
-        </w:rPr>
-        <w:t>" type="EnterpriseDB.EDBClient.EDBFactory, EnterpriseDB.EDBClient"/&gt;</w:t>
-      </w:r>
-    </w:p>
-    <w:p>
-      <w:pPr>
-        <w:pStyle w:val="EDBEXCourierNew9ptCustomColorRGB4649146Left01"/>
-        <w:rPr>
-          <w:sz w:val="16"/>
-        </w:rPr>
-      </w:pPr>
-      <w:r>
-        <w:rPr>
-          <w:sz w:val="16"/>
-        </w:rPr>
-        <w:t xml:space="preserve">    &lt;/DbProviderFactories&gt;</w:t>
-      </w:r>
-    </w:p>
-    <w:p>
-      <w:pPr>
-        <w:pStyle w:val="EDBEXCourierNew9ptCustomColorRGB4649146Left01"/>
-        <w:rPr>
-          <w:sz w:val="16"/>
-        </w:rPr>
-      </w:pPr>
-      <w:r>
-        <w:rPr>
-          <w:sz w:val="16"/>
-        </w:rPr>
-        <w:t xml:space="preserve">  &lt;/system.data&gt;</w:t>
-      </w:r>
-    </w:p>
-    <w:p>
-      <w:pPr>
-        <w:pStyle w:val="EDBEXCourierNew9ptCustomColorRGB4649146Left01"/>
-        <w:rPr>
-          <w:sz w:val="16"/>
-        </w:rPr>
-      </w:pPr>
-    </w:p>
-    <w:p>
-      <w:pPr>
-        <w:pStyle w:val="EDBEXCourierNew9ptCustomColorRGB4649146Left01"/>
-        <w:rPr>
-          <w:sz w:val="16"/>
-        </w:rPr>
-      </w:pPr>
-      <w:r>
-        <w:rPr>
-          <w:sz w:val="16"/>
-        </w:rPr>
         <w:t>&lt;/configuration&gt;</w:t>
       </w:r>
     </w:p>
@@ -8956,14 +9131,14 @@
       <w:pPr>
         <w:pStyle w:val="Heading1"/>
       </w:pPr>
-      <w:bookmarkStart w:id="38" w:name="_Ref482087625"/>
-      <w:bookmarkStart w:id="39" w:name="_Toc503771165"/>
+      <w:bookmarkStart w:id="40" w:name="_Ref482087625"/>
+      <w:bookmarkStart w:id="41" w:name="_Toc509323283"/>
       <w:r>
         <w:lastRenderedPageBreak/>
         <w:t>Using the .NET Connector</w:t>
       </w:r>
-      <w:bookmarkEnd w:id="38"/>
-      <w:bookmarkEnd w:id="39"/>
+      <w:bookmarkEnd w:id="40"/>
+      <w:bookmarkEnd w:id="41"/>
     </w:p>
     <w:p>
       <w:pPr>
@@ -9248,11 +9423,11 @@
       <w:pPr>
         <w:pStyle w:val="Heading2"/>
       </w:pPr>
-      <w:bookmarkStart w:id="40" w:name="_Toc503771166"/>
+      <w:bookmarkStart w:id="42" w:name="_Toc509323284"/>
       <w:r>
         <w:t>Opening a Database Connection</w:t>
       </w:r>
-      <w:bookmarkEnd w:id="40"/>
+      <w:bookmarkEnd w:id="42"/>
     </w:p>
     <w:p>
       <w:pPr>
@@ -9465,13 +9640,13 @@
       <w:pPr>
         <w:pStyle w:val="Heading3"/>
       </w:pPr>
-      <w:bookmarkStart w:id="41" w:name="_Ref482087661"/>
-      <w:bookmarkStart w:id="42" w:name="_Toc503771167"/>
+      <w:bookmarkStart w:id="43" w:name="_Ref482087661"/>
+      <w:bookmarkStart w:id="44" w:name="_Toc509323285"/>
       <w:r>
         <w:t>Connection String Parameters</w:t>
       </w:r>
-      <w:bookmarkEnd w:id="41"/>
-      <w:bookmarkEnd w:id="42"/>
+      <w:bookmarkEnd w:id="43"/>
+      <w:bookmarkEnd w:id="44"/>
       <w:r>
         <w:t xml:space="preserve"> </w:t>
       </w:r>
@@ -10552,14 +10727,14 @@
       <w:pPr>
         <w:pStyle w:val="Heading3"/>
       </w:pPr>
-      <w:bookmarkStart w:id="43" w:name="_Toc503771168"/>
+      <w:bookmarkStart w:id="45" w:name="_Toc509323286"/>
       <w:r>
         <w:t xml:space="preserve">Example - </w:t>
       </w:r>
       <w:r>
         <w:t>Opening a Database Connection using ASP.NET</w:t>
       </w:r>
-      <w:bookmarkEnd w:id="43"/>
+      <w:bookmarkEnd w:id="45"/>
       <w:r>
         <w:t xml:space="preserve"> </w:t>
       </w:r>
@@ -11031,7 +11206,7 @@
           <w:noProof/>
         </w:rPr>
         <w:drawing>
-          <wp:inline distT="0" distB="0" distL="0" distR="0" wp14:anchorId="7701CAAC" wp14:editId="1AC9294A">
+          <wp:inline distT="0" distB="0" distL="0" distR="0" wp14:anchorId="78ED76E8" wp14:editId="48F789AF">
             <wp:extent cx="5480050" cy="1663700"/>
             <wp:effectExtent l="0" t="0" r="6350" b="0"/>
             <wp:docPr id="7" name="Picture 7" descr="Screen Shot 2014-06-26 at 8"/>
@@ -11089,14 +11264,14 @@
       <w:pPr>
         <w:pStyle w:val="Heading3"/>
       </w:pPr>
-      <w:bookmarkStart w:id="44" w:name="_Toc503771169"/>
+      <w:bookmarkStart w:id="46" w:name="_Toc509323287"/>
       <w:r>
         <w:t xml:space="preserve">Example - </w:t>
       </w:r>
       <w:r>
         <w:t>Opening a Database Connection from a Console Application</w:t>
       </w:r>
-      <w:bookmarkEnd w:id="44"/>
+      <w:bookmarkEnd w:id="46"/>
     </w:p>
     <w:p>
       <w:pPr>
@@ -11849,14 +12024,14 @@
       <w:pPr>
         <w:pStyle w:val="Heading3"/>
       </w:pPr>
-      <w:bookmarkStart w:id="45" w:name="_Toc503771170"/>
+      <w:bookmarkStart w:id="47" w:name="_Toc509323288"/>
       <w:r>
         <w:t xml:space="preserve">Example - </w:t>
       </w:r>
       <w:r>
         <w:t>Opening a Database Connection from a Windows Form Application</w:t>
       </w:r>
-      <w:bookmarkEnd w:id="45"/>
+      <w:bookmarkEnd w:id="47"/>
     </w:p>
     <w:p>
       <w:pPr>
@@ -12807,7 +12982,7 @@
           <w:noProof/>
         </w:rPr>
         <w:drawing>
-          <wp:inline distT="0" distB="0" distL="0" distR="0" wp14:anchorId="3241B8A7" wp14:editId="1E559E0F">
+          <wp:inline distT="0" distB="0" distL="0" distR="0" wp14:anchorId="5B69CB86" wp14:editId="04B1C26D">
             <wp:extent cx="2120900" cy="2120900"/>
             <wp:effectExtent l="0" t="0" r="0" b="0"/>
             <wp:docPr id="8" name="Picture 8" descr="dialog"/>
@@ -12919,12 +13094,12 @@
       <w:pPr>
         <w:pStyle w:val="Heading2"/>
       </w:pPr>
-      <w:bookmarkStart w:id="46" w:name="_Toc503771171"/>
+      <w:bookmarkStart w:id="48" w:name="_Toc509323289"/>
       <w:r>
         <w:lastRenderedPageBreak/>
         <w:t>Retrieving Database Records</w:t>
       </w:r>
-      <w:bookmarkEnd w:id="46"/>
+      <w:bookmarkEnd w:id="48"/>
     </w:p>
     <w:p>
       <w:pPr>
@@ -14132,14 +14307,14 @@
       <w:pPr>
         <w:pStyle w:val="Heading3"/>
       </w:pPr>
-      <w:bookmarkStart w:id="47" w:name="_Toc503771172"/>
+      <w:bookmarkStart w:id="49" w:name="_Toc509323290"/>
       <w:r>
         <w:t>Retr</w:t>
       </w:r>
       <w:r>
         <w:t>ieving a Single Database Record</w:t>
       </w:r>
-      <w:bookmarkEnd w:id="47"/>
+      <w:bookmarkEnd w:id="49"/>
     </w:p>
     <w:p>
       <w:pPr>
@@ -14772,12 +14947,12 @@
       <w:pPr>
         <w:pStyle w:val="Heading2"/>
       </w:pPr>
-      <w:bookmarkStart w:id="48" w:name="_Toc503771173"/>
+      <w:bookmarkStart w:id="50" w:name="_Toc509323291"/>
       <w:r>
         <w:lastRenderedPageBreak/>
         <w:t>Parameterized Queries</w:t>
       </w:r>
-      <w:bookmarkEnd w:id="48"/>
+      <w:bookmarkEnd w:id="50"/>
     </w:p>
     <w:p>
       <w:pPr>
@@ -15567,12 +15742,12 @@
       <w:pPr>
         <w:pStyle w:val="Heading2"/>
       </w:pPr>
-      <w:bookmarkStart w:id="49" w:name="_Toc503771174"/>
+      <w:bookmarkStart w:id="51" w:name="_Toc509323292"/>
       <w:r>
         <w:lastRenderedPageBreak/>
         <w:t>Inserting Records in a Database</w:t>
       </w:r>
-      <w:bookmarkEnd w:id="49"/>
+      <w:bookmarkEnd w:id="51"/>
     </w:p>
     <w:p>
       <w:pPr>
@@ -16531,12 +16706,12 @@
       <w:pPr>
         <w:pStyle w:val="Heading2"/>
       </w:pPr>
-      <w:bookmarkStart w:id="50" w:name="_Toc503771175"/>
+      <w:bookmarkStart w:id="52" w:name="_Toc509323293"/>
       <w:r>
         <w:lastRenderedPageBreak/>
         <w:t>Deleting Records in a Database</w:t>
       </w:r>
-      <w:bookmarkEnd w:id="50"/>
+      <w:bookmarkEnd w:id="52"/>
     </w:p>
     <w:p>
       <w:pPr>
@@ -17497,12 +17672,12 @@
       <w:pPr>
         <w:pStyle w:val="Heading2"/>
       </w:pPr>
-      <w:bookmarkStart w:id="51" w:name="_Toc503771176"/>
+      <w:bookmarkStart w:id="53" w:name="_Toc509323294"/>
       <w:r>
         <w:lastRenderedPageBreak/>
         <w:t>Using SPL Stored Procedures in your .NET Application</w:t>
       </w:r>
-      <w:bookmarkEnd w:id="51"/>
+      <w:bookmarkEnd w:id="53"/>
     </w:p>
     <w:p>
       <w:pPr>
@@ -17781,7 +17956,7 @@
       <w:pPr>
         <w:pStyle w:val="Heading3"/>
       </w:pPr>
-      <w:bookmarkStart w:id="52" w:name="_Toc503771177"/>
+      <w:bookmarkStart w:id="54" w:name="_Toc509323295"/>
       <w:r>
         <w:t>Example - Executing</w:t>
       </w:r>
@@ -17791,7 +17966,7 @@
       <w:r>
         <w:t xml:space="preserve"> without Parameters</w:t>
       </w:r>
-      <w:bookmarkEnd w:id="52"/>
+      <w:bookmarkEnd w:id="54"/>
     </w:p>
     <w:p>
       <w:pPr>
@@ -18858,14 +19033,14 @@
       <w:pPr>
         <w:pStyle w:val="Heading3"/>
       </w:pPr>
-      <w:bookmarkStart w:id="53" w:name="_Toc503771178"/>
+      <w:bookmarkStart w:id="55" w:name="_Toc509323296"/>
       <w:r>
         <w:t xml:space="preserve">Example - </w:t>
       </w:r>
       <w:r>
         <w:t>Executing a Stored Procedure with IN Parameters</w:t>
       </w:r>
-      <w:bookmarkEnd w:id="53"/>
+      <w:bookmarkEnd w:id="55"/>
     </w:p>
     <w:p>
       <w:pPr>
@@ -21029,7 +21204,7 @@
       <w:pPr>
         <w:pStyle w:val="Heading3"/>
       </w:pPr>
-      <w:bookmarkStart w:id="54" w:name="_Toc503771179"/>
+      <w:bookmarkStart w:id="56" w:name="_Toc509323297"/>
       <w:r>
         <w:t xml:space="preserve">Example - </w:t>
       </w:r>
@@ -21048,7 +21223,7 @@
       <w:r>
         <w:t xml:space="preserve"> Parameters</w:t>
       </w:r>
-      <w:bookmarkEnd w:id="54"/>
+      <w:bookmarkEnd w:id="56"/>
     </w:p>
     <w:p>
       <w:pPr>
@@ -23708,7 +23883,7 @@
       <w:pPr>
         <w:pStyle w:val="Heading2"/>
       </w:pPr>
-      <w:bookmarkStart w:id="55" w:name="_Toc503771180"/>
+      <w:bookmarkStart w:id="57" w:name="_Toc509323298"/>
       <w:r>
         <w:lastRenderedPageBreak/>
         <w:t xml:space="preserve">Using </w:t>
@@ -23719,7 +23894,7 @@
       <w:r>
         <w:t xml:space="preserve"> in a .NET Application</w:t>
       </w:r>
-      <w:bookmarkEnd w:id="55"/>
+      <w:bookmarkEnd w:id="57"/>
     </w:p>
     <w:p>
       <w:pPr>
@@ -34823,7 +34998,7 @@
 </file>
 
 <file path=customXml/itemProps1.xml><?xml version="1.0" encoding="utf-8"?>
-<ds:datastoreItem xmlns:ds="http://schemas.openxmlformats.org/officeDocument/2006/customXml" ds:itemID="{EC221358-557D-4953-A1DB-F23B1395420E}">
+<ds:datastoreItem xmlns:ds="http://schemas.openxmlformats.org/officeDocument/2006/customXml" ds:itemID="{A44F7EFE-FDF3-4611-ACBA-0EA9A343008B}">
   <ds:schemaRefs>
     <ds:schemaRef ds:uri="http://schemas.openxmlformats.org/officeDocument/2006/bibliography"/>
   </ds:schemaRefs>

</xml_diff>

<commit_message>
EPAS .Net Connector Guide 10.0.2 - JIRA EC-175 Install EnterpriseDB VSIX for Visual Studio 2015/2017
</commit_message>
<xml_diff>
--- a/edb_docs/EDB_Postgres_Advanced_Server_NET_Connector_Guide.docx
+++ b/edb_docs/EDB_Postgres_Advanced_Server_NET_Connector_Guide.docx
@@ -12,7 +12,7 @@
           <w:noProof/>
         </w:rPr>
         <w:drawing>
-          <wp:inline distT="0" distB="0" distL="0" distR="0" wp14:anchorId="613CBD99" wp14:editId="72427C55">
+          <wp:inline distT="0" distB="0" distL="0" distR="0" wp14:anchorId="72926CAB" wp14:editId="765FBEB9">
             <wp:extent cx="2380711" cy="1371599"/>
             <wp:effectExtent l="0" t="0" r="635" b="635"/>
             <wp:docPr id="6" name="Picture 6"/>
@@ -69,16 +69,16 @@
       <w:pPr>
         <w:pStyle w:val="EDBTXTNormalWebBlackCharChar0"/>
       </w:pPr>
-    </w:p>
-    <w:p>
-      <w:pPr>
-        <w:pStyle w:val="EDBTXTNormalWebBlackCharChar0"/>
-        <w:rPr>
-          <w:color w:val="auto"/>
-        </w:rPr>
-      </w:pPr>
       <w:bookmarkStart w:id="0" w:name="_GoBack"/>
       <w:bookmarkEnd w:id="0"/>
+    </w:p>
+    <w:p>
+      <w:pPr>
+        <w:pStyle w:val="EDBTXTNormalWebBlackCharChar0"/>
+        <w:rPr>
+          <w:color w:val="auto"/>
+        </w:rPr>
+      </w:pPr>
     </w:p>
     <w:p>
       <w:pPr>
@@ -244,7 +244,10 @@
         <w:pStyle w:val="EDBCoverProductDate"/>
       </w:pPr>
       <w:r>
-        <w:t>March 20</w:t>
+        <w:t>April 1</w:t>
+      </w:r>
+      <w:r>
+        <w:t>6</w:t>
       </w:r>
       <w:r>
         <w:t xml:space="preserve">, </w:t>
@@ -563,7 +566,7 @@
       <w:r>
         <w:fldChar w:fldCharType="separate"/>
       </w:r>
-      <w:hyperlink w:anchor="_Toc509323265" w:history="1">
+      <w:hyperlink w:anchor="_Toc511635245" w:history="1">
         <w:r>
           <w:rPr>
             <w:rStyle w:val="Hyperlink"/>
@@ -603,7 +606,7 @@
           <w:rPr>
             <w:noProof/>
           </w:rPr>
-          <w:instrText xml:space="preserve"> PAGEREF _Toc509323265 \h </w:instrText>
+          <w:instrText xml:space="preserve"> PAGEREF _Toc511635245 \h </w:instrText>
         </w:r>
         <w:r>
           <w:rPr>
@@ -644,7 +647,7 @@
           <w:szCs w:val="22"/>
         </w:rPr>
       </w:pPr>
-      <w:hyperlink w:anchor="_Toc509323266" w:history="1">
+      <w:hyperlink w:anchor="_Toc511635246" w:history="1">
         <w:r>
           <w:rPr>
             <w:rStyle w:val="Hyperlink"/>
@@ -684,7 +687,7 @@
           <w:rPr>
             <w:noProof/>
           </w:rPr>
-          <w:instrText xml:space="preserve"> PAGEREF _Toc509323266 \h </w:instrText>
+          <w:instrText xml:space="preserve"> PAGEREF _Toc511635246 \h </w:instrText>
         </w:r>
         <w:r>
           <w:rPr>
@@ -725,7 +728,7 @@
           <w:szCs w:val="22"/>
         </w:rPr>
       </w:pPr>
-      <w:hyperlink w:anchor="_Toc509323267" w:history="1">
+      <w:hyperlink w:anchor="_Toc511635247" w:history="1">
         <w:r>
           <w:rPr>
             <w:rStyle w:val="Hyperlink"/>
@@ -765,7 +768,7 @@
           <w:rPr>
             <w:noProof/>
           </w:rPr>
-          <w:instrText xml:space="preserve"> PAGEREF _Toc509323267 \h </w:instrText>
+          <w:instrText xml:space="preserve"> PAGEREF _Toc511635247 \h </w:instrText>
         </w:r>
         <w:r>
           <w:rPr>
@@ -806,7 +809,7 @@
           <w:szCs w:val="22"/>
         </w:rPr>
       </w:pPr>
-      <w:hyperlink w:anchor="_Toc509323268" w:history="1">
+      <w:hyperlink w:anchor="_Toc511635248" w:history="1">
         <w:r>
           <w:rPr>
             <w:rStyle w:val="Hyperlink"/>
@@ -846,7 +849,7 @@
           <w:rPr>
             <w:noProof/>
           </w:rPr>
-          <w:instrText xml:space="preserve"> PAGEREF _Toc509323268 \h </w:instrText>
+          <w:instrText xml:space="preserve"> PAGEREF _Toc511635248 \h </w:instrText>
         </w:r>
         <w:r>
           <w:rPr>
@@ -887,7 +890,7 @@
           <w:szCs w:val="22"/>
         </w:rPr>
       </w:pPr>
-      <w:hyperlink w:anchor="_Toc509323269" w:history="1">
+      <w:hyperlink w:anchor="_Toc511635249" w:history="1">
         <w:r>
           <w:rPr>
             <w:rStyle w:val="Hyperlink"/>
@@ -927,7 +930,7 @@
           <w:rPr>
             <w:noProof/>
           </w:rPr>
-          <w:instrText xml:space="preserve"> PAGEREF _Toc509323269 \h </w:instrText>
+          <w:instrText xml:space="preserve"> PAGEREF _Toc511635249 \h </w:instrText>
         </w:r>
         <w:r>
           <w:rPr>
@@ -968,7 +971,7 @@
           <w:szCs w:val="22"/>
         </w:rPr>
       </w:pPr>
-      <w:hyperlink w:anchor="_Toc509323270" w:history="1">
+      <w:hyperlink w:anchor="_Toc511635250" w:history="1">
         <w:r>
           <w:rPr>
             <w:rStyle w:val="Hyperlink"/>
@@ -1008,7 +1011,7 @@
           <w:rPr>
             <w:noProof/>
           </w:rPr>
-          <w:instrText xml:space="preserve"> PAGEREF _Toc509323270 \h </w:instrText>
+          <w:instrText xml:space="preserve"> PAGEREF _Toc511635250 \h </w:instrText>
         </w:r>
         <w:r>
           <w:rPr>
@@ -1049,7 +1052,7 @@
           <w:szCs w:val="22"/>
         </w:rPr>
       </w:pPr>
-      <w:hyperlink w:anchor="_Toc509323271" w:history="1">
+      <w:hyperlink w:anchor="_Toc511635251" w:history="1">
         <w:r>
           <w:rPr>
             <w:rStyle w:val="Hyperlink"/>
@@ -1089,7 +1092,7 @@
           <w:rPr>
             <w:noProof/>
           </w:rPr>
-          <w:instrText xml:space="preserve"> PAGEREF _Toc509323271 \h </w:instrText>
+          <w:instrText xml:space="preserve"> PAGEREF _Toc511635251 \h </w:instrText>
         </w:r>
         <w:r>
           <w:rPr>
@@ -1130,7 +1133,7 @@
           <w:szCs w:val="22"/>
         </w:rPr>
       </w:pPr>
-      <w:hyperlink w:anchor="_Toc509323272" w:history="1">
+      <w:hyperlink w:anchor="_Toc511635252" w:history="1">
         <w:r>
           <w:rPr>
             <w:rStyle w:val="Hyperlink"/>
@@ -1170,7 +1173,7 @@
           <w:rPr>
             <w:noProof/>
           </w:rPr>
-          <w:instrText xml:space="preserve"> PAGEREF _Toc509323272 \h </w:instrText>
+          <w:instrText xml:space="preserve"> PAGEREF _Toc511635252 \h </w:instrText>
         </w:r>
         <w:r>
           <w:rPr>
@@ -1211,7 +1214,7 @@
           <w:szCs w:val="22"/>
         </w:rPr>
       </w:pPr>
-      <w:hyperlink w:anchor="_Toc509323273" w:history="1">
+      <w:hyperlink w:anchor="_Toc511635253" w:history="1">
         <w:r>
           <w:rPr>
             <w:rStyle w:val="Hyperlink"/>
@@ -1251,7 +1254,7 @@
           <w:rPr>
             <w:noProof/>
           </w:rPr>
-          <w:instrText xml:space="preserve"> PAGEREF _Toc509323273 \h </w:instrText>
+          <w:instrText xml:space="preserve"> PAGEREF _Toc511635253 \h </w:instrText>
         </w:r>
         <w:r>
           <w:rPr>
@@ -1287,7 +1290,7 @@
           <w:szCs w:val="22"/>
         </w:rPr>
       </w:pPr>
-      <w:hyperlink w:anchor="_Toc509323274" w:history="1">
+      <w:hyperlink w:anchor="_Toc511635254" w:history="1">
         <w:r>
           <w:rPr>
             <w:rStyle w:val="Hyperlink"/>
@@ -1315,7 +1318,7 @@
           <w:fldChar w:fldCharType="begin"/>
         </w:r>
         <w:r>
-          <w:instrText xml:space="preserve"> PAGEREF _Toc509323274 \h </w:instrText>
+          <w:instrText xml:space="preserve"> PAGEREF _Toc511635254 \h </w:instrText>
         </w:r>
         <w:r>
           <w:fldChar w:fldCharType="separate"/>
@@ -1337,7 +1340,7 @@
           <w:szCs w:val="22"/>
         </w:rPr>
       </w:pPr>
-      <w:hyperlink w:anchor="_Toc509323275" w:history="1">
+      <w:hyperlink w:anchor="_Toc511635255" w:history="1">
         <w:r>
           <w:rPr>
             <w:rStyle w:val="Hyperlink"/>
@@ -1365,7 +1368,7 @@
           <w:fldChar w:fldCharType="begin"/>
         </w:r>
         <w:r>
-          <w:instrText xml:space="preserve"> PAGEREF _Toc509323275 \h </w:instrText>
+          <w:instrText xml:space="preserve"> PAGEREF _Toc511635255 \h </w:instrText>
         </w:r>
         <w:r>
           <w:fldChar w:fldCharType="separate"/>
@@ -1387,7 +1390,7 @@
           <w:szCs w:val="22"/>
         </w:rPr>
       </w:pPr>
-      <w:hyperlink w:anchor="_Toc509323276" w:history="1">
+      <w:hyperlink w:anchor="_Toc511635256" w:history="1">
         <w:r>
           <w:rPr>
             <w:rStyle w:val="Hyperlink"/>
@@ -1415,7 +1418,7 @@
           <w:fldChar w:fldCharType="begin"/>
         </w:r>
         <w:r>
-          <w:instrText xml:space="preserve"> PAGEREF _Toc509323276 \h </w:instrText>
+          <w:instrText xml:space="preserve"> PAGEREF _Toc511635256 \h </w:instrText>
         </w:r>
         <w:r>
           <w:fldChar w:fldCharType="separate"/>
@@ -1437,7 +1440,7 @@
           <w:szCs w:val="22"/>
         </w:rPr>
       </w:pPr>
-      <w:hyperlink w:anchor="_Toc509323277" w:history="1">
+      <w:hyperlink w:anchor="_Toc511635257" w:history="1">
         <w:r>
           <w:rPr>
             <w:rStyle w:val="Hyperlink"/>
@@ -1465,7 +1468,7 @@
           <w:fldChar w:fldCharType="begin"/>
         </w:r>
         <w:r>
-          <w:instrText xml:space="preserve"> PAGEREF _Toc509323277 \h </w:instrText>
+          <w:instrText xml:space="preserve"> PAGEREF _Toc511635257 \h </w:instrText>
         </w:r>
         <w:r>
           <w:fldChar w:fldCharType="separate"/>
@@ -1487,7 +1490,7 @@
           <w:szCs w:val="22"/>
         </w:rPr>
       </w:pPr>
-      <w:hyperlink w:anchor="_Toc509323278" w:history="1">
+      <w:hyperlink w:anchor="_Toc511635258" w:history="1">
         <w:r>
           <w:rPr>
             <w:rStyle w:val="Hyperlink"/>
@@ -1515,7 +1518,7 @@
           <w:fldChar w:fldCharType="begin"/>
         </w:r>
         <w:r>
-          <w:instrText xml:space="preserve"> PAGEREF _Toc509323278 \h </w:instrText>
+          <w:instrText xml:space="preserve"> PAGEREF _Toc511635258 \h </w:instrText>
         </w:r>
         <w:r>
           <w:fldChar w:fldCharType="separate"/>
@@ -1542,7 +1545,7 @@
           <w:szCs w:val="22"/>
         </w:rPr>
       </w:pPr>
-      <w:hyperlink w:anchor="_Toc509323279" w:history="1">
+      <w:hyperlink w:anchor="_Toc511635259" w:history="1">
         <w:r>
           <w:rPr>
             <w:rStyle w:val="Hyperlink"/>
@@ -1582,7 +1585,7 @@
           <w:rPr>
             <w:noProof/>
           </w:rPr>
-          <w:instrText xml:space="preserve"> PAGEREF _Toc509323279 \h </w:instrText>
+          <w:instrText xml:space="preserve"> PAGEREF _Toc511635259 \h </w:instrText>
         </w:r>
         <w:r>
           <w:rPr>
@@ -1623,7 +1626,7 @@
           <w:szCs w:val="22"/>
         </w:rPr>
       </w:pPr>
-      <w:hyperlink w:anchor="_Toc509323280" w:history="1">
+      <w:hyperlink w:anchor="_Toc511635260" w:history="1">
         <w:r>
           <w:rPr>
             <w:rStyle w:val="Hyperlink"/>
@@ -1645,7 +1648,7 @@
             <w:rStyle w:val="Hyperlink"/>
             <w:noProof/>
           </w:rPr>
-          <w:t>EDBDdexProvider for Visual Studio 2015</w:t>
+          <w:t>EnterpriseDB VSIX for Visual Studio 2015/2017</w:t>
         </w:r>
         <w:r>
           <w:rPr>
@@ -1663,7 +1666,7 @@
           <w:rPr>
             <w:noProof/>
           </w:rPr>
-          <w:instrText xml:space="preserve"> PAGEREF _Toc509323280 \h </w:instrText>
+          <w:instrText xml:space="preserve"> PAGEREF _Toc511635260 \h </w:instrText>
         </w:r>
         <w:r>
           <w:rPr>
@@ -1699,7 +1702,7 @@
           <w:szCs w:val="22"/>
         </w:rPr>
       </w:pPr>
-      <w:hyperlink w:anchor="_Toc509323281" w:history="1">
+      <w:hyperlink w:anchor="_Toc511635261" w:history="1">
         <w:r>
           <w:rPr>
             <w:rStyle w:val="Hyperlink"/>
@@ -1718,7 +1721,7 @@
           <w:rPr>
             <w:rStyle w:val="Hyperlink"/>
           </w:rPr>
-          <w:t>Installation and Configuration for Visual Studio 2015</w:t>
+          <w:t>Installation and Configuration for Visual Studio 2015/2017</w:t>
         </w:r>
         <w:r>
           <w:tab/>
@@ -1727,7 +1730,7 @@
           <w:fldChar w:fldCharType="begin"/>
         </w:r>
         <w:r>
-          <w:instrText xml:space="preserve"> PAGEREF _Toc509323281 \h </w:instrText>
+          <w:instrText xml:space="preserve"> PAGEREF _Toc511635261 \h </w:instrText>
         </w:r>
         <w:r>
           <w:fldChar w:fldCharType="separate"/>
@@ -1749,7 +1752,7 @@
           <w:szCs w:val="22"/>
         </w:rPr>
       </w:pPr>
-      <w:hyperlink w:anchor="_Toc509323282" w:history="1">
+      <w:hyperlink w:anchor="_Toc511635289" w:history="1">
         <w:r>
           <w:rPr>
             <w:rStyle w:val="Hyperlink"/>
@@ -1777,13 +1780,13 @@
           <w:fldChar w:fldCharType="begin"/>
         </w:r>
         <w:r>
-          <w:instrText xml:space="preserve"> PAGEREF _Toc509323282 \h </w:instrText>
+          <w:instrText xml:space="preserve"> PAGEREF _Toc511635289 \h </w:instrText>
         </w:r>
         <w:r>
           <w:fldChar w:fldCharType="separate"/>
         </w:r>
         <w:r>
-          <w:t>18</w:t>
+          <w:t>17</w:t>
         </w:r>
         <w:r>
           <w:fldChar w:fldCharType="end"/>
@@ -1804,7 +1807,7 @@
           <w:szCs w:val="22"/>
         </w:rPr>
       </w:pPr>
-      <w:hyperlink w:anchor="_Toc509323283" w:history="1">
+      <w:hyperlink w:anchor="_Toc511635290" w:history="1">
         <w:r>
           <w:rPr>
             <w:rStyle w:val="Hyperlink"/>
@@ -1844,7 +1847,7 @@
           <w:rPr>
             <w:noProof/>
           </w:rPr>
-          <w:instrText xml:space="preserve"> PAGEREF _Toc509323283 \h </w:instrText>
+          <w:instrText xml:space="preserve"> PAGEREF _Toc511635290 \h </w:instrText>
         </w:r>
         <w:r>
           <w:rPr>
@@ -1861,7 +1864,7 @@
           <w:rPr>
             <w:noProof/>
           </w:rPr>
-          <w:t>20</w:t>
+          <w:t>19</w:t>
         </w:r>
         <w:r>
           <w:rPr>
@@ -1885,7 +1888,7 @@
           <w:szCs w:val="22"/>
         </w:rPr>
       </w:pPr>
-      <w:hyperlink w:anchor="_Toc509323284" w:history="1">
+      <w:hyperlink w:anchor="_Toc511635291" w:history="1">
         <w:r>
           <w:rPr>
             <w:rStyle w:val="Hyperlink"/>
@@ -1925,7 +1928,7 @@
           <w:rPr>
             <w:noProof/>
           </w:rPr>
-          <w:instrText xml:space="preserve"> PAGEREF _Toc509323284 \h </w:instrText>
+          <w:instrText xml:space="preserve"> PAGEREF _Toc511635291 \h </w:instrText>
         </w:r>
         <w:r>
           <w:rPr>
@@ -1942,7 +1945,7 @@
           <w:rPr>
             <w:noProof/>
           </w:rPr>
-          <w:t>20</w:t>
+          <w:t>19</w:t>
         </w:r>
         <w:r>
           <w:rPr>
@@ -1961,7 +1964,7 @@
           <w:szCs w:val="22"/>
         </w:rPr>
       </w:pPr>
-      <w:hyperlink w:anchor="_Toc509323285" w:history="1">
+      <w:hyperlink w:anchor="_Toc511635292" w:history="1">
         <w:r>
           <w:rPr>
             <w:rStyle w:val="Hyperlink"/>
@@ -1989,13 +1992,13 @@
           <w:fldChar w:fldCharType="begin"/>
         </w:r>
         <w:r>
-          <w:instrText xml:space="preserve"> PAGEREF _Toc509323285 \h </w:instrText>
+          <w:instrText xml:space="preserve"> PAGEREF _Toc511635292 \h </w:instrText>
         </w:r>
         <w:r>
           <w:fldChar w:fldCharType="separate"/>
         </w:r>
         <w:r>
-          <w:t>21</w:t>
+          <w:t>20</w:t>
         </w:r>
         <w:r>
           <w:fldChar w:fldCharType="end"/>
@@ -2011,7 +2014,7 @@
           <w:szCs w:val="22"/>
         </w:rPr>
       </w:pPr>
-      <w:hyperlink w:anchor="_Toc509323286" w:history="1">
+      <w:hyperlink w:anchor="_Toc511635293" w:history="1">
         <w:r>
           <w:rPr>
             <w:rStyle w:val="Hyperlink"/>
@@ -2039,13 +2042,13 @@
           <w:fldChar w:fldCharType="begin"/>
         </w:r>
         <w:r>
-          <w:instrText xml:space="preserve"> PAGEREF _Toc509323286 \h </w:instrText>
+          <w:instrText xml:space="preserve"> PAGEREF _Toc511635293 \h </w:instrText>
         </w:r>
         <w:r>
           <w:fldChar w:fldCharType="separate"/>
         </w:r>
         <w:r>
-          <w:t>24</w:t>
+          <w:t>23</w:t>
         </w:r>
         <w:r>
           <w:fldChar w:fldCharType="end"/>
@@ -2061,7 +2064,7 @@
           <w:szCs w:val="22"/>
         </w:rPr>
       </w:pPr>
-      <w:hyperlink w:anchor="_Toc509323287" w:history="1">
+      <w:hyperlink w:anchor="_Toc511635294" w:history="1">
         <w:r>
           <w:rPr>
             <w:rStyle w:val="Hyperlink"/>
@@ -2089,13 +2092,13 @@
           <w:fldChar w:fldCharType="begin"/>
         </w:r>
         <w:r>
-          <w:instrText xml:space="preserve"> PAGEREF _Toc509323287 \h </w:instrText>
+          <w:instrText xml:space="preserve"> PAGEREF _Toc511635294 \h </w:instrText>
         </w:r>
         <w:r>
           <w:fldChar w:fldCharType="separate"/>
         </w:r>
         <w:r>
-          <w:t>25</w:t>
+          <w:t>24</w:t>
         </w:r>
         <w:r>
           <w:fldChar w:fldCharType="end"/>
@@ -2111,7 +2114,7 @@
           <w:szCs w:val="22"/>
         </w:rPr>
       </w:pPr>
-      <w:hyperlink w:anchor="_Toc509323288" w:history="1">
+      <w:hyperlink w:anchor="_Toc511635295" w:history="1">
         <w:r>
           <w:rPr>
             <w:rStyle w:val="Hyperlink"/>
@@ -2139,13 +2142,13 @@
           <w:fldChar w:fldCharType="begin"/>
         </w:r>
         <w:r>
-          <w:instrText xml:space="preserve"> PAGEREF _Toc509323288 \h </w:instrText>
+          <w:instrText xml:space="preserve"> PAGEREF _Toc511635295 \h </w:instrText>
         </w:r>
         <w:r>
           <w:fldChar w:fldCharType="separate"/>
         </w:r>
         <w:r>
-          <w:t>27</w:t>
+          <w:t>26</w:t>
         </w:r>
         <w:r>
           <w:fldChar w:fldCharType="end"/>
@@ -2166,7 +2169,7 @@
           <w:szCs w:val="22"/>
         </w:rPr>
       </w:pPr>
-      <w:hyperlink w:anchor="_Toc509323289" w:history="1">
+      <w:hyperlink w:anchor="_Toc511635296" w:history="1">
         <w:r>
           <w:rPr>
             <w:rStyle w:val="Hyperlink"/>
@@ -2206,7 +2209,7 @@
           <w:rPr>
             <w:noProof/>
           </w:rPr>
-          <w:instrText xml:space="preserve"> PAGEREF _Toc509323289 \h </w:instrText>
+          <w:instrText xml:space="preserve"> PAGEREF _Toc511635296 \h </w:instrText>
         </w:r>
         <w:r>
           <w:rPr>
@@ -2223,7 +2226,7 @@
           <w:rPr>
             <w:noProof/>
           </w:rPr>
-          <w:t>29</w:t>
+          <w:t>28</w:t>
         </w:r>
         <w:r>
           <w:rPr>
@@ -2242,7 +2245,7 @@
           <w:szCs w:val="22"/>
         </w:rPr>
       </w:pPr>
-      <w:hyperlink w:anchor="_Toc509323290" w:history="1">
+      <w:hyperlink w:anchor="_Toc511635297" w:history="1">
         <w:r>
           <w:rPr>
             <w:rStyle w:val="Hyperlink"/>
@@ -2270,13 +2273,13 @@
           <w:fldChar w:fldCharType="begin"/>
         </w:r>
         <w:r>
-          <w:instrText xml:space="preserve"> PAGEREF _Toc509323290 \h </w:instrText>
+          <w:instrText xml:space="preserve"> PAGEREF _Toc511635297 \h </w:instrText>
         </w:r>
         <w:r>
           <w:fldChar w:fldCharType="separate"/>
         </w:r>
         <w:r>
-          <w:t>31</w:t>
+          <w:t>30</w:t>
         </w:r>
         <w:r>
           <w:fldChar w:fldCharType="end"/>
@@ -2297,7 +2300,7 @@
           <w:szCs w:val="22"/>
         </w:rPr>
       </w:pPr>
-      <w:hyperlink w:anchor="_Toc509323291" w:history="1">
+      <w:hyperlink w:anchor="_Toc511635298" w:history="1">
         <w:r>
           <w:rPr>
             <w:rStyle w:val="Hyperlink"/>
@@ -2337,7 +2340,7 @@
           <w:rPr>
             <w:noProof/>
           </w:rPr>
-          <w:instrText xml:space="preserve"> PAGEREF _Toc509323291 \h </w:instrText>
+          <w:instrText xml:space="preserve"> PAGEREF _Toc511635298 \h </w:instrText>
         </w:r>
         <w:r>
           <w:rPr>
@@ -2354,7 +2357,7 @@
           <w:rPr>
             <w:noProof/>
           </w:rPr>
-          <w:t>32</w:t>
+          <w:t>31</w:t>
         </w:r>
         <w:r>
           <w:rPr>
@@ -2378,7 +2381,7 @@
           <w:szCs w:val="22"/>
         </w:rPr>
       </w:pPr>
-      <w:hyperlink w:anchor="_Toc509323292" w:history="1">
+      <w:hyperlink w:anchor="_Toc511635299" w:history="1">
         <w:r>
           <w:rPr>
             <w:rStyle w:val="Hyperlink"/>
@@ -2418,7 +2421,7 @@
           <w:rPr>
             <w:noProof/>
           </w:rPr>
-          <w:instrText xml:space="preserve"> PAGEREF _Toc509323292 \h </w:instrText>
+          <w:instrText xml:space="preserve"> PAGEREF _Toc511635299 \h </w:instrText>
         </w:r>
         <w:r>
           <w:rPr>
@@ -2435,7 +2438,7 @@
           <w:rPr>
             <w:noProof/>
           </w:rPr>
-          <w:t>34</w:t>
+          <w:t>33</w:t>
         </w:r>
         <w:r>
           <w:rPr>
@@ -2459,7 +2462,7 @@
           <w:szCs w:val="22"/>
         </w:rPr>
       </w:pPr>
-      <w:hyperlink w:anchor="_Toc509323293" w:history="1">
+      <w:hyperlink w:anchor="_Toc511635300" w:history="1">
         <w:r>
           <w:rPr>
             <w:rStyle w:val="Hyperlink"/>
@@ -2499,7 +2502,7 @@
           <w:rPr>
             <w:noProof/>
           </w:rPr>
-          <w:instrText xml:space="preserve"> PAGEREF _Toc509323293 \h </w:instrText>
+          <w:instrText xml:space="preserve"> PAGEREF _Toc511635300 \h </w:instrText>
         </w:r>
         <w:r>
           <w:rPr>
@@ -2516,7 +2519,7 @@
           <w:rPr>
             <w:noProof/>
           </w:rPr>
-          <w:t>36</w:t>
+          <w:t>35</w:t>
         </w:r>
         <w:r>
           <w:rPr>
@@ -2540,7 +2543,7 @@
           <w:szCs w:val="22"/>
         </w:rPr>
       </w:pPr>
-      <w:hyperlink w:anchor="_Toc509323294" w:history="1">
+      <w:hyperlink w:anchor="_Toc511635301" w:history="1">
         <w:r>
           <w:rPr>
             <w:rStyle w:val="Hyperlink"/>
@@ -2580,7 +2583,7 @@
           <w:rPr>
             <w:noProof/>
           </w:rPr>
-          <w:instrText xml:space="preserve"> PAGEREF _Toc509323294 \h </w:instrText>
+          <w:instrText xml:space="preserve"> PAGEREF _Toc511635301 \h </w:instrText>
         </w:r>
         <w:r>
           <w:rPr>
@@ -2597,7 +2600,7 @@
           <w:rPr>
             <w:noProof/>
           </w:rPr>
-          <w:t>38</w:t>
+          <w:t>37</w:t>
         </w:r>
         <w:r>
           <w:rPr>
@@ -2616,7 +2619,7 @@
           <w:szCs w:val="22"/>
         </w:rPr>
       </w:pPr>
-      <w:hyperlink w:anchor="_Toc509323295" w:history="1">
+      <w:hyperlink w:anchor="_Toc511635302" w:history="1">
         <w:r>
           <w:rPr>
             <w:rStyle w:val="Hyperlink"/>
@@ -2644,13 +2647,13 @@
           <w:fldChar w:fldCharType="begin"/>
         </w:r>
         <w:r>
-          <w:instrText xml:space="preserve"> PAGEREF _Toc509323295 \h </w:instrText>
+          <w:instrText xml:space="preserve"> PAGEREF _Toc511635302 \h </w:instrText>
         </w:r>
         <w:r>
           <w:fldChar w:fldCharType="separate"/>
         </w:r>
         <w:r>
-          <w:t>39</w:t>
+          <w:t>38</w:t>
         </w:r>
         <w:r>
           <w:fldChar w:fldCharType="end"/>
@@ -2666,7 +2669,7 @@
           <w:szCs w:val="22"/>
         </w:rPr>
       </w:pPr>
-      <w:hyperlink w:anchor="_Toc509323296" w:history="1">
+      <w:hyperlink w:anchor="_Toc511635303" w:history="1">
         <w:r>
           <w:rPr>
             <w:rStyle w:val="Hyperlink"/>
@@ -2694,13 +2697,13 @@
           <w:fldChar w:fldCharType="begin"/>
         </w:r>
         <w:r>
-          <w:instrText xml:space="preserve"> PAGEREF _Toc509323296 \h </w:instrText>
+          <w:instrText xml:space="preserve"> PAGEREF _Toc511635303 \h </w:instrText>
         </w:r>
         <w:r>
           <w:fldChar w:fldCharType="separate"/>
         </w:r>
         <w:r>
-          <w:t>41</w:t>
+          <w:t>40</w:t>
         </w:r>
         <w:r>
           <w:fldChar w:fldCharType="end"/>
@@ -2716,7 +2719,7 @@
           <w:szCs w:val="22"/>
         </w:rPr>
       </w:pPr>
-      <w:hyperlink w:anchor="_Toc509323297" w:history="1">
+      <w:hyperlink w:anchor="_Toc511635304" w:history="1">
         <w:r>
           <w:rPr>
             <w:rStyle w:val="Hyperlink"/>
@@ -2744,13 +2747,13 @@
           <w:fldChar w:fldCharType="begin"/>
         </w:r>
         <w:r>
-          <w:instrText xml:space="preserve"> PAGEREF _Toc509323297 \h </w:instrText>
+          <w:instrText xml:space="preserve"> PAGEREF _Toc511635304 \h </w:instrText>
         </w:r>
         <w:r>
           <w:fldChar w:fldCharType="separate"/>
         </w:r>
         <w:r>
-          <w:t>44</w:t>
+          <w:t>43</w:t>
         </w:r>
         <w:r>
           <w:fldChar w:fldCharType="end"/>
@@ -2771,7 +2774,7 @@
           <w:szCs w:val="22"/>
         </w:rPr>
       </w:pPr>
-      <w:hyperlink w:anchor="_Toc509323298" w:history="1">
+      <w:hyperlink w:anchor="_Toc511635305" w:history="1">
         <w:r>
           <w:rPr>
             <w:rStyle w:val="Hyperlink"/>
@@ -2811,7 +2814,7 @@
           <w:rPr>
             <w:noProof/>
           </w:rPr>
-          <w:instrText xml:space="preserve"> PAGEREF _Toc509323298 \h </w:instrText>
+          <w:instrText xml:space="preserve"> PAGEREF _Toc511635305 \h </w:instrText>
         </w:r>
         <w:r>
           <w:rPr>
@@ -2828,7 +2831,7 @@
           <w:rPr>
             <w:noProof/>
           </w:rPr>
-          <w:t>48</w:t>
+          <w:t>47</w:t>
         </w:r>
         <w:r>
           <w:rPr>
@@ -2869,7 +2872,7 @@
       <w:pPr>
         <w:pStyle w:val="Heading1"/>
       </w:pPr>
-      <w:bookmarkStart w:id="1" w:name="_Toc509323265"/>
+      <w:bookmarkStart w:id="1" w:name="_Toc511635245"/>
       <w:r>
         <w:lastRenderedPageBreak/>
         <w:t>Introduction</w:t>
@@ -3044,7 +3047,7 @@
       <w:pPr>
         <w:pStyle w:val="Heading2"/>
       </w:pPr>
-      <w:bookmarkStart w:id="2" w:name="_Toc509323266"/>
+      <w:bookmarkStart w:id="2" w:name="_Toc511635246"/>
       <w:r>
         <w:lastRenderedPageBreak/>
         <w:t>What’s New</w:t>
@@ -3210,6 +3213,117 @@
           <w:lang w:eastAsia="ar-SA"/>
         </w:rPr>
         <w:t>3.2.5</w:t>
+      </w:r>
+      <w:r>
+        <w:rPr>
+          <w:u w:val="single"/>
+          <w:lang w:eastAsia="ar-SA"/>
+        </w:rPr>
+        <w:fldChar w:fldCharType="end"/>
+      </w:r>
+      <w:r>
+        <w:rPr>
+          <w:lang w:eastAsia="ar-SA"/>
+        </w:rPr>
+        <w:t>.</w:t>
+      </w:r>
+    </w:p>
+    <w:p>
+      <w:pPr>
+        <w:pStyle w:val="EDBTXTNormalWebBlackCharChar1"/>
+        <w:numPr>
+          <w:ilvl w:val="0"/>
+          <w:numId w:val="2"/>
+        </w:numPr>
+        <w:tabs>
+          <w:tab w:val="left" w:pos="720"/>
+        </w:tabs>
+        <w:spacing w:before="0" w:after="0"/>
+        <w:rPr>
+          <w:lang w:eastAsia="ar-SA"/>
+        </w:rPr>
+      </w:pPr>
+      <w:r>
+        <w:rPr>
+          <w:lang w:eastAsia="ar-SA"/>
+        </w:rPr>
+        <w:t>An Advanced Server database can</w:t>
+      </w:r>
+      <w:r>
+        <w:rPr>
+          <w:lang w:eastAsia="ar-SA"/>
+        </w:rPr>
+        <w:t xml:space="preserve"> now </w:t>
+      </w:r>
+      <w:r>
+        <w:rPr>
+          <w:lang w:eastAsia="ar-SA"/>
+        </w:rPr>
+        <w:t xml:space="preserve">be integrated </w:t>
+      </w:r>
+      <w:r>
+        <w:rPr>
+          <w:lang w:eastAsia="ar-SA"/>
+        </w:rPr>
+        <w:t>into Visual Studio 2017 in addition to</w:t>
+      </w:r>
+      <w:r>
+        <w:rPr>
+          <w:lang w:eastAsia="ar-SA"/>
+        </w:rPr>
+        <w:t xml:space="preserve"> Visual Studio</w:t>
+      </w:r>
+      <w:r>
+        <w:rPr>
+          <w:lang w:eastAsia="ar-SA"/>
+        </w:rPr>
+        <w:t xml:space="preserve"> 2015, thus providing the</w:t>
+      </w:r>
+      <w:r>
+        <w:rPr>
+          <w:lang w:eastAsia="ar-SA"/>
+        </w:rPr>
+        <w:t>se</w:t>
+      </w:r>
+      <w:r>
+        <w:rPr>
+          <w:lang w:eastAsia="ar-SA"/>
+        </w:rPr>
+        <w:t xml:space="preserve"> Visual Studio features. For more information, see Section </w:t>
+      </w:r>
+      <w:r>
+        <w:rPr>
+          <w:u w:val="single"/>
+          <w:lang w:eastAsia="ar-SA"/>
+        </w:rPr>
+        <w:fldChar w:fldCharType="begin"/>
+      </w:r>
+      <w:r>
+        <w:rPr>
+          <w:u w:val="single"/>
+          <w:lang w:eastAsia="ar-SA"/>
+        </w:rPr>
+        <w:instrText xml:space="preserve"> REF _Ref511382535 \r \h </w:instrText>
+      </w:r>
+      <w:r>
+        <w:rPr>
+          <w:u w:val="single"/>
+          <w:lang w:eastAsia="ar-SA"/>
+        </w:rPr>
+      </w:r>
+      <w:r>
+        <w:rPr>
+          <w:u w:val="single"/>
+          <w:lang w:eastAsia="ar-SA"/>
+        </w:rPr>
+        <w:fldChar w:fldCharType="separate"/>
+      </w:r>
+      <w:r>
+        <w:rPr>
+          <w:u w:val="single"/>
+          <w:lang w:eastAsia="ar-SA"/>
+        </w:rPr>
+        <w:t>3.4</w:t>
       </w:r>
       <w:r>
         <w:rPr>
@@ -3244,7 +3358,7 @@
       <w:bookmarkStart w:id="10" w:name="_Ref103071794"/>
       <w:bookmarkStart w:id="11" w:name="_Ref103073047"/>
       <w:bookmarkStart w:id="12" w:name="_Ref103073090"/>
-      <w:bookmarkStart w:id="13" w:name="_Toc509323267"/>
+      <w:bookmarkStart w:id="13" w:name="_Toc511635247"/>
       <w:bookmarkEnd w:id="3"/>
       <w:bookmarkEnd w:id="4"/>
       <w:bookmarkEnd w:id="5"/>
@@ -3675,7 +3789,7 @@
       <w:pPr>
         <w:pStyle w:val="Heading1"/>
       </w:pPr>
-      <w:bookmarkStart w:id="15" w:name="_Toc509323268"/>
+      <w:bookmarkStart w:id="15" w:name="_Toc511635248"/>
       <w:r>
         <w:lastRenderedPageBreak/>
         <w:t>The Advanced Server .NET Connector - Overview</w:t>
@@ -3741,7 +3855,7 @@
       <w:pPr>
         <w:pStyle w:val="Heading2"/>
       </w:pPr>
-      <w:bookmarkStart w:id="16" w:name="_Toc509323269"/>
+      <w:bookmarkStart w:id="16" w:name="_Toc511635249"/>
       <w:r>
         <w:t>The .NET Class Hierarchy</w:t>
       </w:r>
@@ -4028,7 +4142,7 @@
       <w:pPr>
         <w:pStyle w:val="Heading2"/>
       </w:pPr>
-      <w:bookmarkStart w:id="17" w:name="_Toc509323270"/>
+      <w:bookmarkStart w:id="17" w:name="_Toc511635250"/>
       <w:r>
         <w:lastRenderedPageBreak/>
         <w:t>Installing the .NET Connector</w:t>
@@ -4155,7 +4269,7 @@
           <w:noProof/>
         </w:rPr>
         <w:drawing>
-          <wp:inline distT="0" distB="0" distL="0" distR="0" wp14:anchorId="59E5C706" wp14:editId="5F111761">
+          <wp:inline distT="0" distB="0" distL="0" distR="0" wp14:anchorId="40D251C2" wp14:editId="5F9751E5">
             <wp:extent cx="3886200" cy="3037805"/>
             <wp:effectExtent l="0" t="0" r="0" b="0"/>
             <wp:docPr id="2" name="Picture 2"/>
@@ -4264,7 +4378,7 @@
         </w:rPr>
         <w:lastRenderedPageBreak/>
         <w:drawing>
-          <wp:inline distT="0" distB="0" distL="0" distR="0" wp14:anchorId="2DBADB27" wp14:editId="747624C2">
+          <wp:inline distT="0" distB="0" distL="0" distR="0" wp14:anchorId="4B2DB6E7" wp14:editId="33CE874C">
             <wp:extent cx="3886200" cy="3046927"/>
             <wp:effectExtent l="0" t="0" r="0" b="1270"/>
             <wp:docPr id="3" name="Picture 3"/>
@@ -4399,7 +4513,7 @@
           <w:noProof/>
         </w:rPr>
         <w:drawing>
-          <wp:inline distT="0" distB="0" distL="0" distR="0" wp14:anchorId="736D0C27" wp14:editId="397820BD">
+          <wp:inline distT="0" distB="0" distL="0" distR="0" wp14:anchorId="15293E1C" wp14:editId="6A40874B">
             <wp:extent cx="4114800" cy="3217552"/>
             <wp:effectExtent l="0" t="0" r="0" b="1905"/>
             <wp:docPr id="4" name="Picture 4"/>
@@ -4554,7 +4668,7 @@
           <w:noProof/>
         </w:rPr>
         <w:drawing>
-          <wp:inline distT="0" distB="0" distL="0" distR="0" wp14:anchorId="508CD424" wp14:editId="45B34EFB">
+          <wp:inline distT="0" distB="0" distL="0" distR="0" wp14:anchorId="48934141" wp14:editId="543B41DD">
             <wp:extent cx="4114800" cy="3194511"/>
             <wp:effectExtent l="0" t="0" r="0" b="6350"/>
             <wp:docPr id="5" name="Picture 5"/>
@@ -4727,7 +4841,7 @@
           <w:noProof/>
         </w:rPr>
         <w:drawing>
-          <wp:inline distT="0" distB="0" distL="0" distR="0" wp14:anchorId="0AE9CE3A" wp14:editId="46992EC8">
+          <wp:inline distT="0" distB="0" distL="0" distR="0" wp14:anchorId="005AA0AB" wp14:editId="2FD26A62">
             <wp:extent cx="3790950" cy="1619051"/>
             <wp:effectExtent l="0" t="0" r="0" b="635"/>
             <wp:docPr id="12" name="Picture 12" descr="C:\Users\susan\AppData\Local\Temp\vmware-susan\VMwareDnD\7412d23f\Screen Shot 2016-07-11 at 4.50.20 PM.png"/>
@@ -4894,7 +5008,7 @@
         </w:rPr>
         <w:lastRenderedPageBreak/>
         <w:drawing>
-          <wp:inline distT="0" distB="0" distL="0" distR="0" wp14:anchorId="7DA492D5" wp14:editId="2DA1EFF7">
+          <wp:inline distT="0" distB="0" distL="0" distR="0" wp14:anchorId="3647F62A" wp14:editId="01BB72D7">
             <wp:extent cx="4116527" cy="2992582"/>
             <wp:effectExtent l="0" t="0" r="0" b="0"/>
             <wp:docPr id="10" name="Picture 10"/>
@@ -5000,7 +5114,7 @@
         <w:pStyle w:val="Heading1"/>
       </w:pPr>
       <w:bookmarkStart w:id="18" w:name="_Ref456012125"/>
-      <w:bookmarkStart w:id="19" w:name="_Toc509323271"/>
+      <w:bookmarkStart w:id="19" w:name="_Toc511635251"/>
       <w:r>
         <w:lastRenderedPageBreak/>
         <w:t>Configuring the .NET Connector</w:t>
@@ -5268,7 +5382,7 @@
         <w:pStyle w:val="Heading2"/>
       </w:pPr>
       <w:bookmarkStart w:id="20" w:name="_Ref477525249"/>
-      <w:bookmarkStart w:id="21" w:name="_Toc509323272"/>
+      <w:bookmarkStart w:id="21" w:name="_Toc511635252"/>
       <w:r>
         <w:t>General Instructions</w:t>
       </w:r>
@@ -5542,7 +5656,7 @@
       <w:pPr>
         <w:pStyle w:val="Heading2"/>
       </w:pPr>
-      <w:bookmarkStart w:id="22" w:name="_Toc509323273"/>
+      <w:bookmarkStart w:id="22" w:name="_Toc511635253"/>
       <w:r>
         <w:t xml:space="preserve">.NET Framework </w:t>
       </w:r>
@@ -5569,7 +5683,7 @@
       <w:pPr>
         <w:pStyle w:val="Heading3"/>
       </w:pPr>
-      <w:bookmarkStart w:id="23" w:name="_Toc509323274"/>
+      <w:bookmarkStart w:id="23" w:name="_Toc511635254"/>
       <w:r>
         <w:t>.NET Framework 4.0</w:t>
       </w:r>
@@ -5777,7 +5891,7 @@
       </w:pPr>
       <w:bookmarkStart w:id="24" w:name="_Ref503423964"/>
       <w:bookmarkStart w:id="25" w:name="_Ref503430964"/>
-      <w:bookmarkStart w:id="26" w:name="_Toc509323275"/>
+      <w:bookmarkStart w:id="26" w:name="_Toc511635255"/>
       <w:r>
         <w:t>.NET Framework 4.5</w:t>
       </w:r>
@@ -6076,7 +6190,7 @@
       </w:pPr>
       <w:bookmarkStart w:id="27" w:name="_Ref503423994"/>
       <w:bookmarkStart w:id="28" w:name="_Ref503431008"/>
-      <w:bookmarkStart w:id="29" w:name="_Toc509323276"/>
+      <w:bookmarkStart w:id="29" w:name="_Toc511635256"/>
       <w:r>
         <w:t>.NET Framework 4.5.1</w:t>
       </w:r>
@@ -6397,7 +6511,7 @@
         <w:pStyle w:val="Heading3"/>
       </w:pPr>
       <w:bookmarkStart w:id="30" w:name="_Ref503431048"/>
-      <w:bookmarkStart w:id="31" w:name="_Toc509323277"/>
+      <w:bookmarkStart w:id="31" w:name="_Toc511635257"/>
       <w:r>
         <w:t>.NET Standard 1.3</w:t>
       </w:r>
@@ -6555,7 +6669,7 @@
         <w:pStyle w:val="Heading3"/>
       </w:pPr>
       <w:bookmarkStart w:id="32" w:name="_Ref509321802"/>
-      <w:bookmarkStart w:id="33" w:name="_Toc509323278"/>
+      <w:bookmarkStart w:id="33" w:name="_Toc511635258"/>
       <w:r>
         <w:lastRenderedPageBreak/>
         <w:t>.NET Standard 2.0</w:t>
@@ -6726,7 +6840,7 @@
         <w:pStyle w:val="Heading2"/>
       </w:pPr>
       <w:bookmarkStart w:id="34" w:name="_Ref477527440"/>
-      <w:bookmarkStart w:id="35" w:name="_Toc509323279"/>
+      <w:bookmarkStart w:id="35" w:name="_Toc511635259"/>
       <w:r>
         <w:t xml:space="preserve">Entity Framework </w:t>
       </w:r>
@@ -7742,15 +7856,26 @@
         <w:pStyle w:val="Heading2"/>
       </w:pPr>
       <w:bookmarkStart w:id="36" w:name="_Ref477528081"/>
-      <w:bookmarkStart w:id="37" w:name="_Toc509323280"/>
-      <w:r>
-        <w:t>EDBDdexProvider for Visual Studio</w:t>
+      <w:bookmarkStart w:id="37" w:name="_Ref511382535"/>
+      <w:bookmarkStart w:id="38" w:name="_Toc511635260"/>
+      <w:r>
+        <w:t>E</w:t>
+      </w:r>
+      <w:r>
+        <w:t>nterpriseDB VSIX</w:t>
+      </w:r>
+      <w:r>
+        <w:t xml:space="preserve"> for Visual Studio</w:t>
       </w:r>
       <w:bookmarkEnd w:id="36"/>
       <w:r>
         <w:t xml:space="preserve"> 2015</w:t>
       </w:r>
       <w:bookmarkEnd w:id="37"/>
+      <w:r>
+        <w:t>/2017</w:t>
+      </w:r>
+      <w:bookmarkEnd w:id="38"/>
     </w:p>
     <w:p>
       <w:pPr>
@@ -7769,7 +7894,13 @@
         <w:rPr>
           <w:rStyle w:val="EDBTXTTermNormalWebBlackItalicCharCharChar"/>
         </w:rPr>
-        <w:t>EDBDdexProvider</w:t>
+        <w:t>E</w:t>
+      </w:r>
+      <w:r>
+        <w:rPr>
+          <w:rStyle w:val="EDBTXTTermNormalWebBlackItalicCharCharChar"/>
+        </w:rPr>
+        <w:t>nterpriseDB VSIX</w:t>
       </w:r>
       <w:r>
         <w:t>)</w:t>
@@ -7798,10 +7929,16 @@
         <w:t>Advanced Server</w:t>
       </w:r>
       <w:r>
-        <w:t xml:space="preserve"> from within Visual Studio's Server Explorer, creating a model from an existing database, etc. Therefore, if Visual Studio features are desired, then EDBDdexPr</w:t>
-      </w:r>
-      <w:r>
-        <w:t>ovider must be utilized</w:t>
+        <w:t xml:space="preserve"> from within Visual Studio's Server Explorer, creating a model from an existing database, etc. Therefore, if Visual Studio features are desired, then </w:t>
+      </w:r>
+      <w:r>
+        <w:t>E</w:t>
+      </w:r>
+      <w:r>
+        <w:t xml:space="preserve">nterpriseDB VSIX </w:t>
+      </w:r>
+      <w:r>
+        <w:t>must be utilized</w:t>
       </w:r>
       <w:r>
         <w:t>.</w:t>
@@ -7813,7 +7950,13 @@
       </w:pPr>
       <w:r>
         <w:lastRenderedPageBreak/>
-        <w:t>EDBDdexProvider is located in the following directory:</w:t>
+        <w:t>E</w:t>
+      </w:r>
+      <w:r>
+        <w:t>nterpriseDB VSIX</w:t>
+      </w:r>
+      <w:r>
+        <w:t xml:space="preserve"> is located in the following directory:</w:t>
       </w:r>
     </w:p>
     <w:p>
@@ -7828,7 +7971,19 @@
         <w:rPr>
           <w:rStyle w:val="EDBTXTKeywordBlack"/>
         </w:rPr>
-        <w:t>C:\Program Files\edb\connectors\dotnet\DdexProvider\</w:t>
+        <w:t>C:\Program Files\edb\connectors\dotnet\</w:t>
+      </w:r>
+      <w:r>
+        <w:rPr>
+          <w:rStyle w:val="EDBTXTKeywordBlack"/>
+        </w:rPr>
+        <w:t>vsix</w:t>
+      </w:r>
+      <w:r>
+        <w:rPr>
+          <w:rStyle w:val="EDBTXTKeywordBlack"/>
+        </w:rPr>
+        <w:t>\</w:t>
       </w:r>
     </w:p>
     <w:p>
@@ -7837,20 +7992,6 @@
       </w:pPr>
       <w:r>
         <w:t>The files available at the above location are the following:</w:t>
-      </w:r>
-    </w:p>
-    <w:p>
-      <w:pPr>
-        <w:ind w:left="720"/>
-        <w:rPr>
-          <w:rStyle w:val="EDBTXTKeywordBlack"/>
-        </w:rPr>
-      </w:pPr>
-      <w:r>
-        <w:rPr>
-          <w:rStyle w:val="EDBTXTKeywordBlack"/>
-        </w:rPr>
-        <w:t>EDBDexProvider.vsix</w:t>
       </w:r>
     </w:p>
     <w:p>
@@ -7866,7 +8007,19 @@
         <w:rPr>
           <w:rStyle w:val="EDBTXTKeywordBlack"/>
         </w:rPr>
-        <w:t>EDBDexProvider.dll</w:t>
+        <w:t>E</w:t>
+      </w:r>
+      <w:r>
+        <w:rPr>
+          <w:rStyle w:val="EDBTXTKeywordBlack"/>
+        </w:rPr>
+        <w:t>nterpriseDB</w:t>
+      </w:r>
+      <w:r>
+        <w:rPr>
+          <w:rStyle w:val="EDBTXTKeywordBlack"/>
+        </w:rPr>
+        <w:t>.vsix</w:t>
       </w:r>
       <w:r>
         <w:rPr>
@@ -7893,19 +8046,410 @@
       <w:pPr>
         <w:pStyle w:val="Heading3"/>
       </w:pPr>
-      <w:bookmarkStart w:id="38" w:name="_Toc509323281"/>
+      <w:bookmarkStart w:id="39" w:name="_Toc511635261"/>
       <w:r>
         <w:t>Installation and Configuration for Visual Studio 2015</w:t>
       </w:r>
-      <w:bookmarkEnd w:id="38"/>
-    </w:p>
-    <w:p>
-      <w:pPr>
-        <w:pStyle w:val="EDBTXTNormalWebBlackCharChar0"/>
-      </w:pPr>
-      <w:r>
-        <w:t>The following are the steps to install and configure EDBDdexProvider.</w:t>
-      </w:r>
+      <w:r>
+        <w:t>/2017</w:t>
+      </w:r>
+      <w:bookmarkEnd w:id="39"/>
+    </w:p>
+    <w:p>
+      <w:pPr>
+        <w:pStyle w:val="EDBTXTNormalWebBlackCharChar0"/>
+      </w:pPr>
+      <w:r>
+        <w:t>Install</w:t>
+      </w:r>
+      <w:r>
+        <w:t xml:space="preserve"> the</w:t>
+      </w:r>
+      <w:r>
+        <w:t xml:space="preserve"> </w:t>
+      </w:r>
+      <w:r>
+        <w:rPr>
+          <w:rStyle w:val="EDBTXTKeywordBlack"/>
+        </w:rPr>
+        <w:t>EnterpriseDB.vsix</w:t>
+      </w:r>
+      <w:r>
+        <w:t xml:space="preserve"> extension to the desired version of Visual Studio.</w:t>
+      </w:r>
+    </w:p>
+    <w:p>
+      <w:pPr>
+        <w:pStyle w:val="EDBTXTNormalWebBlackCharChar0"/>
+      </w:pPr>
+      <w:r>
+        <w:t>If you already have an earlier version of t</w:t>
+      </w:r>
+      <w:r>
+        <w:t>he VSIX (or MSI) installed, it’s</w:t>
+      </w:r>
+      <w:r>
+        <w:t xml:space="preserve"> highly recommended that you uninstall them to avoid conflicts.</w:t>
+      </w:r>
+    </w:p>
+    <w:p>
+      <w:pPr>
+        <w:pStyle w:val="EDBTXTNormalWebBlackCharChar0"/>
+      </w:pPr>
+      <w:r>
+        <w:t xml:space="preserve">It is no longer necessary or recommended to have </w:t>
+      </w:r>
+      <w:r>
+        <w:rPr>
+          <w:rStyle w:val="EDBTXTKeywordBlack"/>
+        </w:rPr>
+        <w:t>EnterpriseDB.EDBClient</w:t>
+      </w:r>
+      <w:r>
+        <w:t xml:space="preserve"> in your </w:t>
+      </w:r>
+      <w:r>
+        <w:t>global assembly cache (</w:t>
+      </w:r>
+      <w:r>
+        <w:t>GAC</w:t>
+      </w:r>
+      <w:r>
+        <w:t>)</w:t>
+      </w:r>
+      <w:r>
+        <w:t xml:space="preserve">, or to have </w:t>
+      </w:r>
+      <w:r>
+        <w:rPr>
+          <w:rStyle w:val="EDBTXTKeywordBlack"/>
+        </w:rPr>
+        <w:t>EnterpriseDB.EDBClient</w:t>
+      </w:r>
+      <w:r>
+        <w:t xml:space="preserve"> listed in your </w:t>
+      </w:r>
+      <w:r>
+        <w:rPr>
+          <w:rStyle w:val="EDBTXTKeywordBlack"/>
+        </w:rPr>
+        <w:t>machine</w:t>
+      </w:r>
+      <w:r>
+        <w:rPr>
+          <w:rStyle w:val="EDBTXTKeywordBlack"/>
+        </w:rPr>
+        <w:t>.config</w:t>
+      </w:r>
+      <w:r>
+        <w:t xml:space="preserve"> </w:t>
+      </w:r>
+      <w:r>
+        <w:t xml:space="preserve">file. </w:t>
+      </w:r>
+      <w:r>
+        <w:t>Simply installing the VSIX should wo</w:t>
+      </w:r>
+      <w:r>
+        <w:t>rk just fine, and a GAC/</w:t>
+      </w:r>
+      <w:r>
+        <w:rPr>
+          <w:rStyle w:val="EDBTXTKeywordBlack"/>
+        </w:rPr>
+        <w:t>machine.config</w:t>
+      </w:r>
+      <w:r>
+        <w:t xml:space="preserve"> may actually cause issues.</w:t>
+      </w:r>
+    </w:p>
+    <w:p>
+      <w:pPr>
+        <w:pStyle w:val="EDBTXTNormalWebBlackCharChar0"/>
+      </w:pPr>
+      <w:r>
+        <w:t xml:space="preserve">If you previously installed </w:t>
+      </w:r>
+      <w:r>
+        <w:rPr>
+          <w:rStyle w:val="EDBTXTKeywordBlack"/>
+        </w:rPr>
+        <w:t>EnterpriseDB.EDBClient</w:t>
+      </w:r>
+      <w:r>
+        <w:t xml:space="preserve"> into your GAC/</w:t>
+      </w:r>
+      <w:r>
+        <w:rPr>
+          <w:rStyle w:val="EDBTXTKeywordBlack"/>
+        </w:rPr>
+        <w:t>machine.config</w:t>
+      </w:r>
+      <w:r>
+        <w:t xml:space="preserve">, it’s recommended you uninstall it. If you have any entries (binding redirects, </w:t>
+      </w:r>
+      <w:r>
+        <w:rPr>
+          <w:rStyle w:val="EDBTXTKeywordBlack"/>
+        </w:rPr>
+        <w:t>DbProviderFactories</w:t>
+      </w:r>
+      <w:r>
+        <w:t xml:space="preserve"> registrations) in either your </w:t>
+      </w:r>
+      <w:r>
+        <w:rPr>
+          <w:rStyle w:val="EDBTXTKeywordBlack"/>
+        </w:rPr>
+        <w:t>machine.config</w:t>
+      </w:r>
+      <w:r>
+        <w:t xml:space="preserve"> or in your Visual Studio setup (for example, </w:t>
+      </w:r>
+      <w:r>
+        <w:rPr>
+          <w:rStyle w:val="EDBTXTKeywordBlack"/>
+        </w:rPr>
+        <w:t>app.config</w:t>
+      </w:r>
+      <w:r>
+        <w:t xml:space="preserve">, </w:t>
+      </w:r>
+      <w:r>
+        <w:rPr>
+          <w:rStyle w:val="EDBTXTKeywordBlack"/>
+        </w:rPr>
+        <w:t>devenv.exe.config</w:t>
+      </w:r>
+      <w:r>
+        <w:t>), please remove them. The VSIX should work on a totally clean setup.</w:t>
+      </w:r>
+    </w:p>
+    <w:p>
+      <w:pPr>
+        <w:pStyle w:val="Heading3"/>
+      </w:pPr>
+      <w:bookmarkStart w:id="40" w:name="_Toc511385085"/>
+      <w:bookmarkStart w:id="41" w:name="_Toc511634305"/>
+      <w:bookmarkStart w:id="42" w:name="_Toc511635201"/>
+      <w:bookmarkStart w:id="43" w:name="_Toc511635262"/>
+      <w:bookmarkStart w:id="44" w:name="_Toc511385086"/>
+      <w:bookmarkStart w:id="45" w:name="_Toc511634306"/>
+      <w:bookmarkStart w:id="46" w:name="_Toc511635202"/>
+      <w:bookmarkStart w:id="47" w:name="_Toc511635263"/>
+      <w:bookmarkStart w:id="48" w:name="_Toc511385087"/>
+      <w:bookmarkStart w:id="49" w:name="_Toc511634307"/>
+      <w:bookmarkStart w:id="50" w:name="_Toc511635203"/>
+      <w:bookmarkStart w:id="51" w:name="_Toc511635264"/>
+      <w:bookmarkStart w:id="52" w:name="_Toc511385088"/>
+      <w:bookmarkStart w:id="53" w:name="_Toc511634308"/>
+      <w:bookmarkStart w:id="54" w:name="_Toc511635204"/>
+      <w:bookmarkStart w:id="55" w:name="_Toc511635265"/>
+      <w:bookmarkStart w:id="56" w:name="_Toc511385089"/>
+      <w:bookmarkStart w:id="57" w:name="_Toc511634309"/>
+      <w:bookmarkStart w:id="58" w:name="_Toc511635205"/>
+      <w:bookmarkStart w:id="59" w:name="_Toc511635266"/>
+      <w:bookmarkStart w:id="60" w:name="_Toc511385090"/>
+      <w:bookmarkStart w:id="61" w:name="_Toc511634310"/>
+      <w:bookmarkStart w:id="62" w:name="_Toc511635206"/>
+      <w:bookmarkStart w:id="63" w:name="_Toc511635267"/>
+      <w:bookmarkStart w:id="64" w:name="_Toc511385091"/>
+      <w:bookmarkStart w:id="65" w:name="_Toc511634311"/>
+      <w:bookmarkStart w:id="66" w:name="_Toc511635207"/>
+      <w:bookmarkStart w:id="67" w:name="_Toc511635268"/>
+      <w:bookmarkStart w:id="68" w:name="_Toc511385092"/>
+      <w:bookmarkStart w:id="69" w:name="_Toc511634312"/>
+      <w:bookmarkStart w:id="70" w:name="_Toc511635208"/>
+      <w:bookmarkStart w:id="71" w:name="_Toc511635269"/>
+      <w:bookmarkStart w:id="72" w:name="_Toc511385093"/>
+      <w:bookmarkStart w:id="73" w:name="_Toc511634313"/>
+      <w:bookmarkStart w:id="74" w:name="_Toc511635209"/>
+      <w:bookmarkStart w:id="75" w:name="_Toc511635270"/>
+      <w:bookmarkStart w:id="76" w:name="_Toc511385094"/>
+      <w:bookmarkStart w:id="77" w:name="_Toc511634314"/>
+      <w:bookmarkStart w:id="78" w:name="_Toc511635210"/>
+      <w:bookmarkStart w:id="79" w:name="_Toc511635271"/>
+      <w:bookmarkStart w:id="80" w:name="_Toc511385095"/>
+      <w:bookmarkStart w:id="81" w:name="_Toc511634315"/>
+      <w:bookmarkStart w:id="82" w:name="_Toc511635211"/>
+      <w:bookmarkStart w:id="83" w:name="_Toc511635272"/>
+      <w:bookmarkStart w:id="84" w:name="_Toc511385096"/>
+      <w:bookmarkStart w:id="85" w:name="_Toc511634316"/>
+      <w:bookmarkStart w:id="86" w:name="_Toc511635212"/>
+      <w:bookmarkStart w:id="87" w:name="_Toc511635273"/>
+      <w:bookmarkStart w:id="88" w:name="_Toc511385097"/>
+      <w:bookmarkStart w:id="89" w:name="_Toc511634317"/>
+      <w:bookmarkStart w:id="90" w:name="_Toc511635213"/>
+      <w:bookmarkStart w:id="91" w:name="_Toc511635274"/>
+      <w:bookmarkStart w:id="92" w:name="_Toc511385098"/>
+      <w:bookmarkStart w:id="93" w:name="_Toc511634318"/>
+      <w:bookmarkStart w:id="94" w:name="_Toc511635214"/>
+      <w:bookmarkStart w:id="95" w:name="_Toc511635275"/>
+      <w:bookmarkStart w:id="96" w:name="_Toc511385099"/>
+      <w:bookmarkStart w:id="97" w:name="_Toc511634319"/>
+      <w:bookmarkStart w:id="98" w:name="_Toc511635215"/>
+      <w:bookmarkStart w:id="99" w:name="_Toc511635276"/>
+      <w:bookmarkStart w:id="100" w:name="_Toc511385100"/>
+      <w:bookmarkStart w:id="101" w:name="_Toc511634320"/>
+      <w:bookmarkStart w:id="102" w:name="_Toc511635216"/>
+      <w:bookmarkStart w:id="103" w:name="_Toc511635277"/>
+      <w:bookmarkStart w:id="104" w:name="_Toc511385101"/>
+      <w:bookmarkStart w:id="105" w:name="_Toc511634321"/>
+      <w:bookmarkStart w:id="106" w:name="_Toc511635217"/>
+      <w:bookmarkStart w:id="107" w:name="_Toc511635278"/>
+      <w:bookmarkStart w:id="108" w:name="_Toc511385102"/>
+      <w:bookmarkStart w:id="109" w:name="_Toc511634322"/>
+      <w:bookmarkStart w:id="110" w:name="_Toc511635218"/>
+      <w:bookmarkStart w:id="111" w:name="_Toc511635279"/>
+      <w:bookmarkStart w:id="112" w:name="_Toc511385103"/>
+      <w:bookmarkStart w:id="113" w:name="_Toc511634323"/>
+      <w:bookmarkStart w:id="114" w:name="_Toc511635219"/>
+      <w:bookmarkStart w:id="115" w:name="_Toc511635280"/>
+      <w:bookmarkStart w:id="116" w:name="_Toc511385104"/>
+      <w:bookmarkStart w:id="117" w:name="_Toc511634324"/>
+      <w:bookmarkStart w:id="118" w:name="_Toc511635220"/>
+      <w:bookmarkStart w:id="119" w:name="_Toc511635281"/>
+      <w:bookmarkStart w:id="120" w:name="_Toc511385105"/>
+      <w:bookmarkStart w:id="121" w:name="_Toc511634325"/>
+      <w:bookmarkStart w:id="122" w:name="_Toc511635221"/>
+      <w:bookmarkStart w:id="123" w:name="_Toc511635282"/>
+      <w:bookmarkStart w:id="124" w:name="_Toc511385106"/>
+      <w:bookmarkStart w:id="125" w:name="_Toc511634326"/>
+      <w:bookmarkStart w:id="126" w:name="_Toc511635222"/>
+      <w:bookmarkStart w:id="127" w:name="_Toc511635283"/>
+      <w:bookmarkStart w:id="128" w:name="_Toc511385107"/>
+      <w:bookmarkStart w:id="129" w:name="_Toc511634327"/>
+      <w:bookmarkStart w:id="130" w:name="_Toc511635223"/>
+      <w:bookmarkStart w:id="131" w:name="_Toc511635284"/>
+      <w:bookmarkStart w:id="132" w:name="_Toc511385108"/>
+      <w:bookmarkStart w:id="133" w:name="_Toc511634328"/>
+      <w:bookmarkStart w:id="134" w:name="_Toc511635224"/>
+      <w:bookmarkStart w:id="135" w:name="_Toc511635285"/>
+      <w:bookmarkStart w:id="136" w:name="_Toc511385109"/>
+      <w:bookmarkStart w:id="137" w:name="_Toc511634329"/>
+      <w:bookmarkStart w:id="138" w:name="_Toc511635225"/>
+      <w:bookmarkStart w:id="139" w:name="_Toc511635286"/>
+      <w:bookmarkStart w:id="140" w:name="_Toc511385110"/>
+      <w:bookmarkStart w:id="141" w:name="_Toc511634330"/>
+      <w:bookmarkStart w:id="142" w:name="_Toc511635226"/>
+      <w:bookmarkStart w:id="143" w:name="_Toc511635287"/>
+      <w:bookmarkStart w:id="144" w:name="_Toc511385111"/>
+      <w:bookmarkStart w:id="145" w:name="_Toc511634331"/>
+      <w:bookmarkStart w:id="146" w:name="_Toc511635227"/>
+      <w:bookmarkStart w:id="147" w:name="_Toc511635288"/>
+      <w:bookmarkStart w:id="148" w:name="_Toc511635289"/>
+      <w:bookmarkEnd w:id="40"/>
+      <w:bookmarkEnd w:id="41"/>
+      <w:bookmarkEnd w:id="42"/>
+      <w:bookmarkEnd w:id="43"/>
+      <w:bookmarkEnd w:id="44"/>
+      <w:bookmarkEnd w:id="45"/>
+      <w:bookmarkEnd w:id="46"/>
+      <w:bookmarkEnd w:id="47"/>
+      <w:bookmarkEnd w:id="48"/>
+      <w:bookmarkEnd w:id="49"/>
+      <w:bookmarkEnd w:id="50"/>
+      <w:bookmarkEnd w:id="51"/>
+      <w:bookmarkEnd w:id="52"/>
+      <w:bookmarkEnd w:id="53"/>
+      <w:bookmarkEnd w:id="54"/>
+      <w:bookmarkEnd w:id="55"/>
+      <w:bookmarkEnd w:id="56"/>
+      <w:bookmarkEnd w:id="57"/>
+      <w:bookmarkEnd w:id="58"/>
+      <w:bookmarkEnd w:id="59"/>
+      <w:bookmarkEnd w:id="60"/>
+      <w:bookmarkEnd w:id="61"/>
+      <w:bookmarkEnd w:id="62"/>
+      <w:bookmarkEnd w:id="63"/>
+      <w:bookmarkEnd w:id="64"/>
+      <w:bookmarkEnd w:id="65"/>
+      <w:bookmarkEnd w:id="66"/>
+      <w:bookmarkEnd w:id="67"/>
+      <w:bookmarkEnd w:id="68"/>
+      <w:bookmarkEnd w:id="69"/>
+      <w:bookmarkEnd w:id="70"/>
+      <w:bookmarkEnd w:id="71"/>
+      <w:bookmarkEnd w:id="72"/>
+      <w:bookmarkEnd w:id="73"/>
+      <w:bookmarkEnd w:id="74"/>
+      <w:bookmarkEnd w:id="75"/>
+      <w:bookmarkEnd w:id="76"/>
+      <w:bookmarkEnd w:id="77"/>
+      <w:bookmarkEnd w:id="78"/>
+      <w:bookmarkEnd w:id="79"/>
+      <w:bookmarkEnd w:id="80"/>
+      <w:bookmarkEnd w:id="81"/>
+      <w:bookmarkEnd w:id="82"/>
+      <w:bookmarkEnd w:id="83"/>
+      <w:bookmarkEnd w:id="84"/>
+      <w:bookmarkEnd w:id="85"/>
+      <w:bookmarkEnd w:id="86"/>
+      <w:bookmarkEnd w:id="87"/>
+      <w:bookmarkEnd w:id="88"/>
+      <w:bookmarkEnd w:id="89"/>
+      <w:bookmarkEnd w:id="90"/>
+      <w:bookmarkEnd w:id="91"/>
+      <w:bookmarkEnd w:id="92"/>
+      <w:bookmarkEnd w:id="93"/>
+      <w:bookmarkEnd w:id="94"/>
+      <w:bookmarkEnd w:id="95"/>
+      <w:bookmarkEnd w:id="96"/>
+      <w:bookmarkEnd w:id="97"/>
+      <w:bookmarkEnd w:id="98"/>
+      <w:bookmarkEnd w:id="99"/>
+      <w:bookmarkEnd w:id="100"/>
+      <w:bookmarkEnd w:id="101"/>
+      <w:bookmarkEnd w:id="102"/>
+      <w:bookmarkEnd w:id="103"/>
+      <w:bookmarkEnd w:id="104"/>
+      <w:bookmarkEnd w:id="105"/>
+      <w:bookmarkEnd w:id="106"/>
+      <w:bookmarkEnd w:id="107"/>
+      <w:bookmarkEnd w:id="108"/>
+      <w:bookmarkEnd w:id="109"/>
+      <w:bookmarkEnd w:id="110"/>
+      <w:bookmarkEnd w:id="111"/>
+      <w:bookmarkEnd w:id="112"/>
+      <w:bookmarkEnd w:id="113"/>
+      <w:bookmarkEnd w:id="114"/>
+      <w:bookmarkEnd w:id="115"/>
+      <w:bookmarkEnd w:id="116"/>
+      <w:bookmarkEnd w:id="117"/>
+      <w:bookmarkEnd w:id="118"/>
+      <w:bookmarkEnd w:id="119"/>
+      <w:bookmarkEnd w:id="120"/>
+      <w:bookmarkEnd w:id="121"/>
+      <w:bookmarkEnd w:id="122"/>
+      <w:bookmarkEnd w:id="123"/>
+      <w:bookmarkEnd w:id="124"/>
+      <w:bookmarkEnd w:id="125"/>
+      <w:bookmarkEnd w:id="126"/>
+      <w:bookmarkEnd w:id="127"/>
+      <w:bookmarkEnd w:id="128"/>
+      <w:bookmarkEnd w:id="129"/>
+      <w:bookmarkEnd w:id="130"/>
+      <w:bookmarkEnd w:id="131"/>
+      <w:bookmarkEnd w:id="132"/>
+      <w:bookmarkEnd w:id="133"/>
+      <w:bookmarkEnd w:id="134"/>
+      <w:bookmarkEnd w:id="135"/>
+      <w:bookmarkEnd w:id="136"/>
+      <w:bookmarkEnd w:id="137"/>
+      <w:bookmarkEnd w:id="138"/>
+      <w:bookmarkEnd w:id="139"/>
+      <w:bookmarkEnd w:id="140"/>
+      <w:bookmarkEnd w:id="141"/>
+      <w:bookmarkEnd w:id="142"/>
+      <w:bookmarkEnd w:id="143"/>
+      <w:bookmarkEnd w:id="144"/>
+      <w:bookmarkEnd w:id="145"/>
+      <w:bookmarkEnd w:id="146"/>
+      <w:bookmarkEnd w:id="147"/>
+      <w:r>
+        <w:t>Model First and Data First Usage</w:t>
+      </w:r>
+      <w:bookmarkEnd w:id="148"/>
     </w:p>
     <w:p>
       <w:pPr>
@@ -7915,34 +8459,40 @@
         <w:rPr>
           <w:rStyle w:val="EDBTXTEmphasisNormalWebBoldBlackCharChar"/>
         </w:rPr>
-        <w:t>Step 1:</w:t>
-      </w:r>
-      <w:r>
-        <w:t xml:space="preserve"> Install EDBDdexProvider with the </w:t>
-      </w:r>
-      <w:r>
-        <w:rPr>
-          <w:rStyle w:val="EDBTXTKeywordBlack"/>
-        </w:rPr>
-        <w:t>EDBDdexProvider</w:t>
-      </w:r>
-      <w:r>
-        <w:rPr>
-          <w:rStyle w:val="EDBTXTKeywordBlack"/>
-        </w:rPr>
-        <w:t>.</w:t>
-      </w:r>
-      <w:r>
-        <w:rPr>
-          <w:rStyle w:val="EDBTXTKeywordBlack"/>
-        </w:rPr>
-        <w:t>vsix</w:t>
-      </w:r>
-      <w:r>
-        <w:t xml:space="preserve"> installer</w:t>
-      </w:r>
-      <w:r>
-        <w:t xml:space="preserve"> at the following location:</w:t>
+        <w:t>Step 1</w:t>
+      </w:r>
+      <w:r>
+        <w:rPr>
+          <w:rStyle w:val="EDBTXTEmphasisNormalWebBoldBlackCharChar"/>
+        </w:rPr>
+        <w:t>:</w:t>
+      </w:r>
+      <w:r>
+        <w:t xml:space="preserve"> Place the DDL generation template </w:t>
+      </w:r>
+      <w:r>
+        <w:rPr>
+          <w:rStyle w:val="EDBTXTKeywordBlack"/>
+        </w:rPr>
+        <w:t>SSDLToPgSQL.tt</w:t>
+      </w:r>
+      <w:r>
+        <w:t xml:space="preserve"> in the </w:t>
+      </w:r>
+      <w:r>
+        <w:t xml:space="preserve">Visual Studio </w:t>
+      </w:r>
+      <w:r>
+        <w:rPr>
+          <w:rStyle w:val="EDBTXTKeywordBlack"/>
+        </w:rPr>
+        <w:t>EntityFramework Tools\DBGen\</w:t>
+      </w:r>
+      <w:r>
+        <w:t xml:space="preserve"> folder</w:t>
+      </w:r>
+      <w:r>
+        <w:t xml:space="preserve"> as in the following example:</w:t>
       </w:r>
     </w:p>
     <w:p>
@@ -7950,19 +8500,7 @@
         <w:pStyle w:val="EDBSYNTXPreformattedBlackLeft033"/>
       </w:pPr>
       <w:r>
-        <w:t xml:space="preserve">C:\Program </w:t>
-      </w:r>
-      <w:r>
-        <w:t>Files\edb\connectors\dotnet\</w:t>
-      </w:r>
-      <w:r>
-        <w:rPr>
-          <w:rStyle w:val="EDBTXTKeywordBlack"/>
-        </w:rPr>
-        <w:t>DdexProvider</w:t>
-      </w:r>
-      <w:r>
-        <w:t>\</w:t>
+        <w:t>C:\Program Files (x86)\Microsoft Visual Studio 14.0\</w:t>
       </w:r>
     </w:p>
     <w:p>
@@ -7970,7 +8508,7 @@
         <w:pStyle w:val="EDBSYNTXPreformattedBlackLeft033"/>
       </w:pPr>
       <w:r>
-        <w:t>EDBDdexProvider.vsix</w:t>
+        <w:t>Common7\IDE\Extensions\Microsoft\EntityFramework Tools\DBGen\</w:t>
       </w:r>
     </w:p>
     <w:p>
@@ -7981,6 +8519,29 @@
         <w:rPr>
           <w:rStyle w:val="EDBTXTEmphasisNormalWebBoldBlackCharChar"/>
         </w:rPr>
+        <w:t>Note:</w:t>
+      </w:r>
+      <w:r>
+        <w:t xml:space="preserve"> Select this template </w:t>
+      </w:r>
+      <w:r>
+        <w:rPr>
+          <w:rStyle w:val="EDBTXTKeywordBlack"/>
+        </w:rPr>
+        <w:t>SSDLToPgSQL.tt</w:t>
+      </w:r>
+      <w:r>
+        <w:t xml:space="preserve"> in your EDMX file properties.</w:t>
+      </w:r>
+    </w:p>
+    <w:p>
+      <w:pPr>
+        <w:pStyle w:val="EDBTXTNormalWebBlackCharChar0"/>
+      </w:pPr>
+      <w:r>
+        <w:rPr>
+          <w:rStyle w:val="EDBTXTEmphasisNormalWebBoldBlackCharChar"/>
+        </w:rPr>
         <w:t xml:space="preserve">Step </w:t>
       </w:r>
       <w:r>
@@ -7996,117 +8557,66 @@
         <w:t>:</w:t>
       </w:r>
       <w:r>
-        <w:t xml:space="preserve"> Add the following assemblies in the global assembly cache (GAC) with the </w:t>
-      </w:r>
-      <w:r>
-        <w:rPr>
-          <w:rStyle w:val="EDBTXTKeywordBlack"/>
-        </w:rPr>
-        <w:t>gacutil</w:t>
-      </w:r>
-      <w:r>
-        <w:t xml:space="preserve"> utility usin</w:t>
-      </w:r>
-      <w:r>
-        <w:t xml:space="preserve">g the Visual Studio Developers Command </w:t>
-      </w:r>
-      <w:r>
-        <w:t>l</w:t>
-      </w:r>
-      <w:r>
-        <w:t>ine:</w:t>
-      </w:r>
-    </w:p>
-    <w:p>
-      <w:pPr>
-        <w:pStyle w:val="EDBTXTNormalWebBlackCharChar1"/>
-        <w:numPr>
-          <w:ilvl w:val="0"/>
-          <w:numId w:val="2"/>
-        </w:numPr>
-        <w:spacing w:before="0" w:after="0"/>
-        <w:rPr>
-          <w:rStyle w:val="EDBTXTKeywordBlack"/>
-        </w:rPr>
-      </w:pPr>
+        <w:t xml:space="preserve"> Add files </w:t>
+      </w:r>
       <w:r>
         <w:rPr>
           <w:rStyle w:val="EDBTXTKeywordBlack"/>
         </w:rPr>
         <w:t>EnterpriseDB.EDBClient.dll</w:t>
       </w:r>
-    </w:p>
-    <w:p>
-      <w:pPr>
-        <w:pStyle w:val="EDBTXTNormalWebBlackCharChar1"/>
-        <w:numPr>
-          <w:ilvl w:val="0"/>
-          <w:numId w:val="2"/>
-        </w:numPr>
-        <w:spacing w:before="0" w:after="0"/>
-        <w:rPr>
-          <w:rStyle w:val="EDBTXTKeywordBlack"/>
-        </w:rPr>
-      </w:pPr>
-      <w:r>
-        <w:rPr>
-          <w:rStyle w:val="EDBTXTKeywordBlack"/>
-        </w:rPr>
-        <w:t>EntityFramework5.EnterpriseDB.EDBClient.dll</w:t>
-      </w:r>
-    </w:p>
-    <w:p>
-      <w:pPr>
-        <w:pStyle w:val="EDBTXTNormalWebBlackCharChar1"/>
-        <w:numPr>
-          <w:ilvl w:val="0"/>
-          <w:numId w:val="2"/>
-        </w:numPr>
-        <w:spacing w:before="0" w:after="0"/>
-        <w:rPr>
-          <w:rStyle w:val="EDBTXTKeywordBlack"/>
-        </w:rPr>
-      </w:pPr>
+      <w:r>
+        <w:t xml:space="preserve"> and </w:t>
+      </w:r>
       <w:r>
         <w:rPr>
           <w:rStyle w:val="EDBTXTKeywordBlack"/>
         </w:rPr>
         <w:t>EntityFramework6.EnterpriseDB.EDBClient.dll</w:t>
       </w:r>
-    </w:p>
-    <w:p>
-      <w:pPr>
-        <w:pStyle w:val="EDBTXTNormalWebBlackCharChar1"/>
-        <w:numPr>
-          <w:ilvl w:val="0"/>
-          <w:numId w:val="2"/>
-        </w:numPr>
-        <w:spacing w:before="0" w:after="0"/>
-        <w:rPr>
-          <w:rStyle w:val="EDBTXTKeywordBlack"/>
-        </w:rPr>
-      </w:pPr>
-      <w:r>
-        <w:rPr>
-          <w:rStyle w:val="EDBTXTKeywordBlack"/>
-        </w:rPr>
-        <w:t>System.Threading.Tasks.Extensions.dll</w:t>
-      </w:r>
-    </w:p>
-    <w:p>
-      <w:pPr>
-        <w:pStyle w:val="EDBTXTNormalWebBlackCharChar0"/>
-      </w:pPr>
-      <w:r>
-        <w:t>For example:</w:t>
-      </w:r>
-    </w:p>
-    <w:p>
-      <w:pPr>
-        <w:pStyle w:val="EDBEXCourierNew9ptCustomColorRGB4649146Left01"/>
-      </w:pPr>
-      <w:r>
-        <w:t>&gt; gacutil.exe /i EnterpriseDB.EDBClient.dll</w:t>
+      <w:r>
+        <w:t xml:space="preserve"> in project references.</w:t>
+      </w:r>
+      <w:r>
+        <w:t xml:space="preserve"> See Section </w:t>
+      </w:r>
+      <w:r>
+        <w:rPr>
+          <w:u w:val="single"/>
+        </w:rPr>
+        <w:fldChar w:fldCharType="begin"/>
+      </w:r>
+      <w:r>
+        <w:rPr>
+          <w:u w:val="single"/>
+        </w:rPr>
+        <w:instrText xml:space="preserve"> REF _Ref477525249 \r \h </w:instrText>
+      </w:r>
+      <w:r>
+        <w:rPr>
+          <w:u w:val="single"/>
+        </w:rPr>
+      </w:r>
+      <w:r>
+        <w:rPr>
+          <w:u w:val="single"/>
+        </w:rPr>
+        <w:fldChar w:fldCharType="separate"/>
+      </w:r>
+      <w:r>
+        <w:rPr>
+          <w:u w:val="single"/>
+        </w:rPr>
+        <w:t>3.1</w:t>
+      </w:r>
+      <w:r>
+        <w:rPr>
+          <w:u w:val="single"/>
+        </w:rPr>
+        <w:fldChar w:fldCharType="end"/>
+      </w:r>
+      <w:r>
+        <w:t xml:space="preserve"> for information on referencing library files.</w:t>
       </w:r>
     </w:p>
     <w:p>
@@ -8132,25 +8642,16 @@
         <w:t>:</w:t>
       </w:r>
       <w:r>
-        <w:t xml:space="preserve"> Add the </w:t>
-      </w:r>
-      <w:r>
-        <w:rPr>
-          <w:rStyle w:val="EDBTXTKeywordBlack"/>
-        </w:rPr>
-        <w:t>&lt;DbProviderFactories&gt;</w:t>
-      </w:r>
-      <w:r>
-        <w:t xml:space="preserve"> entries for the ADO.NET driver of EDB Postgres in the </w:t>
-      </w:r>
-      <w:r>
-        <w:rPr>
-          <w:rStyle w:val="EDBTXTKeywordBlack"/>
-        </w:rPr>
-        <w:t>machine.config</w:t>
-      </w:r>
-      <w:r>
-        <w:t xml:space="preserve"> file. The following are the entries:</w:t>
+        <w:t xml:space="preserve"> In the project’s </w:t>
+      </w:r>
+      <w:r>
+        <w:rPr>
+          <w:rStyle w:val="EDBTXTKeywordBlack"/>
+        </w:rPr>
+        <w:t>app.config</w:t>
+      </w:r>
+      <w:r>
+        <w:t xml:space="preserve"> file add the following entry for provider services under the EntityFramework/providers tag.</w:t>
       </w:r>
     </w:p>
     <w:p>
@@ -8158,7 +8659,11 @@
         <w:pStyle w:val="EDBSYNTXPreformattedBlackLeft033"/>
       </w:pPr>
       <w:r>
-        <w:t>&lt;add name="EnterpriseDB.EDBClient"</w:t>
+        <w:lastRenderedPageBreak/>
+        <w:t>&lt;provider invaria</w:t>
+      </w:r>
+      <w:r>
+        <w:t>ntName="EnterpriseDB.EDBClient"</w:t>
       </w:r>
     </w:p>
     <w:p>
@@ -8170,11 +8675,11 @@
       </w:r>
       <w:proofErr w:type="gramStart"/>
       <w:r>
-        <w:t>invariant</w:t>
+        <w:t>type</w:t>
       </w:r>
       <w:proofErr w:type="gramEnd"/>
       <w:r>
-        <w:t>="EnterpriseDB.EDBClient"</w:t>
+        <w:t>="EnterpriseDB.EDBClient.EDBServices, EntityFramework6.EnterpriseDB.EDBClient"&gt;</w:t>
       </w:r>
     </w:p>
     <w:p>
@@ -8182,550 +8687,244 @@
         <w:pStyle w:val="EDBSYNTXPreformattedBlackLeft033"/>
       </w:pPr>
       <w:r>
-        <w:t xml:space="preserve">  </w:t>
-      </w:r>
+        <w:t>&lt;/provider&gt;</w:t>
+      </w:r>
+    </w:p>
+    <w:p>
+      <w:pPr>
+        <w:pStyle w:val="EDBTXTNormalWebBlackCharChar0"/>
+      </w:pPr>
+      <w:r>
+        <w:t xml:space="preserve">The following is an example of the </w:t>
+      </w:r>
+      <w:r>
+        <w:rPr>
+          <w:rStyle w:val="EDBTXTKeywordBlack"/>
+        </w:rPr>
+        <w:t>app.config</w:t>
+      </w:r>
+      <w:r>
+        <w:t xml:space="preserve"> file.</w:t>
+      </w:r>
+    </w:p>
+    <w:p>
+      <w:pPr>
+        <w:pStyle w:val="EDBEXCourierNew9ptCustomColorRGB4649146Left01"/>
+        <w:rPr>
+          <w:sz w:val="16"/>
+        </w:rPr>
+      </w:pPr>
       <w:proofErr w:type="gramStart"/>
       <w:r>
-        <w:t>description</w:t>
+        <w:rPr>
+          <w:sz w:val="16"/>
+        </w:rPr>
+        <w:t>&lt;?xml</w:t>
       </w:r>
       <w:proofErr w:type="gramEnd"/>
       <w:r>
-        <w:t>=".NET Data Provider for EnterpriseDB PostgreSQL”</w:t>
-      </w:r>
-    </w:p>
-    <w:p>
-      <w:pPr>
-        <w:pStyle w:val="EDBSYNTXPreformattedBlackLeft033"/>
-      </w:pPr>
-      <w:r>
-        <w:t xml:space="preserve">  </w:t>
+        <w:rPr>
+          <w:sz w:val="16"/>
+        </w:rPr>
+        <w:t xml:space="preserve"> version="1.0" encoding="utf-8" ?&gt;</w:t>
+      </w:r>
+    </w:p>
+    <w:p>
+      <w:pPr>
+        <w:pStyle w:val="EDBEXCourierNew9ptCustomColorRGB4649146Left01"/>
+        <w:rPr>
+          <w:sz w:val="16"/>
+        </w:rPr>
+      </w:pPr>
+      <w:r>
+        <w:rPr>
+          <w:sz w:val="16"/>
+        </w:rPr>
+        <w:t>&lt;</w:t>
       </w:r>
       <w:proofErr w:type="gramStart"/>
       <w:r>
-        <w:t>type</w:t>
+        <w:rPr>
+          <w:sz w:val="16"/>
+        </w:rPr>
+        <w:t>configuration</w:t>
       </w:r>
       <w:proofErr w:type="gramEnd"/>
       <w:r>
-        <w:t>="EnterpriseDB.EDBClient.EDBFactory, EnterpriseDB.EDBClient, Version=3.</w:t>
-      </w:r>
-      <w:r>
-        <w:t>2</w:t>
-      </w:r>
-      <w:r>
-        <w:t>.</w:t>
-      </w:r>
-      <w:r>
-        <w:t>6</w:t>
-      </w:r>
-      <w:r>
-        <w:t>.</w:t>
-      </w:r>
-      <w:r>
-        <w:t>1</w:t>
-      </w:r>
-      <w:r>
-        <w:t>, Culture=neutral, PublicKeyToken=5d8b90d52f46fda7"</w:t>
-      </w:r>
-    </w:p>
-    <w:p>
-      <w:pPr>
-        <w:pStyle w:val="EDBSYNTXPreformattedBlackLeft033"/>
-      </w:pPr>
-      <w:r>
-        <w:t xml:space="preserve">  </w:t>
+        <w:rPr>
+          <w:sz w:val="16"/>
+        </w:rPr>
+        <w:t>&gt;</w:t>
+      </w:r>
+    </w:p>
+    <w:p>
+      <w:pPr>
+        <w:pStyle w:val="EDBEXCourierNew9ptCustomColorRGB4649146Left01"/>
+        <w:rPr>
+          <w:sz w:val="16"/>
+        </w:rPr>
+      </w:pPr>
+      <w:r>
+        <w:rPr>
+          <w:sz w:val="16"/>
+        </w:rPr>
+        <w:t xml:space="preserve">  &lt;</w:t>
       </w:r>
       <w:proofErr w:type="gramStart"/>
       <w:r>
-        <w:t>support</w:t>
+        <w:rPr>
+          <w:sz w:val="16"/>
+        </w:rPr>
+        <w:t>configSections</w:t>
       </w:r>
       <w:proofErr w:type="gramEnd"/>
       <w:r>
-        <w:t>="FF"/&gt;</w:t>
-      </w:r>
-    </w:p>
-    <w:p>
-      <w:pPr>
-        <w:pStyle w:val="EDBTXTNormalWebBlackCharChar0"/>
-      </w:pPr>
-      <w:r>
-        <w:rPr>
-          <w:rStyle w:val="EDBTXTEmphasisNormalWebBoldBlackCharChar"/>
-        </w:rPr>
-        <w:lastRenderedPageBreak/>
-        <w:t>Note:</w:t>
-      </w:r>
-      <w:r>
-        <w:t xml:space="preserve"> For the attribute-value pairs, the double-quoted strings should not contain excess white space characters, but be configured on a single line. The examples shown in this section may be split on multiple lines for clarity, but should actually be configured within a single line such as the following:</w:t>
-      </w:r>
-    </w:p>
-    <w:p>
-      <w:pPr>
-        <w:pStyle w:val="EDBTXTNormalWebBlackCharChar0"/>
-        <w:rPr>
-          <w:rStyle w:val="EDBTXTKeywordBlack"/>
-        </w:rPr>
-      </w:pPr>
+        <w:rPr>
+          <w:sz w:val="16"/>
+        </w:rPr>
+        <w:t>&gt;</w:t>
+      </w:r>
+    </w:p>
+    <w:p>
+      <w:pPr>
+        <w:pStyle w:val="EDBEXCourierNew9ptCustomColorRGB4649146Left01"/>
+        <w:rPr>
+          <w:sz w:val="16"/>
+        </w:rPr>
+      </w:pPr>
+      <w:r>
+        <w:rPr>
+          <w:sz w:val="16"/>
+        </w:rPr>
+        <w:t xml:space="preserve">    &lt;section name="entityFramework" type="System.Data.Entity.Internal.ConfigFile.EntityFrameworkSection, EntityFramework, Version=6.0.0.0, Culture=neutral, PublicKeyToken=b77a5c561934e089" requirePermission="false"/&gt;</w:t>
+      </w:r>
+    </w:p>
+    <w:p>
+      <w:pPr>
+        <w:pStyle w:val="EDBEXCourierNew9ptCustomColorRGB4649146Left01"/>
+        <w:rPr>
+          <w:sz w:val="16"/>
+        </w:rPr>
+      </w:pPr>
+      <w:r>
+        <w:rPr>
+          <w:sz w:val="16"/>
+        </w:rPr>
+        <w:t xml:space="preserve">  &lt;/configSections&gt;</w:t>
+      </w:r>
+    </w:p>
+    <w:p>
+      <w:pPr>
+        <w:pStyle w:val="EDBEXCourierNew9ptCustomColorRGB4649146Left01"/>
+        <w:rPr>
+          <w:sz w:val="16"/>
+        </w:rPr>
+      </w:pPr>
+    </w:p>
+    <w:p>
+      <w:pPr>
+        <w:pStyle w:val="EDBEXCourierNew9ptCustomColorRGB4649146Left01"/>
+        <w:rPr>
+          <w:sz w:val="16"/>
+        </w:rPr>
+      </w:pPr>
+      <w:r>
+        <w:rPr>
+          <w:sz w:val="16"/>
+        </w:rPr>
+        <w:t xml:space="preserve">    &lt;</w:t>
+      </w:r>
       <w:proofErr w:type="gramStart"/>
       <w:r>
         <w:rPr>
-          <w:rStyle w:val="EDBTXTKeywordBlack"/>
-        </w:rPr>
-        <w:t>description</w:t>
+          <w:sz w:val="16"/>
+        </w:rPr>
+        <w:t>startup</w:t>
       </w:r>
       <w:proofErr w:type="gramEnd"/>
       <w:r>
         <w:rPr>
-          <w:rStyle w:val="EDBTXTKeywordBlack"/>
-        </w:rPr>
-        <w:t>=".NET Data Provider for EnterpriseDB PostgreSQL”</w:t>
-      </w:r>
-    </w:p>
-    <w:p>
-      <w:pPr>
-        <w:pStyle w:val="EDBTXTNormalWebBlackCharChar0"/>
-      </w:pPr>
-      <w:r>
-        <w:t xml:space="preserve">For 64-bit Windows, the </w:t>
-      </w:r>
-      <w:r>
-        <w:rPr>
-          <w:rStyle w:val="EDBTXTKeywordBlack"/>
-        </w:rPr>
-        <w:t>machine.config</w:t>
-      </w:r>
-      <w:r>
-        <w:t xml:space="preserve"> file is in the following location:</w:t>
-      </w:r>
-    </w:p>
-    <w:p>
-      <w:pPr>
-        <w:pStyle w:val="EDBSYNTXPreformattedBlackLeft033"/>
-      </w:pPr>
-      <w:r>
-        <w:t>C:\Windows\Microsoft.NET\Framework64\v4.0.30319\</w:t>
-      </w:r>
-    </w:p>
-    <w:p>
-      <w:pPr>
-        <w:pStyle w:val="EDBSYNTXPreformattedBlackLeft033"/>
-      </w:pPr>
-      <w:r>
-        <w:t>Config</w:t>
-      </w:r>
-      <w:r>
-        <w:t>\machine.config</w:t>
-      </w:r>
-    </w:p>
-    <w:p>
-      <w:pPr>
-        <w:pStyle w:val="EDBTXTNormalWebBlackCharChar0"/>
-      </w:pPr>
-      <w:r>
-        <w:t xml:space="preserve">For 32-bit Windows, the </w:t>
-      </w:r>
-      <w:r>
-        <w:rPr>
-          <w:rStyle w:val="EDBTXTKeywordBlack"/>
-        </w:rPr>
-        <w:t>machine.config</w:t>
-      </w:r>
-      <w:r>
-        <w:t xml:space="preserve"> file is in the following location:</w:t>
-      </w:r>
-    </w:p>
-    <w:p>
-      <w:pPr>
-        <w:pStyle w:val="EDBSYNTXPreformattedBlackLeft033"/>
-      </w:pPr>
-      <w:r>
-        <w:t>C:\Windows\Microsoft.NET\Framework\v4.0.30319\</w:t>
-      </w:r>
-    </w:p>
-    <w:p>
-      <w:pPr>
-        <w:pStyle w:val="EDBSYNTXPreformattedBlackLeft033"/>
-      </w:pPr>
-      <w:r>
-        <w:t>Config</w:t>
-      </w:r>
-      <w:r>
-        <w:t>\machine.config</w:t>
-      </w:r>
-    </w:p>
-    <w:p>
-      <w:pPr>
-        <w:pStyle w:val="EDBTXTNormalWebBlackCharChar0"/>
-      </w:pPr>
-      <w:r>
-        <w:rPr>
-          <w:rStyle w:val="EDBTXTEmphasisNormalWebBoldBlackCharChar"/>
-        </w:rPr>
-        <w:t xml:space="preserve">Step </w:t>
-      </w:r>
-      <w:r>
-        <w:rPr>
-          <w:rStyle w:val="EDBTXTEmphasisNormalWebBoldBlackCharChar"/>
-        </w:rPr>
-        <w:t>4</w:t>
-      </w:r>
-      <w:r>
-        <w:rPr>
-          <w:rStyle w:val="EDBTXTEmphasisNormalWebBoldBlackCharChar"/>
-        </w:rPr>
-        <w:t>:</w:t>
-      </w:r>
-      <w:r>
-        <w:t xml:space="preserve"> Relaunch Visual Studio and verify from </w:t>
-      </w:r>
-      <w:r>
-        <w:rPr>
-          <w:rStyle w:val="EDBTXTKeywordBlack"/>
-        </w:rPr>
-        <w:t>Tools &gt; Extentions and Updates</w:t>
-      </w:r>
-      <w:r>
-        <w:t>… menu that the EDBDdexProvider extension is installed.</w:t>
-      </w:r>
-    </w:p>
-    <w:p>
-      <w:pPr>
-        <w:pStyle w:val="EDBTXTNormalWebBlackCharChar0"/>
-      </w:pPr>
-      <w:r>
-        <w:rPr>
-          <w:rStyle w:val="EDBTXTEmphasisNormalWebBoldBlackCharChar"/>
-        </w:rPr>
-        <w:t xml:space="preserve">Step </w:t>
-      </w:r>
-      <w:r>
-        <w:rPr>
-          <w:rStyle w:val="EDBTXTEmphasisNormalWebBoldBlackCharChar"/>
-        </w:rPr>
-        <w:t>5</w:t>
-      </w:r>
-      <w:r>
-        <w:rPr>
-          <w:rStyle w:val="EDBTXTEmphasisNormalWebBoldBlackCharChar"/>
-        </w:rPr>
-        <w:t>:</w:t>
-      </w:r>
-      <w:r>
-        <w:t xml:space="preserve"> From Server Explorer, right-click on </w:t>
-      </w:r>
-      <w:r>
-        <w:rPr>
-          <w:rStyle w:val="EDBTXTKeywordBlack"/>
-        </w:rPr>
-        <w:t>Data Connections</w:t>
-      </w:r>
-      <w:r>
-        <w:t xml:space="preserve">, click </w:t>
-      </w:r>
-      <w:r>
-        <w:rPr>
-          <w:rStyle w:val="EDBTXTKeywordBlack"/>
-        </w:rPr>
-        <w:t>Add Connection</w:t>
-      </w:r>
-      <w:r>
-        <w:t xml:space="preserve">, and verify the </w:t>
-      </w:r>
-      <w:r>
-        <w:rPr>
-          <w:rStyle w:val="EDBTXTKeywordBlack"/>
-        </w:rPr>
-        <w:t>Enterprisedb Postgres Database</w:t>
-      </w:r>
-      <w:r>
-        <w:t xml:space="preserve"> data source is available.</w:t>
-      </w:r>
-    </w:p>
-    <w:p>
-      <w:pPr>
-        <w:pStyle w:val="Heading3"/>
-      </w:pPr>
-      <w:bookmarkStart w:id="39" w:name="_Toc509323282"/>
-      <w:r>
-        <w:t>Model First and Data First Usage</w:t>
-      </w:r>
-      <w:bookmarkEnd w:id="39"/>
-    </w:p>
-    <w:p>
-      <w:pPr>
-        <w:pStyle w:val="EDBTXTNormalWebBlackCharChar0"/>
-      </w:pPr>
-      <w:r>
-        <w:rPr>
-          <w:rStyle w:val="EDBTXTEmphasisNormalWebBoldBlackCharChar"/>
-        </w:rPr>
-        <w:t>Step 1</w:t>
-      </w:r>
-      <w:r>
-        <w:rPr>
-          <w:rStyle w:val="EDBTXTEmphasisNormalWebBoldBlackCharChar"/>
-        </w:rPr>
-        <w:t>:</w:t>
-      </w:r>
-      <w:r>
-        <w:t xml:space="preserve"> Place the DDL generation template </w:t>
-      </w:r>
-      <w:r>
-        <w:rPr>
-          <w:rStyle w:val="EDBTXTKeywordBlack"/>
-        </w:rPr>
-        <w:t>SSDLToPgSQL.tt</w:t>
-      </w:r>
-      <w:r>
-        <w:t xml:space="preserve"> in the </w:t>
-      </w:r>
-      <w:r>
-        <w:t xml:space="preserve">Visual Studio </w:t>
-      </w:r>
-      <w:r>
-        <w:rPr>
-          <w:rStyle w:val="EDBTXTKeywordBlack"/>
-        </w:rPr>
-        <w:t>EntityFramework Tools\DBGen\</w:t>
-      </w:r>
-      <w:r>
-        <w:t xml:space="preserve"> folder</w:t>
-      </w:r>
-      <w:r>
-        <w:t xml:space="preserve"> as in the following example:</w:t>
-      </w:r>
-    </w:p>
-    <w:p>
-      <w:pPr>
-        <w:pStyle w:val="EDBSYNTXPreformattedBlackLeft033"/>
-      </w:pPr>
-      <w:r>
-        <w:t>C:\Program Files (x86)\Microsoft Visual Studio 14.0\</w:t>
-      </w:r>
-    </w:p>
-    <w:p>
-      <w:pPr>
-        <w:pStyle w:val="EDBSYNTXPreformattedBlackLeft033"/>
-      </w:pPr>
-      <w:r>
-        <w:t>Common7\IDE\Extensions\Microsoft\EntityFramework Tools\DBGen\</w:t>
-      </w:r>
-    </w:p>
-    <w:p>
-      <w:pPr>
-        <w:pStyle w:val="EDBTXTNormalWebBlackCharChar0"/>
-      </w:pPr>
-      <w:r>
-        <w:rPr>
-          <w:rStyle w:val="EDBTXTEmphasisNormalWebBoldBlackCharChar"/>
-        </w:rPr>
-        <w:t>Note:</w:t>
-      </w:r>
-      <w:r>
-        <w:t xml:space="preserve"> Select this template </w:t>
-      </w:r>
-      <w:r>
-        <w:rPr>
-          <w:rStyle w:val="EDBTXTKeywordBlack"/>
-        </w:rPr>
-        <w:t>SSDLToPgSQL.tt</w:t>
-      </w:r>
-      <w:r>
-        <w:t xml:space="preserve"> in your EDMX file properties.</w:t>
-      </w:r>
-    </w:p>
-    <w:p>
-      <w:pPr>
-        <w:pStyle w:val="EDBTXTNormalWebBlackCharChar0"/>
-      </w:pPr>
-      <w:r>
-        <w:rPr>
-          <w:rStyle w:val="EDBTXTEmphasisNormalWebBoldBlackCharChar"/>
-        </w:rPr>
-        <w:t xml:space="preserve">Step </w:t>
-      </w:r>
-      <w:r>
-        <w:rPr>
-          <w:rStyle w:val="EDBTXTEmphasisNormalWebBoldBlackCharChar"/>
-        </w:rPr>
-        <w:t>2</w:t>
-      </w:r>
-      <w:r>
-        <w:rPr>
-          <w:rStyle w:val="EDBTXTEmphasisNormalWebBoldBlackCharChar"/>
-        </w:rPr>
-        <w:t>:</w:t>
-      </w:r>
-      <w:r>
-        <w:t xml:space="preserve"> Add files </w:t>
-      </w:r>
-      <w:r>
-        <w:rPr>
-          <w:rStyle w:val="EDBTXTKeywordBlack"/>
-        </w:rPr>
-        <w:t>EnterpriseDB.EDBClient.dll</w:t>
-      </w:r>
-      <w:r>
-        <w:t xml:space="preserve"> and </w:t>
-      </w:r>
-      <w:r>
-        <w:rPr>
-          <w:rStyle w:val="EDBTXTKeywordBlack"/>
-        </w:rPr>
-        <w:t>EntityFramework6.EnterpriseDB.EDBClient.dll</w:t>
-      </w:r>
-      <w:r>
-        <w:t xml:space="preserve"> in project references.</w:t>
-      </w:r>
-      <w:r>
-        <w:t xml:space="preserve"> See Section </w:t>
-      </w:r>
-      <w:r>
-        <w:rPr>
-          <w:u w:val="single"/>
-        </w:rPr>
-        <w:fldChar w:fldCharType="begin"/>
-      </w:r>
-      <w:r>
-        <w:rPr>
-          <w:u w:val="single"/>
-        </w:rPr>
-        <w:instrText xml:space="preserve"> REF _Ref477525249 \r \h </w:instrText>
-      </w:r>
-      <w:r>
-        <w:rPr>
-          <w:u w:val="single"/>
-        </w:rPr>
-      </w:r>
-      <w:r>
-        <w:rPr>
-          <w:u w:val="single"/>
-        </w:rPr>
-        <w:fldChar w:fldCharType="separate"/>
-      </w:r>
-      <w:r>
-        <w:rPr>
-          <w:u w:val="single"/>
-        </w:rPr>
-        <w:t>3.1</w:t>
-      </w:r>
-      <w:r>
-        <w:rPr>
-          <w:u w:val="single"/>
-        </w:rPr>
-        <w:fldChar w:fldCharType="end"/>
-      </w:r>
-      <w:r>
-        <w:t xml:space="preserve"> for information on referencing library files.</w:t>
-      </w:r>
-    </w:p>
-    <w:p>
-      <w:pPr>
-        <w:pStyle w:val="EDBTXTNormalWebBlackCharChar0"/>
-      </w:pPr>
-      <w:r>
-        <w:rPr>
-          <w:rStyle w:val="EDBTXTEmphasisNormalWebBoldBlackCharChar"/>
-        </w:rPr>
-        <w:t xml:space="preserve">Step </w:t>
-      </w:r>
-      <w:r>
-        <w:rPr>
-          <w:rStyle w:val="EDBTXTEmphasisNormalWebBoldBlackCharChar"/>
-        </w:rPr>
-        <w:t>3</w:t>
-      </w:r>
-      <w:r>
-        <w:rPr>
-          <w:rStyle w:val="EDBTXTEmphasisNormalWebBoldBlackCharChar"/>
-        </w:rPr>
-        <w:t>:</w:t>
-      </w:r>
-      <w:r>
-        <w:t xml:space="preserve"> In the project’s </w:t>
-      </w:r>
-      <w:r>
-        <w:rPr>
-          <w:rStyle w:val="EDBTXTKeywordBlack"/>
-        </w:rPr>
-        <w:t>app.config</w:t>
-      </w:r>
-      <w:r>
-        <w:t xml:space="preserve"> file add the following entry for provider services under the EntityFramework/providers tag.</w:t>
-      </w:r>
-    </w:p>
-    <w:p>
-      <w:pPr>
-        <w:pStyle w:val="EDBSYNTXPreformattedBlackLeft033"/>
-      </w:pPr>
-      <w:r>
-        <w:t>&lt;provider invaria</w:t>
-      </w:r>
-      <w:r>
-        <w:t>ntName="EnterpriseDB.EDBClient"</w:t>
-      </w:r>
-    </w:p>
-    <w:p>
-      <w:pPr>
-        <w:pStyle w:val="EDBSYNTXPreformattedBlackLeft033"/>
-      </w:pPr>
-      <w:r>
-        <w:t xml:space="preserve">  </w:t>
+          <w:sz w:val="16"/>
+        </w:rPr>
+        <w:t>&gt;</w:t>
+      </w:r>
+    </w:p>
+    <w:p>
+      <w:pPr>
+        <w:pStyle w:val="EDBEXCourierNew9ptCustomColorRGB4649146Left01"/>
+        <w:rPr>
+          <w:sz w:val="16"/>
+        </w:rPr>
+      </w:pPr>
+      <w:r>
+        <w:rPr>
+          <w:sz w:val="16"/>
+        </w:rPr>
+        <w:t xml:space="preserve">        &lt;supportedRuntime version="v4.0" sku=".NETFramework</w:t>
       </w:r>
       <w:proofErr w:type="gramStart"/>
       <w:r>
-        <w:t>type</w:t>
+        <w:rPr>
+          <w:sz w:val="16"/>
+        </w:rPr>
+        <w:t>,Version</w:t>
       </w:r>
       <w:proofErr w:type="gramEnd"/>
       <w:r>
-        <w:t>="EnterpriseDB.EDBClient.EDBServices, EntityFramework6.EnterpriseDB.EDBClient"&gt;</w:t>
-      </w:r>
-    </w:p>
-    <w:p>
-      <w:pPr>
-        <w:pStyle w:val="EDBSYNTXPreformattedBlackLeft033"/>
-      </w:pPr>
-      <w:r>
-        <w:t>&lt;/provider&gt;</w:t>
-      </w:r>
-    </w:p>
-    <w:p>
-      <w:pPr>
-        <w:pStyle w:val="EDBTXTNormalWebBlackCharChar0"/>
-      </w:pPr>
-      <w:r>
-        <w:t xml:space="preserve">The following is an example of the </w:t>
-      </w:r>
-      <w:r>
-        <w:rPr>
-          <w:rStyle w:val="EDBTXTKeywordBlack"/>
-        </w:rPr>
-        <w:t>app.config</w:t>
-      </w:r>
-      <w:r>
-        <w:t xml:space="preserve"> file.</w:t>
-      </w:r>
-    </w:p>
-    <w:p>
-      <w:pPr>
-        <w:pStyle w:val="EDBEXCourierNew9ptCustomColorRGB4649146Left01"/>
         <w:rPr>
           <w:sz w:val="16"/>
         </w:rPr>
-      </w:pPr>
+        <w:t>=v4.5" /&gt;</w:t>
+      </w:r>
+    </w:p>
+    <w:p>
+      <w:pPr>
+        <w:pStyle w:val="EDBEXCourierNew9ptCustomColorRGB4649146Left01"/>
+        <w:rPr>
+          <w:sz w:val="16"/>
+        </w:rPr>
+      </w:pPr>
+      <w:r>
+        <w:rPr>
+          <w:sz w:val="16"/>
+        </w:rPr>
+        <w:t xml:space="preserve">    &lt;/startup&gt;</w:t>
+      </w:r>
+    </w:p>
+    <w:p>
+      <w:pPr>
+        <w:pStyle w:val="EDBEXCourierNew9ptCustomColorRGB4649146Left01"/>
+        <w:rPr>
+          <w:sz w:val="16"/>
+        </w:rPr>
+      </w:pPr>
+    </w:p>
+    <w:p>
+      <w:pPr>
+        <w:pStyle w:val="EDBEXCourierNew9ptCustomColorRGB4649146Left01"/>
+        <w:rPr>
+          <w:sz w:val="16"/>
+        </w:rPr>
+      </w:pPr>
+      <w:r>
+        <w:rPr>
+          <w:sz w:val="16"/>
+        </w:rPr>
+        <w:t xml:space="preserve">  &lt;</w:t>
+      </w:r>
       <w:proofErr w:type="gramStart"/>
       <w:r>
         <w:rPr>
           <w:sz w:val="16"/>
         </w:rPr>
-        <w:lastRenderedPageBreak/>
-        <w:t>&lt;?xml</w:t>
+        <w:t>entityFramework</w:t>
       </w:r>
       <w:proofErr w:type="gramEnd"/>
       <w:r>
         <w:rPr>
           <w:sz w:val="16"/>
         </w:rPr>
-        <w:t xml:space="preserve"> version="1.0" encoding="utf-8" ?&gt;</w:t>
+        <w:t>&gt;</w:t>
       </w:r>
     </w:p>
     <w:p>
@@ -8739,14 +8938,14 @@
         <w:rPr>
           <w:sz w:val="16"/>
         </w:rPr>
-        <w:t>&lt;</w:t>
+        <w:t xml:space="preserve">    &lt;</w:t>
       </w:r>
       <w:proofErr w:type="gramStart"/>
       <w:r>
         <w:rPr>
           <w:sz w:val="16"/>
         </w:rPr>
-        <w:t>configuration</w:t>
+        <w:t>providers</w:t>
       </w:r>
       <w:proofErr w:type="gramEnd"/>
       <w:r>
@@ -8767,21 +8966,21 @@
         <w:rPr>
           <w:sz w:val="16"/>
         </w:rPr>
-        <w:t xml:space="preserve">  &lt;</w:t>
-      </w:r>
-      <w:proofErr w:type="gramStart"/>
-      <w:r>
+        <w:t xml:space="preserve">      &lt;provider invariantName="EnterpriseDB.EDBClient" type="EnterpriseDB.EDBClient.EDBServices, EntityFramework6.EnterpriseDB.EDBClient"&gt;&lt;/provider&gt;</w:t>
+      </w:r>
+    </w:p>
+    <w:p>
+      <w:pPr>
+        <w:pStyle w:val="EDBEXCourierNew9ptCustomColorRGB4649146Left01"/>
         <w:rPr>
           <w:sz w:val="16"/>
         </w:rPr>
-        <w:t>configSections</w:t>
-      </w:r>
-      <w:proofErr w:type="gramEnd"/>
+      </w:pPr>
       <w:r>
         <w:rPr>
           <w:sz w:val="16"/>
         </w:rPr>
-        <w:t>&gt;</w:t>
+        <w:t xml:space="preserve">    &lt;/providers&gt;</w:t>
       </w:r>
     </w:p>
     <w:p>
@@ -8795,7 +8994,7 @@
         <w:rPr>
           <w:sz w:val="16"/>
         </w:rPr>
-        <w:t xml:space="preserve">    &lt;section name="entityFramework" type="System.Data.Entity.Internal.ConfigFile.EntityFrameworkSection, EntityFramework, Version=6.0.0.0, Culture=neutral, PublicKeyToken=b77a5c561934e089" requirePermission="false"/&gt;</w:t>
+        <w:t xml:space="preserve">  &lt;/entityFramework&gt;</w:t>
       </w:r>
     </w:p>
     <w:p>
@@ -8805,20 +9004,20 @@
           <w:sz w:val="16"/>
         </w:rPr>
       </w:pPr>
-      <w:r>
+    </w:p>
+    <w:p>
+      <w:pPr>
+        <w:pStyle w:val="EDBEXCourierNew9ptCustomColorRGB4649146Left01"/>
         <w:rPr>
           <w:sz w:val="16"/>
         </w:rPr>
-        <w:t xml:space="preserve">  &lt;/configSections&gt;</w:t>
-      </w:r>
-    </w:p>
-    <w:p>
-      <w:pPr>
-        <w:pStyle w:val="EDBEXCourierNew9ptCustomColorRGB4649146Left01"/>
+      </w:pPr>
+      <w:r>
         <w:rPr>
           <w:sz w:val="16"/>
         </w:rPr>
-      </w:pPr>
+        <w:t xml:space="preserve">  &lt;system.data&gt;</w:t>
+      </w:r>
     </w:p>
     <w:p>
       <w:pPr>
@@ -8831,21 +9030,21 @@
         <w:rPr>
           <w:sz w:val="16"/>
         </w:rPr>
-        <w:t xml:space="preserve">    &lt;</w:t>
-      </w:r>
-      <w:proofErr w:type="gramStart"/>
-      <w:r>
+        <w:t xml:space="preserve">    &lt;DbProviderFactories&gt;</w:t>
+      </w:r>
+    </w:p>
+    <w:p>
+      <w:pPr>
+        <w:pStyle w:val="EDBEXCourierNew9ptCustomColorRGB4649146Left01"/>
         <w:rPr>
           <w:sz w:val="16"/>
         </w:rPr>
-        <w:t>startup</w:t>
-      </w:r>
-      <w:proofErr w:type="gramEnd"/>
+      </w:pPr>
       <w:r>
         <w:rPr>
           <w:sz w:val="16"/>
         </w:rPr>
-        <w:t>&gt;</w:t>
+        <w:t xml:space="preserve">      &lt;remove invariant="EnterpriseDB.EDBClient"/&gt;</w:t>
       </w:r>
     </w:p>
     <w:p>
@@ -8859,21 +9058,19 @@
         <w:rPr>
           <w:sz w:val="16"/>
         </w:rPr>
-        <w:t xml:space="preserve">        &lt;supportedRuntime version="v4.0" sku=".NETFramework</w:t>
-      </w:r>
-      <w:proofErr w:type="gramStart"/>
+        <w:t xml:space="preserve">      &lt;add name="EnterpriseDB Data Provider" invariant="EnterpriseDB.EDBClient" support="FF" description=".Net Framework Data Provider for </w:t>
+      </w:r>
       <w:r>
         <w:rPr>
           <w:sz w:val="16"/>
         </w:rPr>
-        <w:t>,Version</w:t>
-      </w:r>
-      <w:proofErr w:type="gramEnd"/>
+        <w:t>EDB Postgres</w:t>
+      </w:r>
       <w:r>
         <w:rPr>
           <w:sz w:val="16"/>
         </w:rPr>
-        <w:t>=v4.5" /&gt;</w:t>
+        <w:t>" type="EnterpriseDB.EDBClient.EDBFactory, EnterpriseDB.EDBClient"/&gt;</w:t>
       </w:r>
     </w:p>
     <w:p>
@@ -8887,7 +9084,7 @@
         <w:rPr>
           <w:sz w:val="16"/>
         </w:rPr>
-        <w:t xml:space="preserve">    &lt;/startup&gt;</w:t>
+        <w:t xml:space="preserve">    &lt;/DbProviderFactories&gt;</w:t>
       </w:r>
     </w:p>
     <w:p>
@@ -8897,228 +9094,32 @@
           <w:sz w:val="16"/>
         </w:rPr>
       </w:pPr>
-    </w:p>
-    <w:p>
-      <w:pPr>
-        <w:pStyle w:val="EDBEXCourierNew9ptCustomColorRGB4649146Left01"/>
+      <w:r>
         <w:rPr>
           <w:sz w:val="16"/>
         </w:rPr>
-      </w:pPr>
-      <w:r>
+        <w:t xml:space="preserve">  &lt;/system.data&gt;</w:t>
+      </w:r>
+    </w:p>
+    <w:p>
+      <w:pPr>
+        <w:pStyle w:val="EDBEXCourierNew9ptCustomColorRGB4649146Left01"/>
         <w:rPr>
           <w:sz w:val="16"/>
         </w:rPr>
-        <w:t xml:space="preserve">  &lt;</w:t>
-      </w:r>
-      <w:proofErr w:type="gramStart"/>
-      <w:r>
+      </w:pPr>
+    </w:p>
+    <w:p>
+      <w:pPr>
+        <w:pStyle w:val="EDBEXCourierNew9ptCustomColorRGB4649146Left01"/>
         <w:rPr>
           <w:sz w:val="16"/>
         </w:rPr>
-        <w:t>entityFramework</w:t>
-      </w:r>
-      <w:proofErr w:type="gramEnd"/>
+      </w:pPr>
       <w:r>
         <w:rPr>
           <w:sz w:val="16"/>
         </w:rPr>
-        <w:t>&gt;</w:t>
-      </w:r>
-    </w:p>
-    <w:p>
-      <w:pPr>
-        <w:pStyle w:val="EDBEXCourierNew9ptCustomColorRGB4649146Left01"/>
-        <w:rPr>
-          <w:sz w:val="16"/>
-        </w:rPr>
-      </w:pPr>
-      <w:r>
-        <w:rPr>
-          <w:sz w:val="16"/>
-        </w:rPr>
-        <w:t xml:space="preserve">    &lt;</w:t>
-      </w:r>
-      <w:proofErr w:type="gramStart"/>
-      <w:r>
-        <w:rPr>
-          <w:sz w:val="16"/>
-        </w:rPr>
-        <w:t>providers</w:t>
-      </w:r>
-      <w:proofErr w:type="gramEnd"/>
-      <w:r>
-        <w:rPr>
-          <w:sz w:val="16"/>
-        </w:rPr>
-        <w:t>&gt;</w:t>
-      </w:r>
-    </w:p>
-    <w:p>
-      <w:pPr>
-        <w:pStyle w:val="EDBEXCourierNew9ptCustomColorRGB4649146Left01"/>
-        <w:rPr>
-          <w:sz w:val="16"/>
-        </w:rPr>
-      </w:pPr>
-      <w:r>
-        <w:rPr>
-          <w:sz w:val="16"/>
-        </w:rPr>
-        <w:t xml:space="preserve">      &lt;provider invariantName="EnterpriseDB.EDBClient" type="EnterpriseDB.EDBClient.EDBServices, EntityFramework6.EnterpriseDB.EDBClient"&gt;&lt;/provider&gt;</w:t>
-      </w:r>
-    </w:p>
-    <w:p>
-      <w:pPr>
-        <w:pStyle w:val="EDBEXCourierNew9ptCustomColorRGB4649146Left01"/>
-        <w:rPr>
-          <w:sz w:val="16"/>
-        </w:rPr>
-      </w:pPr>
-      <w:r>
-        <w:rPr>
-          <w:sz w:val="16"/>
-        </w:rPr>
-        <w:t xml:space="preserve">    &lt;/providers&gt;</w:t>
-      </w:r>
-    </w:p>
-    <w:p>
-      <w:pPr>
-        <w:pStyle w:val="EDBEXCourierNew9ptCustomColorRGB4649146Left01"/>
-        <w:rPr>
-          <w:sz w:val="16"/>
-        </w:rPr>
-      </w:pPr>
-      <w:r>
-        <w:rPr>
-          <w:sz w:val="16"/>
-        </w:rPr>
-        <w:t xml:space="preserve">  &lt;/entityFramework&gt;</w:t>
-      </w:r>
-    </w:p>
-    <w:p>
-      <w:pPr>
-        <w:pStyle w:val="EDBEXCourierNew9ptCustomColorRGB4649146Left01"/>
-        <w:rPr>
-          <w:sz w:val="16"/>
-        </w:rPr>
-      </w:pPr>
-    </w:p>
-    <w:p>
-      <w:pPr>
-        <w:pStyle w:val="EDBEXCourierNew9ptCustomColorRGB4649146Left01"/>
-        <w:rPr>
-          <w:sz w:val="16"/>
-        </w:rPr>
-      </w:pPr>
-      <w:r>
-        <w:rPr>
-          <w:sz w:val="16"/>
-        </w:rPr>
-        <w:t xml:space="preserve">  &lt;system.data&gt;</w:t>
-      </w:r>
-    </w:p>
-    <w:p>
-      <w:pPr>
-        <w:pStyle w:val="EDBEXCourierNew9ptCustomColorRGB4649146Left01"/>
-        <w:rPr>
-          <w:sz w:val="16"/>
-        </w:rPr>
-      </w:pPr>
-      <w:r>
-        <w:rPr>
-          <w:sz w:val="16"/>
-        </w:rPr>
-        <w:t xml:space="preserve">    &lt;DbProviderFactories&gt;</w:t>
-      </w:r>
-    </w:p>
-    <w:p>
-      <w:pPr>
-        <w:pStyle w:val="EDBEXCourierNew9ptCustomColorRGB4649146Left01"/>
-        <w:rPr>
-          <w:sz w:val="16"/>
-        </w:rPr>
-      </w:pPr>
-      <w:r>
-        <w:rPr>
-          <w:sz w:val="16"/>
-        </w:rPr>
-        <w:t xml:space="preserve">      &lt;remove invariant="EnterpriseDB.EDBClient"/&gt;</w:t>
-      </w:r>
-    </w:p>
-    <w:p>
-      <w:pPr>
-        <w:pStyle w:val="EDBEXCourierNew9ptCustomColorRGB4649146Left01"/>
-        <w:rPr>
-          <w:sz w:val="16"/>
-        </w:rPr>
-      </w:pPr>
-      <w:r>
-        <w:rPr>
-          <w:sz w:val="16"/>
-        </w:rPr>
-        <w:t xml:space="preserve">      &lt;add name="EnterpriseDB Data Provider" invariant="EnterpriseDB.EDBClient" support="FF" description=".Net Framework Data Provider for </w:t>
-      </w:r>
-      <w:r>
-        <w:rPr>
-          <w:sz w:val="16"/>
-        </w:rPr>
-        <w:t>EDB Postgres</w:t>
-      </w:r>
-      <w:r>
-        <w:rPr>
-          <w:sz w:val="16"/>
-        </w:rPr>
-        <w:t>" type="EnterpriseDB.EDBClient.EDBFactory, EnterpriseDB.EDBClient"/&gt;</w:t>
-      </w:r>
-    </w:p>
-    <w:p>
-      <w:pPr>
-        <w:pStyle w:val="EDBEXCourierNew9ptCustomColorRGB4649146Left01"/>
-        <w:rPr>
-          <w:sz w:val="16"/>
-        </w:rPr>
-      </w:pPr>
-      <w:r>
-        <w:rPr>
-          <w:sz w:val="16"/>
-        </w:rPr>
-        <w:t xml:space="preserve">    &lt;/DbProviderFactories&gt;</w:t>
-      </w:r>
-    </w:p>
-    <w:p>
-      <w:pPr>
-        <w:pStyle w:val="EDBEXCourierNew9ptCustomColorRGB4649146Left01"/>
-        <w:rPr>
-          <w:sz w:val="16"/>
-        </w:rPr>
-      </w:pPr>
-      <w:r>
-        <w:rPr>
-          <w:sz w:val="16"/>
-        </w:rPr>
-        <w:t xml:space="preserve">  &lt;/system.data&gt;</w:t>
-      </w:r>
-    </w:p>
-    <w:p>
-      <w:pPr>
-        <w:pStyle w:val="EDBEXCourierNew9ptCustomColorRGB4649146Left01"/>
-        <w:rPr>
-          <w:sz w:val="16"/>
-        </w:rPr>
-      </w:pPr>
-    </w:p>
-    <w:p>
-      <w:pPr>
-        <w:pStyle w:val="EDBEXCourierNew9ptCustomColorRGB4649146Left01"/>
-        <w:rPr>
-          <w:sz w:val="16"/>
-        </w:rPr>
-      </w:pPr>
-      <w:r>
-        <w:rPr>
-          <w:sz w:val="16"/>
-        </w:rPr>
         <w:t>&lt;/configuration&gt;</w:t>
       </w:r>
     </w:p>
@@ -9131,14 +9132,14 @@
       <w:pPr>
         <w:pStyle w:val="Heading1"/>
       </w:pPr>
-      <w:bookmarkStart w:id="40" w:name="_Ref482087625"/>
-      <w:bookmarkStart w:id="41" w:name="_Toc509323283"/>
+      <w:bookmarkStart w:id="149" w:name="_Ref482087625"/>
+      <w:bookmarkStart w:id="150" w:name="_Toc511635290"/>
       <w:r>
         <w:lastRenderedPageBreak/>
         <w:t>Using the .NET Connector</w:t>
       </w:r>
-      <w:bookmarkEnd w:id="40"/>
-      <w:bookmarkEnd w:id="41"/>
+      <w:bookmarkEnd w:id="149"/>
+      <w:bookmarkEnd w:id="150"/>
     </w:p>
     <w:p>
       <w:pPr>
@@ -9423,11 +9424,11 @@
       <w:pPr>
         <w:pStyle w:val="Heading2"/>
       </w:pPr>
-      <w:bookmarkStart w:id="42" w:name="_Toc509323284"/>
+      <w:bookmarkStart w:id="151" w:name="_Toc511635291"/>
       <w:r>
         <w:t>Opening a Database Connection</w:t>
       </w:r>
-      <w:bookmarkEnd w:id="42"/>
+      <w:bookmarkEnd w:id="151"/>
     </w:p>
     <w:p>
       <w:pPr>
@@ -9640,13 +9641,13 @@
       <w:pPr>
         <w:pStyle w:val="Heading3"/>
       </w:pPr>
-      <w:bookmarkStart w:id="43" w:name="_Ref482087661"/>
-      <w:bookmarkStart w:id="44" w:name="_Toc509323285"/>
+      <w:bookmarkStart w:id="152" w:name="_Ref482087661"/>
+      <w:bookmarkStart w:id="153" w:name="_Toc511635292"/>
       <w:r>
         <w:t>Connection String Parameters</w:t>
       </w:r>
-      <w:bookmarkEnd w:id="43"/>
-      <w:bookmarkEnd w:id="44"/>
+      <w:bookmarkEnd w:id="152"/>
+      <w:bookmarkEnd w:id="153"/>
       <w:r>
         <w:t xml:space="preserve"> </w:t>
       </w:r>
@@ -10727,14 +10728,14 @@
       <w:pPr>
         <w:pStyle w:val="Heading3"/>
       </w:pPr>
-      <w:bookmarkStart w:id="45" w:name="_Toc509323286"/>
+      <w:bookmarkStart w:id="154" w:name="_Toc511635293"/>
       <w:r>
         <w:t xml:space="preserve">Example - </w:t>
       </w:r>
       <w:r>
         <w:t>Opening a Database Connection using ASP.NET</w:t>
       </w:r>
-      <w:bookmarkEnd w:id="45"/>
+      <w:bookmarkEnd w:id="154"/>
       <w:r>
         <w:t xml:space="preserve"> </w:t>
       </w:r>
@@ -11206,7 +11207,7 @@
           <w:noProof/>
         </w:rPr>
         <w:drawing>
-          <wp:inline distT="0" distB="0" distL="0" distR="0" wp14:anchorId="78ED76E8" wp14:editId="48F789AF">
+          <wp:inline distT="0" distB="0" distL="0" distR="0" wp14:anchorId="0F7D78F1" wp14:editId="5B956D4C">
             <wp:extent cx="5480050" cy="1663700"/>
             <wp:effectExtent l="0" t="0" r="6350" b="0"/>
             <wp:docPr id="7" name="Picture 7" descr="Screen Shot 2014-06-26 at 8"/>
@@ -11264,14 +11265,14 @@
       <w:pPr>
         <w:pStyle w:val="Heading3"/>
       </w:pPr>
-      <w:bookmarkStart w:id="46" w:name="_Toc509323287"/>
+      <w:bookmarkStart w:id="155" w:name="_Toc511635294"/>
       <w:r>
         <w:t xml:space="preserve">Example - </w:t>
       </w:r>
       <w:r>
         <w:t>Opening a Database Connection from a Console Application</w:t>
       </w:r>
-      <w:bookmarkEnd w:id="46"/>
+      <w:bookmarkEnd w:id="155"/>
     </w:p>
     <w:p>
       <w:pPr>
@@ -12024,14 +12025,14 @@
       <w:pPr>
         <w:pStyle w:val="Heading3"/>
       </w:pPr>
-      <w:bookmarkStart w:id="47" w:name="_Toc509323288"/>
+      <w:bookmarkStart w:id="156" w:name="_Toc511635295"/>
       <w:r>
         <w:t xml:space="preserve">Example - </w:t>
       </w:r>
       <w:r>
         <w:t>Opening a Database Connection from a Windows Form Application</w:t>
       </w:r>
-      <w:bookmarkEnd w:id="47"/>
+      <w:bookmarkEnd w:id="156"/>
     </w:p>
     <w:p>
       <w:pPr>
@@ -12982,7 +12983,7 @@
           <w:noProof/>
         </w:rPr>
         <w:drawing>
-          <wp:inline distT="0" distB="0" distL="0" distR="0" wp14:anchorId="5B69CB86" wp14:editId="04B1C26D">
+          <wp:inline distT="0" distB="0" distL="0" distR="0" wp14:anchorId="0E8EDBD9" wp14:editId="1994C224">
             <wp:extent cx="2120900" cy="2120900"/>
             <wp:effectExtent l="0" t="0" r="0" b="0"/>
             <wp:docPr id="8" name="Picture 8" descr="dialog"/>
@@ -13094,12 +13095,12 @@
       <w:pPr>
         <w:pStyle w:val="Heading2"/>
       </w:pPr>
-      <w:bookmarkStart w:id="48" w:name="_Toc509323289"/>
+      <w:bookmarkStart w:id="157" w:name="_Toc511635296"/>
       <w:r>
         <w:lastRenderedPageBreak/>
         <w:t>Retrieving Database Records</w:t>
       </w:r>
-      <w:bookmarkEnd w:id="48"/>
+      <w:bookmarkEnd w:id="157"/>
     </w:p>
     <w:p>
       <w:pPr>
@@ -14307,14 +14308,14 @@
       <w:pPr>
         <w:pStyle w:val="Heading3"/>
       </w:pPr>
-      <w:bookmarkStart w:id="49" w:name="_Toc509323290"/>
+      <w:bookmarkStart w:id="158" w:name="_Toc511635297"/>
       <w:r>
         <w:t>Retr</w:t>
       </w:r>
       <w:r>
         <w:t>ieving a Single Database Record</w:t>
       </w:r>
-      <w:bookmarkEnd w:id="49"/>
+      <w:bookmarkEnd w:id="158"/>
     </w:p>
     <w:p>
       <w:pPr>
@@ -14947,12 +14948,12 @@
       <w:pPr>
         <w:pStyle w:val="Heading2"/>
       </w:pPr>
-      <w:bookmarkStart w:id="50" w:name="_Toc509323291"/>
+      <w:bookmarkStart w:id="159" w:name="_Toc511635298"/>
       <w:r>
         <w:lastRenderedPageBreak/>
         <w:t>Parameterized Queries</w:t>
       </w:r>
-      <w:bookmarkEnd w:id="50"/>
+      <w:bookmarkEnd w:id="159"/>
     </w:p>
     <w:p>
       <w:pPr>
@@ -15742,12 +15743,12 @@
       <w:pPr>
         <w:pStyle w:val="Heading2"/>
       </w:pPr>
-      <w:bookmarkStart w:id="51" w:name="_Toc509323292"/>
+      <w:bookmarkStart w:id="160" w:name="_Toc511635299"/>
       <w:r>
         <w:lastRenderedPageBreak/>
         <w:t>Inserting Records in a Database</w:t>
       </w:r>
-      <w:bookmarkEnd w:id="51"/>
+      <w:bookmarkEnd w:id="160"/>
     </w:p>
     <w:p>
       <w:pPr>
@@ -16706,12 +16707,12 @@
       <w:pPr>
         <w:pStyle w:val="Heading2"/>
       </w:pPr>
-      <w:bookmarkStart w:id="52" w:name="_Toc509323293"/>
+      <w:bookmarkStart w:id="161" w:name="_Toc511635300"/>
       <w:r>
         <w:lastRenderedPageBreak/>
         <w:t>Deleting Records in a Database</w:t>
       </w:r>
-      <w:bookmarkEnd w:id="52"/>
+      <w:bookmarkEnd w:id="161"/>
     </w:p>
     <w:p>
       <w:pPr>
@@ -17672,12 +17673,12 @@
       <w:pPr>
         <w:pStyle w:val="Heading2"/>
       </w:pPr>
-      <w:bookmarkStart w:id="53" w:name="_Toc509323294"/>
+      <w:bookmarkStart w:id="162" w:name="_Toc511635301"/>
       <w:r>
         <w:lastRenderedPageBreak/>
         <w:t>Using SPL Stored Procedures in your .NET Application</w:t>
       </w:r>
-      <w:bookmarkEnd w:id="53"/>
+      <w:bookmarkEnd w:id="162"/>
     </w:p>
     <w:p>
       <w:pPr>
@@ -17956,7 +17957,7 @@
       <w:pPr>
         <w:pStyle w:val="Heading3"/>
       </w:pPr>
-      <w:bookmarkStart w:id="54" w:name="_Toc509323295"/>
+      <w:bookmarkStart w:id="163" w:name="_Toc511635302"/>
       <w:r>
         <w:t>Example - Executing</w:t>
       </w:r>
@@ -17966,7 +17967,7 @@
       <w:r>
         <w:t xml:space="preserve"> without Parameters</w:t>
       </w:r>
-      <w:bookmarkEnd w:id="54"/>
+      <w:bookmarkEnd w:id="163"/>
     </w:p>
     <w:p>
       <w:pPr>
@@ -19033,14 +19034,14 @@
       <w:pPr>
         <w:pStyle w:val="Heading3"/>
       </w:pPr>
-      <w:bookmarkStart w:id="55" w:name="_Toc509323296"/>
+      <w:bookmarkStart w:id="164" w:name="_Toc511635303"/>
       <w:r>
         <w:t xml:space="preserve">Example - </w:t>
       </w:r>
       <w:r>
         <w:t>Executing a Stored Procedure with IN Parameters</w:t>
       </w:r>
-      <w:bookmarkEnd w:id="55"/>
+      <w:bookmarkEnd w:id="164"/>
     </w:p>
     <w:p>
       <w:pPr>
@@ -21204,7 +21205,7 @@
       <w:pPr>
         <w:pStyle w:val="Heading3"/>
       </w:pPr>
-      <w:bookmarkStart w:id="56" w:name="_Toc509323297"/>
+      <w:bookmarkStart w:id="165" w:name="_Toc511635304"/>
       <w:r>
         <w:t xml:space="preserve">Example - </w:t>
       </w:r>
@@ -21223,7 +21224,7 @@
       <w:r>
         <w:t xml:space="preserve"> Parameters</w:t>
       </w:r>
-      <w:bookmarkEnd w:id="56"/>
+      <w:bookmarkEnd w:id="165"/>
     </w:p>
     <w:p>
       <w:pPr>
@@ -23883,7 +23884,7 @@
       <w:pPr>
         <w:pStyle w:val="Heading2"/>
       </w:pPr>
-      <w:bookmarkStart w:id="57" w:name="_Toc509323298"/>
+      <w:bookmarkStart w:id="166" w:name="_Toc511635305"/>
       <w:r>
         <w:lastRenderedPageBreak/>
         <w:t xml:space="preserve">Using </w:t>
@@ -23894,7 +23895,7 @@
       <w:r>
         <w:t xml:space="preserve"> in a .NET Application</w:t>
       </w:r>
-      <w:bookmarkEnd w:id="57"/>
+      <w:bookmarkEnd w:id="166"/>
     </w:p>
     <w:p>
       <w:pPr>
@@ -25103,7 +25104,7 @@
         <w:rStyle w:val="PageNumber"/>
         <w:noProof/>
       </w:rPr>
-      <w:t>24</w:t>
+      <w:t>23</w:t>
     </w:r>
     <w:r>
       <w:rPr>
@@ -34998,7 +34999,7 @@
 </file>
 
 <file path=customXml/itemProps1.xml><?xml version="1.0" encoding="utf-8"?>
-<ds:datastoreItem xmlns:ds="http://schemas.openxmlformats.org/officeDocument/2006/customXml" ds:itemID="{A44F7EFE-FDF3-4611-ACBA-0EA9A343008B}">
+<ds:datastoreItem xmlns:ds="http://schemas.openxmlformats.org/officeDocument/2006/customXml" ds:itemID="{8CB4FE1D-A87B-4DC7-AE85-6B0CD02C45CD}">
   <ds:schemaRefs>
     <ds:schemaRef ds:uri="http://schemas.openxmlformats.org/officeDocument/2006/bibliography"/>
   </ds:schemaRefs>

</xml_diff>

<commit_message>
EPAS .Net Connector Guide 10.0.2 - JIRA EC-175 Last bullet point in Chapter 3 corrected from EDBDdexProvider to EnterpriseDB VSIX
</commit_message>
<xml_diff>
--- a/edb_docs/EDB_Postgres_Advanced_Server_NET_Connector_Guide.docx
+++ b/edb_docs/EDB_Postgres_Advanced_Server_NET_Connector_Guide.docx
@@ -12,7 +12,7 @@
           <w:noProof/>
         </w:rPr>
         <w:drawing>
-          <wp:inline distT="0" distB="0" distL="0" distR="0" wp14:anchorId="72926CAB" wp14:editId="765FBEB9">
+          <wp:inline distT="0" distB="0" distL="0" distR="0" wp14:anchorId="739C3BB8" wp14:editId="4BAC0831">
             <wp:extent cx="2380711" cy="1371599"/>
             <wp:effectExtent l="0" t="0" r="635" b="635"/>
             <wp:docPr id="6" name="Picture 6"/>
@@ -69,16 +69,16 @@
       <w:pPr>
         <w:pStyle w:val="EDBTXTNormalWebBlackCharChar0"/>
       </w:pPr>
+    </w:p>
+    <w:p>
+      <w:pPr>
+        <w:pStyle w:val="EDBTXTNormalWebBlackCharChar0"/>
+        <w:rPr>
+          <w:color w:val="auto"/>
+        </w:rPr>
+      </w:pPr>
       <w:bookmarkStart w:id="0" w:name="_GoBack"/>
       <w:bookmarkEnd w:id="0"/>
-    </w:p>
-    <w:p>
-      <w:pPr>
-        <w:pStyle w:val="EDBTXTNormalWebBlackCharChar0"/>
-        <w:rPr>
-          <w:color w:val="auto"/>
-        </w:rPr>
-      </w:pPr>
     </w:p>
     <w:p>
       <w:pPr>
@@ -244,10 +244,10 @@
         <w:pStyle w:val="EDBCoverProductDate"/>
       </w:pPr>
       <w:r>
-        <w:t>April 1</w:t>
-      </w:r>
-      <w:r>
-        <w:t>6</w:t>
+        <w:t xml:space="preserve">April </w:t>
+      </w:r>
+      <w:r>
+        <w:t>17</w:t>
       </w:r>
       <w:r>
         <w:t xml:space="preserve">, </w:t>
@@ -566,7 +566,7 @@
       <w:r>
         <w:fldChar w:fldCharType="separate"/>
       </w:r>
-      <w:hyperlink w:anchor="_Toc511635245" w:history="1">
+      <w:hyperlink w:anchor="_Toc511710202" w:history="1">
         <w:r>
           <w:rPr>
             <w:rStyle w:val="Hyperlink"/>
@@ -606,7 +606,7 @@
           <w:rPr>
             <w:noProof/>
           </w:rPr>
-          <w:instrText xml:space="preserve"> PAGEREF _Toc511635245 \h </w:instrText>
+          <w:instrText xml:space="preserve"> PAGEREF _Toc511710202 \h </w:instrText>
         </w:r>
         <w:r>
           <w:rPr>
@@ -647,7 +647,7 @@
           <w:szCs w:val="22"/>
         </w:rPr>
       </w:pPr>
-      <w:hyperlink w:anchor="_Toc511635246" w:history="1">
+      <w:hyperlink w:anchor="_Toc511710203" w:history="1">
         <w:r>
           <w:rPr>
             <w:rStyle w:val="Hyperlink"/>
@@ -687,7 +687,7 @@
           <w:rPr>
             <w:noProof/>
           </w:rPr>
-          <w:instrText xml:space="preserve"> PAGEREF _Toc511635246 \h </w:instrText>
+          <w:instrText xml:space="preserve"> PAGEREF _Toc511710203 \h </w:instrText>
         </w:r>
         <w:r>
           <w:rPr>
@@ -728,7 +728,7 @@
           <w:szCs w:val="22"/>
         </w:rPr>
       </w:pPr>
-      <w:hyperlink w:anchor="_Toc511635247" w:history="1">
+      <w:hyperlink w:anchor="_Toc511710204" w:history="1">
         <w:r>
           <w:rPr>
             <w:rStyle w:val="Hyperlink"/>
@@ -768,7 +768,7 @@
           <w:rPr>
             <w:noProof/>
           </w:rPr>
-          <w:instrText xml:space="preserve"> PAGEREF _Toc511635247 \h </w:instrText>
+          <w:instrText xml:space="preserve"> PAGEREF _Toc511710204 \h </w:instrText>
         </w:r>
         <w:r>
           <w:rPr>
@@ -809,7 +809,7 @@
           <w:szCs w:val="22"/>
         </w:rPr>
       </w:pPr>
-      <w:hyperlink w:anchor="_Toc511635248" w:history="1">
+      <w:hyperlink w:anchor="_Toc511710205" w:history="1">
         <w:r>
           <w:rPr>
             <w:rStyle w:val="Hyperlink"/>
@@ -849,7 +849,7 @@
           <w:rPr>
             <w:noProof/>
           </w:rPr>
-          <w:instrText xml:space="preserve"> PAGEREF _Toc511635248 \h </w:instrText>
+          <w:instrText xml:space="preserve"> PAGEREF _Toc511710205 \h </w:instrText>
         </w:r>
         <w:r>
           <w:rPr>
@@ -890,7 +890,7 @@
           <w:szCs w:val="22"/>
         </w:rPr>
       </w:pPr>
-      <w:hyperlink w:anchor="_Toc511635249" w:history="1">
+      <w:hyperlink w:anchor="_Toc511710206" w:history="1">
         <w:r>
           <w:rPr>
             <w:rStyle w:val="Hyperlink"/>
@@ -930,7 +930,7 @@
           <w:rPr>
             <w:noProof/>
           </w:rPr>
-          <w:instrText xml:space="preserve"> PAGEREF _Toc511635249 \h </w:instrText>
+          <w:instrText xml:space="preserve"> PAGEREF _Toc511710206 \h </w:instrText>
         </w:r>
         <w:r>
           <w:rPr>
@@ -971,7 +971,7 @@
           <w:szCs w:val="22"/>
         </w:rPr>
       </w:pPr>
-      <w:hyperlink w:anchor="_Toc511635250" w:history="1">
+      <w:hyperlink w:anchor="_Toc511710207" w:history="1">
         <w:r>
           <w:rPr>
             <w:rStyle w:val="Hyperlink"/>
@@ -1011,7 +1011,7 @@
           <w:rPr>
             <w:noProof/>
           </w:rPr>
-          <w:instrText xml:space="preserve"> PAGEREF _Toc511635250 \h </w:instrText>
+          <w:instrText xml:space="preserve"> PAGEREF _Toc511710207 \h </w:instrText>
         </w:r>
         <w:r>
           <w:rPr>
@@ -1052,7 +1052,7 @@
           <w:szCs w:val="22"/>
         </w:rPr>
       </w:pPr>
-      <w:hyperlink w:anchor="_Toc511635251" w:history="1">
+      <w:hyperlink w:anchor="_Toc511710208" w:history="1">
         <w:r>
           <w:rPr>
             <w:rStyle w:val="Hyperlink"/>
@@ -1092,7 +1092,7 @@
           <w:rPr>
             <w:noProof/>
           </w:rPr>
-          <w:instrText xml:space="preserve"> PAGEREF _Toc511635251 \h </w:instrText>
+          <w:instrText xml:space="preserve"> PAGEREF _Toc511710208 \h </w:instrText>
         </w:r>
         <w:r>
           <w:rPr>
@@ -1133,7 +1133,7 @@
           <w:szCs w:val="22"/>
         </w:rPr>
       </w:pPr>
-      <w:hyperlink w:anchor="_Toc511635252" w:history="1">
+      <w:hyperlink w:anchor="_Toc511710209" w:history="1">
         <w:r>
           <w:rPr>
             <w:rStyle w:val="Hyperlink"/>
@@ -1173,7 +1173,7 @@
           <w:rPr>
             <w:noProof/>
           </w:rPr>
-          <w:instrText xml:space="preserve"> PAGEREF _Toc511635252 \h </w:instrText>
+          <w:instrText xml:space="preserve"> PAGEREF _Toc511710209 \h </w:instrText>
         </w:r>
         <w:r>
           <w:rPr>
@@ -1214,7 +1214,7 @@
           <w:szCs w:val="22"/>
         </w:rPr>
       </w:pPr>
-      <w:hyperlink w:anchor="_Toc511635253" w:history="1">
+      <w:hyperlink w:anchor="_Toc511710210" w:history="1">
         <w:r>
           <w:rPr>
             <w:rStyle w:val="Hyperlink"/>
@@ -1254,7 +1254,7 @@
           <w:rPr>
             <w:noProof/>
           </w:rPr>
-          <w:instrText xml:space="preserve"> PAGEREF _Toc511635253 \h </w:instrText>
+          <w:instrText xml:space="preserve"> PAGEREF _Toc511710210 \h </w:instrText>
         </w:r>
         <w:r>
           <w:rPr>
@@ -1290,7 +1290,7 @@
           <w:szCs w:val="22"/>
         </w:rPr>
       </w:pPr>
-      <w:hyperlink w:anchor="_Toc511635254" w:history="1">
+      <w:hyperlink w:anchor="_Toc511710211" w:history="1">
         <w:r>
           <w:rPr>
             <w:rStyle w:val="Hyperlink"/>
@@ -1318,7 +1318,7 @@
           <w:fldChar w:fldCharType="begin"/>
         </w:r>
         <w:r>
-          <w:instrText xml:space="preserve"> PAGEREF _Toc511635254 \h </w:instrText>
+          <w:instrText xml:space="preserve"> PAGEREF _Toc511710211 \h </w:instrText>
         </w:r>
         <w:r>
           <w:fldChar w:fldCharType="separate"/>
@@ -1340,7 +1340,7 @@
           <w:szCs w:val="22"/>
         </w:rPr>
       </w:pPr>
-      <w:hyperlink w:anchor="_Toc511635255" w:history="1">
+      <w:hyperlink w:anchor="_Toc511710212" w:history="1">
         <w:r>
           <w:rPr>
             <w:rStyle w:val="Hyperlink"/>
@@ -1368,7 +1368,7 @@
           <w:fldChar w:fldCharType="begin"/>
         </w:r>
         <w:r>
-          <w:instrText xml:space="preserve"> PAGEREF _Toc511635255 \h </w:instrText>
+          <w:instrText xml:space="preserve"> PAGEREF _Toc511710212 \h </w:instrText>
         </w:r>
         <w:r>
           <w:fldChar w:fldCharType="separate"/>
@@ -1390,7 +1390,7 @@
           <w:szCs w:val="22"/>
         </w:rPr>
       </w:pPr>
-      <w:hyperlink w:anchor="_Toc511635256" w:history="1">
+      <w:hyperlink w:anchor="_Toc511710213" w:history="1">
         <w:r>
           <w:rPr>
             <w:rStyle w:val="Hyperlink"/>
@@ -1418,7 +1418,7 @@
           <w:fldChar w:fldCharType="begin"/>
         </w:r>
         <w:r>
-          <w:instrText xml:space="preserve"> PAGEREF _Toc511635256 \h </w:instrText>
+          <w:instrText xml:space="preserve"> PAGEREF _Toc511710213 \h </w:instrText>
         </w:r>
         <w:r>
           <w:fldChar w:fldCharType="separate"/>
@@ -1440,7 +1440,7 @@
           <w:szCs w:val="22"/>
         </w:rPr>
       </w:pPr>
-      <w:hyperlink w:anchor="_Toc511635257" w:history="1">
+      <w:hyperlink w:anchor="_Toc511710214" w:history="1">
         <w:r>
           <w:rPr>
             <w:rStyle w:val="Hyperlink"/>
@@ -1468,7 +1468,7 @@
           <w:fldChar w:fldCharType="begin"/>
         </w:r>
         <w:r>
-          <w:instrText xml:space="preserve"> PAGEREF _Toc511635257 \h </w:instrText>
+          <w:instrText xml:space="preserve"> PAGEREF _Toc511710214 \h </w:instrText>
         </w:r>
         <w:r>
           <w:fldChar w:fldCharType="separate"/>
@@ -1490,7 +1490,7 @@
           <w:szCs w:val="22"/>
         </w:rPr>
       </w:pPr>
-      <w:hyperlink w:anchor="_Toc511635258" w:history="1">
+      <w:hyperlink w:anchor="_Toc511710215" w:history="1">
         <w:r>
           <w:rPr>
             <w:rStyle w:val="Hyperlink"/>
@@ -1518,7 +1518,7 @@
           <w:fldChar w:fldCharType="begin"/>
         </w:r>
         <w:r>
-          <w:instrText xml:space="preserve"> PAGEREF _Toc511635258 \h </w:instrText>
+          <w:instrText xml:space="preserve"> PAGEREF _Toc511710215 \h </w:instrText>
         </w:r>
         <w:r>
           <w:fldChar w:fldCharType="separate"/>
@@ -1545,7 +1545,7 @@
           <w:szCs w:val="22"/>
         </w:rPr>
       </w:pPr>
-      <w:hyperlink w:anchor="_Toc511635259" w:history="1">
+      <w:hyperlink w:anchor="_Toc511710216" w:history="1">
         <w:r>
           <w:rPr>
             <w:rStyle w:val="Hyperlink"/>
@@ -1585,7 +1585,7 @@
           <w:rPr>
             <w:noProof/>
           </w:rPr>
-          <w:instrText xml:space="preserve"> PAGEREF _Toc511635259 \h </w:instrText>
+          <w:instrText xml:space="preserve"> PAGEREF _Toc511710216 \h </w:instrText>
         </w:r>
         <w:r>
           <w:rPr>
@@ -1626,7 +1626,7 @@
           <w:szCs w:val="22"/>
         </w:rPr>
       </w:pPr>
-      <w:hyperlink w:anchor="_Toc511635260" w:history="1">
+      <w:hyperlink w:anchor="_Toc511710217" w:history="1">
         <w:r>
           <w:rPr>
             <w:rStyle w:val="Hyperlink"/>
@@ -1666,7 +1666,7 @@
           <w:rPr>
             <w:noProof/>
           </w:rPr>
-          <w:instrText xml:space="preserve"> PAGEREF _Toc511635260 \h </w:instrText>
+          <w:instrText xml:space="preserve"> PAGEREF _Toc511710217 \h </w:instrText>
         </w:r>
         <w:r>
           <w:rPr>
@@ -1702,7 +1702,7 @@
           <w:szCs w:val="22"/>
         </w:rPr>
       </w:pPr>
-      <w:hyperlink w:anchor="_Toc511635261" w:history="1">
+      <w:hyperlink w:anchor="_Toc511710218" w:history="1">
         <w:r>
           <w:rPr>
             <w:rStyle w:val="Hyperlink"/>
@@ -1730,7 +1730,7 @@
           <w:fldChar w:fldCharType="begin"/>
         </w:r>
         <w:r>
-          <w:instrText xml:space="preserve"> PAGEREF _Toc511635261 \h </w:instrText>
+          <w:instrText xml:space="preserve"> PAGEREF _Toc511710218 \h </w:instrText>
         </w:r>
         <w:r>
           <w:fldChar w:fldCharType="separate"/>
@@ -1752,7 +1752,7 @@
           <w:szCs w:val="22"/>
         </w:rPr>
       </w:pPr>
-      <w:hyperlink w:anchor="_Toc511635289" w:history="1">
+      <w:hyperlink w:anchor="_Toc511710219" w:history="1">
         <w:r>
           <w:rPr>
             <w:rStyle w:val="Hyperlink"/>
@@ -1780,7 +1780,7 @@
           <w:fldChar w:fldCharType="begin"/>
         </w:r>
         <w:r>
-          <w:instrText xml:space="preserve"> PAGEREF _Toc511635289 \h </w:instrText>
+          <w:instrText xml:space="preserve"> PAGEREF _Toc511710219 \h </w:instrText>
         </w:r>
         <w:r>
           <w:fldChar w:fldCharType="separate"/>
@@ -1807,7 +1807,7 @@
           <w:szCs w:val="22"/>
         </w:rPr>
       </w:pPr>
-      <w:hyperlink w:anchor="_Toc511635290" w:history="1">
+      <w:hyperlink w:anchor="_Toc511710220" w:history="1">
         <w:r>
           <w:rPr>
             <w:rStyle w:val="Hyperlink"/>
@@ -1847,7 +1847,7 @@
           <w:rPr>
             <w:noProof/>
           </w:rPr>
-          <w:instrText xml:space="preserve"> PAGEREF _Toc511635290 \h </w:instrText>
+          <w:instrText xml:space="preserve"> PAGEREF _Toc511710220 \h </w:instrText>
         </w:r>
         <w:r>
           <w:rPr>
@@ -1888,7 +1888,7 @@
           <w:szCs w:val="22"/>
         </w:rPr>
       </w:pPr>
-      <w:hyperlink w:anchor="_Toc511635291" w:history="1">
+      <w:hyperlink w:anchor="_Toc511710221" w:history="1">
         <w:r>
           <w:rPr>
             <w:rStyle w:val="Hyperlink"/>
@@ -1928,7 +1928,7 @@
           <w:rPr>
             <w:noProof/>
           </w:rPr>
-          <w:instrText xml:space="preserve"> PAGEREF _Toc511635291 \h </w:instrText>
+          <w:instrText xml:space="preserve"> PAGEREF _Toc511710221 \h </w:instrText>
         </w:r>
         <w:r>
           <w:rPr>
@@ -1964,7 +1964,7 @@
           <w:szCs w:val="22"/>
         </w:rPr>
       </w:pPr>
-      <w:hyperlink w:anchor="_Toc511635292" w:history="1">
+      <w:hyperlink w:anchor="_Toc511710222" w:history="1">
         <w:r>
           <w:rPr>
             <w:rStyle w:val="Hyperlink"/>
@@ -1992,7 +1992,7 @@
           <w:fldChar w:fldCharType="begin"/>
         </w:r>
         <w:r>
-          <w:instrText xml:space="preserve"> PAGEREF _Toc511635292 \h </w:instrText>
+          <w:instrText xml:space="preserve"> PAGEREF _Toc511710222 \h </w:instrText>
         </w:r>
         <w:r>
           <w:fldChar w:fldCharType="separate"/>
@@ -2014,7 +2014,7 @@
           <w:szCs w:val="22"/>
         </w:rPr>
       </w:pPr>
-      <w:hyperlink w:anchor="_Toc511635293" w:history="1">
+      <w:hyperlink w:anchor="_Toc511710223" w:history="1">
         <w:r>
           <w:rPr>
             <w:rStyle w:val="Hyperlink"/>
@@ -2042,7 +2042,7 @@
           <w:fldChar w:fldCharType="begin"/>
         </w:r>
         <w:r>
-          <w:instrText xml:space="preserve"> PAGEREF _Toc511635293 \h </w:instrText>
+          <w:instrText xml:space="preserve"> PAGEREF _Toc511710223 \h </w:instrText>
         </w:r>
         <w:r>
           <w:fldChar w:fldCharType="separate"/>
@@ -2064,7 +2064,7 @@
           <w:szCs w:val="22"/>
         </w:rPr>
       </w:pPr>
-      <w:hyperlink w:anchor="_Toc511635294" w:history="1">
+      <w:hyperlink w:anchor="_Toc511710224" w:history="1">
         <w:r>
           <w:rPr>
             <w:rStyle w:val="Hyperlink"/>
@@ -2092,7 +2092,7 @@
           <w:fldChar w:fldCharType="begin"/>
         </w:r>
         <w:r>
-          <w:instrText xml:space="preserve"> PAGEREF _Toc511635294 \h </w:instrText>
+          <w:instrText xml:space="preserve"> PAGEREF _Toc511710224 \h </w:instrText>
         </w:r>
         <w:r>
           <w:fldChar w:fldCharType="separate"/>
@@ -2114,7 +2114,7 @@
           <w:szCs w:val="22"/>
         </w:rPr>
       </w:pPr>
-      <w:hyperlink w:anchor="_Toc511635295" w:history="1">
+      <w:hyperlink w:anchor="_Toc511710225" w:history="1">
         <w:r>
           <w:rPr>
             <w:rStyle w:val="Hyperlink"/>
@@ -2142,7 +2142,7 @@
           <w:fldChar w:fldCharType="begin"/>
         </w:r>
         <w:r>
-          <w:instrText xml:space="preserve"> PAGEREF _Toc511635295 \h </w:instrText>
+          <w:instrText xml:space="preserve"> PAGEREF _Toc511710225 \h </w:instrText>
         </w:r>
         <w:r>
           <w:fldChar w:fldCharType="separate"/>
@@ -2169,7 +2169,7 @@
           <w:szCs w:val="22"/>
         </w:rPr>
       </w:pPr>
-      <w:hyperlink w:anchor="_Toc511635296" w:history="1">
+      <w:hyperlink w:anchor="_Toc511710226" w:history="1">
         <w:r>
           <w:rPr>
             <w:rStyle w:val="Hyperlink"/>
@@ -2209,7 +2209,7 @@
           <w:rPr>
             <w:noProof/>
           </w:rPr>
-          <w:instrText xml:space="preserve"> PAGEREF _Toc511635296 \h </w:instrText>
+          <w:instrText xml:space="preserve"> PAGEREF _Toc511710226 \h </w:instrText>
         </w:r>
         <w:r>
           <w:rPr>
@@ -2245,7 +2245,7 @@
           <w:szCs w:val="22"/>
         </w:rPr>
       </w:pPr>
-      <w:hyperlink w:anchor="_Toc511635297" w:history="1">
+      <w:hyperlink w:anchor="_Toc511710227" w:history="1">
         <w:r>
           <w:rPr>
             <w:rStyle w:val="Hyperlink"/>
@@ -2273,7 +2273,7 @@
           <w:fldChar w:fldCharType="begin"/>
         </w:r>
         <w:r>
-          <w:instrText xml:space="preserve"> PAGEREF _Toc511635297 \h </w:instrText>
+          <w:instrText xml:space="preserve"> PAGEREF _Toc511710227 \h </w:instrText>
         </w:r>
         <w:r>
           <w:fldChar w:fldCharType="separate"/>
@@ -2300,7 +2300,7 @@
           <w:szCs w:val="22"/>
         </w:rPr>
       </w:pPr>
-      <w:hyperlink w:anchor="_Toc511635298" w:history="1">
+      <w:hyperlink w:anchor="_Toc511710228" w:history="1">
         <w:r>
           <w:rPr>
             <w:rStyle w:val="Hyperlink"/>
@@ -2340,7 +2340,7 @@
           <w:rPr>
             <w:noProof/>
           </w:rPr>
-          <w:instrText xml:space="preserve"> PAGEREF _Toc511635298 \h </w:instrText>
+          <w:instrText xml:space="preserve"> PAGEREF _Toc511710228 \h </w:instrText>
         </w:r>
         <w:r>
           <w:rPr>
@@ -2381,7 +2381,7 @@
           <w:szCs w:val="22"/>
         </w:rPr>
       </w:pPr>
-      <w:hyperlink w:anchor="_Toc511635299" w:history="1">
+      <w:hyperlink w:anchor="_Toc511710229" w:history="1">
         <w:r>
           <w:rPr>
             <w:rStyle w:val="Hyperlink"/>
@@ -2421,7 +2421,7 @@
           <w:rPr>
             <w:noProof/>
           </w:rPr>
-          <w:instrText xml:space="preserve"> PAGEREF _Toc511635299 \h </w:instrText>
+          <w:instrText xml:space="preserve"> PAGEREF _Toc511710229 \h </w:instrText>
         </w:r>
         <w:r>
           <w:rPr>
@@ -2462,7 +2462,7 @@
           <w:szCs w:val="22"/>
         </w:rPr>
       </w:pPr>
-      <w:hyperlink w:anchor="_Toc511635300" w:history="1">
+      <w:hyperlink w:anchor="_Toc511710230" w:history="1">
         <w:r>
           <w:rPr>
             <w:rStyle w:val="Hyperlink"/>
@@ -2502,7 +2502,7 @@
           <w:rPr>
             <w:noProof/>
           </w:rPr>
-          <w:instrText xml:space="preserve"> PAGEREF _Toc511635300 \h </w:instrText>
+          <w:instrText xml:space="preserve"> PAGEREF _Toc511710230 \h </w:instrText>
         </w:r>
         <w:r>
           <w:rPr>
@@ -2543,7 +2543,7 @@
           <w:szCs w:val="22"/>
         </w:rPr>
       </w:pPr>
-      <w:hyperlink w:anchor="_Toc511635301" w:history="1">
+      <w:hyperlink w:anchor="_Toc511710231" w:history="1">
         <w:r>
           <w:rPr>
             <w:rStyle w:val="Hyperlink"/>
@@ -2583,7 +2583,7 @@
           <w:rPr>
             <w:noProof/>
           </w:rPr>
-          <w:instrText xml:space="preserve"> PAGEREF _Toc511635301 \h </w:instrText>
+          <w:instrText xml:space="preserve"> PAGEREF _Toc511710231 \h </w:instrText>
         </w:r>
         <w:r>
           <w:rPr>
@@ -2619,7 +2619,7 @@
           <w:szCs w:val="22"/>
         </w:rPr>
       </w:pPr>
-      <w:hyperlink w:anchor="_Toc511635302" w:history="1">
+      <w:hyperlink w:anchor="_Toc511710232" w:history="1">
         <w:r>
           <w:rPr>
             <w:rStyle w:val="Hyperlink"/>
@@ -2647,7 +2647,7 @@
           <w:fldChar w:fldCharType="begin"/>
         </w:r>
         <w:r>
-          <w:instrText xml:space="preserve"> PAGEREF _Toc511635302 \h </w:instrText>
+          <w:instrText xml:space="preserve"> PAGEREF _Toc511710232 \h </w:instrText>
         </w:r>
         <w:r>
           <w:fldChar w:fldCharType="separate"/>
@@ -2669,7 +2669,7 @@
           <w:szCs w:val="22"/>
         </w:rPr>
       </w:pPr>
-      <w:hyperlink w:anchor="_Toc511635303" w:history="1">
+      <w:hyperlink w:anchor="_Toc511710233" w:history="1">
         <w:r>
           <w:rPr>
             <w:rStyle w:val="Hyperlink"/>
@@ -2697,7 +2697,7 @@
           <w:fldChar w:fldCharType="begin"/>
         </w:r>
         <w:r>
-          <w:instrText xml:space="preserve"> PAGEREF _Toc511635303 \h </w:instrText>
+          <w:instrText xml:space="preserve"> PAGEREF _Toc511710233 \h </w:instrText>
         </w:r>
         <w:r>
           <w:fldChar w:fldCharType="separate"/>
@@ -2719,7 +2719,7 @@
           <w:szCs w:val="22"/>
         </w:rPr>
       </w:pPr>
-      <w:hyperlink w:anchor="_Toc511635304" w:history="1">
+      <w:hyperlink w:anchor="_Toc511710234" w:history="1">
         <w:r>
           <w:rPr>
             <w:rStyle w:val="Hyperlink"/>
@@ -2747,7 +2747,7 @@
           <w:fldChar w:fldCharType="begin"/>
         </w:r>
         <w:r>
-          <w:instrText xml:space="preserve"> PAGEREF _Toc511635304 \h </w:instrText>
+          <w:instrText xml:space="preserve"> PAGEREF _Toc511710234 \h </w:instrText>
         </w:r>
         <w:r>
           <w:fldChar w:fldCharType="separate"/>
@@ -2774,7 +2774,7 @@
           <w:szCs w:val="22"/>
         </w:rPr>
       </w:pPr>
-      <w:hyperlink w:anchor="_Toc511635305" w:history="1">
+      <w:hyperlink w:anchor="_Toc511710235" w:history="1">
         <w:r>
           <w:rPr>
             <w:rStyle w:val="Hyperlink"/>
@@ -2814,7 +2814,7 @@
           <w:rPr>
             <w:noProof/>
           </w:rPr>
-          <w:instrText xml:space="preserve"> PAGEREF _Toc511635305 \h </w:instrText>
+          <w:instrText xml:space="preserve"> PAGEREF _Toc511710235 \h </w:instrText>
         </w:r>
         <w:r>
           <w:rPr>
@@ -2872,7 +2872,7 @@
       <w:pPr>
         <w:pStyle w:val="Heading1"/>
       </w:pPr>
-      <w:bookmarkStart w:id="1" w:name="_Toc511635245"/>
+      <w:bookmarkStart w:id="1" w:name="_Toc511710202"/>
       <w:r>
         <w:lastRenderedPageBreak/>
         <w:t>Introduction</w:t>
@@ -3047,7 +3047,7 @@
       <w:pPr>
         <w:pStyle w:val="Heading2"/>
       </w:pPr>
-      <w:bookmarkStart w:id="2" w:name="_Toc511635246"/>
+      <w:bookmarkStart w:id="2" w:name="_Toc511710203"/>
       <w:r>
         <w:lastRenderedPageBreak/>
         <w:t>What’s New</w:t>
@@ -3358,7 +3358,7 @@
       <w:bookmarkStart w:id="10" w:name="_Ref103071794"/>
       <w:bookmarkStart w:id="11" w:name="_Ref103073047"/>
       <w:bookmarkStart w:id="12" w:name="_Ref103073090"/>
-      <w:bookmarkStart w:id="13" w:name="_Toc511635247"/>
+      <w:bookmarkStart w:id="13" w:name="_Toc511710204"/>
       <w:bookmarkEnd w:id="3"/>
       <w:bookmarkEnd w:id="4"/>
       <w:bookmarkEnd w:id="5"/>
@@ -3789,7 +3789,7 @@
       <w:pPr>
         <w:pStyle w:val="Heading1"/>
       </w:pPr>
-      <w:bookmarkStart w:id="15" w:name="_Toc511635248"/>
+      <w:bookmarkStart w:id="15" w:name="_Toc511710205"/>
       <w:r>
         <w:lastRenderedPageBreak/>
         <w:t>The Advanced Server .NET Connector - Overview</w:t>
@@ -3855,7 +3855,7 @@
       <w:pPr>
         <w:pStyle w:val="Heading2"/>
       </w:pPr>
-      <w:bookmarkStart w:id="16" w:name="_Toc511635249"/>
+      <w:bookmarkStart w:id="16" w:name="_Toc511710206"/>
       <w:r>
         <w:t>The .NET Class Hierarchy</w:t>
       </w:r>
@@ -4142,7 +4142,7 @@
       <w:pPr>
         <w:pStyle w:val="Heading2"/>
       </w:pPr>
-      <w:bookmarkStart w:id="17" w:name="_Toc511635250"/>
+      <w:bookmarkStart w:id="17" w:name="_Toc511710207"/>
       <w:r>
         <w:lastRenderedPageBreak/>
         <w:t>Installing the .NET Connector</w:t>
@@ -4269,7 +4269,7 @@
           <w:noProof/>
         </w:rPr>
         <w:drawing>
-          <wp:inline distT="0" distB="0" distL="0" distR="0" wp14:anchorId="40D251C2" wp14:editId="5F9751E5">
+          <wp:inline distT="0" distB="0" distL="0" distR="0" wp14:anchorId="4F75DF7C" wp14:editId="780B655F">
             <wp:extent cx="3886200" cy="3037805"/>
             <wp:effectExtent l="0" t="0" r="0" b="0"/>
             <wp:docPr id="2" name="Picture 2"/>
@@ -4378,7 +4378,7 @@
         </w:rPr>
         <w:lastRenderedPageBreak/>
         <w:drawing>
-          <wp:inline distT="0" distB="0" distL="0" distR="0" wp14:anchorId="4B2DB6E7" wp14:editId="33CE874C">
+          <wp:inline distT="0" distB="0" distL="0" distR="0" wp14:anchorId="683CD8BB" wp14:editId="01537B71">
             <wp:extent cx="3886200" cy="3046927"/>
             <wp:effectExtent l="0" t="0" r="0" b="1270"/>
             <wp:docPr id="3" name="Picture 3"/>
@@ -4513,7 +4513,7 @@
           <w:noProof/>
         </w:rPr>
         <w:drawing>
-          <wp:inline distT="0" distB="0" distL="0" distR="0" wp14:anchorId="15293E1C" wp14:editId="6A40874B">
+          <wp:inline distT="0" distB="0" distL="0" distR="0" wp14:anchorId="7AB35B0A" wp14:editId="4DB8894B">
             <wp:extent cx="4114800" cy="3217552"/>
             <wp:effectExtent l="0" t="0" r="0" b="1905"/>
             <wp:docPr id="4" name="Picture 4"/>
@@ -4668,7 +4668,7 @@
           <w:noProof/>
         </w:rPr>
         <w:drawing>
-          <wp:inline distT="0" distB="0" distL="0" distR="0" wp14:anchorId="48934141" wp14:editId="543B41DD">
+          <wp:inline distT="0" distB="0" distL="0" distR="0" wp14:anchorId="3B77CE99" wp14:editId="7E3DA0F0">
             <wp:extent cx="4114800" cy="3194511"/>
             <wp:effectExtent l="0" t="0" r="0" b="6350"/>
             <wp:docPr id="5" name="Picture 5"/>
@@ -4841,7 +4841,7 @@
           <w:noProof/>
         </w:rPr>
         <w:drawing>
-          <wp:inline distT="0" distB="0" distL="0" distR="0" wp14:anchorId="005AA0AB" wp14:editId="2FD26A62">
+          <wp:inline distT="0" distB="0" distL="0" distR="0" wp14:anchorId="1D5423D5" wp14:editId="3FEF539B">
             <wp:extent cx="3790950" cy="1619051"/>
             <wp:effectExtent l="0" t="0" r="0" b="635"/>
             <wp:docPr id="12" name="Picture 12" descr="C:\Users\susan\AppData\Local\Temp\vmware-susan\VMwareDnD\7412d23f\Screen Shot 2016-07-11 at 4.50.20 PM.png"/>
@@ -5008,7 +5008,7 @@
         </w:rPr>
         <w:lastRenderedPageBreak/>
         <w:drawing>
-          <wp:inline distT="0" distB="0" distL="0" distR="0" wp14:anchorId="3647F62A" wp14:editId="01BB72D7">
+          <wp:inline distT="0" distB="0" distL="0" distR="0" wp14:anchorId="5B67481C" wp14:editId="24463C1B">
             <wp:extent cx="4116527" cy="2992582"/>
             <wp:effectExtent l="0" t="0" r="0" b="0"/>
             <wp:docPr id="10" name="Picture 10"/>
@@ -5114,7 +5114,7 @@
         <w:pStyle w:val="Heading1"/>
       </w:pPr>
       <w:bookmarkStart w:id="18" w:name="_Ref456012125"/>
-      <w:bookmarkStart w:id="19" w:name="_Toc511635251"/>
+      <w:bookmarkStart w:id="19" w:name="_Toc511710208"/>
       <w:r>
         <w:lastRenderedPageBreak/>
         <w:t>Configuring the .NET Connector</w:t>
@@ -5360,16 +5360,31 @@
         <w:rPr>
           <w:rStyle w:val="EDBTXTEmphasisNormalWebBoldBlackCharChar"/>
         </w:rPr>
-        <w:t>EDBDdexProvider</w:t>
+        <w:t>E</w:t>
       </w:r>
       <w:r>
         <w:rPr>
           <w:rStyle w:val="EDBTXTEmphasisNormalWebBoldBlackCharChar"/>
         </w:rPr>
+        <w:t>nterpriseDB VSIX</w:t>
+      </w:r>
+      <w:r>
+        <w:rPr>
+          <w:rStyle w:val="EDBTXTEmphasisNormalWebBoldBlackCharChar"/>
+        </w:rPr>
         <w:t>.</w:t>
       </w:r>
       <w:r>
-        <w:t xml:space="preserve"> Instructions for configuring for usage with EDBDdexProvider</w:t>
+        <w:t xml:space="preserve"> Instructions for configuring for usage with </w:t>
+      </w:r>
+      <w:r>
+        <w:t>E</w:t>
+      </w:r>
+      <w:r>
+        <w:t xml:space="preserve">nterpriseDB </w:t>
+      </w:r>
+      <w:r>
+        <w:t>VSIX</w:t>
       </w:r>
     </w:p>
     <w:p>
@@ -5382,7 +5397,7 @@
         <w:pStyle w:val="Heading2"/>
       </w:pPr>
       <w:bookmarkStart w:id="20" w:name="_Ref477525249"/>
-      <w:bookmarkStart w:id="21" w:name="_Toc511635252"/>
+      <w:bookmarkStart w:id="21" w:name="_Toc511710209"/>
       <w:r>
         <w:t>General Instructions</w:t>
       </w:r>
@@ -5656,7 +5671,7 @@
       <w:pPr>
         <w:pStyle w:val="Heading2"/>
       </w:pPr>
-      <w:bookmarkStart w:id="22" w:name="_Toc511635253"/>
+      <w:bookmarkStart w:id="22" w:name="_Toc511710210"/>
       <w:r>
         <w:t xml:space="preserve">.NET Framework </w:t>
       </w:r>
@@ -5683,7 +5698,7 @@
       <w:pPr>
         <w:pStyle w:val="Heading3"/>
       </w:pPr>
-      <w:bookmarkStart w:id="23" w:name="_Toc511635254"/>
+      <w:bookmarkStart w:id="23" w:name="_Toc511710211"/>
       <w:r>
         <w:t>.NET Framework 4.0</w:t>
       </w:r>
@@ -5891,7 +5906,7 @@
       </w:pPr>
       <w:bookmarkStart w:id="24" w:name="_Ref503423964"/>
       <w:bookmarkStart w:id="25" w:name="_Ref503430964"/>
-      <w:bookmarkStart w:id="26" w:name="_Toc511635255"/>
+      <w:bookmarkStart w:id="26" w:name="_Toc511710212"/>
       <w:r>
         <w:t>.NET Framework 4.5</w:t>
       </w:r>
@@ -6190,7 +6205,7 @@
       </w:pPr>
       <w:bookmarkStart w:id="27" w:name="_Ref503423994"/>
       <w:bookmarkStart w:id="28" w:name="_Ref503431008"/>
-      <w:bookmarkStart w:id="29" w:name="_Toc511635256"/>
+      <w:bookmarkStart w:id="29" w:name="_Toc511710213"/>
       <w:r>
         <w:t>.NET Framework 4.5.1</w:t>
       </w:r>
@@ -6511,7 +6526,7 @@
         <w:pStyle w:val="Heading3"/>
       </w:pPr>
       <w:bookmarkStart w:id="30" w:name="_Ref503431048"/>
-      <w:bookmarkStart w:id="31" w:name="_Toc511635257"/>
+      <w:bookmarkStart w:id="31" w:name="_Toc511710214"/>
       <w:r>
         <w:t>.NET Standard 1.3</w:t>
       </w:r>
@@ -6669,7 +6684,7 @@
         <w:pStyle w:val="Heading3"/>
       </w:pPr>
       <w:bookmarkStart w:id="32" w:name="_Ref509321802"/>
-      <w:bookmarkStart w:id="33" w:name="_Toc511635258"/>
+      <w:bookmarkStart w:id="33" w:name="_Toc511710215"/>
       <w:r>
         <w:lastRenderedPageBreak/>
         <w:t>.NET Standard 2.0</w:t>
@@ -6840,7 +6855,7 @@
         <w:pStyle w:val="Heading2"/>
       </w:pPr>
       <w:bookmarkStart w:id="34" w:name="_Ref477527440"/>
-      <w:bookmarkStart w:id="35" w:name="_Toc511635259"/>
+      <w:bookmarkStart w:id="35" w:name="_Toc511710216"/>
       <w:r>
         <w:t xml:space="preserve">Entity Framework </w:t>
       </w:r>
@@ -7857,7 +7872,7 @@
       </w:pPr>
       <w:bookmarkStart w:id="36" w:name="_Ref477528081"/>
       <w:bookmarkStart w:id="37" w:name="_Ref511382535"/>
-      <w:bookmarkStart w:id="38" w:name="_Toc511635260"/>
+      <w:bookmarkStart w:id="38" w:name="_Toc511710217"/>
       <w:r>
         <w:t>E</w:t>
       </w:r>
@@ -8046,7 +8061,7 @@
       <w:pPr>
         <w:pStyle w:val="Heading3"/>
       </w:pPr>
-      <w:bookmarkStart w:id="39" w:name="_Toc511635261"/>
+      <w:bookmarkStart w:id="39" w:name="_Toc511710218"/>
       <w:r>
         <w:t>Installation and Configuration for Visual Studio 2015</w:t>
       </w:r>
@@ -8337,7 +8352,7 @@
       <w:bookmarkStart w:id="145" w:name="_Toc511634331"/>
       <w:bookmarkStart w:id="146" w:name="_Toc511635227"/>
       <w:bookmarkStart w:id="147" w:name="_Toc511635288"/>
-      <w:bookmarkStart w:id="148" w:name="_Toc511635289"/>
+      <w:bookmarkStart w:id="148" w:name="_Toc511710219"/>
       <w:bookmarkEnd w:id="40"/>
       <w:bookmarkEnd w:id="41"/>
       <w:bookmarkEnd w:id="42"/>
@@ -9133,7 +9148,7 @@
         <w:pStyle w:val="Heading1"/>
       </w:pPr>
       <w:bookmarkStart w:id="149" w:name="_Ref482087625"/>
-      <w:bookmarkStart w:id="150" w:name="_Toc511635290"/>
+      <w:bookmarkStart w:id="150" w:name="_Toc511710220"/>
       <w:r>
         <w:lastRenderedPageBreak/>
         <w:t>Using the .NET Connector</w:t>
@@ -9424,7 +9439,7 @@
       <w:pPr>
         <w:pStyle w:val="Heading2"/>
       </w:pPr>
-      <w:bookmarkStart w:id="151" w:name="_Toc511635291"/>
+      <w:bookmarkStart w:id="151" w:name="_Toc511710221"/>
       <w:r>
         <w:t>Opening a Database Connection</w:t>
       </w:r>
@@ -9642,7 +9657,7 @@
         <w:pStyle w:val="Heading3"/>
       </w:pPr>
       <w:bookmarkStart w:id="152" w:name="_Ref482087661"/>
-      <w:bookmarkStart w:id="153" w:name="_Toc511635292"/>
+      <w:bookmarkStart w:id="153" w:name="_Toc511710222"/>
       <w:r>
         <w:t>Connection String Parameters</w:t>
       </w:r>
@@ -10728,7 +10743,7 @@
       <w:pPr>
         <w:pStyle w:val="Heading3"/>
       </w:pPr>
-      <w:bookmarkStart w:id="154" w:name="_Toc511635293"/>
+      <w:bookmarkStart w:id="154" w:name="_Toc511710223"/>
       <w:r>
         <w:t xml:space="preserve">Example - </w:t>
       </w:r>
@@ -11207,7 +11222,7 @@
           <w:noProof/>
         </w:rPr>
         <w:drawing>
-          <wp:inline distT="0" distB="0" distL="0" distR="0" wp14:anchorId="0F7D78F1" wp14:editId="5B956D4C">
+          <wp:inline distT="0" distB="0" distL="0" distR="0" wp14:anchorId="260F5841" wp14:editId="35B9888F">
             <wp:extent cx="5480050" cy="1663700"/>
             <wp:effectExtent l="0" t="0" r="6350" b="0"/>
             <wp:docPr id="7" name="Picture 7" descr="Screen Shot 2014-06-26 at 8"/>
@@ -11265,7 +11280,7 @@
       <w:pPr>
         <w:pStyle w:val="Heading3"/>
       </w:pPr>
-      <w:bookmarkStart w:id="155" w:name="_Toc511635294"/>
+      <w:bookmarkStart w:id="155" w:name="_Toc511710224"/>
       <w:r>
         <w:t xml:space="preserve">Example - </w:t>
       </w:r>
@@ -12025,7 +12040,7 @@
       <w:pPr>
         <w:pStyle w:val="Heading3"/>
       </w:pPr>
-      <w:bookmarkStart w:id="156" w:name="_Toc511635295"/>
+      <w:bookmarkStart w:id="156" w:name="_Toc511710225"/>
       <w:r>
         <w:t xml:space="preserve">Example - </w:t>
       </w:r>
@@ -12983,7 +12998,7 @@
           <w:noProof/>
         </w:rPr>
         <w:drawing>
-          <wp:inline distT="0" distB="0" distL="0" distR="0" wp14:anchorId="0E8EDBD9" wp14:editId="1994C224">
+          <wp:inline distT="0" distB="0" distL="0" distR="0" wp14:anchorId="29B8B2B6" wp14:editId="2DACC503">
             <wp:extent cx="2120900" cy="2120900"/>
             <wp:effectExtent l="0" t="0" r="0" b="0"/>
             <wp:docPr id="8" name="Picture 8" descr="dialog"/>
@@ -13095,7 +13110,7 @@
       <w:pPr>
         <w:pStyle w:val="Heading2"/>
       </w:pPr>
-      <w:bookmarkStart w:id="157" w:name="_Toc511635296"/>
+      <w:bookmarkStart w:id="157" w:name="_Toc511710226"/>
       <w:r>
         <w:lastRenderedPageBreak/>
         <w:t>Retrieving Database Records</w:t>
@@ -14308,7 +14323,7 @@
       <w:pPr>
         <w:pStyle w:val="Heading3"/>
       </w:pPr>
-      <w:bookmarkStart w:id="158" w:name="_Toc511635297"/>
+      <w:bookmarkStart w:id="158" w:name="_Toc511710227"/>
       <w:r>
         <w:t>Retr</w:t>
       </w:r>
@@ -14948,7 +14963,7 @@
       <w:pPr>
         <w:pStyle w:val="Heading2"/>
       </w:pPr>
-      <w:bookmarkStart w:id="159" w:name="_Toc511635298"/>
+      <w:bookmarkStart w:id="159" w:name="_Toc511710228"/>
       <w:r>
         <w:lastRenderedPageBreak/>
         <w:t>Parameterized Queries</w:t>
@@ -15743,7 +15758,7 @@
       <w:pPr>
         <w:pStyle w:val="Heading2"/>
       </w:pPr>
-      <w:bookmarkStart w:id="160" w:name="_Toc511635299"/>
+      <w:bookmarkStart w:id="160" w:name="_Toc511710229"/>
       <w:r>
         <w:lastRenderedPageBreak/>
         <w:t>Inserting Records in a Database</w:t>
@@ -16707,7 +16722,7 @@
       <w:pPr>
         <w:pStyle w:val="Heading2"/>
       </w:pPr>
-      <w:bookmarkStart w:id="161" w:name="_Toc511635300"/>
+      <w:bookmarkStart w:id="161" w:name="_Toc511710230"/>
       <w:r>
         <w:lastRenderedPageBreak/>
         <w:t>Deleting Records in a Database</w:t>
@@ -17673,7 +17688,7 @@
       <w:pPr>
         <w:pStyle w:val="Heading2"/>
       </w:pPr>
-      <w:bookmarkStart w:id="162" w:name="_Toc511635301"/>
+      <w:bookmarkStart w:id="162" w:name="_Toc511710231"/>
       <w:r>
         <w:lastRenderedPageBreak/>
         <w:t>Using SPL Stored Procedures in your .NET Application</w:t>
@@ -17957,7 +17972,7 @@
       <w:pPr>
         <w:pStyle w:val="Heading3"/>
       </w:pPr>
-      <w:bookmarkStart w:id="163" w:name="_Toc511635302"/>
+      <w:bookmarkStart w:id="163" w:name="_Toc511710232"/>
       <w:r>
         <w:t>Example - Executing</w:t>
       </w:r>
@@ -19034,7 +19049,7 @@
       <w:pPr>
         <w:pStyle w:val="Heading3"/>
       </w:pPr>
-      <w:bookmarkStart w:id="164" w:name="_Toc511635303"/>
+      <w:bookmarkStart w:id="164" w:name="_Toc511710233"/>
       <w:r>
         <w:t xml:space="preserve">Example - </w:t>
       </w:r>
@@ -21205,7 +21220,7 @@
       <w:pPr>
         <w:pStyle w:val="Heading3"/>
       </w:pPr>
-      <w:bookmarkStart w:id="165" w:name="_Toc511635304"/>
+      <w:bookmarkStart w:id="165" w:name="_Toc511710234"/>
       <w:r>
         <w:t xml:space="preserve">Example - </w:t>
       </w:r>
@@ -23884,7 +23899,7 @@
       <w:pPr>
         <w:pStyle w:val="Heading2"/>
       </w:pPr>
-      <w:bookmarkStart w:id="166" w:name="_Toc511635305"/>
+      <w:bookmarkStart w:id="166" w:name="_Toc511710235"/>
       <w:r>
         <w:lastRenderedPageBreak/>
         <w:t xml:space="preserve">Using </w:t>
@@ -34999,7 +35014,7 @@
 </file>
 
 <file path=customXml/itemProps1.xml><?xml version="1.0" encoding="utf-8"?>
-<ds:datastoreItem xmlns:ds="http://schemas.openxmlformats.org/officeDocument/2006/customXml" ds:itemID="{8CB4FE1D-A87B-4DC7-AE85-6B0CD02C45CD}">
+<ds:datastoreItem xmlns:ds="http://schemas.openxmlformats.org/officeDocument/2006/customXml" ds:itemID="{E1462BE0-3B6E-4A5C-94AB-1EFD125C2744}">
   <ds:schemaRefs>
     <ds:schemaRef ds:uri="http://schemas.openxmlformats.org/officeDocument/2006/bibliography"/>
   </ds:schemaRefs>

</xml_diff>

<commit_message>
EPAS .Net Connector Guide 10.0.3 - Cover updated to 10.0.3
</commit_message>
<xml_diff>
--- a/edb_docs/EDB_Postgres_Advanced_Server_NET_Connector_Guide.docx
+++ b/edb_docs/EDB_Postgres_Advanced_Server_NET_Connector_Guide.docx
@@ -7,14 +7,12 @@
       <w:pPr>
         <w:pStyle w:val="EDBCoverLogo"/>
       </w:pPr>
-      <w:bookmarkStart w:id="0" w:name="_GoBack"/>
-      <w:bookmarkEnd w:id="0"/>
       <w:r>
         <w:rPr>
           <w:noProof/>
         </w:rPr>
         <w:drawing>
-          <wp:inline distT="0" distB="0" distL="0" distR="0" wp14:anchorId="0A767D81" wp14:editId="7EB97887">
+          <wp:inline distT="0" distB="0" distL="0" distR="0" wp14:anchorId="306B3AFB" wp14:editId="1CC27911">
             <wp:extent cx="2380711" cy="1371599"/>
             <wp:effectExtent l="0" t="0" r="635" b="635"/>
             <wp:docPr id="6" name="Picture 6"/>
@@ -71,6 +69,8 @@
       <w:pPr>
         <w:pStyle w:val="EDBTXTNormalWebBlackCharChar0"/>
       </w:pPr>
+      <w:bookmarkStart w:id="0" w:name="_GoBack"/>
+      <w:bookmarkEnd w:id="0"/>
     </w:p>
     <w:p>
       <w:pPr>
@@ -176,7 +176,7 @@
         <w:t>10.0.</w:t>
       </w:r>
       <w:r>
-        <w:t>2</w:t>
+        <w:t>3</w:t>
       </w:r>
       <w:r>
         <w:br/>
@@ -247,7 +247,10 @@
         <w:pStyle w:val="EDBCoverProductDate"/>
       </w:pPr>
       <w:r>
-        <w:t>May 1</w:t>
+        <w:t xml:space="preserve">July </w:t>
+      </w:r>
+      <w:r>
+        <w:t>24</w:t>
       </w:r>
       <w:r>
         <w:t xml:space="preserve">, </w:t>
@@ -566,7 +569,7 @@
       <w:r>
         <w:fldChar w:fldCharType="separate"/>
       </w:r>
-      <w:hyperlink w:anchor="_Toc512935226" w:history="1">
+      <w:hyperlink w:anchor="_Toc520194400" w:history="1">
         <w:r>
           <w:rPr>
             <w:rStyle w:val="Hyperlink"/>
@@ -606,7 +609,7 @@
           <w:rPr>
             <w:noProof/>
           </w:rPr>
-          <w:instrText xml:space="preserve"> PAGEREF _Toc512935226 \h </w:instrText>
+          <w:instrText xml:space="preserve"> PAGEREF _Toc520194400 \h </w:instrText>
         </w:r>
         <w:r>
           <w:rPr>
@@ -647,94 +650,13 @@
           <w:szCs w:val="22"/>
         </w:rPr>
       </w:pPr>
-      <w:hyperlink w:anchor="_Toc512935227" w:history="1">
+      <w:hyperlink w:anchor="_Toc520194407" w:history="1">
         <w:r>
           <w:rPr>
             <w:rStyle w:val="Hyperlink"/>
             <w:noProof/>
           </w:rPr>
           <w:t>1.1</w:t>
-        </w:r>
-        <w:r>
-          <w:rPr>
-            <w:rFonts w:asciiTheme="minorHAnsi" w:eastAsiaTheme="minorEastAsia" w:hAnsiTheme="minorHAnsi" w:cstheme="minorBidi"/>
-            <w:noProof/>
-            <w:sz w:val="22"/>
-            <w:szCs w:val="22"/>
-          </w:rPr>
-          <w:tab/>
-        </w:r>
-        <w:r>
-          <w:rPr>
-            <w:rStyle w:val="Hyperlink"/>
-            <w:noProof/>
-          </w:rPr>
-          <w:t>What’s New</w:t>
-        </w:r>
-        <w:r>
-          <w:rPr>
-            <w:noProof/>
-          </w:rPr>
-          <w:tab/>
-        </w:r>
-        <w:r>
-          <w:rPr>
-            <w:noProof/>
-          </w:rPr>
-          <w:fldChar w:fldCharType="begin"/>
-        </w:r>
-        <w:r>
-          <w:rPr>
-            <w:noProof/>
-          </w:rPr>
-          <w:instrText xml:space="preserve"> PAGEREF _Toc512935227 \h </w:instrText>
-        </w:r>
-        <w:r>
-          <w:rPr>
-            <w:noProof/>
-          </w:rPr>
-        </w:r>
-        <w:r>
-          <w:rPr>
-            <w:noProof/>
-          </w:rPr>
-          <w:fldChar w:fldCharType="separate"/>
-        </w:r>
-        <w:r>
-          <w:rPr>
-            <w:noProof/>
-          </w:rPr>
-          <w:t>6</w:t>
-        </w:r>
-        <w:r>
-          <w:rPr>
-            <w:noProof/>
-          </w:rPr>
-          <w:fldChar w:fldCharType="end"/>
-        </w:r>
-      </w:hyperlink>
-    </w:p>
-    <w:p>
-      <w:pPr>
-        <w:pStyle w:val="TOC2"/>
-        <w:tabs>
-          <w:tab w:val="left" w:pos="960"/>
-          <w:tab w:val="right" w:leader="dot" w:pos="8630"/>
-        </w:tabs>
-        <w:rPr>
-          <w:rFonts w:asciiTheme="minorHAnsi" w:eastAsiaTheme="minorEastAsia" w:hAnsiTheme="minorHAnsi" w:cstheme="minorBidi"/>
-          <w:noProof/>
-          <w:sz w:val="22"/>
-          <w:szCs w:val="22"/>
-        </w:rPr>
-      </w:pPr>
-      <w:hyperlink w:anchor="_Toc512935228" w:history="1">
-        <w:r>
-          <w:rPr>
-            <w:rStyle w:val="Hyperlink"/>
-            <w:noProof/>
-          </w:rPr>
-          <w:t>1.2</w:t>
         </w:r>
         <w:r>
           <w:rPr>
@@ -768,7 +690,7 @@
           <w:rPr>
             <w:noProof/>
           </w:rPr>
-          <w:instrText xml:space="preserve"> PAGEREF _Toc512935228 \h </w:instrText>
+          <w:instrText xml:space="preserve"> PAGEREF _Toc520194407 \h </w:instrText>
         </w:r>
         <w:r>
           <w:rPr>
@@ -809,7 +731,7 @@
           <w:szCs w:val="22"/>
         </w:rPr>
       </w:pPr>
-      <w:hyperlink w:anchor="_Toc512935229" w:history="1">
+      <w:hyperlink w:anchor="_Toc520194408" w:history="1">
         <w:r>
           <w:rPr>
             <w:rStyle w:val="Hyperlink"/>
@@ -849,7 +771,7 @@
           <w:rPr>
             <w:noProof/>
           </w:rPr>
-          <w:instrText xml:space="preserve"> PAGEREF _Toc512935229 \h </w:instrText>
+          <w:instrText xml:space="preserve"> PAGEREF _Toc520194408 \h </w:instrText>
         </w:r>
         <w:r>
           <w:rPr>
@@ -890,7 +812,7 @@
           <w:szCs w:val="22"/>
         </w:rPr>
       </w:pPr>
-      <w:hyperlink w:anchor="_Toc512935230" w:history="1">
+      <w:hyperlink w:anchor="_Toc520194409" w:history="1">
         <w:r>
           <w:rPr>
             <w:rStyle w:val="Hyperlink"/>
@@ -930,7 +852,7 @@
           <w:rPr>
             <w:noProof/>
           </w:rPr>
-          <w:instrText xml:space="preserve"> PAGEREF _Toc512935230 \h </w:instrText>
+          <w:instrText xml:space="preserve"> PAGEREF _Toc520194409 \h </w:instrText>
         </w:r>
         <w:r>
           <w:rPr>
@@ -971,7 +893,7 @@
           <w:szCs w:val="22"/>
         </w:rPr>
       </w:pPr>
-      <w:hyperlink w:anchor="_Toc512935231" w:history="1">
+      <w:hyperlink w:anchor="_Toc520194410" w:history="1">
         <w:r>
           <w:rPr>
             <w:rStyle w:val="Hyperlink"/>
@@ -1011,7 +933,7 @@
           <w:rPr>
             <w:noProof/>
           </w:rPr>
-          <w:instrText xml:space="preserve"> PAGEREF _Toc512935231 \h </w:instrText>
+          <w:instrText xml:space="preserve"> PAGEREF _Toc520194410 \h </w:instrText>
         </w:r>
         <w:r>
           <w:rPr>
@@ -1052,7 +974,7 @@
           <w:szCs w:val="22"/>
         </w:rPr>
       </w:pPr>
-      <w:hyperlink w:anchor="_Toc512935232" w:history="1">
+      <w:hyperlink w:anchor="_Toc520194411" w:history="1">
         <w:r>
           <w:rPr>
             <w:rStyle w:val="Hyperlink"/>
@@ -1092,7 +1014,7 @@
           <w:rPr>
             <w:noProof/>
           </w:rPr>
-          <w:instrText xml:space="preserve"> PAGEREF _Toc512935232 \h </w:instrText>
+          <w:instrText xml:space="preserve"> PAGEREF _Toc520194411 \h </w:instrText>
         </w:r>
         <w:r>
           <w:rPr>
@@ -1133,7 +1055,7 @@
           <w:szCs w:val="22"/>
         </w:rPr>
       </w:pPr>
-      <w:hyperlink w:anchor="_Toc512935233" w:history="1">
+      <w:hyperlink w:anchor="_Toc520194412" w:history="1">
         <w:r>
           <w:rPr>
             <w:rStyle w:val="Hyperlink"/>
@@ -1173,7 +1095,7 @@
           <w:rPr>
             <w:noProof/>
           </w:rPr>
-          <w:instrText xml:space="preserve"> PAGEREF _Toc512935233 \h </w:instrText>
+          <w:instrText xml:space="preserve"> PAGEREF _Toc520194412 \h </w:instrText>
         </w:r>
         <w:r>
           <w:rPr>
@@ -1214,7 +1136,7 @@
           <w:szCs w:val="22"/>
         </w:rPr>
       </w:pPr>
-      <w:hyperlink w:anchor="_Toc512935234" w:history="1">
+      <w:hyperlink w:anchor="_Toc520194413" w:history="1">
         <w:r>
           <w:rPr>
             <w:rStyle w:val="Hyperlink"/>
@@ -1254,7 +1176,7 @@
           <w:rPr>
             <w:noProof/>
           </w:rPr>
-          <w:instrText xml:space="preserve"> PAGEREF _Toc512935234 \h </w:instrText>
+          <w:instrText xml:space="preserve"> PAGEREF _Toc520194413 \h </w:instrText>
         </w:r>
         <w:r>
           <w:rPr>
@@ -1290,7 +1212,7 @@
           <w:szCs w:val="22"/>
         </w:rPr>
       </w:pPr>
-      <w:hyperlink w:anchor="_Toc512935235" w:history="1">
+      <w:hyperlink w:anchor="_Toc520194414" w:history="1">
         <w:r>
           <w:rPr>
             <w:rStyle w:val="Hyperlink"/>
@@ -1318,7 +1240,7 @@
           <w:fldChar w:fldCharType="begin"/>
         </w:r>
         <w:r>
-          <w:instrText xml:space="preserve"> PAGEREF _Toc512935235 \h </w:instrText>
+          <w:instrText xml:space="preserve"> PAGEREF _Toc520194414 \h </w:instrText>
         </w:r>
         <w:r>
           <w:fldChar w:fldCharType="separate"/>
@@ -1340,7 +1262,7 @@
           <w:szCs w:val="22"/>
         </w:rPr>
       </w:pPr>
-      <w:hyperlink w:anchor="_Toc512935236" w:history="1">
+      <w:hyperlink w:anchor="_Toc520194415" w:history="1">
         <w:r>
           <w:rPr>
             <w:rStyle w:val="Hyperlink"/>
@@ -1368,7 +1290,7 @@
           <w:fldChar w:fldCharType="begin"/>
         </w:r>
         <w:r>
-          <w:instrText xml:space="preserve"> PAGEREF _Toc512935236 \h </w:instrText>
+          <w:instrText xml:space="preserve"> PAGEREF _Toc520194415 \h </w:instrText>
         </w:r>
         <w:r>
           <w:fldChar w:fldCharType="separate"/>
@@ -1390,7 +1312,7 @@
           <w:szCs w:val="22"/>
         </w:rPr>
       </w:pPr>
-      <w:hyperlink w:anchor="_Toc512935237" w:history="1">
+      <w:hyperlink w:anchor="_Toc520194416" w:history="1">
         <w:r>
           <w:rPr>
             <w:rStyle w:val="Hyperlink"/>
@@ -1418,7 +1340,7 @@
           <w:fldChar w:fldCharType="begin"/>
         </w:r>
         <w:r>
-          <w:instrText xml:space="preserve"> PAGEREF _Toc512935237 \h </w:instrText>
+          <w:instrText xml:space="preserve"> PAGEREF _Toc520194416 \h </w:instrText>
         </w:r>
         <w:r>
           <w:fldChar w:fldCharType="separate"/>
@@ -1440,7 +1362,7 @@
           <w:szCs w:val="22"/>
         </w:rPr>
       </w:pPr>
-      <w:hyperlink w:anchor="_Toc512935238" w:history="1">
+      <w:hyperlink w:anchor="_Toc520194417" w:history="1">
         <w:r>
           <w:rPr>
             <w:rStyle w:val="Hyperlink"/>
@@ -1468,7 +1390,7 @@
           <w:fldChar w:fldCharType="begin"/>
         </w:r>
         <w:r>
-          <w:instrText xml:space="preserve"> PAGEREF _Toc512935238 \h </w:instrText>
+          <w:instrText xml:space="preserve"> PAGEREF _Toc520194417 \h </w:instrText>
         </w:r>
         <w:r>
           <w:fldChar w:fldCharType="separate"/>
@@ -1490,7 +1412,7 @@
           <w:szCs w:val="22"/>
         </w:rPr>
       </w:pPr>
-      <w:hyperlink w:anchor="_Toc512935239" w:history="1">
+      <w:hyperlink w:anchor="_Toc520194418" w:history="1">
         <w:r>
           <w:rPr>
             <w:rStyle w:val="Hyperlink"/>
@@ -1518,7 +1440,7 @@
           <w:fldChar w:fldCharType="begin"/>
         </w:r>
         <w:r>
-          <w:instrText xml:space="preserve"> PAGEREF _Toc512935239 \h </w:instrText>
+          <w:instrText xml:space="preserve"> PAGEREF _Toc520194418 \h </w:instrText>
         </w:r>
         <w:r>
           <w:fldChar w:fldCharType="separate"/>
@@ -1545,7 +1467,7 @@
           <w:szCs w:val="22"/>
         </w:rPr>
       </w:pPr>
-      <w:hyperlink w:anchor="_Toc512935240" w:history="1">
+      <w:hyperlink w:anchor="_Toc520194419" w:history="1">
         <w:r>
           <w:rPr>
             <w:rStyle w:val="Hyperlink"/>
@@ -1585,7 +1507,7 @@
           <w:rPr>
             <w:noProof/>
           </w:rPr>
-          <w:instrText xml:space="preserve"> PAGEREF _Toc512935240 \h </w:instrText>
+          <w:instrText xml:space="preserve"> PAGEREF _Toc520194419 \h </w:instrText>
         </w:r>
         <w:r>
           <w:rPr>
@@ -1626,7 +1548,7 @@
           <w:szCs w:val="22"/>
         </w:rPr>
       </w:pPr>
-      <w:hyperlink w:anchor="_Toc512935241" w:history="1">
+      <w:hyperlink w:anchor="_Toc520194420" w:history="1">
         <w:r>
           <w:rPr>
             <w:rStyle w:val="Hyperlink"/>
@@ -1666,7 +1588,7 @@
           <w:rPr>
             <w:noProof/>
           </w:rPr>
-          <w:instrText xml:space="preserve"> PAGEREF _Toc512935241 \h </w:instrText>
+          <w:instrText xml:space="preserve"> PAGEREF _Toc520194420 \h </w:instrText>
         </w:r>
         <w:r>
           <w:rPr>
@@ -1702,7 +1624,7 @@
           <w:szCs w:val="22"/>
         </w:rPr>
       </w:pPr>
-      <w:hyperlink w:anchor="_Toc512935242" w:history="1">
+      <w:hyperlink w:anchor="_Toc520194421" w:history="1">
         <w:r>
           <w:rPr>
             <w:rStyle w:val="Hyperlink"/>
@@ -1730,7 +1652,7 @@
           <w:fldChar w:fldCharType="begin"/>
         </w:r>
         <w:r>
-          <w:instrText xml:space="preserve"> PAGEREF _Toc512935242 \h </w:instrText>
+          <w:instrText xml:space="preserve"> PAGEREF _Toc520194421 \h </w:instrText>
         </w:r>
         <w:r>
           <w:fldChar w:fldCharType="separate"/>
@@ -1752,7 +1674,7 @@
           <w:szCs w:val="22"/>
         </w:rPr>
       </w:pPr>
-      <w:hyperlink w:anchor="_Toc512935243" w:history="1">
+      <w:hyperlink w:anchor="_Toc520194422" w:history="1">
         <w:r>
           <w:rPr>
             <w:rStyle w:val="Hyperlink"/>
@@ -1780,7 +1702,7 @@
           <w:fldChar w:fldCharType="begin"/>
         </w:r>
         <w:r>
-          <w:instrText xml:space="preserve"> PAGEREF _Toc512935243 \h </w:instrText>
+          <w:instrText xml:space="preserve"> PAGEREF _Toc520194422 \h </w:instrText>
         </w:r>
         <w:r>
           <w:fldChar w:fldCharType="separate"/>
@@ -1807,7 +1729,7 @@
           <w:szCs w:val="22"/>
         </w:rPr>
       </w:pPr>
-      <w:hyperlink w:anchor="_Toc512935244" w:history="1">
+      <w:hyperlink w:anchor="_Toc520194423" w:history="1">
         <w:r>
           <w:rPr>
             <w:rStyle w:val="Hyperlink"/>
@@ -1847,7 +1769,7 @@
           <w:rPr>
             <w:noProof/>
           </w:rPr>
-          <w:instrText xml:space="preserve"> PAGEREF _Toc512935244 \h </w:instrText>
+          <w:instrText xml:space="preserve"> PAGEREF _Toc520194423 \h </w:instrText>
         </w:r>
         <w:r>
           <w:rPr>
@@ -1888,7 +1810,7 @@
           <w:szCs w:val="22"/>
         </w:rPr>
       </w:pPr>
-      <w:hyperlink w:anchor="_Toc512935245" w:history="1">
+      <w:hyperlink w:anchor="_Toc520194424" w:history="1">
         <w:r>
           <w:rPr>
             <w:rStyle w:val="Hyperlink"/>
@@ -1928,7 +1850,7 @@
           <w:rPr>
             <w:noProof/>
           </w:rPr>
-          <w:instrText xml:space="preserve"> PAGEREF _Toc512935245 \h </w:instrText>
+          <w:instrText xml:space="preserve"> PAGEREF _Toc520194424 \h </w:instrText>
         </w:r>
         <w:r>
           <w:rPr>
@@ -1964,7 +1886,7 @@
           <w:szCs w:val="22"/>
         </w:rPr>
       </w:pPr>
-      <w:hyperlink w:anchor="_Toc512935246" w:history="1">
+      <w:hyperlink w:anchor="_Toc520194425" w:history="1">
         <w:r>
           <w:rPr>
             <w:rStyle w:val="Hyperlink"/>
@@ -1992,7 +1914,7 @@
           <w:fldChar w:fldCharType="begin"/>
         </w:r>
         <w:r>
-          <w:instrText xml:space="preserve"> PAGEREF _Toc512935246 \h </w:instrText>
+          <w:instrText xml:space="preserve"> PAGEREF _Toc520194425 \h </w:instrText>
         </w:r>
         <w:r>
           <w:fldChar w:fldCharType="separate"/>
@@ -2014,7 +1936,7 @@
           <w:szCs w:val="22"/>
         </w:rPr>
       </w:pPr>
-      <w:hyperlink w:anchor="_Toc512935247" w:history="1">
+      <w:hyperlink w:anchor="_Toc520194426" w:history="1">
         <w:r>
           <w:rPr>
             <w:rStyle w:val="Hyperlink"/>
@@ -2042,7 +1964,7 @@
           <w:fldChar w:fldCharType="begin"/>
         </w:r>
         <w:r>
-          <w:instrText xml:space="preserve"> PAGEREF _Toc512935247 \h </w:instrText>
+          <w:instrText xml:space="preserve"> PAGEREF _Toc520194426 \h </w:instrText>
         </w:r>
         <w:r>
           <w:fldChar w:fldCharType="separate"/>
@@ -2064,7 +1986,7 @@
           <w:szCs w:val="22"/>
         </w:rPr>
       </w:pPr>
-      <w:hyperlink w:anchor="_Toc512935248" w:history="1">
+      <w:hyperlink w:anchor="_Toc520194427" w:history="1">
         <w:r>
           <w:rPr>
             <w:rStyle w:val="Hyperlink"/>
@@ -2092,7 +2014,7 @@
           <w:fldChar w:fldCharType="begin"/>
         </w:r>
         <w:r>
-          <w:instrText xml:space="preserve"> PAGEREF _Toc512935248 \h </w:instrText>
+          <w:instrText xml:space="preserve"> PAGEREF _Toc520194427 \h </w:instrText>
         </w:r>
         <w:r>
           <w:fldChar w:fldCharType="separate"/>
@@ -2114,7 +2036,7 @@
           <w:szCs w:val="22"/>
         </w:rPr>
       </w:pPr>
-      <w:hyperlink w:anchor="_Toc512935249" w:history="1">
+      <w:hyperlink w:anchor="_Toc520194428" w:history="1">
         <w:r>
           <w:rPr>
             <w:rStyle w:val="Hyperlink"/>
@@ -2142,7 +2064,7 @@
           <w:fldChar w:fldCharType="begin"/>
         </w:r>
         <w:r>
-          <w:instrText xml:space="preserve"> PAGEREF _Toc512935249 \h </w:instrText>
+          <w:instrText xml:space="preserve"> PAGEREF _Toc520194428 \h </w:instrText>
         </w:r>
         <w:r>
           <w:fldChar w:fldCharType="separate"/>
@@ -2169,7 +2091,7 @@
           <w:szCs w:val="22"/>
         </w:rPr>
       </w:pPr>
-      <w:hyperlink w:anchor="_Toc512935250" w:history="1">
+      <w:hyperlink w:anchor="_Toc520194429" w:history="1">
         <w:r>
           <w:rPr>
             <w:rStyle w:val="Hyperlink"/>
@@ -2209,7 +2131,7 @@
           <w:rPr>
             <w:noProof/>
           </w:rPr>
-          <w:instrText xml:space="preserve"> PAGEREF _Toc512935250 \h </w:instrText>
+          <w:instrText xml:space="preserve"> PAGEREF _Toc520194429 \h </w:instrText>
         </w:r>
         <w:r>
           <w:rPr>
@@ -2245,7 +2167,7 @@
           <w:szCs w:val="22"/>
         </w:rPr>
       </w:pPr>
-      <w:hyperlink w:anchor="_Toc512935251" w:history="1">
+      <w:hyperlink w:anchor="_Toc520194430" w:history="1">
         <w:r>
           <w:rPr>
             <w:rStyle w:val="Hyperlink"/>
@@ -2273,7 +2195,7 @@
           <w:fldChar w:fldCharType="begin"/>
         </w:r>
         <w:r>
-          <w:instrText xml:space="preserve"> PAGEREF _Toc512935251 \h </w:instrText>
+          <w:instrText xml:space="preserve"> PAGEREF _Toc520194430 \h </w:instrText>
         </w:r>
         <w:r>
           <w:fldChar w:fldCharType="separate"/>
@@ -2300,7 +2222,7 @@
           <w:szCs w:val="22"/>
         </w:rPr>
       </w:pPr>
-      <w:hyperlink w:anchor="_Toc512935252" w:history="1">
+      <w:hyperlink w:anchor="_Toc520194431" w:history="1">
         <w:r>
           <w:rPr>
             <w:rStyle w:val="Hyperlink"/>
@@ -2340,7 +2262,7 @@
           <w:rPr>
             <w:noProof/>
           </w:rPr>
-          <w:instrText xml:space="preserve"> PAGEREF _Toc512935252 \h </w:instrText>
+          <w:instrText xml:space="preserve"> PAGEREF _Toc520194431 \h </w:instrText>
         </w:r>
         <w:r>
           <w:rPr>
@@ -2381,7 +2303,7 @@
           <w:szCs w:val="22"/>
         </w:rPr>
       </w:pPr>
-      <w:hyperlink w:anchor="_Toc512935253" w:history="1">
+      <w:hyperlink w:anchor="_Toc520194432" w:history="1">
         <w:r>
           <w:rPr>
             <w:rStyle w:val="Hyperlink"/>
@@ -2421,7 +2343,7 @@
           <w:rPr>
             <w:noProof/>
           </w:rPr>
-          <w:instrText xml:space="preserve"> PAGEREF _Toc512935253 \h </w:instrText>
+          <w:instrText xml:space="preserve"> PAGEREF _Toc520194432 \h </w:instrText>
         </w:r>
         <w:r>
           <w:rPr>
@@ -2462,7 +2384,7 @@
           <w:szCs w:val="22"/>
         </w:rPr>
       </w:pPr>
-      <w:hyperlink w:anchor="_Toc512935254" w:history="1">
+      <w:hyperlink w:anchor="_Toc520194433" w:history="1">
         <w:r>
           <w:rPr>
             <w:rStyle w:val="Hyperlink"/>
@@ -2502,7 +2424,7 @@
           <w:rPr>
             <w:noProof/>
           </w:rPr>
-          <w:instrText xml:space="preserve"> PAGEREF _Toc512935254 \h </w:instrText>
+          <w:instrText xml:space="preserve"> PAGEREF _Toc520194433 \h </w:instrText>
         </w:r>
         <w:r>
           <w:rPr>
@@ -2543,7 +2465,7 @@
           <w:szCs w:val="22"/>
         </w:rPr>
       </w:pPr>
-      <w:hyperlink w:anchor="_Toc512935255" w:history="1">
+      <w:hyperlink w:anchor="_Toc520194434" w:history="1">
         <w:r>
           <w:rPr>
             <w:rStyle w:val="Hyperlink"/>
@@ -2583,7 +2505,7 @@
           <w:rPr>
             <w:noProof/>
           </w:rPr>
-          <w:instrText xml:space="preserve"> PAGEREF _Toc512935255 \h </w:instrText>
+          <w:instrText xml:space="preserve"> PAGEREF _Toc520194434 \h </w:instrText>
         </w:r>
         <w:r>
           <w:rPr>
@@ -2619,7 +2541,7 @@
           <w:szCs w:val="22"/>
         </w:rPr>
       </w:pPr>
-      <w:hyperlink w:anchor="_Toc512935256" w:history="1">
+      <w:hyperlink w:anchor="_Toc520194435" w:history="1">
         <w:r>
           <w:rPr>
             <w:rStyle w:val="Hyperlink"/>
@@ -2647,7 +2569,7 @@
           <w:fldChar w:fldCharType="begin"/>
         </w:r>
         <w:r>
-          <w:instrText xml:space="preserve"> PAGEREF _Toc512935256 \h </w:instrText>
+          <w:instrText xml:space="preserve"> PAGEREF _Toc520194435 \h </w:instrText>
         </w:r>
         <w:r>
           <w:fldChar w:fldCharType="separate"/>
@@ -2669,7 +2591,7 @@
           <w:szCs w:val="22"/>
         </w:rPr>
       </w:pPr>
-      <w:hyperlink w:anchor="_Toc512935257" w:history="1">
+      <w:hyperlink w:anchor="_Toc520194436" w:history="1">
         <w:r>
           <w:rPr>
             <w:rStyle w:val="Hyperlink"/>
@@ -2697,7 +2619,7 @@
           <w:fldChar w:fldCharType="begin"/>
         </w:r>
         <w:r>
-          <w:instrText xml:space="preserve"> PAGEREF _Toc512935257 \h </w:instrText>
+          <w:instrText xml:space="preserve"> PAGEREF _Toc520194436 \h </w:instrText>
         </w:r>
         <w:r>
           <w:fldChar w:fldCharType="separate"/>
@@ -2719,7 +2641,7 @@
           <w:szCs w:val="22"/>
         </w:rPr>
       </w:pPr>
-      <w:hyperlink w:anchor="_Toc512935258" w:history="1">
+      <w:hyperlink w:anchor="_Toc520194437" w:history="1">
         <w:r>
           <w:rPr>
             <w:rStyle w:val="Hyperlink"/>
@@ -2747,7 +2669,7 @@
           <w:fldChar w:fldCharType="begin"/>
         </w:r>
         <w:r>
-          <w:instrText xml:space="preserve"> PAGEREF _Toc512935258 \h </w:instrText>
+          <w:instrText xml:space="preserve"> PAGEREF _Toc520194437 \h </w:instrText>
         </w:r>
         <w:r>
           <w:fldChar w:fldCharType="separate"/>
@@ -2774,7 +2696,7 @@
           <w:szCs w:val="22"/>
         </w:rPr>
       </w:pPr>
-      <w:hyperlink w:anchor="_Toc512935259" w:history="1">
+      <w:hyperlink w:anchor="_Toc520194438" w:history="1">
         <w:r>
           <w:rPr>
             <w:rStyle w:val="Hyperlink"/>
@@ -2814,7 +2736,7 @@
           <w:rPr>
             <w:noProof/>
           </w:rPr>
-          <w:instrText xml:space="preserve"> PAGEREF _Toc512935259 \h </w:instrText>
+          <w:instrText xml:space="preserve"> PAGEREF _Toc520194438 \h </w:instrText>
         </w:r>
         <w:r>
           <w:rPr>
@@ -2872,7 +2794,7 @@
       <w:pPr>
         <w:pStyle w:val="Heading1"/>
       </w:pPr>
-      <w:bookmarkStart w:id="1" w:name="_Toc512935226"/>
+      <w:bookmarkStart w:id="1" w:name="_Toc520194400"/>
       <w:r>
         <w:lastRenderedPageBreak/>
         <w:t>Introduction</w:t>
@@ -3047,332 +2969,68 @@
       <w:pPr>
         <w:pStyle w:val="Heading2"/>
       </w:pPr>
-      <w:bookmarkStart w:id="2" w:name="_Toc512935227"/>
-      <w:r>
-        <w:lastRenderedPageBreak/>
-        <w:t>What’s New</w:t>
-      </w:r>
+      <w:bookmarkStart w:id="2" w:name="_Toc519674346"/>
+      <w:bookmarkStart w:id="3" w:name="_Toc520194088"/>
+      <w:bookmarkStart w:id="4" w:name="_Toc520194401"/>
+      <w:bookmarkStart w:id="5" w:name="_Toc519674347"/>
+      <w:bookmarkStart w:id="6" w:name="_Toc520194089"/>
+      <w:bookmarkStart w:id="7" w:name="_Toc520194402"/>
+      <w:bookmarkStart w:id="8" w:name="_Toc519674348"/>
+      <w:bookmarkStart w:id="9" w:name="_Toc520194090"/>
+      <w:bookmarkStart w:id="10" w:name="_Toc520194403"/>
+      <w:bookmarkStart w:id="11" w:name="_Toc519674349"/>
+      <w:bookmarkStart w:id="12" w:name="_Toc520194091"/>
+      <w:bookmarkStart w:id="13" w:name="_Toc520194404"/>
+      <w:bookmarkStart w:id="14" w:name="_Toc519674350"/>
+      <w:bookmarkStart w:id="15" w:name="_Toc520194092"/>
+      <w:bookmarkStart w:id="16" w:name="_Toc520194405"/>
+      <w:bookmarkStart w:id="17" w:name="_Toc519674351"/>
+      <w:bookmarkStart w:id="18" w:name="_Toc520194093"/>
+      <w:bookmarkStart w:id="19" w:name="_Toc520194406"/>
+      <w:bookmarkStart w:id="20" w:name="_Toc490831598"/>
+      <w:bookmarkStart w:id="21" w:name="_Toc490831599"/>
+      <w:bookmarkStart w:id="22" w:name="_Toc490831600"/>
+      <w:bookmarkStart w:id="23" w:name="_Toc490831601"/>
+      <w:bookmarkStart w:id="24" w:name="_Toc490831602"/>
+      <w:bookmarkStart w:id="25" w:name="_Toc490831603"/>
+      <w:bookmarkStart w:id="26" w:name="_Ref103071763"/>
+      <w:bookmarkStart w:id="27" w:name="_Ref103071794"/>
+      <w:bookmarkStart w:id="28" w:name="_Ref103073047"/>
+      <w:bookmarkStart w:id="29" w:name="_Ref103073090"/>
+      <w:bookmarkStart w:id="30" w:name="_Toc520194407"/>
       <w:bookmarkEnd w:id="2"/>
-    </w:p>
-    <w:p>
-      <w:pPr>
-        <w:pStyle w:val="EDBTXTNormalWebBlackCharChar1"/>
-        <w:rPr>
-          <w:color w:val="auto"/>
-        </w:rPr>
-      </w:pPr>
-      <w:r>
-        <w:t xml:space="preserve">The following </w:t>
-      </w:r>
-      <w:r>
-        <w:t>feature</w:t>
-      </w:r>
-      <w:r>
-        <w:t>s</w:t>
-      </w:r>
-      <w:r>
-        <w:t xml:space="preserve"> ha</w:t>
-      </w:r>
-      <w:r>
-        <w:t>ve</w:t>
-      </w:r>
-      <w:r>
-        <w:t xml:space="preserve"> been added to the Advanced Server .NET Connector 10.0.</w:t>
-      </w:r>
-      <w:r>
-        <w:t>1</w:t>
-      </w:r>
-      <w:r>
-        <w:t xml:space="preserve"> to produce Advanced Server .NET Connector 10.0.</w:t>
-      </w:r>
-      <w:r>
-        <w:t>2</w:t>
-      </w:r>
-      <w:r>
-        <w:rPr>
-          <w:color w:val="auto"/>
-        </w:rPr>
-        <w:t>:</w:t>
-      </w:r>
-    </w:p>
-    <w:p>
-      <w:pPr>
-        <w:pStyle w:val="EDBTXTNormalWebBlackCharChar1"/>
-        <w:numPr>
-          <w:ilvl w:val="0"/>
-          <w:numId w:val="2"/>
-        </w:numPr>
-        <w:tabs>
-          <w:tab w:val="left" w:pos="720"/>
-        </w:tabs>
-        <w:spacing w:before="0" w:after="0"/>
-        <w:rPr>
-          <w:lang w:eastAsia="ar-SA"/>
-        </w:rPr>
-      </w:pPr>
-      <w:r>
-        <w:rPr>
-          <w:lang w:eastAsia="ar-SA"/>
-        </w:rPr>
-        <w:t>Merged with the com</w:t>
-      </w:r>
-      <w:r>
-        <w:rPr>
-          <w:lang w:eastAsia="ar-SA"/>
-        </w:rPr>
-        <w:t>munity Npgsql driver version 3.2.</w:t>
-      </w:r>
-      <w:r>
-        <w:rPr>
-          <w:lang w:eastAsia="ar-SA"/>
-        </w:rPr>
-        <w:t>6</w:t>
-      </w:r>
-    </w:p>
-    <w:p>
-      <w:pPr>
-        <w:pStyle w:val="EDBTXTNormalWebBlackCharChar1"/>
-        <w:numPr>
-          <w:ilvl w:val="0"/>
-          <w:numId w:val="2"/>
-        </w:numPr>
-        <w:tabs>
-          <w:tab w:val="left" w:pos="720"/>
-        </w:tabs>
-        <w:spacing w:before="0" w:after="0"/>
-        <w:rPr>
-          <w:lang w:eastAsia="ar-SA"/>
-        </w:rPr>
-      </w:pPr>
-      <w:r>
-        <w:rPr>
-          <w:lang w:eastAsia="ar-SA"/>
-        </w:rPr>
-        <w:t xml:space="preserve">The .NET Connector now provides support for .NET Standard </w:t>
-      </w:r>
-      <w:r>
-        <w:rPr>
-          <w:lang w:eastAsia="ar-SA"/>
-        </w:rPr>
-        <w:t>2</w:t>
-      </w:r>
-      <w:r>
-        <w:rPr>
-          <w:lang w:eastAsia="ar-SA"/>
-        </w:rPr>
-        <w:t>.</w:t>
-      </w:r>
-      <w:r>
-        <w:rPr>
-          <w:lang w:eastAsia="ar-SA"/>
-        </w:rPr>
-        <w:t>0</w:t>
-      </w:r>
-      <w:r>
-        <w:rPr>
-          <w:lang w:eastAsia="ar-SA"/>
-        </w:rPr>
-        <w:t>. For more information, see Section</w:t>
-      </w:r>
-      <w:r>
-        <w:rPr>
-          <w:lang w:eastAsia="ar-SA"/>
-        </w:rPr>
-        <w:t xml:space="preserve"> </w:t>
-      </w:r>
-      <w:r>
-        <w:rPr>
-          <w:u w:val="single"/>
-          <w:lang w:eastAsia="ar-SA"/>
-        </w:rPr>
-        <w:fldChar w:fldCharType="begin"/>
-      </w:r>
-      <w:r>
-        <w:rPr>
-          <w:u w:val="single"/>
-          <w:lang w:eastAsia="ar-SA"/>
-        </w:rPr>
-        <w:instrText xml:space="preserve"> REF _Ref509321802 \r \h </w:instrText>
-      </w:r>
-      <w:r>
-        <w:rPr>
-          <w:u w:val="single"/>
-          <w:lang w:eastAsia="ar-SA"/>
-        </w:rPr>
-      </w:r>
-      <w:r>
-        <w:rPr>
-          <w:u w:val="single"/>
-          <w:lang w:eastAsia="ar-SA"/>
-        </w:rPr>
-        <w:fldChar w:fldCharType="separate"/>
-      </w:r>
-      <w:r>
-        <w:rPr>
-          <w:u w:val="single"/>
-          <w:lang w:eastAsia="ar-SA"/>
-        </w:rPr>
-        <w:t>3.2.5</w:t>
-      </w:r>
-      <w:r>
-        <w:rPr>
-          <w:u w:val="single"/>
-          <w:lang w:eastAsia="ar-SA"/>
-        </w:rPr>
-        <w:fldChar w:fldCharType="end"/>
-      </w:r>
-      <w:r>
-        <w:rPr>
-          <w:lang w:eastAsia="ar-SA"/>
-        </w:rPr>
-        <w:t>.</w:t>
-      </w:r>
-    </w:p>
-    <w:p>
-      <w:pPr>
-        <w:pStyle w:val="EDBTXTNormalWebBlackCharChar1"/>
-        <w:numPr>
-          <w:ilvl w:val="0"/>
-          <w:numId w:val="2"/>
-        </w:numPr>
-        <w:tabs>
-          <w:tab w:val="left" w:pos="720"/>
-        </w:tabs>
-        <w:spacing w:before="0" w:after="0"/>
-        <w:rPr>
-          <w:lang w:eastAsia="ar-SA"/>
-        </w:rPr>
-      </w:pPr>
-      <w:r>
-        <w:rPr>
-          <w:lang w:eastAsia="ar-SA"/>
-        </w:rPr>
-        <w:t>An Advanced Server database can</w:t>
-      </w:r>
-      <w:r>
-        <w:rPr>
-          <w:lang w:eastAsia="ar-SA"/>
-        </w:rPr>
-        <w:t xml:space="preserve"> now </w:t>
-      </w:r>
-      <w:r>
-        <w:rPr>
-          <w:lang w:eastAsia="ar-SA"/>
-        </w:rPr>
-        <w:t xml:space="preserve">be integrated </w:t>
-      </w:r>
-      <w:r>
-        <w:rPr>
-          <w:lang w:eastAsia="ar-SA"/>
-        </w:rPr>
-        <w:t>into Visual Studio 2017 in addition to</w:t>
-      </w:r>
-      <w:r>
-        <w:rPr>
-          <w:lang w:eastAsia="ar-SA"/>
-        </w:rPr>
-        <w:t xml:space="preserve"> Visual Studio</w:t>
-      </w:r>
-      <w:r>
-        <w:rPr>
-          <w:lang w:eastAsia="ar-SA"/>
-        </w:rPr>
-        <w:t xml:space="preserve"> 2015, thus providing the</w:t>
-      </w:r>
-      <w:r>
-        <w:rPr>
-          <w:lang w:eastAsia="ar-SA"/>
-        </w:rPr>
-        <w:t>se</w:t>
-      </w:r>
-      <w:r>
-        <w:rPr>
-          <w:lang w:eastAsia="ar-SA"/>
-        </w:rPr>
-        <w:t xml:space="preserve"> Visual Studio features. For more information, see Section </w:t>
-      </w:r>
-      <w:r>
-        <w:rPr>
-          <w:u w:val="single"/>
-          <w:lang w:eastAsia="ar-SA"/>
-        </w:rPr>
-        <w:fldChar w:fldCharType="begin"/>
-      </w:r>
-      <w:r>
-        <w:rPr>
-          <w:u w:val="single"/>
-          <w:lang w:eastAsia="ar-SA"/>
-        </w:rPr>
-        <w:instrText xml:space="preserve"> REF _Ref511382535 \r \h </w:instrText>
-      </w:r>
-      <w:r>
-        <w:rPr>
-          <w:u w:val="single"/>
-          <w:lang w:eastAsia="ar-SA"/>
-        </w:rPr>
-      </w:r>
-      <w:r>
-        <w:rPr>
-          <w:u w:val="single"/>
-          <w:lang w:eastAsia="ar-SA"/>
-        </w:rPr>
-        <w:fldChar w:fldCharType="separate"/>
-      </w:r>
-      <w:r>
-        <w:rPr>
-          <w:u w:val="single"/>
-          <w:lang w:eastAsia="ar-SA"/>
-        </w:rPr>
-        <w:t>3.4</w:t>
-      </w:r>
-      <w:r>
-        <w:rPr>
-          <w:u w:val="single"/>
-          <w:lang w:eastAsia="ar-SA"/>
-        </w:rPr>
-        <w:fldChar w:fldCharType="end"/>
-      </w:r>
-      <w:r>
-        <w:rPr>
-          <w:lang w:eastAsia="ar-SA"/>
-        </w:rPr>
-        <w:t>.</w:t>
-      </w:r>
-    </w:p>
-    <w:p>
-      <w:pPr>
-        <w:pStyle w:val="EDBTXTNormalWebBlackCharChar1"/>
-      </w:pPr>
-    </w:p>
-    <w:p>
-      <w:pPr>
-        <w:pStyle w:val="Heading2"/>
-      </w:pPr>
-      <w:bookmarkStart w:id="3" w:name="_Toc490831598"/>
-      <w:bookmarkStart w:id="4" w:name="_Toc490831599"/>
-      <w:bookmarkStart w:id="5" w:name="_Toc490831600"/>
-      <w:bookmarkStart w:id="6" w:name="_Toc490831601"/>
-      <w:bookmarkStart w:id="7" w:name="_Toc490831602"/>
-      <w:bookmarkStart w:id="8" w:name="_Toc490831603"/>
-      <w:bookmarkStart w:id="9" w:name="_Ref103071763"/>
-      <w:bookmarkStart w:id="10" w:name="_Ref103071794"/>
-      <w:bookmarkStart w:id="11" w:name="_Ref103073047"/>
-      <w:bookmarkStart w:id="12" w:name="_Ref103073090"/>
-      <w:bookmarkStart w:id="13" w:name="_Toc512935228"/>
       <w:bookmarkEnd w:id="3"/>
       <w:bookmarkEnd w:id="4"/>
       <w:bookmarkEnd w:id="5"/>
       <w:bookmarkEnd w:id="6"/>
       <w:bookmarkEnd w:id="7"/>
       <w:bookmarkEnd w:id="8"/>
-      <w:r>
-        <w:t>Typographical Conventions Used in this Guide</w:t>
-      </w:r>
       <w:bookmarkEnd w:id="9"/>
       <w:bookmarkEnd w:id="10"/>
       <w:bookmarkEnd w:id="11"/>
       <w:bookmarkEnd w:id="12"/>
       <w:bookmarkEnd w:id="13"/>
+      <w:bookmarkEnd w:id="14"/>
+      <w:bookmarkEnd w:id="15"/>
+      <w:bookmarkEnd w:id="16"/>
+      <w:bookmarkEnd w:id="17"/>
+      <w:bookmarkEnd w:id="18"/>
+      <w:bookmarkEnd w:id="19"/>
+      <w:bookmarkEnd w:id="20"/>
+      <w:bookmarkEnd w:id="21"/>
+      <w:bookmarkEnd w:id="22"/>
+      <w:bookmarkEnd w:id="23"/>
+      <w:bookmarkEnd w:id="24"/>
+      <w:bookmarkEnd w:id="25"/>
+      <w:r>
+        <w:lastRenderedPageBreak/>
+        <w:t>Typographical Conventions Used in this Guide</w:t>
+      </w:r>
+      <w:bookmarkEnd w:id="26"/>
+      <w:bookmarkEnd w:id="27"/>
+      <w:bookmarkEnd w:id="28"/>
+      <w:bookmarkEnd w:id="29"/>
+      <w:bookmarkEnd w:id="30"/>
     </w:p>
     <w:p>
       <w:pPr>
@@ -3749,19 +3407,19 @@
         </w:rPr>
         <w:t>”.</w:t>
       </w:r>
-      <w:bookmarkStart w:id="14" w:name="_First_level_Heading"/>
-      <w:bookmarkEnd w:id="14"/>
+      <w:bookmarkStart w:id="31" w:name="_First_level_Heading"/>
+      <w:bookmarkEnd w:id="31"/>
     </w:p>
     <w:p>
       <w:pPr>
         <w:pStyle w:val="Heading1"/>
       </w:pPr>
-      <w:bookmarkStart w:id="15" w:name="_Toc512935229"/>
+      <w:bookmarkStart w:id="32" w:name="_Toc520194408"/>
       <w:r>
         <w:lastRenderedPageBreak/>
         <w:t>The Advanced Server .NET Connector - Overview</w:t>
       </w:r>
-      <w:bookmarkEnd w:id="15"/>
+      <w:bookmarkEnd w:id="32"/>
     </w:p>
     <w:p>
       <w:pPr>
@@ -3822,11 +3480,11 @@
       <w:pPr>
         <w:pStyle w:val="Heading2"/>
       </w:pPr>
-      <w:bookmarkStart w:id="16" w:name="_Toc512935230"/>
+      <w:bookmarkStart w:id="33" w:name="_Toc520194409"/>
       <w:r>
         <w:t>The .NET Class Hierarchy</w:t>
       </w:r>
-      <w:bookmarkEnd w:id="16"/>
+      <w:bookmarkEnd w:id="33"/>
     </w:p>
     <w:p>
       <w:pPr>
@@ -4109,12 +3767,12 @@
       <w:pPr>
         <w:pStyle w:val="Heading2"/>
       </w:pPr>
-      <w:bookmarkStart w:id="17" w:name="_Toc512935231"/>
+      <w:bookmarkStart w:id="34" w:name="_Toc520194410"/>
       <w:r>
         <w:lastRenderedPageBreak/>
         <w:t>Installing the .NET Connector</w:t>
       </w:r>
-      <w:bookmarkEnd w:id="17"/>
+      <w:bookmarkEnd w:id="34"/>
     </w:p>
     <w:p>
       <w:pPr>
@@ -4158,7 +3816,7 @@
           <w:rPr>
             <w:rStyle w:val="Hyperlink"/>
           </w:rPr>
-          <w:t>www.enterprisedb.com</w:t>
+          <w:t>https://www.enterprisedb.com/advanced-downloads</w:t>
         </w:r>
       </w:hyperlink>
     </w:p>
@@ -4187,12 +3845,14 @@
       <w:r>
         <w:t xml:space="preserve"> </w:t>
       </w:r>
+      <w:proofErr w:type="gramStart"/>
       <w:r>
         <w:rPr>
           <w:rStyle w:val="EDBTXTKeywordBlack"/>
         </w:rPr>
         <w:t>As</w:t>
       </w:r>
+      <w:proofErr w:type="gramEnd"/>
       <w:r>
         <w:t xml:space="preserve"> </w:t>
       </w:r>
@@ -4234,7 +3894,7 @@
           <w:noProof/>
         </w:rPr>
         <w:drawing>
-          <wp:inline distT="0" distB="0" distL="0" distR="0" wp14:anchorId="0FD3220C" wp14:editId="31CDD6EA">
+          <wp:inline distT="0" distB="0" distL="0" distR="0" wp14:anchorId="1FD9AE5E" wp14:editId="7D031739">
             <wp:extent cx="3886200" cy="3037805"/>
             <wp:effectExtent l="0" t="0" r="0" b="0"/>
             <wp:docPr id="2" name="Picture 2"/>
@@ -4343,7 +4003,7 @@
         </w:rPr>
         <w:lastRenderedPageBreak/>
         <w:drawing>
-          <wp:inline distT="0" distB="0" distL="0" distR="0" wp14:anchorId="40BA9D75" wp14:editId="52377229">
+          <wp:inline distT="0" distB="0" distL="0" distR="0" wp14:anchorId="7A9EE60E" wp14:editId="3CECAD22">
             <wp:extent cx="3886200" cy="3046927"/>
             <wp:effectExtent l="0" t="0" r="0" b="1270"/>
             <wp:docPr id="3" name="Picture 3"/>
@@ -4478,7 +4138,7 @@
           <w:noProof/>
         </w:rPr>
         <w:drawing>
-          <wp:inline distT="0" distB="0" distL="0" distR="0" wp14:anchorId="342374DF" wp14:editId="4F477104">
+          <wp:inline distT="0" distB="0" distL="0" distR="0" wp14:anchorId="5EBAC98A" wp14:editId="3ED2AB51">
             <wp:extent cx="4114800" cy="3217552"/>
             <wp:effectExtent l="0" t="0" r="0" b="1905"/>
             <wp:docPr id="4" name="Picture 4"/>
@@ -4623,7 +4283,7 @@
           <w:noProof/>
         </w:rPr>
         <w:drawing>
-          <wp:inline distT="0" distB="0" distL="0" distR="0" wp14:anchorId="02C796C6" wp14:editId="3DEFE81F">
+          <wp:inline distT="0" distB="0" distL="0" distR="0" wp14:anchorId="330329C1" wp14:editId="1B659719">
             <wp:extent cx="4114800" cy="3194511"/>
             <wp:effectExtent l="0" t="0" r="0" b="6350"/>
             <wp:docPr id="5" name="Picture 5"/>
@@ -4796,7 +4456,7 @@
           <w:noProof/>
         </w:rPr>
         <w:drawing>
-          <wp:inline distT="0" distB="0" distL="0" distR="0" wp14:anchorId="37A8BDF6" wp14:editId="5F8C68E5">
+          <wp:inline distT="0" distB="0" distL="0" distR="0" wp14:anchorId="23626696" wp14:editId="11064D6E">
             <wp:extent cx="3790950" cy="1619051"/>
             <wp:effectExtent l="0" t="0" r="0" b="635"/>
             <wp:docPr id="12" name="Picture 12" descr="C:\Users\susan\AppData\Local\Temp\vmware-susan\VMwareDnD\7412d23f\Screen Shot 2016-07-11 at 4.50.20 PM.png"/>
@@ -4963,7 +4623,7 @@
         </w:rPr>
         <w:lastRenderedPageBreak/>
         <w:drawing>
-          <wp:inline distT="0" distB="0" distL="0" distR="0" wp14:anchorId="28A113ED" wp14:editId="468632CE">
+          <wp:inline distT="0" distB="0" distL="0" distR="0" wp14:anchorId="39D52CA2" wp14:editId="421E1B1E">
             <wp:extent cx="4116527" cy="2992582"/>
             <wp:effectExtent l="0" t="0" r="0" b="0"/>
             <wp:docPr id="10" name="Picture 10"/>
@@ -5068,14 +4728,14 @@
       <w:pPr>
         <w:pStyle w:val="Heading1"/>
       </w:pPr>
-      <w:bookmarkStart w:id="18" w:name="_Ref456012125"/>
-      <w:bookmarkStart w:id="19" w:name="_Toc512935232"/>
+      <w:bookmarkStart w:id="35" w:name="_Ref456012125"/>
+      <w:bookmarkStart w:id="36" w:name="_Toc520194411"/>
       <w:r>
         <w:lastRenderedPageBreak/>
         <w:t>Configuring the .NET Connector</w:t>
       </w:r>
-      <w:bookmarkEnd w:id="18"/>
-      <w:bookmarkEnd w:id="19"/>
+      <w:bookmarkEnd w:id="35"/>
+      <w:bookmarkEnd w:id="36"/>
     </w:p>
     <w:p>
       <w:pPr>
@@ -5351,13 +5011,13 @@
       <w:pPr>
         <w:pStyle w:val="Heading2"/>
       </w:pPr>
-      <w:bookmarkStart w:id="20" w:name="_Ref477525249"/>
-      <w:bookmarkStart w:id="21" w:name="_Toc512935233"/>
+      <w:bookmarkStart w:id="37" w:name="_Ref477525249"/>
+      <w:bookmarkStart w:id="38" w:name="_Toc520194412"/>
       <w:r>
         <w:t>General Instructions</w:t>
       </w:r>
-      <w:bookmarkEnd w:id="20"/>
-      <w:bookmarkEnd w:id="21"/>
+      <w:bookmarkEnd w:id="37"/>
+      <w:bookmarkEnd w:id="38"/>
     </w:p>
     <w:p>
       <w:pPr>
@@ -5618,14 +5278,14 @@
       <w:pPr>
         <w:pStyle w:val="Heading2"/>
       </w:pPr>
-      <w:bookmarkStart w:id="22" w:name="_Toc512935234"/>
+      <w:bookmarkStart w:id="39" w:name="_Toc520194413"/>
       <w:r>
         <w:t xml:space="preserve">.NET Framework </w:t>
       </w:r>
       <w:r>
         <w:t>Setup</w:t>
       </w:r>
-      <w:bookmarkEnd w:id="22"/>
+      <w:bookmarkEnd w:id="39"/>
     </w:p>
     <w:p>
       <w:pPr>
@@ -5645,11 +5305,11 @@
       <w:pPr>
         <w:pStyle w:val="Heading3"/>
       </w:pPr>
-      <w:bookmarkStart w:id="23" w:name="_Toc512935235"/>
+      <w:bookmarkStart w:id="40" w:name="_Toc520194414"/>
       <w:r>
         <w:t>.NET Framework 4.0</w:t>
       </w:r>
-      <w:bookmarkEnd w:id="23"/>
+      <w:bookmarkEnd w:id="40"/>
     </w:p>
     <w:p>
       <w:pPr>
@@ -5851,15 +5511,15 @@
       <w:pPr>
         <w:pStyle w:val="Heading3"/>
       </w:pPr>
-      <w:bookmarkStart w:id="24" w:name="_Ref503423964"/>
-      <w:bookmarkStart w:id="25" w:name="_Ref503430964"/>
-      <w:bookmarkStart w:id="26" w:name="_Toc512935236"/>
+      <w:bookmarkStart w:id="41" w:name="_Ref503423964"/>
+      <w:bookmarkStart w:id="42" w:name="_Ref503430964"/>
+      <w:bookmarkStart w:id="43" w:name="_Toc520194415"/>
       <w:r>
         <w:t>.NET Framework 4.5</w:t>
       </w:r>
-      <w:bookmarkEnd w:id="24"/>
-      <w:bookmarkEnd w:id="25"/>
-      <w:bookmarkEnd w:id="26"/>
+      <w:bookmarkEnd w:id="41"/>
+      <w:bookmarkEnd w:id="42"/>
+      <w:bookmarkEnd w:id="43"/>
     </w:p>
     <w:p>
       <w:pPr>
@@ -6150,15 +5810,15 @@
       <w:pPr>
         <w:pStyle w:val="Heading3"/>
       </w:pPr>
-      <w:bookmarkStart w:id="27" w:name="_Ref503423994"/>
-      <w:bookmarkStart w:id="28" w:name="_Ref503431008"/>
-      <w:bookmarkStart w:id="29" w:name="_Toc512935237"/>
+      <w:bookmarkStart w:id="44" w:name="_Ref503423994"/>
+      <w:bookmarkStart w:id="45" w:name="_Ref503431008"/>
+      <w:bookmarkStart w:id="46" w:name="_Toc520194416"/>
       <w:r>
         <w:t>.NET Framework 4.5.1</w:t>
       </w:r>
-      <w:bookmarkEnd w:id="27"/>
-      <w:bookmarkEnd w:id="28"/>
-      <w:bookmarkEnd w:id="29"/>
+      <w:bookmarkEnd w:id="44"/>
+      <w:bookmarkEnd w:id="45"/>
+      <w:bookmarkEnd w:id="46"/>
     </w:p>
     <w:p>
       <w:pPr>
@@ -6472,13 +6132,13 @@
       <w:pPr>
         <w:pStyle w:val="Heading3"/>
       </w:pPr>
-      <w:bookmarkStart w:id="30" w:name="_Ref503431048"/>
-      <w:bookmarkStart w:id="31" w:name="_Toc512935238"/>
+      <w:bookmarkStart w:id="47" w:name="_Ref503431048"/>
+      <w:bookmarkStart w:id="48" w:name="_Toc520194417"/>
       <w:r>
         <w:t>.NET Standard 1.3</w:t>
       </w:r>
-      <w:bookmarkEnd w:id="30"/>
-      <w:bookmarkEnd w:id="31"/>
+      <w:bookmarkEnd w:id="47"/>
+      <w:bookmarkEnd w:id="48"/>
     </w:p>
     <w:p>
       <w:pPr>
@@ -6630,14 +6290,14 @@
       <w:pPr>
         <w:pStyle w:val="Heading3"/>
       </w:pPr>
-      <w:bookmarkStart w:id="32" w:name="_Ref509321802"/>
-      <w:bookmarkStart w:id="33" w:name="_Toc512935239"/>
+      <w:bookmarkStart w:id="49" w:name="_Ref509321802"/>
+      <w:bookmarkStart w:id="50" w:name="_Toc520194418"/>
       <w:r>
         <w:lastRenderedPageBreak/>
         <w:t>.NET Standard 2.0</w:t>
       </w:r>
-      <w:bookmarkEnd w:id="32"/>
-      <w:bookmarkEnd w:id="33"/>
+      <w:bookmarkEnd w:id="49"/>
+      <w:bookmarkEnd w:id="50"/>
     </w:p>
     <w:p>
       <w:pPr>
@@ -6801,8 +6461,8 @@
       <w:pPr>
         <w:pStyle w:val="Heading2"/>
       </w:pPr>
-      <w:bookmarkStart w:id="34" w:name="_Ref477527440"/>
-      <w:bookmarkStart w:id="35" w:name="_Toc512935240"/>
+      <w:bookmarkStart w:id="51" w:name="_Ref477527440"/>
+      <w:bookmarkStart w:id="52" w:name="_Toc520194419"/>
       <w:r>
         <w:t xml:space="preserve">Entity Framework </w:t>
       </w:r>
@@ -6812,8 +6472,8 @@
       <w:r>
         <w:t>6</w:t>
       </w:r>
-      <w:bookmarkEnd w:id="34"/>
-      <w:bookmarkEnd w:id="35"/>
+      <w:bookmarkEnd w:id="51"/>
+      <w:bookmarkEnd w:id="52"/>
     </w:p>
     <w:p>
       <w:pPr>
@@ -7688,9 +7348,9 @@
       <w:pPr>
         <w:pStyle w:val="Heading2"/>
       </w:pPr>
-      <w:bookmarkStart w:id="36" w:name="_Ref477528081"/>
-      <w:bookmarkStart w:id="37" w:name="_Ref511382535"/>
-      <w:bookmarkStart w:id="38" w:name="_Toc512935241"/>
+      <w:bookmarkStart w:id="53" w:name="_Ref477528081"/>
+      <w:bookmarkStart w:id="54" w:name="_Ref511382535"/>
+      <w:bookmarkStart w:id="55" w:name="_Toc520194420"/>
       <w:r>
         <w:t>E</w:t>
       </w:r>
@@ -7700,15 +7360,15 @@
       <w:r>
         <w:t xml:space="preserve"> for Visual Studio</w:t>
       </w:r>
-      <w:bookmarkEnd w:id="36"/>
+      <w:bookmarkEnd w:id="53"/>
       <w:r>
         <w:t xml:space="preserve"> 2015</w:t>
       </w:r>
-      <w:bookmarkEnd w:id="37"/>
+      <w:bookmarkEnd w:id="54"/>
       <w:r>
         <w:t>/2017</w:t>
       </w:r>
-      <w:bookmarkEnd w:id="38"/>
+      <w:bookmarkEnd w:id="55"/>
     </w:p>
     <w:p>
       <w:pPr>
@@ -7879,14 +7539,14 @@
       <w:pPr>
         <w:pStyle w:val="Heading3"/>
       </w:pPr>
-      <w:bookmarkStart w:id="39" w:name="_Toc512935242"/>
+      <w:bookmarkStart w:id="56" w:name="_Toc520194421"/>
       <w:r>
         <w:t>Installation and Configuration for Visual Studio 2015</w:t>
       </w:r>
       <w:r>
         <w:t>/2017</w:t>
       </w:r>
-      <w:bookmarkEnd w:id="39"/>
+      <w:bookmarkEnd w:id="56"/>
     </w:p>
     <w:p>
       <w:pPr>
@@ -8103,148 +7763,131 @@
       <w:pPr>
         <w:pStyle w:val="Heading3"/>
       </w:pPr>
-      <w:bookmarkStart w:id="40" w:name="_Toc512575239"/>
-      <w:bookmarkStart w:id="41" w:name="_Toc512579341"/>
-      <w:bookmarkStart w:id="42" w:name="_Toc512580109"/>
-      <w:bookmarkStart w:id="43" w:name="_Toc512580597"/>
-      <w:bookmarkStart w:id="44" w:name="_Toc512575240"/>
-      <w:bookmarkStart w:id="45" w:name="_Toc512579342"/>
-      <w:bookmarkStart w:id="46" w:name="_Toc512580110"/>
-      <w:bookmarkStart w:id="47" w:name="_Toc512580598"/>
-      <w:bookmarkStart w:id="48" w:name="_Toc512575241"/>
-      <w:bookmarkStart w:id="49" w:name="_Toc512579343"/>
-      <w:bookmarkStart w:id="50" w:name="_Toc512580111"/>
-      <w:bookmarkStart w:id="51" w:name="_Toc512580599"/>
-      <w:bookmarkStart w:id="52" w:name="_Toc512575242"/>
-      <w:bookmarkStart w:id="53" w:name="_Toc512579344"/>
-      <w:bookmarkStart w:id="54" w:name="_Toc512580112"/>
-      <w:bookmarkStart w:id="55" w:name="_Toc512580600"/>
-      <w:bookmarkStart w:id="56" w:name="_Toc511385085"/>
-      <w:bookmarkStart w:id="57" w:name="_Toc511634305"/>
-      <w:bookmarkStart w:id="58" w:name="_Toc511635201"/>
-      <w:bookmarkStart w:id="59" w:name="_Toc511635262"/>
-      <w:bookmarkStart w:id="60" w:name="_Toc511385086"/>
-      <w:bookmarkStart w:id="61" w:name="_Toc511634306"/>
-      <w:bookmarkStart w:id="62" w:name="_Toc511635202"/>
-      <w:bookmarkStart w:id="63" w:name="_Toc511635263"/>
-      <w:bookmarkStart w:id="64" w:name="_Toc511385087"/>
-      <w:bookmarkStart w:id="65" w:name="_Toc511634307"/>
-      <w:bookmarkStart w:id="66" w:name="_Toc511635203"/>
-      <w:bookmarkStart w:id="67" w:name="_Toc511635264"/>
-      <w:bookmarkStart w:id="68" w:name="_Toc511385088"/>
-      <w:bookmarkStart w:id="69" w:name="_Toc511634308"/>
-      <w:bookmarkStart w:id="70" w:name="_Toc511635204"/>
-      <w:bookmarkStart w:id="71" w:name="_Toc511635265"/>
-      <w:bookmarkStart w:id="72" w:name="_Toc511385089"/>
-      <w:bookmarkStart w:id="73" w:name="_Toc511634309"/>
-      <w:bookmarkStart w:id="74" w:name="_Toc511635205"/>
-      <w:bookmarkStart w:id="75" w:name="_Toc511635266"/>
-      <w:bookmarkStart w:id="76" w:name="_Toc511385090"/>
-      <w:bookmarkStart w:id="77" w:name="_Toc511634310"/>
-      <w:bookmarkStart w:id="78" w:name="_Toc511635206"/>
-      <w:bookmarkStart w:id="79" w:name="_Toc511635267"/>
-      <w:bookmarkStart w:id="80" w:name="_Toc511385091"/>
-      <w:bookmarkStart w:id="81" w:name="_Toc511634311"/>
-      <w:bookmarkStart w:id="82" w:name="_Toc511635207"/>
-      <w:bookmarkStart w:id="83" w:name="_Toc511635268"/>
-      <w:bookmarkStart w:id="84" w:name="_Toc511385092"/>
-      <w:bookmarkStart w:id="85" w:name="_Toc511634312"/>
-      <w:bookmarkStart w:id="86" w:name="_Toc511635208"/>
-      <w:bookmarkStart w:id="87" w:name="_Toc511635269"/>
-      <w:bookmarkStart w:id="88" w:name="_Toc511385093"/>
-      <w:bookmarkStart w:id="89" w:name="_Toc511634313"/>
-      <w:bookmarkStart w:id="90" w:name="_Toc511635209"/>
-      <w:bookmarkStart w:id="91" w:name="_Toc511635270"/>
-      <w:bookmarkStart w:id="92" w:name="_Toc511385094"/>
-      <w:bookmarkStart w:id="93" w:name="_Toc511634314"/>
-      <w:bookmarkStart w:id="94" w:name="_Toc511635210"/>
-      <w:bookmarkStart w:id="95" w:name="_Toc511635271"/>
-      <w:bookmarkStart w:id="96" w:name="_Toc511385095"/>
-      <w:bookmarkStart w:id="97" w:name="_Toc511634315"/>
-      <w:bookmarkStart w:id="98" w:name="_Toc511635211"/>
-      <w:bookmarkStart w:id="99" w:name="_Toc511635272"/>
-      <w:bookmarkStart w:id="100" w:name="_Toc511385096"/>
-      <w:bookmarkStart w:id="101" w:name="_Toc511634316"/>
-      <w:bookmarkStart w:id="102" w:name="_Toc511635212"/>
-      <w:bookmarkStart w:id="103" w:name="_Toc511635273"/>
-      <w:bookmarkStart w:id="104" w:name="_Toc511385097"/>
-      <w:bookmarkStart w:id="105" w:name="_Toc511634317"/>
-      <w:bookmarkStart w:id="106" w:name="_Toc511635213"/>
-      <w:bookmarkStart w:id="107" w:name="_Toc511635274"/>
-      <w:bookmarkStart w:id="108" w:name="_Toc511385098"/>
-      <w:bookmarkStart w:id="109" w:name="_Toc511634318"/>
-      <w:bookmarkStart w:id="110" w:name="_Toc511635214"/>
-      <w:bookmarkStart w:id="111" w:name="_Toc511635275"/>
-      <w:bookmarkStart w:id="112" w:name="_Toc511385099"/>
-      <w:bookmarkStart w:id="113" w:name="_Toc511634319"/>
-      <w:bookmarkStart w:id="114" w:name="_Toc511635215"/>
-      <w:bookmarkStart w:id="115" w:name="_Toc511635276"/>
-      <w:bookmarkStart w:id="116" w:name="_Toc511385100"/>
-      <w:bookmarkStart w:id="117" w:name="_Toc511634320"/>
-      <w:bookmarkStart w:id="118" w:name="_Toc511635216"/>
-      <w:bookmarkStart w:id="119" w:name="_Toc511635277"/>
-      <w:bookmarkStart w:id="120" w:name="_Toc511385101"/>
-      <w:bookmarkStart w:id="121" w:name="_Toc511634321"/>
-      <w:bookmarkStart w:id="122" w:name="_Toc511635217"/>
-      <w:bookmarkStart w:id="123" w:name="_Toc511635278"/>
-      <w:bookmarkStart w:id="124" w:name="_Toc511385102"/>
-      <w:bookmarkStart w:id="125" w:name="_Toc511634322"/>
-      <w:bookmarkStart w:id="126" w:name="_Toc511635218"/>
-      <w:bookmarkStart w:id="127" w:name="_Toc511635279"/>
-      <w:bookmarkStart w:id="128" w:name="_Toc511385103"/>
-      <w:bookmarkStart w:id="129" w:name="_Toc511634323"/>
-      <w:bookmarkStart w:id="130" w:name="_Toc511635219"/>
-      <w:bookmarkStart w:id="131" w:name="_Toc511635280"/>
-      <w:bookmarkStart w:id="132" w:name="_Toc511385104"/>
-      <w:bookmarkStart w:id="133" w:name="_Toc511634324"/>
-      <w:bookmarkStart w:id="134" w:name="_Toc511635220"/>
-      <w:bookmarkStart w:id="135" w:name="_Toc511635281"/>
-      <w:bookmarkStart w:id="136" w:name="_Toc511385105"/>
-      <w:bookmarkStart w:id="137" w:name="_Toc511634325"/>
-      <w:bookmarkStart w:id="138" w:name="_Toc511635221"/>
-      <w:bookmarkStart w:id="139" w:name="_Toc511635282"/>
-      <w:bookmarkStart w:id="140" w:name="_Toc511385106"/>
-      <w:bookmarkStart w:id="141" w:name="_Toc511634326"/>
-      <w:bookmarkStart w:id="142" w:name="_Toc511635222"/>
-      <w:bookmarkStart w:id="143" w:name="_Toc511635283"/>
-      <w:bookmarkStart w:id="144" w:name="_Toc511385107"/>
-      <w:bookmarkStart w:id="145" w:name="_Toc511634327"/>
-      <w:bookmarkStart w:id="146" w:name="_Toc511635223"/>
-      <w:bookmarkStart w:id="147" w:name="_Toc511635284"/>
-      <w:bookmarkStart w:id="148" w:name="_Toc511385108"/>
-      <w:bookmarkStart w:id="149" w:name="_Toc511634328"/>
-      <w:bookmarkStart w:id="150" w:name="_Toc511635224"/>
-      <w:bookmarkStart w:id="151" w:name="_Toc511635285"/>
-      <w:bookmarkStart w:id="152" w:name="_Toc511385109"/>
-      <w:bookmarkStart w:id="153" w:name="_Toc511634329"/>
-      <w:bookmarkStart w:id="154" w:name="_Toc511635225"/>
-      <w:bookmarkStart w:id="155" w:name="_Toc511635286"/>
-      <w:bookmarkStart w:id="156" w:name="_Toc511385110"/>
-      <w:bookmarkStart w:id="157" w:name="_Toc511634330"/>
-      <w:bookmarkStart w:id="158" w:name="_Toc511635226"/>
-      <w:bookmarkStart w:id="159" w:name="_Toc511635287"/>
-      <w:bookmarkStart w:id="160" w:name="_Toc511385111"/>
-      <w:bookmarkStart w:id="161" w:name="_Toc511634331"/>
-      <w:bookmarkStart w:id="162" w:name="_Toc511635227"/>
-      <w:bookmarkStart w:id="163" w:name="_Toc511635288"/>
-      <w:bookmarkStart w:id="164" w:name="_Toc512935243"/>
-      <w:bookmarkEnd w:id="40"/>
-      <w:bookmarkEnd w:id="41"/>
-      <w:bookmarkEnd w:id="42"/>
-      <w:bookmarkEnd w:id="43"/>
-      <w:bookmarkEnd w:id="44"/>
-      <w:bookmarkEnd w:id="45"/>
-      <w:bookmarkEnd w:id="46"/>
-      <w:bookmarkEnd w:id="47"/>
-      <w:bookmarkEnd w:id="48"/>
-      <w:bookmarkEnd w:id="49"/>
-      <w:bookmarkEnd w:id="50"/>
-      <w:bookmarkEnd w:id="51"/>
-      <w:bookmarkEnd w:id="52"/>
-      <w:bookmarkEnd w:id="53"/>
-      <w:bookmarkEnd w:id="54"/>
-      <w:bookmarkEnd w:id="55"/>
-      <w:bookmarkEnd w:id="56"/>
+      <w:bookmarkStart w:id="57" w:name="_Toc512575239"/>
+      <w:bookmarkStart w:id="58" w:name="_Toc512579341"/>
+      <w:bookmarkStart w:id="59" w:name="_Toc512580109"/>
+      <w:bookmarkStart w:id="60" w:name="_Toc512580597"/>
+      <w:bookmarkStart w:id="61" w:name="_Toc512575240"/>
+      <w:bookmarkStart w:id="62" w:name="_Toc512579342"/>
+      <w:bookmarkStart w:id="63" w:name="_Toc512580110"/>
+      <w:bookmarkStart w:id="64" w:name="_Toc512580598"/>
+      <w:bookmarkStart w:id="65" w:name="_Toc512575241"/>
+      <w:bookmarkStart w:id="66" w:name="_Toc512579343"/>
+      <w:bookmarkStart w:id="67" w:name="_Toc512580111"/>
+      <w:bookmarkStart w:id="68" w:name="_Toc512580599"/>
+      <w:bookmarkStart w:id="69" w:name="_Toc512575242"/>
+      <w:bookmarkStart w:id="70" w:name="_Toc512579344"/>
+      <w:bookmarkStart w:id="71" w:name="_Toc512580112"/>
+      <w:bookmarkStart w:id="72" w:name="_Toc512580600"/>
+      <w:bookmarkStart w:id="73" w:name="_Toc511385085"/>
+      <w:bookmarkStart w:id="74" w:name="_Toc511634305"/>
+      <w:bookmarkStart w:id="75" w:name="_Toc511635201"/>
+      <w:bookmarkStart w:id="76" w:name="_Toc511635262"/>
+      <w:bookmarkStart w:id="77" w:name="_Toc511385086"/>
+      <w:bookmarkStart w:id="78" w:name="_Toc511634306"/>
+      <w:bookmarkStart w:id="79" w:name="_Toc511635202"/>
+      <w:bookmarkStart w:id="80" w:name="_Toc511635263"/>
+      <w:bookmarkStart w:id="81" w:name="_Toc511385087"/>
+      <w:bookmarkStart w:id="82" w:name="_Toc511634307"/>
+      <w:bookmarkStart w:id="83" w:name="_Toc511635203"/>
+      <w:bookmarkStart w:id="84" w:name="_Toc511635264"/>
+      <w:bookmarkStart w:id="85" w:name="_Toc511385088"/>
+      <w:bookmarkStart w:id="86" w:name="_Toc511634308"/>
+      <w:bookmarkStart w:id="87" w:name="_Toc511635204"/>
+      <w:bookmarkStart w:id="88" w:name="_Toc511635265"/>
+      <w:bookmarkStart w:id="89" w:name="_Toc511385089"/>
+      <w:bookmarkStart w:id="90" w:name="_Toc511634309"/>
+      <w:bookmarkStart w:id="91" w:name="_Toc511635205"/>
+      <w:bookmarkStart w:id="92" w:name="_Toc511635266"/>
+      <w:bookmarkStart w:id="93" w:name="_Toc511385090"/>
+      <w:bookmarkStart w:id="94" w:name="_Toc511634310"/>
+      <w:bookmarkStart w:id="95" w:name="_Toc511635206"/>
+      <w:bookmarkStart w:id="96" w:name="_Toc511635267"/>
+      <w:bookmarkStart w:id="97" w:name="_Toc511385091"/>
+      <w:bookmarkStart w:id="98" w:name="_Toc511634311"/>
+      <w:bookmarkStart w:id="99" w:name="_Toc511635207"/>
+      <w:bookmarkStart w:id="100" w:name="_Toc511635268"/>
+      <w:bookmarkStart w:id="101" w:name="_Toc511385092"/>
+      <w:bookmarkStart w:id="102" w:name="_Toc511634312"/>
+      <w:bookmarkStart w:id="103" w:name="_Toc511635208"/>
+      <w:bookmarkStart w:id="104" w:name="_Toc511635269"/>
+      <w:bookmarkStart w:id="105" w:name="_Toc511385093"/>
+      <w:bookmarkStart w:id="106" w:name="_Toc511634313"/>
+      <w:bookmarkStart w:id="107" w:name="_Toc511635209"/>
+      <w:bookmarkStart w:id="108" w:name="_Toc511635270"/>
+      <w:bookmarkStart w:id="109" w:name="_Toc511385094"/>
+      <w:bookmarkStart w:id="110" w:name="_Toc511634314"/>
+      <w:bookmarkStart w:id="111" w:name="_Toc511635210"/>
+      <w:bookmarkStart w:id="112" w:name="_Toc511635271"/>
+      <w:bookmarkStart w:id="113" w:name="_Toc511385095"/>
+      <w:bookmarkStart w:id="114" w:name="_Toc511634315"/>
+      <w:bookmarkStart w:id="115" w:name="_Toc511635211"/>
+      <w:bookmarkStart w:id="116" w:name="_Toc511635272"/>
+      <w:bookmarkStart w:id="117" w:name="_Toc511385096"/>
+      <w:bookmarkStart w:id="118" w:name="_Toc511634316"/>
+      <w:bookmarkStart w:id="119" w:name="_Toc511635212"/>
+      <w:bookmarkStart w:id="120" w:name="_Toc511635273"/>
+      <w:bookmarkStart w:id="121" w:name="_Toc511385097"/>
+      <w:bookmarkStart w:id="122" w:name="_Toc511634317"/>
+      <w:bookmarkStart w:id="123" w:name="_Toc511635213"/>
+      <w:bookmarkStart w:id="124" w:name="_Toc511635274"/>
+      <w:bookmarkStart w:id="125" w:name="_Toc511385098"/>
+      <w:bookmarkStart w:id="126" w:name="_Toc511634318"/>
+      <w:bookmarkStart w:id="127" w:name="_Toc511635214"/>
+      <w:bookmarkStart w:id="128" w:name="_Toc511635275"/>
+      <w:bookmarkStart w:id="129" w:name="_Toc511385099"/>
+      <w:bookmarkStart w:id="130" w:name="_Toc511634319"/>
+      <w:bookmarkStart w:id="131" w:name="_Toc511635215"/>
+      <w:bookmarkStart w:id="132" w:name="_Toc511635276"/>
+      <w:bookmarkStart w:id="133" w:name="_Toc511385100"/>
+      <w:bookmarkStart w:id="134" w:name="_Toc511634320"/>
+      <w:bookmarkStart w:id="135" w:name="_Toc511635216"/>
+      <w:bookmarkStart w:id="136" w:name="_Toc511635277"/>
+      <w:bookmarkStart w:id="137" w:name="_Toc511385101"/>
+      <w:bookmarkStart w:id="138" w:name="_Toc511634321"/>
+      <w:bookmarkStart w:id="139" w:name="_Toc511635217"/>
+      <w:bookmarkStart w:id="140" w:name="_Toc511635278"/>
+      <w:bookmarkStart w:id="141" w:name="_Toc511385102"/>
+      <w:bookmarkStart w:id="142" w:name="_Toc511634322"/>
+      <w:bookmarkStart w:id="143" w:name="_Toc511635218"/>
+      <w:bookmarkStart w:id="144" w:name="_Toc511635279"/>
+      <w:bookmarkStart w:id="145" w:name="_Toc511385103"/>
+      <w:bookmarkStart w:id="146" w:name="_Toc511634323"/>
+      <w:bookmarkStart w:id="147" w:name="_Toc511635219"/>
+      <w:bookmarkStart w:id="148" w:name="_Toc511635280"/>
+      <w:bookmarkStart w:id="149" w:name="_Toc511385104"/>
+      <w:bookmarkStart w:id="150" w:name="_Toc511634324"/>
+      <w:bookmarkStart w:id="151" w:name="_Toc511635220"/>
+      <w:bookmarkStart w:id="152" w:name="_Toc511635281"/>
+      <w:bookmarkStart w:id="153" w:name="_Toc511385105"/>
+      <w:bookmarkStart w:id="154" w:name="_Toc511634325"/>
+      <w:bookmarkStart w:id="155" w:name="_Toc511635221"/>
+      <w:bookmarkStart w:id="156" w:name="_Toc511635282"/>
+      <w:bookmarkStart w:id="157" w:name="_Toc511385106"/>
+      <w:bookmarkStart w:id="158" w:name="_Toc511634326"/>
+      <w:bookmarkStart w:id="159" w:name="_Toc511635222"/>
+      <w:bookmarkStart w:id="160" w:name="_Toc511635283"/>
+      <w:bookmarkStart w:id="161" w:name="_Toc511385107"/>
+      <w:bookmarkStart w:id="162" w:name="_Toc511634327"/>
+      <w:bookmarkStart w:id="163" w:name="_Toc511635223"/>
+      <w:bookmarkStart w:id="164" w:name="_Toc511635284"/>
+      <w:bookmarkStart w:id="165" w:name="_Toc511385108"/>
+      <w:bookmarkStart w:id="166" w:name="_Toc511634328"/>
+      <w:bookmarkStart w:id="167" w:name="_Toc511635224"/>
+      <w:bookmarkStart w:id="168" w:name="_Toc511635285"/>
+      <w:bookmarkStart w:id="169" w:name="_Toc511385109"/>
+      <w:bookmarkStart w:id="170" w:name="_Toc511634329"/>
+      <w:bookmarkStart w:id="171" w:name="_Toc511635225"/>
+      <w:bookmarkStart w:id="172" w:name="_Toc511635286"/>
+      <w:bookmarkStart w:id="173" w:name="_Toc511385110"/>
+      <w:bookmarkStart w:id="174" w:name="_Toc511634330"/>
+      <w:bookmarkStart w:id="175" w:name="_Toc511635226"/>
+      <w:bookmarkStart w:id="176" w:name="_Toc511635287"/>
+      <w:bookmarkStart w:id="177" w:name="_Toc511385111"/>
+      <w:bookmarkStart w:id="178" w:name="_Toc511634331"/>
+      <w:bookmarkStart w:id="179" w:name="_Toc511635227"/>
+      <w:bookmarkStart w:id="180" w:name="_Toc511635288"/>
+      <w:bookmarkStart w:id="181" w:name="_Toc520194422"/>
       <w:bookmarkEnd w:id="57"/>
       <w:bookmarkEnd w:id="58"/>
       <w:bookmarkEnd w:id="59"/>
@@ -8352,6 +7995,23 @@
       <w:bookmarkEnd w:id="161"/>
       <w:bookmarkEnd w:id="162"/>
       <w:bookmarkEnd w:id="163"/>
+      <w:bookmarkEnd w:id="164"/>
+      <w:bookmarkEnd w:id="165"/>
+      <w:bookmarkEnd w:id="166"/>
+      <w:bookmarkEnd w:id="167"/>
+      <w:bookmarkEnd w:id="168"/>
+      <w:bookmarkEnd w:id="169"/>
+      <w:bookmarkEnd w:id="170"/>
+      <w:bookmarkEnd w:id="171"/>
+      <w:bookmarkEnd w:id="172"/>
+      <w:bookmarkEnd w:id="173"/>
+      <w:bookmarkEnd w:id="174"/>
+      <w:bookmarkEnd w:id="175"/>
+      <w:bookmarkEnd w:id="176"/>
+      <w:bookmarkEnd w:id="177"/>
+      <w:bookmarkEnd w:id="178"/>
+      <w:bookmarkEnd w:id="179"/>
+      <w:bookmarkEnd w:id="180"/>
       <w:r>
         <w:t>Model First and Data</w:t>
       </w:r>
@@ -8361,7 +8021,7 @@
       <w:r>
         <w:t xml:space="preserve"> First Usage</w:t>
       </w:r>
-      <w:bookmarkEnd w:id="164"/>
+      <w:bookmarkEnd w:id="181"/>
     </w:p>
     <w:p>
       <w:pPr>
@@ -9207,14 +8867,14 @@
       <w:pPr>
         <w:pStyle w:val="Heading1"/>
       </w:pPr>
-      <w:bookmarkStart w:id="165" w:name="_Ref482087625"/>
-      <w:bookmarkStart w:id="166" w:name="_Toc512935244"/>
+      <w:bookmarkStart w:id="182" w:name="_Ref482087625"/>
+      <w:bookmarkStart w:id="183" w:name="_Toc520194423"/>
       <w:r>
         <w:lastRenderedPageBreak/>
         <w:t>Using the .NET Connector</w:t>
       </w:r>
-      <w:bookmarkEnd w:id="165"/>
-      <w:bookmarkEnd w:id="166"/>
+      <w:bookmarkEnd w:id="182"/>
+      <w:bookmarkEnd w:id="183"/>
     </w:p>
     <w:p>
       <w:pPr>
@@ -9462,11 +9122,11 @@
       <w:pPr>
         <w:pStyle w:val="Heading2"/>
       </w:pPr>
-      <w:bookmarkStart w:id="167" w:name="_Toc512935245"/>
+      <w:bookmarkStart w:id="184" w:name="_Toc520194424"/>
       <w:r>
         <w:t>Opening a Database Connection</w:t>
       </w:r>
-      <w:bookmarkEnd w:id="167"/>
+      <w:bookmarkEnd w:id="184"/>
     </w:p>
     <w:p>
       <w:pPr>
@@ -9679,13 +9339,13 @@
       <w:pPr>
         <w:pStyle w:val="Heading3"/>
       </w:pPr>
-      <w:bookmarkStart w:id="168" w:name="_Ref482087661"/>
-      <w:bookmarkStart w:id="169" w:name="_Toc512935246"/>
+      <w:bookmarkStart w:id="185" w:name="_Ref482087661"/>
+      <w:bookmarkStart w:id="186" w:name="_Toc520194425"/>
       <w:r>
         <w:t>Connection String Parameters</w:t>
       </w:r>
-      <w:bookmarkEnd w:id="168"/>
-      <w:bookmarkEnd w:id="169"/>
+      <w:bookmarkEnd w:id="185"/>
+      <w:bookmarkEnd w:id="186"/>
       <w:r>
         <w:t xml:space="preserve"> </w:t>
       </w:r>
@@ -10754,14 +10414,14 @@
       <w:pPr>
         <w:pStyle w:val="Heading3"/>
       </w:pPr>
-      <w:bookmarkStart w:id="170" w:name="_Toc512935247"/>
+      <w:bookmarkStart w:id="187" w:name="_Toc520194426"/>
       <w:r>
         <w:t xml:space="preserve">Example - </w:t>
       </w:r>
       <w:r>
         <w:t>Opening a Database Connection using ASP.NET</w:t>
       </w:r>
-      <w:bookmarkEnd w:id="170"/>
+      <w:bookmarkEnd w:id="187"/>
       <w:r>
         <w:t xml:space="preserve"> </w:t>
       </w:r>
@@ -11174,7 +10834,7 @@
           <w:noProof/>
         </w:rPr>
         <w:drawing>
-          <wp:inline distT="0" distB="0" distL="0" distR="0" wp14:anchorId="465F16EE" wp14:editId="48FF80F3">
+          <wp:inline distT="0" distB="0" distL="0" distR="0" wp14:anchorId="180326B1" wp14:editId="4BF01124">
             <wp:extent cx="5480050" cy="1663700"/>
             <wp:effectExtent l="0" t="0" r="6350" b="0"/>
             <wp:docPr id="7" name="Picture 7" descr="Screen Shot 2014-06-26 at 8"/>
@@ -11232,14 +10892,14 @@
       <w:pPr>
         <w:pStyle w:val="Heading3"/>
       </w:pPr>
-      <w:bookmarkStart w:id="171" w:name="_Toc512935248"/>
+      <w:bookmarkStart w:id="188" w:name="_Toc520194427"/>
       <w:r>
         <w:t xml:space="preserve">Example - </w:t>
       </w:r>
       <w:r>
         <w:t>Opening a Database Connection from a Console Application</w:t>
       </w:r>
-      <w:bookmarkEnd w:id="171"/>
+      <w:bookmarkEnd w:id="188"/>
     </w:p>
     <w:p>
       <w:pPr>
@@ -11845,14 +11505,14 @@
       <w:pPr>
         <w:pStyle w:val="Heading3"/>
       </w:pPr>
-      <w:bookmarkStart w:id="172" w:name="_Toc512935249"/>
+      <w:bookmarkStart w:id="189" w:name="_Toc520194428"/>
       <w:r>
         <w:t xml:space="preserve">Example - </w:t>
       </w:r>
       <w:r>
         <w:t>Opening a Database Connection from a Windows Form Application</w:t>
       </w:r>
-      <w:bookmarkEnd w:id="172"/>
+      <w:bookmarkEnd w:id="189"/>
     </w:p>
     <w:p>
       <w:pPr>
@@ -12642,7 +12302,7 @@
           <w:noProof/>
         </w:rPr>
         <w:drawing>
-          <wp:inline distT="0" distB="0" distL="0" distR="0" wp14:anchorId="0D02D7FA" wp14:editId="4124424D">
+          <wp:inline distT="0" distB="0" distL="0" distR="0" wp14:anchorId="53CE7ECC" wp14:editId="33E34774">
             <wp:extent cx="2120900" cy="2120900"/>
             <wp:effectExtent l="0" t="0" r="0" b="0"/>
             <wp:docPr id="8" name="Picture 8" descr="dialog"/>
@@ -12754,12 +12414,12 @@
       <w:pPr>
         <w:pStyle w:val="Heading2"/>
       </w:pPr>
-      <w:bookmarkStart w:id="173" w:name="_Toc512935250"/>
+      <w:bookmarkStart w:id="190" w:name="_Toc520194429"/>
       <w:r>
         <w:lastRenderedPageBreak/>
         <w:t>Retrieving Database Records</w:t>
       </w:r>
-      <w:bookmarkEnd w:id="173"/>
+      <w:bookmarkEnd w:id="190"/>
     </w:p>
     <w:p>
       <w:pPr>
@@ -13838,14 +13498,14 @@
       <w:pPr>
         <w:pStyle w:val="Heading3"/>
       </w:pPr>
-      <w:bookmarkStart w:id="174" w:name="_Toc512935251"/>
+      <w:bookmarkStart w:id="191" w:name="_Toc520194430"/>
       <w:r>
         <w:t>Retr</w:t>
       </w:r>
       <w:r>
         <w:t>ieving a Single Database Record</w:t>
       </w:r>
-      <w:bookmarkEnd w:id="174"/>
+      <w:bookmarkEnd w:id="191"/>
     </w:p>
     <w:p>
       <w:pPr>
@@ -14380,12 +14040,12 @@
       <w:pPr>
         <w:pStyle w:val="Heading2"/>
       </w:pPr>
-      <w:bookmarkStart w:id="175" w:name="_Toc512935252"/>
+      <w:bookmarkStart w:id="192" w:name="_Toc520194431"/>
       <w:r>
         <w:lastRenderedPageBreak/>
         <w:t>Parameterized Queries</w:t>
       </w:r>
-      <w:bookmarkEnd w:id="175"/>
+      <w:bookmarkEnd w:id="192"/>
     </w:p>
     <w:p>
       <w:pPr>
@@ -15061,12 +14721,12 @@
       <w:pPr>
         <w:pStyle w:val="Heading2"/>
       </w:pPr>
-      <w:bookmarkStart w:id="176" w:name="_Toc512935253"/>
+      <w:bookmarkStart w:id="193" w:name="_Toc520194432"/>
       <w:r>
         <w:lastRenderedPageBreak/>
         <w:t>Inserting Records in a Database</w:t>
       </w:r>
-      <w:bookmarkEnd w:id="176"/>
+      <w:bookmarkEnd w:id="193"/>
     </w:p>
     <w:p>
       <w:pPr>
@@ -15907,12 +15567,12 @@
       <w:pPr>
         <w:pStyle w:val="Heading2"/>
       </w:pPr>
-      <w:bookmarkStart w:id="177" w:name="_Toc512935254"/>
+      <w:bookmarkStart w:id="194" w:name="_Toc520194433"/>
       <w:r>
         <w:lastRenderedPageBreak/>
         <w:t>Deleting Records in a Database</w:t>
       </w:r>
-      <w:bookmarkEnd w:id="177"/>
+      <w:bookmarkEnd w:id="194"/>
     </w:p>
     <w:p>
       <w:pPr>
@@ -16749,12 +16409,12 @@
       <w:pPr>
         <w:pStyle w:val="Heading2"/>
       </w:pPr>
-      <w:bookmarkStart w:id="178" w:name="_Toc512935255"/>
+      <w:bookmarkStart w:id="195" w:name="_Toc520194434"/>
       <w:r>
         <w:lastRenderedPageBreak/>
         <w:t>Using SPL Stored Procedures in your .NET Application</w:t>
       </w:r>
-      <w:bookmarkEnd w:id="178"/>
+      <w:bookmarkEnd w:id="195"/>
     </w:p>
     <w:p>
       <w:pPr>
@@ -17025,7 +16685,7 @@
       <w:pPr>
         <w:pStyle w:val="Heading3"/>
       </w:pPr>
-      <w:bookmarkStart w:id="179" w:name="_Toc512935256"/>
+      <w:bookmarkStart w:id="196" w:name="_Toc520194435"/>
       <w:r>
         <w:t>Example - Executing</w:t>
       </w:r>
@@ -17035,7 +16695,7 @@
       <w:r>
         <w:t xml:space="preserve"> without Parameters</w:t>
       </w:r>
-      <w:bookmarkEnd w:id="179"/>
+      <w:bookmarkEnd w:id="196"/>
     </w:p>
     <w:p>
       <w:pPr>
@@ -17954,14 +17614,14 @@
       <w:pPr>
         <w:pStyle w:val="Heading3"/>
       </w:pPr>
-      <w:bookmarkStart w:id="180" w:name="_Toc512935257"/>
+      <w:bookmarkStart w:id="197" w:name="_Toc520194436"/>
       <w:r>
         <w:t xml:space="preserve">Example - </w:t>
       </w:r>
       <w:r>
         <w:t>Executing a Stored Procedure with IN Parameters</w:t>
       </w:r>
-      <w:bookmarkEnd w:id="180"/>
+      <w:bookmarkEnd w:id="197"/>
     </w:p>
     <w:p>
       <w:pPr>
@@ -19750,7 +19410,7 @@
       <w:pPr>
         <w:pStyle w:val="Heading3"/>
       </w:pPr>
-      <w:bookmarkStart w:id="181" w:name="_Toc512935258"/>
+      <w:bookmarkStart w:id="198" w:name="_Toc520194437"/>
       <w:r>
         <w:t xml:space="preserve">Example - </w:t>
       </w:r>
@@ -19769,7 +19429,7 @@
       <w:r>
         <w:t xml:space="preserve"> Parameters</w:t>
       </w:r>
-      <w:bookmarkEnd w:id="181"/>
+      <w:bookmarkEnd w:id="198"/>
     </w:p>
     <w:p>
       <w:pPr>
@@ -21984,7 +21644,7 @@
       <w:pPr>
         <w:pStyle w:val="Heading2"/>
       </w:pPr>
-      <w:bookmarkStart w:id="182" w:name="_Toc512935259"/>
+      <w:bookmarkStart w:id="199" w:name="_Toc520194438"/>
       <w:r>
         <w:lastRenderedPageBreak/>
         <w:t xml:space="preserve">Using </w:t>
@@ -21995,7 +21655,7 @@
       <w:r>
         <w:t xml:space="preserve"> in a .NET Application</w:t>
       </w:r>
-      <w:bookmarkEnd w:id="182"/>
+      <w:bookmarkEnd w:id="199"/>
     </w:p>
     <w:p>
       <w:pPr>
@@ -33053,7 +32713,7 @@
 </file>
 
 <file path=customXml/itemProps1.xml><?xml version="1.0" encoding="utf-8"?>
-<ds:datastoreItem xmlns:ds="http://schemas.openxmlformats.org/officeDocument/2006/customXml" ds:itemID="{72EBE5DE-73C3-4EBA-AD1C-A45334EEE61E}">
+<ds:datastoreItem xmlns:ds="http://schemas.openxmlformats.org/officeDocument/2006/customXml" ds:itemID="{11991794-F728-4294-9CBA-67729C0FE261}">
   <ds:schemaRefs>
     <ds:schemaRef ds:uri="http://schemas.openxmlformats.org/officeDocument/2006/bibliography"/>
   </ds:schemaRefs>

</xml_diff>

<commit_message>
EPAS .Net Connector Guide 10.0.2 - JIRA EC-457 Section 2 ; Added documentation update for supported .NET versions.
</commit_message>
<xml_diff>
--- a/edb_docs/EDB_Postgres_Advanced_Server_NET_Connector_Guide.docx
+++ b/edb_docs/EDB_Postgres_Advanced_Server_NET_Connector_Guide.docx
@@ -69,8 +69,6 @@
       <w:pPr>
         <w:pStyle w:val="EDBTXTNormalWebBlackCharChar0"/>
       </w:pPr>
-      <w:bookmarkStart w:id="0" w:name="_GoBack"/>
-      <w:bookmarkEnd w:id="0"/>
     </w:p>
     <w:p>
       <w:pPr>
@@ -247,10 +245,7 @@
         <w:pStyle w:val="EDBCoverProductDate"/>
       </w:pPr>
       <w:r>
-        <w:t xml:space="preserve">July </w:t>
-      </w:r>
-      <w:r>
-        <w:t>24</w:t>
+        <w:t>September 28</w:t>
       </w:r>
       <w:r>
         <w:t xml:space="preserve">, </w:t>
@@ -269,7 +264,6 @@
           <w:szCs w:val="32"/>
         </w:rPr>
       </w:pPr>
-      <w:proofErr w:type="gramStart"/>
       <w:r>
         <w:rPr>
           <w:rFonts w:ascii="Arial" w:hAnsi="Arial" w:cs="Arial"/>
@@ -343,15 +337,7 @@
           <w:rFonts w:ascii="Arial" w:hAnsi="Arial" w:cs="Arial"/>
           <w:b w:val="0"/>
         </w:rPr>
-        <w:t xml:space="preserve"> EnterpriseDB Corporation.</w:t>
-      </w:r>
-      <w:proofErr w:type="gramEnd"/>
-      <w:r>
-        <w:rPr>
-          <w:rFonts w:ascii="Arial" w:hAnsi="Arial" w:cs="Arial"/>
-          <w:b w:val="0"/>
-        </w:rPr>
-        <w:t xml:space="preserve">  All rights reserved.</w:t>
+        <w:t xml:space="preserve"> EnterpriseDB Corporation.  All rights reserved.</w:t>
       </w:r>
     </w:p>
     <w:p>
@@ -2794,12 +2780,12 @@
       <w:pPr>
         <w:pStyle w:val="Heading1"/>
       </w:pPr>
-      <w:bookmarkStart w:id="1" w:name="_Toc520194400"/>
+      <w:bookmarkStart w:id="0" w:name="_Toc520194400"/>
       <w:r>
         <w:lastRenderedPageBreak/>
         <w:t>Introduction</w:t>
       </w:r>
-      <w:bookmarkEnd w:id="1"/>
+      <w:bookmarkEnd w:id="0"/>
     </w:p>
     <w:p>
       <w:pPr>
@@ -2969,35 +2955,36 @@
       <w:pPr>
         <w:pStyle w:val="Heading2"/>
       </w:pPr>
-      <w:bookmarkStart w:id="2" w:name="_Toc519674346"/>
-      <w:bookmarkStart w:id="3" w:name="_Toc520194088"/>
-      <w:bookmarkStart w:id="4" w:name="_Toc520194401"/>
-      <w:bookmarkStart w:id="5" w:name="_Toc519674347"/>
-      <w:bookmarkStart w:id="6" w:name="_Toc520194089"/>
-      <w:bookmarkStart w:id="7" w:name="_Toc520194402"/>
-      <w:bookmarkStart w:id="8" w:name="_Toc519674348"/>
-      <w:bookmarkStart w:id="9" w:name="_Toc520194090"/>
-      <w:bookmarkStart w:id="10" w:name="_Toc520194403"/>
-      <w:bookmarkStart w:id="11" w:name="_Toc519674349"/>
-      <w:bookmarkStart w:id="12" w:name="_Toc520194091"/>
-      <w:bookmarkStart w:id="13" w:name="_Toc520194404"/>
-      <w:bookmarkStart w:id="14" w:name="_Toc519674350"/>
-      <w:bookmarkStart w:id="15" w:name="_Toc520194092"/>
-      <w:bookmarkStart w:id="16" w:name="_Toc520194405"/>
-      <w:bookmarkStart w:id="17" w:name="_Toc519674351"/>
-      <w:bookmarkStart w:id="18" w:name="_Toc520194093"/>
-      <w:bookmarkStart w:id="19" w:name="_Toc520194406"/>
-      <w:bookmarkStart w:id="20" w:name="_Toc490831598"/>
-      <w:bookmarkStart w:id="21" w:name="_Toc490831599"/>
-      <w:bookmarkStart w:id="22" w:name="_Toc490831600"/>
-      <w:bookmarkStart w:id="23" w:name="_Toc490831601"/>
-      <w:bookmarkStart w:id="24" w:name="_Toc490831602"/>
-      <w:bookmarkStart w:id="25" w:name="_Toc490831603"/>
-      <w:bookmarkStart w:id="26" w:name="_Ref103071763"/>
-      <w:bookmarkStart w:id="27" w:name="_Ref103071794"/>
-      <w:bookmarkStart w:id="28" w:name="_Ref103073047"/>
-      <w:bookmarkStart w:id="29" w:name="_Ref103073090"/>
-      <w:bookmarkStart w:id="30" w:name="_Toc520194407"/>
+      <w:bookmarkStart w:id="1" w:name="_Toc519674346"/>
+      <w:bookmarkStart w:id="2" w:name="_Toc520194088"/>
+      <w:bookmarkStart w:id="3" w:name="_Toc520194401"/>
+      <w:bookmarkStart w:id="4" w:name="_Toc519674347"/>
+      <w:bookmarkStart w:id="5" w:name="_Toc520194089"/>
+      <w:bookmarkStart w:id="6" w:name="_Toc520194402"/>
+      <w:bookmarkStart w:id="7" w:name="_Toc519674348"/>
+      <w:bookmarkStart w:id="8" w:name="_Toc520194090"/>
+      <w:bookmarkStart w:id="9" w:name="_Toc520194403"/>
+      <w:bookmarkStart w:id="10" w:name="_Toc519674349"/>
+      <w:bookmarkStart w:id="11" w:name="_Toc520194091"/>
+      <w:bookmarkStart w:id="12" w:name="_Toc520194404"/>
+      <w:bookmarkStart w:id="13" w:name="_Toc519674350"/>
+      <w:bookmarkStart w:id="14" w:name="_Toc520194092"/>
+      <w:bookmarkStart w:id="15" w:name="_Toc520194405"/>
+      <w:bookmarkStart w:id="16" w:name="_Toc519674351"/>
+      <w:bookmarkStart w:id="17" w:name="_Toc520194093"/>
+      <w:bookmarkStart w:id="18" w:name="_Toc520194406"/>
+      <w:bookmarkStart w:id="19" w:name="_Toc490831598"/>
+      <w:bookmarkStart w:id="20" w:name="_Toc490831599"/>
+      <w:bookmarkStart w:id="21" w:name="_Toc490831600"/>
+      <w:bookmarkStart w:id="22" w:name="_Toc490831601"/>
+      <w:bookmarkStart w:id="23" w:name="_Toc490831602"/>
+      <w:bookmarkStart w:id="24" w:name="_Toc490831603"/>
+      <w:bookmarkStart w:id="25" w:name="_Ref103071763"/>
+      <w:bookmarkStart w:id="26" w:name="_Ref103071794"/>
+      <w:bookmarkStart w:id="27" w:name="_Ref103073047"/>
+      <w:bookmarkStart w:id="28" w:name="_Ref103073090"/>
+      <w:bookmarkStart w:id="29" w:name="_Toc520194407"/>
+      <w:bookmarkEnd w:id="1"/>
       <w:bookmarkEnd w:id="2"/>
       <w:bookmarkEnd w:id="3"/>
       <w:bookmarkEnd w:id="4"/>
@@ -3021,16 +3008,15 @@
       <w:bookmarkEnd w:id="22"/>
       <w:bookmarkEnd w:id="23"/>
       <w:bookmarkEnd w:id="24"/>
-      <w:bookmarkEnd w:id="25"/>
       <w:r>
         <w:lastRenderedPageBreak/>
         <w:t>Typographical Conventions Used in this Guide</w:t>
       </w:r>
+      <w:bookmarkEnd w:id="25"/>
       <w:bookmarkEnd w:id="26"/>
       <w:bookmarkEnd w:id="27"/>
       <w:bookmarkEnd w:id="28"/>
       <w:bookmarkEnd w:id="29"/>
-      <w:bookmarkEnd w:id="30"/>
     </w:p>
     <w:p>
       <w:pPr>
@@ -3407,84 +3393,87 @@
         </w:rPr>
         <w:t>”.</w:t>
       </w:r>
-      <w:bookmarkStart w:id="31" w:name="_First_level_Heading"/>
-      <w:bookmarkEnd w:id="31"/>
+      <w:bookmarkStart w:id="30" w:name="_First_level_Heading"/>
+      <w:bookmarkEnd w:id="30"/>
     </w:p>
     <w:p>
       <w:pPr>
         <w:pStyle w:val="Heading1"/>
       </w:pPr>
-      <w:bookmarkStart w:id="32" w:name="_Toc520194408"/>
+      <w:bookmarkStart w:id="31" w:name="_Toc520194408"/>
       <w:r>
         <w:lastRenderedPageBreak/>
         <w:t>The Advanced Server .NET Connector - Overview</w:t>
       </w:r>
+      <w:bookmarkEnd w:id="31"/>
+    </w:p>
+    <w:p>
+      <w:pPr>
+        <w:pStyle w:val="EDBTXTNormalWebBlackCharChar0"/>
+      </w:pPr>
+      <w:r>
+        <w:t xml:space="preserve">The Advanced Server .NET </w:t>
+      </w:r>
+      <w:r>
+        <w:t>C</w:t>
+      </w:r>
+      <w:r>
+        <w:t xml:space="preserve">onnector is a .NET data provider that allows a client application to connect to a database stored on an Advanced Server host.  The .NET </w:t>
+      </w:r>
+      <w:r>
+        <w:t xml:space="preserve">Connector </w:t>
+      </w:r>
+      <w:r>
+        <w:t>accesses the data directly, allowing the client application optimal performance, a broad spectrum of functionality, and access to Advanced Server features.</w:t>
+      </w:r>
+    </w:p>
+    <w:p>
+      <w:pPr>
+        <w:pStyle w:val="EDBTXTNormalWebBlackCharChar0"/>
+      </w:pPr>
+      <w:r>
+        <w:t xml:space="preserve">The .NET </w:t>
+      </w:r>
+      <w:r>
+        <w:t xml:space="preserve">Connector </w:t>
+      </w:r>
+      <w:r>
+        <w:t xml:space="preserve">supports .NET </w:t>
+      </w:r>
+      <w:r>
+        <w:t xml:space="preserve">Framework </w:t>
+      </w:r>
+      <w:r>
+        <w:t>versions 4.0 and 4.5</w:t>
+      </w:r>
+      <w:r>
+        <w:t>.1</w:t>
+      </w:r>
+      <w:r>
+        <w:t xml:space="preserve">, and Entity </w:t>
+      </w:r>
+      <w:r>
+        <w:t>Framework 5</w:t>
+      </w:r>
+      <w:r>
+        <w:t>/</w:t>
+      </w:r>
+      <w:r>
+        <w:t>6</w:t>
+      </w:r>
+      <w:r>
+        <w:t>, .Net Standard 1.3, and .Net Standard 2.0.</w:t>
+      </w:r>
+    </w:p>
+    <w:p>
+      <w:pPr>
+        <w:pStyle w:val="Heading2"/>
+      </w:pPr>
+      <w:bookmarkStart w:id="32" w:name="_Toc520194409"/>
+      <w:r>
+        <w:t>The .NET Class Hierarchy</w:t>
+      </w:r>
       <w:bookmarkEnd w:id="32"/>
-    </w:p>
-    <w:p>
-      <w:pPr>
-        <w:pStyle w:val="EDBTXTNormalWebBlackCharChar0"/>
-      </w:pPr>
-      <w:r>
-        <w:t xml:space="preserve">The Advanced Server .NET </w:t>
-      </w:r>
-      <w:r>
-        <w:t>C</w:t>
-      </w:r>
-      <w:r>
-        <w:t xml:space="preserve">onnector is a .NET data provider that allows a client application to connect to a database stored on an Advanced Server host.  The .NET </w:t>
-      </w:r>
-      <w:r>
-        <w:t xml:space="preserve">Connector </w:t>
-      </w:r>
-      <w:r>
-        <w:t>accesses the data directly, allowing the client application optimal performance, a broad spectrum of functionality, and access to Advanced Server features.</w:t>
-      </w:r>
-    </w:p>
-    <w:p>
-      <w:pPr>
-        <w:pStyle w:val="EDBTXTNormalWebBlackCharChar0"/>
-      </w:pPr>
-      <w:r>
-        <w:t xml:space="preserve">The .NET </w:t>
-      </w:r>
-      <w:r>
-        <w:t xml:space="preserve">Connector </w:t>
-      </w:r>
-      <w:r>
-        <w:t xml:space="preserve">supports .NET </w:t>
-      </w:r>
-      <w:r>
-        <w:t xml:space="preserve">Framework </w:t>
-      </w:r>
-      <w:r>
-        <w:t>versions 4.0 and 4.5</w:t>
-      </w:r>
-      <w:r>
-        <w:t>.1</w:t>
-      </w:r>
-      <w:r>
-        <w:t xml:space="preserve">, and Entity </w:t>
-      </w:r>
-      <w:r>
-        <w:t xml:space="preserve">Framework </w:t>
-      </w:r>
-      <w:r>
-        <w:t>6</w:t>
-      </w:r>
-      <w:r>
-        <w:t>.</w:t>
-      </w:r>
-    </w:p>
-    <w:p>
-      <w:pPr>
-        <w:pStyle w:val="Heading2"/>
-      </w:pPr>
-      <w:bookmarkStart w:id="33" w:name="_Toc520194409"/>
-      <w:r>
-        <w:t>The .NET Class Hierarchy</w:t>
-      </w:r>
-      <w:bookmarkEnd w:id="33"/>
     </w:p>
     <w:p>
       <w:pPr>
@@ -3767,12 +3756,12 @@
       <w:pPr>
         <w:pStyle w:val="Heading2"/>
       </w:pPr>
-      <w:bookmarkStart w:id="34" w:name="_Toc520194410"/>
+      <w:bookmarkStart w:id="33" w:name="_Toc520194410"/>
       <w:r>
         <w:lastRenderedPageBreak/>
         <w:t>Installing the .NET Connector</w:t>
       </w:r>
-      <w:bookmarkEnd w:id="34"/>
+      <w:bookmarkEnd w:id="33"/>
     </w:p>
     <w:p>
       <w:pPr>
@@ -3845,14 +3834,12 @@
       <w:r>
         <w:t xml:space="preserve"> </w:t>
       </w:r>
-      <w:proofErr w:type="gramStart"/>
       <w:r>
         <w:rPr>
           <w:rStyle w:val="EDBTXTKeywordBlack"/>
         </w:rPr>
         <w:t>As</w:t>
       </w:r>
-      <w:proofErr w:type="gramEnd"/>
       <w:r>
         <w:t xml:space="preserve"> </w:t>
       </w:r>
@@ -3895,8 +3882,8 @@
         </w:rPr>
         <w:drawing>
           <wp:inline distT="0" distB="0" distL="0" distR="0" wp14:anchorId="1FD9AE5E" wp14:editId="7D031739">
-            <wp:extent cx="3886200" cy="3037805"/>
-            <wp:effectExtent l="0" t="0" r="0" b="0"/>
+            <wp:extent cx="4114800" cy="3218688"/>
+            <wp:effectExtent l="0" t="0" r="0" b="1270"/>
             <wp:docPr id="2" name="Picture 2"/>
             <wp:cNvGraphicFramePr>
               <a:graphicFrameLocks xmlns:a="http://schemas.openxmlformats.org/drawingml/2006/main" noChangeAspect="1"/>
@@ -3917,7 +3904,7 @@
                   <pic:spPr>
                     <a:xfrm>
                       <a:off x="0" y="0"/>
-                      <a:ext cx="3886200" cy="3037805"/>
+                      <a:ext cx="4114800" cy="3218688"/>
                     </a:xfrm>
                     <a:prstGeom prst="rect">
                       <a:avLst/>
@@ -4004,8 +3991,8 @@
         <w:lastRenderedPageBreak/>
         <w:drawing>
           <wp:inline distT="0" distB="0" distL="0" distR="0" wp14:anchorId="7A9EE60E" wp14:editId="3CECAD22">
-            <wp:extent cx="3886200" cy="3046927"/>
-            <wp:effectExtent l="0" t="0" r="0" b="1270"/>
+            <wp:extent cx="4114800" cy="3227832"/>
+            <wp:effectExtent l="0" t="0" r="0" b="0"/>
             <wp:docPr id="3" name="Picture 3"/>
             <wp:cNvGraphicFramePr>
               <a:graphicFrameLocks xmlns:a="http://schemas.openxmlformats.org/drawingml/2006/main" noChangeAspect="1"/>
@@ -4026,7 +4013,7 @@
                   <pic:spPr>
                     <a:xfrm>
                       <a:off x="0" y="0"/>
-                      <a:ext cx="3886200" cy="3046927"/>
+                      <a:ext cx="4114800" cy="3227832"/>
                     </a:xfrm>
                     <a:prstGeom prst="rect">
                       <a:avLst/>
@@ -4116,7 +4103,12 @@
         <w:t>2</w:t>
       </w:r>
       <w:r>
-        <w:t xml:space="preserve">) to specify the directory in which the connector will be installed, and click </w:t>
+        <w:t>) to specify the directory in which the connector will be installed,</w:t>
+      </w:r>
+      <w:bookmarkStart w:id="34" w:name="_GoBack"/>
+      <w:bookmarkEnd w:id="34"/>
+      <w:r>
+        <w:t xml:space="preserve"> and click </w:t>
       </w:r>
       <w:r>
         <w:rPr>
@@ -4139,8 +4131,8 @@
         </w:rPr>
         <w:drawing>
           <wp:inline distT="0" distB="0" distL="0" distR="0" wp14:anchorId="5EBAC98A" wp14:editId="3ED2AB51">
-            <wp:extent cx="4114800" cy="3217552"/>
-            <wp:effectExtent l="0" t="0" r="0" b="1905"/>
+            <wp:extent cx="4114800" cy="3218688"/>
+            <wp:effectExtent l="0" t="0" r="0" b="1270"/>
             <wp:docPr id="4" name="Picture 4"/>
             <wp:cNvGraphicFramePr>
               <a:graphicFrameLocks xmlns:a="http://schemas.openxmlformats.org/drawingml/2006/main" noChangeAspect="1"/>
@@ -4161,7 +4153,7 @@
                   <pic:spPr>
                     <a:xfrm>
                       <a:off x="0" y="0"/>
-                      <a:ext cx="4114800" cy="3217552"/>
+                      <a:ext cx="4114800" cy="3218688"/>
                     </a:xfrm>
                     <a:prstGeom prst="rect">
                       <a:avLst/>
@@ -4284,8 +4276,8 @@
         </w:rPr>
         <w:drawing>
           <wp:inline distT="0" distB="0" distL="0" distR="0" wp14:anchorId="330329C1" wp14:editId="1B659719">
-            <wp:extent cx="4114800" cy="3194511"/>
-            <wp:effectExtent l="0" t="0" r="0" b="6350"/>
+            <wp:extent cx="4110607" cy="3191256"/>
+            <wp:effectExtent l="0" t="0" r="4445" b="9525"/>
             <wp:docPr id="5" name="Picture 5"/>
             <wp:cNvGraphicFramePr>
               <a:graphicFrameLocks xmlns:a="http://schemas.openxmlformats.org/drawingml/2006/main" noChangeAspect="1"/>
@@ -4306,7 +4298,7 @@
                   <pic:spPr>
                     <a:xfrm>
                       <a:off x="0" y="0"/>
-                      <a:ext cx="4114800" cy="3194511"/>
+                      <a:ext cx="4110607" cy="3191256"/>
                     </a:xfrm>
                     <a:prstGeom prst="rect">
                       <a:avLst/>
@@ -4624,8 +4616,8 @@
         <w:lastRenderedPageBreak/>
         <w:drawing>
           <wp:inline distT="0" distB="0" distL="0" distR="0" wp14:anchorId="39D52CA2" wp14:editId="421E1B1E">
-            <wp:extent cx="4116527" cy="2992582"/>
-            <wp:effectExtent l="0" t="0" r="0" b="0"/>
+            <wp:extent cx="4114800" cy="2990088"/>
+            <wp:effectExtent l="0" t="0" r="0" b="1270"/>
             <wp:docPr id="10" name="Picture 10"/>
             <wp:cNvGraphicFramePr>
               <a:graphicFrameLocks xmlns:a="http://schemas.openxmlformats.org/drawingml/2006/main" noChangeAspect="1"/>
@@ -4652,7 +4644,7 @@
                   <pic:spPr>
                     <a:xfrm>
                       <a:off x="0" y="0"/>
-                      <a:ext cx="4122528" cy="2996944"/>
+                      <a:ext cx="4114800" cy="2990088"/>
                     </a:xfrm>
                     <a:prstGeom prst="rect">
                       <a:avLst/>
@@ -9975,7 +9967,6 @@
         <w:pStyle w:val="EDBTXTNormalWebBlackCharChar0"/>
         <w:ind w:left="720"/>
       </w:pPr>
-      <w:proofErr w:type="gramStart"/>
       <w:r>
         <w:t xml:space="preserve">The specific protocol version to use (instead of automatic); specify an integer value of </w:t>
       </w:r>
@@ -9995,11 +9986,7 @@
         <w:t>3</w:t>
       </w:r>
       <w:r>
-        <w:t>.</w:t>
-      </w:r>
-      <w:proofErr w:type="gramEnd"/>
-      <w:r>
-        <w:t xml:space="preserve"> </w:t>
+        <w:t xml:space="preserve">. </w:t>
       </w:r>
     </w:p>
     <w:p>
@@ -10056,13 +10043,8 @@
         <w:pStyle w:val="EDBTXTNormalWebBlackCharChar0"/>
         <w:ind w:left="720"/>
       </w:pPr>
-      <w:proofErr w:type="gramStart"/>
-      <w:r>
-        <w:t>The name or IP address of the Advanced Server host.</w:t>
-      </w:r>
-      <w:proofErr w:type="gramEnd"/>
-      <w:r>
-        <w:t xml:space="preserve"> </w:t>
+      <w:r>
+        <w:t xml:space="preserve">The name or IP address of the Advanced Server host. </w:t>
       </w:r>
     </w:p>
     <w:p>
@@ -13523,19 +13505,11 @@
       <w:r>
         <w:t xml:space="preserve"> the </w:t>
       </w:r>
-      <w:proofErr w:type="gramStart"/>
-      <w:r>
-        <w:rPr>
-          <w:rStyle w:val="EDBTXTKeywordBlack"/>
-        </w:rPr>
-        <w:t>ExecuteScalar(</w:t>
-      </w:r>
-      <w:proofErr w:type="gramEnd"/>
-      <w:r>
-        <w:rPr>
-          <w:rStyle w:val="EDBTXTKeywordBlack"/>
-        </w:rPr>
-        <w:t>)</w:t>
+      <w:r>
+        <w:rPr>
+          <w:rStyle w:val="EDBTXTKeywordBlack"/>
+        </w:rPr>
+        <w:t>ExecuteScalar()</w:t>
       </w:r>
       <w:r>
         <w:t xml:space="preserve"> method of the </w:t>
@@ -22818,7 +22792,7 @@
         <w:rStyle w:val="PageNumber"/>
         <w:noProof/>
       </w:rPr>
-      <w:t>24</w:t>
+      <w:t>9</w:t>
     </w:r>
     <w:r>
       <w:rPr>
@@ -23093,29 +23067,29 @@
         <v:path o:extrusionok="f" gradientshapeok="t" o:connecttype="rect"/>
         <o:lock v:ext="edit" aspectratio="t"/>
       </v:shapetype>
-      <v:shape id="_x0000_i1041" type="#_x0000_t75" style="width:8pt;height:8pt" o:bullet="t">
+      <v:shape id="_x0000_i1061" type="#_x0000_t75" style="width:8.25pt;height:8.25pt" o:bullet="t">
         <v:imagedata r:id="rId1" o:title="bullet"/>
       </v:shape>
     </w:pict>
   </w:numPicBullet>
   <w:numPicBullet w:numPicBulletId="1">
     <w:pict>
-      <v:shape id="_x0000_i1042" type="#_x0000_t75" style="width:3in;height:3in" o:bullet="t"/>
+      <v:shape id="_x0000_i1062" type="#_x0000_t75" style="width:3in;height:3in" o:bullet="t"/>
     </w:pict>
   </w:numPicBullet>
   <w:numPicBullet w:numPicBulletId="2">
     <w:pict>
-      <v:shape id="_x0000_i1043" type="#_x0000_t75" style="width:3in;height:3in" o:bullet="t"/>
+      <v:shape id="_x0000_i1063" type="#_x0000_t75" style="width:3in;height:3in" o:bullet="t"/>
     </w:pict>
   </w:numPicBullet>
   <w:numPicBullet w:numPicBulletId="3">
     <w:pict>
-      <v:shape id="_x0000_i1044" type="#_x0000_t75" style="width:3in;height:3in" o:bullet="t"/>
+      <v:shape id="_x0000_i1064" type="#_x0000_t75" style="width:3in;height:3in" o:bullet="t"/>
     </w:pict>
   </w:numPicBullet>
   <w:numPicBullet w:numPicBulletId="4">
     <w:pict>
-      <v:shape id="_x0000_i1045" type="#_x0000_t75" style="width:3in;height:3in" o:bullet="t"/>
+      <v:shape id="_x0000_i1065" type="#_x0000_t75" style="width:3in;height:3in" o:bullet="t"/>
     </w:pict>
   </w:numPicBullet>
   <w:abstractNum w:abstractNumId="0">
@@ -28787,6 +28761,7 @@
       <w:rFonts w:ascii="Cambria" w:eastAsia="Cambria" w:hAnsi="Cambria"/>
     </w:rPr>
     <w:tblPr>
+      <w:tblInd w:w="0" w:type="dxa"/>
       <w:tblBorders>
         <w:top w:val="single" w:sz="4" w:space="0" w:color="000000"/>
         <w:left w:val="single" w:sz="4" w:space="0" w:color="000000"/>
@@ -28795,6 +28770,12 @@
         <w:insideH w:val="single" w:sz="4" w:space="0" w:color="000000"/>
         <w:insideV w:val="single" w:sz="4" w:space="0" w:color="000000"/>
       </w:tblBorders>
+      <w:tblCellMar>
+        <w:top w:w="0" w:type="dxa"/>
+        <w:left w:w="108" w:type="dxa"/>
+        <w:bottom w:w="0" w:type="dxa"/>
+        <w:right w:w="108" w:type="dxa"/>
+      </w:tblCellMar>
     </w:tblPr>
   </w:style>
   <w:style w:type="paragraph" w:styleId="BodyTextIndent">
@@ -31783,6 +31764,7 @@
       <w:rFonts w:ascii="Cambria" w:eastAsia="Cambria" w:hAnsi="Cambria"/>
     </w:rPr>
     <w:tblPr>
+      <w:tblInd w:w="0" w:type="dxa"/>
       <w:tblBorders>
         <w:top w:val="single" w:sz="4" w:space="0" w:color="000000"/>
         <w:left w:val="single" w:sz="4" w:space="0" w:color="000000"/>
@@ -31791,6 +31773,12 @@
         <w:insideH w:val="single" w:sz="4" w:space="0" w:color="000000"/>
         <w:insideV w:val="single" w:sz="4" w:space="0" w:color="000000"/>
       </w:tblBorders>
+      <w:tblCellMar>
+        <w:top w:w="0" w:type="dxa"/>
+        <w:left w:w="108" w:type="dxa"/>
+        <w:bottom w:w="0" w:type="dxa"/>
+        <w:right w:w="108" w:type="dxa"/>
+      </w:tblCellMar>
     </w:tblPr>
   </w:style>
   <w:style w:type="paragraph" w:styleId="BodyTextIndent">
@@ -32713,7 +32701,7 @@
 </file>
 
 <file path=customXml/itemProps1.xml><?xml version="1.0" encoding="utf-8"?>
-<ds:datastoreItem xmlns:ds="http://schemas.openxmlformats.org/officeDocument/2006/customXml" ds:itemID="{11991794-F728-4294-9CBA-67729C0FE261}">
+<ds:datastoreItem xmlns:ds="http://schemas.openxmlformats.org/officeDocument/2006/customXml" ds:itemID="{A3703ECC-FDAC-4D63-82A1-C2A06994B20C}">
   <ds:schemaRefs>
     <ds:schemaRef ds:uri="http://schemas.openxmlformats.org/officeDocument/2006/bibliography"/>
   </ds:schemaRefs>

</xml_diff>

<commit_message>
Updated .NET Connector Guide - wording in Section 3.2
</commit_message>
<xml_diff>
--- a/edb_docs/EDB_Postgres_Advanced_Server_NET_Connector_Guide.docx
+++ b/edb_docs/EDB_Postgres_Advanced_Server_NET_Connector_Guide.docx
@@ -7,8 +7,6 @@
       <w:pPr>
         <w:pStyle w:val="EDBCoverLogo"/>
       </w:pPr>
-      <w:bookmarkStart w:id="0" w:name="_GoBack"/>
-      <w:bookmarkEnd w:id="0"/>
       <w:r>
         <w:rPr>
           <w:noProof/>
@@ -271,7 +269,7 @@
         <w:pStyle w:val="EDBCoverProductDate"/>
       </w:pPr>
       <w:r>
-        <w:t>November 15</w:t>
+        <w:t>November 16</w:t>
       </w:r>
       <w:r>
         <w:t xml:space="preserve">, </w:t>
@@ -581,7 +579,7 @@
       <w:r>
         <w:fldChar w:fldCharType="separate"/>
       </w:r>
-      <w:hyperlink w:anchor="_Toc530034582" w:history="1">
+      <w:hyperlink w:anchor="_Toc530110026" w:history="1">
         <w:r>
           <w:rPr>
             <w:rStyle w:val="Hyperlink"/>
@@ -621,7 +619,7 @@
           <w:rPr>
             <w:noProof/>
           </w:rPr>
-          <w:instrText xml:space="preserve"> PAGEREF _Toc530034582 \h </w:instrText>
+          <w:instrText xml:space="preserve"> PAGEREF _Toc530110026 \h </w:instrText>
         </w:r>
         <w:r>
           <w:rPr>
@@ -662,7 +660,7 @@
           <w:szCs w:val="22"/>
         </w:rPr>
       </w:pPr>
-      <w:hyperlink w:anchor="_Toc530034583" w:history="1">
+      <w:hyperlink w:anchor="_Toc530110027" w:history="1">
         <w:r>
           <w:rPr>
             <w:rStyle w:val="Hyperlink"/>
@@ -702,7 +700,7 @@
           <w:rPr>
             <w:noProof/>
           </w:rPr>
-          <w:instrText xml:space="preserve"> PAGEREF _Toc530034583 \h </w:instrText>
+          <w:instrText xml:space="preserve"> PAGEREF _Toc530110027 \h </w:instrText>
         </w:r>
         <w:r>
           <w:rPr>
@@ -743,7 +741,7 @@
           <w:szCs w:val="22"/>
         </w:rPr>
       </w:pPr>
-      <w:hyperlink w:anchor="_Toc530034584" w:history="1">
+      <w:hyperlink w:anchor="_Toc530110028" w:history="1">
         <w:r>
           <w:rPr>
             <w:rStyle w:val="Hyperlink"/>
@@ -783,7 +781,7 @@
           <w:rPr>
             <w:noProof/>
           </w:rPr>
-          <w:instrText xml:space="preserve"> PAGEREF _Toc530034584 \h </w:instrText>
+          <w:instrText xml:space="preserve"> PAGEREF _Toc530110028 \h </w:instrText>
         </w:r>
         <w:r>
           <w:rPr>
@@ -824,7 +822,7 @@
           <w:szCs w:val="22"/>
         </w:rPr>
       </w:pPr>
-      <w:hyperlink w:anchor="_Toc530034585" w:history="1">
+      <w:hyperlink w:anchor="_Toc530110029" w:history="1">
         <w:r>
           <w:rPr>
             <w:rStyle w:val="Hyperlink"/>
@@ -864,7 +862,7 @@
           <w:rPr>
             <w:noProof/>
           </w:rPr>
-          <w:instrText xml:space="preserve"> PAGEREF _Toc530034585 \h </w:instrText>
+          <w:instrText xml:space="preserve"> PAGEREF _Toc530110029 \h </w:instrText>
         </w:r>
         <w:r>
           <w:rPr>
@@ -905,7 +903,7 @@
           <w:szCs w:val="22"/>
         </w:rPr>
       </w:pPr>
-      <w:hyperlink w:anchor="_Toc530034586" w:history="1">
+      <w:hyperlink w:anchor="_Toc530110030" w:history="1">
         <w:r>
           <w:rPr>
             <w:rStyle w:val="Hyperlink"/>
@@ -945,7 +943,7 @@
           <w:rPr>
             <w:noProof/>
           </w:rPr>
-          <w:instrText xml:space="preserve"> PAGEREF _Toc530034586 \h </w:instrText>
+          <w:instrText xml:space="preserve"> PAGEREF _Toc530110030 \h </w:instrText>
         </w:r>
         <w:r>
           <w:rPr>
@@ -986,7 +984,7 @@
           <w:szCs w:val="22"/>
         </w:rPr>
       </w:pPr>
-      <w:hyperlink w:anchor="_Toc530034587" w:history="1">
+      <w:hyperlink w:anchor="_Toc530110031" w:history="1">
         <w:r>
           <w:rPr>
             <w:rStyle w:val="Hyperlink"/>
@@ -1026,7 +1024,7 @@
           <w:rPr>
             <w:noProof/>
           </w:rPr>
-          <w:instrText xml:space="preserve"> PAGEREF _Toc530034587 \h </w:instrText>
+          <w:instrText xml:space="preserve"> PAGEREF _Toc530110031 \h </w:instrText>
         </w:r>
         <w:r>
           <w:rPr>
@@ -1067,7 +1065,7 @@
           <w:szCs w:val="22"/>
         </w:rPr>
       </w:pPr>
-      <w:hyperlink w:anchor="_Toc530034588" w:history="1">
+      <w:hyperlink w:anchor="_Toc530110032" w:history="1">
         <w:r>
           <w:rPr>
             <w:rStyle w:val="Hyperlink"/>
@@ -1107,7 +1105,7 @@
           <w:rPr>
             <w:noProof/>
           </w:rPr>
-          <w:instrText xml:space="preserve"> PAGEREF _Toc530034588 \h </w:instrText>
+          <w:instrText xml:space="preserve"> PAGEREF _Toc530110032 \h </w:instrText>
         </w:r>
         <w:r>
           <w:rPr>
@@ -1148,7 +1146,7 @@
           <w:szCs w:val="22"/>
         </w:rPr>
       </w:pPr>
-      <w:hyperlink w:anchor="_Toc530034589" w:history="1">
+      <w:hyperlink w:anchor="_Toc530110033" w:history="1">
         <w:r>
           <w:rPr>
             <w:rStyle w:val="Hyperlink"/>
@@ -1188,7 +1186,7 @@
           <w:rPr>
             <w:noProof/>
           </w:rPr>
-          <w:instrText xml:space="preserve"> PAGEREF _Toc530034589 \h </w:instrText>
+          <w:instrText xml:space="preserve"> PAGEREF _Toc530110033 \h </w:instrText>
         </w:r>
         <w:r>
           <w:rPr>
@@ -1224,7 +1222,7 @@
           <w:szCs w:val="22"/>
         </w:rPr>
       </w:pPr>
-      <w:hyperlink w:anchor="_Toc530034590" w:history="1">
+      <w:hyperlink w:anchor="_Toc530110034" w:history="1">
         <w:r>
           <w:rPr>
             <w:rStyle w:val="Hyperlink"/>
@@ -1252,7 +1250,7 @@
           <w:fldChar w:fldCharType="begin"/>
         </w:r>
         <w:r>
-          <w:instrText xml:space="preserve"> PAGEREF _Toc530034590 \h </w:instrText>
+          <w:instrText xml:space="preserve"> PAGEREF _Toc530110034 \h </w:instrText>
         </w:r>
         <w:r>
           <w:fldChar w:fldCharType="separate"/>
@@ -1274,7 +1272,7 @@
           <w:szCs w:val="22"/>
         </w:rPr>
       </w:pPr>
-      <w:hyperlink w:anchor="_Toc530034591" w:history="1">
+      <w:hyperlink w:anchor="_Toc530110035" w:history="1">
         <w:r>
           <w:rPr>
             <w:rStyle w:val="Hyperlink"/>
@@ -1302,7 +1300,7 @@
           <w:fldChar w:fldCharType="begin"/>
         </w:r>
         <w:r>
-          <w:instrText xml:space="preserve"> PAGEREF _Toc530034591 \h </w:instrText>
+          <w:instrText xml:space="preserve"> PAGEREF _Toc530110035 \h </w:instrText>
         </w:r>
         <w:r>
           <w:fldChar w:fldCharType="separate"/>
@@ -1324,7 +1322,7 @@
           <w:szCs w:val="22"/>
         </w:rPr>
       </w:pPr>
-      <w:hyperlink w:anchor="_Toc530034592" w:history="1">
+      <w:hyperlink w:anchor="_Toc530110036" w:history="1">
         <w:r>
           <w:rPr>
             <w:rStyle w:val="Hyperlink"/>
@@ -1352,7 +1350,7 @@
           <w:fldChar w:fldCharType="begin"/>
         </w:r>
         <w:r>
-          <w:instrText xml:space="preserve"> PAGEREF _Toc530034592 \h </w:instrText>
+          <w:instrText xml:space="preserve"> PAGEREF _Toc530110036 \h </w:instrText>
         </w:r>
         <w:r>
           <w:fldChar w:fldCharType="separate"/>
@@ -1374,7 +1372,7 @@
           <w:szCs w:val="22"/>
         </w:rPr>
       </w:pPr>
-      <w:hyperlink w:anchor="_Toc530034593" w:history="1">
+      <w:hyperlink w:anchor="_Toc530110037" w:history="1">
         <w:r>
           <w:rPr>
             <w:rStyle w:val="Hyperlink"/>
@@ -1402,7 +1400,7 @@
           <w:fldChar w:fldCharType="begin"/>
         </w:r>
         <w:r>
-          <w:instrText xml:space="preserve"> PAGEREF _Toc530034593 \h </w:instrText>
+          <w:instrText xml:space="preserve"> PAGEREF _Toc530110037 \h </w:instrText>
         </w:r>
         <w:r>
           <w:fldChar w:fldCharType="separate"/>
@@ -1429,7 +1427,7 @@
           <w:szCs w:val="22"/>
         </w:rPr>
       </w:pPr>
-      <w:hyperlink w:anchor="_Toc530034594" w:history="1">
+      <w:hyperlink w:anchor="_Toc530110038" w:history="1">
         <w:r>
           <w:rPr>
             <w:rStyle w:val="Hyperlink"/>
@@ -1469,7 +1467,7 @@
           <w:rPr>
             <w:noProof/>
           </w:rPr>
-          <w:instrText xml:space="preserve"> PAGEREF _Toc530034594 \h </w:instrText>
+          <w:instrText xml:space="preserve"> PAGEREF _Toc530110038 \h </w:instrText>
         </w:r>
         <w:r>
           <w:rPr>
@@ -1510,7 +1508,7 @@
           <w:szCs w:val="22"/>
         </w:rPr>
       </w:pPr>
-      <w:hyperlink w:anchor="_Toc530034595" w:history="1">
+      <w:hyperlink w:anchor="_Toc530110039" w:history="1">
         <w:r>
           <w:rPr>
             <w:rStyle w:val="Hyperlink"/>
@@ -1550,7 +1548,7 @@
           <w:rPr>
             <w:noProof/>
           </w:rPr>
-          <w:instrText xml:space="preserve"> PAGEREF _Toc530034595 \h </w:instrText>
+          <w:instrText xml:space="preserve"> PAGEREF _Toc530110039 \h </w:instrText>
         </w:r>
         <w:r>
           <w:rPr>
@@ -1586,7 +1584,7 @@
           <w:szCs w:val="22"/>
         </w:rPr>
       </w:pPr>
-      <w:hyperlink w:anchor="_Toc530034596" w:history="1">
+      <w:hyperlink w:anchor="_Toc530110040" w:history="1">
         <w:r>
           <w:rPr>
             <w:rStyle w:val="Hyperlink"/>
@@ -1614,7 +1612,7 @@
           <w:fldChar w:fldCharType="begin"/>
         </w:r>
         <w:r>
-          <w:instrText xml:space="preserve"> PAGEREF _Toc530034596 \h </w:instrText>
+          <w:instrText xml:space="preserve"> PAGEREF _Toc530110040 \h </w:instrText>
         </w:r>
         <w:r>
           <w:fldChar w:fldCharType="separate"/>
@@ -1636,7 +1634,7 @@
           <w:szCs w:val="22"/>
         </w:rPr>
       </w:pPr>
-      <w:hyperlink w:anchor="_Toc530034597" w:history="1">
+      <w:hyperlink w:anchor="_Toc530110041" w:history="1">
         <w:r>
           <w:rPr>
             <w:rStyle w:val="Hyperlink"/>
@@ -1664,7 +1662,7 @@
           <w:fldChar w:fldCharType="begin"/>
         </w:r>
         <w:r>
-          <w:instrText xml:space="preserve"> PAGEREF _Toc530034597 \h </w:instrText>
+          <w:instrText xml:space="preserve"> PAGEREF _Toc530110041 \h </w:instrText>
         </w:r>
         <w:r>
           <w:fldChar w:fldCharType="separate"/>
@@ -1691,7 +1689,7 @@
           <w:szCs w:val="22"/>
         </w:rPr>
       </w:pPr>
-      <w:hyperlink w:anchor="_Toc530034598" w:history="1">
+      <w:hyperlink w:anchor="_Toc530110042" w:history="1">
         <w:r>
           <w:rPr>
             <w:rStyle w:val="Hyperlink"/>
@@ -1731,7 +1729,7 @@
           <w:rPr>
             <w:noProof/>
           </w:rPr>
-          <w:instrText xml:space="preserve"> PAGEREF _Toc530034598 \h </w:instrText>
+          <w:instrText xml:space="preserve"> PAGEREF _Toc530110042 \h </w:instrText>
         </w:r>
         <w:r>
           <w:rPr>
@@ -1772,7 +1770,7 @@
           <w:szCs w:val="22"/>
         </w:rPr>
       </w:pPr>
-      <w:hyperlink w:anchor="_Toc530034599" w:history="1">
+      <w:hyperlink w:anchor="_Toc530110043" w:history="1">
         <w:r>
           <w:rPr>
             <w:rStyle w:val="Hyperlink"/>
@@ -1812,7 +1810,7 @@
           <w:rPr>
             <w:noProof/>
           </w:rPr>
-          <w:instrText xml:space="preserve"> PAGEREF _Toc530034599 \h </w:instrText>
+          <w:instrText xml:space="preserve"> PAGEREF _Toc530110043 \h </w:instrText>
         </w:r>
         <w:r>
           <w:rPr>
@@ -1848,7 +1846,7 @@
           <w:szCs w:val="22"/>
         </w:rPr>
       </w:pPr>
-      <w:hyperlink w:anchor="_Toc530034600" w:history="1">
+      <w:hyperlink w:anchor="_Toc530110044" w:history="1">
         <w:r>
           <w:rPr>
             <w:rStyle w:val="Hyperlink"/>
@@ -1876,7 +1874,7 @@
           <w:fldChar w:fldCharType="begin"/>
         </w:r>
         <w:r>
-          <w:instrText xml:space="preserve"> PAGEREF _Toc530034600 \h </w:instrText>
+          <w:instrText xml:space="preserve"> PAGEREF _Toc530110044 \h </w:instrText>
         </w:r>
         <w:r>
           <w:fldChar w:fldCharType="separate"/>
@@ -1898,7 +1896,7 @@
           <w:szCs w:val="22"/>
         </w:rPr>
       </w:pPr>
-      <w:hyperlink w:anchor="_Toc530034601" w:history="1">
+      <w:hyperlink w:anchor="_Toc530110045" w:history="1">
         <w:r>
           <w:rPr>
             <w:rStyle w:val="Hyperlink"/>
@@ -1926,7 +1924,7 @@
           <w:fldChar w:fldCharType="begin"/>
         </w:r>
         <w:r>
-          <w:instrText xml:space="preserve"> PAGEREF _Toc530034601 \h </w:instrText>
+          <w:instrText xml:space="preserve"> PAGEREF _Toc530110045 \h </w:instrText>
         </w:r>
         <w:r>
           <w:fldChar w:fldCharType="separate"/>
@@ -1948,7 +1946,7 @@
           <w:szCs w:val="22"/>
         </w:rPr>
       </w:pPr>
-      <w:hyperlink w:anchor="_Toc530034602" w:history="1">
+      <w:hyperlink w:anchor="_Toc530110046" w:history="1">
         <w:r>
           <w:rPr>
             <w:rStyle w:val="Hyperlink"/>
@@ -1976,7 +1974,7 @@
           <w:fldChar w:fldCharType="begin"/>
         </w:r>
         <w:r>
-          <w:instrText xml:space="preserve"> PAGEREF _Toc530034602 \h </w:instrText>
+          <w:instrText xml:space="preserve"> PAGEREF _Toc530110046 \h </w:instrText>
         </w:r>
         <w:r>
           <w:fldChar w:fldCharType="separate"/>
@@ -1998,7 +1996,7 @@
           <w:szCs w:val="22"/>
         </w:rPr>
       </w:pPr>
-      <w:hyperlink w:anchor="_Toc530034603" w:history="1">
+      <w:hyperlink w:anchor="_Toc530110047" w:history="1">
         <w:r>
           <w:rPr>
             <w:rStyle w:val="Hyperlink"/>
@@ -2026,7 +2024,7 @@
           <w:fldChar w:fldCharType="begin"/>
         </w:r>
         <w:r>
-          <w:instrText xml:space="preserve"> PAGEREF _Toc530034603 \h </w:instrText>
+          <w:instrText xml:space="preserve"> PAGEREF _Toc530110047 \h </w:instrText>
         </w:r>
         <w:r>
           <w:fldChar w:fldCharType="separate"/>
@@ -2053,7 +2051,7 @@
           <w:szCs w:val="22"/>
         </w:rPr>
       </w:pPr>
-      <w:hyperlink w:anchor="_Toc530034604" w:history="1">
+      <w:hyperlink w:anchor="_Toc530110048" w:history="1">
         <w:r>
           <w:rPr>
             <w:rStyle w:val="Hyperlink"/>
@@ -2093,7 +2091,7 @@
           <w:rPr>
             <w:noProof/>
           </w:rPr>
-          <w:instrText xml:space="preserve"> PAGEREF _Toc530034604 \h </w:instrText>
+          <w:instrText xml:space="preserve"> PAGEREF _Toc530110048 \h </w:instrText>
         </w:r>
         <w:r>
           <w:rPr>
@@ -2129,7 +2127,7 @@
           <w:szCs w:val="22"/>
         </w:rPr>
       </w:pPr>
-      <w:hyperlink w:anchor="_Toc530034605" w:history="1">
+      <w:hyperlink w:anchor="_Toc530110049" w:history="1">
         <w:r>
           <w:rPr>
             <w:rStyle w:val="Hyperlink"/>
@@ -2157,7 +2155,7 @@
           <w:fldChar w:fldCharType="begin"/>
         </w:r>
         <w:r>
-          <w:instrText xml:space="preserve"> PAGEREF _Toc530034605 \h </w:instrText>
+          <w:instrText xml:space="preserve"> PAGEREF _Toc530110049 \h </w:instrText>
         </w:r>
         <w:r>
           <w:fldChar w:fldCharType="separate"/>
@@ -2184,7 +2182,7 @@
           <w:szCs w:val="22"/>
         </w:rPr>
       </w:pPr>
-      <w:hyperlink w:anchor="_Toc530034606" w:history="1">
+      <w:hyperlink w:anchor="_Toc530110050" w:history="1">
         <w:r>
           <w:rPr>
             <w:rStyle w:val="Hyperlink"/>
@@ -2224,7 +2222,7 @@
           <w:rPr>
             <w:noProof/>
           </w:rPr>
-          <w:instrText xml:space="preserve"> PAGEREF _Toc530034606 \h </w:instrText>
+          <w:instrText xml:space="preserve"> PAGEREF _Toc530110050 \h </w:instrText>
         </w:r>
         <w:r>
           <w:rPr>
@@ -2265,7 +2263,7 @@
           <w:szCs w:val="22"/>
         </w:rPr>
       </w:pPr>
-      <w:hyperlink w:anchor="_Toc530034607" w:history="1">
+      <w:hyperlink w:anchor="_Toc530110051" w:history="1">
         <w:r>
           <w:rPr>
             <w:rStyle w:val="Hyperlink"/>
@@ -2305,7 +2303,7 @@
           <w:rPr>
             <w:noProof/>
           </w:rPr>
-          <w:instrText xml:space="preserve"> PAGEREF _Toc530034607 \h </w:instrText>
+          <w:instrText xml:space="preserve"> PAGEREF _Toc530110051 \h </w:instrText>
         </w:r>
         <w:r>
           <w:rPr>
@@ -2346,7 +2344,7 @@
           <w:szCs w:val="22"/>
         </w:rPr>
       </w:pPr>
-      <w:hyperlink w:anchor="_Toc530034608" w:history="1">
+      <w:hyperlink w:anchor="_Toc530110052" w:history="1">
         <w:r>
           <w:rPr>
             <w:rStyle w:val="Hyperlink"/>
@@ -2386,7 +2384,7 @@
           <w:rPr>
             <w:noProof/>
           </w:rPr>
-          <w:instrText xml:space="preserve"> PAGEREF _Toc530034608 \h </w:instrText>
+          <w:instrText xml:space="preserve"> PAGEREF _Toc530110052 \h </w:instrText>
         </w:r>
         <w:r>
           <w:rPr>
@@ -2427,7 +2425,7 @@
           <w:szCs w:val="22"/>
         </w:rPr>
       </w:pPr>
-      <w:hyperlink w:anchor="_Toc530034609" w:history="1">
+      <w:hyperlink w:anchor="_Toc530110053" w:history="1">
         <w:r>
           <w:rPr>
             <w:rStyle w:val="Hyperlink"/>
@@ -2467,7 +2465,7 @@
           <w:rPr>
             <w:noProof/>
           </w:rPr>
-          <w:instrText xml:space="preserve"> PAGEREF _Toc530034609 \h </w:instrText>
+          <w:instrText xml:space="preserve"> PAGEREF _Toc530110053 \h </w:instrText>
         </w:r>
         <w:r>
           <w:rPr>
@@ -2503,7 +2501,7 @@
           <w:szCs w:val="22"/>
         </w:rPr>
       </w:pPr>
-      <w:hyperlink w:anchor="_Toc530034610" w:history="1">
+      <w:hyperlink w:anchor="_Toc530110054" w:history="1">
         <w:r>
           <w:rPr>
             <w:rStyle w:val="Hyperlink"/>
@@ -2531,7 +2529,7 @@
           <w:fldChar w:fldCharType="begin"/>
         </w:r>
         <w:r>
-          <w:instrText xml:space="preserve"> PAGEREF _Toc530034610 \h </w:instrText>
+          <w:instrText xml:space="preserve"> PAGEREF _Toc530110054 \h </w:instrText>
         </w:r>
         <w:r>
           <w:fldChar w:fldCharType="separate"/>
@@ -2553,7 +2551,7 @@
           <w:szCs w:val="22"/>
         </w:rPr>
       </w:pPr>
-      <w:hyperlink w:anchor="_Toc530034611" w:history="1">
+      <w:hyperlink w:anchor="_Toc530110055" w:history="1">
         <w:r>
           <w:rPr>
             <w:rStyle w:val="Hyperlink"/>
@@ -2581,7 +2579,7 @@
           <w:fldChar w:fldCharType="begin"/>
         </w:r>
         <w:r>
-          <w:instrText xml:space="preserve"> PAGEREF _Toc530034611 \h </w:instrText>
+          <w:instrText xml:space="preserve"> PAGEREF _Toc530110055 \h </w:instrText>
         </w:r>
         <w:r>
           <w:fldChar w:fldCharType="separate"/>
@@ -2603,7 +2601,7 @@
           <w:szCs w:val="22"/>
         </w:rPr>
       </w:pPr>
-      <w:hyperlink w:anchor="_Toc530034612" w:history="1">
+      <w:hyperlink w:anchor="_Toc530110056" w:history="1">
         <w:r>
           <w:rPr>
             <w:rStyle w:val="Hyperlink"/>
@@ -2631,7 +2629,7 @@
           <w:fldChar w:fldCharType="begin"/>
         </w:r>
         <w:r>
-          <w:instrText xml:space="preserve"> PAGEREF _Toc530034612 \h </w:instrText>
+          <w:instrText xml:space="preserve"> PAGEREF _Toc530110056 \h </w:instrText>
         </w:r>
         <w:r>
           <w:fldChar w:fldCharType="separate"/>
@@ -2658,7 +2656,7 @@
           <w:szCs w:val="22"/>
         </w:rPr>
       </w:pPr>
-      <w:hyperlink w:anchor="_Toc530034613" w:history="1">
+      <w:hyperlink w:anchor="_Toc530110057" w:history="1">
         <w:r>
           <w:rPr>
             <w:rStyle w:val="Hyperlink"/>
@@ -2698,7 +2696,7 @@
           <w:rPr>
             <w:noProof/>
           </w:rPr>
-          <w:instrText xml:space="preserve"> PAGEREF _Toc530034613 \h </w:instrText>
+          <w:instrText xml:space="preserve"> PAGEREF _Toc530110057 \h </w:instrText>
         </w:r>
         <w:r>
           <w:rPr>
@@ -2756,12 +2754,12 @@
       <w:pPr>
         <w:pStyle w:val="Heading1"/>
       </w:pPr>
-      <w:bookmarkStart w:id="1" w:name="_Toc530034582"/>
+      <w:bookmarkStart w:id="0" w:name="_Toc530110026"/>
       <w:r>
         <w:lastRenderedPageBreak/>
         <w:t>Introduction</w:t>
       </w:r>
-      <w:bookmarkEnd w:id="1"/>
+      <w:bookmarkEnd w:id="0"/>
     </w:p>
     <w:p>
       <w:pPr>
@@ -2931,35 +2929,36 @@
       <w:pPr>
         <w:pStyle w:val="Heading2"/>
       </w:pPr>
-      <w:bookmarkStart w:id="2" w:name="_Toc519674346"/>
-      <w:bookmarkStart w:id="3" w:name="_Toc520194088"/>
-      <w:bookmarkStart w:id="4" w:name="_Toc520194401"/>
-      <w:bookmarkStart w:id="5" w:name="_Toc519674347"/>
-      <w:bookmarkStart w:id="6" w:name="_Toc520194089"/>
-      <w:bookmarkStart w:id="7" w:name="_Toc520194402"/>
-      <w:bookmarkStart w:id="8" w:name="_Toc519674348"/>
-      <w:bookmarkStart w:id="9" w:name="_Toc520194090"/>
-      <w:bookmarkStart w:id="10" w:name="_Toc520194403"/>
-      <w:bookmarkStart w:id="11" w:name="_Toc519674349"/>
-      <w:bookmarkStart w:id="12" w:name="_Toc520194091"/>
-      <w:bookmarkStart w:id="13" w:name="_Toc520194404"/>
-      <w:bookmarkStart w:id="14" w:name="_Toc519674350"/>
-      <w:bookmarkStart w:id="15" w:name="_Toc520194092"/>
-      <w:bookmarkStart w:id="16" w:name="_Toc520194405"/>
-      <w:bookmarkStart w:id="17" w:name="_Toc519674351"/>
-      <w:bookmarkStart w:id="18" w:name="_Toc520194093"/>
-      <w:bookmarkStart w:id="19" w:name="_Toc520194406"/>
-      <w:bookmarkStart w:id="20" w:name="_Toc490831598"/>
-      <w:bookmarkStart w:id="21" w:name="_Toc490831599"/>
-      <w:bookmarkStart w:id="22" w:name="_Toc490831600"/>
-      <w:bookmarkStart w:id="23" w:name="_Toc490831601"/>
-      <w:bookmarkStart w:id="24" w:name="_Toc490831602"/>
-      <w:bookmarkStart w:id="25" w:name="_Toc490831603"/>
-      <w:bookmarkStart w:id="26" w:name="_Ref103071763"/>
-      <w:bookmarkStart w:id="27" w:name="_Ref103071794"/>
-      <w:bookmarkStart w:id="28" w:name="_Ref103073047"/>
-      <w:bookmarkStart w:id="29" w:name="_Ref103073090"/>
-      <w:bookmarkStart w:id="30" w:name="_Toc530034583"/>
+      <w:bookmarkStart w:id="1" w:name="_Toc519674346"/>
+      <w:bookmarkStart w:id="2" w:name="_Toc520194088"/>
+      <w:bookmarkStart w:id="3" w:name="_Toc520194401"/>
+      <w:bookmarkStart w:id="4" w:name="_Toc519674347"/>
+      <w:bookmarkStart w:id="5" w:name="_Toc520194089"/>
+      <w:bookmarkStart w:id="6" w:name="_Toc520194402"/>
+      <w:bookmarkStart w:id="7" w:name="_Toc519674348"/>
+      <w:bookmarkStart w:id="8" w:name="_Toc520194090"/>
+      <w:bookmarkStart w:id="9" w:name="_Toc520194403"/>
+      <w:bookmarkStart w:id="10" w:name="_Toc519674349"/>
+      <w:bookmarkStart w:id="11" w:name="_Toc520194091"/>
+      <w:bookmarkStart w:id="12" w:name="_Toc520194404"/>
+      <w:bookmarkStart w:id="13" w:name="_Toc519674350"/>
+      <w:bookmarkStart w:id="14" w:name="_Toc520194092"/>
+      <w:bookmarkStart w:id="15" w:name="_Toc520194405"/>
+      <w:bookmarkStart w:id="16" w:name="_Toc519674351"/>
+      <w:bookmarkStart w:id="17" w:name="_Toc520194093"/>
+      <w:bookmarkStart w:id="18" w:name="_Toc520194406"/>
+      <w:bookmarkStart w:id="19" w:name="_Toc490831598"/>
+      <w:bookmarkStart w:id="20" w:name="_Toc490831599"/>
+      <w:bookmarkStart w:id="21" w:name="_Toc490831600"/>
+      <w:bookmarkStart w:id="22" w:name="_Toc490831601"/>
+      <w:bookmarkStart w:id="23" w:name="_Toc490831602"/>
+      <w:bookmarkStart w:id="24" w:name="_Toc490831603"/>
+      <w:bookmarkStart w:id="25" w:name="_Ref103071763"/>
+      <w:bookmarkStart w:id="26" w:name="_Ref103071794"/>
+      <w:bookmarkStart w:id="27" w:name="_Ref103073047"/>
+      <w:bookmarkStart w:id="28" w:name="_Ref103073090"/>
+      <w:bookmarkStart w:id="29" w:name="_Toc530110027"/>
+      <w:bookmarkEnd w:id="1"/>
       <w:bookmarkEnd w:id="2"/>
       <w:bookmarkEnd w:id="3"/>
       <w:bookmarkEnd w:id="4"/>
@@ -2983,16 +2982,15 @@
       <w:bookmarkEnd w:id="22"/>
       <w:bookmarkEnd w:id="23"/>
       <w:bookmarkEnd w:id="24"/>
-      <w:bookmarkEnd w:id="25"/>
       <w:r>
         <w:lastRenderedPageBreak/>
         <w:t>Typographical Conventions Used in this Guide</w:t>
       </w:r>
+      <w:bookmarkEnd w:id="25"/>
       <w:bookmarkEnd w:id="26"/>
       <w:bookmarkEnd w:id="27"/>
       <w:bookmarkEnd w:id="28"/>
       <w:bookmarkEnd w:id="29"/>
-      <w:bookmarkEnd w:id="30"/>
     </w:p>
     <w:p>
       <w:pPr>
@@ -3369,93 +3367,93 @@
         </w:rPr>
         <w:t>”.</w:t>
       </w:r>
-      <w:bookmarkStart w:id="31" w:name="_First_level_Heading"/>
-      <w:bookmarkEnd w:id="31"/>
+      <w:bookmarkStart w:id="30" w:name="_First_level_Heading"/>
+      <w:bookmarkEnd w:id="30"/>
     </w:p>
     <w:p>
       <w:pPr>
         <w:pStyle w:val="Heading1"/>
       </w:pPr>
-      <w:bookmarkStart w:id="32" w:name="_Toc530034584"/>
+      <w:bookmarkStart w:id="31" w:name="_Toc530110028"/>
       <w:r>
         <w:lastRenderedPageBreak/>
         <w:t>The Advanced Server .NET Connector - Overview</w:t>
       </w:r>
+      <w:bookmarkEnd w:id="31"/>
+    </w:p>
+    <w:p>
+      <w:pPr>
+        <w:pStyle w:val="EDBTXTNormalWebBlackCharChar0"/>
+      </w:pPr>
+      <w:r>
+        <w:t xml:space="preserve">The Advanced Server .NET </w:t>
+      </w:r>
+      <w:r>
+        <w:t>C</w:t>
+      </w:r>
+      <w:r>
+        <w:t xml:space="preserve">onnector is a .NET data provider that allows a client application to connect to a database stored on an Advanced Server host.  The .NET </w:t>
+      </w:r>
+      <w:r>
+        <w:t xml:space="preserve">Connector </w:t>
+      </w:r>
+      <w:r>
+        <w:t>accesses the data directly, allowing the client application optimal performance, a broad spectrum of functionality, and access to Advanced Server features.</w:t>
+      </w:r>
+    </w:p>
+    <w:p>
+      <w:pPr>
+        <w:pStyle w:val="EDBTXTNormalWebBlackCharChar0"/>
+      </w:pPr>
+      <w:r>
+        <w:t xml:space="preserve">The .NET </w:t>
+      </w:r>
+      <w:r>
+        <w:t xml:space="preserve">Connector </w:t>
+      </w:r>
+      <w:r>
+        <w:t xml:space="preserve">supports .NET </w:t>
+      </w:r>
+      <w:r>
+        <w:t xml:space="preserve">Framework </w:t>
+      </w:r>
+      <w:r>
+        <w:t>versions 4.0 and 4.5</w:t>
+      </w:r>
+      <w:r>
+        <w:t>.1</w:t>
+      </w:r>
+      <w:r>
+        <w:t xml:space="preserve">, and Entity </w:t>
+      </w:r>
+      <w:r>
+        <w:t>Framework 5</w:t>
+      </w:r>
+      <w:r>
+        <w:t>/</w:t>
+      </w:r>
+      <w:r>
+        <w:t>6</w:t>
+      </w:r>
+      <w:r>
+        <w:t xml:space="preserve">, </w:t>
+      </w:r>
+      <w:r>
+        <w:t>and</w:t>
+      </w:r>
+      <w:r>
+        <w:t xml:space="preserve"> .Net Standard 2.0.</w:t>
+      </w:r>
+    </w:p>
+    <w:p>
+      <w:pPr>
+        <w:pStyle w:val="Heading2"/>
+      </w:pPr>
+      <w:bookmarkStart w:id="32" w:name="_Toc530110029"/>
+      <w:r>
+        <w:t>The .NET Class Hierarchy</w:t>
+      </w:r>
       <w:bookmarkEnd w:id="32"/>
-    </w:p>
-    <w:p>
-      <w:pPr>
-        <w:pStyle w:val="EDBTXTNormalWebBlackCharChar0"/>
-      </w:pPr>
-      <w:r>
-        <w:t xml:space="preserve">The Advanced Server .NET </w:t>
-      </w:r>
-      <w:r>
-        <w:t>C</w:t>
-      </w:r>
-      <w:r>
-        <w:t xml:space="preserve">onnector is a .NET data provider that allows a client application to connect to a database stored on an Advanced Server host.  The .NET </w:t>
-      </w:r>
-      <w:r>
-        <w:t xml:space="preserve">Connector </w:t>
-      </w:r>
-      <w:r>
-        <w:t>accesses the data directly, allowing the client application optimal performance, a broad spectrum of functionality, and access to Advanced Server features.</w:t>
-      </w:r>
-    </w:p>
-    <w:p>
-      <w:pPr>
-        <w:pStyle w:val="EDBTXTNormalWebBlackCharChar0"/>
-      </w:pPr>
-      <w:r>
-        <w:t xml:space="preserve">The .NET </w:t>
-      </w:r>
-      <w:r>
-        <w:t xml:space="preserve">Connector </w:t>
-      </w:r>
-      <w:r>
-        <w:t xml:space="preserve">supports .NET </w:t>
-      </w:r>
-      <w:r>
-        <w:t xml:space="preserve">Framework </w:t>
-      </w:r>
-      <w:r>
-        <w:t>versions 4.0 and 4.5</w:t>
-      </w:r>
-      <w:r>
-        <w:t>.1</w:t>
-      </w:r>
-      <w:r>
-        <w:t xml:space="preserve">, and Entity </w:t>
-      </w:r>
-      <w:r>
-        <w:t>Framework 5</w:t>
-      </w:r>
-      <w:r>
-        <w:t>/</w:t>
-      </w:r>
-      <w:r>
-        <w:t>6</w:t>
-      </w:r>
-      <w:r>
-        <w:t xml:space="preserve">, </w:t>
-      </w:r>
-      <w:r>
-        <w:t>and</w:t>
-      </w:r>
-      <w:r>
-        <w:t xml:space="preserve"> .Net Standard 2.0.</w:t>
-      </w:r>
-    </w:p>
-    <w:p>
-      <w:pPr>
-        <w:pStyle w:val="Heading2"/>
-      </w:pPr>
-      <w:bookmarkStart w:id="33" w:name="_Toc530034585"/>
-      <w:r>
-        <w:t>The .NET Class Hierarchy</w:t>
-      </w:r>
-      <w:bookmarkEnd w:id="33"/>
     </w:p>
     <w:p>
       <w:pPr>
@@ -3738,12 +3736,12 @@
       <w:pPr>
         <w:pStyle w:val="Heading2"/>
       </w:pPr>
-      <w:bookmarkStart w:id="34" w:name="_Toc530034586"/>
+      <w:bookmarkStart w:id="33" w:name="_Toc530110030"/>
       <w:r>
         <w:lastRenderedPageBreak/>
         <w:t>Installing the .NET Connector</w:t>
       </w:r>
-      <w:bookmarkEnd w:id="34"/>
+      <w:bookmarkEnd w:id="33"/>
     </w:p>
     <w:p>
       <w:pPr>
@@ -4611,7 +4609,15 @@
         <w:rPr>
           <w:i/>
         </w:rPr>
-        <w:t>Figure 2.</w:t>
+        <w:t>F</w:t>
+      </w:r>
+      <w:bookmarkStart w:id="34" w:name="_GoBack"/>
+      <w:bookmarkEnd w:id="34"/>
+      <w:r>
+        <w:rPr>
+          <w:i/>
+        </w:rPr>
+        <w:t>igure 2.</w:t>
       </w:r>
       <w:r>
         <w:rPr>
@@ -4824,7 +4830,7 @@
         <w:pStyle w:val="Heading1"/>
       </w:pPr>
       <w:bookmarkStart w:id="35" w:name="_Ref456012125"/>
-      <w:bookmarkStart w:id="36" w:name="_Toc530034587"/>
+      <w:bookmarkStart w:id="36" w:name="_Toc530110031"/>
       <w:r>
         <w:lastRenderedPageBreak/>
         <w:t>Configuring the .NET Connector</w:t>
@@ -5079,7 +5085,7 @@
         <w:pStyle w:val="Heading2"/>
       </w:pPr>
       <w:bookmarkStart w:id="37" w:name="_Ref477525249"/>
-      <w:bookmarkStart w:id="38" w:name="_Toc530034588"/>
+      <w:bookmarkStart w:id="38" w:name="_Toc530110032"/>
       <w:r>
         <w:t>General Instructions</w:t>
       </w:r>
@@ -5430,7 +5436,7 @@
       <w:pPr>
         <w:pStyle w:val="Heading2"/>
       </w:pPr>
-      <w:bookmarkStart w:id="39" w:name="_Toc530034589"/>
+      <w:bookmarkStart w:id="39" w:name="_Toc530110033"/>
       <w:r>
         <w:lastRenderedPageBreak/>
         <w:t xml:space="preserve">.NET Framework </w:t>
@@ -5458,7 +5464,7 @@
       <w:pPr>
         <w:pStyle w:val="Heading3"/>
       </w:pPr>
-      <w:bookmarkStart w:id="40" w:name="_Toc530034590"/>
+      <w:bookmarkStart w:id="40" w:name="_Toc530110034"/>
       <w:r>
         <w:t>.NET Framework 4.0</w:t>
       </w:r>
@@ -5469,10 +5475,19 @@
         <w:pStyle w:val="EDBTXTNormalWebBlackCharChar0"/>
       </w:pPr>
       <w:r>
-        <w:t>To set up .NET Connector for usage with .NET Framework 4.0, reference</w:t>
-      </w:r>
-      <w:r>
-        <w:t xml:space="preserve"> the shared library files located in the following directory:</w:t>
+        <w:t>If you are u</w:t>
+      </w:r>
+      <w:r>
+        <w:t xml:space="preserve">sing .NET Framework version 4.0, </w:t>
+      </w:r>
+      <w:r>
+        <w:t>the dat</w:t>
+      </w:r>
+      <w:r>
+        <w:t>a provider installation path is</w:t>
+      </w:r>
+      <w:r>
+        <w:t>:</w:t>
       </w:r>
     </w:p>
     <w:p>
@@ -5519,13 +5534,7 @@
         <w:pStyle w:val="EDBTXTNormalWebBlackCharChar0"/>
       </w:pPr>
       <w:r>
-        <w:t>The shared library files</w:t>
-      </w:r>
-      <w:r>
-        <w:t xml:space="preserve"> are</w:t>
-      </w:r>
-      <w:r>
-        <w:t xml:space="preserve"> the following</w:t>
+        <w:t>The following shared library files are required</w:t>
       </w:r>
       <w:r>
         <w:t>:</w:t>
@@ -5668,7 +5677,7 @@
       <w:pPr>
         <w:pStyle w:val="Heading3"/>
       </w:pPr>
-      <w:bookmarkStart w:id="43" w:name="_Toc530034591"/>
+      <w:bookmarkStart w:id="43" w:name="_Toc530110035"/>
       <w:r>
         <w:t>.NET Framework 4.5</w:t>
       </w:r>
@@ -5684,15 +5693,19 @@
         <w:t>If you are u</w:t>
       </w:r>
       <w:r>
-        <w:t>sing .NET Framework version 4.5:</w:t>
-      </w:r>
-    </w:p>
-    <w:p>
-      <w:pPr>
-        <w:pStyle w:val="EDBTXTNormalWebBlackCharChar0"/>
-      </w:pPr>
-      <w:r>
-        <w:t>To set up .NET Connector for usage with .NET Framework 4.5, reference the shared library files located in the following directory:</w:t>
+        <w:t>sing .NET Framework version 4.5</w:t>
+      </w:r>
+      <w:r>
+        <w:t xml:space="preserve">, </w:t>
+      </w:r>
+      <w:r>
+        <w:t>the dat</w:t>
+      </w:r>
+      <w:r>
+        <w:t>a provider installation path is</w:t>
+      </w:r>
+      <w:r>
+        <w:t>:</w:t>
       </w:r>
     </w:p>
     <w:p>
@@ -5736,10 +5749,22 @@
     </w:p>
     <w:p>
       <w:pPr>
-        <w:pStyle w:val="EDBTXTNormalWebBlackCharChar0"/>
-      </w:pPr>
-      <w:r>
-        <w:t>The shared library files are the following:</w:t>
+        <w:pStyle w:val="EDBTXTNormalWebBlack"/>
+      </w:pPr>
+      <w:r>
+        <w:t xml:space="preserve">The </w:t>
+      </w:r>
+      <w:r>
+        <w:t xml:space="preserve">following shared library </w:t>
+      </w:r>
+      <w:r>
+        <w:t xml:space="preserve">files are </w:t>
+      </w:r>
+      <w:r>
+        <w:t>required</w:t>
+      </w:r>
+      <w:r>
+        <w:t>:</w:t>
       </w:r>
     </w:p>
     <w:p>
@@ -5824,7 +5849,7 @@
     </w:p>
     <w:p>
       <w:pPr>
-        <w:pStyle w:val="EDBTXTNormalWebBlackCharChar0"/>
+        <w:pStyle w:val="EDBTXTNormalWebBlack"/>
       </w:pPr>
       <w:r>
         <w:rPr>
@@ -5833,28 +5858,10 @@
         <w:t>Note:</w:t>
       </w:r>
       <w:r>
-        <w:t xml:space="preserve"> It</w:t>
-      </w:r>
-      <w:r>
-        <w:t xml:space="preserve"> is also required to refer to the depende</w:t>
-      </w:r>
-      <w:r>
-        <w:t>n</w:t>
-      </w:r>
-      <w:r>
-        <w:t xml:space="preserve">cy </w:t>
-      </w:r>
-      <w:r>
-        <w:t>on</w:t>
-      </w:r>
-      <w:r>
-        <w:t xml:space="preserve"> following </w:t>
-      </w:r>
-      <w:r>
-        <w:t xml:space="preserve">files </w:t>
-      </w:r>
-      <w:r>
-        <w:t>in the project:</w:t>
+        <w:t xml:space="preserve"> </w:t>
+      </w:r>
+      <w:r>
+        <w:t>You must also add the following dependencies to your project:</w:t>
       </w:r>
     </w:p>
     <w:p>
@@ -6029,7 +6036,7 @@
       <w:pPr>
         <w:pStyle w:val="Heading3"/>
       </w:pPr>
-      <w:bookmarkStart w:id="46" w:name="_Toc530034592"/>
+      <w:bookmarkStart w:id="46" w:name="_Toc530110036"/>
       <w:r>
         <w:t>.NET Framework 4.5.1</w:t>
       </w:r>
@@ -6039,29 +6046,100 @@
     </w:p>
     <w:p>
       <w:pPr>
-        <w:pStyle w:val="EDBTXTNormalWebBlackCharChar0"/>
-      </w:pPr>
-      <w:r>
-        <w:t>If you are using .NET Framework version 4.5.1:</w:t>
-      </w:r>
-    </w:p>
-    <w:p>
-      <w:pPr>
-        <w:pStyle w:val="EDBTXTNormalWebBlackCharChar0"/>
-      </w:pPr>
-      <w:r>
-        <w:t>To set up .NET Connector for usage with .NET Framework 4.5.1, reference the shared library file</w:t>
+        <w:pStyle w:val="EDBTXTNormalWebBlack"/>
+      </w:pPr>
+      <w:r>
+        <w:t>If you are using .NET Framework version 4.5.1</w:t>
+      </w:r>
+      <w:r>
+        <w:t xml:space="preserve">, </w:t>
+      </w:r>
+      <w:r>
+        <w:t>the dat</w:t>
+      </w:r>
+      <w:r>
+        <w:t>a provider installation path is</w:t>
+      </w:r>
+      <w:r>
+        <w:t>:</w:t>
+      </w:r>
+    </w:p>
+    <w:p>
+      <w:pPr>
+        <w:pStyle w:val="EDBTXTNormalWebBlackCharChar0"/>
+        <w:ind w:left="720"/>
+        <w:rPr>
+          <w:rStyle w:val="EDBTXTKeywordBlack"/>
+        </w:rPr>
+      </w:pPr>
+      <w:r>
+        <w:rPr>
+          <w:rStyle w:val="EDBTXTKeywordBlack"/>
+        </w:rPr>
+        <w:t>C:\Program Files\</w:t>
+      </w:r>
+      <w:r>
+        <w:rPr>
+          <w:rStyle w:val="EDBTXTKeywordBlack"/>
+        </w:rPr>
+        <w:t>edb</w:t>
+      </w:r>
+      <w:r>
+        <w:rPr>
+          <w:rStyle w:val="EDBTXTKeywordBlack"/>
+        </w:rPr>
+        <w:t>\dotnet</w:t>
+      </w:r>
+      <w:r>
+        <w:rPr>
+          <w:rStyle w:val="EDBTXTKeywordBlack"/>
+        </w:rPr>
+        <w:t>\</w:t>
+      </w:r>
+      <w:r>
+        <w:rPr>
+          <w:rStyle w:val="EDBTXTKeywordBlack"/>
+        </w:rPr>
+        <w:t>net451</w:t>
+      </w:r>
+      <w:r>
+        <w:rPr>
+          <w:rStyle w:val="EDBTXTKeywordBlack"/>
+        </w:rPr>
+        <w:t>\</w:t>
+      </w:r>
+    </w:p>
+    <w:p>
+      <w:pPr>
+        <w:pStyle w:val="EDBTXTNormalWebBlack"/>
+      </w:pPr>
+      <w:r>
+        <w:t xml:space="preserve">The </w:t>
+      </w:r>
+      <w:r>
+        <w:t xml:space="preserve">following </w:t>
+      </w:r>
+      <w:r>
+        <w:t>shared library file</w:t>
       </w:r>
       <w:r>
         <w:t>s</w:t>
       </w:r>
       <w:r>
-        <w:t xml:space="preserve"> located in the following directory:</w:t>
-      </w:r>
-    </w:p>
-    <w:p>
-      <w:pPr>
-        <w:pStyle w:val="EDBTXTNormalWebBlackCharChar0"/>
+        <w:t xml:space="preserve"> </w:t>
+      </w:r>
+      <w:r>
+        <w:t xml:space="preserve">are </w:t>
+      </w:r>
+      <w:r>
+        <w:t>required</w:t>
+      </w:r>
+      <w:r>
+        <w:t>:</w:t>
+      </w:r>
+    </w:p>
+    <w:p>
+      <w:pPr>
         <w:ind w:left="720"/>
         <w:rPr>
           <w:rStyle w:val="EDBTXTKeywordBlack"/>
@@ -6071,186 +6149,96 @@
         <w:rPr>
           <w:rStyle w:val="EDBTXTKeywordBlack"/>
         </w:rPr>
-        <w:t>C:\Program Files\</w:t>
-      </w:r>
-      <w:r>
-        <w:rPr>
-          <w:rStyle w:val="EDBTXTKeywordBlack"/>
-        </w:rPr>
-        <w:t>edb</w:t>
-      </w:r>
-      <w:r>
-        <w:rPr>
-          <w:rStyle w:val="EDBTXTKeywordBlack"/>
-        </w:rPr>
-        <w:t>\dotnet</w:t>
-      </w:r>
-      <w:r>
-        <w:rPr>
-          <w:rStyle w:val="EDBTXTKeywordBlack"/>
-        </w:rPr>
-        <w:t>\</w:t>
-      </w:r>
-      <w:r>
-        <w:rPr>
-          <w:rStyle w:val="EDBTXTKeywordBlack"/>
-        </w:rPr>
-        <w:t>net451</w:t>
-      </w:r>
-      <w:r>
-        <w:rPr>
-          <w:rStyle w:val="EDBTXTKeywordBlack"/>
-        </w:rPr>
-        <w:t>\</w:t>
-      </w:r>
-    </w:p>
-    <w:p>
-      <w:pPr>
-        <w:pStyle w:val="EDBTXTNormalWebBlackCharChar0"/>
-      </w:pPr>
-      <w:r>
-        <w:t>The shared library file</w:t>
-      </w:r>
-      <w:r>
+        <w:t>EnterpriseDB.EDBClient.</w:t>
+      </w:r>
+      <w:r>
+        <w:rPr>
+          <w:rStyle w:val="EDBTXTKeywordBlack"/>
+        </w:rPr>
+        <w:t>dll</w:t>
+      </w:r>
+    </w:p>
+    <w:p>
+      <w:pPr>
+        <w:ind w:left="720"/>
+        <w:rPr>
+          <w:rStyle w:val="EDBTXTKeywordBlack"/>
+        </w:rPr>
+      </w:pPr>
+      <w:r>
+        <w:rPr>
+          <w:rStyle w:val="EDBTXTKeywordBlack"/>
+        </w:rPr>
+        <w:t>System.Threading.Task</w:t>
+      </w:r>
+      <w:r>
+        <w:rPr>
+          <w:rStyle w:val="EDBTXTKeywordBlack"/>
+        </w:rPr>
         <w:t>s</w:t>
       </w:r>
       <w:r>
+        <w:rPr>
+          <w:rStyle w:val="EDBTXTKeywordBlack"/>
+        </w:rPr>
+        <w:t>.Extension</w:t>
+      </w:r>
+      <w:r>
+        <w:rPr>
+          <w:rStyle w:val="EDBTXTKeywordBlack"/>
+        </w:rPr>
+        <w:t>s</w:t>
+      </w:r>
+      <w:r>
+        <w:rPr>
+          <w:rStyle w:val="EDBTXTKeywordBlack"/>
+        </w:rPr>
+        <w:t>.dll</w:t>
+      </w:r>
+    </w:p>
+    <w:p>
+      <w:pPr>
+        <w:ind w:left="720"/>
+        <w:rPr>
+          <w:rStyle w:val="EDBTXTKeywordBlack"/>
+        </w:rPr>
+      </w:pPr>
+      <w:r>
+        <w:rPr>
+          <w:rStyle w:val="EDBTXTKeywordBlack"/>
+        </w:rPr>
+        <w:t>System.Runtime.CompilerServices.Unsafe.dll</w:t>
+      </w:r>
+    </w:p>
+    <w:p>
+      <w:pPr>
+        <w:ind w:left="720"/>
+        <w:rPr>
+          <w:rStyle w:val="EDBTXTKeywordBlack"/>
+        </w:rPr>
+      </w:pPr>
+      <w:r>
+        <w:rPr>
+          <w:rStyle w:val="EDBTXTKeywordBlack"/>
+        </w:rPr>
+        <w:t>System.ValueTuple.dll</w:t>
+      </w:r>
+    </w:p>
+    <w:p>
+      <w:pPr>
+        <w:pStyle w:val="EDBTXTNormalWebBlack"/>
+      </w:pPr>
+      <w:r>
+        <w:rPr>
+          <w:rStyle w:val="EDBTXTEmphasisNormalWebBoldBlackCharChar"/>
+        </w:rPr>
+        <w:t>Note:</w:t>
+      </w:r>
+      <w:r>
         <w:t xml:space="preserve"> </w:t>
       </w:r>
       <w:r>
-        <w:t xml:space="preserve">are </w:t>
-      </w:r>
-      <w:r>
-        <w:t>the following:</w:t>
-      </w:r>
-    </w:p>
-    <w:p>
-      <w:pPr>
-        <w:ind w:left="720"/>
-        <w:rPr>
-          <w:rStyle w:val="EDBTXTKeywordBlack"/>
-        </w:rPr>
-      </w:pPr>
-      <w:r>
-        <w:rPr>
-          <w:rStyle w:val="EDBTXTKeywordBlack"/>
-        </w:rPr>
-        <w:t>EnterpriseDB.EDBClient.</w:t>
-      </w:r>
-      <w:r>
-        <w:rPr>
-          <w:rStyle w:val="EDBTXTKeywordBlack"/>
-        </w:rPr>
-        <w:t>dll</w:t>
-      </w:r>
-    </w:p>
-    <w:p>
-      <w:pPr>
-        <w:ind w:left="720"/>
-        <w:rPr>
-          <w:rStyle w:val="EDBTXTKeywordBlack"/>
-        </w:rPr>
-      </w:pPr>
-      <w:r>
-        <w:rPr>
-          <w:rStyle w:val="EDBTXTKeywordBlack"/>
-        </w:rPr>
-        <w:t>System.Threading.Task</w:t>
-      </w:r>
-      <w:r>
-        <w:rPr>
-          <w:rStyle w:val="EDBTXTKeywordBlack"/>
-        </w:rPr>
-        <w:t>s</w:t>
-      </w:r>
-      <w:r>
-        <w:rPr>
-          <w:rStyle w:val="EDBTXTKeywordBlack"/>
-        </w:rPr>
-        <w:t>.Extension</w:t>
-      </w:r>
-      <w:r>
-        <w:rPr>
-          <w:rStyle w:val="EDBTXTKeywordBlack"/>
-        </w:rPr>
-        <w:t>s</w:t>
-      </w:r>
-      <w:r>
-        <w:rPr>
-          <w:rStyle w:val="EDBTXTKeywordBlack"/>
-        </w:rPr>
-        <w:t>.dll</w:t>
-      </w:r>
-    </w:p>
-    <w:p>
-      <w:pPr>
-        <w:ind w:left="720"/>
-        <w:rPr>
-          <w:rStyle w:val="EDBTXTKeywordBlack"/>
-        </w:rPr>
-      </w:pPr>
-      <w:r>
-        <w:rPr>
-          <w:rStyle w:val="EDBTXTKeywordBlack"/>
-        </w:rPr>
-        <w:t>System.Runtime.CompilerServices.Unsafe.dll</w:t>
-      </w:r>
-    </w:p>
-    <w:p>
-      <w:pPr>
-        <w:ind w:left="720"/>
-        <w:rPr>
-          <w:rStyle w:val="EDBTXTKeywordBlack"/>
-        </w:rPr>
-      </w:pPr>
-      <w:r>
-        <w:rPr>
-          <w:rStyle w:val="EDBTXTKeywordBlack"/>
-        </w:rPr>
-        <w:t>System.ValueTuple.dll</w:t>
-      </w:r>
-    </w:p>
-    <w:p>
-      <w:pPr>
-        <w:ind w:left="720"/>
-        <w:rPr>
-          <w:rStyle w:val="EDBTXTKeywordBlack"/>
-        </w:rPr>
-      </w:pPr>
-    </w:p>
-    <w:p>
-      <w:pPr>
-        <w:pStyle w:val="EDBTXTNormalWebBlackCharChar0"/>
-      </w:pPr>
-      <w:r>
-        <w:rPr>
-          <w:rStyle w:val="EDBTXTEmphasisNormalWebBoldBlackCharChar"/>
-        </w:rPr>
-        <w:t>Note:</w:t>
-      </w:r>
-      <w:r>
-        <w:t xml:space="preserve"> It</w:t>
-      </w:r>
-      <w:r>
-        <w:t xml:space="preserve"> is also required to refer to the depende</w:t>
-      </w:r>
-      <w:r>
-        <w:t>n</w:t>
-      </w:r>
-      <w:r>
-        <w:t xml:space="preserve">cy </w:t>
-      </w:r>
-      <w:r>
-        <w:t>on</w:t>
-      </w:r>
-      <w:r>
-        <w:t xml:space="preserve"> following </w:t>
-      </w:r>
-      <w:r>
-        <w:t xml:space="preserve">files </w:t>
-      </w:r>
-      <w:r>
-        <w:t>in the project:</w:t>
+        <w:t>You must also add the following dependencies to your project:</w:t>
       </w:r>
     </w:p>
     <w:p>
@@ -6429,7 +6417,7 @@
       <w:pPr>
         <w:pStyle w:val="Heading3"/>
       </w:pPr>
-      <w:bookmarkStart w:id="48" w:name="_Toc530034593"/>
+      <w:bookmarkStart w:id="48" w:name="_Toc530110037"/>
       <w:r>
         <w:t>.NET Standard 2.0</w:t>
       </w:r>
@@ -6488,7 +6476,7 @@
     </w:p>
     <w:p>
       <w:pPr>
-        <w:pStyle w:val="EDBTXTNormalWebBlackCharChar0"/>
+        <w:pStyle w:val="EDBTXTNormalWebBlack"/>
       </w:pPr>
       <w:r>
         <w:t xml:space="preserve">The </w:t>
@@ -6588,15 +6576,7 @@
     </w:p>
     <w:p>
       <w:pPr>
-        <w:ind w:left="720"/>
-        <w:rPr>
-          <w:rStyle w:val="EDBTXTKeywordBlack"/>
-        </w:rPr>
-      </w:pPr>
-    </w:p>
-    <w:p>
-      <w:pPr>
-        <w:pStyle w:val="Default"/>
+        <w:pStyle w:val="EDBTXTNormalWebBlack"/>
       </w:pPr>
       <w:r>
         <w:rPr>
@@ -6619,18 +6599,14 @@
         <w:t xml:space="preserve"> </w:t>
       </w:r>
       <w:r>
-        <w:t>you must also add the following dependencies to your</w:t>
+        <w:t>Y</w:t>
+      </w:r>
+      <w:r>
+        <w:t>ou must also add the following dependencies to your</w:t>
       </w:r>
       <w:r>
         <w:t xml:space="preserve"> project:</w:t>
       </w:r>
-    </w:p>
-    <w:p>
-      <w:pPr>
-        <w:rPr>
-          <w:rStyle w:val="EDBTXTKeywordBlack"/>
-        </w:rPr>
-      </w:pPr>
     </w:p>
     <w:p>
       <w:pPr>
@@ -6665,7 +6641,15 @@
     </w:p>
     <w:p>
       <w:pPr>
-        <w:pStyle w:val="Default"/>
+        <w:pStyle w:val="EDBTXTNormalWebBlack"/>
+        <w:rPr>
+          <w:rStyle w:val="EDBTXTKeywordBlack"/>
+          <w:rFonts w:ascii="Times New Roman" w:hAnsi="Times New Roman" w:cs="Times New Roman"/>
+          <w:sz w:val="24"/>
+          <w:szCs w:val="24"/>
+        </w:rPr>
+      </w:pPr>
+      <w:r>
         <w:rPr>
           <w:rStyle w:val="EDBTXTKeywordBlack"/>
           <w:rFonts w:ascii="Times New Roman" w:hAnsi="Times New Roman" w:cs="Times New Roman"/>
@@ -6673,27 +6657,16 @@
           <w:sz w:val="24"/>
           <w:szCs w:val="24"/>
         </w:rPr>
-      </w:pPr>
-    </w:p>
-    <w:p>
-      <w:pPr>
-        <w:pStyle w:val="Default"/>
+        <w:t xml:space="preserve">Note: </w:t>
+      </w:r>
+      <w:r>
         <w:rPr>
           <w:rStyle w:val="EDBTXTKeywordBlack"/>
           <w:rFonts w:ascii="Times New Roman" w:hAnsi="Times New Roman" w:cs="Times New Roman"/>
           <w:sz w:val="24"/>
           <w:szCs w:val="24"/>
         </w:rPr>
-      </w:pPr>
-      <w:r>
-        <w:rPr>
-          <w:rStyle w:val="EDBTXTKeywordBlack"/>
-          <w:rFonts w:ascii="Times New Roman" w:hAnsi="Times New Roman" w:cs="Times New Roman"/>
-          <w:b/>
-          <w:sz w:val="24"/>
-          <w:szCs w:val="24"/>
-        </w:rPr>
-        <w:t xml:space="preserve">Note: </w:t>
+        <w:t xml:space="preserve">If </w:t>
       </w:r>
       <w:r>
         <w:rPr>
@@ -6702,7 +6675,7 @@
           <w:sz w:val="24"/>
           <w:szCs w:val="24"/>
         </w:rPr>
-        <w:t xml:space="preserve">If </w:t>
+        <w:t xml:space="preserve">your </w:t>
       </w:r>
       <w:r>
         <w:rPr>
@@ -6711,7 +6684,7 @@
           <w:sz w:val="24"/>
           <w:szCs w:val="24"/>
         </w:rPr>
-        <w:t xml:space="preserve">your </w:t>
+        <w:t xml:space="preserve">target framework is .Net Core 2.0, </w:t>
       </w:r>
       <w:r>
         <w:rPr>
@@ -6720,7 +6693,7 @@
           <w:sz w:val="24"/>
           <w:szCs w:val="24"/>
         </w:rPr>
-        <w:t xml:space="preserve">target framework is .Net Core 2.0, </w:t>
+        <w:t xml:space="preserve">then </w:t>
       </w:r>
       <w:r>
         <w:rPr>
@@ -6729,7 +6702,7 @@
           <w:sz w:val="24"/>
           <w:szCs w:val="24"/>
         </w:rPr>
-        <w:t>please include</w:t>
+        <w:t>include</w:t>
       </w:r>
       <w:r>
         <w:rPr>
@@ -6779,14 +6752,6 @@
     </w:p>
     <w:p>
       <w:pPr>
-        <w:pStyle w:val="Default"/>
-        <w:rPr>
-          <w:rStyle w:val="EDBTXTKeywordBlack"/>
-        </w:rPr>
-      </w:pPr>
-    </w:p>
-    <w:p>
-      <w:pPr>
         <w:ind w:left="720"/>
         <w:rPr>
           <w:rStyle w:val="EDBTXTKeywordBlack"/>
@@ -6825,7 +6790,7 @@
     </w:p>
     <w:p>
       <w:pPr>
-        <w:pStyle w:val="EDBTXTNormalWebBlackCharChar0"/>
+        <w:pStyle w:val="EDBTXTNormalWebBlack"/>
       </w:pPr>
       <w:r>
         <w:t xml:space="preserve">See Section </w:t>
@@ -6851,6 +6816,12 @@
         <w:rPr>
           <w:u w:val="single"/>
         </w:rPr>
+        <w:instrText xml:space="preserve"> \* MERGEFORMAT </w:instrText>
+      </w:r>
+      <w:r>
+        <w:rPr>
+          <w:u w:val="single"/>
+        </w:rPr>
         <w:fldChar w:fldCharType="separate"/>
       </w:r>
       <w:r>
@@ -6980,7 +6951,7 @@
         <w:pStyle w:val="Heading2"/>
       </w:pPr>
       <w:bookmarkStart w:id="49" w:name="_Ref477527440"/>
-      <w:bookmarkStart w:id="50" w:name="_Toc530034594"/>
+      <w:bookmarkStart w:id="50" w:name="_Toc530110038"/>
       <w:r>
         <w:lastRenderedPageBreak/>
         <w:t xml:space="preserve">Entity Framework </w:t>
@@ -7046,7 +7017,10 @@
         <w:pStyle w:val="EDBTXTNormalWebBlackCharChar0"/>
       </w:pPr>
       <w:r>
-        <w:t>The shared library files are the following:</w:t>
+        <w:t>The following shared library files are required</w:t>
+      </w:r>
+      <w:r>
+        <w:t>:</w:t>
       </w:r>
     </w:p>
     <w:p>
@@ -7929,7 +7903,7 @@
       </w:pPr>
       <w:bookmarkStart w:id="51" w:name="_Ref477528081"/>
       <w:bookmarkStart w:id="52" w:name="_Ref511382535"/>
-      <w:bookmarkStart w:id="53" w:name="_Toc530034595"/>
+      <w:bookmarkStart w:id="53" w:name="_Toc530110039"/>
       <w:r>
         <w:lastRenderedPageBreak/>
         <w:t>E</w:t>
@@ -8124,7 +8098,7 @@
       <w:pPr>
         <w:pStyle w:val="Heading3"/>
       </w:pPr>
-      <w:bookmarkStart w:id="54" w:name="_Toc530034596"/>
+      <w:bookmarkStart w:id="54" w:name="_Toc530110040"/>
       <w:r>
         <w:t>Installation and Configuration for Visual Studio 2015</w:t>
       </w:r>
@@ -8693,7 +8667,7 @@
       <w:pPr>
         <w:pStyle w:val="Heading3"/>
       </w:pPr>
-      <w:bookmarkStart w:id="179" w:name="_Toc530034597"/>
+      <w:bookmarkStart w:id="179" w:name="_Toc530110041"/>
       <w:r>
         <w:t>Model First and Data</w:t>
       </w:r>
@@ -9549,7 +9523,7 @@
         <w:pStyle w:val="Heading1"/>
       </w:pPr>
       <w:bookmarkStart w:id="180" w:name="_Ref482087625"/>
-      <w:bookmarkStart w:id="181" w:name="_Toc530034598"/>
+      <w:bookmarkStart w:id="181" w:name="_Toc530110042"/>
       <w:r>
         <w:lastRenderedPageBreak/>
         <w:t>Using the .NET Connector</w:t>
@@ -9803,7 +9777,7 @@
       <w:pPr>
         <w:pStyle w:val="Heading2"/>
       </w:pPr>
-      <w:bookmarkStart w:id="182" w:name="_Toc530034599"/>
+      <w:bookmarkStart w:id="182" w:name="_Toc530110043"/>
       <w:r>
         <w:t>Opening a Database Connection</w:t>
       </w:r>
@@ -10021,7 +9995,7 @@
         <w:pStyle w:val="Heading3"/>
       </w:pPr>
       <w:bookmarkStart w:id="183" w:name="_Ref482087661"/>
-      <w:bookmarkStart w:id="184" w:name="_Toc530034600"/>
+      <w:bookmarkStart w:id="184" w:name="_Toc530110044"/>
       <w:r>
         <w:t>Connection String Parameters</w:t>
       </w:r>
@@ -11085,7 +11059,7 @@
       <w:pPr>
         <w:pStyle w:val="Heading3"/>
       </w:pPr>
-      <w:bookmarkStart w:id="185" w:name="_Toc530034601"/>
+      <w:bookmarkStart w:id="185" w:name="_Toc530110045"/>
       <w:r>
         <w:t xml:space="preserve">Example - </w:t>
       </w:r>
@@ -11563,7 +11537,7 @@
       <w:pPr>
         <w:pStyle w:val="Heading3"/>
       </w:pPr>
-      <w:bookmarkStart w:id="186" w:name="_Toc530034602"/>
+      <w:bookmarkStart w:id="186" w:name="_Toc530110046"/>
       <w:r>
         <w:t xml:space="preserve">Example - </w:t>
       </w:r>
@@ -12176,7 +12150,7 @@
       <w:pPr>
         <w:pStyle w:val="Heading3"/>
       </w:pPr>
-      <w:bookmarkStart w:id="187" w:name="_Toc530034603"/>
+      <w:bookmarkStart w:id="187" w:name="_Toc530110047"/>
       <w:r>
         <w:t xml:space="preserve">Example - </w:t>
       </w:r>
@@ -13085,7 +13059,7 @@
       <w:pPr>
         <w:pStyle w:val="Heading2"/>
       </w:pPr>
-      <w:bookmarkStart w:id="188" w:name="_Toc530034604"/>
+      <w:bookmarkStart w:id="188" w:name="_Toc530110048"/>
       <w:r>
         <w:lastRenderedPageBreak/>
         <w:t>Retrieving Database Records</w:t>
@@ -14169,7 +14143,7 @@
       <w:pPr>
         <w:pStyle w:val="Heading3"/>
       </w:pPr>
-      <w:bookmarkStart w:id="189" w:name="_Toc530034605"/>
+      <w:bookmarkStart w:id="189" w:name="_Toc530110049"/>
       <w:r>
         <w:t>Retr</w:t>
       </w:r>
@@ -14703,7 +14677,7 @@
       <w:pPr>
         <w:pStyle w:val="Heading2"/>
       </w:pPr>
-      <w:bookmarkStart w:id="190" w:name="_Toc530034606"/>
+      <w:bookmarkStart w:id="190" w:name="_Toc530110050"/>
       <w:r>
         <w:lastRenderedPageBreak/>
         <w:t>Parameterized Queries</w:t>
@@ -15384,7 +15358,7 @@
       <w:pPr>
         <w:pStyle w:val="Heading2"/>
       </w:pPr>
-      <w:bookmarkStart w:id="191" w:name="_Toc530034607"/>
+      <w:bookmarkStart w:id="191" w:name="_Toc530110051"/>
       <w:r>
         <w:lastRenderedPageBreak/>
         <w:t>Inserting Records in a Database</w:t>
@@ -16230,7 +16204,7 @@
       <w:pPr>
         <w:pStyle w:val="Heading2"/>
       </w:pPr>
-      <w:bookmarkStart w:id="192" w:name="_Toc530034608"/>
+      <w:bookmarkStart w:id="192" w:name="_Toc530110052"/>
       <w:r>
         <w:lastRenderedPageBreak/>
         <w:t>Deleting Records in a Database</w:t>
@@ -17072,7 +17046,7 @@
       <w:pPr>
         <w:pStyle w:val="Heading2"/>
       </w:pPr>
-      <w:bookmarkStart w:id="193" w:name="_Toc530034609"/>
+      <w:bookmarkStart w:id="193" w:name="_Toc530110053"/>
       <w:r>
         <w:lastRenderedPageBreak/>
         <w:t>Using SPL Stored Procedures in your .NET Application</w:t>
@@ -17348,7 +17322,7 @@
       <w:pPr>
         <w:pStyle w:val="Heading3"/>
       </w:pPr>
-      <w:bookmarkStart w:id="194" w:name="_Toc530034610"/>
+      <w:bookmarkStart w:id="194" w:name="_Toc530110054"/>
       <w:r>
         <w:t>Example - Executing</w:t>
       </w:r>
@@ -18277,7 +18251,7 @@
       <w:pPr>
         <w:pStyle w:val="Heading3"/>
       </w:pPr>
-      <w:bookmarkStart w:id="195" w:name="_Toc530034611"/>
+      <w:bookmarkStart w:id="195" w:name="_Toc530110055"/>
       <w:r>
         <w:t xml:space="preserve">Example - </w:t>
       </w:r>
@@ -20073,7 +20047,7 @@
       <w:pPr>
         <w:pStyle w:val="Heading3"/>
       </w:pPr>
-      <w:bookmarkStart w:id="196" w:name="_Toc530034612"/>
+      <w:bookmarkStart w:id="196" w:name="_Toc530110056"/>
       <w:r>
         <w:t xml:space="preserve">Example - </w:t>
       </w:r>
@@ -22307,7 +22281,7 @@
       <w:pPr>
         <w:pStyle w:val="Heading2"/>
       </w:pPr>
-      <w:bookmarkStart w:id="197" w:name="_Toc530034613"/>
+      <w:bookmarkStart w:id="197" w:name="_Toc530110057"/>
       <w:r>
         <w:lastRenderedPageBreak/>
         <w:t xml:space="preserve">Using </w:t>
@@ -23481,7 +23455,7 @@
         <w:rStyle w:val="PageNumber"/>
         <w:noProof/>
       </w:rPr>
-      <w:t>2</w:t>
+      <w:t>10</w:t>
     </w:r>
     <w:r>
       <w:rPr>
@@ -23756,29 +23730,29 @@
         <v:path o:extrusionok="f" gradientshapeok="t" o:connecttype="rect"/>
         <o:lock v:ext="edit" aspectratio="t"/>
       </v:shapetype>
-      <v:shape id="_x0000_i1046" type="#_x0000_t75" style="width:8.25pt;height:8.25pt" o:bullet="t">
+      <v:shape id="_x0000_i1250" type="#_x0000_t75" style="width:8.25pt;height:8.25pt" o:bullet="t">
         <v:imagedata r:id="rId1" o:title="bullet"/>
       </v:shape>
     </w:pict>
   </w:numPicBullet>
   <w:numPicBullet w:numPicBulletId="1">
     <w:pict>
-      <v:shape id="_x0000_i1047" type="#_x0000_t75" style="width:3in;height:3in" o:bullet="t"/>
+      <v:shape id="_x0000_i1251" type="#_x0000_t75" style="width:3in;height:3in" o:bullet="t"/>
     </w:pict>
   </w:numPicBullet>
   <w:numPicBullet w:numPicBulletId="2">
     <w:pict>
-      <v:shape id="_x0000_i1048" type="#_x0000_t75" style="width:3in;height:3in" o:bullet="t"/>
+      <v:shape id="_x0000_i1252" type="#_x0000_t75" style="width:3in;height:3in" o:bullet="t"/>
     </w:pict>
   </w:numPicBullet>
   <w:numPicBullet w:numPicBulletId="3">
     <w:pict>
-      <v:shape id="_x0000_i1049" type="#_x0000_t75" style="width:3in;height:3in" o:bullet="t"/>
+      <v:shape id="_x0000_i1253" type="#_x0000_t75" style="width:3in;height:3in" o:bullet="t"/>
     </w:pict>
   </w:numPicBullet>
   <w:numPicBullet w:numPicBulletId="4">
     <w:pict>
-      <v:shape id="_x0000_i1050" type="#_x0000_t75" style="width:3in;height:3in" o:bullet="t"/>
+      <v:shape id="_x0000_i1254" type="#_x0000_t75" style="width:3in;height:3in" o:bullet="t"/>
     </w:pict>
   </w:numPicBullet>
   <w:abstractNum w:abstractNumId="0">
@@ -33620,7 +33594,7 @@
 </file>
 
 <file path=customXml/itemProps1.xml><?xml version="1.0" encoding="utf-8"?>
-<ds:datastoreItem xmlns:ds="http://schemas.openxmlformats.org/officeDocument/2006/customXml" ds:itemID="{39EF8F5E-09F6-4AEB-9BEB-9326686C38CD}">
+<ds:datastoreItem xmlns:ds="http://schemas.openxmlformats.org/officeDocument/2006/customXml" ds:itemID="{BB91338A-67F4-4ECF-94D7-AE0092A7B012}">
   <ds:schemaRefs>
     <ds:schemaRef ds:uri="http://schemas.openxmlformats.org/officeDocument/2006/bibliography"/>
   </ds:schemaRefs>

</xml_diff>

<commit_message>
Updated .NET Connector Guide - fixed links
</commit_message>
<xml_diff>
--- a/edb_docs/EDB_Postgres_Advanced_Server_NET_Connector_Guide.docx
+++ b/edb_docs/EDB_Postgres_Advanced_Server_NET_Connector_Guide.docx
@@ -4609,15 +4609,7 @@
         <w:rPr>
           <w:i/>
         </w:rPr>
-        <w:t>F</w:t>
-      </w:r>
-      <w:bookmarkStart w:id="34" w:name="_GoBack"/>
-      <w:bookmarkEnd w:id="34"/>
-      <w:r>
-        <w:rPr>
-          <w:i/>
-        </w:rPr>
-        <w:t>igure 2.</w:t>
+        <w:t>Figure 2.</w:t>
       </w:r>
       <w:r>
         <w:rPr>
@@ -4829,14 +4821,14 @@
       <w:pPr>
         <w:pStyle w:val="Heading1"/>
       </w:pPr>
-      <w:bookmarkStart w:id="35" w:name="_Ref456012125"/>
-      <w:bookmarkStart w:id="36" w:name="_Toc530110031"/>
+      <w:bookmarkStart w:id="34" w:name="_Ref456012125"/>
+      <w:bookmarkStart w:id="35" w:name="_Toc530110031"/>
       <w:r>
         <w:lastRenderedPageBreak/>
         <w:t>Configuring the .NET Connector</w:t>
       </w:r>
+      <w:bookmarkEnd w:id="34"/>
       <w:bookmarkEnd w:id="35"/>
-      <w:bookmarkEnd w:id="36"/>
     </w:p>
     <w:p>
       <w:pPr>
@@ -5084,13 +5076,13 @@
       <w:pPr>
         <w:pStyle w:val="Heading2"/>
       </w:pPr>
-      <w:bookmarkStart w:id="37" w:name="_Ref477525249"/>
-      <w:bookmarkStart w:id="38" w:name="_Toc530110032"/>
+      <w:bookmarkStart w:id="36" w:name="_Ref477525249"/>
+      <w:bookmarkStart w:id="37" w:name="_Toc530110032"/>
       <w:r>
         <w:t>General Instructions</w:t>
       </w:r>
+      <w:bookmarkEnd w:id="36"/>
       <w:bookmarkEnd w:id="37"/>
-      <w:bookmarkEnd w:id="38"/>
     </w:p>
     <w:p>
       <w:pPr>
@@ -5436,7 +5428,7 @@
       <w:pPr>
         <w:pStyle w:val="Heading2"/>
       </w:pPr>
-      <w:bookmarkStart w:id="39" w:name="_Toc530110033"/>
+      <w:bookmarkStart w:id="38" w:name="_Toc530110033"/>
       <w:r>
         <w:lastRenderedPageBreak/>
         <w:t xml:space="preserve">.NET Framework </w:t>
@@ -5444,6 +5436,30 @@
       <w:r>
         <w:t>Setup</w:t>
       </w:r>
+      <w:bookmarkEnd w:id="38"/>
+    </w:p>
+    <w:p>
+      <w:pPr>
+        <w:pStyle w:val="EDBTXTNormalWebBlackCharChar0"/>
+      </w:pPr>
+      <w:r>
+        <w:t>The following sections describe the setup for various .NET ver</w:t>
+      </w:r>
+      <w:r>
+        <w:t>s</w:t>
+      </w:r>
+      <w:r>
+        <w:t>ions.</w:t>
+      </w:r>
+    </w:p>
+    <w:p>
+      <w:pPr>
+        <w:pStyle w:val="Heading3"/>
+      </w:pPr>
+      <w:bookmarkStart w:id="39" w:name="_Toc530110034"/>
+      <w:r>
+        <w:t>.NET Framework 4.0</w:t>
+      </w:r>
       <w:bookmarkEnd w:id="39"/>
     </w:p>
     <w:p>
@@ -5451,239 +5467,215 @@
         <w:pStyle w:val="EDBTXTNormalWebBlackCharChar0"/>
       </w:pPr>
       <w:r>
-        <w:t>The following sections describe the setup for various .NET ver</w:t>
-      </w:r>
-      <w:r>
-        <w:t>s</w:t>
-      </w:r>
-      <w:r>
-        <w:t>ions.</w:t>
-      </w:r>
+        <w:t>If you are u</w:t>
+      </w:r>
+      <w:r>
+        <w:t xml:space="preserve">sing .NET Framework version 4.0, </w:t>
+      </w:r>
+      <w:r>
+        <w:t>the dat</w:t>
+      </w:r>
+      <w:r>
+        <w:t>a provider installation path is</w:t>
+      </w:r>
+      <w:r>
+        <w:t>:</w:t>
+      </w:r>
+    </w:p>
+    <w:p>
+      <w:pPr>
+        <w:pStyle w:val="EDBTXTNormalWebBlackCharChar0"/>
+        <w:ind w:left="720"/>
+        <w:rPr>
+          <w:rStyle w:val="EDBTXTKeywordBlack"/>
+        </w:rPr>
+      </w:pPr>
+      <w:r>
+        <w:rPr>
+          <w:rStyle w:val="EDBTXTKeywordBlack"/>
+        </w:rPr>
+        <w:t>C:\Program Files\edb</w:t>
+      </w:r>
+      <w:r>
+        <w:rPr>
+          <w:rStyle w:val="EDBTXTKeywordBlack"/>
+        </w:rPr>
+        <w:t>\dotnet</w:t>
+      </w:r>
+      <w:r>
+        <w:rPr>
+          <w:rStyle w:val="EDBTXTKeywordBlack"/>
+        </w:rPr>
+        <w:t>\</w:t>
+      </w:r>
+      <w:r>
+        <w:rPr>
+          <w:rStyle w:val="EDBTXTKeywordBlack"/>
+        </w:rPr>
+        <w:t>net40</w:t>
+      </w:r>
+      <w:r>
+        <w:rPr>
+          <w:rStyle w:val="EDBTXTKeywordBlack"/>
+        </w:rPr>
+        <w:t>\</w:t>
+      </w:r>
+    </w:p>
+    <w:p>
+      <w:pPr>
+        <w:pStyle w:val="EDBTXTNormalWebBlackCharChar0"/>
+      </w:pPr>
+      <w:r>
+        <w:t>The following shared library files are required</w:t>
+      </w:r>
+      <w:r>
+        <w:t>:</w:t>
+      </w:r>
+    </w:p>
+    <w:p>
+      <w:pPr>
+        <w:ind w:left="720"/>
+        <w:rPr>
+          <w:rStyle w:val="EDBTXTKeywordBlack"/>
+        </w:rPr>
+      </w:pPr>
+      <w:r>
+        <w:rPr>
+          <w:rStyle w:val="EDBTXTKeywordBlack"/>
+        </w:rPr>
+        <w:t>EDBDataProvider.2.0.2.</w:t>
+      </w:r>
+      <w:r>
+        <w:rPr>
+          <w:rStyle w:val="EDBTXTKeywordBlack"/>
+        </w:rPr>
+        <w:t xml:space="preserve">dll </w:t>
+      </w:r>
+    </w:p>
+    <w:p>
+      <w:pPr>
+        <w:ind w:left="720"/>
+        <w:rPr>
+          <w:rStyle w:val="EDBTXTKeywordBlack"/>
+        </w:rPr>
+      </w:pPr>
+      <w:r>
+        <w:rPr>
+          <w:rStyle w:val="EDBTXTKeywordBlack"/>
+        </w:rPr>
+        <w:t>Mono.Security.dll</w:t>
+      </w:r>
+    </w:p>
+    <w:p>
+      <w:pPr>
+        <w:pStyle w:val="EDBTXTNormalWebBlackCharChar0"/>
+      </w:pPr>
+      <w:r>
+        <w:t xml:space="preserve">See Section </w:t>
+      </w:r>
+      <w:r>
+        <w:rPr>
+          <w:u w:val="single"/>
+        </w:rPr>
+        <w:fldChar w:fldCharType="begin"/>
+      </w:r>
+      <w:r>
+        <w:rPr>
+          <w:u w:val="single"/>
+        </w:rPr>
+        <w:instrText xml:space="preserve"> REF _Ref477525249 \r \h </w:instrText>
+      </w:r>
+      <w:r>
+        <w:rPr>
+          <w:u w:val="single"/>
+        </w:rPr>
+      </w:r>
+      <w:r>
+        <w:rPr>
+          <w:u w:val="single"/>
+        </w:rPr>
+        <w:fldChar w:fldCharType="separate"/>
+      </w:r>
+      <w:r>
+        <w:rPr>
+          <w:u w:val="single"/>
+        </w:rPr>
+        <w:t>3.1</w:t>
+      </w:r>
+      <w:r>
+        <w:rPr>
+          <w:u w:val="single"/>
+        </w:rPr>
+        <w:fldChar w:fldCharType="end"/>
+      </w:r>
+      <w:r>
+        <w:t xml:space="preserve"> for information on referencing library files.</w:t>
+      </w:r>
+    </w:p>
+    <w:p>
+      <w:pPr>
+        <w:pStyle w:val="EDBTXTNormalWebBlackCharChar0"/>
+      </w:pPr>
+      <w:r>
+        <w:t xml:space="preserve">Depending upon the type of application, import the namespace into the source code (see Section </w:t>
+      </w:r>
+      <w:r>
+        <w:rPr>
+          <w:u w:val="single"/>
+        </w:rPr>
+        <w:fldChar w:fldCharType="begin"/>
+      </w:r>
+      <w:r>
+        <w:rPr>
+          <w:u w:val="single"/>
+        </w:rPr>
+        <w:instrText xml:space="preserve"> REF _Ref477525249 \r \h </w:instrText>
+      </w:r>
+      <w:r>
+        <w:rPr>
+          <w:u w:val="single"/>
+        </w:rPr>
+      </w:r>
+      <w:r>
+        <w:rPr>
+          <w:u w:val="single"/>
+        </w:rPr>
+        <w:fldChar w:fldCharType="separate"/>
+      </w:r>
+      <w:r>
+        <w:rPr>
+          <w:u w:val="single"/>
+        </w:rPr>
+        <w:t>3.1</w:t>
+      </w:r>
+      <w:r>
+        <w:rPr>
+          <w:u w:val="single"/>
+        </w:rPr>
+        <w:fldChar w:fldCharType="end"/>
+      </w:r>
+      <w:r>
+        <w:t>).</w:t>
+      </w:r>
+    </w:p>
+    <w:p>
+      <w:pPr>
+        <w:pStyle w:val="EDBHTMLPageBreak"/>
+      </w:pPr>
+      <w:bookmarkStart w:id="40" w:name="_Ref503423964"/>
+      <w:bookmarkStart w:id="41" w:name="_Ref503430964"/>
     </w:p>
     <w:p>
       <w:pPr>
         <w:pStyle w:val="Heading3"/>
       </w:pPr>
-      <w:bookmarkStart w:id="40" w:name="_Toc530110034"/>
-      <w:r>
-        <w:t>.NET Framework 4.0</w:t>
+      <w:bookmarkStart w:id="42" w:name="_Toc530110035"/>
+      <w:r>
+        <w:t>.NET Framework 4.5</w:t>
       </w:r>
       <w:bookmarkEnd w:id="40"/>
-    </w:p>
-    <w:p>
-      <w:pPr>
-        <w:pStyle w:val="EDBTXTNormalWebBlackCharChar0"/>
-      </w:pPr>
-      <w:r>
-        <w:t>If you are u</w:t>
-      </w:r>
-      <w:r>
-        <w:t xml:space="preserve">sing .NET Framework version 4.0, </w:t>
-      </w:r>
-      <w:r>
-        <w:t>the dat</w:t>
-      </w:r>
-      <w:r>
-        <w:t>a provider installation path is</w:t>
-      </w:r>
-      <w:r>
-        <w:t>:</w:t>
-      </w:r>
-    </w:p>
-    <w:p>
-      <w:pPr>
-        <w:pStyle w:val="EDBTXTNormalWebBlackCharChar0"/>
-        <w:ind w:left="720"/>
-        <w:rPr>
-          <w:rStyle w:val="EDBTXTKeywordBlack"/>
-        </w:rPr>
-      </w:pPr>
-      <w:r>
-        <w:rPr>
-          <w:rStyle w:val="EDBTXTKeywordBlack"/>
-        </w:rPr>
-        <w:t>C:\Program Files\edb</w:t>
-      </w:r>
-      <w:r>
-        <w:rPr>
-          <w:rStyle w:val="EDBTXTKeywordBlack"/>
-        </w:rPr>
-        <w:t>\dotnet</w:t>
-      </w:r>
-      <w:r>
-        <w:rPr>
-          <w:rStyle w:val="EDBTXTKeywordBlack"/>
-        </w:rPr>
-        <w:t>\</w:t>
-      </w:r>
-      <w:r>
-        <w:rPr>
-          <w:rStyle w:val="EDBTXTKeywordBlack"/>
-        </w:rPr>
-        <w:t>net40</w:t>
-      </w:r>
-      <w:r>
-        <w:rPr>
-          <w:rStyle w:val="EDBTXTKeywordBlack"/>
-        </w:rPr>
-        <w:t>\</w:t>
-      </w:r>
-    </w:p>
-    <w:p>
-      <w:pPr>
-        <w:pStyle w:val="EDBTXTNormalWebBlackCharChar0"/>
-      </w:pPr>
-      <w:r>
-        <w:t>The following shared library files are required</w:t>
-      </w:r>
-      <w:r>
-        <w:t>:</w:t>
-      </w:r>
-    </w:p>
-    <w:p>
-      <w:pPr>
-        <w:ind w:left="720"/>
-        <w:rPr>
-          <w:rStyle w:val="EDBTXTKeywordBlack"/>
-        </w:rPr>
-      </w:pPr>
-      <w:r>
-        <w:rPr>
-          <w:rStyle w:val="EDBTXTKeywordBlack"/>
-        </w:rPr>
-        <w:t>EDBDataProvider.2.0.2.</w:t>
-      </w:r>
-      <w:r>
-        <w:rPr>
-          <w:rStyle w:val="EDBTXTKeywordBlack"/>
-        </w:rPr>
-        <w:t xml:space="preserve">dll </w:t>
-      </w:r>
-    </w:p>
-    <w:p>
-      <w:pPr>
-        <w:ind w:left="720"/>
-        <w:rPr>
-          <w:rStyle w:val="EDBTXTKeywordBlack"/>
-        </w:rPr>
-      </w:pPr>
-      <w:r>
-        <w:rPr>
-          <w:rStyle w:val="EDBTXTKeywordBlack"/>
-        </w:rPr>
-        <w:t>Mono.Security.dll</w:t>
-      </w:r>
-    </w:p>
-    <w:p>
-      <w:pPr>
-        <w:pStyle w:val="EDBTXTNormalWebBlackCharChar0"/>
-      </w:pPr>
-      <w:r>
-        <w:t xml:space="preserve">See Section </w:t>
-      </w:r>
-      <w:r>
-        <w:rPr>
-          <w:u w:val="single"/>
-        </w:rPr>
-        <w:fldChar w:fldCharType="begin"/>
-      </w:r>
-      <w:r>
-        <w:rPr>
-          <w:u w:val="single"/>
-        </w:rPr>
-        <w:instrText xml:space="preserve"> REF _Ref477525249 \r \h </w:instrText>
-      </w:r>
-      <w:r>
-        <w:rPr>
-          <w:u w:val="single"/>
-        </w:rPr>
-      </w:r>
-      <w:r>
-        <w:rPr>
-          <w:u w:val="single"/>
-        </w:rPr>
-        <w:fldChar w:fldCharType="separate"/>
-      </w:r>
-      <w:r>
-        <w:rPr>
-          <w:u w:val="single"/>
-        </w:rPr>
-        <w:t>3.1</w:t>
-      </w:r>
-      <w:r>
-        <w:rPr>
-          <w:u w:val="single"/>
-        </w:rPr>
-        <w:fldChar w:fldCharType="end"/>
-      </w:r>
-      <w:r>
-        <w:t xml:space="preserve"> for information on referencing library files.</w:t>
-      </w:r>
-    </w:p>
-    <w:p>
-      <w:pPr>
-        <w:pStyle w:val="EDBTXTNormalWebBlackCharChar0"/>
-      </w:pPr>
-      <w:r>
-        <w:t xml:space="preserve">Depending upon the type of application, import the namespace into the source code (see Section </w:t>
-      </w:r>
-      <w:r>
-        <w:rPr>
-          <w:u w:val="single"/>
-        </w:rPr>
-        <w:fldChar w:fldCharType="begin"/>
-      </w:r>
-      <w:r>
-        <w:rPr>
-          <w:u w:val="single"/>
-        </w:rPr>
-        <w:instrText xml:space="preserve"> REF _Ref477525249 \r \h </w:instrText>
-      </w:r>
-      <w:r>
-        <w:rPr>
-          <w:u w:val="single"/>
-        </w:rPr>
-      </w:r>
-      <w:r>
-        <w:rPr>
-          <w:u w:val="single"/>
-        </w:rPr>
-        <w:fldChar w:fldCharType="separate"/>
-      </w:r>
-      <w:r>
-        <w:rPr>
-          <w:u w:val="single"/>
-        </w:rPr>
-        <w:t>3.1</w:t>
-      </w:r>
-      <w:r>
-        <w:rPr>
-          <w:u w:val="single"/>
-        </w:rPr>
-        <w:fldChar w:fldCharType="end"/>
-      </w:r>
-      <w:r>
-        <w:t>).</w:t>
-      </w:r>
-    </w:p>
-    <w:p>
-      <w:pPr>
-        <w:pStyle w:val="EDBHTMLPageBreak"/>
-      </w:pPr>
-      <w:bookmarkStart w:id="41" w:name="_Ref503423964"/>
-      <w:bookmarkStart w:id="42" w:name="_Ref503430964"/>
-    </w:p>
-    <w:p>
-      <w:pPr>
-        <w:pStyle w:val="Heading3"/>
-      </w:pPr>
-      <w:bookmarkStart w:id="43" w:name="_Toc530110035"/>
-      <w:r>
-        <w:t>.NET Framework 4.5</w:t>
-      </w:r>
       <w:bookmarkEnd w:id="41"/>
       <w:bookmarkEnd w:id="42"/>
-      <w:bookmarkEnd w:id="43"/>
     </w:p>
     <w:p>
       <w:pPr>
@@ -6029,20 +6021,20 @@
       <w:pPr>
         <w:pStyle w:val="EDBHTMLPageBreak"/>
       </w:pPr>
-      <w:bookmarkStart w:id="44" w:name="_Ref503423994"/>
-      <w:bookmarkStart w:id="45" w:name="_Ref503431008"/>
+      <w:bookmarkStart w:id="43" w:name="_Ref503423994"/>
+      <w:bookmarkStart w:id="44" w:name="_Ref503431008"/>
     </w:p>
     <w:p>
       <w:pPr>
         <w:pStyle w:val="Heading3"/>
       </w:pPr>
-      <w:bookmarkStart w:id="46" w:name="_Toc530110036"/>
+      <w:bookmarkStart w:id="45" w:name="_Toc530110036"/>
       <w:r>
         <w:t>.NET Framework 4.5.1</w:t>
       </w:r>
+      <w:bookmarkEnd w:id="43"/>
       <w:bookmarkEnd w:id="44"/>
       <w:bookmarkEnd w:id="45"/>
-      <w:bookmarkEnd w:id="46"/>
     </w:p>
     <w:p>
       <w:pPr>
@@ -6411,18 +6403,18 @@
       <w:pPr>
         <w:pStyle w:val="EDBHTMLPageBreak"/>
       </w:pPr>
-      <w:bookmarkStart w:id="47" w:name="_Ref509321802"/>
+      <w:bookmarkStart w:id="46" w:name="_Ref509321802"/>
     </w:p>
     <w:p>
       <w:pPr>
         <w:pStyle w:val="Heading3"/>
       </w:pPr>
-      <w:bookmarkStart w:id="48" w:name="_Toc530110037"/>
+      <w:bookmarkStart w:id="47" w:name="_Toc530110037"/>
       <w:r>
         <w:t>.NET Standard 2.0</w:t>
       </w:r>
+      <w:bookmarkEnd w:id="46"/>
       <w:bookmarkEnd w:id="47"/>
-      <w:bookmarkEnd w:id="48"/>
     </w:p>
     <w:p>
       <w:pPr>
@@ -6811,12 +6803,12 @@
         <w:rPr>
           <w:u w:val="single"/>
         </w:rPr>
+        <w:instrText xml:space="preserve"> \* MERGEFORMAT </w:instrText>
       </w:r>
       <w:r>
         <w:rPr>
           <w:u w:val="single"/>
         </w:rPr>
-        <w:instrText xml:space="preserve"> \* MERGEFORMAT </w:instrText>
       </w:r>
       <w:r>
         <w:rPr>
@@ -6950,8 +6942,8 @@
       <w:pPr>
         <w:pStyle w:val="Heading2"/>
       </w:pPr>
-      <w:bookmarkStart w:id="49" w:name="_Ref477527440"/>
-      <w:bookmarkStart w:id="50" w:name="_Toc530110038"/>
+      <w:bookmarkStart w:id="48" w:name="_Ref477527440"/>
+      <w:bookmarkStart w:id="49" w:name="_Toc530110038"/>
       <w:r>
         <w:lastRenderedPageBreak/>
         <w:t xml:space="preserve">Entity Framework </w:t>
@@ -6962,15 +6954,24 @@
       <w:r>
         <w:t>6</w:t>
       </w:r>
+      <w:bookmarkEnd w:id="48"/>
       <w:bookmarkEnd w:id="49"/>
-      <w:bookmarkEnd w:id="50"/>
-    </w:p>
-    <w:p>
-      <w:pPr>
-        <w:pStyle w:val="EDBTXTNormalWebBlackCharChar0"/>
-      </w:pPr>
-      <w:r>
-        <w:t>To set up .NET Connector for usage with Entity Framework, reference the shared library files located in the following directory:</w:t>
+    </w:p>
+    <w:p>
+      <w:pPr>
+        <w:pStyle w:val="EDBTXTNormalWebBlackCharChar0"/>
+      </w:pPr>
+      <w:r>
+        <w:t xml:space="preserve">To set up .NET Connector for usage with Entity Framework, </w:t>
+      </w:r>
+      <w:r>
+        <w:t>the dat</w:t>
+      </w:r>
+      <w:r>
+        <w:t>a provider installation path is</w:t>
+      </w:r>
+      <w:r>
+        <w:t>:</w:t>
       </w:r>
     </w:p>
     <w:p>
@@ -7114,22 +7115,15 @@
         <w:t>subdirectories</w:t>
       </w:r>
       <w:r>
-        <w:t xml:space="preserve">. </w:t>
-      </w:r>
-      <w:r>
-        <w:t xml:space="preserve">For </w:t>
-      </w:r>
-      <w:r>
-        <w:t>reference</w:t>
-      </w:r>
-      <w:r>
-        <w:t>, see s</w:t>
-      </w:r>
-      <w:r>
-        <w:t>ection</w:t>
-      </w:r>
-      <w:r>
-        <w:t xml:space="preserve">s </w:t>
+        <w:t>.</w:t>
+      </w:r>
+    </w:p>
+    <w:p>
+      <w:pPr>
+        <w:pStyle w:val="EDBTXTNormalWebBlackCharChar0"/>
+      </w:pPr>
+      <w:r>
+        <w:t xml:space="preserve">See Section </w:t>
       </w:r>
       <w:r>
         <w:rPr>
@@ -7141,7 +7135,7 @@
         <w:rPr>
           <w:u w:val="single"/>
         </w:rPr>
-        <w:instrText xml:space="preserve"> REF _Ref503423964 \r \h </w:instrText>
+        <w:instrText xml:space="preserve"> REF _Ref477525249 \r \h </w:instrText>
       </w:r>
       <w:r>
         <w:rPr>
@@ -7158,7 +7152,7 @@
         <w:rPr>
           <w:u w:val="single"/>
         </w:rPr>
-        <w:t>0</w:t>
+        <w:t>3.1</w:t>
       </w:r>
       <w:r>
         <w:rPr>
@@ -7167,91 +7161,10 @@
         <w:fldChar w:fldCharType="end"/>
       </w:r>
       <w:r>
-        <w:t xml:space="preserve"> and </w:t>
-      </w:r>
-      <w:r>
-        <w:rPr>
-          <w:u w:val="single"/>
-        </w:rPr>
-        <w:fldChar w:fldCharType="begin"/>
-      </w:r>
-      <w:r>
-        <w:rPr>
-          <w:u w:val="single"/>
-        </w:rPr>
-        <w:instrText xml:space="preserve"> REF _Ref503423994 \r \h </w:instrText>
-      </w:r>
-      <w:r>
-        <w:rPr>
-          <w:u w:val="single"/>
-        </w:rPr>
-      </w:r>
-      <w:r>
-        <w:rPr>
-          <w:u w:val="single"/>
-        </w:rPr>
-        <w:fldChar w:fldCharType="separate"/>
-      </w:r>
-      <w:r>
-        <w:rPr>
-          <w:u w:val="single"/>
-        </w:rPr>
-        <w:t>0</w:t>
-      </w:r>
-      <w:r>
-        <w:rPr>
-          <w:u w:val="single"/>
-        </w:rPr>
-        <w:fldChar w:fldCharType="end"/>
-      </w:r>
-      <w:r>
-        <w:t>.</w:t>
-      </w:r>
-    </w:p>
-    <w:p>
-      <w:pPr>
-        <w:pStyle w:val="EDBTXTNormalWebBlackCharChar0"/>
-      </w:pPr>
-      <w:r>
-        <w:t xml:space="preserve">See Section </w:t>
-      </w:r>
-      <w:r>
-        <w:rPr>
-          <w:u w:val="single"/>
-        </w:rPr>
-        <w:fldChar w:fldCharType="begin"/>
-      </w:r>
-      <w:r>
-        <w:rPr>
-          <w:u w:val="single"/>
-        </w:rPr>
-        <w:instrText xml:space="preserve"> REF _Ref477525249 \r \h </w:instrText>
-      </w:r>
-      <w:r>
-        <w:rPr>
-          <w:u w:val="single"/>
-        </w:rPr>
-      </w:r>
-      <w:r>
-        <w:rPr>
-          <w:u w:val="single"/>
-        </w:rPr>
-        <w:fldChar w:fldCharType="separate"/>
-      </w:r>
-      <w:r>
-        <w:rPr>
-          <w:u w:val="single"/>
-        </w:rPr>
-        <w:t>3.1</w:t>
-      </w:r>
-      <w:r>
-        <w:rPr>
-          <w:u w:val="single"/>
-        </w:rPr>
-        <w:fldChar w:fldCharType="end"/>
-      </w:r>
-      <w:r>
-        <w:t xml:space="preserve"> for information on referencing library files.</w:t>
+        <w:t xml:space="preserve"> for information on</w:t>
+      </w:r>
+      <w:r>
+        <w:t xml:space="preserve"> referencing library files.</w:t>
       </w:r>
     </w:p>
     <w:p>
@@ -7901,9 +7814,9 @@
       <w:pPr>
         <w:pStyle w:val="Heading2"/>
       </w:pPr>
-      <w:bookmarkStart w:id="51" w:name="_Ref477528081"/>
-      <w:bookmarkStart w:id="52" w:name="_Ref511382535"/>
-      <w:bookmarkStart w:id="53" w:name="_Toc530110039"/>
+      <w:bookmarkStart w:id="50" w:name="_Ref477528081"/>
+      <w:bookmarkStart w:id="51" w:name="_Ref511382535"/>
+      <w:bookmarkStart w:id="52" w:name="_Toc530110039"/>
       <w:r>
         <w:lastRenderedPageBreak/>
         <w:t>E</w:t>
@@ -7914,76 +7827,78 @@
       <w:r>
         <w:t xml:space="preserve"> for Visual Studio</w:t>
       </w:r>
+      <w:bookmarkEnd w:id="50"/>
+      <w:r>
+        <w:t xml:space="preserve"> 2015</w:t>
+      </w:r>
       <w:bookmarkEnd w:id="51"/>
       <w:r>
-        <w:t xml:space="preserve"> 2015</w:t>
+        <w:t>/2017</w:t>
       </w:r>
       <w:bookmarkEnd w:id="52"/>
-      <w:r>
-        <w:t>/2017</w:t>
-      </w:r>
+    </w:p>
+    <w:p>
+      <w:pPr>
+        <w:pStyle w:val="EDBTXTNormalWebBlackCharChar0"/>
+      </w:pPr>
+      <w:r>
+        <w:rPr>
+          <w:rStyle w:val="EDBTXTTermNormalWebBlackItalicCharCharChar"/>
+        </w:rPr>
+        <w:t>EDB Data Designer Extensibility Provider</w:t>
+      </w:r>
+      <w:r>
+        <w:t xml:space="preserve"> (</w:t>
+      </w:r>
+      <w:r>
+        <w:rPr>
+          <w:rStyle w:val="EDBTXTTermNormalWebBlackItalicCharCharChar"/>
+        </w:rPr>
+        <w:t>E</w:t>
+      </w:r>
+      <w:r>
+        <w:rPr>
+          <w:rStyle w:val="EDBTXTTermNormalWebBlackItalicCharCharChar"/>
+        </w:rPr>
+        <w:t>nterpriseDB VSIX</w:t>
+      </w:r>
+      <w:r>
+        <w:t>)</w:t>
+      </w:r>
+      <w:r>
+        <w:t xml:space="preserve"> is a component, which integrates </w:t>
+      </w:r>
+      <w:r>
+        <w:t>Advanced Server</w:t>
+      </w:r>
+      <w:r>
+        <w:t xml:space="preserve"> database access into Visual Studio, thus providing Vis</w:t>
+      </w:r>
+      <w:r>
+        <w:t>ual Studio integrated features.</w:t>
+      </w:r>
+    </w:p>
+    <w:p>
+      <w:pPr>
+        <w:pStyle w:val="EDBTXTNormalWebBlackCharChar0"/>
+      </w:pPr>
+      <w:r>
+        <w:t xml:space="preserve">It allows connecting to </w:t>
+      </w:r>
+      <w:r>
+        <w:t>Advanced Server</w:t>
+      </w:r>
+      <w:r>
+        <w:t xml:space="preserve"> from within Visual Studio's Server Explorer, creating a model from an existing database, etc. Therefore, if Visual Studio features are desired, then </w:t>
+      </w:r>
+      <w:r>
+        <w:t>E</w:t>
+      </w:r>
+      <w:r>
+        <w:t xml:space="preserve">nterpriseDB VSIX </w:t>
+      </w:r>
+      <w:bookmarkStart w:id="53" w:name="_GoBack"/>
       <w:bookmarkEnd w:id="53"/>
-    </w:p>
-    <w:p>
-      <w:pPr>
-        <w:pStyle w:val="EDBTXTNormalWebBlackCharChar0"/>
-      </w:pPr>
-      <w:r>
-        <w:rPr>
-          <w:rStyle w:val="EDBTXTTermNormalWebBlackItalicCharCharChar"/>
-        </w:rPr>
-        <w:t>EDB Data Designer Extensibility Provider</w:t>
-      </w:r>
-      <w:r>
-        <w:t xml:space="preserve"> (</w:t>
-      </w:r>
-      <w:r>
-        <w:rPr>
-          <w:rStyle w:val="EDBTXTTermNormalWebBlackItalicCharCharChar"/>
-        </w:rPr>
-        <w:t>E</w:t>
-      </w:r>
-      <w:r>
-        <w:rPr>
-          <w:rStyle w:val="EDBTXTTermNormalWebBlackItalicCharCharChar"/>
-        </w:rPr>
-        <w:t>nterpriseDB VSIX</w:t>
-      </w:r>
-      <w:r>
-        <w:t>)</w:t>
-      </w:r>
-      <w:r>
-        <w:t xml:space="preserve"> is a component, which integrates </w:t>
-      </w:r>
-      <w:r>
-        <w:t>Advanced Server</w:t>
-      </w:r>
-      <w:r>
-        <w:t xml:space="preserve"> database access into Visual Studio, thus providing Vis</w:t>
-      </w:r>
-      <w:r>
-        <w:t>ual Studio integrated features.</w:t>
-      </w:r>
-    </w:p>
-    <w:p>
-      <w:pPr>
-        <w:pStyle w:val="EDBTXTNormalWebBlackCharChar0"/>
-      </w:pPr>
-      <w:r>
-        <w:t xml:space="preserve">It allows connecting to </w:t>
-      </w:r>
-      <w:r>
-        <w:t>Advanced Server</w:t>
-      </w:r>
-      <w:r>
-        <w:t xml:space="preserve"> from within Visual Studio's Server Explorer, creating a model from an existing database, etc. Therefore, if Visual Studio features are desired, then </w:t>
-      </w:r>
-      <w:r>
-        <w:t>E</w:t>
-      </w:r>
-      <w:r>
-        <w:t xml:space="preserve">nterpriseDB VSIX </w:t>
-      </w:r>
       <w:r>
         <w:t>must be utilized</w:t>
       </w:r>
@@ -23455,7 +23370,7 @@
         <w:rStyle w:val="PageNumber"/>
         <w:noProof/>
       </w:rPr>
-      <w:t>10</w:t>
+      <w:t>21</w:t>
     </w:r>
     <w:r>
       <w:rPr>
@@ -23730,29 +23645,29 @@
         <v:path o:extrusionok="f" gradientshapeok="t" o:connecttype="rect"/>
         <o:lock v:ext="edit" aspectratio="t"/>
       </v:shapetype>
-      <v:shape id="_x0000_i1250" type="#_x0000_t75" style="width:8.25pt;height:8.25pt" o:bullet="t">
+      <v:shape id="_x0000_i1036" type="#_x0000_t75" style="width:8.25pt;height:8.25pt" o:bullet="t">
         <v:imagedata r:id="rId1" o:title="bullet"/>
       </v:shape>
     </w:pict>
   </w:numPicBullet>
   <w:numPicBullet w:numPicBulletId="1">
     <w:pict>
-      <v:shape id="_x0000_i1251" type="#_x0000_t75" style="width:3in;height:3in" o:bullet="t"/>
+      <v:shape id="_x0000_i1037" type="#_x0000_t75" style="width:3in;height:3in" o:bullet="t"/>
     </w:pict>
   </w:numPicBullet>
   <w:numPicBullet w:numPicBulletId="2">
     <w:pict>
-      <v:shape id="_x0000_i1252" type="#_x0000_t75" style="width:3in;height:3in" o:bullet="t"/>
+      <v:shape id="_x0000_i1038" type="#_x0000_t75" style="width:3in;height:3in" o:bullet="t"/>
     </w:pict>
   </w:numPicBullet>
   <w:numPicBullet w:numPicBulletId="3">
     <w:pict>
-      <v:shape id="_x0000_i1253" type="#_x0000_t75" style="width:3in;height:3in" o:bullet="t"/>
+      <v:shape id="_x0000_i1039" type="#_x0000_t75" style="width:3in;height:3in" o:bullet="t"/>
     </w:pict>
   </w:numPicBullet>
   <w:numPicBullet w:numPicBulletId="4">
     <w:pict>
-      <v:shape id="_x0000_i1254" type="#_x0000_t75" style="width:3in;height:3in" o:bullet="t"/>
+      <v:shape id="_x0000_i1040" type="#_x0000_t75" style="width:3in;height:3in" o:bullet="t"/>
     </w:pict>
   </w:numPicBullet>
   <w:abstractNum w:abstractNumId="0">
@@ -33594,7 +33509,7 @@
 </file>
 
 <file path=customXml/itemProps1.xml><?xml version="1.0" encoding="utf-8"?>
-<ds:datastoreItem xmlns:ds="http://schemas.openxmlformats.org/officeDocument/2006/customXml" ds:itemID="{BB91338A-67F4-4ECF-94D7-AE0092A7B012}">
+<ds:datastoreItem xmlns:ds="http://schemas.openxmlformats.org/officeDocument/2006/customXml" ds:itemID="{D48BADAF-68F3-4D7C-82C7-8D463730F6CF}">
   <ds:schemaRefs>
     <ds:schemaRef ds:uri="http://schemas.openxmlformats.org/officeDocument/2006/bibliography"/>
   </ds:schemaRefs>

</xml_diff>

<commit_message>
EC-850 Updated the documentation as per the ticket
</commit_message>
<xml_diff>
--- a/edb_docs/EDB_Postgres_Advanced_Server_NET_Connector_Guide.docx
+++ b/edb_docs/EDB_Postgres_Advanced_Server_NET_Connector_Guide.docx
@@ -168,21 +168,6 @@
         <w:pStyle w:val="EDBCoverProductDate"/>
       </w:pPr>
       <w:r>
-        <w:t xml:space="preserve">Connectors Release </w:t>
-      </w:r>
-      <w:r>
-        <w:t>1</w:t>
-      </w:r>
-      <w:r>
-        <w:t>1</w:t>
-      </w:r>
-      <w:r>
-        <w:t>.0.</w:t>
-      </w:r>
-      <w:r>
-        <w:t>2</w:t>
-      </w:r>
-      <w:r>
         <w:br/>
         <w:t xml:space="preserve">.NET </w:t>
       </w:r>
@@ -269,7 +254,10 @@
         <w:pStyle w:val="EDBCoverProductDate"/>
       </w:pPr>
       <w:r>
-        <w:t>May 15</w:t>
+        <w:t>July</w:t>
+      </w:r>
+      <w:r>
+        <w:t xml:space="preserve"> 15</w:t>
       </w:r>
       <w:r>
         <w:t xml:space="preserve">, </w:t>
@@ -7135,448 +7123,102 @@
     </w:p>
     <w:p>
       <w:pPr>
-        <w:pStyle w:val="EDBTXTNormalWebBlack"/>
-      </w:pPr>
-      <w:r>
-        <w:rPr>
-          <w:rStyle w:val="EDBTXTEmphasisNormalWebBoldBlackCharChar"/>
-        </w:rPr>
-        <w:t>Note:</w:t>
-      </w:r>
-      <w:r>
-        <w:t xml:space="preserve"> </w:t>
-      </w:r>
-      <w:r>
-        <w:t>You must also add the following dependencies to your project:</w:t>
-      </w:r>
-    </w:p>
-    <w:p>
-      <w:pPr>
         <w:ind w:left="720"/>
         <w:rPr>
           <w:rStyle w:val="EDBTXTKeywordBlack"/>
         </w:rPr>
       </w:pPr>
       <w:r>
-        <w:rPr>
-          <w:rStyle w:val="EDBTXTKeywordBlack"/>
-        </w:rPr>
-        <w:t>System.Threading.Task</w:t>
-      </w:r>
-      <w:r>
-        <w:rPr>
-          <w:rStyle w:val="EDBTXTKeywordBlack"/>
-        </w:rPr>
-        <w:t>s</w:t>
-      </w:r>
-      <w:r>
-        <w:rPr>
-          <w:rStyle w:val="EDBTXTKeywordBlack"/>
-        </w:rPr>
-        <w:t>.Extension</w:t>
-      </w:r>
-      <w:r>
-        <w:rPr>
-          <w:rStyle w:val="EDBTXTKeywordBlack"/>
-        </w:rPr>
-        <w:t>s</w:t>
-      </w:r>
-      <w:r>
-        <w:rPr>
-          <w:rStyle w:val="EDBTXTKeywordBlack"/>
-        </w:rPr>
-        <w:t>.dll</w:t>
-      </w:r>
-    </w:p>
-    <w:p>
-      <w:pPr>
-        <w:ind w:left="720"/>
-        <w:rPr>
-          <w:rStyle w:val="EDBTXTKeywordBlack"/>
-        </w:rPr>
-      </w:pPr>
-      <w:r>
-        <w:rPr>
-          <w:rStyle w:val="EDBTXTKeywordBlack"/>
-        </w:rPr>
-        <w:t>System.Runtime.CompilerServices.Unsafe.dll</w:t>
-      </w:r>
-    </w:p>
-    <w:p>
-      <w:pPr>
-        <w:ind w:left="720"/>
         <w:rPr>
           <w:rFonts w:ascii="Courier New" w:hAnsi="Courier New" w:cs="Courier New"/>
           <w:color w:val="000000"/>
           <w:sz w:val="22"/>
           <w:szCs w:val="20"/>
         </w:rPr>
+        <w:t>System.Memory.dll</w:t>
+      </w:r>
+    </w:p>
+    <w:p>
+      <w:pPr>
+        <w:pStyle w:val="EDBTXTNormalWebBlack"/>
+      </w:pPr>
+      <w:r>
+        <w:rPr>
+          <w:rStyle w:val="EDBTXTEmphasisNormalWebBoldBlackCharChar"/>
+        </w:rPr>
+        <w:t>Note:</w:t>
+      </w:r>
+      <w:r>
+        <w:t xml:space="preserve"> </w:t>
+      </w:r>
+      <w:r>
+        <w:t>You must also add the following dependencies to your project:</w:t>
+      </w:r>
+    </w:p>
+    <w:p>
+      <w:pPr>
+        <w:ind w:left="720"/>
+        <w:rPr>
+          <w:rStyle w:val="EDBTXTKeywordBlack"/>
+        </w:rPr>
+      </w:pPr>
+      <w:r>
+        <w:rPr>
+          <w:rStyle w:val="EDBTXTKeywordBlack"/>
+        </w:rPr>
+        <w:t>System.Threading.Task</w:t>
+      </w:r>
+      <w:r>
+        <w:rPr>
+          <w:rStyle w:val="EDBTXTKeywordBlack"/>
+        </w:rPr>
+        <w:t>s</w:t>
+      </w:r>
+      <w:r>
+        <w:rPr>
+          <w:rStyle w:val="EDBTXTKeywordBlack"/>
+        </w:rPr>
+        <w:t>.Extension</w:t>
+      </w:r>
+      <w:r>
+        <w:rPr>
+          <w:rStyle w:val="EDBTXTKeywordBlack"/>
+        </w:rPr>
+        <w:t>s</w:t>
+      </w:r>
+      <w:r>
+        <w:rPr>
+          <w:rStyle w:val="EDBTXTKeywordBlack"/>
+        </w:rPr>
+        <w:t>.dll</w:t>
+      </w:r>
+    </w:p>
+    <w:p>
+      <w:pPr>
+        <w:ind w:left="720"/>
+        <w:rPr>
+          <w:rStyle w:val="EDBTXTKeywordBlack"/>
+        </w:rPr>
+      </w:pPr>
+      <w:r>
+        <w:rPr>
+          <w:rStyle w:val="EDBTXTKeywordBlack"/>
+        </w:rPr>
+        <w:t>System.Runtime.CompilerServices.Unsafe.dll</w:t>
+      </w:r>
+    </w:p>
+    <w:p>
+      <w:pPr>
+        <w:ind w:left="720"/>
+        <w:rPr>
+          <w:rStyle w:val="EDBTXTKeywordBlack"/>
+        </w:rPr>
       </w:pPr>
       <w:r>
         <w:rPr>
           <w:rStyle w:val="EDBTXTKeywordBlack"/>
         </w:rPr>
         <w:t>System.ValueTuple.dll</w:t>
-      </w:r>
-    </w:p>
-    <w:p>
-      <w:pPr>
-        <w:pStyle w:val="EDBTXTNormalWebBlackCharChar0"/>
-      </w:pPr>
-      <w:r>
-        <w:t xml:space="preserve">See Section </w:t>
-      </w:r>
-      <w:r>
-        <w:rPr>
-          <w:u w:val="single"/>
-        </w:rPr>
-        <w:fldChar w:fldCharType="begin"/>
-      </w:r>
-      <w:r>
-        <w:rPr>
-          <w:u w:val="single"/>
-        </w:rPr>
-        <w:instrText xml:space="preserve"> REF _Ref5107265 \r \h </w:instrText>
-      </w:r>
-      <w:r>
-        <w:rPr>
-          <w:u w:val="single"/>
-        </w:rPr>
-      </w:r>
-      <w:r>
-        <w:rPr>
-          <w:u w:val="single"/>
-        </w:rPr>
-        <w:fldChar w:fldCharType="separate"/>
-      </w:r>
-      <w:r>
-        <w:rPr>
-          <w:u w:val="single"/>
-        </w:rPr>
-        <w:t>4.2.1</w:t>
-      </w:r>
-      <w:r>
-        <w:rPr>
-          <w:u w:val="single"/>
-        </w:rPr>
-        <w:fldChar w:fldCharType="end"/>
-      </w:r>
-      <w:r>
-        <w:t xml:space="preserve"> for information on referencing library files.</w:t>
-      </w:r>
-    </w:p>
-    <w:p>
-      <w:pPr>
-        <w:pStyle w:val="EDBTXTNormalWebBlackCharChar0"/>
-      </w:pPr>
-      <w:r>
-        <w:t xml:space="preserve">Depending upon the type of application, import the namespace into the source code (see Section </w:t>
-      </w:r>
-      <w:r>
-        <w:rPr>
-          <w:u w:val="single"/>
-        </w:rPr>
-        <w:fldChar w:fldCharType="begin"/>
-      </w:r>
-      <w:r>
-        <w:rPr>
-          <w:u w:val="single"/>
-        </w:rPr>
-        <w:instrText xml:space="preserve"> REF _Ref5107265 \r \h </w:instrText>
-      </w:r>
-      <w:r>
-        <w:rPr>
-          <w:u w:val="single"/>
-        </w:rPr>
-      </w:r>
-      <w:r>
-        <w:rPr>
-          <w:u w:val="single"/>
-        </w:rPr>
-        <w:fldChar w:fldCharType="separate"/>
-      </w:r>
-      <w:r>
-        <w:rPr>
-          <w:u w:val="single"/>
-        </w:rPr>
-        <w:t>4.2.1</w:t>
-      </w:r>
-      <w:r>
-        <w:rPr>
-          <w:u w:val="single"/>
-        </w:rPr>
-        <w:fldChar w:fldCharType="end"/>
-      </w:r>
-      <w:r>
-        <w:t>).</w:t>
-      </w:r>
-    </w:p>
-    <w:p>
-      <w:pPr>
-        <w:pStyle w:val="EDBHTMLPageBreak"/>
-      </w:pPr>
-      <w:bookmarkStart w:id="47" w:name="_Ref503423994"/>
-      <w:bookmarkStart w:id="48" w:name="_Ref503431008"/>
-    </w:p>
-    <w:p>
-      <w:pPr>
-        <w:pStyle w:val="Heading4"/>
-      </w:pPr>
-      <w:bookmarkStart w:id="49" w:name="_Toc8827686"/>
-      <w:r>
-        <w:t>.NET Framework 4.5.1</w:t>
-      </w:r>
-      <w:bookmarkEnd w:id="47"/>
-      <w:bookmarkEnd w:id="48"/>
-      <w:bookmarkEnd w:id="49"/>
-    </w:p>
-    <w:p>
-      <w:pPr>
-        <w:pStyle w:val="EDBTXTNormalWebBlack"/>
-      </w:pPr>
-      <w:r>
-        <w:t>If you are using .NET Framework version 4.5.1</w:t>
-      </w:r>
-      <w:r>
-        <w:t xml:space="preserve">, </w:t>
-      </w:r>
-      <w:r>
-        <w:t>the dat</w:t>
-      </w:r>
-      <w:r>
-        <w:t>a provider installation path is</w:t>
-      </w:r>
-      <w:r>
-        <w:t>:</w:t>
-      </w:r>
-    </w:p>
-    <w:p>
-      <w:pPr>
-        <w:pStyle w:val="EDBTXTNormalWebBlackCharChar0"/>
-        <w:ind w:left="720"/>
-        <w:rPr>
-          <w:rStyle w:val="EDBTXTKeywordBlack"/>
-        </w:rPr>
-      </w:pPr>
-      <w:r>
-        <w:rPr>
-          <w:rStyle w:val="EDBTXTKeywordBlack"/>
-        </w:rPr>
-        <w:t>C:\Program Files\</w:t>
-      </w:r>
-      <w:r>
-        <w:rPr>
-          <w:rStyle w:val="EDBTXTKeywordBlack"/>
-        </w:rPr>
-        <w:t>edb</w:t>
-      </w:r>
-      <w:r>
-        <w:rPr>
-          <w:rStyle w:val="EDBTXTKeywordBlack"/>
-        </w:rPr>
-        <w:t>\dotnet</w:t>
-      </w:r>
-      <w:r>
-        <w:rPr>
-          <w:rStyle w:val="EDBTXTKeywordBlack"/>
-        </w:rPr>
-        <w:t>\</w:t>
-      </w:r>
-      <w:r>
-        <w:rPr>
-          <w:rStyle w:val="EDBTXTKeywordBlack"/>
-        </w:rPr>
-        <w:t>net451</w:t>
-      </w:r>
-      <w:r>
-        <w:rPr>
-          <w:rStyle w:val="EDBTXTKeywordBlack"/>
-        </w:rPr>
-        <w:t>\</w:t>
-      </w:r>
-    </w:p>
-    <w:p>
-      <w:pPr>
-        <w:pStyle w:val="EDBTXTNormalWebBlack"/>
-      </w:pPr>
-      <w:r>
-        <w:t xml:space="preserve">The </w:t>
-      </w:r>
-      <w:r>
-        <w:t xml:space="preserve">following </w:t>
-      </w:r>
-      <w:r>
-        <w:t>shared library file</w:t>
-      </w:r>
-      <w:r>
-        <w:t>s</w:t>
-      </w:r>
-      <w:r>
-        <w:t xml:space="preserve"> </w:t>
-      </w:r>
-      <w:r>
-        <w:t xml:space="preserve">are </w:t>
-      </w:r>
-      <w:r>
-        <w:t>required</w:t>
-      </w:r>
-      <w:r>
-        <w:t>:</w:t>
-      </w:r>
-    </w:p>
-    <w:p>
-      <w:pPr>
-        <w:ind w:left="720"/>
-        <w:rPr>
-          <w:rStyle w:val="EDBTXTKeywordBlack"/>
-        </w:rPr>
-      </w:pPr>
-      <w:r>
-        <w:rPr>
-          <w:rStyle w:val="EDBTXTKeywordBlack"/>
-        </w:rPr>
-        <w:t>EnterpriseDB.EDBClient.</w:t>
-      </w:r>
-      <w:r>
-        <w:rPr>
-          <w:rStyle w:val="EDBTXTKeywordBlack"/>
-        </w:rPr>
-        <w:t>dll</w:t>
-      </w:r>
-    </w:p>
-    <w:p>
-      <w:pPr>
-        <w:ind w:left="720"/>
-        <w:rPr>
-          <w:rStyle w:val="EDBTXTKeywordBlack"/>
-        </w:rPr>
-      </w:pPr>
-      <w:r>
-        <w:rPr>
-          <w:rStyle w:val="EDBTXTKeywordBlack"/>
-        </w:rPr>
-        <w:t>System.Threading.Task</w:t>
-      </w:r>
-      <w:r>
-        <w:rPr>
-          <w:rStyle w:val="EDBTXTKeywordBlack"/>
-        </w:rPr>
-        <w:t>s</w:t>
-      </w:r>
-      <w:r>
-        <w:rPr>
-          <w:rStyle w:val="EDBTXTKeywordBlack"/>
-        </w:rPr>
-        <w:t>.Extension</w:t>
-      </w:r>
-      <w:r>
-        <w:rPr>
-          <w:rStyle w:val="EDBTXTKeywordBlack"/>
-        </w:rPr>
-        <w:t>s</w:t>
-      </w:r>
-      <w:r>
-        <w:rPr>
-          <w:rStyle w:val="EDBTXTKeywordBlack"/>
-        </w:rPr>
-        <w:t>.dll</w:t>
-      </w:r>
-    </w:p>
-    <w:p>
-      <w:pPr>
-        <w:ind w:left="720"/>
-        <w:rPr>
-          <w:rStyle w:val="EDBTXTKeywordBlack"/>
-        </w:rPr>
-      </w:pPr>
-      <w:r>
-        <w:rPr>
-          <w:rStyle w:val="EDBTXTKeywordBlack"/>
-        </w:rPr>
-        <w:t>System.Runtime.CompilerServices.Unsafe.dll</w:t>
-      </w:r>
-    </w:p>
-    <w:p>
-      <w:pPr>
-        <w:ind w:left="720"/>
-        <w:rPr>
-          <w:rStyle w:val="EDBTXTKeywordBlack"/>
-        </w:rPr>
-      </w:pPr>
-      <w:r>
-        <w:rPr>
-          <w:rStyle w:val="EDBTXTKeywordBlack"/>
-        </w:rPr>
-        <w:t>System.ValueTuple.dll</w:t>
-      </w:r>
-    </w:p>
-    <w:p>
-      <w:pPr>
-        <w:pStyle w:val="EDBTXTNormalWebBlack"/>
-      </w:pPr>
-      <w:r>
-        <w:rPr>
-          <w:rStyle w:val="EDBTXTEmphasisNormalWebBoldBlackCharChar"/>
-        </w:rPr>
-        <w:t>Note:</w:t>
-      </w:r>
-      <w:r>
-        <w:t xml:space="preserve"> </w:t>
-      </w:r>
-      <w:r>
-        <w:t>You must also add the following dependencies to your project:</w:t>
-      </w:r>
-    </w:p>
-    <w:p>
-      <w:pPr>
-        <w:ind w:left="720"/>
-        <w:rPr>
-          <w:rStyle w:val="EDBTXTKeywordBlack"/>
-        </w:rPr>
-      </w:pPr>
-      <w:r>
-        <w:rPr>
-          <w:rStyle w:val="EDBTXTKeywordBlack"/>
-        </w:rPr>
-        <w:t>System.Threading.Task</w:t>
-      </w:r>
-      <w:r>
-        <w:rPr>
-          <w:rStyle w:val="EDBTXTKeywordBlack"/>
-        </w:rPr>
-        <w:t>s</w:t>
-      </w:r>
-      <w:r>
-        <w:rPr>
-          <w:rStyle w:val="EDBTXTKeywordBlack"/>
-        </w:rPr>
-        <w:t>.Extension</w:t>
-      </w:r>
-      <w:r>
-        <w:rPr>
-          <w:rStyle w:val="EDBTXTKeywordBlack"/>
-        </w:rPr>
-        <w:t>s</w:t>
-      </w:r>
-      <w:r>
-        <w:rPr>
-          <w:rStyle w:val="EDBTXTKeywordBlack"/>
-        </w:rPr>
-        <w:t>.dll</w:t>
-      </w:r>
-    </w:p>
-    <w:p>
-      <w:pPr>
-        <w:ind w:left="720"/>
-        <w:rPr>
-          <w:rStyle w:val="EDBTXTKeywordBlack"/>
-        </w:rPr>
-      </w:pPr>
-      <w:r>
-        <w:rPr>
-          <w:rStyle w:val="EDBTXTKeywordBlack"/>
-        </w:rPr>
-        <w:t>System.Runtime.CompilerServices.Unsafe.dll</w:t>
       </w:r>
     </w:p>
     <w:p>
@@ -7591,6 +7233,300 @@
       </w:pPr>
       <w:r>
         <w:rPr>
+          <w:rFonts w:ascii="Courier New" w:hAnsi="Courier New" w:cs="Courier New"/>
+          <w:color w:val="000000"/>
+          <w:sz w:val="22"/>
+          <w:szCs w:val="20"/>
+        </w:rPr>
+        <w:t>System.Memory.dll</w:t>
+      </w:r>
+    </w:p>
+    <w:p>
+      <w:pPr>
+        <w:pStyle w:val="EDBTXTNormalWebBlackCharChar0"/>
+      </w:pPr>
+      <w:r>
+        <w:t xml:space="preserve">See Section </w:t>
+      </w:r>
+      <w:r>
+        <w:rPr>
+          <w:u w:val="single"/>
+        </w:rPr>
+        <w:fldChar w:fldCharType="begin"/>
+      </w:r>
+      <w:r>
+        <w:rPr>
+          <w:u w:val="single"/>
+        </w:rPr>
+        <w:instrText xml:space="preserve"> REF _Ref5107265 \r \h </w:instrText>
+      </w:r>
+      <w:r>
+        <w:rPr>
+          <w:u w:val="single"/>
+        </w:rPr>
+      </w:r>
+      <w:r>
+        <w:rPr>
+          <w:u w:val="single"/>
+        </w:rPr>
+        <w:fldChar w:fldCharType="separate"/>
+      </w:r>
+      <w:r>
+        <w:rPr>
+          <w:u w:val="single"/>
+        </w:rPr>
+        <w:t>4.2.1</w:t>
+      </w:r>
+      <w:r>
+        <w:rPr>
+          <w:u w:val="single"/>
+        </w:rPr>
+        <w:fldChar w:fldCharType="end"/>
+      </w:r>
+      <w:r>
+        <w:t xml:space="preserve"> for information on referencing library files.</w:t>
+      </w:r>
+    </w:p>
+    <w:p>
+      <w:pPr>
+        <w:pStyle w:val="EDBTXTNormalWebBlackCharChar0"/>
+      </w:pPr>
+      <w:r>
+        <w:t xml:space="preserve">Depending upon the type of application, import the namespace into the source code (see Section </w:t>
+      </w:r>
+      <w:r>
+        <w:rPr>
+          <w:u w:val="single"/>
+        </w:rPr>
+        <w:fldChar w:fldCharType="begin"/>
+      </w:r>
+      <w:r>
+        <w:rPr>
+          <w:u w:val="single"/>
+        </w:rPr>
+        <w:instrText xml:space="preserve"> REF _Ref5107265 \r \h </w:instrText>
+      </w:r>
+      <w:r>
+        <w:rPr>
+          <w:u w:val="single"/>
+        </w:rPr>
+      </w:r>
+      <w:r>
+        <w:rPr>
+          <w:u w:val="single"/>
+        </w:rPr>
+        <w:fldChar w:fldCharType="separate"/>
+      </w:r>
+      <w:r>
+        <w:rPr>
+          <w:u w:val="single"/>
+        </w:rPr>
+        <w:t>4.2.1</w:t>
+      </w:r>
+      <w:r>
+        <w:rPr>
+          <w:u w:val="single"/>
+        </w:rPr>
+        <w:fldChar w:fldCharType="end"/>
+      </w:r>
+      <w:r>
+        <w:t>).</w:t>
+      </w:r>
+    </w:p>
+    <w:p>
+      <w:pPr>
+        <w:pStyle w:val="EDBHTMLPageBreak"/>
+      </w:pPr>
+      <w:bookmarkStart w:id="47" w:name="_Ref503423994"/>
+      <w:bookmarkStart w:id="48" w:name="_Ref503431008"/>
+    </w:p>
+    <w:p>
+      <w:pPr>
+        <w:pStyle w:val="Heading4"/>
+      </w:pPr>
+      <w:bookmarkStart w:id="49" w:name="_Toc8827686"/>
+      <w:r>
+        <w:t>.NET Framework 4.5.1</w:t>
+      </w:r>
+      <w:bookmarkEnd w:id="47"/>
+      <w:bookmarkEnd w:id="48"/>
+      <w:bookmarkEnd w:id="49"/>
+    </w:p>
+    <w:p>
+      <w:pPr>
+        <w:pStyle w:val="EDBTXTNormalWebBlack"/>
+      </w:pPr>
+      <w:r>
+        <w:t>If you are using .NET Framework version 4.5.1</w:t>
+      </w:r>
+      <w:r>
+        <w:t xml:space="preserve">, </w:t>
+      </w:r>
+      <w:r>
+        <w:t>the dat</w:t>
+      </w:r>
+      <w:r>
+        <w:t>a provider installation path is</w:t>
+      </w:r>
+      <w:r>
+        <w:t>:</w:t>
+      </w:r>
+    </w:p>
+    <w:p>
+      <w:pPr>
+        <w:pStyle w:val="EDBTXTNormalWebBlackCharChar0"/>
+        <w:ind w:left="720"/>
+        <w:rPr>
+          <w:rStyle w:val="EDBTXTKeywordBlack"/>
+        </w:rPr>
+      </w:pPr>
+      <w:r>
+        <w:rPr>
+          <w:rStyle w:val="EDBTXTKeywordBlack"/>
+        </w:rPr>
+        <w:t>C:\Program Files\</w:t>
+      </w:r>
+      <w:r>
+        <w:rPr>
+          <w:rStyle w:val="EDBTXTKeywordBlack"/>
+        </w:rPr>
+        <w:t>edb</w:t>
+      </w:r>
+      <w:r>
+        <w:rPr>
+          <w:rStyle w:val="EDBTXTKeywordBlack"/>
+        </w:rPr>
+        <w:t>\dotnet</w:t>
+      </w:r>
+      <w:r>
+        <w:rPr>
+          <w:rStyle w:val="EDBTXTKeywordBlack"/>
+        </w:rPr>
+        <w:t>\</w:t>
+      </w:r>
+      <w:r>
+        <w:rPr>
+          <w:rStyle w:val="EDBTXTKeywordBlack"/>
+        </w:rPr>
+        <w:t>net451</w:t>
+      </w:r>
+      <w:r>
+        <w:rPr>
+          <w:rStyle w:val="EDBTXTKeywordBlack"/>
+        </w:rPr>
+        <w:t>\</w:t>
+      </w:r>
+    </w:p>
+    <w:p>
+      <w:pPr>
+        <w:pStyle w:val="EDBTXTNormalWebBlack"/>
+      </w:pPr>
+      <w:r>
+        <w:t xml:space="preserve">The </w:t>
+      </w:r>
+      <w:r>
+        <w:t xml:space="preserve">following </w:t>
+      </w:r>
+      <w:r>
+        <w:t>shared library file</w:t>
+      </w:r>
+      <w:r>
+        <w:t>s</w:t>
+      </w:r>
+      <w:r>
+        <w:t xml:space="preserve"> </w:t>
+      </w:r>
+      <w:r>
+        <w:t xml:space="preserve">are </w:t>
+      </w:r>
+      <w:r>
+        <w:t>required</w:t>
+      </w:r>
+      <w:r>
+        <w:t>:</w:t>
+      </w:r>
+    </w:p>
+    <w:p>
+      <w:pPr>
+        <w:ind w:left="720"/>
+        <w:rPr>
+          <w:rStyle w:val="EDBTXTKeywordBlack"/>
+        </w:rPr>
+      </w:pPr>
+      <w:r>
+        <w:rPr>
+          <w:rStyle w:val="EDBTXTKeywordBlack"/>
+        </w:rPr>
+        <w:t>EnterpriseDB.EDBClient.</w:t>
+      </w:r>
+      <w:r>
+        <w:rPr>
+          <w:rStyle w:val="EDBTXTKeywordBlack"/>
+        </w:rPr>
+        <w:t>dll</w:t>
+      </w:r>
+    </w:p>
+    <w:p>
+      <w:pPr>
+        <w:ind w:left="720"/>
+        <w:rPr>
+          <w:rStyle w:val="EDBTXTKeywordBlack"/>
+        </w:rPr>
+      </w:pPr>
+      <w:r>
+        <w:rPr>
+          <w:rStyle w:val="EDBTXTKeywordBlack"/>
+        </w:rPr>
+        <w:t>System.Threading.Task</w:t>
+      </w:r>
+      <w:r>
+        <w:rPr>
+          <w:rStyle w:val="EDBTXTKeywordBlack"/>
+        </w:rPr>
+        <w:t>s</w:t>
+      </w:r>
+      <w:r>
+        <w:rPr>
+          <w:rStyle w:val="EDBTXTKeywordBlack"/>
+        </w:rPr>
+        <w:t>.Extension</w:t>
+      </w:r>
+      <w:r>
+        <w:rPr>
+          <w:rStyle w:val="EDBTXTKeywordBlack"/>
+        </w:rPr>
+        <w:t>s</w:t>
+      </w:r>
+      <w:r>
+        <w:rPr>
+          <w:rStyle w:val="EDBTXTKeywordBlack"/>
+        </w:rPr>
+        <w:t>.dll</w:t>
+      </w:r>
+    </w:p>
+    <w:p>
+      <w:pPr>
+        <w:ind w:left="720"/>
+        <w:rPr>
+          <w:rStyle w:val="EDBTXTKeywordBlack"/>
+        </w:rPr>
+      </w:pPr>
+      <w:r>
+        <w:rPr>
+          <w:rStyle w:val="EDBTXTKeywordBlack"/>
+        </w:rPr>
+        <w:t>System.Runtime.CompilerServices.Unsafe.dll</w:t>
+      </w:r>
+    </w:p>
+    <w:p>
+      <w:pPr>
+        <w:ind w:left="720"/>
+        <w:rPr>
+          <w:rStyle w:val="EDBTXTKeywordBlack"/>
+        </w:rPr>
+      </w:pPr>
+      <w:r>
+        <w:rPr>
           <w:rStyle w:val="EDBTXTKeywordBlack"/>
         </w:rPr>
         <w:t>System.ValueTuple.dll</w:t>
@@ -7598,6 +7534,128 @@
     </w:p>
     <w:p>
       <w:pPr>
+        <w:ind w:left="720"/>
+        <w:rPr>
+          <w:rStyle w:val="EDBTXTKeywordBlack"/>
+        </w:rPr>
+      </w:pPr>
+      <w:r>
+        <w:rPr>
+          <w:rFonts w:ascii="Courier New" w:hAnsi="Courier New" w:cs="Courier New"/>
+          <w:color w:val="000000"/>
+          <w:sz w:val="22"/>
+          <w:szCs w:val="20"/>
+        </w:rPr>
+        <w:t>System.Memory.dll</w:t>
+      </w:r>
+      <w:bookmarkStart w:id="50" w:name="_GoBack"/>
+      <w:bookmarkEnd w:id="50"/>
+    </w:p>
+    <w:p>
+      <w:pPr>
+        <w:pStyle w:val="EDBTXTNormalWebBlack"/>
+      </w:pPr>
+      <w:r>
+        <w:rPr>
+          <w:rStyle w:val="EDBTXTEmphasisNormalWebBoldBlackCharChar"/>
+        </w:rPr>
+        <w:t>Note:</w:t>
+      </w:r>
+      <w:r>
+        <w:t xml:space="preserve"> </w:t>
+      </w:r>
+      <w:r>
+        <w:t>You must also add the following dependencies to your project:</w:t>
+      </w:r>
+    </w:p>
+    <w:p>
+      <w:pPr>
+        <w:ind w:left="720"/>
+        <w:rPr>
+          <w:rStyle w:val="EDBTXTKeywordBlack"/>
+        </w:rPr>
+      </w:pPr>
+      <w:r>
+        <w:rPr>
+          <w:rStyle w:val="EDBTXTKeywordBlack"/>
+        </w:rPr>
+        <w:t>System.Threading.Task</w:t>
+      </w:r>
+      <w:r>
+        <w:rPr>
+          <w:rStyle w:val="EDBTXTKeywordBlack"/>
+        </w:rPr>
+        <w:t>s</w:t>
+      </w:r>
+      <w:r>
+        <w:rPr>
+          <w:rStyle w:val="EDBTXTKeywordBlack"/>
+        </w:rPr>
+        <w:t>.Extension</w:t>
+      </w:r>
+      <w:r>
+        <w:rPr>
+          <w:rStyle w:val="EDBTXTKeywordBlack"/>
+        </w:rPr>
+        <w:t>s</w:t>
+      </w:r>
+      <w:r>
+        <w:rPr>
+          <w:rStyle w:val="EDBTXTKeywordBlack"/>
+        </w:rPr>
+        <w:t>.dll</w:t>
+      </w:r>
+    </w:p>
+    <w:p>
+      <w:pPr>
+        <w:ind w:left="720"/>
+        <w:rPr>
+          <w:rStyle w:val="EDBTXTKeywordBlack"/>
+        </w:rPr>
+      </w:pPr>
+      <w:r>
+        <w:rPr>
+          <w:rStyle w:val="EDBTXTKeywordBlack"/>
+        </w:rPr>
+        <w:t>System.Runtime.CompilerServices.Unsafe.dll</w:t>
+      </w:r>
+    </w:p>
+    <w:p>
+      <w:pPr>
+        <w:ind w:left="720"/>
+        <w:rPr>
+          <w:rStyle w:val="EDBTXTKeywordBlack"/>
+        </w:rPr>
+      </w:pPr>
+      <w:r>
+        <w:rPr>
+          <w:rStyle w:val="EDBTXTKeywordBlack"/>
+        </w:rPr>
+        <w:t>System.ValueTuple.dll</w:t>
+      </w:r>
+    </w:p>
+    <w:p>
+      <w:pPr>
+        <w:ind w:left="720"/>
+        <w:rPr>
+          <w:rFonts w:ascii="Courier New" w:hAnsi="Courier New" w:cs="Courier New"/>
+          <w:color w:val="000000"/>
+          <w:sz w:val="22"/>
+          <w:szCs w:val="20"/>
+        </w:rPr>
+      </w:pPr>
+      <w:r>
+        <w:rPr>
+          <w:rFonts w:ascii="Courier New" w:hAnsi="Courier New" w:cs="Courier New"/>
+          <w:color w:val="000000"/>
+          <w:sz w:val="22"/>
+          <w:szCs w:val="20"/>
+        </w:rPr>
+        <w:t>System.Memory.dll</w:t>
+      </w:r>
+    </w:p>
+    <w:p>
+      <w:pPr>
         <w:pStyle w:val="EDBTXTNormalWebBlackCharChar0"/>
       </w:pPr>
       <w:r>
@@ -7697,18 +7755,18 @@
       <w:pPr>
         <w:pStyle w:val="EDBHTMLPageBreak"/>
       </w:pPr>
-      <w:bookmarkStart w:id="50" w:name="_Ref509321802"/>
+      <w:bookmarkStart w:id="51" w:name="_Ref509321802"/>
     </w:p>
     <w:p>
       <w:pPr>
         <w:pStyle w:val="Heading4"/>
       </w:pPr>
-      <w:bookmarkStart w:id="51" w:name="_Toc8827687"/>
+      <w:bookmarkStart w:id="52" w:name="_Toc8827687"/>
       <w:r>
         <w:t>.NET Standard 2.0</w:t>
       </w:r>
-      <w:bookmarkEnd w:id="50"/>
       <w:bookmarkEnd w:id="51"/>
+      <w:bookmarkEnd w:id="52"/>
     </w:p>
     <w:p>
       <w:pPr>
@@ -8195,13 +8253,13 @@
       <w:pPr>
         <w:pStyle w:val="EDBHTMLPageBreak"/>
       </w:pPr>
-      <w:bookmarkStart w:id="52" w:name="_Ref477527440"/>
+      <w:bookmarkStart w:id="53" w:name="_Ref477527440"/>
     </w:p>
     <w:p>
       <w:pPr>
         <w:pStyle w:val="Heading3"/>
       </w:pPr>
-      <w:bookmarkStart w:id="53" w:name="_Toc8827688"/>
+      <w:bookmarkStart w:id="54" w:name="_Toc8827688"/>
       <w:r>
         <w:t xml:space="preserve">Entity Framework </w:t>
       </w:r>
@@ -8211,8 +8269,8 @@
       <w:r>
         <w:t>6</w:t>
       </w:r>
-      <w:bookmarkEnd w:id="52"/>
       <w:bookmarkEnd w:id="53"/>
+      <w:bookmarkEnd w:id="54"/>
     </w:p>
     <w:p>
       <w:pPr>
@@ -9010,14 +9068,14 @@
       <w:pPr>
         <w:pStyle w:val="EDBHTMLPageBreak"/>
       </w:pPr>
-      <w:bookmarkStart w:id="54" w:name="_Ref477528081"/>
-      <w:bookmarkStart w:id="55" w:name="_Ref511382535"/>
+      <w:bookmarkStart w:id="55" w:name="_Ref477528081"/>
+      <w:bookmarkStart w:id="56" w:name="_Ref511382535"/>
     </w:p>
     <w:p>
       <w:pPr>
         <w:pStyle w:val="Heading3"/>
       </w:pPr>
-      <w:bookmarkStart w:id="56" w:name="_Toc8827689"/>
+      <w:bookmarkStart w:id="57" w:name="_Toc8827689"/>
       <w:r>
         <w:t>E</w:t>
       </w:r>
@@ -9027,15 +9085,15 @@
       <w:r>
         <w:t xml:space="preserve"> for Visual Studio</w:t>
       </w:r>
-      <w:bookmarkEnd w:id="54"/>
+      <w:bookmarkEnd w:id="55"/>
       <w:r>
         <w:t xml:space="preserve"> 2015</w:t>
       </w:r>
-      <w:bookmarkEnd w:id="55"/>
+      <w:bookmarkEnd w:id="56"/>
       <w:r>
         <w:t>/2017</w:t>
       </w:r>
-      <w:bookmarkEnd w:id="56"/>
+      <w:bookmarkEnd w:id="57"/>
     </w:p>
     <w:p>
       <w:pPr>
@@ -9216,14 +9274,14 @@
       <w:pPr>
         <w:pStyle w:val="Heading4"/>
       </w:pPr>
-      <w:bookmarkStart w:id="57" w:name="_Toc8827690"/>
+      <w:bookmarkStart w:id="58" w:name="_Toc8827690"/>
       <w:r>
         <w:t>Installation and Configuration for Visual Studio 2015</w:t>
       </w:r>
       <w:r>
         <w:t>/2017</w:t>
       </w:r>
-      <w:bookmarkEnd w:id="57"/>
+      <w:bookmarkEnd w:id="58"/>
     </w:p>
     <w:p>
       <w:pPr>
@@ -9531,131 +9589,130 @@
       <w:pPr>
         <w:pStyle w:val="EDBHTMLPageBreak"/>
       </w:pPr>
-      <w:bookmarkStart w:id="58" w:name="_Toc512575239"/>
-      <w:bookmarkStart w:id="59" w:name="_Toc512579341"/>
-      <w:bookmarkStart w:id="60" w:name="_Toc512580109"/>
-      <w:bookmarkStart w:id="61" w:name="_Toc512580597"/>
-      <w:bookmarkStart w:id="62" w:name="_Toc512575240"/>
-      <w:bookmarkStart w:id="63" w:name="_Toc512579342"/>
-      <w:bookmarkStart w:id="64" w:name="_Toc512580110"/>
-      <w:bookmarkStart w:id="65" w:name="_Toc512580598"/>
-      <w:bookmarkStart w:id="66" w:name="_Toc512575241"/>
-      <w:bookmarkStart w:id="67" w:name="_Toc512579343"/>
-      <w:bookmarkStart w:id="68" w:name="_Toc512580111"/>
-      <w:bookmarkStart w:id="69" w:name="_Toc512580599"/>
-      <w:bookmarkStart w:id="70" w:name="_Toc512575242"/>
-      <w:bookmarkStart w:id="71" w:name="_Toc512579344"/>
-      <w:bookmarkStart w:id="72" w:name="_Toc512580112"/>
-      <w:bookmarkStart w:id="73" w:name="_Toc512580600"/>
-      <w:bookmarkStart w:id="74" w:name="_Toc511385085"/>
-      <w:bookmarkStart w:id="75" w:name="_Toc511634305"/>
-      <w:bookmarkStart w:id="76" w:name="_Toc511635201"/>
-      <w:bookmarkStart w:id="77" w:name="_Toc511635262"/>
-      <w:bookmarkStart w:id="78" w:name="_Toc511385086"/>
-      <w:bookmarkStart w:id="79" w:name="_Toc511634306"/>
-      <w:bookmarkStart w:id="80" w:name="_Toc511635202"/>
-      <w:bookmarkStart w:id="81" w:name="_Toc511635263"/>
-      <w:bookmarkStart w:id="82" w:name="_Toc511385087"/>
-      <w:bookmarkStart w:id="83" w:name="_Toc511634307"/>
-      <w:bookmarkStart w:id="84" w:name="_Toc511635203"/>
-      <w:bookmarkStart w:id="85" w:name="_Toc511635264"/>
-      <w:bookmarkStart w:id="86" w:name="_Toc511385088"/>
-      <w:bookmarkStart w:id="87" w:name="_Toc511634308"/>
-      <w:bookmarkStart w:id="88" w:name="_Toc511635204"/>
-      <w:bookmarkStart w:id="89" w:name="_Toc511635265"/>
-      <w:bookmarkStart w:id="90" w:name="_Toc511385089"/>
-      <w:bookmarkStart w:id="91" w:name="_Toc511634309"/>
-      <w:bookmarkStart w:id="92" w:name="_Toc511635205"/>
-      <w:bookmarkStart w:id="93" w:name="_Toc511635266"/>
-      <w:bookmarkStart w:id="94" w:name="_Toc511385090"/>
-      <w:bookmarkStart w:id="95" w:name="_Toc511634310"/>
-      <w:bookmarkStart w:id="96" w:name="_Toc511635206"/>
-      <w:bookmarkStart w:id="97" w:name="_Toc511635267"/>
-      <w:bookmarkStart w:id="98" w:name="_Toc511385091"/>
-      <w:bookmarkStart w:id="99" w:name="_Toc511634311"/>
-      <w:bookmarkStart w:id="100" w:name="_Toc511635207"/>
-      <w:bookmarkStart w:id="101" w:name="_Toc511635268"/>
-      <w:bookmarkStart w:id="102" w:name="_Toc511385092"/>
-      <w:bookmarkStart w:id="103" w:name="_Toc511634312"/>
-      <w:bookmarkStart w:id="104" w:name="_Toc511635208"/>
-      <w:bookmarkStart w:id="105" w:name="_Toc511635269"/>
-      <w:bookmarkStart w:id="106" w:name="_Toc511385093"/>
-      <w:bookmarkStart w:id="107" w:name="_Toc511634313"/>
-      <w:bookmarkStart w:id="108" w:name="_Toc511635209"/>
-      <w:bookmarkStart w:id="109" w:name="_Toc511635270"/>
-      <w:bookmarkStart w:id="110" w:name="_Toc511385094"/>
-      <w:bookmarkStart w:id="111" w:name="_Toc511634314"/>
-      <w:bookmarkStart w:id="112" w:name="_Toc511635210"/>
-      <w:bookmarkStart w:id="113" w:name="_Toc511635271"/>
-      <w:bookmarkStart w:id="114" w:name="_Toc511385095"/>
-      <w:bookmarkStart w:id="115" w:name="_Toc511634315"/>
-      <w:bookmarkStart w:id="116" w:name="_Toc511635211"/>
-      <w:bookmarkStart w:id="117" w:name="_Toc511635272"/>
-      <w:bookmarkStart w:id="118" w:name="_Toc511385096"/>
-      <w:bookmarkStart w:id="119" w:name="_Toc511634316"/>
-      <w:bookmarkStart w:id="120" w:name="_Toc511635212"/>
-      <w:bookmarkStart w:id="121" w:name="_Toc511635273"/>
-      <w:bookmarkStart w:id="122" w:name="_Toc511385097"/>
-      <w:bookmarkStart w:id="123" w:name="_Toc511634317"/>
-      <w:bookmarkStart w:id="124" w:name="_Toc511635213"/>
-      <w:bookmarkStart w:id="125" w:name="_Toc511635274"/>
-      <w:bookmarkStart w:id="126" w:name="_Toc511385098"/>
-      <w:bookmarkStart w:id="127" w:name="_Toc511634318"/>
-      <w:bookmarkStart w:id="128" w:name="_Toc511635214"/>
-      <w:bookmarkStart w:id="129" w:name="_Toc511635275"/>
-      <w:bookmarkStart w:id="130" w:name="_Toc511385099"/>
-      <w:bookmarkStart w:id="131" w:name="_Toc511634319"/>
-      <w:bookmarkStart w:id="132" w:name="_Toc511635215"/>
-      <w:bookmarkStart w:id="133" w:name="_Toc511635276"/>
-      <w:bookmarkStart w:id="134" w:name="_Toc511385100"/>
-      <w:bookmarkStart w:id="135" w:name="_Toc511634320"/>
-      <w:bookmarkStart w:id="136" w:name="_Toc511635216"/>
-      <w:bookmarkStart w:id="137" w:name="_Toc511635277"/>
-      <w:bookmarkStart w:id="138" w:name="_Toc511385101"/>
-      <w:bookmarkStart w:id="139" w:name="_Toc511634321"/>
-      <w:bookmarkStart w:id="140" w:name="_Toc511635217"/>
-      <w:bookmarkStart w:id="141" w:name="_Toc511635278"/>
-      <w:bookmarkStart w:id="142" w:name="_Toc511385102"/>
-      <w:bookmarkStart w:id="143" w:name="_Toc511634322"/>
-      <w:bookmarkStart w:id="144" w:name="_Toc511635218"/>
-      <w:bookmarkStart w:id="145" w:name="_Toc511635279"/>
-      <w:bookmarkStart w:id="146" w:name="_Toc511385103"/>
-      <w:bookmarkStart w:id="147" w:name="_Toc511634323"/>
-      <w:bookmarkStart w:id="148" w:name="_Toc511635219"/>
-      <w:bookmarkStart w:id="149" w:name="_Toc511635280"/>
-      <w:bookmarkStart w:id="150" w:name="_Toc511385104"/>
-      <w:bookmarkStart w:id="151" w:name="_Toc511634324"/>
-      <w:bookmarkStart w:id="152" w:name="_Toc511635220"/>
-      <w:bookmarkStart w:id="153" w:name="_Toc511635281"/>
-      <w:bookmarkStart w:id="154" w:name="_Toc511385105"/>
-      <w:bookmarkStart w:id="155" w:name="_Toc511634325"/>
-      <w:bookmarkStart w:id="156" w:name="_Toc511635221"/>
-      <w:bookmarkStart w:id="157" w:name="_Toc511635282"/>
-      <w:bookmarkStart w:id="158" w:name="_Toc511385106"/>
-      <w:bookmarkStart w:id="159" w:name="_Toc511634326"/>
-      <w:bookmarkStart w:id="160" w:name="_Toc511635222"/>
-      <w:bookmarkStart w:id="161" w:name="_Toc511635283"/>
-      <w:bookmarkStart w:id="162" w:name="_Toc511385107"/>
-      <w:bookmarkStart w:id="163" w:name="_Toc511634327"/>
-      <w:bookmarkStart w:id="164" w:name="_Toc511635223"/>
-      <w:bookmarkStart w:id="165" w:name="_Toc511635284"/>
-      <w:bookmarkStart w:id="166" w:name="_Toc511385108"/>
-      <w:bookmarkStart w:id="167" w:name="_Toc511634328"/>
-      <w:bookmarkStart w:id="168" w:name="_Toc511635224"/>
-      <w:bookmarkStart w:id="169" w:name="_Toc511635285"/>
-      <w:bookmarkStart w:id="170" w:name="_Toc511385109"/>
-      <w:bookmarkStart w:id="171" w:name="_Toc511634329"/>
-      <w:bookmarkStart w:id="172" w:name="_Toc511635225"/>
-      <w:bookmarkStart w:id="173" w:name="_Toc511635286"/>
-      <w:bookmarkStart w:id="174" w:name="_Toc511385110"/>
-      <w:bookmarkStart w:id="175" w:name="_Toc511634330"/>
-      <w:bookmarkStart w:id="176" w:name="_Toc511635226"/>
-      <w:bookmarkStart w:id="177" w:name="_Toc511635287"/>
-      <w:bookmarkStart w:id="178" w:name="_Toc511385111"/>
-      <w:bookmarkStart w:id="179" w:name="_Toc511634331"/>
-      <w:bookmarkStart w:id="180" w:name="_Toc511635227"/>
-      <w:bookmarkStart w:id="181" w:name="_Toc511635288"/>
-      <w:bookmarkEnd w:id="58"/>
+      <w:bookmarkStart w:id="59" w:name="_Toc512575239"/>
+      <w:bookmarkStart w:id="60" w:name="_Toc512579341"/>
+      <w:bookmarkStart w:id="61" w:name="_Toc512580109"/>
+      <w:bookmarkStart w:id="62" w:name="_Toc512580597"/>
+      <w:bookmarkStart w:id="63" w:name="_Toc512575240"/>
+      <w:bookmarkStart w:id="64" w:name="_Toc512579342"/>
+      <w:bookmarkStart w:id="65" w:name="_Toc512580110"/>
+      <w:bookmarkStart w:id="66" w:name="_Toc512580598"/>
+      <w:bookmarkStart w:id="67" w:name="_Toc512575241"/>
+      <w:bookmarkStart w:id="68" w:name="_Toc512579343"/>
+      <w:bookmarkStart w:id="69" w:name="_Toc512580111"/>
+      <w:bookmarkStart w:id="70" w:name="_Toc512580599"/>
+      <w:bookmarkStart w:id="71" w:name="_Toc512575242"/>
+      <w:bookmarkStart w:id="72" w:name="_Toc512579344"/>
+      <w:bookmarkStart w:id="73" w:name="_Toc512580112"/>
+      <w:bookmarkStart w:id="74" w:name="_Toc512580600"/>
+      <w:bookmarkStart w:id="75" w:name="_Toc511385085"/>
+      <w:bookmarkStart w:id="76" w:name="_Toc511634305"/>
+      <w:bookmarkStart w:id="77" w:name="_Toc511635201"/>
+      <w:bookmarkStart w:id="78" w:name="_Toc511635262"/>
+      <w:bookmarkStart w:id="79" w:name="_Toc511385086"/>
+      <w:bookmarkStart w:id="80" w:name="_Toc511634306"/>
+      <w:bookmarkStart w:id="81" w:name="_Toc511635202"/>
+      <w:bookmarkStart w:id="82" w:name="_Toc511635263"/>
+      <w:bookmarkStart w:id="83" w:name="_Toc511385087"/>
+      <w:bookmarkStart w:id="84" w:name="_Toc511634307"/>
+      <w:bookmarkStart w:id="85" w:name="_Toc511635203"/>
+      <w:bookmarkStart w:id="86" w:name="_Toc511635264"/>
+      <w:bookmarkStart w:id="87" w:name="_Toc511385088"/>
+      <w:bookmarkStart w:id="88" w:name="_Toc511634308"/>
+      <w:bookmarkStart w:id="89" w:name="_Toc511635204"/>
+      <w:bookmarkStart w:id="90" w:name="_Toc511635265"/>
+      <w:bookmarkStart w:id="91" w:name="_Toc511385089"/>
+      <w:bookmarkStart w:id="92" w:name="_Toc511634309"/>
+      <w:bookmarkStart w:id="93" w:name="_Toc511635205"/>
+      <w:bookmarkStart w:id="94" w:name="_Toc511635266"/>
+      <w:bookmarkStart w:id="95" w:name="_Toc511385090"/>
+      <w:bookmarkStart w:id="96" w:name="_Toc511634310"/>
+      <w:bookmarkStart w:id="97" w:name="_Toc511635206"/>
+      <w:bookmarkStart w:id="98" w:name="_Toc511635267"/>
+      <w:bookmarkStart w:id="99" w:name="_Toc511385091"/>
+      <w:bookmarkStart w:id="100" w:name="_Toc511634311"/>
+      <w:bookmarkStart w:id="101" w:name="_Toc511635207"/>
+      <w:bookmarkStart w:id="102" w:name="_Toc511635268"/>
+      <w:bookmarkStart w:id="103" w:name="_Toc511385092"/>
+      <w:bookmarkStart w:id="104" w:name="_Toc511634312"/>
+      <w:bookmarkStart w:id="105" w:name="_Toc511635208"/>
+      <w:bookmarkStart w:id="106" w:name="_Toc511635269"/>
+      <w:bookmarkStart w:id="107" w:name="_Toc511385093"/>
+      <w:bookmarkStart w:id="108" w:name="_Toc511634313"/>
+      <w:bookmarkStart w:id="109" w:name="_Toc511635209"/>
+      <w:bookmarkStart w:id="110" w:name="_Toc511635270"/>
+      <w:bookmarkStart w:id="111" w:name="_Toc511385094"/>
+      <w:bookmarkStart w:id="112" w:name="_Toc511634314"/>
+      <w:bookmarkStart w:id="113" w:name="_Toc511635210"/>
+      <w:bookmarkStart w:id="114" w:name="_Toc511635271"/>
+      <w:bookmarkStart w:id="115" w:name="_Toc511385095"/>
+      <w:bookmarkStart w:id="116" w:name="_Toc511634315"/>
+      <w:bookmarkStart w:id="117" w:name="_Toc511635211"/>
+      <w:bookmarkStart w:id="118" w:name="_Toc511635272"/>
+      <w:bookmarkStart w:id="119" w:name="_Toc511385096"/>
+      <w:bookmarkStart w:id="120" w:name="_Toc511634316"/>
+      <w:bookmarkStart w:id="121" w:name="_Toc511635212"/>
+      <w:bookmarkStart w:id="122" w:name="_Toc511635273"/>
+      <w:bookmarkStart w:id="123" w:name="_Toc511385097"/>
+      <w:bookmarkStart w:id="124" w:name="_Toc511634317"/>
+      <w:bookmarkStart w:id="125" w:name="_Toc511635213"/>
+      <w:bookmarkStart w:id="126" w:name="_Toc511635274"/>
+      <w:bookmarkStart w:id="127" w:name="_Toc511385098"/>
+      <w:bookmarkStart w:id="128" w:name="_Toc511634318"/>
+      <w:bookmarkStart w:id="129" w:name="_Toc511635214"/>
+      <w:bookmarkStart w:id="130" w:name="_Toc511635275"/>
+      <w:bookmarkStart w:id="131" w:name="_Toc511385099"/>
+      <w:bookmarkStart w:id="132" w:name="_Toc511634319"/>
+      <w:bookmarkStart w:id="133" w:name="_Toc511635215"/>
+      <w:bookmarkStart w:id="134" w:name="_Toc511635276"/>
+      <w:bookmarkStart w:id="135" w:name="_Toc511385100"/>
+      <w:bookmarkStart w:id="136" w:name="_Toc511634320"/>
+      <w:bookmarkStart w:id="137" w:name="_Toc511635216"/>
+      <w:bookmarkStart w:id="138" w:name="_Toc511635277"/>
+      <w:bookmarkStart w:id="139" w:name="_Toc511385101"/>
+      <w:bookmarkStart w:id="140" w:name="_Toc511634321"/>
+      <w:bookmarkStart w:id="141" w:name="_Toc511635217"/>
+      <w:bookmarkStart w:id="142" w:name="_Toc511635278"/>
+      <w:bookmarkStart w:id="143" w:name="_Toc511385102"/>
+      <w:bookmarkStart w:id="144" w:name="_Toc511634322"/>
+      <w:bookmarkStart w:id="145" w:name="_Toc511635218"/>
+      <w:bookmarkStart w:id="146" w:name="_Toc511635279"/>
+      <w:bookmarkStart w:id="147" w:name="_Toc511385103"/>
+      <w:bookmarkStart w:id="148" w:name="_Toc511634323"/>
+      <w:bookmarkStart w:id="149" w:name="_Toc511635219"/>
+      <w:bookmarkStart w:id="150" w:name="_Toc511635280"/>
+      <w:bookmarkStart w:id="151" w:name="_Toc511385104"/>
+      <w:bookmarkStart w:id="152" w:name="_Toc511634324"/>
+      <w:bookmarkStart w:id="153" w:name="_Toc511635220"/>
+      <w:bookmarkStart w:id="154" w:name="_Toc511635281"/>
+      <w:bookmarkStart w:id="155" w:name="_Toc511385105"/>
+      <w:bookmarkStart w:id="156" w:name="_Toc511634325"/>
+      <w:bookmarkStart w:id="157" w:name="_Toc511635221"/>
+      <w:bookmarkStart w:id="158" w:name="_Toc511635282"/>
+      <w:bookmarkStart w:id="159" w:name="_Toc511385106"/>
+      <w:bookmarkStart w:id="160" w:name="_Toc511634326"/>
+      <w:bookmarkStart w:id="161" w:name="_Toc511635222"/>
+      <w:bookmarkStart w:id="162" w:name="_Toc511635283"/>
+      <w:bookmarkStart w:id="163" w:name="_Toc511385107"/>
+      <w:bookmarkStart w:id="164" w:name="_Toc511634327"/>
+      <w:bookmarkStart w:id="165" w:name="_Toc511635223"/>
+      <w:bookmarkStart w:id="166" w:name="_Toc511635284"/>
+      <w:bookmarkStart w:id="167" w:name="_Toc511385108"/>
+      <w:bookmarkStart w:id="168" w:name="_Toc511634328"/>
+      <w:bookmarkStart w:id="169" w:name="_Toc511635224"/>
+      <w:bookmarkStart w:id="170" w:name="_Toc511635285"/>
+      <w:bookmarkStart w:id="171" w:name="_Toc511385109"/>
+      <w:bookmarkStart w:id="172" w:name="_Toc511634329"/>
+      <w:bookmarkStart w:id="173" w:name="_Toc511635225"/>
+      <w:bookmarkStart w:id="174" w:name="_Toc511635286"/>
+      <w:bookmarkStart w:id="175" w:name="_Toc511385110"/>
+      <w:bookmarkStart w:id="176" w:name="_Toc511634330"/>
+      <w:bookmarkStart w:id="177" w:name="_Toc511635226"/>
+      <w:bookmarkStart w:id="178" w:name="_Toc511635287"/>
+      <w:bookmarkStart w:id="179" w:name="_Toc511385111"/>
+      <w:bookmarkStart w:id="180" w:name="_Toc511634331"/>
+      <w:bookmarkStart w:id="181" w:name="_Toc511635227"/>
+      <w:bookmarkStart w:id="182" w:name="_Toc511635288"/>
       <w:bookmarkEnd w:id="59"/>
       <w:bookmarkEnd w:id="60"/>
       <w:bookmarkEnd w:id="61"/>
@@ -9779,12 +9836,13 @@
       <w:bookmarkEnd w:id="179"/>
       <w:bookmarkEnd w:id="180"/>
       <w:bookmarkEnd w:id="181"/>
+      <w:bookmarkEnd w:id="182"/>
     </w:p>
     <w:p>
       <w:pPr>
         <w:pStyle w:val="Heading4"/>
       </w:pPr>
-      <w:bookmarkStart w:id="182" w:name="_Toc8827691"/>
+      <w:bookmarkStart w:id="183" w:name="_Toc8827691"/>
       <w:r>
         <w:t>Model First and Data</w:t>
       </w:r>
@@ -9794,7 +9852,7 @@
       <w:r>
         <w:t xml:space="preserve"> First Usage</w:t>
       </w:r>
-      <w:bookmarkEnd w:id="182"/>
+      <w:bookmarkEnd w:id="183"/>
     </w:p>
     <w:p>
       <w:pPr>
@@ -10648,14 +10706,14 @@
       <w:pPr>
         <w:pStyle w:val="Heading1"/>
       </w:pPr>
-      <w:bookmarkStart w:id="183" w:name="_Ref482087625"/>
-      <w:bookmarkStart w:id="184" w:name="_Toc8827692"/>
+      <w:bookmarkStart w:id="184" w:name="_Ref482087625"/>
+      <w:bookmarkStart w:id="185" w:name="_Toc8827692"/>
       <w:r>
         <w:lastRenderedPageBreak/>
         <w:t>Using the .NET Connector</w:t>
       </w:r>
-      <w:bookmarkEnd w:id="183"/>
       <w:bookmarkEnd w:id="184"/>
+      <w:bookmarkEnd w:id="185"/>
     </w:p>
     <w:p>
       <w:pPr>
@@ -10903,11 +10961,11 @@
       <w:pPr>
         <w:pStyle w:val="Heading2"/>
       </w:pPr>
-      <w:bookmarkStart w:id="185" w:name="_Toc8827693"/>
+      <w:bookmarkStart w:id="186" w:name="_Toc8827693"/>
       <w:r>
         <w:t>Opening a Database Connection</w:t>
       </w:r>
-      <w:bookmarkEnd w:id="185"/>
+      <w:bookmarkEnd w:id="186"/>
     </w:p>
     <w:p>
       <w:pPr>
@@ -11120,13 +11178,13 @@
       <w:pPr>
         <w:pStyle w:val="Heading3"/>
       </w:pPr>
-      <w:bookmarkStart w:id="186" w:name="_Ref482087661"/>
-      <w:bookmarkStart w:id="187" w:name="_Toc8827694"/>
+      <w:bookmarkStart w:id="187" w:name="_Ref482087661"/>
+      <w:bookmarkStart w:id="188" w:name="_Toc8827694"/>
       <w:r>
         <w:t>Connection String Parameters</w:t>
       </w:r>
-      <w:bookmarkEnd w:id="186"/>
       <w:bookmarkEnd w:id="187"/>
+      <w:bookmarkEnd w:id="188"/>
       <w:r>
         <w:t xml:space="preserve"> </w:t>
       </w:r>
@@ -12185,14 +12243,14 @@
       <w:pPr>
         <w:pStyle w:val="Heading3"/>
       </w:pPr>
-      <w:bookmarkStart w:id="188" w:name="_Toc8827695"/>
+      <w:bookmarkStart w:id="189" w:name="_Toc8827695"/>
       <w:r>
         <w:t xml:space="preserve">Example - </w:t>
       </w:r>
       <w:r>
         <w:t>Opening a Database Connection using ASP.NET</w:t>
       </w:r>
-      <w:bookmarkEnd w:id="188"/>
+      <w:bookmarkEnd w:id="189"/>
       <w:r>
         <w:t xml:space="preserve"> </w:t>
       </w:r>
@@ -12663,14 +12721,14 @@
       <w:pPr>
         <w:pStyle w:val="Heading3"/>
       </w:pPr>
-      <w:bookmarkStart w:id="189" w:name="_Toc8827696"/>
+      <w:bookmarkStart w:id="190" w:name="_Toc8827696"/>
       <w:r>
         <w:t xml:space="preserve">Example - </w:t>
       </w:r>
       <w:r>
         <w:t>Opening a Database Connection from a Console Application</w:t>
       </w:r>
-      <w:bookmarkEnd w:id="189"/>
+      <w:bookmarkEnd w:id="190"/>
     </w:p>
     <w:p>
       <w:pPr>
@@ -13276,14 +13334,14 @@
       <w:pPr>
         <w:pStyle w:val="Heading3"/>
       </w:pPr>
-      <w:bookmarkStart w:id="190" w:name="_Toc8827697"/>
+      <w:bookmarkStart w:id="191" w:name="_Toc8827697"/>
       <w:r>
         <w:t xml:space="preserve">Example - </w:t>
       </w:r>
       <w:r>
         <w:t>Opening a Database Connection from a Windows Form Application</w:t>
       </w:r>
-      <w:bookmarkEnd w:id="190"/>
+      <w:bookmarkEnd w:id="191"/>
     </w:p>
     <w:p>
       <w:pPr>
@@ -14141,11 +14199,11 @@
       <w:pPr>
         <w:pStyle w:val="Heading2"/>
       </w:pPr>
-      <w:bookmarkStart w:id="191" w:name="_Toc8827698"/>
+      <w:bookmarkStart w:id="192" w:name="_Toc8827698"/>
       <w:r>
         <w:t>Retrieving Database Records</w:t>
       </w:r>
-      <w:bookmarkEnd w:id="191"/>
+      <w:bookmarkEnd w:id="192"/>
     </w:p>
     <w:p>
       <w:pPr>
@@ -15214,14 +15272,14 @@
       <w:pPr>
         <w:pStyle w:val="Heading3"/>
       </w:pPr>
-      <w:bookmarkStart w:id="192" w:name="_Toc8827699"/>
+      <w:bookmarkStart w:id="193" w:name="_Toc8827699"/>
       <w:r>
         <w:t>Retr</w:t>
       </w:r>
       <w:r>
         <w:t>ieving a Single Database Record</w:t>
       </w:r>
-      <w:bookmarkEnd w:id="192"/>
+      <w:bookmarkEnd w:id="193"/>
     </w:p>
     <w:p>
       <w:pPr>
@@ -15748,12 +15806,12 @@
       <w:pPr>
         <w:pStyle w:val="Heading2"/>
       </w:pPr>
-      <w:bookmarkStart w:id="193" w:name="_Toc8827700"/>
+      <w:bookmarkStart w:id="194" w:name="_Toc8827700"/>
       <w:r>
         <w:lastRenderedPageBreak/>
         <w:t>Parameterized Queries</w:t>
       </w:r>
-      <w:bookmarkEnd w:id="193"/>
+      <w:bookmarkEnd w:id="194"/>
     </w:p>
     <w:p>
       <w:pPr>
@@ -16354,11 +16412,11 @@
       <w:pPr>
         <w:pStyle w:val="Heading2"/>
       </w:pPr>
-      <w:bookmarkStart w:id="194" w:name="_Toc8827701"/>
+      <w:bookmarkStart w:id="195" w:name="_Toc8827701"/>
       <w:r>
         <w:t>Inserting Records in a Database</w:t>
       </w:r>
-      <w:bookmarkEnd w:id="194"/>
+      <w:bookmarkEnd w:id="195"/>
     </w:p>
     <w:p>
       <w:pPr>
@@ -17124,11 +17182,11 @@
       <w:pPr>
         <w:pStyle w:val="Heading2"/>
       </w:pPr>
-      <w:bookmarkStart w:id="195" w:name="_Toc8827702"/>
+      <w:bookmarkStart w:id="196" w:name="_Toc8827702"/>
       <w:r>
         <w:t>Deleting Records in a Database</w:t>
       </w:r>
-      <w:bookmarkEnd w:id="195"/>
+      <w:bookmarkEnd w:id="196"/>
     </w:p>
     <w:p>
       <w:pPr>
@@ -17887,11 +17945,11 @@
       <w:pPr>
         <w:pStyle w:val="Heading2"/>
       </w:pPr>
-      <w:bookmarkStart w:id="196" w:name="_Toc8827703"/>
+      <w:bookmarkStart w:id="197" w:name="_Toc8827703"/>
       <w:r>
         <w:t>Using SPL Stored Procedures in your .NET Application</w:t>
       </w:r>
-      <w:bookmarkEnd w:id="196"/>
+      <w:bookmarkEnd w:id="197"/>
     </w:p>
     <w:p>
       <w:pPr>
@@ -18162,7 +18220,7 @@
       <w:pPr>
         <w:pStyle w:val="Heading3"/>
       </w:pPr>
-      <w:bookmarkStart w:id="197" w:name="_Toc8827704"/>
+      <w:bookmarkStart w:id="198" w:name="_Toc8827704"/>
       <w:r>
         <w:t>Example - Executing</w:t>
       </w:r>
@@ -18172,7 +18230,7 @@
       <w:r>
         <w:t xml:space="preserve"> without Parameters</w:t>
       </w:r>
-      <w:bookmarkEnd w:id="197"/>
+      <w:bookmarkEnd w:id="198"/>
     </w:p>
     <w:p>
       <w:pPr>
@@ -19091,14 +19149,14 @@
       <w:pPr>
         <w:pStyle w:val="Heading3"/>
       </w:pPr>
-      <w:bookmarkStart w:id="198" w:name="_Toc8827705"/>
+      <w:bookmarkStart w:id="199" w:name="_Toc8827705"/>
       <w:r>
         <w:t xml:space="preserve">Example - </w:t>
       </w:r>
       <w:r>
         <w:t>Executing a Stored Procedure with IN Parameters</w:t>
       </w:r>
-      <w:bookmarkEnd w:id="198"/>
+      <w:bookmarkEnd w:id="199"/>
     </w:p>
     <w:p>
       <w:pPr>
@@ -20887,7 +20945,7 @@
       <w:pPr>
         <w:pStyle w:val="Heading3"/>
       </w:pPr>
-      <w:bookmarkStart w:id="199" w:name="_Toc8827706"/>
+      <w:bookmarkStart w:id="200" w:name="_Toc8827706"/>
       <w:r>
         <w:t xml:space="preserve">Example - </w:t>
       </w:r>
@@ -20906,7 +20964,7 @@
       <w:r>
         <w:t xml:space="preserve"> Parameters</w:t>
       </w:r>
-      <w:bookmarkEnd w:id="199"/>
+      <w:bookmarkEnd w:id="200"/>
     </w:p>
     <w:p>
       <w:pPr>
@@ -23071,11 +23129,11 @@
       <w:pPr>
         <w:pStyle w:val="Heading2"/>
       </w:pPr>
-      <w:bookmarkStart w:id="200" w:name="_Toc8827707"/>
+      <w:bookmarkStart w:id="201" w:name="_Toc8827707"/>
       <w:r>
         <w:t>Using Advanced Queueing</w:t>
       </w:r>
-      <w:bookmarkEnd w:id="200"/>
+      <w:bookmarkEnd w:id="201"/>
     </w:p>
     <w:p>
       <w:pPr>
@@ -23216,12 +23274,12 @@
       <w:pPr>
         <w:pStyle w:val="Heading3"/>
       </w:pPr>
-      <w:bookmarkStart w:id="201" w:name="_Toc8827708"/>
+      <w:bookmarkStart w:id="202" w:name="_Toc8827708"/>
       <w:r>
         <w:lastRenderedPageBreak/>
         <w:t>Enqueue or Dequeue a message</w:t>
       </w:r>
-      <w:bookmarkEnd w:id="201"/>
+      <w:bookmarkEnd w:id="202"/>
     </w:p>
     <w:p>
       <w:pPr>
@@ -23232,11 +23290,11 @@
       <w:pPr>
         <w:pStyle w:val="Heading4"/>
       </w:pPr>
-      <w:bookmarkStart w:id="202" w:name="_Toc8827709"/>
+      <w:bookmarkStart w:id="203" w:name="_Toc8827709"/>
       <w:r>
         <w:t>Serve-side setup</w:t>
       </w:r>
-      <w:bookmarkEnd w:id="202"/>
+      <w:bookmarkEnd w:id="203"/>
     </w:p>
     <w:p>
       <w:pPr>
@@ -23675,14 +23733,14 @@
       <w:pPr>
         <w:pStyle w:val="Heading4"/>
       </w:pPr>
-      <w:bookmarkStart w:id="203" w:name="_Toc8827710"/>
+      <w:bookmarkStart w:id="204" w:name="_Toc8827710"/>
       <w:r>
         <w:t>Client</w:t>
       </w:r>
       <w:r>
         <w:t>-side sample</w:t>
       </w:r>
-      <w:bookmarkEnd w:id="203"/>
+      <w:bookmarkEnd w:id="204"/>
     </w:p>
     <w:p>
       <w:pPr>
@@ -26068,10 +26126,8 @@
       <w:pPr>
         <w:pStyle w:val="EDBTXTNormal"/>
       </w:pPr>
-      <w:bookmarkStart w:id="204" w:name="_Toc8827711"/>
-      <w:bookmarkStart w:id="205" w:name="_GoBack"/>
-    </w:p>
-    <w:bookmarkEnd w:id="205"/>
+      <w:bookmarkStart w:id="205" w:name="_Toc8827711"/>
+    </w:p>
     <w:p>
       <w:pPr>
         <w:pStyle w:val="Heading3"/>
@@ -26079,7 +26135,7 @@
       <w:r>
         <w:t>EDBAQ Classes</w:t>
       </w:r>
-      <w:bookmarkEnd w:id="204"/>
+      <w:bookmarkEnd w:id="205"/>
     </w:p>
     <w:p>
       <w:pPr>
@@ -33066,7 +33122,7 @@
         <w:rStyle w:val="PageNumber"/>
         <w:noProof/>
       </w:rPr>
-      <w:t>62</w:t>
+      <w:t>18</w:t>
     </w:r>
     <w:r>
       <w:rPr>
@@ -33341,29 +33397,29 @@
         <v:path o:extrusionok="f" gradientshapeok="t" o:connecttype="rect"/>
         <o:lock v:ext="edit" aspectratio="t"/>
       </v:shapetype>
-      <v:shape id="_x0000_i1484" type="#_x0000_t75" style="width:8.25pt;height:8.25pt" o:bullet="t">
+      <v:shape id="_x0000_i1474" type="#_x0000_t75" style="width:8.25pt;height:8.25pt" o:bullet="t">
         <v:imagedata r:id="rId1" o:title="bullet"/>
       </v:shape>
     </w:pict>
   </w:numPicBullet>
   <w:numPicBullet w:numPicBulletId="1">
     <w:pict>
-      <v:shape id="_x0000_i1485" type="#_x0000_t75" style="width:3in;height:3in" o:bullet="t"/>
+      <v:shape id="_x0000_i1475" type="#_x0000_t75" style="width:3in;height:3in" o:bullet="t"/>
     </w:pict>
   </w:numPicBullet>
   <w:numPicBullet w:numPicBulletId="2">
     <w:pict>
-      <v:shape id="_x0000_i1486" type="#_x0000_t75" style="width:3in;height:3in" o:bullet="t"/>
+      <v:shape id="_x0000_i1476" type="#_x0000_t75" style="width:3in;height:3in" o:bullet="t"/>
     </w:pict>
   </w:numPicBullet>
   <w:numPicBullet w:numPicBulletId="3">
     <w:pict>
-      <v:shape id="_x0000_i1487" type="#_x0000_t75" style="width:3in;height:3in" o:bullet="t"/>
+      <v:shape id="_x0000_i1477" type="#_x0000_t75" style="width:3in;height:3in" o:bullet="t"/>
     </w:pict>
   </w:numPicBullet>
   <w:numPicBullet w:numPicBulletId="4">
     <w:pict>
-      <v:shape id="_x0000_i1488" type="#_x0000_t75" style="width:3in;height:3in" o:bullet="t"/>
+      <v:shape id="_x0000_i1478" type="#_x0000_t75" style="width:3in;height:3in" o:bullet="t"/>
     </w:pict>
   </w:numPicBullet>
   <w:abstractNum w:abstractNumId="0">
@@ -40563,7 +40619,6 @@
       <w:rFonts w:ascii="Cambria" w:eastAsia="Cambria" w:hAnsi="Cambria"/>
     </w:rPr>
     <w:tblPr>
-      <w:tblInd w:w="0" w:type="dxa"/>
       <w:tblBorders>
         <w:top w:val="single" w:sz="4" w:space="0" w:color="000000"/>
         <w:left w:val="single" w:sz="4" w:space="0" w:color="000000"/>
@@ -40572,12 +40627,6 @@
         <w:insideH w:val="single" w:sz="4" w:space="0" w:color="000000"/>
         <w:insideV w:val="single" w:sz="4" w:space="0" w:color="000000"/>
       </w:tblBorders>
-      <w:tblCellMar>
-        <w:top w:w="0" w:type="dxa"/>
-        <w:left w:w="108" w:type="dxa"/>
-        <w:bottom w:w="0" w:type="dxa"/>
-        <w:right w:w="108" w:type="dxa"/>
-      </w:tblCellMar>
     </w:tblPr>
   </w:style>
   <w:style w:type="paragraph" w:styleId="BodyTextIndent">
@@ -43595,7 +43644,6 @@
       <w:rFonts w:ascii="Cambria" w:eastAsia="Cambria" w:hAnsi="Cambria"/>
     </w:rPr>
     <w:tblPr>
-      <w:tblInd w:w="0" w:type="dxa"/>
       <w:tblBorders>
         <w:top w:val="single" w:sz="4" w:space="0" w:color="000000"/>
         <w:left w:val="single" w:sz="4" w:space="0" w:color="000000"/>
@@ -43604,12 +43652,6 @@
         <w:insideH w:val="single" w:sz="4" w:space="0" w:color="000000"/>
         <w:insideV w:val="single" w:sz="4" w:space="0" w:color="000000"/>
       </w:tblBorders>
-      <w:tblCellMar>
-        <w:top w:w="0" w:type="dxa"/>
-        <w:left w:w="108" w:type="dxa"/>
-        <w:bottom w:w="0" w:type="dxa"/>
-        <w:right w:w="108" w:type="dxa"/>
-      </w:tblCellMar>
     </w:tblPr>
   </w:style>
   <w:style w:type="paragraph" w:styleId="BodyTextIndent">
@@ -44560,7 +44602,7 @@
 </file>
 
 <file path=customXml/itemProps1.xml><?xml version="1.0" encoding="utf-8"?>
-<ds:datastoreItem xmlns:ds="http://schemas.openxmlformats.org/officeDocument/2006/customXml" ds:itemID="{6BE91B0C-D42D-49F8-9828-CDC06BCD65D9}">
+<ds:datastoreItem xmlns:ds="http://schemas.openxmlformats.org/officeDocument/2006/customXml" ds:itemID="{3C5797F0-B506-4E53-8803-2553106CBB61}">
   <ds:schemaRefs>
     <ds:schemaRef ds:uri="http://schemas.openxmlformats.org/officeDocument/2006/bibliography"/>
   </ds:schemaRefs>

</xml_diff>